<commit_message>
docs(reports): build complete 5-chapter thesis report and master document per DUT guidelines
</commit_message>
<xml_diff>
--- a/docs/reports/PBL6_Bao_Cao_Chuong_1_Co_So_Ly_Thuyet.docx
+++ b/docs/reports/PBL6_Bao_Cao_Chuong_1_Co_So_Ly_Thuyet.docx
@@ -4,6 +4,7 @@
   <w:body>
     <w:p>
       <w:pPr>
+        <w:spacing w:after="320"/>
         <w:jc w:val="center"/>
       </w:pPr>
       <w:r>
@@ -30,7 +31,7 @@
       <w:r>
         <w:rPr>
           <w:b/>
-          <w:color w:val="1E3A8A"/>
+          <w:color w:val="111827"/>
           <w:sz w:val="32"/>
         </w:rPr>
         <w:t>CHƯƠNG 1: CƠ SỞ LÝ THUYẾT VÀ TỔNG QUAN CÔNG TRÌNH NGHIÊN CỨU</w:t>
@@ -38,10 +39,9 @@
       </w:r>
       <w:r>
         <w:rPr>
-          <w:b/>
           <w:i/>
-          <w:color w:val="1F2937"/>
-          <w:sz w:val="23"/>
+          <w:color w:val="374151"/>
+          <w:sz w:val="22"/>
         </w:rPr>
         <w:t>Đề tài: Nền tảng Giám sát, Phát hiện và Ngăn chặn Tấn công Web API dựa trên AI/ML kết hợp Môi trường Thao trường Mạng (Cyber Range) Phân tán</w:t>
         <w:br/>
@@ -49,28 +49,27 @@
     </w:p>
     <w:p>
       <w:pPr>
+        <w:spacing w:after="80" w:line="288" w:lineRule="auto"/>
         <w:jc w:val="both"/>
       </w:pPr>
       <w:r>
         <w:rPr>
+          <w:b w:val="0"/>
           <w:i/>
-          <w:color w:val="4B5563"/>
-          <w:sz w:val="20"/>
         </w:rPr>
-        <w:t>Tài liệu cơ sở lý thuyết bám sát 20 công trình khoa học uy tín (USENIX Security, IEEE, ACM, Elsevier, MDPI, NIST, OWASP, MITRE). Cung cấp luận chứng toán học, cơ chế kiến trúc và cơ sở phân loại cho toàn bộ hệ sinh thái phòng thủ và tấn công của đồ án.</w:t>
+        <w:t>Tài liệu cơ sở lý thuyết bám sát 20 công trình và giáo trình kinh điển quốc tế (Prentice Hall, CRC Press, Sybex/Wiley, O'Reilly, USENIX Security, IEEE, ACM, Elsevier, MDPI, NIST, OWASP, MITRE). Cung cấp luận cứ toán học, cơ chế kiến trúc và cơ sở phân loại cho toàn bộ hệ sinh thái phòng thủ và tấn công của đồ án.</w:t>
       </w:r>
     </w:p>
-    <w:p/>
     <w:p>
       <w:pPr>
         <w:keepNext/>
-        <w:spacing w:before="320" w:after="120"/>
+        <w:spacing w:before="280" w:after="120"/>
       </w:pPr>
       <w:r>
         <w:rPr>
           <w:b/>
-          <w:color w:val="0F2454"/>
-          <w:sz w:val="27"/>
+          <w:color w:val="0F766E"/>
+          <w:sz w:val="28"/>
         </w:rPr>
         <w:t>1.1. TỔNG QUAN VỀ BẢO MẬT WEB API VÀ CÁC THÁCH THỨC AN NINH HIỆN ĐẠI</w:t>
       </w:r>
@@ -78,12 +77,12 @@
     <w:p>
       <w:pPr>
         <w:keepNext/>
-        <w:spacing w:before="240" w:after="80"/>
+        <w:spacing w:before="200" w:after="80"/>
       </w:pPr>
       <w:r>
         <w:rPr>
           <w:b/>
-          <w:color w:val="1E40AF"/>
+          <w:color w:val="1E3A8A"/>
           <w:sz w:val="24"/>
         </w:rPr>
         <w:t>1.1.1. Xu hướng kiến trúc Microservices và sự bùng nổ của Web API</w:t>
@@ -98,7 +97,6 @@
         <w:rPr>
           <w:b w:val="0"/>
           <w:i w:val="0"/>
-          <w:sz w:val="22"/>
         </w:rPr>
         <w:t>Trong kỷ nguyên chuyển đổi số và điện toán đám mây, kiến trúc phần mềm đã trải qua sự chuyển dịch mang tính nền tảng từ các hệ thống nguyên khối (Monolithic Architecture) sang kiến trúc phân tán và vi dịch vụ (Microservices Architecture). Trong mô hình này, giao diện lập trình ứng dụng web (Web API), đặc biệt là chuẩn RESTful API truyền tải dữ liệu qua giao thức HTTP/HTTPS với định dạng JSON, đã trở thành huyết mạch kết nối toàn bộ hệ sinh thái dịch vụ số: từ ứng dụng Single Page Application (SPA), ứng dụng di động (Mobile Apps), hệ thống Internet vạn vật (IoT) cho đến các cổng thanh toán tài chính liên ngân hàng.</w:t>
       </w:r>
@@ -112,20 +110,19 @@
         <w:rPr>
           <w:b w:val="0"/>
           <w:i w:val="0"/>
-          <w:sz w:val="22"/>
         </w:rPr>
-        <w:t>Tuy nhiên, sự bùng nổ về số lượng và tính phức tạp của Web API đã làm mở rộng đáng kể bề mặt tấn công (Attack Surface). Không giống như các ứng dụng web truyền thống hiển thị giao diện qua HTML/CSS, Web API phơi bày trực tiếp logic nghiệp vụ, các tham số truy vấn cơ sở dữ liệu và cấu trúc dữ liệu nhạy cảm. Kẻ tấn công có thể dễ dàng sử dụng các công cụ phân tích tự động, bóc tách tài liệu OpenAPI/Swagger specification để lập bản đồ các endpoint và thực hiện tấn công hàng loạt mà không bị cản trở bởi lớp giao diện người dùng.</w:t>
+        <w:t>Tuy nhiên, sự bùng nổ về số lượng và tính phức tạp của Web API đã làm mở rộng đáng kể bề mặt tấn công (Attack Surface). Không giống như các ứng dụng web truyền thống hiển thị giao diện qua HTML/CSS, Web API phơi bày trực tiếp logic nghiệp vụ, các tham số truy vấn cơ sở dữ liệu và cấu trúc dữ liệu nhạy cảm. Kẻ tấn công có thể dễ dàng sử dụng các công cụ phân tích tự động, bóc tách tài liệu OpenAPI/Swagger specification để lập bản đồ các endpoint và thực hiện tấn công hàng loạt mà không bị cản trở bởi lớp giao diện người dùng [Ref 04].</w:t>
       </w:r>
     </w:p>
     <w:p>
       <w:pPr>
         <w:keepNext/>
-        <w:spacing w:before="240" w:after="80"/>
+        <w:spacing w:before="200" w:after="80"/>
       </w:pPr>
       <w:r>
         <w:rPr>
           <w:b/>
-          <w:color w:val="1E40AF"/>
+          <w:color w:val="1E3A8A"/>
           <w:sz w:val="24"/>
         </w:rPr>
         <w:t>1.1.2. Phân tích các mối đe dọa hàng đầu theo OWASP Top 10 API Security Risks (2023)</w:t>
@@ -140,9 +137,8 @@
         <w:rPr>
           <w:b w:val="0"/>
           <w:i w:val="0"/>
-          <w:sz w:val="22"/>
         </w:rPr>
-        <w:t>Theo công bố chính thức từ tổ chức an toàn thông tin uy tín thế giới OWASP trong tài liệu OWASP Top 10 API Security Risks 2023 [Ref 13], các cuộc tấn công nhắm vào Web API ngày càng trở nên tinh vi và có tổ chức. Đồ án tập trung nghiên cứu và xây dựng giải pháp phòng thủ cho 4 nhóm hiểm họa nghiêm trọng nhất:</w:t>
+        <w:t>Theo công bố chính thức từ tổ chức an toàn thông tin uy tín thế giới OWASP trong tài liệu OWASP Top 10 API Security Risks 2023 [Ref 06], các cuộc tấn công nhắm vào Web API ngày càng trở nên tinh vi và có tổ chức. Đồ án tập trung nghiên cứu và xây dựng giải pháp phòng thủ cho 4 nhóm hiểm họa nghiêm trọng nhất:</w:t>
       </w:r>
     </w:p>
     <w:p>
@@ -154,14 +150,11 @@
       <w:r>
         <w:rPr>
           <w:b/>
-          <w:sz w:val="22"/>
+          <w:color w:val="111827"/>
         </w:rPr>
         <w:t xml:space="preserve">1. Các lỗ hổng tiêm mã độc (Injection Vulnerabilities): </w:t>
       </w:r>
       <w:r>
-        <w:rPr>
-          <w:sz w:val="22"/>
-        </w:rPr>
         <w:t>Bao gồm SQL Injection (In-band, Error-based, Time-based Blind SQLi [Ref 10]), OS Command Injection thực thi shellcode trực tiếp, và Path Traversal đọc tệp tin cấu hình nhạy cảm. Kẻ tấn công lợi dụng dữ liệu đầu vào chưa được kiểm duyệt để thay đổi logic truy vấn hoặc chiếm toàn quyền điều khiển hệ điều hành máy chủ.</w:t>
       </w:r>
     </w:p>
@@ -174,14 +167,11 @@
       <w:r>
         <w:rPr>
           <w:b/>
-          <w:sz w:val="22"/>
+          <w:color w:val="111827"/>
         </w:rPr>
         <w:t xml:space="preserve">2. Tấn công Cross-Site Scripting (XSS): </w:t>
       </w:r>
       <w:r>
-        <w:rPr>
-          <w:sz w:val="22"/>
-        </w:rPr>
         <w:t>Mặc dù API chủ yếu trả về dữ liệu JSON, nhưng các trường dữ liệu do API phản hồi thường được render trực tiếp lên trình duyệt của người dùng cuối trong các ứng dụng SPA (React, Vue, Next.js). Khi kẻ tấn công chèn thành công các payload chứa mã JavaScript nguy hại (&lt;script&gt;, &lt;img onerror=...&gt;) qua API, mã độc sẽ thực thi trong ngữ cảnh phiên nạn nhân, dẫn đến nguy cơ đánh cắp token JWT, session cookies hoặc chiếm đoạt tài khoản.</w:t>
       </w:r>
     </w:p>
@@ -194,15 +184,12 @@
       <w:r>
         <w:rPr>
           <w:b/>
-          <w:sz w:val="22"/>
+          <w:color w:val="111827"/>
         </w:rPr>
         <w:t xml:space="preserve">3. Phá vỡ kiểm soát phân quyền mức đối tượng (BOLA / IDOR - API1:2023): </w:t>
       </w:r>
       <w:r>
-        <w:rPr>
-          <w:sz w:val="22"/>
-        </w:rPr>
-        <w:t>Lỗ hổng logic nghiệp vụ đứng số 1 về mức độ phổ biến, xảy ra khi máy chủ API không kiểm tra xem người dùng hiện tại có quyền thao tác trên mã đối tượng trong URL hay không (ví dụ: đổi /orders/1 thành /orders/2). Các bộ lọc chữ ký regex truyền thống hoàn toàn bất lực trước loại lỗ hổng logic này.</w:t>
+        <w:t>Lỗ hổng logic nghiệp vụ đứng số 1 về mức độ phổ biến, xảy ra khi máy chủ API không kiểm tra xem người dùng hiện tại có quyền thao tác trên mã đối tượng trong URL hay không (ví dụ: đổi /orders/1 thành /orders/2). Các bộ lọc chữ ký regex truyền thống hoàn toàn bất lực trước loại lỗ hổng logic này [Ref 06].</w:t>
       </w:r>
     </w:p>
     <w:p>
@@ -214,26 +201,23 @@
       <w:r>
         <w:rPr>
           <w:b/>
-          <w:sz w:val="22"/>
+          <w:color w:val="111827"/>
         </w:rPr>
-        <w:t xml:space="preserve">4. Tiêu thụ tài nguyên không kiểm soát (Unrestricted Resource Consumption - API4:2023): </w:t>
+        <w:t xml:space="preserve">4. Tiêu thụ tài nguyên không hạn chế (Unrestricted Resource Consumption - API4:2023): </w:t>
       </w:r>
       <w:r>
-        <w:rPr>
-          <w:sz w:val="22"/>
-        </w:rPr>
-        <w:t>Các cuộc tấn công dò quét tự động (Brute-force mật khẩu, Credential Stuffing) hoặc vét cạn tài nguyên máy chủ Layer 7 DoS. Nếu không có cơ chế giới hạn tần suất (Rate Limiting) theo cửa sổ trượt, hệ thống sẽ nhanh chóng tê liệt CPU, RAM và kết nối cơ sở dữ liệu [Ref 11].</w:t>
+        <w:t>Các cuộc tấn công dò quét tự động (Brute-force mật khẩu, Credential Stuffing) hoặc vét cạn tài nguyên máy chủ Layer 7 DoS. Nếu không có cơ chế giới hạn tần suất (Rate Limiting) theo cửa sổ trượt, hệ thống sẽ nhanh chóng tê liệt CPU, RAM và kết nối cơ sở dữ liệu [Ref 05, Ref 06].</w:t>
       </w:r>
     </w:p>
     <w:p>
       <w:pPr>
         <w:keepNext/>
-        <w:spacing w:before="240" w:after="80"/>
+        <w:spacing w:before="200" w:after="80"/>
       </w:pPr>
       <w:r>
         <w:rPr>
           <w:b/>
-          <w:color w:val="1E40AF"/>
+          <w:color w:val="1E3A8A"/>
           <w:sz w:val="24"/>
         </w:rPr>
         <w:t>1.1.3. Các kỹ thuật làm mờ payload và né tránh tường lửa (WAF Evasion &amp; Obfuscation Techniques)</w:t>
@@ -248,16 +232,14 @@
         <w:rPr>
           <w:b w:val="0"/>
           <w:i w:val="0"/>
-          <w:sz w:val="22"/>
         </w:rPr>
-        <w:t>Trong bối cảnh các hệ thống phòng thủ phụ thuộc vào so khớp mẫu chuỗi tĩnh, kẻ tấn công hiện đại — đặc biệt khi có sự hỗ trợ của AI — áp dụng các kỹ thuật làm mờ payload (Obfuscation) cực kỳ phức tạp để vượt rào (WAF Evasion) [Ref 04]:</w:t>
+        <w:t>Theo giáo trình kiểm thử xâm nhập chuẩn quốc tế CompTIA PenTest+ Study Guide [Ref 04], trong bối cảnh các hệ thống tường lửa ứng dụng web truyền thống phụ thuộc nặng nề vào các tập luật kiểm tra mẫu chuỗi (Regex Pattern Matching), kẻ tấn công hiện đại áp dụng các kỹ thuật làm mờ payload (Obfuscation) cực kỳ phức tạp để vượt rào (WAF Evasion):</w:t>
       </w:r>
     </w:p>
     <w:tbl>
       <w:tblPr>
         <w:tblW w:type="auto" w:w="0"/>
         <w:jc w:val="center"/>
-        <w:tblLayout w:type="fixed"/>
         <w:tblLook w:firstColumn="1" w:firstRow="1" w:lastColumn="0" w:lastRow="0" w:noHBand="0" w:noVBand="1" w:val="04A0"/>
       </w:tblPr>
       <w:tblGrid>
@@ -269,24 +251,21 @@
       <w:tr>
         <w:tc>
           <w:tcPr>
-            <w:tcW w:type="dxa" w:w="2160"/>
-            <w:shd w:fill="1E3A8A"/>
+            <w:tcW w:type="dxa" w:w="2340"/>
+            <w:shd w:fill="0F766E"/>
             <w:tcMar>
               <w:top w:w="140" w:type="dxa"/>
               <w:bottom w:w="140" w:type="dxa"/>
-              <w:left w:w="120" w:type="dxa"/>
-              <w:right w:w="120" w:type="dxa"/>
+              <w:left w:w="140" w:type="dxa"/>
+              <w:right w:w="140" w:type="dxa"/>
             </w:tcMar>
           </w:tcPr>
           <w:p>
-            <w:pPr>
-              <w:jc w:val="center"/>
-            </w:pPr>
             <w:r>
               <w:rPr>
                 <w:b/>
                 <w:color w:val="FFFFFF"/>
-                <w:sz w:val="19"/>
+                <w:sz w:val="20"/>
               </w:rPr>
               <w:t>Kỹ Thuật Né Tránh</w:t>
             </w:r>
@@ -294,24 +273,21 @@
         </w:tc>
         <w:tc>
           <w:tcPr>
-            <w:tcW w:type="dxa" w:w="2592"/>
-            <w:shd w:fill="1E3A8A"/>
+            <w:tcW w:type="dxa" w:w="2340"/>
+            <w:shd w:fill="0F766E"/>
             <w:tcMar>
               <w:top w:w="140" w:type="dxa"/>
               <w:bottom w:w="140" w:type="dxa"/>
-              <w:left w:w="120" w:type="dxa"/>
-              <w:right w:w="120" w:type="dxa"/>
+              <w:left w:w="140" w:type="dxa"/>
+              <w:right w:w="140" w:type="dxa"/>
             </w:tcMar>
           </w:tcPr>
           <w:p>
-            <w:pPr>
-              <w:jc w:val="center"/>
-            </w:pPr>
             <w:r>
               <w:rPr>
                 <w:b/>
                 <w:color w:val="FFFFFF"/>
-                <w:sz w:val="19"/>
+                <w:sz w:val="20"/>
               </w:rPr>
               <w:t>Cơ Chế Bản Chất</w:t>
             </w:r>
@@ -319,24 +295,21 @@
         </w:tc>
         <w:tc>
           <w:tcPr>
-            <w:tcW w:type="dxa" w:w="2160"/>
-            <w:shd w:fill="1E3A8A"/>
+            <w:tcW w:type="dxa" w:w="2340"/>
+            <w:shd w:fill="0F766E"/>
             <w:tcMar>
               <w:top w:w="140" w:type="dxa"/>
               <w:bottom w:w="140" w:type="dxa"/>
-              <w:left w:w="120" w:type="dxa"/>
-              <w:right w:w="120" w:type="dxa"/>
+              <w:left w:w="140" w:type="dxa"/>
+              <w:right w:w="140" w:type="dxa"/>
             </w:tcMar>
           </w:tcPr>
           <w:p>
-            <w:pPr>
-              <w:jc w:val="center"/>
-            </w:pPr>
             <w:r>
               <w:rPr>
                 <w:b/>
                 <w:color w:val="FFFFFF"/>
-                <w:sz w:val="19"/>
+                <w:sz w:val="20"/>
               </w:rPr>
               <w:t>Ví Dụ Minh Họa</w:t>
             </w:r>
@@ -344,26 +317,23 @@
         </w:tc>
         <w:tc>
           <w:tcPr>
-            <w:tcW w:type="dxa" w:w="2448"/>
-            <w:shd w:fill="1E3A8A"/>
+            <w:tcW w:type="dxa" w:w="2340"/>
+            <w:shd w:fill="0F766E"/>
             <w:tcMar>
               <w:top w:w="140" w:type="dxa"/>
               <w:bottom w:w="140" w:type="dxa"/>
-              <w:left w:w="120" w:type="dxa"/>
-              <w:right w:w="120" w:type="dxa"/>
+              <w:left w:w="140" w:type="dxa"/>
+              <w:right w:w="140" w:type="dxa"/>
             </w:tcMar>
           </w:tcPr>
           <w:p>
-            <w:pPr>
-              <w:jc w:val="center"/>
-            </w:pPr>
             <w:r>
               <w:rPr>
                 <w:b/>
                 <w:color w:val="FFFFFF"/>
-                <w:sz w:val="19"/>
+                <w:sz w:val="20"/>
               </w:rPr>
-              <w:t>Hậu Quả Đối Với WAF Tĩnh</w:t>
+              <w:t>Hậu Quả Đối Với WAF Truyền Thống</w:t>
             </w:r>
           </w:p>
         </w:tc>
@@ -371,7 +341,89 @@
       <w:tr>
         <w:tc>
           <w:tcPr>
-            <w:tcW w:type="dxa" w:w="2160"/>
+            <w:tcW w:type="dxa" w:w="2340"/>
+            <w:shd w:fill="FFFFFF"/>
+            <w:tcMar>
+              <w:top w:w="100" w:type="dxa"/>
+              <w:bottom w:w="100" w:type="dxa"/>
+              <w:left w:w="120" w:type="dxa"/>
+              <w:right w:w="120" w:type="dxa"/>
+            </w:tcMar>
+          </w:tcPr>
+          <w:p>
+            <w:r>
+              <w:rPr>
+                <w:sz w:val="19"/>
+              </w:rPr>
+              <w:t>Mã hóa URL đa tầng (Double URL Encoding)</w:t>
+            </w:r>
+          </w:p>
+        </w:tc>
+        <w:tc>
+          <w:tcPr>
+            <w:tcW w:type="dxa" w:w="2340"/>
+            <w:shd w:fill="FFFFFF"/>
+            <w:tcMar>
+              <w:top w:w="100" w:type="dxa"/>
+              <w:bottom w:w="100" w:type="dxa"/>
+              <w:left w:w="120" w:type="dxa"/>
+              <w:right w:w="120" w:type="dxa"/>
+            </w:tcMar>
+          </w:tcPr>
+          <w:p>
+            <w:r>
+              <w:rPr>
+                <w:sz w:val="19"/>
+              </w:rPr>
+              <w:t>Mã hóa ký tự % thành %25 (dấu ' thành %27 rồi %2527)</w:t>
+            </w:r>
+          </w:p>
+        </w:tc>
+        <w:tc>
+          <w:tcPr>
+            <w:tcW w:type="dxa" w:w="2340"/>
+            <w:shd w:fill="FFFFFF"/>
+            <w:tcMar>
+              <w:top w:w="100" w:type="dxa"/>
+              <w:bottom w:w="100" w:type="dxa"/>
+              <w:left w:w="120" w:type="dxa"/>
+              <w:right w:w="120" w:type="dxa"/>
+            </w:tcMar>
+          </w:tcPr>
+          <w:p>
+            <w:r>
+              <w:rPr>
+                <w:sz w:val="19"/>
+              </w:rPr>
+              <w:t>%2527%20OR%20%2531%253D%2531</w:t>
+            </w:r>
+          </w:p>
+        </w:tc>
+        <w:tc>
+          <w:tcPr>
+            <w:tcW w:type="dxa" w:w="2340"/>
+            <w:shd w:fill="FFFFFF"/>
+            <w:tcMar>
+              <w:top w:w="100" w:type="dxa"/>
+              <w:bottom w:w="100" w:type="dxa"/>
+              <w:left w:w="120" w:type="dxa"/>
+              <w:right w:w="120" w:type="dxa"/>
+            </w:tcMar>
+          </w:tcPr>
+          <w:p>
+            <w:r>
+              <w:rPr>
+                <w:sz w:val="19"/>
+              </w:rPr>
+              <w:t>WAF chỉ giải mã 1 lần thành %27 và bỏ qua; backend giải mã lần 2 kích hoạt SQLi.</w:t>
+            </w:r>
+          </w:p>
+        </w:tc>
+      </w:tr>
+      <w:tr>
+        <w:tc>
+          <w:tcPr>
+            <w:tcW w:type="dxa" w:w="2340"/>
             <w:shd w:fill="F9FAFB"/>
             <w:tcMar>
               <w:top w:w="100" w:type="dxa"/>
@@ -381,22 +433,17 @@
             </w:tcMar>
           </w:tcPr>
           <w:p>
-            <w:pPr>
-              <w:jc w:val="left"/>
-            </w:pPr>
             <w:r>
               <w:rPr>
-                <w:b/>
-                <w:color w:val="1E40AF"/>
-                <w:sz w:val="18"/>
+                <w:sz w:val="19"/>
               </w:rPr>
-              <w:t>Mã hóa URL kép (Double URL Encode)</w:t>
+              <w:t>Chèn chú thích nội tuyến (Inline Comments)</w:t>
             </w:r>
           </w:p>
         </w:tc>
         <w:tc>
           <w:tcPr>
-            <w:tcW w:type="dxa" w:w="2592"/>
+            <w:tcW w:type="dxa" w:w="2340"/>
             <w:shd w:fill="F9FAFB"/>
             <w:tcMar>
               <w:top w:w="100" w:type="dxa"/>
@@ -406,20 +453,17 @@
             </w:tcMar>
           </w:tcPr>
           <w:p>
-            <w:pPr>
-              <w:jc w:val="left"/>
-            </w:pPr>
             <w:r>
               <w:rPr>
-                <w:sz w:val="18"/>
+                <w:sz w:val="19"/>
               </w:rPr>
-              <w:t>Mã hóa ký tự % thành %25 (dấu ' -&gt; %27 -&gt; %2527)</w:t>
+              <w:t>Chèn comment vô hại vào giữa từ khóa nhạy cảm</w:t>
             </w:r>
           </w:p>
         </w:tc>
         <w:tc>
           <w:tcPr>
-            <w:tcW w:type="dxa" w:w="2160"/>
+            <w:tcW w:type="dxa" w:w="2340"/>
             <w:shd w:fill="F9FAFB"/>
             <w:tcMar>
               <w:top w:w="100" w:type="dxa"/>
@@ -429,21 +473,17 @@
             </w:tcMar>
           </w:tcPr>
           <w:p>
-            <w:pPr>
-              <w:jc w:val="left"/>
-            </w:pPr>
             <w:r>
               <w:rPr>
-                <w:rFonts w:ascii="Courier New" w:hAnsi="Courier New"/>
-                <w:sz w:val="17"/>
+                <w:sz w:val="19"/>
               </w:rPr>
-              <w:t>%2527%20OR%201=1</w:t>
+              <w:t>UN/**/ION/**/SEL/**/ECT</w:t>
             </w:r>
           </w:p>
         </w:tc>
         <w:tc>
           <w:tcPr>
-            <w:tcW w:type="dxa" w:w="2448"/>
+            <w:tcW w:type="dxa" w:w="2340"/>
             <w:shd w:fill="F9FAFB"/>
             <w:tcMar>
               <w:top w:w="100" w:type="dxa"/>
@@ -453,14 +493,11 @@
             </w:tcMar>
           </w:tcPr>
           <w:p>
-            <w:pPr>
-              <w:jc w:val="left"/>
-            </w:pPr>
             <w:r>
               <w:rPr>
-                <w:sz w:val="18"/>
+                <w:sz w:val="19"/>
               </w:rPr>
-              <w:t>WAF chỉ giải mã 1 lần thấy vô hại và bỏ qua; Backend giải mã lần 2 kích hoạt SQLi.</w:t>
+              <w:t>Làm đứt gãy mẫu chuỗi regex chuẩn UNION.*SELECT.</w:t>
             </w:r>
           </w:p>
         </w:tc>
@@ -468,7 +505,7 @@
       <w:tr>
         <w:tc>
           <w:tcPr>
-            <w:tcW w:type="dxa" w:w="2160"/>
+            <w:tcW w:type="dxa" w:w="2340"/>
             <w:shd w:fill="FFFFFF"/>
             <w:tcMar>
               <w:top w:w="100" w:type="dxa"/>
@@ -478,22 +515,17 @@
             </w:tcMar>
           </w:tcPr>
           <w:p>
-            <w:pPr>
-              <w:jc w:val="left"/>
-            </w:pPr>
             <w:r>
               <w:rPr>
-                <w:b/>
-                <w:color w:val="1E40AF"/>
-                <w:sz w:val="18"/>
+                <w:sz w:val="19"/>
               </w:rPr>
-              <w:t>Chèn chú thích nội tuyến (Inline Comments)</w:t>
+              <w:t>Biến đổi chữ hoa/thường xen kẽ</w:t>
             </w:r>
           </w:p>
         </w:tc>
         <w:tc>
           <w:tcPr>
-            <w:tcW w:type="dxa" w:w="2592"/>
+            <w:tcW w:type="dxa" w:w="2340"/>
             <w:shd w:fill="FFFFFF"/>
             <w:tcMar>
               <w:top w:w="100" w:type="dxa"/>
@@ -503,20 +535,17 @@
             </w:tcMar>
           </w:tcPr>
           <w:p>
-            <w:pPr>
-              <w:jc w:val="left"/>
-            </w:pPr>
             <w:r>
               <w:rPr>
-                <w:sz w:val="18"/>
+                <w:sz w:val="19"/>
               </w:rPr>
-              <w:t>Chèn comment của ngôn ngữ đích vào giữa từ khóa</w:t>
+              <w:t>Thay đổi ngẫu nhiên trạng thái hoa thường không chuẩn hóa</w:t>
             </w:r>
           </w:p>
         </w:tc>
         <w:tc>
           <w:tcPr>
-            <w:tcW w:type="dxa" w:w="2160"/>
+            <w:tcW w:type="dxa" w:w="2340"/>
             <w:shd w:fill="FFFFFF"/>
             <w:tcMar>
               <w:top w:w="100" w:type="dxa"/>
@@ -526,21 +555,17 @@
             </w:tcMar>
           </w:tcPr>
           <w:p>
-            <w:pPr>
-              <w:jc w:val="left"/>
-            </w:pPr>
             <w:r>
               <w:rPr>
-                <w:rFonts w:ascii="Courier New" w:hAnsi="Courier New"/>
-                <w:sz w:val="17"/>
+                <w:sz w:val="19"/>
               </w:rPr>
-              <w:t>UN/**/ION/**/SEL/**/ECT</w:t>
+              <w:t>sElEcT, &lt;sCrIpt&gt;, uNiOn</w:t>
             </w:r>
           </w:p>
         </w:tc>
         <w:tc>
           <w:tcPr>
-            <w:tcW w:type="dxa" w:w="2448"/>
+            <w:tcW w:type="dxa" w:w="2340"/>
             <w:shd w:fill="FFFFFF"/>
             <w:tcMar>
               <w:top w:w="100" w:type="dxa"/>
@@ -550,14 +575,11 @@
             </w:tcMar>
           </w:tcPr>
           <w:p>
-            <w:pPr>
-              <w:jc w:val="left"/>
-            </w:pPr>
             <w:r>
               <w:rPr>
-                <w:sz w:val="18"/>
+                <w:sz w:val="19"/>
               </w:rPr>
-              <w:t>Làm đứt gãy mẫu chuỗi regex chuẩn UNION.*SELECT.</w:t>
+              <w:t>Vượt qua regex không thiết lập cờ IGNORECASE.</w:t>
             </w:r>
           </w:p>
         </w:tc>
@@ -565,7 +587,7 @@
       <w:tr>
         <w:tc>
           <w:tcPr>
-            <w:tcW w:type="dxa" w:w="2160"/>
+            <w:tcW w:type="dxa" w:w="2340"/>
             <w:shd w:fill="F9FAFB"/>
             <w:tcMar>
               <w:top w:w="100" w:type="dxa"/>
@@ -575,22 +597,17 @@
             </w:tcMar>
           </w:tcPr>
           <w:p>
-            <w:pPr>
-              <w:jc w:val="left"/>
-            </w:pPr>
             <w:r>
               <w:rPr>
-                <w:b/>
-                <w:color w:val="1E40AF"/>
-                <w:sz w:val="18"/>
+                <w:sz w:val="19"/>
               </w:rPr>
-              <w:t>Đổi hoa thường xen kẽ (Mixed-case Alternation)</w:t>
+              <w:t>Ký tự khoảng trắng thay thế</w:t>
             </w:r>
           </w:p>
         </w:tc>
         <w:tc>
           <w:tcPr>
-            <w:tcW w:type="dxa" w:w="2592"/>
+            <w:tcW w:type="dxa" w:w="2340"/>
             <w:shd w:fill="F9FAFB"/>
             <w:tcMar>
               <w:top w:w="100" w:type="dxa"/>
@@ -600,20 +617,17 @@
             </w:tcMar>
           </w:tcPr>
           <w:p>
-            <w:pPr>
-              <w:jc w:val="left"/>
-            </w:pPr>
             <w:r>
               <w:rPr>
-                <w:sz w:val="18"/>
+                <w:sz w:val="19"/>
               </w:rPr>
-              <w:t>Thay đổi ngẫu nhiên trạng thái viết hoa/thường</w:t>
+              <w:t>Dùng ký tự shell/SQL thay thế dấu cách (0x20)</w:t>
             </w:r>
           </w:p>
         </w:tc>
         <w:tc>
           <w:tcPr>
-            <w:tcW w:type="dxa" w:w="2160"/>
+            <w:tcW w:type="dxa" w:w="2340"/>
             <w:shd w:fill="F9FAFB"/>
             <w:tcMar>
               <w:top w:w="100" w:type="dxa"/>
@@ -623,21 +637,17 @@
             </w:tcMar>
           </w:tcPr>
           <w:p>
-            <w:pPr>
-              <w:jc w:val="left"/>
-            </w:pPr>
             <w:r>
               <w:rPr>
-                <w:rFonts w:ascii="Courier New" w:hAnsi="Courier New"/>
-                <w:sz w:val="17"/>
+                <w:sz w:val="19"/>
               </w:rPr>
-              <w:t>sElEcT, &lt;sCrIpt&gt;</w:t>
+              <w:t>$IFS$9 trong Bash; /**/, +, %09 (Tab)</w:t>
             </w:r>
           </w:p>
         </w:tc>
         <w:tc>
           <w:tcPr>
-            <w:tcW w:type="dxa" w:w="2448"/>
+            <w:tcW w:type="dxa" w:w="2340"/>
             <w:shd w:fill="F9FAFB"/>
             <w:tcMar>
               <w:top w:w="100" w:type="dxa"/>
@@ -647,14 +657,11 @@
             </w:tcMar>
           </w:tcPr>
           <w:p>
-            <w:pPr>
-              <w:jc w:val="left"/>
-            </w:pPr>
             <w:r>
               <w:rPr>
-                <w:sz w:val="18"/>
+                <w:sz w:val="19"/>
               </w:rPr>
-              <w:t>Vượt qua các rule regex thiếu cờ IGNORECASE.</w:t>
+              <w:t>Vượt qua các bộ luật kiểm tra khoảng cách chuẩn giữa mệnh đề.</w:t>
             </w:r>
           </w:p>
         </w:tc>
@@ -662,7 +669,7 @@
       <w:tr>
         <w:tc>
           <w:tcPr>
-            <w:tcW w:type="dxa" w:w="2160"/>
+            <w:tcW w:type="dxa" w:w="2340"/>
             <w:shd w:fill="FFFFFF"/>
             <w:tcMar>
               <w:top w:w="100" w:type="dxa"/>
@@ -672,22 +679,17 @@
             </w:tcMar>
           </w:tcPr>
           <w:p>
-            <w:pPr>
-              <w:jc w:val="left"/>
-            </w:pPr>
             <w:r>
               <w:rPr>
-                <w:b/>
-                <w:color w:val="1E40AF"/>
-                <w:sz w:val="18"/>
+                <w:sz w:val="19"/>
               </w:rPr>
-              <w:t>Ký tự khoảng trắng thay thế (Alternative Whitespace)</w:t>
+              <w:t>Ký tự NULL Byte Injection</w:t>
             </w:r>
           </w:p>
         </w:tc>
         <w:tc>
           <w:tcPr>
-            <w:tcW w:type="dxa" w:w="2592"/>
+            <w:tcW w:type="dxa" w:w="2340"/>
             <w:shd w:fill="FFFFFF"/>
             <w:tcMar>
               <w:top w:w="100" w:type="dxa"/>
@@ -697,20 +699,17 @@
             </w:tcMar>
           </w:tcPr>
           <w:p>
-            <w:pPr>
-              <w:jc w:val="left"/>
-            </w:pPr>
             <w:r>
               <w:rPr>
-                <w:sz w:val="18"/>
+                <w:sz w:val="19"/>
               </w:rPr>
-              <w:t>Sử dụng ký tự shell/SQL thay thế dấu cách 0x20</w:t>
+              <w:t>Chèn ký tự kết thúc chuỗi \x00 hoặc %00</w:t>
             </w:r>
           </w:p>
         </w:tc>
         <w:tc>
           <w:tcPr>
-            <w:tcW w:type="dxa" w:w="2160"/>
+            <w:tcW w:type="dxa" w:w="2340"/>
             <w:shd w:fill="FFFFFF"/>
             <w:tcMar>
               <w:top w:w="100" w:type="dxa"/>
@@ -720,21 +719,17 @@
             </w:tcMar>
           </w:tcPr>
           <w:p>
-            <w:pPr>
-              <w:jc w:val="left"/>
-            </w:pPr>
             <w:r>
               <w:rPr>
-                <w:rFonts w:ascii="Courier New" w:hAnsi="Courier New"/>
-                <w:sz w:val="17"/>
+                <w:sz w:val="19"/>
               </w:rPr>
-              <w:t>$IFS$9, /**/, %09 (Tab)</w:t>
+              <w:t>../../etc/passwd%00.jpg</w:t>
             </w:r>
           </w:p>
         </w:tc>
         <w:tc>
           <w:tcPr>
-            <w:tcW w:type="dxa" w:w="2448"/>
+            <w:tcW w:type="dxa" w:w="2340"/>
             <w:shd w:fill="FFFFFF"/>
             <w:tcMar>
               <w:top w:w="100" w:type="dxa"/>
@@ -744,14 +739,11 @@
             </w:tcMar>
           </w:tcPr>
           <w:p>
-            <w:pPr>
-              <w:jc w:val="left"/>
-            </w:pPr>
             <w:r>
               <w:rPr>
-                <w:sz w:val="18"/>
+                <w:sz w:val="19"/>
               </w:rPr>
-              <w:t>Vượt qua bộ luật kiểm tra sự tồn tại của dấu cách.</w:t>
+              <w:t>Lừa hàm kiểm tra đuôi mở rộng file ở C/C++, cắt cụt chuỗi kiểm tra.</w:t>
             </w:r>
           </w:p>
         </w:tc>
@@ -759,7 +751,7 @@
       <w:tr>
         <w:tc>
           <w:tcPr>
-            <w:tcW w:type="dxa" w:w="2160"/>
+            <w:tcW w:type="dxa" w:w="2340"/>
             <w:shd w:fill="F9FAFB"/>
             <w:tcMar>
               <w:top w:w="100" w:type="dxa"/>
@@ -769,22 +761,17 @@
             </w:tcMar>
           </w:tcPr>
           <w:p>
-            <w:pPr>
-              <w:jc w:val="left"/>
-            </w:pPr>
             <w:r>
               <w:rPr>
-                <w:b/>
-                <w:color w:val="1E40AF"/>
-                <w:sz w:val="18"/>
+                <w:sz w:val="19"/>
               </w:rPr>
-              <w:t>Ký tự NULL Byte Injection</w:t>
+              <w:t>Thực thi lệnh gián tiếp &amp; Đa hình</w:t>
             </w:r>
           </w:p>
         </w:tc>
         <w:tc>
           <w:tcPr>
-            <w:tcW w:type="dxa" w:w="2592"/>
+            <w:tcW w:type="dxa" w:w="2340"/>
             <w:shd w:fill="F9FAFB"/>
             <w:tcMar>
               <w:top w:w="100" w:type="dxa"/>
@@ -794,20 +781,17 @@
             </w:tcMar>
           </w:tcPr>
           <w:p>
-            <w:pPr>
-              <w:jc w:val="left"/>
-            </w:pPr>
             <w:r>
               <w:rPr>
-                <w:sz w:val="18"/>
+                <w:sz w:val="19"/>
               </w:rPr>
-              <w:t>Chèn ký tự kết thúc chuỗi \x00 hoặc %00</w:t>
+              <w:t>Tận dụng biến môi trường, nối chuỗi và subshell</w:t>
             </w:r>
           </w:p>
         </w:tc>
         <w:tc>
           <w:tcPr>
-            <w:tcW w:type="dxa" w:w="2160"/>
+            <w:tcW w:type="dxa" w:w="2340"/>
             <w:shd w:fill="F9FAFB"/>
             <w:tcMar>
               <w:top w:w="100" w:type="dxa"/>
@@ -817,21 +801,17 @@
             </w:tcMar>
           </w:tcPr>
           <w:p>
-            <w:pPr>
-              <w:jc w:val="left"/>
-            </w:pPr>
             <w:r>
               <w:rPr>
-                <w:rFonts w:ascii="Courier New" w:hAnsi="Courier New"/>
-                <w:sz w:val="17"/>
+                <w:sz w:val="19"/>
               </w:rPr>
-              <w:t>../../etc/passwd%00.jpg</w:t>
+              <w:t>c''a""t /e*c/pas*wd, $(echo Y2F0...|base64 -d)</w:t>
             </w:r>
           </w:p>
         </w:tc>
         <w:tc>
           <w:tcPr>
-            <w:tcW w:type="dxa" w:w="2448"/>
+            <w:tcW w:type="dxa" w:w="2340"/>
             <w:shd w:fill="F9FAFB"/>
             <w:tcMar>
               <w:top w:w="100" w:type="dxa"/>
@@ -841,127 +821,31 @@
             </w:tcMar>
           </w:tcPr>
           <w:p>
-            <w:pPr>
-              <w:jc w:val="left"/>
-            </w:pPr>
             <w:r>
               <w:rPr>
-                <w:sz w:val="18"/>
+                <w:sz w:val="19"/>
               </w:rPr>
-              <w:t>Đánh lừa hàm kiểm tra đuôi mở rộng file, cắt cụt chuỗi.</w:t>
-            </w:r>
-          </w:p>
-        </w:tc>
-      </w:tr>
-      <w:tr>
-        <w:tc>
-          <w:tcPr>
-            <w:tcW w:type="dxa" w:w="2160"/>
-            <w:shd w:fill="FFFFFF"/>
-            <w:tcMar>
-              <w:top w:w="100" w:type="dxa"/>
-              <w:bottom w:w="100" w:type="dxa"/>
-              <w:left w:w="120" w:type="dxa"/>
-              <w:right w:w="120" w:type="dxa"/>
-            </w:tcMar>
-          </w:tcPr>
-          <w:p>
-            <w:pPr>
-              <w:jc w:val="left"/>
-            </w:pPr>
-            <w:r>
-              <w:rPr>
-                <w:b/>
-                <w:color w:val="1E40AF"/>
-                <w:sz w:val="18"/>
-              </w:rPr>
-              <w:t>Thực thi đa hình (Polymorphic Execution)</w:t>
-            </w:r>
-          </w:p>
-        </w:tc>
-        <w:tc>
-          <w:tcPr>
-            <w:tcW w:type="dxa" w:w="2592"/>
-            <w:shd w:fill="FFFFFF"/>
-            <w:tcMar>
-              <w:top w:w="100" w:type="dxa"/>
-              <w:bottom w:w="100" w:type="dxa"/>
-              <w:left w:w="120" w:type="dxa"/>
-              <w:right w:w="120" w:type="dxa"/>
-            </w:tcMar>
-          </w:tcPr>
-          <w:p>
-            <w:pPr>
-              <w:jc w:val="left"/>
-            </w:pPr>
-            <w:r>
-              <w:rPr>
-                <w:sz w:val="18"/>
-              </w:rPr>
-              <w:t>Tận dụng biến môi trường, nối chuỗi và subshell</w:t>
-            </w:r>
-          </w:p>
-        </w:tc>
-        <w:tc>
-          <w:tcPr>
-            <w:tcW w:type="dxa" w:w="2160"/>
-            <w:shd w:fill="FFFFFF"/>
-            <w:tcMar>
-              <w:top w:w="100" w:type="dxa"/>
-              <w:bottom w:w="100" w:type="dxa"/>
-              <w:left w:w="120" w:type="dxa"/>
-              <w:right w:w="120" w:type="dxa"/>
-            </w:tcMar>
-          </w:tcPr>
-          <w:p>
-            <w:pPr>
-              <w:jc w:val="left"/>
-            </w:pPr>
-            <w:r>
-              <w:rPr>
-                <w:rFonts w:ascii="Courier New" w:hAnsi="Courier New"/>
-                <w:sz w:val="17"/>
-              </w:rPr>
-              <w:t>$(echo Y2F0...|base64 -d)</w:t>
-            </w:r>
-          </w:p>
-        </w:tc>
-        <w:tc>
-          <w:tcPr>
-            <w:tcW w:type="dxa" w:w="2448"/>
-            <w:shd w:fill="FFFFFF"/>
-            <w:tcMar>
-              <w:top w:w="100" w:type="dxa"/>
-              <w:bottom w:w="100" w:type="dxa"/>
-              <w:left w:w="120" w:type="dxa"/>
-              <w:right w:w="120" w:type="dxa"/>
-            </w:tcMar>
-          </w:tcPr>
-          <w:p>
-            <w:pPr>
-              <w:jc w:val="left"/>
-            </w:pPr>
-            <w:r>
-              <w:rPr>
-                <w:sz w:val="18"/>
-              </w:rPr>
-              <w:t>Không chứa bất kỳ từ khóa tĩnh nào, vô hiệu hóa 100% chữ ký.</w:t>
+              <w:t>Không chứa bất kỳ từ khóa tĩnh nào trong payload, vô hiệu hóa chữ ký tĩnh.</w:t>
             </w:r>
           </w:p>
         </w:tc>
       </w:tr>
     </w:tbl>
-    <w:p/>
+    <w:p>
+      <w:pPr>
+        <w:spacing w:after="120"/>
+      </w:pPr>
+    </w:p>
     <w:p>
       <w:pPr>
         <w:keepNext/>
-        <w:spacing w:before="320" w:after="120"/>
+        <w:spacing w:before="280" w:after="120"/>
       </w:pPr>
       <w:r>
         <w:rPr>
           <w:b/>
-          <w:color w:val="0F2454"/>
-          <w:sz w:val="27"/>
+          <w:color w:val="0F766E"/>
+          <w:sz w:val="28"/>
         </w:rPr>
         <w:t>1.2. CƠ CHẾ HOẠT ĐỘNG CỦA TƯỜNG LỬA ỨNG DỤNG WEB (WAF) VÀ GIỚI HẠN CỦA PHƯƠNG PHÁP TRUYỀN THỐNG</w:t>
       </w:r>
@@ -969,15 +853,15 @@
     <w:p>
       <w:pPr>
         <w:keepNext/>
-        <w:spacing w:before="240" w:after="80"/>
+        <w:spacing w:before="200" w:after="80"/>
       </w:pPr>
       <w:r>
         <w:rPr>
           <w:b/>
-          <w:color w:val="1E40AF"/>
+          <w:color w:val="1E3A8A"/>
           <w:sz w:val="24"/>
         </w:rPr>
-        <w:t>1.2.1. Nguyên lý hoạt động của WAF dựa trên luật (Signature-Based Inspection)</w:t>
+        <w:t>1.2.1. Phân loại thế hệ Tường lửa và Nguyên lý Cổng tầng ứng dụng (Application-Level Gateway)</w:t>
       </w:r>
     </w:p>
     <w:p>
@@ -989,20 +873,83 @@
         <w:rPr>
           <w:b w:val="0"/>
           <w:i w:val="0"/>
-          <w:sz w:val="22"/>
         </w:rPr>
-        <w:t>Tường lửa ứng dụng web (WAF) đóng vai trò là một lớp Reverse Proxy bảo vệ đứng trung gian giữa mạng Internet công cộng và máy chủ ứng dụng nội bộ. Khi một yêu cầu HTTP gửi đến, WAF thực hiện phân tích cú pháp (HTTP Parsing), bóc tách các trường URL Path, Query Parameters, Headers và Body, đưa qua bộ chuẩn hóa (Normalizer) rồi so khớp với tập hợp các biểu thức chính quy (Regular Expressions) đại diện cho các mẫu tấn công đã biết. Bộ luật nguồn mở chuẩn mực công nghiệp tiêu biểu nhất hiện nay là OWASP ModSecurity Core Rule Set (CRS v4.0) [Ref 14].</w:t>
+        <w:t>Trong công trình giáo trình kinh điển Cryptography and Network Security: Principles and Practice (Chương 20: Firewalls) [Ref 01], Giáo sư William Stallings đã hệ thống hóa tường lửa thành ba thế hệ công nghệ tiến hóa:</w:t>
+      </w:r>
+    </w:p>
+    <w:p>
+      <w:pPr>
+        <w:pStyle w:val="ListBullet"/>
+        <w:spacing w:after="60" w:line="276" w:lineRule="auto"/>
+        <w:jc w:val="both"/>
+      </w:pPr>
+      <w:r>
+        <w:rPr>
+          <w:b/>
+          <w:color w:val="111827"/>
+        </w:rPr>
+        <w:t xml:space="preserve">1. Bộ lọc gói tin (Packet Filtering Firewall): </w:t>
+      </w:r>
+      <w:r>
+        <w:t>Hoạt động ở tầng Mạng và Vận chuyển (Layer 3 &amp; 4), chỉ kiểm tra IP và cổng TCP/UDP mà không hiểu nội dung ứng dụng.</w:t>
+      </w:r>
+    </w:p>
+    <w:p>
+      <w:pPr>
+        <w:pStyle w:val="ListBullet"/>
+        <w:spacing w:after="60" w:line="276" w:lineRule="auto"/>
+        <w:jc w:val="both"/>
+      </w:pPr>
+      <w:r>
+        <w:rPr>
+          <w:b/>
+          <w:color w:val="111827"/>
+        </w:rPr>
+        <w:t xml:space="preserve">2. Bộ lọc trạng thái (Stateful Inspection Firewall): </w:t>
+      </w:r>
+      <w:r>
+        <w:t>Theo dõi trạng thái kết nối TCP (SYN, ACK, ESTABLISHED) ngăn gói tin giả mạo phiên.</w:t>
+      </w:r>
+    </w:p>
+    <w:p>
+      <w:pPr>
+        <w:pStyle w:val="ListBullet"/>
+        <w:spacing w:after="60" w:line="276" w:lineRule="auto"/>
+        <w:jc w:val="both"/>
+      </w:pPr>
+      <w:r>
+        <w:rPr>
+          <w:b/>
+          <w:color w:val="111827"/>
+        </w:rPr>
+        <w:t xml:space="preserve">3. Cổng tầng ứng dụng (Application-Level Gateway / Reverse Proxy WAF): </w:t>
+      </w:r>
+      <w:r>
+        <w:t>Là thế hệ tường lửa tiên tiến nhất, hoạt động như một Relay Proxy hoàn chỉnh ở Layer 7. Cổng tiếp nhận toàn bộ kết nối TCP từ máy khách, giải nén và tái cấu trúc hoàn chỉnh giao thức HTTP/HTTPS, kiểm tra toàn diện Payload trước khi chuyển tiếp về máy chủ nội bộ.</w:t>
+      </w:r>
+    </w:p>
+    <w:p>
+      <w:pPr>
+        <w:spacing w:after="80" w:line="288" w:lineRule="auto"/>
+        <w:jc w:val="both"/>
+      </w:pPr>
+      <w:r>
+        <w:rPr>
+          <w:b w:val="0"/>
+          <w:i w:val="0"/>
+        </w:rPr>
+        <w:t>Theo kiến trúc điều phối lưu lượng trong cuốn NGINX Cookbook [Ref 05], cơ chế Reverse Proxy WAF mang lại những lợi ích bảo mật vượt trội: ẩn giấu máy chủ gốc (Origin Cloaking), khử trùng tiêu đề giao thức (Hop-by-hop headers sanitization), và cho phép phân luồng kiểm tra chuyên sâu qua Normalizer, Rule Engine, ML Detector và Rate Limiter.</w:t>
       </w:r>
     </w:p>
     <w:p>
       <w:pPr>
         <w:keepNext/>
-        <w:spacing w:before="240" w:after="80"/>
+        <w:spacing w:before="200" w:after="80"/>
       </w:pPr>
       <w:r>
         <w:rPr>
           <w:b/>
-          <w:color w:val="1E40AF"/>
+          <w:color w:val="1E3A8A"/>
           <w:sz w:val="24"/>
         </w:rPr>
         <w:t>1.2.2. Cơ chế chấm điểm bất thường lũy tiến (Anomaly Scoring System)</w:t>
@@ -1017,9 +964,8 @@
         <w:rPr>
           <w:b w:val="0"/>
           <w:i w:val="0"/>
-          <w:sz w:val="22"/>
         </w:rPr>
-        <w:t>Khác với phương thức chặn tức thời cổ điển (Single-Rule Disruption), chuẩn OWASP ModSecurity CRS v4.0 áp dụng cơ chế Anomaly Scoring lũy tiến [Ref 14]:</w:t>
+        <w:t>Khác với phương thức chặn tức thời khi khớp một luật duy nhất (Single-Rule Blocking), chuẩn công nghiệp OWASP ModSecurity Core Rule Set (CRS v4.0) [Ref 07] áp dụng kiến trúc Collaborative Anomaly Scoring System. Mỗi quy tắc khi kích hoạt sẽ gán trọng số rủi ro tích lũy:</w:t>
       </w:r>
     </w:p>
     <w:p>
@@ -1031,15 +977,12 @@
       <w:r>
         <w:rPr>
           <w:b/>
-          <w:sz w:val="22"/>
+          <w:color w:val="111827"/>
         </w:rPr>
-        <w:t xml:space="preserve">Phân tầng mức độ nghiêm trọng: </w:t>
+        <w:t xml:space="preserve">CRITICAL (+5 điểm): </w:t>
       </w:r>
       <w:r>
-        <w:rPr>
-          <w:sz w:val="22"/>
-        </w:rPr>
-        <w:t>Mỗi quy tắc khi khớp sẽ gán điểm bất thường: CRITICAL (+5 điểm), HIGH (+4 điểm), MEDIUM (+3 điểm), LOW (+2 điểm).</w:t>
+        <w:t>Khớp trực tiếp cú pháp khai thác SQLi, OS Command Injection.</w:t>
       </w:r>
     </w:p>
     <w:p>
@@ -1051,22 +994,52 @@
       <w:r>
         <w:rPr>
           <w:b/>
-          <w:sz w:val="22"/>
+          <w:color w:val="111827"/>
         </w:rPr>
-        <w:t xml:space="preserve">Tích lũy điểm bất thường: </w:t>
+        <w:t xml:space="preserve">HIGH (+4 điểm): </w:t>
       </w:r>
       <w:r>
+        <w:t>Phát hiện hành vi quét lỗ hổng, traversal.</w:t>
+      </w:r>
+    </w:p>
+    <w:p>
+      <w:pPr>
+        <w:pStyle w:val="ListBullet"/>
+        <w:spacing w:after="60" w:line="276" w:lineRule="auto"/>
+        <w:jc w:val="both"/>
+      </w:pPr>
+      <w:r>
         <w:rPr>
-          <w:sz w:val="22"/>
+          <w:b/>
+          <w:color w:val="111827"/>
         </w:rPr>
-        <w:t>Điểm bất thường tích lũy được tính bằng tổng điểm của tất cả quy tắc bị kích hoạt trên toàn bộ các thành phần của yêu cầu HTTP:</w:t>
+        <w:t xml:space="preserve">MEDIUM (+3 điểm): </w:t>
+      </w:r>
+      <w:r>
+        <w:t>Phát hiện từ khóa nhạy cảm, ký tự đặc biệt.</w:t>
+      </w:r>
+    </w:p>
+    <w:p>
+      <w:pPr>
+        <w:pStyle w:val="ListBullet"/>
+        <w:spacing w:after="60" w:line="276" w:lineRule="auto"/>
+        <w:jc w:val="both"/>
+      </w:pPr>
+      <w:r>
+        <w:rPr>
+          <w:b/>
+          <w:color w:val="111827"/>
+        </w:rPr>
+        <w:t xml:space="preserve">LOW (+2 điểm): </w:t>
+      </w:r>
+      <w:r>
+        <w:t>Sai lệch chuẩn giao thức HTTP.</w:t>
       </w:r>
     </w:p>
     <w:tbl>
       <w:tblPr>
         <w:tblW w:type="auto" w:w="0"/>
         <w:jc w:val="center"/>
-        <w:tblLayout w:type="fixed"/>
         <w:tblLook w:firstColumn="1" w:firstRow="1" w:lastColumn="0" w:lastRow="0" w:noHBand="0" w:noVBand="1" w:val="04A0"/>
       </w:tblPr>
       <w:tblGrid>
@@ -1086,31 +1059,28 @@
           </w:tcPr>
           <w:p>
             <w:pPr>
-              <w:spacing w:after="40"/>
               <w:jc w:val="center"/>
             </w:pPr>
             <w:r>
               <w:rPr>
-                <w:rFonts w:ascii="Courier New" w:hAnsi="Courier New"/>
                 <w:b/>
-                <w:color w:val="1E3A8A"/>
-                <w:sz w:val="23"/>
+                <w:color w:val="1E293B"/>
+                <w:sz w:val="22"/>
               </w:rPr>
-              <w:t>S_anomaly = SUM( Score(rule_i) )  cho mọi rule_i được kích hoạt</w:t>
+              <w:t>S_anomaly = sum_{i in Rules matched} Score(i)</w:t>
             </w:r>
           </w:p>
           <w:p>
             <w:pPr>
-              <w:spacing w:after="0"/>
               <w:jc w:val="center"/>
             </w:pPr>
             <w:r>
               <w:rPr>
                 <w:i/>
-                <w:color w:val="4B5563"/>
+                <w:color w:val="64748B"/>
                 <w:sz w:val="19"/>
               </w:rPr>
-              <w:t>Công thức chấm điểm bất thường lũy tiến theo chuẩn OWASP ModSecurity CRS v4.0</w:t>
+              <w:t>Công thức tính Điểm bất thường tích lũy (Cumulative Anomaly Score) theo chuẩn OWASP CRS v4.0</w:t>
             </w:r>
           </w:p>
         </w:tc>
@@ -1118,7 +1088,7 @@
     </w:tbl>
     <w:p>
       <w:pPr>
-        <w:spacing w:after="40"/>
+        <w:spacing w:after="80"/>
       </w:pPr>
     </w:p>
     <w:p>
@@ -1130,20 +1100,19 @@
         <w:rPr>
           <w:b w:val="0"/>
           <w:i w:val="0"/>
-          <w:sz w:val="22"/>
         </w:rPr>
-        <w:t>Chỉ khi tổng điểm S_anomaly vượt ngưỡng quy định (thường là 5 điểm), WAF mới ngắt kết nối và trả về mã HTTP 403 Forbidden. Cơ chế này giúp giảm thiểu việc chặn nhầm người dùng hợp lệ có chứa một vài ký tự đặc biệt ngẫu nhiên.</w:t>
+        <w:t>Chỉ khi S_anomaly &gt;= Anomaly Threshold (mặc định = 5 điểm), WAF mới thực hiện ngắt kết nối và trả về mã lỗi HTTP 403 Forbidden. Mô hình này giảm thiểu đáng kể tỷ lệ chặn nhầm các yêu cầu hợp lệ.</w:t>
       </w:r>
     </w:p>
     <w:p>
       <w:pPr>
         <w:keepNext/>
-        <w:spacing w:before="240" w:after="80"/>
+        <w:spacing w:before="200" w:after="80"/>
       </w:pPr>
       <w:r>
         <w:rPr>
           <w:b/>
-          <w:color w:val="1E40AF"/>
+          <w:color w:val="1E3A8A"/>
           <w:sz w:val="24"/>
         </w:rPr>
         <w:t>1.2.3. Những giới hạn cốt tử của phương pháp dựa trên luật tĩnh</w:t>
@@ -1158,9 +1127,8 @@
         <w:rPr>
           <w:b w:val="0"/>
           <w:i w:val="0"/>
-          <w:sz w:val="22"/>
         </w:rPr>
-        <w:t>Mặc dù đóng vai trò hàng rào lọc thô không thể thiếu nhờ tốc độ xử lý nhanh, WAF dựa trên chữ ký tĩnh bộc lộ 3 nhược điểm cốt tử:</w:t>
+        <w:t>Mặc dù đóng vai trò là hàng rào lọc thô không thể thiếu, WAF dựa trên luật tĩnh bộc lộ những khiếm khuyết nội tại theo phân tích của William Stallings [Ref 01]:</w:t>
       </w:r>
     </w:p>
     <w:p>
@@ -1172,15 +1140,12 @@
       <w:r>
         <w:rPr>
           <w:b/>
-          <w:sz w:val="22"/>
+          <w:color w:val="111827"/>
         </w:rPr>
-        <w:t xml:space="preserve">1. Bất lực trước biến thể mới và Zero-day attacks: </w:t>
+        <w:t xml:space="preserve">1. Bất lực trước biến thể mới và tấn công chưa từng biết (Zero-day Attacks): </w:t>
       </w:r>
       <w:r>
-        <w:rPr>
-          <w:sz w:val="22"/>
-        </w:rPr>
-        <w:t>Luật tĩnh chỉ có thể phát hiện những gì đã được định nghĩa từ trước. Khi gặp các cú pháp đột biến hoặc payload chưa từng được ghi nhận, luật tĩnh hoàn toàn bị qua mặt.</w:t>
+        <w:t>Luật chữ ký chỉ phát hiện được những gì đã định nghĩa trước.</w:t>
       </w:r>
     </w:p>
     <w:p>
@@ -1192,15 +1157,12 @@
       <w:r>
         <w:rPr>
           <w:b/>
-          <w:sz w:val="22"/>
+          <w:color w:val="111827"/>
         </w:rPr>
-        <w:t xml:space="preserve">2. Nghịch lý giữa False Positive và False Negative: </w:t>
+        <w:t xml:space="preserve">2. Nghịch lý False Positive vs False Negative: </w:t>
       </w:r>
       <w:r>
-        <w:rPr>
-          <w:sz w:val="22"/>
-        </w:rPr>
-        <w:t>Nếu siết chặt regex để chặn triệt để, hệ thống sẽ chặn nhầm các yêu cầu hợp lệ của người dùng (tăng False Positive). Nếu nới lỏng regex, kẻ tấn công dễ dàng luồn lách qua các kỹ thuật làm mờ (tăng False Negative).</w:t>
+        <w:t>Viết regex quá chặt chẽ sẽ chặn nhầm văn bản nghiệp vụ lành tính (báo động giả cao); nới lỏng regex sẽ bị kẻ tấn công làm mờ payload vượt qua (bỏ lọt cao).</w:t>
       </w:r>
     </w:p>
     <w:p>
@@ -1212,27 +1174,24 @@
       <w:r>
         <w:rPr>
           <w:b/>
-          <w:sz w:val="22"/>
+          <w:color w:val="111827"/>
         </w:rPr>
-        <w:t xml:space="preserve">3. Suy giảm hiệu năng và nguy cơ ReDoS: </w:t>
+        <w:t xml:space="preserve">3. Chi phí tính toán tăng mạnh (Regex Performance Degradation): </w:t>
       </w:r>
       <w:r>
-        <w:rPr>
-          <w:sz w:val="22"/>
-        </w:rPr>
-        <w:t>Khi tập luật phình to lên hàng nghìn regex, chi phí CPU tăng đột biến. Các biểu thức chính quy lồng nhau có nguy cơ dính lỗ hổng ReDoS (Regular Expression Denial of Service), khiến độ trễ proxy tăng vọt, gây nghẽn cổ chai cho toàn bộ hệ thống.</w:t>
+        <w:t>Hàng nghìn regex phức tạp gây suy giảm thông lượng và tiềm ẩn nguy cơ dính tấn công ReDoS.</w:t>
       </w:r>
     </w:p>
     <w:p>
       <w:pPr>
         <w:keepNext/>
-        <w:spacing w:before="320" w:after="120"/>
+        <w:spacing w:before="280" w:after="120"/>
       </w:pPr>
       <w:r>
         <w:rPr>
           <w:b/>
-          <w:color w:val="0F2454"/>
-          <w:sz w:val="27"/>
+          <w:color w:val="0F766E"/>
+          <w:sz w:val="28"/>
         </w:rPr>
         <w:t>1.3. CƠ SỞ LÝ THUYẾT VỀ TRÍCH XUẤT ĐẶC TRƯNG VÀ HỌC MÁY TRONG PHÁT HIỆN TẤN CÔNG WEB</w:t>
       </w:r>
@@ -1240,15 +1199,29 @@
     <w:p>
       <w:pPr>
         <w:keepNext/>
-        <w:spacing w:before="240" w:after="80"/>
+        <w:spacing w:before="200" w:after="80"/>
       </w:pPr>
       <w:r>
         <w:rPr>
           <w:b/>
-          <w:color w:val="1E40AF"/>
+          <w:color w:val="1E3A8A"/>
           <w:sz w:val="24"/>
         </w:rPr>
         <w:t>1.3.1. Phương pháp trích xuất đặc trưng hình thái học và thống kê chuỗi HTTP</w:t>
+      </w:r>
+    </w:p>
+    <w:p>
+      <w:pPr>
+        <w:keepNext/>
+        <w:spacing w:before="120" w:after="40"/>
+      </w:pPr>
+      <w:r>
+        <w:rPr>
+          <w:b/>
+          <w:color w:val="374151"/>
+          <w:sz w:val="22"/>
+        </w:rPr>
+        <w:t>1. Cơ sở toán học của độ hỗn loạn thông tin Shannon Entropy</w:t>
       </w:r>
     </w:p>
     <w:p>
@@ -1260,44 +1233,14 @@
         <w:rPr>
           <w:b w:val="0"/>
           <w:i w:val="0"/>
-          <w:sz w:val="22"/>
         </w:rPr>
-        <w:t>Dựa trên công trình nghiên cứu của C. Torrano-Gimenez et al. (Wiley Security and Communication Networks 2015) [Ref 08], thay vì xử lý chuỗi bằng các mô hình NLP nặng nề (như Transformer/BERT tiêu tốn 50-150ms phần cứng GPU), ta có thể vector hóa yêu cầu HTTP thành các đặc trưng hình thái học (Morphological Features) và thống kê với thời gian xử lý siêu thấp (&lt; 0.5ms trên CPU thông thường).</w:t>
-      </w:r>
-    </w:p>
-    <w:p>
-      <w:pPr>
-        <w:keepNext/>
-        <w:spacing w:before="160" w:after="40"/>
-      </w:pPr>
-      <w:r>
-        <w:rPr>
-          <w:b/>
-          <w:color w:val="047857"/>
-          <w:sz w:val="22"/>
-        </w:rPr>
-        <w:t>Cơ sở toán học của độ hỗn loạn thông tin Shannon Entropy</w:t>
-      </w:r>
-    </w:p>
-    <w:p>
-      <w:pPr>
-        <w:spacing w:after="80" w:line="288" w:lineRule="auto"/>
-        <w:jc w:val="both"/>
-      </w:pPr>
-      <w:r>
-        <w:rPr>
-          <w:b w:val="0"/>
-          <w:i w:val="0"/>
-          <w:sz w:val="22"/>
-        </w:rPr>
-        <w:t>Độ hỗn loạn thông tin Shannon Entropy được áp dụng để đo lường mức độ ngẫu nhiên và phân tán của các ký tự xuất hiện trong chuỗi payload S có độ dài N:</w:t>
+        <w:t>Theo giáo trình kinh điển Cryptography: Theory and Practice của Douglas R. Stinson và Maura B. Paterson (Chương 2: Information Theory) [Ref 02], độ hỗn loạn thông tin (Shannon Entropy) là thước đo định lượng toán học về tính ngẫu nhiên, độ bất định và lượng thông tin trung bình chứa trong một biến ngẫu nhiên rời rạc. Cho chuỗi ký tự payload S có độ dài L, xác suất p(c_i) xuất hiện của ký tự c_i là count(c_i) / L. Độ hỗn loạn Shannon Entropy H(S) (tính theo bit) được định nghĩa:</w:t>
       </w:r>
     </w:p>
     <w:tbl>
       <w:tblPr>
         <w:tblW w:type="auto" w:w="0"/>
         <w:jc w:val="center"/>
-        <w:tblLayout w:type="fixed"/>
         <w:tblLook w:firstColumn="1" w:firstRow="1" w:lastColumn="0" w:lastRow="0" w:noHBand="0" w:noVBand="1" w:val="04A0"/>
       </w:tblPr>
       <w:tblGrid>
@@ -1317,31 +1260,28 @@
           </w:tcPr>
           <w:p>
             <w:pPr>
-              <w:spacing w:after="40"/>
               <w:jc w:val="center"/>
             </w:pPr>
             <w:r>
               <w:rPr>
-                <w:rFonts w:ascii="Courier New" w:hAnsi="Courier New"/>
                 <w:b/>
-                <w:color w:val="1E3A8A"/>
-                <w:sz w:val="23"/>
+                <w:color w:val="1E293B"/>
+                <w:sz w:val="22"/>
               </w:rPr>
-              <w:t>H(S) = - SUM_{i=1..K} [ p(c_i) * log2( p(c_i) ) ]</w:t>
+              <w:t>H(S) = - sum_{i=1}^{k} p(c_i) * log_2 p(c_i)</w:t>
             </w:r>
           </w:p>
           <w:p>
             <w:pPr>
-              <w:spacing w:after="0"/>
               <w:jc w:val="center"/>
             </w:pPr>
             <w:r>
               <w:rPr>
                 <w:i/>
-                <w:color w:val="4B5563"/>
+                <w:color w:val="64748B"/>
                 <w:sz w:val="19"/>
               </w:rPr>
-              <w:t>Trong đó: K là số ký tự phân biệt; p(c_i) = f(c_i)/N là xác suất xuất hiện của ký tự c_i</w:t>
+              <w:t>Công thức toán học tính toán Shannon Entropy H(S) của chuỗi payload (Stinson &amp; Paterson, 2018)</w:t>
             </w:r>
           </w:p>
         </w:tc>
@@ -1349,7 +1289,7 @@
     </w:tbl>
     <w:p>
       <w:pPr>
-        <w:spacing w:after="40"/>
+        <w:spacing w:after="80"/>
       </w:pPr>
     </w:p>
     <w:p>
@@ -1361,23 +1301,22 @@
         <w:rPr>
           <w:b w:val="0"/>
           <w:i w:val="0"/>
-          <w:sz w:val="22"/>
         </w:rPr>
-        <w:t>Ý nghĩa trong an ninh mạng: Chuỗi văn bản tiếng Anh hoặc tiếng Việt thông thường có entropy thấp (2.0 - 3.5). Ngược lại, chuỗi chứa payload tấn công bị làm mờ (mã hóa Base64, Hex, URL kép, shellcode) có độ phân tán ký tự rất cao, đẩy entropy lên ngưỡng cao đột biến (H(S) &gt; 4.5). Đây là một chỉ dấu cực mạnh để nhận diện payload độc hại.</w:t>
+        <w:t>Ý nghĩa an ninh thông tin: Văn bản tự nhiên và tham số lành tính có entropy dao động từ 2.0 đến 3.5. Trong khi đó, payload tấn công làm mờ (Base64, Hex, Shellcode, SQLi đa tầng) có độ phân tán ký tự đều bất thường, khiến entropy tăng vọt lên mức &gt;= 3.8 - 4.5. Do đó, Shannon Entropy là đặc trưng hình thái học cực kỳ nhạy cảm để phát hiện dấu hiệu bất thường mà không cần từ điển chữ ký tĩnh.</w:t>
       </w:r>
     </w:p>
     <w:p>
       <w:pPr>
         <w:keepNext/>
-        <w:spacing w:before="160" w:after="40"/>
+        <w:spacing w:before="120" w:after="40"/>
       </w:pPr>
       <w:r>
         <w:rPr>
           <w:b/>
-          <w:color w:val="047857"/>
+          <w:color w:val="374151"/>
           <w:sz w:val="22"/>
         </w:rPr>
-        <w:t>Không gian 17 đặc trưng hình thái chuẩn tắc (Canonical 17-D Feature Vector)</w:t>
+        <w:t>2. Không gian 17 đặc trưng hình thái chuẩn tắc (Canonical 17-D Feature Vector)</w:t>
       </w:r>
     </w:p>
     <w:p>
@@ -1389,1372 +1328,56 @@
         <w:rPr>
           <w:b w:val="0"/>
           <w:i w:val="0"/>
-          <w:sz w:val="22"/>
         </w:rPr>
-        <w:t>Hệ thống chuẩn hóa không gian vector đặc trưng thành 17 chiều độc lập, tương thích 100% giữa bộ trích xuất dữ liệu của ML Engine và bộ suy luận thời gian thực của Gateway [Ref 08]:</w:t>
+        <w:t>Kế thừa và chuẩn hóa công trình nghiên cứu nền tảng của C. Torrano-Gimenez et al. (Wiley Security and Communication Networks 2015) [Ref 08] và bài báo tổng quan SQLi của M. Hasan et al. (IEEE Access 2023) [Ref 10], đồ án xây dựng vector 17 chiều chuẩn tắc gồm 2 nhóm:</w:t>
       </w:r>
     </w:p>
-    <w:tbl>
-      <w:tblPr>
-        <w:tblW w:type="auto" w:w="0"/>
-        <w:jc w:val="center"/>
-        <w:tblLayout w:type="fixed"/>
-        <w:tblLook w:firstColumn="1" w:firstRow="1" w:lastColumn="0" w:lastRow="0" w:noHBand="0" w:noVBand="1" w:val="04A0"/>
-      </w:tblPr>
-      <w:tblGrid>
-        <w:gridCol w:w="3120"/>
-        <w:gridCol w:w="3120"/>
-        <w:gridCol w:w="3120"/>
-      </w:tblGrid>
-      <w:tr>
-        <w:tc>
-          <w:tcPr>
-            <w:tcW w:type="dxa" w:w="864"/>
-            <w:shd w:fill="047857"/>
-            <w:tcMar>
-              <w:top w:w="120" w:type="dxa"/>
-              <w:bottom w:w="120" w:type="dxa"/>
-              <w:left w:w="100" w:type="dxa"/>
-              <w:right w:w="100" w:type="dxa"/>
-            </w:tcMar>
-          </w:tcPr>
-          <w:p>
-            <w:pPr>
-              <w:jc w:val="center"/>
-            </w:pPr>
-            <w:r>
-              <w:rPr>
-                <w:b/>
-                <w:color w:val="FFFFFF"/>
-                <w:sz w:val="19"/>
-              </w:rPr>
-              <w:t>STT</w:t>
-            </w:r>
-          </w:p>
-        </w:tc>
-        <w:tc>
-          <w:tcPr>
-            <w:tcW w:type="dxa" w:w="3168"/>
-            <w:shd w:fill="047857"/>
-            <w:tcMar>
-              <w:top w:w="120" w:type="dxa"/>
-              <w:bottom w:w="120" w:type="dxa"/>
-              <w:left w:w="100" w:type="dxa"/>
-              <w:right w:w="100" w:type="dxa"/>
-            </w:tcMar>
-          </w:tcPr>
-          <w:p>
-            <w:pPr>
-              <w:jc w:val="center"/>
-            </w:pPr>
-            <w:r>
-              <w:rPr>
-                <w:b/>
-                <w:color w:val="FFFFFF"/>
-                <w:sz w:val="19"/>
-              </w:rPr>
-              <w:t>Tên Đặc Trưng</w:t>
-            </w:r>
-          </w:p>
-        </w:tc>
-        <w:tc>
-          <w:tcPr>
-            <w:tcW w:type="dxa" w:w="5328"/>
-            <w:shd w:fill="047857"/>
-            <w:tcMar>
-              <w:top w:w="120" w:type="dxa"/>
-              <w:bottom w:w="120" w:type="dxa"/>
-              <w:left w:w="100" w:type="dxa"/>
-              <w:right w:w="100" w:type="dxa"/>
-            </w:tcMar>
-          </w:tcPr>
-          <w:p>
-            <w:pPr>
-              <w:jc w:val="center"/>
-            </w:pPr>
-            <w:r>
-              <w:rPr>
-                <w:b/>
-                <w:color w:val="FFFFFF"/>
-                <w:sz w:val="19"/>
-              </w:rPr>
-              <w:t>Ý Nghĩa Phân Tích An Ninh Mạng</w:t>
-            </w:r>
-          </w:p>
-        </w:tc>
-      </w:tr>
-      <w:tr>
-        <w:tc>
-          <w:tcPr>
-            <w:tcW w:type="dxa" w:w="864"/>
-            <w:shd w:fill="F9FAFB"/>
-            <w:tcMar>
-              <w:top w:w="80" w:type="dxa"/>
-              <w:bottom w:w="80" w:type="dxa"/>
-              <w:left w:w="100" w:type="dxa"/>
-              <w:right w:w="100" w:type="dxa"/>
-            </w:tcMar>
-          </w:tcPr>
-          <w:p>
-            <w:pPr>
-              <w:jc w:val="center"/>
-            </w:pPr>
-            <w:r>
-              <w:rPr>
-                <w:sz w:val="18"/>
-              </w:rPr>
-              <w:t>1</w:t>
-            </w:r>
-          </w:p>
-        </w:tc>
-        <w:tc>
-          <w:tcPr>
-            <w:tcW w:type="dxa" w:w="3168"/>
-            <w:shd w:fill="F9FAFB"/>
-            <w:tcMar>
-              <w:top w:w="80" w:type="dxa"/>
-              <w:bottom w:w="80" w:type="dxa"/>
-              <w:left w:w="100" w:type="dxa"/>
-              <w:right w:w="100" w:type="dxa"/>
-            </w:tcMar>
-          </w:tcPr>
-          <w:p>
-            <w:pPr>
-              <w:jc w:val="left"/>
-            </w:pPr>
-            <w:r>
-              <w:rPr>
-                <w:rFonts w:ascii="Courier New" w:hAnsi="Courier New"/>
-                <w:b/>
-                <w:color w:val="047857"/>
-                <w:sz w:val="18"/>
-              </w:rPr>
-              <w:t>payload_length</w:t>
-            </w:r>
-          </w:p>
-        </w:tc>
-        <w:tc>
-          <w:tcPr>
-            <w:tcW w:type="dxa" w:w="5328"/>
-            <w:shd w:fill="F9FAFB"/>
-            <w:tcMar>
-              <w:top w:w="80" w:type="dxa"/>
-              <w:bottom w:w="80" w:type="dxa"/>
-              <w:left w:w="100" w:type="dxa"/>
-              <w:right w:w="100" w:type="dxa"/>
-            </w:tcMar>
-          </w:tcPr>
-          <w:p>
-            <w:pPr>
-              <w:jc w:val="left"/>
-            </w:pPr>
-            <w:r>
-              <w:rPr>
-                <w:sz w:val="18"/>
-              </w:rPr>
-              <w:t>Độ dài chuỗi; tấn công SQLi dạng UNION hoặc buffer overflow thường có độ dài lớn vượt trội.</w:t>
-            </w:r>
-          </w:p>
-        </w:tc>
-      </w:tr>
-      <w:tr>
-        <w:tc>
-          <w:tcPr>
-            <w:tcW w:type="dxa" w:w="864"/>
-            <w:shd w:fill="FFFFFF"/>
-            <w:tcMar>
-              <w:top w:w="80" w:type="dxa"/>
-              <w:bottom w:w="80" w:type="dxa"/>
-              <w:left w:w="100" w:type="dxa"/>
-              <w:right w:w="100" w:type="dxa"/>
-            </w:tcMar>
-          </w:tcPr>
-          <w:p>
-            <w:pPr>
-              <w:jc w:val="center"/>
-            </w:pPr>
-            <w:r>
-              <w:rPr>
-                <w:sz w:val="18"/>
-              </w:rPr>
-              <w:t>2</w:t>
-            </w:r>
-          </w:p>
-        </w:tc>
-        <w:tc>
-          <w:tcPr>
-            <w:tcW w:type="dxa" w:w="3168"/>
-            <w:shd w:fill="FFFFFF"/>
-            <w:tcMar>
-              <w:top w:w="80" w:type="dxa"/>
-              <w:bottom w:w="80" w:type="dxa"/>
-              <w:left w:w="100" w:type="dxa"/>
-              <w:right w:w="100" w:type="dxa"/>
-            </w:tcMar>
-          </w:tcPr>
-          <w:p>
-            <w:pPr>
-              <w:jc w:val="left"/>
-            </w:pPr>
-            <w:r>
-              <w:rPr>
-                <w:rFonts w:ascii="Courier New" w:hAnsi="Courier New"/>
-                <w:b/>
-                <w:color w:val="047857"/>
-                <w:sz w:val="18"/>
-              </w:rPr>
-              <w:t>entropy</w:t>
-            </w:r>
-          </w:p>
-        </w:tc>
-        <w:tc>
-          <w:tcPr>
-            <w:tcW w:type="dxa" w:w="5328"/>
-            <w:shd w:fill="FFFFFF"/>
-            <w:tcMar>
-              <w:top w:w="80" w:type="dxa"/>
-              <w:bottom w:w="80" w:type="dxa"/>
-              <w:left w:w="100" w:type="dxa"/>
-              <w:right w:w="100" w:type="dxa"/>
-            </w:tcMar>
-          </w:tcPr>
-          <w:p>
-            <w:pPr>
-              <w:jc w:val="left"/>
-            </w:pPr>
-            <w:r>
-              <w:rPr>
-                <w:sz w:val="18"/>
-              </w:rPr>
-              <w:t>Shannon Entropy; đo lường độ ngẫu nhiên, phát hiện chuỗi mã hóa, băm mật mã và obfuscation.</w:t>
-            </w:r>
-          </w:p>
-        </w:tc>
-      </w:tr>
-      <w:tr>
-        <w:tc>
-          <w:tcPr>
-            <w:tcW w:type="dxa" w:w="864"/>
-            <w:shd w:fill="F9FAFB"/>
-            <w:tcMar>
-              <w:top w:w="80" w:type="dxa"/>
-              <w:bottom w:w="80" w:type="dxa"/>
-              <w:left w:w="100" w:type="dxa"/>
-              <w:right w:w="100" w:type="dxa"/>
-            </w:tcMar>
-          </w:tcPr>
-          <w:p>
-            <w:pPr>
-              <w:jc w:val="center"/>
-            </w:pPr>
-            <w:r>
-              <w:rPr>
-                <w:sz w:val="18"/>
-              </w:rPr>
-              <w:t>3</w:t>
-            </w:r>
-          </w:p>
-        </w:tc>
-        <w:tc>
-          <w:tcPr>
-            <w:tcW w:type="dxa" w:w="3168"/>
-            <w:shd w:fill="F9FAFB"/>
-            <w:tcMar>
-              <w:top w:w="80" w:type="dxa"/>
-              <w:bottom w:w="80" w:type="dxa"/>
-              <w:left w:w="100" w:type="dxa"/>
-              <w:right w:w="100" w:type="dxa"/>
-            </w:tcMar>
-          </w:tcPr>
-          <w:p>
-            <w:pPr>
-              <w:jc w:val="left"/>
-            </w:pPr>
-            <w:r>
-              <w:rPr>
-                <w:rFonts w:ascii="Courier New" w:hAnsi="Courier New"/>
-                <w:b/>
-                <w:color w:val="047857"/>
-                <w:sz w:val="18"/>
-              </w:rPr>
-              <w:t>special_char_ratio</w:t>
-            </w:r>
-          </w:p>
-        </w:tc>
-        <w:tc>
-          <w:tcPr>
-            <w:tcW w:type="dxa" w:w="5328"/>
-            <w:shd w:fill="F9FAFB"/>
-            <w:tcMar>
-              <w:top w:w="80" w:type="dxa"/>
-              <w:bottom w:w="80" w:type="dxa"/>
-              <w:left w:w="100" w:type="dxa"/>
-              <w:right w:w="100" w:type="dxa"/>
-            </w:tcMar>
-          </w:tcPr>
-          <w:p>
-            <w:pPr>
-              <w:jc w:val="left"/>
-            </w:pPr>
-            <w:r>
-              <w:rPr>
-                <w:sz w:val="18"/>
-              </w:rPr>
-              <w:t>Tỷ lệ ký tự đặc biệt (!@#$%^&amp;*...); payload tấn công luôn có mật độ ký tự đặc biệt cao.</w:t>
-            </w:r>
-          </w:p>
-        </w:tc>
-      </w:tr>
-      <w:tr>
-        <w:tc>
-          <w:tcPr>
-            <w:tcW w:type="dxa" w:w="864"/>
-            <w:shd w:fill="FFFFFF"/>
-            <w:tcMar>
-              <w:top w:w="80" w:type="dxa"/>
-              <w:bottom w:w="80" w:type="dxa"/>
-              <w:left w:w="100" w:type="dxa"/>
-              <w:right w:w="100" w:type="dxa"/>
-            </w:tcMar>
-          </w:tcPr>
-          <w:p>
-            <w:pPr>
-              <w:jc w:val="center"/>
-            </w:pPr>
-            <w:r>
-              <w:rPr>
-                <w:sz w:val="18"/>
-              </w:rPr>
-              <w:t>4</w:t>
-            </w:r>
-          </w:p>
-        </w:tc>
-        <w:tc>
-          <w:tcPr>
-            <w:tcW w:type="dxa" w:w="3168"/>
-            <w:shd w:fill="FFFFFF"/>
-            <w:tcMar>
-              <w:top w:w="80" w:type="dxa"/>
-              <w:bottom w:w="80" w:type="dxa"/>
-              <w:left w:w="100" w:type="dxa"/>
-              <w:right w:w="100" w:type="dxa"/>
-            </w:tcMar>
-          </w:tcPr>
-          <w:p>
-            <w:pPr>
-              <w:jc w:val="left"/>
-            </w:pPr>
-            <w:r>
-              <w:rPr>
-                <w:rFonts w:ascii="Courier New" w:hAnsi="Courier New"/>
-                <w:b/>
-                <w:color w:val="047857"/>
-                <w:sz w:val="18"/>
-              </w:rPr>
-              <w:t>digit_ratio</w:t>
-            </w:r>
-          </w:p>
-        </w:tc>
-        <w:tc>
-          <w:tcPr>
-            <w:tcW w:type="dxa" w:w="5328"/>
-            <w:shd w:fill="FFFFFF"/>
-            <w:tcMar>
-              <w:top w:w="80" w:type="dxa"/>
-              <w:bottom w:w="80" w:type="dxa"/>
-              <w:left w:w="100" w:type="dxa"/>
-              <w:right w:w="100" w:type="dxa"/>
-            </w:tcMar>
-          </w:tcPr>
-          <w:p>
-            <w:pPr>
-              <w:jc w:val="left"/>
-            </w:pPr>
-            <w:r>
-              <w:rPr>
-                <w:sz w:val="18"/>
-              </w:rPr>
-              <w:t>Tỷ lệ chữ số; phát hiện các đòn brute force ID, số liệu nhị phân hoặc chuỗi hex.</w:t>
-            </w:r>
-          </w:p>
-        </w:tc>
-      </w:tr>
-      <w:tr>
-        <w:tc>
-          <w:tcPr>
-            <w:tcW w:type="dxa" w:w="864"/>
-            <w:shd w:fill="F9FAFB"/>
-            <w:tcMar>
-              <w:top w:w="80" w:type="dxa"/>
-              <w:bottom w:w="80" w:type="dxa"/>
-              <w:left w:w="100" w:type="dxa"/>
-              <w:right w:w="100" w:type="dxa"/>
-            </w:tcMar>
-          </w:tcPr>
-          <w:p>
-            <w:pPr>
-              <w:jc w:val="center"/>
-            </w:pPr>
-            <w:r>
-              <w:rPr>
-                <w:sz w:val="18"/>
-              </w:rPr>
-              <w:t>5</w:t>
-            </w:r>
-          </w:p>
-        </w:tc>
-        <w:tc>
-          <w:tcPr>
-            <w:tcW w:type="dxa" w:w="3168"/>
-            <w:shd w:fill="F9FAFB"/>
-            <w:tcMar>
-              <w:top w:w="80" w:type="dxa"/>
-              <w:bottom w:w="80" w:type="dxa"/>
-              <w:left w:w="100" w:type="dxa"/>
-              <w:right w:w="100" w:type="dxa"/>
-            </w:tcMar>
-          </w:tcPr>
-          <w:p>
-            <w:pPr>
-              <w:jc w:val="left"/>
-            </w:pPr>
-            <w:r>
-              <w:rPr>
-                <w:rFonts w:ascii="Courier New" w:hAnsi="Courier New"/>
-                <w:b/>
-                <w:color w:val="047857"/>
-                <w:sz w:val="18"/>
-              </w:rPr>
-              <w:t>uppercase_ratio</w:t>
-            </w:r>
-          </w:p>
-        </w:tc>
-        <w:tc>
-          <w:tcPr>
-            <w:tcW w:type="dxa" w:w="5328"/>
-            <w:shd w:fill="F9FAFB"/>
-            <w:tcMar>
-              <w:top w:w="80" w:type="dxa"/>
-              <w:bottom w:w="80" w:type="dxa"/>
-              <w:left w:w="100" w:type="dxa"/>
-              <w:right w:w="100" w:type="dxa"/>
-            </w:tcMar>
-          </w:tcPr>
-          <w:p>
-            <w:pPr>
-              <w:jc w:val="left"/>
-            </w:pPr>
-            <w:r>
-              <w:rPr>
-                <w:sz w:val="18"/>
-              </w:rPr>
-              <w:t>Tỷ lệ chữ hoa; nhận diện kỹ thuật né tránh đổi hoa thường xen kẽ (Mixed-case Evasion).</w:t>
-            </w:r>
-          </w:p>
-        </w:tc>
-      </w:tr>
-      <w:tr>
-        <w:tc>
-          <w:tcPr>
-            <w:tcW w:type="dxa" w:w="864"/>
-            <w:shd w:fill="FFFFFF"/>
-            <w:tcMar>
-              <w:top w:w="80" w:type="dxa"/>
-              <w:bottom w:w="80" w:type="dxa"/>
-              <w:left w:w="100" w:type="dxa"/>
-              <w:right w:w="100" w:type="dxa"/>
-            </w:tcMar>
-          </w:tcPr>
-          <w:p>
-            <w:pPr>
-              <w:jc w:val="center"/>
-            </w:pPr>
-            <w:r>
-              <w:rPr>
-                <w:sz w:val="18"/>
-              </w:rPr>
-              <w:t>6</w:t>
-            </w:r>
-          </w:p>
-        </w:tc>
-        <w:tc>
-          <w:tcPr>
-            <w:tcW w:type="dxa" w:w="3168"/>
-            <w:shd w:fill="FFFFFF"/>
-            <w:tcMar>
-              <w:top w:w="80" w:type="dxa"/>
-              <w:bottom w:w="80" w:type="dxa"/>
-              <w:left w:w="100" w:type="dxa"/>
-              <w:right w:w="100" w:type="dxa"/>
-            </w:tcMar>
-          </w:tcPr>
-          <w:p>
-            <w:pPr>
-              <w:jc w:val="left"/>
-            </w:pPr>
-            <w:r>
-              <w:rPr>
-                <w:rFonts w:ascii="Courier New" w:hAnsi="Courier New"/>
-                <w:b/>
-                <w:color w:val="047857"/>
-                <w:sz w:val="18"/>
-              </w:rPr>
-              <w:t>single_quote_count</w:t>
-            </w:r>
-          </w:p>
-        </w:tc>
-        <w:tc>
-          <w:tcPr>
-            <w:tcW w:type="dxa" w:w="5328"/>
-            <w:shd w:fill="FFFFFF"/>
-            <w:tcMar>
-              <w:top w:w="80" w:type="dxa"/>
-              <w:bottom w:w="80" w:type="dxa"/>
-              <w:left w:w="100" w:type="dxa"/>
-              <w:right w:w="100" w:type="dxa"/>
-            </w:tcMar>
-          </w:tcPr>
-          <w:p>
-            <w:pPr>
-              <w:jc w:val="left"/>
-            </w:pPr>
-            <w:r>
-              <w:rPr>
-                <w:sz w:val="18"/>
-              </w:rPr>
-              <w:t>Số lượng dấu nháy đơn ('); chỉ dấu cơ bản của SQL Injection đóng chuỗi.</w:t>
-            </w:r>
-          </w:p>
-        </w:tc>
-      </w:tr>
-      <w:tr>
-        <w:tc>
-          <w:tcPr>
-            <w:tcW w:type="dxa" w:w="864"/>
-            <w:shd w:fill="F9FAFB"/>
-            <w:tcMar>
-              <w:top w:w="80" w:type="dxa"/>
-              <w:bottom w:w="80" w:type="dxa"/>
-              <w:left w:w="100" w:type="dxa"/>
-              <w:right w:w="100" w:type="dxa"/>
-            </w:tcMar>
-          </w:tcPr>
-          <w:p>
-            <w:pPr>
-              <w:jc w:val="center"/>
-            </w:pPr>
-            <w:r>
-              <w:rPr>
-                <w:sz w:val="18"/>
-              </w:rPr>
-              <w:t>7</w:t>
-            </w:r>
-          </w:p>
-        </w:tc>
-        <w:tc>
-          <w:tcPr>
-            <w:tcW w:type="dxa" w:w="3168"/>
-            <w:shd w:fill="F9FAFB"/>
-            <w:tcMar>
-              <w:top w:w="80" w:type="dxa"/>
-              <w:bottom w:w="80" w:type="dxa"/>
-              <w:left w:w="100" w:type="dxa"/>
-              <w:right w:w="100" w:type="dxa"/>
-            </w:tcMar>
-          </w:tcPr>
-          <w:p>
-            <w:pPr>
-              <w:jc w:val="left"/>
-            </w:pPr>
-            <w:r>
-              <w:rPr>
-                <w:rFonts w:ascii="Courier New" w:hAnsi="Courier New"/>
-                <w:b/>
-                <w:color w:val="047857"/>
-                <w:sz w:val="18"/>
-              </w:rPr>
-              <w:t>double_quote_count</w:t>
-            </w:r>
-          </w:p>
-        </w:tc>
-        <w:tc>
-          <w:tcPr>
-            <w:tcW w:type="dxa" w:w="5328"/>
-            <w:shd w:fill="F9FAFB"/>
-            <w:tcMar>
-              <w:top w:w="80" w:type="dxa"/>
-              <w:bottom w:w="80" w:type="dxa"/>
-              <w:left w:w="100" w:type="dxa"/>
-              <w:right w:w="100" w:type="dxa"/>
-            </w:tcMar>
-          </w:tcPr>
-          <w:p>
-            <w:pPr>
-              <w:jc w:val="left"/>
-            </w:pPr>
-            <w:r>
-              <w:rPr>
-                <w:sz w:val="18"/>
-              </w:rPr>
-              <w:t>Số lượng dấu nháy kép ("); chỉ dấu của XSS attribute injection và SQLi.</w:t>
-            </w:r>
-          </w:p>
-        </w:tc>
-      </w:tr>
-      <w:tr>
-        <w:tc>
-          <w:tcPr>
-            <w:tcW w:type="dxa" w:w="864"/>
-            <w:shd w:fill="FFFFFF"/>
-            <w:tcMar>
-              <w:top w:w="80" w:type="dxa"/>
-              <w:bottom w:w="80" w:type="dxa"/>
-              <w:left w:w="100" w:type="dxa"/>
-              <w:right w:w="100" w:type="dxa"/>
-            </w:tcMar>
-          </w:tcPr>
-          <w:p>
-            <w:pPr>
-              <w:jc w:val="center"/>
-            </w:pPr>
-            <w:r>
-              <w:rPr>
-                <w:sz w:val="18"/>
-              </w:rPr>
-              <w:t>8</w:t>
-            </w:r>
-          </w:p>
-        </w:tc>
-        <w:tc>
-          <w:tcPr>
-            <w:tcW w:type="dxa" w:w="3168"/>
-            <w:shd w:fill="FFFFFF"/>
-            <w:tcMar>
-              <w:top w:w="80" w:type="dxa"/>
-              <w:bottom w:w="80" w:type="dxa"/>
-              <w:left w:w="100" w:type="dxa"/>
-              <w:right w:w="100" w:type="dxa"/>
-            </w:tcMar>
-          </w:tcPr>
-          <w:p>
-            <w:pPr>
-              <w:jc w:val="left"/>
-            </w:pPr>
-            <w:r>
-              <w:rPr>
-                <w:rFonts w:ascii="Courier New" w:hAnsi="Courier New"/>
-                <w:b/>
-                <w:color w:val="047857"/>
-                <w:sz w:val="18"/>
-              </w:rPr>
-              <w:t>parentheses_count</w:t>
-            </w:r>
-          </w:p>
-        </w:tc>
-        <w:tc>
-          <w:tcPr>
-            <w:tcW w:type="dxa" w:w="5328"/>
-            <w:shd w:fill="FFFFFF"/>
-            <w:tcMar>
-              <w:top w:w="80" w:type="dxa"/>
-              <w:bottom w:w="80" w:type="dxa"/>
-              <w:left w:w="100" w:type="dxa"/>
-              <w:right w:w="100" w:type="dxa"/>
-            </w:tcMar>
-          </w:tcPr>
-          <w:p>
-            <w:pPr>
-              <w:jc w:val="left"/>
-            </w:pPr>
-            <w:r>
-              <w:rPr>
-                <w:sz w:val="18"/>
-              </w:rPr>
-              <w:t>Số lượng dấu ngoặc tròn (); phát hiện lời gọi hàm SQL (CONCAT, SLEEP) hoặc hàm JS (alert).</w:t>
-            </w:r>
-          </w:p>
-        </w:tc>
-      </w:tr>
-      <w:tr>
-        <w:tc>
-          <w:tcPr>
-            <w:tcW w:type="dxa" w:w="864"/>
-            <w:shd w:fill="F9FAFB"/>
-            <w:tcMar>
-              <w:top w:w="80" w:type="dxa"/>
-              <w:bottom w:w="80" w:type="dxa"/>
-              <w:left w:w="100" w:type="dxa"/>
-              <w:right w:w="100" w:type="dxa"/>
-            </w:tcMar>
-          </w:tcPr>
-          <w:p>
-            <w:pPr>
-              <w:jc w:val="center"/>
-            </w:pPr>
-            <w:r>
-              <w:rPr>
-                <w:sz w:val="18"/>
-              </w:rPr>
-              <w:t>9</w:t>
-            </w:r>
-          </w:p>
-        </w:tc>
-        <w:tc>
-          <w:tcPr>
-            <w:tcW w:type="dxa" w:w="3168"/>
-            <w:shd w:fill="F9FAFB"/>
-            <w:tcMar>
-              <w:top w:w="80" w:type="dxa"/>
-              <w:bottom w:w="80" w:type="dxa"/>
-              <w:left w:w="100" w:type="dxa"/>
-              <w:right w:w="100" w:type="dxa"/>
-            </w:tcMar>
-          </w:tcPr>
-          <w:p>
-            <w:pPr>
-              <w:jc w:val="left"/>
-            </w:pPr>
-            <w:r>
-              <w:rPr>
-                <w:rFonts w:ascii="Courier New" w:hAnsi="Courier New"/>
-                <w:b/>
-                <w:color w:val="047857"/>
-                <w:sz w:val="18"/>
-              </w:rPr>
-              <w:t>angle_bracket_count</w:t>
-            </w:r>
-          </w:p>
-        </w:tc>
-        <w:tc>
-          <w:tcPr>
-            <w:tcW w:type="dxa" w:w="5328"/>
-            <w:shd w:fill="F9FAFB"/>
-            <w:tcMar>
-              <w:top w:w="80" w:type="dxa"/>
-              <w:bottom w:w="80" w:type="dxa"/>
-              <w:left w:w="100" w:type="dxa"/>
-              <w:right w:w="100" w:type="dxa"/>
-            </w:tcMar>
-          </w:tcPr>
-          <w:p>
-            <w:pPr>
-              <w:jc w:val="left"/>
-            </w:pPr>
-            <w:r>
-              <w:rPr>
-                <w:sz w:val="18"/>
-              </w:rPr>
-              <w:t>Số lượng dấu ngoặc nhọn (&lt; &gt;); chỉ dấu trực tiếp của việc tiêm mã thẻ HTML/XSS.</w:t>
-            </w:r>
-          </w:p>
-        </w:tc>
-      </w:tr>
-      <w:tr>
-        <w:tc>
-          <w:tcPr>
-            <w:tcW w:type="dxa" w:w="864"/>
-            <w:shd w:fill="FFFFFF"/>
-            <w:tcMar>
-              <w:top w:w="80" w:type="dxa"/>
-              <w:bottom w:w="80" w:type="dxa"/>
-              <w:left w:w="100" w:type="dxa"/>
-              <w:right w:w="100" w:type="dxa"/>
-            </w:tcMar>
-          </w:tcPr>
-          <w:p>
-            <w:pPr>
-              <w:jc w:val="center"/>
-            </w:pPr>
-            <w:r>
-              <w:rPr>
-                <w:sz w:val="18"/>
-              </w:rPr>
-              <w:t>10</w:t>
-            </w:r>
-          </w:p>
-        </w:tc>
-        <w:tc>
-          <w:tcPr>
-            <w:tcW w:type="dxa" w:w="3168"/>
-            <w:shd w:fill="FFFFFF"/>
-            <w:tcMar>
-              <w:top w:w="80" w:type="dxa"/>
-              <w:bottom w:w="80" w:type="dxa"/>
-              <w:left w:w="100" w:type="dxa"/>
-              <w:right w:w="100" w:type="dxa"/>
-            </w:tcMar>
-          </w:tcPr>
-          <w:p>
-            <w:pPr>
-              <w:jc w:val="left"/>
-            </w:pPr>
-            <w:r>
-              <w:rPr>
-                <w:rFonts w:ascii="Courier New" w:hAnsi="Courier New"/>
-                <w:b/>
-                <w:color w:val="047857"/>
-                <w:sz w:val="18"/>
-              </w:rPr>
-              <w:t>semicolon_count</w:t>
-            </w:r>
-          </w:p>
-        </w:tc>
-        <w:tc>
-          <w:tcPr>
-            <w:tcW w:type="dxa" w:w="5328"/>
-            <w:shd w:fill="FFFFFF"/>
-            <w:tcMar>
-              <w:top w:w="80" w:type="dxa"/>
-              <w:bottom w:w="80" w:type="dxa"/>
-              <w:left w:w="100" w:type="dxa"/>
-              <w:right w:w="100" w:type="dxa"/>
-            </w:tcMar>
-          </w:tcPr>
-          <w:p>
-            <w:pPr>
-              <w:jc w:val="left"/>
-            </w:pPr>
-            <w:r>
-              <w:rPr>
-                <w:sz w:val="18"/>
-              </w:rPr>
-              <w:t>Số lượng dấu chấm phẩy (;); phát hiện kỹ thuật xếp chồng câu lệnh SQL (Stacked Queries) hoặc ngắt lệnh Shell.</w:t>
-            </w:r>
-          </w:p>
-        </w:tc>
-      </w:tr>
-      <w:tr>
-        <w:tc>
-          <w:tcPr>
-            <w:tcW w:type="dxa" w:w="864"/>
-            <w:shd w:fill="F9FAFB"/>
-            <w:tcMar>
-              <w:top w:w="80" w:type="dxa"/>
-              <w:bottom w:w="80" w:type="dxa"/>
-              <w:left w:w="100" w:type="dxa"/>
-              <w:right w:w="100" w:type="dxa"/>
-            </w:tcMar>
-          </w:tcPr>
-          <w:p>
-            <w:pPr>
-              <w:jc w:val="center"/>
-            </w:pPr>
-            <w:r>
-              <w:rPr>
-                <w:sz w:val="18"/>
-              </w:rPr>
-              <w:t>11</w:t>
-            </w:r>
-          </w:p>
-        </w:tc>
-        <w:tc>
-          <w:tcPr>
-            <w:tcW w:type="dxa" w:w="3168"/>
-            <w:shd w:fill="F9FAFB"/>
-            <w:tcMar>
-              <w:top w:w="80" w:type="dxa"/>
-              <w:bottom w:w="80" w:type="dxa"/>
-              <w:left w:w="100" w:type="dxa"/>
-              <w:right w:w="100" w:type="dxa"/>
-            </w:tcMar>
-          </w:tcPr>
-          <w:p>
-            <w:pPr>
-              <w:jc w:val="left"/>
-            </w:pPr>
-            <w:r>
-              <w:rPr>
-                <w:rFonts w:ascii="Courier New" w:hAnsi="Courier New"/>
-                <w:b/>
-                <w:color w:val="047857"/>
-                <w:sz w:val="18"/>
-              </w:rPr>
-              <w:t>whitespace_count</w:t>
-            </w:r>
-          </w:p>
-        </w:tc>
-        <w:tc>
-          <w:tcPr>
-            <w:tcW w:type="dxa" w:w="5328"/>
-            <w:shd w:fill="F9FAFB"/>
-            <w:tcMar>
-              <w:top w:w="80" w:type="dxa"/>
-              <w:bottom w:w="80" w:type="dxa"/>
-              <w:left w:w="100" w:type="dxa"/>
-              <w:right w:w="100" w:type="dxa"/>
-            </w:tcMar>
-          </w:tcPr>
-          <w:p>
-            <w:pPr>
-              <w:jc w:val="left"/>
-            </w:pPr>
-            <w:r>
-              <w:rPr>
-                <w:sz w:val="18"/>
-              </w:rPr>
-              <w:t>Số lượng khoảng trắng; phân tích cấu trúc cú pháp câu lệnh truy vấn.</w:t>
-            </w:r>
-          </w:p>
-        </w:tc>
-      </w:tr>
-      <w:tr>
-        <w:tc>
-          <w:tcPr>
-            <w:tcW w:type="dxa" w:w="864"/>
-            <w:shd w:fill="FFFFFF"/>
-            <w:tcMar>
-              <w:top w:w="80" w:type="dxa"/>
-              <w:bottom w:w="80" w:type="dxa"/>
-              <w:left w:w="100" w:type="dxa"/>
-              <w:right w:w="100" w:type="dxa"/>
-            </w:tcMar>
-          </w:tcPr>
-          <w:p>
-            <w:pPr>
-              <w:jc w:val="center"/>
-            </w:pPr>
-            <w:r>
-              <w:rPr>
-                <w:sz w:val="18"/>
-              </w:rPr>
-              <w:t>12</w:t>
-            </w:r>
-          </w:p>
-        </w:tc>
-        <w:tc>
-          <w:tcPr>
-            <w:tcW w:type="dxa" w:w="3168"/>
-            <w:shd w:fill="FFFFFF"/>
-            <w:tcMar>
-              <w:top w:w="80" w:type="dxa"/>
-              <w:bottom w:w="80" w:type="dxa"/>
-              <w:left w:w="100" w:type="dxa"/>
-              <w:right w:w="100" w:type="dxa"/>
-            </w:tcMar>
-          </w:tcPr>
-          <w:p>
-            <w:pPr>
-              <w:jc w:val="left"/>
-            </w:pPr>
-            <w:r>
-              <w:rPr>
-                <w:rFonts w:ascii="Courier New" w:hAnsi="Courier New"/>
-                <w:b/>
-                <w:color w:val="047857"/>
-                <w:sz w:val="18"/>
-              </w:rPr>
-              <w:t>null_byte_count</w:t>
-            </w:r>
-          </w:p>
-        </w:tc>
-        <w:tc>
-          <w:tcPr>
-            <w:tcW w:type="dxa" w:w="5328"/>
-            <w:shd w:fill="FFFFFF"/>
-            <w:tcMar>
-              <w:top w:w="80" w:type="dxa"/>
-              <w:bottom w:w="80" w:type="dxa"/>
-              <w:left w:w="100" w:type="dxa"/>
-              <w:right w:w="100" w:type="dxa"/>
-            </w:tcMar>
-          </w:tcPr>
-          <w:p>
-            <w:pPr>
-              <w:jc w:val="left"/>
-            </w:pPr>
-            <w:r>
-              <w:rPr>
-                <w:sz w:val="18"/>
-              </w:rPr>
-              <w:t>Số lượng byte rỗng (\x00, %00); phát hiện kỹ thuật cắt chuỗi tệp tin và vượt rào kiểm tra.</w:t>
-            </w:r>
-          </w:p>
-        </w:tc>
-      </w:tr>
-      <w:tr>
-        <w:tc>
-          <w:tcPr>
-            <w:tcW w:type="dxa" w:w="864"/>
-            <w:shd w:fill="F9FAFB"/>
-            <w:tcMar>
-              <w:top w:w="80" w:type="dxa"/>
-              <w:bottom w:w="80" w:type="dxa"/>
-              <w:left w:w="100" w:type="dxa"/>
-              <w:right w:w="100" w:type="dxa"/>
-            </w:tcMar>
-          </w:tcPr>
-          <w:p>
-            <w:pPr>
-              <w:jc w:val="center"/>
-            </w:pPr>
-            <w:r>
-              <w:rPr>
-                <w:sz w:val="18"/>
-              </w:rPr>
-              <w:t>13</w:t>
-            </w:r>
-          </w:p>
-        </w:tc>
-        <w:tc>
-          <w:tcPr>
-            <w:tcW w:type="dxa" w:w="3168"/>
-            <w:shd w:fill="F9FAFB"/>
-            <w:tcMar>
-              <w:top w:w="80" w:type="dxa"/>
-              <w:bottom w:w="80" w:type="dxa"/>
-              <w:left w:w="100" w:type="dxa"/>
-              <w:right w:w="100" w:type="dxa"/>
-            </w:tcMar>
-          </w:tcPr>
-          <w:p>
-            <w:pPr>
-              <w:jc w:val="left"/>
-            </w:pPr>
-            <w:r>
-              <w:rPr>
-                <w:rFonts w:ascii="Courier New" w:hAnsi="Courier New"/>
-                <w:b/>
-                <w:color w:val="047857"/>
-                <w:sz w:val="18"/>
-              </w:rPr>
-              <w:t>sqli_keyword_count</w:t>
-            </w:r>
-          </w:p>
-        </w:tc>
-        <w:tc>
-          <w:tcPr>
-            <w:tcW w:type="dxa" w:w="5328"/>
-            <w:shd w:fill="F9FAFB"/>
-            <w:tcMar>
-              <w:top w:w="80" w:type="dxa"/>
-              <w:bottom w:w="80" w:type="dxa"/>
-              <w:left w:w="100" w:type="dxa"/>
-              <w:right w:w="100" w:type="dxa"/>
-            </w:tcMar>
-          </w:tcPr>
-          <w:p>
-            <w:pPr>
-              <w:jc w:val="left"/>
-            </w:pPr>
-            <w:r>
-              <w:rPr>
-                <w:sz w:val="18"/>
-              </w:rPr>
-              <w:t>Mật độ từ khóa SQL kinh điển (SELECT, UNION, DROP, INFORMATION_SCHEMA, SLEEP...).</w:t>
-            </w:r>
-          </w:p>
-        </w:tc>
-      </w:tr>
-      <w:tr>
-        <w:tc>
-          <w:tcPr>
-            <w:tcW w:type="dxa" w:w="864"/>
-            <w:shd w:fill="FFFFFF"/>
-            <w:tcMar>
-              <w:top w:w="80" w:type="dxa"/>
-              <w:bottom w:w="80" w:type="dxa"/>
-              <w:left w:w="100" w:type="dxa"/>
-              <w:right w:w="100" w:type="dxa"/>
-            </w:tcMar>
-          </w:tcPr>
-          <w:p>
-            <w:pPr>
-              <w:jc w:val="center"/>
-            </w:pPr>
-            <w:r>
-              <w:rPr>
-                <w:sz w:val="18"/>
-              </w:rPr>
-              <w:t>14</w:t>
-            </w:r>
-          </w:p>
-        </w:tc>
-        <w:tc>
-          <w:tcPr>
-            <w:tcW w:type="dxa" w:w="3168"/>
-            <w:shd w:fill="FFFFFF"/>
-            <w:tcMar>
-              <w:top w:w="80" w:type="dxa"/>
-              <w:bottom w:w="80" w:type="dxa"/>
-              <w:left w:w="100" w:type="dxa"/>
-              <w:right w:w="100" w:type="dxa"/>
-            </w:tcMar>
-          </w:tcPr>
-          <w:p>
-            <w:pPr>
-              <w:jc w:val="left"/>
-            </w:pPr>
-            <w:r>
-              <w:rPr>
-                <w:rFonts w:ascii="Courier New" w:hAnsi="Courier New"/>
-                <w:b/>
-                <w:color w:val="047857"/>
-                <w:sz w:val="18"/>
-              </w:rPr>
-              <w:t>xss_keyword_count</w:t>
-            </w:r>
-          </w:p>
-        </w:tc>
-        <w:tc>
-          <w:tcPr>
-            <w:tcW w:type="dxa" w:w="5328"/>
-            <w:shd w:fill="FFFFFF"/>
-            <w:tcMar>
-              <w:top w:w="80" w:type="dxa"/>
-              <w:bottom w:w="80" w:type="dxa"/>
-              <w:left w:w="100" w:type="dxa"/>
-              <w:right w:w="100" w:type="dxa"/>
-            </w:tcMar>
-          </w:tcPr>
-          <w:p>
-            <w:pPr>
-              <w:jc w:val="left"/>
-            </w:pPr>
-            <w:r>
-              <w:rPr>
-                <w:sz w:val="18"/>
-              </w:rPr>
-              <w:t>Mật độ từ khóa/thuộc tính XSS nguy hiểm (SCRIPT, ONERROR, ONLOAD, JAVASCRIPT:, EVAL...).</w:t>
-            </w:r>
-          </w:p>
-        </w:tc>
-      </w:tr>
-      <w:tr>
-        <w:tc>
-          <w:tcPr>
-            <w:tcW w:type="dxa" w:w="864"/>
-            <w:shd w:fill="F9FAFB"/>
-            <w:tcMar>
-              <w:top w:w="80" w:type="dxa"/>
-              <w:bottom w:w="80" w:type="dxa"/>
-              <w:left w:w="100" w:type="dxa"/>
-              <w:right w:w="100" w:type="dxa"/>
-            </w:tcMar>
-          </w:tcPr>
-          <w:p>
-            <w:pPr>
-              <w:jc w:val="center"/>
-            </w:pPr>
-            <w:r>
-              <w:rPr>
-                <w:sz w:val="18"/>
-              </w:rPr>
-              <w:t>15</w:t>
-            </w:r>
-          </w:p>
-        </w:tc>
-        <w:tc>
-          <w:tcPr>
-            <w:tcW w:type="dxa" w:w="3168"/>
-            <w:shd w:fill="F9FAFB"/>
-            <w:tcMar>
-              <w:top w:w="80" w:type="dxa"/>
-              <w:bottom w:w="80" w:type="dxa"/>
-              <w:left w:w="100" w:type="dxa"/>
-              <w:right w:w="100" w:type="dxa"/>
-            </w:tcMar>
-          </w:tcPr>
-          <w:p>
-            <w:pPr>
-              <w:jc w:val="left"/>
-            </w:pPr>
-            <w:r>
-              <w:rPr>
-                <w:rFonts w:ascii="Courier New" w:hAnsi="Courier New"/>
-                <w:b/>
-                <w:color w:val="047857"/>
-                <w:sz w:val="18"/>
-              </w:rPr>
-              <w:t>cmdi_keyword_count</w:t>
-            </w:r>
-          </w:p>
-        </w:tc>
-        <w:tc>
-          <w:tcPr>
-            <w:tcW w:type="dxa" w:w="5328"/>
-            <w:shd w:fill="F9FAFB"/>
-            <w:tcMar>
-              <w:top w:w="80" w:type="dxa"/>
-              <w:bottom w:w="80" w:type="dxa"/>
-              <w:left w:w="100" w:type="dxa"/>
-              <w:right w:w="100" w:type="dxa"/>
-            </w:tcMar>
-          </w:tcPr>
-          <w:p>
-            <w:pPr>
-              <w:jc w:val="left"/>
-            </w:pPr>
-            <w:r>
-              <w:rPr>
-                <w:sz w:val="18"/>
-              </w:rPr>
-              <w:t>Mật độ từ khóa lệnh hệ thống (ETC/PASSWD, BIN/SH, CMD.EXE, POWERSHELL, WHOAMI...).</w:t>
-            </w:r>
-          </w:p>
-        </w:tc>
-      </w:tr>
-      <w:tr>
-        <w:tc>
-          <w:tcPr>
-            <w:tcW w:type="dxa" w:w="864"/>
-            <w:shd w:fill="FFFFFF"/>
-            <w:tcMar>
-              <w:top w:w="80" w:type="dxa"/>
-              <w:bottom w:w="80" w:type="dxa"/>
-              <w:left w:w="100" w:type="dxa"/>
-              <w:right w:w="100" w:type="dxa"/>
-            </w:tcMar>
-          </w:tcPr>
-          <w:p>
-            <w:pPr>
-              <w:jc w:val="center"/>
-            </w:pPr>
-            <w:r>
-              <w:rPr>
-                <w:sz w:val="18"/>
-              </w:rPr>
-              <w:t>16</w:t>
-            </w:r>
-          </w:p>
-        </w:tc>
-        <w:tc>
-          <w:tcPr>
-            <w:tcW w:type="dxa" w:w="3168"/>
-            <w:shd w:fill="FFFFFF"/>
-            <w:tcMar>
-              <w:top w:w="80" w:type="dxa"/>
-              <w:bottom w:w="80" w:type="dxa"/>
-              <w:left w:w="100" w:type="dxa"/>
-              <w:right w:w="100" w:type="dxa"/>
-            </w:tcMar>
-          </w:tcPr>
-          <w:p>
-            <w:pPr>
-              <w:jc w:val="left"/>
-            </w:pPr>
-            <w:r>
-              <w:rPr>
-                <w:rFonts w:ascii="Courier New" w:hAnsi="Courier New"/>
-                <w:b/>
-                <w:color w:val="047857"/>
-                <w:sz w:val="18"/>
-              </w:rPr>
-              <w:t>path_keyword_count</w:t>
-            </w:r>
-          </w:p>
-        </w:tc>
-        <w:tc>
-          <w:tcPr>
-            <w:tcW w:type="dxa" w:w="5328"/>
-            <w:shd w:fill="FFFFFF"/>
-            <w:tcMar>
-              <w:top w:w="80" w:type="dxa"/>
-              <w:bottom w:w="80" w:type="dxa"/>
-              <w:left w:w="100" w:type="dxa"/>
-              <w:right w:w="100" w:type="dxa"/>
-            </w:tcMar>
-          </w:tcPr>
-          <w:p>
-            <w:pPr>
-              <w:jc w:val="left"/>
-            </w:pPr>
-            <w:r>
-              <w:rPr>
-                <w:sz w:val="18"/>
-              </w:rPr>
-              <w:t>Mật độ mẫu duyệt đường dẫn (.., WEB-INF, BOOT.INI, ENV, WIN.INI...).</w:t>
-            </w:r>
-          </w:p>
-        </w:tc>
-      </w:tr>
-      <w:tr>
-        <w:tc>
-          <w:tcPr>
-            <w:tcW w:type="dxa" w:w="864"/>
-            <w:shd w:fill="F9FAFB"/>
-            <w:tcMar>
-              <w:top w:w="80" w:type="dxa"/>
-              <w:bottom w:w="80" w:type="dxa"/>
-              <w:left w:w="100" w:type="dxa"/>
-              <w:right w:w="100" w:type="dxa"/>
-            </w:tcMar>
-          </w:tcPr>
-          <w:p>
-            <w:pPr>
-              <w:jc w:val="center"/>
-            </w:pPr>
-            <w:r>
-              <w:rPr>
-                <w:sz w:val="18"/>
-              </w:rPr>
-              <w:t>17</w:t>
-            </w:r>
-          </w:p>
-        </w:tc>
-        <w:tc>
-          <w:tcPr>
-            <w:tcW w:type="dxa" w:w="3168"/>
-            <w:shd w:fill="F9FAFB"/>
-            <w:tcMar>
-              <w:top w:w="80" w:type="dxa"/>
-              <w:bottom w:w="80" w:type="dxa"/>
-              <w:left w:w="100" w:type="dxa"/>
-              <w:right w:w="100" w:type="dxa"/>
-            </w:tcMar>
-          </w:tcPr>
-          <w:p>
-            <w:pPr>
-              <w:jc w:val="left"/>
-            </w:pPr>
-            <w:r>
-              <w:rPr>
-                <w:rFonts w:ascii="Courier New" w:hAnsi="Courier New"/>
-                <w:b/>
-                <w:color w:val="047857"/>
-                <w:sz w:val="18"/>
-              </w:rPr>
-              <w:t>syntax_pattern_count</w:t>
-            </w:r>
-          </w:p>
-        </w:tc>
-        <w:tc>
-          <w:tcPr>
-            <w:tcW w:type="dxa" w:w="5328"/>
-            <w:shd w:fill="F9FAFB"/>
-            <w:tcMar>
-              <w:top w:w="80" w:type="dxa"/>
-              <w:bottom w:w="80" w:type="dxa"/>
-              <w:left w:w="100" w:type="dxa"/>
-              <w:right w:w="100" w:type="dxa"/>
-            </w:tcMar>
-          </w:tcPr>
-          <w:p>
-            <w:pPr>
-              <w:jc w:val="left"/>
-            </w:pPr>
-            <w:r>
-              <w:rPr>
-                <w:sz w:val="18"/>
-              </w:rPr>
-              <w:t>Mật độ các cấu trúc toán tử logic đặc trưng (OR 1=1, AND 1=1, /*, --, #, ||, &amp;&amp;).</w:t>
-            </w:r>
-          </w:p>
-        </w:tc>
-      </w:tr>
-    </w:tbl>
-    <w:p/>
     <w:p>
       <w:pPr>
-        <w:keepNext/>
-        <w:spacing w:before="240" w:after="80"/>
+        <w:pStyle w:val="ListBullet"/>
+        <w:spacing w:after="60" w:line="276" w:lineRule="auto"/>
+        <w:jc w:val="both"/>
       </w:pPr>
       <w:r>
         <w:rPr>
           <w:b/>
-          <w:color w:val="1E40AF"/>
+          <w:color w:val="111827"/>
+        </w:rPr>
+        <w:t xml:space="preserve">Nhóm 1 (12 đặc trưng hình thái &amp; entropy): </w:t>
+      </w:r>
+      <w:r>
+        <w:t>length, entropy, count_single_quote, count_double_quote, count_less_than, count_greater_than, count_semicolon, count_hyphen, count_slash, count_backslash, count_parenthesis, special_char_ratio.</w:t>
+      </w:r>
+    </w:p>
+    <w:p>
+      <w:pPr>
+        <w:pStyle w:val="ListBullet"/>
+        <w:spacing w:after="60" w:line="276" w:lineRule="auto"/>
+        <w:jc w:val="both"/>
+      </w:pPr>
+      <w:r>
+        <w:rPr>
+          <w:b/>
+          <w:color w:val="111827"/>
+        </w:rPr>
+        <w:t xml:space="preserve">Nhóm 2 (5 đặc trưng mật độ từ khóa &amp; cú pháp): </w:t>
+      </w:r>
+      <w:r>
+        <w:t>sql_keyword_count, xss_keyword_count, sqli_regex_matches, xss_regex_matches, path_traversal_matches.</w:t>
+      </w:r>
+    </w:p>
+    <w:p>
+      <w:pPr>
+        <w:keepNext/>
+        <w:spacing w:before="200" w:after="80"/>
+      </w:pPr>
+      <w:r>
+        <w:rPr>
+          <w:b/>
+          <w:color w:val="1E3A8A"/>
           <w:sz w:val="24"/>
         </w:rPr>
-        <w:t>1.3.2. Thuật toán học máy có giám sát (Supervised Learning) — Rừng ngẫu nhiên (Random Forest)</w:t>
+        <w:t>1.3.2. Thuật toán học máy có giám sát — Rừng ngẫu nhiên (Random Forest)</w:t>
       </w:r>
     </w:p>
     <w:p>
@@ -2766,30 +1389,14 @@
         <w:rPr>
           <w:b w:val="0"/>
           <w:i w:val="0"/>
-          <w:sz w:val="22"/>
         </w:rPr>
-        <w:t>Mô hình học máy có giám sát đảm nhiệm bài toán phân loại đa lớp (Multiclass Classification) để định danh chính xác 5 trạng thái request: BENIGN (0), SQLI (1), XSS (2), PATH_TRAVERSAL (3), COMMAND_INJECTION (4).</w:t>
-      </w:r>
-    </w:p>
-    <w:p>
-      <w:pPr>
-        <w:spacing w:after="80" w:line="288" w:lineRule="auto"/>
-        <w:jc w:val="both"/>
-      </w:pPr>
-      <w:r>
-        <w:rPr>
-          <w:b w:val="0"/>
-          <w:i w:val="0"/>
-          <w:sz w:val="22"/>
-        </w:rPr>
-        <w:t>Random Forest là thuật toán học tăng cường tập hợp (Ensemble Learning) kết hợp B cây quyết định đơn lẻ qua kỹ thuật Bootstrap Aggregating (Bagging) và chọn ngẫu nhiên không gian đặc trưng con (Random Feature Subspace). Tại mỗi nút phân nhánh, thuật toán tìm điểm phân tách tối ưu trên tập con m đặc trưng (m = sqrt(M) = 4) bằng cách tối đa hóa độ giảm Gini Impurity [Ref 11]:</w:t>
+        <w:t>Random Forest (Leo Breiman, 2001) huấn luyện một tập hợp B cây quyết định độc lập qua kỹ thuật Bootstrap Aggregating (Bagging) và chọn lọc ngẫu nhiên tập con đặc trưng (Random Subspace). Kết quả phân loại cuối cùng được tổng hợp qua cơ chế bỏ phiếu đa số hoặc trung bình xác suất:</w:t>
       </w:r>
     </w:p>
     <w:tbl>
       <w:tblPr>
         <w:tblW w:type="auto" w:w="0"/>
         <w:jc w:val="center"/>
-        <w:tblLayout w:type="fixed"/>
         <w:tblLook w:firstColumn="1" w:firstRow="1" w:lastColumn="0" w:lastRow="0" w:noHBand="0" w:noVBand="1" w:val="04A0"/>
       </w:tblPr>
       <w:tblGrid>
@@ -2809,31 +1416,28 @@
           </w:tcPr>
           <w:p>
             <w:pPr>
-              <w:spacing w:after="40"/>
               <w:jc w:val="center"/>
             </w:pPr>
             <w:r>
               <w:rPr>
-                <w:rFonts w:ascii="Courier New" w:hAnsi="Courier New"/>
                 <w:b/>
-                <w:color w:val="1E3A8A"/>
-                <w:sz w:val="23"/>
+                <w:color w:val="1E293B"/>
+                <w:sz w:val="22"/>
               </w:rPr>
-              <w:t>I_G(p) = 1 - SUM_{k=1..C} [ p_k^2 ]</w:t>
+              <w:t>y_hat = argmax_c [ (1 / B) * sum_{b=1}^{B} P_{T_b}(y = c | x) ]</w:t>
             </w:r>
           </w:p>
           <w:p>
             <w:pPr>
-              <w:spacing w:after="0"/>
               <w:jc w:val="center"/>
             </w:pPr>
             <w:r>
               <w:rPr>
                 <w:i/>
-                <w:color w:val="4B5563"/>
+                <w:color w:val="64748B"/>
                 <w:sz w:val="19"/>
               </w:rPr>
-              <w:t>Độ bất thuần Gini (Gini Impurity) tại nút phân tách</w:t>
+              <w:t>Công thức tổng hợp phân loại của mô hình kết hợp Random Forest</w:t>
             </w:r>
           </w:p>
         </w:tc>
@@ -2841,7 +1445,7 @@
     </w:tbl>
     <w:p>
       <w:pPr>
-        <w:spacing w:after="40"/>
+        <w:spacing w:after="80"/>
       </w:pPr>
     </w:p>
     <w:p>
@@ -2853,83 +1457,8 @@
         <w:rPr>
           <w:b w:val="0"/>
           <w:i w:val="0"/>
-          <w:sz w:val="22"/>
         </w:rPr>
-        <w:t>Lý do lựa chọn Random Forest thay vì Deep Learning / Transformer:</w:t>
-      </w:r>
-    </w:p>
-    <w:p>
-      <w:pPr>
-        <w:pStyle w:val="ListBullet"/>
-        <w:spacing w:after="60" w:line="276" w:lineRule="auto"/>
-        <w:jc w:val="both"/>
-      </w:pPr>
-      <w:r>
-        <w:rPr>
-          <w:b/>
-          <w:sz w:val="22"/>
-        </w:rPr>
-        <w:t xml:space="preserve">Ngân sách độ trễ siêu thấp: </w:t>
-      </w:r>
-      <w:r>
-        <w:rPr>
-          <w:sz w:val="22"/>
-        </w:rPr>
-        <w:t>Random Forest chỉ mất 1.2ms - 3.5ms trên CPU để phân loại một request. Trong khi đó, các mô hình ngôn ngữ như BERT/DistilBERT mất từ 60ms - 150ms (kể cả trên GPU), gây nghẽn cổ chai thông lượng proxy [Ref 09].</w:t>
-      </w:r>
-    </w:p>
-    <w:p>
-      <w:pPr>
-        <w:pStyle w:val="ListBullet"/>
-        <w:spacing w:after="60" w:line="276" w:lineRule="auto"/>
-        <w:jc w:val="both"/>
-      </w:pPr>
-      <w:r>
-        <w:rPr>
-          <w:b/>
-          <w:sz w:val="22"/>
-        </w:rPr>
-        <w:t xml:space="preserve">Khả năng diễn giải (Explainability): </w:t>
-      </w:r>
-      <w:r>
-        <w:rPr>
-          <w:sz w:val="22"/>
-        </w:rPr>
-        <w:t>Random Forest cho phép xuất chỉ số Feature Importance, giúp đội ngũ an ninh SOC giải thích minh bạch lý do tại sao một request bị chặn.</w:t>
-      </w:r>
-    </w:p>
-    <w:p>
-      <w:pPr>
-        <w:pStyle w:val="ListBullet"/>
-        <w:spacing w:after="60" w:line="276" w:lineRule="auto"/>
-        <w:jc w:val="both"/>
-      </w:pPr>
-      <w:r>
-        <w:rPr>
-          <w:b/>
-          <w:sz w:val="22"/>
-        </w:rPr>
-        <w:t xml:space="preserve">Khả năng chống quá khớp (Anti-overfitting): </w:t>
-      </w:r>
-      <w:r>
-        <w:rPr>
-          <w:sz w:val="22"/>
-        </w:rPr>
-        <w:t>Cơ chế lấy mẫu ngẫu nhiên hai tầng giúp Random Forest có độ bền vững cao trước các payload có nhiễu hoặc đột biến nhẹ.</w:t>
-      </w:r>
-    </w:p>
-    <w:p>
-      <w:pPr>
-        <w:keepNext/>
-        <w:spacing w:before="240" w:after="80"/>
-      </w:pPr>
-      <w:r>
-        <w:rPr>
-          <w:b/>
-          <w:color w:val="1E40AF"/>
-          <w:sz w:val="24"/>
-        </w:rPr>
-        <w:t>1.3.3. Thuật toán học máy không giám sát (Unsupervised Learning) — Rừng cô lập (Isolation Forest)</w:t>
+        <w:t>Động lực lựa chọn Random Forest thay vì Deep Learning / Transformers:</w:t>
       </w:r>
     </w:p>
     <w:p>
@@ -2941,16 +1470,41 @@
         <w:rPr>
           <w:b w:val="0"/>
           <w:i w:val="0"/>
-          <w:sz w:val="22"/>
         </w:rPr>
-        <w:t>Để bắt các cuộc tấn công Zero-day hoặc các biến thể dị biệt chưa từng xuất hiện trong tập huấn luyện, hệ thống tích hợp mô hình Isolation Forest (iForest). Thuật toán xây dựng tập hợp các cây cô lập nhị phân (iTrees). Các điểm dữ liệu dị biệt (Anomalies) nằm ở vùng thưa thớt sẽ bị cô lập rất nhanh chóng và có độ dài đường đi h(x) từ gốc đến lá ngắn hơn rất nhiều so với dữ liệu thông thường. Điểm bất thường s(x, n) được tính theo công thức [Ref 08]:</w:t>
+        <w:t>Theo khảo sát thực nghiệm chuyên sâu trên IEEE Access (2024) [Ref 12] và MDPI Electronics (2025) [Ref 11], việc ứng dụng mạng nơ-ron sâu (CNN, Bi-LSTM) hoặc Transformers (BERT) vào tầng WAF Gateway gặp trở ngại lớn về độ trễ suy luận (60ms - 150ms trên CPU). Trong khi đó, Random Forest đạt độ trễ siêu tốc chỉ từ 0.02ms đến 0.05ms trên CPU đơn lõi, đồng thời cung cấp khả năng giải thích tường minh (Feature Importance) và khả năng chống quá khớp cực cao.</w:t>
+      </w:r>
+    </w:p>
+    <w:p>
+      <w:pPr>
+        <w:keepNext/>
+        <w:spacing w:before="200" w:after="80"/>
+      </w:pPr>
+      <w:r>
+        <w:rPr>
+          <w:b/>
+          <w:color w:val="1E3A8A"/>
+          <w:sz w:val="24"/>
+        </w:rPr>
+        <w:t>1.3.3. Thuật toán học máy không giám sát — Rừng cô lập (Isolation Forest)</w:t>
+      </w:r>
+    </w:p>
+    <w:p>
+      <w:pPr>
+        <w:spacing w:after="80" w:line="288" w:lineRule="auto"/>
+        <w:jc w:val="both"/>
+      </w:pPr>
+      <w:r>
+        <w:rPr>
+          <w:b w:val="0"/>
+          <w:i w:val="0"/>
+        </w:rPr>
+        <w:t>Để bắt các cuộc tấn công Zero-day hoặc biến dị payload chưa từng thấy, hệ thống tích hợp Isolation Forest (Liu et al. ICDM 2008). Thuật toán xây dựng tập hợp iTrees phân tách ngẫu nhiên dữ liệu; do điểm dị biệt nằm ở vùng thưa thớt, chúng bị cô lập rất nhanh chóng và có độ sâu đường đi h(x) rất ngắn. Điểm bất thường s(x, n) được tính theo công thức:</w:t>
       </w:r>
     </w:p>
     <w:tbl>
       <w:tblPr>
         <w:tblW w:type="auto" w:w="0"/>
         <w:jc w:val="center"/>
-        <w:tblLayout w:type="fixed"/>
         <w:tblLook w:firstColumn="1" w:firstRow="1" w:lastColumn="0" w:lastRow="0" w:noHBand="0" w:noVBand="1" w:val="04A0"/>
       </w:tblPr>
       <w:tblGrid>
@@ -2970,31 +1524,28 @@
           </w:tcPr>
           <w:p>
             <w:pPr>
-              <w:spacing w:after="40"/>
               <w:jc w:val="center"/>
             </w:pPr>
             <w:r>
               <w:rPr>
-                <w:rFonts w:ascii="Courier New" w:hAnsi="Courier New"/>
                 <w:b/>
-                <w:color w:val="1E3A8A"/>
-                <w:sz w:val="23"/>
+                <w:color w:val="1E293B"/>
+                <w:sz w:val="22"/>
               </w:rPr>
-              <w:t>s(x, n) = 2^( - E(h(x)) / c(n) )</w:t>
+              <w:t>s(x, n) = 2^{ - E(h(x)) / c(n) }</w:t>
             </w:r>
           </w:p>
           <w:p>
             <w:pPr>
-              <w:spacing w:after="0"/>
               <w:jc w:val="center"/>
             </w:pPr>
             <w:r>
               <w:rPr>
                 <w:i/>
-                <w:color w:val="4B5563"/>
+                <w:color w:val="64748B"/>
                 <w:sz w:val="19"/>
               </w:rPr>
-              <w:t>Trong đó: E(h(x)) là độ dài đường đi trung bình; c(n) là hệ số chuẩn hóa theo số mẫu n</w:t>
+              <w:t>Công thức tính điểm bất thường Anomaly Score của thuật toán Isolation Forest</w:t>
             </w:r>
           </w:p>
         </w:tc>
@@ -3002,7 +1553,7 @@
     </w:tbl>
     <w:p>
       <w:pPr>
-        <w:spacing w:after="40"/>
+        <w:spacing w:after="80"/>
       </w:pPr>
     </w:p>
     <w:p>
@@ -3014,20 +1565,19 @@
         <w:rPr>
           <w:b w:val="0"/>
           <w:i w:val="0"/>
-          <w:sz w:val="22"/>
         </w:rPr>
-        <w:t>Quy tắc diễn giải: Nếu s(x, n) -&gt; 1.0, mẫu bị cô lập cực nhanh, khả năng rất cao là đòn tấn công dị biệt / Zero-day; nếu s(x, n) &lt; 0.5, mẫu nằm sâu trong cụm phân phối bình thường, đại diện cho lưu lượng an toàn.</w:t>
+        <w:t>Trong đó c(n) là độ dài đường đi trung bình lý thuyết của cây tìm kiếm nhị phân. Khi s -&gt; 1.0, mẫu bị cô lập cực nhanh, tương ứng xác suất rất cao là mối đe dọa Zero-day; khi s &lt; 0.5, mẫu là dữ liệu bình thường lành tính.</w:t>
       </w:r>
     </w:p>
     <w:p>
       <w:pPr>
         <w:keepNext/>
-        <w:spacing w:before="240" w:after="80"/>
+        <w:spacing w:before="200" w:after="80"/>
       </w:pPr>
       <w:r>
         <w:rPr>
           <w:b/>
-          <w:color w:val="1E40AF"/>
+          <w:color w:val="1E3A8A"/>
           <w:sz w:val="24"/>
         </w:rPr>
         <w:t>1.3.4. Mô hình dung hợp rủi ro đa tầng (Hybrid Multi-Layer Risk Engine)</w:t>
@@ -3042,16 +1592,14 @@
         <w:rPr>
           <w:b w:val="0"/>
           <w:i w:val="0"/>
-          <w:sz w:val="22"/>
         </w:rPr>
-        <w:t>Hệ thống áp dụng kiến trúc Dual-Stage Pipeline theo mô hình MDPI Electronics 2025 [Ref 11]: Tầng 1 Fast Path (Regex &lt; 1ms) kết hợp Tầng 2 Deep Path (ML Feature Extraction &amp; Inference). Điểm rủi ro tổng hợp cuối cùng nằm trong thang đo 0.0 - 100.0:</w:t>
+        <w:t>Áp dụng kiến trúc Dual-Stage Pipeline theo nghiên cứu MDPI Electronics 2025 [Ref 11]: Tầng 1 (Fast Path) dùng Rule Engine lọc tĩnh (&lt; 1ms); Tầng 2 (Deep Path) trích xuất 17 đặc trưng và chạy song song qua Random Forest và Isolation Forest. Điểm rủi ro tổng hợp nằm trong thang đo 0.0 - 100.0:</w:t>
       </w:r>
     </w:p>
     <w:tbl>
       <w:tblPr>
         <w:tblW w:type="auto" w:w="0"/>
         <w:jc w:val="center"/>
-        <w:tblLayout w:type="fixed"/>
         <w:tblLook w:firstColumn="1" w:firstRow="1" w:lastColumn="0" w:lastRow="0" w:noHBand="0" w:noVBand="1" w:val="04A0"/>
       </w:tblPr>
       <w:tblGrid>
@@ -3071,31 +1619,28 @@
           </w:tcPr>
           <w:p>
             <w:pPr>
-              <w:spacing w:after="40"/>
               <w:jc w:val="center"/>
             </w:pPr>
             <w:r>
               <w:rPr>
-                <w:rFonts w:ascii="Courier New" w:hAnsi="Courier New"/>
                 <w:b/>
-                <w:color w:val="1E3A8A"/>
-                <w:sz w:val="23"/>
+                <w:color w:val="1E293B"/>
+                <w:sz w:val="22"/>
               </w:rPr>
               <w:t>Risk Score = 0.40 * S_Rule + 0.35 * S_RF + 0.25 * S_Anomaly</w:t>
             </w:r>
           </w:p>
           <w:p>
             <w:pPr>
-              <w:spacing w:after="0"/>
               <w:jc w:val="center"/>
             </w:pPr>
             <w:r>
               <w:rPr>
                 <w:i/>
-                <w:color w:val="4B5563"/>
+                <w:color w:val="64748B"/>
                 <w:sz w:val="19"/>
               </w:rPr>
-              <w:t>Công thức tính điểm rủi ro có trọng số (Weighted Hybrid Risk Score)</w:t>
+              <w:t>Công thức dung hợp điểm rủi ro đa tầng Hybrid Risk Score</w:t>
             </w:r>
           </w:p>
         </w:tc>
@@ -3103,7 +1648,7 @@
     </w:tbl>
     <w:p>
       <w:pPr>
-        <w:spacing w:after="40"/>
+        <w:spacing w:after="80"/>
       </w:pPr>
     </w:p>
     <w:p>
@@ -3115,9 +1660,8 @@
         <w:rPr>
           <w:b w:val="0"/>
           <w:i w:val="0"/>
-          <w:sz w:val="22"/>
         </w:rPr>
-        <w:t>Hệ thống thực thi chính sách phòng thủ đa ngưỡng (Multi-Threshold Policy) theo chuẩn MITRE ATT&amp;CK Mitigation [Ref 17]:</w:t>
+        <w:t>Ma trận ra quyết định phòng thủ phân tầng theo chuẩn MITRE ATT&amp;CK Mitigation [Ref 16]:</w:t>
       </w:r>
     </w:p>
     <w:p>
@@ -3129,15 +1673,12 @@
       <w:r>
         <w:rPr>
           <w:b/>
-          <w:sz w:val="22"/>
+          <w:color w:val="111827"/>
         </w:rPr>
         <w:t xml:space="preserve">Điểm &lt; 30 (ALLOW): </w:t>
       </w:r>
       <w:r>
-        <w:rPr>
-          <w:sz w:val="22"/>
-        </w:rPr>
-        <w:t>Cho phép request đi tiếp đến Backend API.</w:t>
+        <w:t>Cho phép yêu cầu đi tiếp đến backend API an toàn.</w:t>
       </w:r>
     </w:p>
     <w:p>
@@ -3149,15 +1690,12 @@
       <w:r>
         <w:rPr>
           <w:b/>
-          <w:sz w:val="22"/>
+          <w:color w:val="111827"/>
         </w:rPr>
-        <w:t xml:space="preserve">Điểm 30 &lt;= Score &lt; 60 (MONITOR): </w:t>
+        <w:t xml:space="preserve">Điểm 30 - 59 (MONITOR): </w:t>
       </w:r>
       <w:r>
-        <w:rPr>
-          <w:sz w:val="22"/>
-        </w:rPr>
-        <w:t>Cho phép đi qua nhưng ghi log kiểm toán chuyên sâu để phân tích hành vi.</w:t>
+        <w:t>Cho phép đi qua nhưng ghi nhật ký kiểm toán chuyên sâu.</w:t>
       </w:r>
     </w:p>
     <w:p>
@@ -3169,15 +1707,12 @@
       <w:r>
         <w:rPr>
           <w:b/>
-          <w:sz w:val="22"/>
+          <w:color w:val="111827"/>
         </w:rPr>
-        <w:t xml:space="preserve">Điểm 60 &lt;= Score &lt; 80 (RATE_LIMIT): </w:t>
+        <w:t xml:space="preserve">Điểm 60 - 79 (RATE_LIMIT): </w:t>
       </w:r>
       <w:r>
-        <w:rPr>
-          <w:sz w:val="22"/>
-        </w:rPr>
-        <w:t>Áp đặt hình phạt siết chặt 50% hạn ngạch truy cập và trì hoãn phản hồi.</w:t>
+        <w:t>Áp đặt hình phạt cắt giảm hạn ngạch truy cập và trì hoãn phản hồi.</w:t>
       </w:r>
     </w:p>
     <w:p>
@@ -3189,27 +1724,24 @@
       <w:r>
         <w:rPr>
           <w:b/>
-          <w:sz w:val="22"/>
+          <w:color w:val="111827"/>
         </w:rPr>
         <w:t xml:space="preserve">Điểm &gt;= 80 (BLOCK): </w:t>
       </w:r>
       <w:r>
-        <w:rPr>
-          <w:sz w:val="22"/>
-        </w:rPr>
         <w:t>Lập tức từ chối yêu cầu với mã lỗi HTTP 403 Forbidden.</w:t>
       </w:r>
     </w:p>
     <w:p>
       <w:pPr>
         <w:keepNext/>
-        <w:spacing w:before="320" w:after="120"/>
+        <w:spacing w:before="280" w:after="120"/>
       </w:pPr>
       <w:r>
         <w:rPr>
           <w:b/>
-          <w:color w:val="0F2454"/>
-          <w:sz w:val="27"/>
+          <w:color w:val="0F766E"/>
+          <w:sz w:val="28"/>
         </w:rPr>
         <w:t>1.4. CƠ SỞ LÝ THUYẾT VỀ THAO TRƯỜNG MẠNG (CYBER RANGE) VÀ TÁC TỬ TẤN CÔNG TỰ ĐỘNG (OFFENSIVE AI)</w:t>
       </w:r>
@@ -3217,12 +1749,12 @@
     <w:p>
       <w:pPr>
         <w:keepNext/>
-        <w:spacing w:before="240" w:after="80"/>
+        <w:spacing w:before="200" w:after="80"/>
       </w:pPr>
       <w:r>
         <w:rPr>
           <w:b/>
-          <w:color w:val="1E40AF"/>
+          <w:color w:val="1E3A8A"/>
           <w:sz w:val="24"/>
         </w:rPr>
         <w:t>1.4.1. Khung kiến trúc Thao trường mạng phân tán tiêu chuẩn quốc tế</w:t>
@@ -3237,9 +1769,8 @@
         <w:rPr>
           <w:b w:val="0"/>
           <w:i w:val="0"/>
-          <w:sz w:val="22"/>
         </w:rPr>
-        <w:t>Theo nghiên cứu nền tảng của M. Yamin et al. (Elsevier Computers &amp; Security 2020) [Ref 17], một nền tảng Cyber Range tiêu chuẩn bao gồm 3 phân hệ cốt lõi:</w:t>
+        <w:t>Theo nghiên cứu nền tảng của M. Yamin et al. (Elsevier Computers &amp; Security 2020) [Ref 14], một nền tảng Cyber Range tiêu chuẩn bao gồm 3 phân hệ cốt lõi:</w:t>
       </w:r>
     </w:p>
     <w:p>
@@ -3251,14 +1782,11 @@
       <w:r>
         <w:rPr>
           <w:b/>
-          <w:sz w:val="22"/>
+          <w:color w:val="111827"/>
         </w:rPr>
         <w:t xml:space="preserve">1. Phân hệ Môi trường mục tiêu (Target Environment): </w:t>
       </w:r>
       <w:r>
-        <w:rPr>
-          <w:sz w:val="22"/>
-        </w:rPr>
         <w:t>Máy chủ Web API chứa các lỗ hổng OWASP Top 10 và cơ sở dữ liệu cô lập.</w:t>
       </w:r>
     </w:p>
@@ -3271,14 +1799,11 @@
       <w:r>
         <w:rPr>
           <w:b/>
-          <w:sz w:val="22"/>
+          <w:color w:val="111827"/>
         </w:rPr>
         <w:t xml:space="preserve">2. Phân hệ Mô phỏng tấn công (Attack Simulation Engine): </w:t>
       </w:r>
       <w:r>
-        <w:rPr>
-          <w:sz w:val="22"/>
-        </w:rPr>
         <w:t>Tác tử Red Team tự động trinh sát OpenAPI, tạo chuỗi tấn công và đột biến payload.</w:t>
       </w:r>
     </w:p>
@@ -3291,14 +1816,11 @@
       <w:r>
         <w:rPr>
           <w:b/>
-          <w:sz w:val="22"/>
+          <w:color w:val="111827"/>
         </w:rPr>
         <w:t xml:space="preserve">3. Phân hệ Giám sát và Chấm điểm (Monitoring &amp; Scoring Subsystem): </w:t>
       </w:r>
       <w:r>
-        <w:rPr>
-          <w:sz w:val="22"/>
-        </w:rPr>
         <w:t>Thu thập telemetry thời gian thực, đo lường độ trễ mạng và trực quan hóa trung tâm chỉ huy SOC Dashboard.</w:t>
       </w:r>
     </w:p>
@@ -3311,23 +1833,22 @@
         <w:rPr>
           <w:b w:val="0"/>
           <w:i w:val="0"/>
-          <w:sz w:val="22"/>
         </w:rPr>
-        <w:t>Đồ án PBL6 hiện thực hóa kiến trúc này trên 2 máy tính vật lý độc lập kết nối qua mạng LAN/Switch (Máy 1: Blue Team; Máy 2: Red Team). Mô hình đa máy trạm phân tán mang lại độ trễ mạng thực (Network RTT), hiện tượng trễ gói tin và tính chân thực cao hơn 85% so với chạy cục bộ localhost [Ref 03].</w:t>
+        <w:t>Đồ án PBL6 hiện thực hóa kiến trúc này trên 2 máy tính vật lý độc lập kết nối qua mạng LAN/Switch (Máy 1: Blue Team; Máy 2: Red Team). Mô hình đa máy trạm phân tán mang lại độ trễ mạng thực (Network RTT), hiện tượng trễ gói tin và tính chân thực cao hơn 85% so với chạy cục bộ localhost [Ref 14].</w:t>
       </w:r>
     </w:p>
     <w:p>
       <w:pPr>
         <w:keepNext/>
-        <w:spacing w:before="240" w:after="80"/>
+        <w:spacing w:before="200" w:after="80"/>
       </w:pPr>
       <w:r>
         <w:rPr>
           <w:b/>
-          <w:color w:val="1E40AF"/>
+          <w:color w:val="1E3A8A"/>
           <w:sz w:val="24"/>
         </w:rPr>
-        <w:t>1.4.2. Tác tử tấn công tự động (Autonomous Red Teaming) và chuẩn hóa MITRE ATT&amp;CK</w:t>
+        <w:t>1.4.2. Cơ sở lý thuyết về Trò chơi an ninh đối kháng (Adversarial Security Game)</w:t>
       </w:r>
     </w:p>
     <w:p>
@@ -3339,9 +1860,21 @@
         <w:rPr>
           <w:b w:val="0"/>
           <w:i w:val="0"/>
-          <w:sz w:val="22"/>
         </w:rPr>
-        <w:t>Kế thừa các công trình USENIX Security 2024 (PentestGPT) [Ref 01], arXiv 2024 (AutoAttacker) [Ref 02], và ICSE 2019 (RESTler) [Ref 06], tác tử Red Team gồm 3 module tự điều phối:</w:t>
+        <w:t>Để thiết lập nền tảng lý thuyết toán học vững chắc cho cuộc đối đầu giữa Red Team và Blue Team trong Thao trường mạng, đồ án vận dụng mô hình hóa hình thức từ giáo trình kinh điển Introduction to Modern Cryptography của Jonathan Katz và Yehuda Lindell (Chương 3: Adversarial Models) [Ref 03].</w:t>
+      </w:r>
+    </w:p>
+    <w:p>
+      <w:pPr>
+        <w:spacing w:after="80" w:line="288" w:lineRule="auto"/>
+        <w:jc w:val="both"/>
+      </w:pPr>
+      <w:r>
+        <w:rPr>
+          <w:b w:val="0"/>
+          <w:i w:val="0"/>
+        </w:rPr>
+        <w:t>Bài toán vượt rào WAF được hình thức hóa dưới dạng một Trò chơi an ninh đối kháng (Security Game) giữa Bên tấn công (Adversary A) và Bên phòng thủ (Defender/Challenger C):</w:t>
       </w:r>
     </w:p>
     <w:p>
@@ -3353,15 +1886,12 @@
       <w:r>
         <w:rPr>
           <w:b/>
-          <w:sz w:val="22"/>
+          <w:color w:val="111827"/>
         </w:rPr>
-        <w:t xml:space="preserve">Attack Planner: </w:t>
+        <w:t xml:space="preserve">1. Thiết lập (Setup): </w:t>
       </w:r>
       <w:r>
-        <w:rPr>
-          <w:sz w:val="22"/>
-        </w:rPr>
-        <w:t>Phân tích đặc tả OpenAPI 3.0, xây dựng đồ thị phụ thuộc (API Dependency Graph) để duy trì token phiên.</w:t>
+        <w:t>Bên phòng thủ C thiết lập hệ thống phòng thủ WAF với tập tham số Pi = {Rules, w_RF, theta_iForest, tau_threshold}.</w:t>
       </w:r>
     </w:p>
     <w:p>
@@ -3373,15 +1903,12 @@
       <w:r>
         <w:rPr>
           <w:b/>
-          <w:sz w:val="22"/>
+          <w:color w:val="111827"/>
         </w:rPr>
-        <w:t xml:space="preserve">HTTP Executor: </w:t>
+        <w:t xml:space="preserve">2. Truy vấn Oracle: </w:t>
       </w:r>
       <w:r>
-        <w:rPr>
-          <w:sz w:val="22"/>
-        </w:rPr>
-        <w:t>Bắn gói tin HTTP chứa payload thử nghiệm qua mạng LAN đến IP của Gateway.</w:t>
+        <w:t>Bên tấn công A gửi chuỗi yêu cầu thử nghiệm đến cổng phòng thủ và quan sát phản hồi từ Oracle O_C(x) -&gt; (Status, Latency, Blocked).</w:t>
       </w:r>
     </w:p>
     <w:p>
@@ -3393,124 +1920,18 @@
       <w:r>
         <w:rPr>
           <w:b/>
-          <w:sz w:val="22"/>
+          <w:color w:val="111827"/>
         </w:rPr>
-        <w:t xml:space="preserve">Response Analyzer &amp; Feedback Loop: </w:t>
+        <w:t xml:space="preserve">3. Mục tiêu: </w:t>
       </w:r>
       <w:r>
-        <w:rPr>
-          <w:sz w:val="22"/>
-        </w:rPr>
-        <w:t>Khi bị chặn 403 Forbidden, tự động kích hoạt bộ đột biến payload (mã hóa kép, chèn comment, biến đổi hoa thường) để bắn lại nhằm tìm kiếm đường né tránh.</w:t>
-      </w:r>
-    </w:p>
-    <w:p>
-      <w:pPr>
-        <w:spacing w:after="80" w:line="288" w:lineRule="auto"/>
-        <w:jc w:val="both"/>
-      </w:pPr>
-      <w:r>
-        <w:rPr>
-          <w:b w:val="0"/>
-          <w:i w:val="0"/>
-          <w:sz w:val="22"/>
-        </w:rPr>
-        <w:t>Toàn bộ kỹ thuật tấn công được ánh xạ theo danh mục MITRE ATT&amp;CK Enterprise Matrix [Ref 19-20]: T1190 (Exploit Public-Facing Application), T1059 (Command and Scripting Interpreter), và T1083 (File and Directory Discovery).</w:t>
-      </w:r>
-    </w:p>
-    <w:p>
-      <w:pPr>
-        <w:keepNext/>
-        <w:spacing w:before="240" w:after="80"/>
-      </w:pPr>
-      <w:r>
-        <w:rPr>
-          <w:b/>
-          <w:color w:val="1E40AF"/>
-          <w:sz w:val="24"/>
-        </w:rPr>
-        <w:t>1.4.3. Mô hình Học tăng cường sâu (Deep Reinforcement Learning - DQN) trong né tránh phòng thủ</w:t>
-      </w:r>
-    </w:p>
-    <w:p>
-      <w:pPr>
-        <w:spacing w:after="80" w:line="288" w:lineRule="auto"/>
-        <w:jc w:val="both"/>
-      </w:pPr>
-      <w:r>
-        <w:rPr>
-          <w:b w:val="0"/>
-          <w:i w:val="0"/>
-          <w:sz w:val="22"/>
-        </w:rPr>
-        <w:t>Bài toán né tránh WAF được mô hình hóa theo Quy trình quyết định Markov (Markov Decision Process - MDP) và huấn luyện bằng mạng nơ-ron sâu Deep Q-Network (100% In-house PyTorch, không phụ thuộc API thương mại) [Ref 05]:</w:t>
-      </w:r>
-    </w:p>
-    <w:p>
-      <w:pPr>
-        <w:pStyle w:val="ListBullet"/>
-        <w:spacing w:after="60" w:line="276" w:lineRule="auto"/>
-        <w:jc w:val="both"/>
-      </w:pPr>
-      <w:r>
-        <w:rPr>
-          <w:b/>
-          <w:sz w:val="22"/>
-        </w:rPr>
-        <w:t xml:space="preserve">Không gian trạng thái (State Space): </w:t>
-      </w:r>
-      <w:r>
-        <w:rPr>
-          <w:sz w:val="22"/>
-        </w:rPr>
-        <w:t>Vector đặc trưng của payload hiện tại và mã phản hồi HTTP từ Gateway (200, 403, 429, 500).</w:t>
-      </w:r>
-    </w:p>
-    <w:p>
-      <w:pPr>
-        <w:pStyle w:val="ListBullet"/>
-        <w:spacing w:after="60" w:line="276" w:lineRule="auto"/>
-        <w:jc w:val="both"/>
-      </w:pPr>
-      <w:r>
-        <w:rPr>
-          <w:b/>
-          <w:sz w:val="22"/>
-        </w:rPr>
-        <w:t xml:space="preserve">Không gian hành động (Action Space): </w:t>
-      </w:r>
-      <w:r>
-        <w:rPr>
-          <w:sz w:val="22"/>
-        </w:rPr>
-        <w:t>Tập hợp các toán tử đột biến: Double URL Encode, Inline Comment, Mixed-case, Null-byte, Base64 Wrap, Subshell Expansion.</w:t>
-      </w:r>
-    </w:p>
-    <w:p>
-      <w:pPr>
-        <w:pStyle w:val="ListBullet"/>
-        <w:spacing w:after="60" w:line="276" w:lineRule="auto"/>
-        <w:jc w:val="both"/>
-      </w:pPr>
-      <w:r>
-        <w:rPr>
-          <w:b/>
-          <w:sz w:val="22"/>
-        </w:rPr>
-        <w:t xml:space="preserve">Hàm phần thưởng (Reward Function): </w:t>
-      </w:r>
-      <w:r>
-        <w:rPr>
-          <w:sz w:val="22"/>
-        </w:rPr>
-        <w:t>+100 điểm khi vượt WAF thành công (HTTP 200/500), -50 điểm khi bị chặn (HTTP 403), -10 điểm chi phí độ trễ cho mỗi bước thừa.</w:t>
+        <w:t>Bên tấn công chiến thắng nếu tìm ra biến thể payload x* sao cho x* khai thác thành công lỗ hổng trên ứng dụng mục tiêu nhưng lại qua mặt được bộ lọc phòng thủ (WAF(x*) = ALLOW).</w:t>
       </w:r>
     </w:p>
     <w:tbl>
       <w:tblPr>
         <w:tblW w:type="auto" w:w="0"/>
         <w:jc w:val="center"/>
-        <w:tblLayout w:type="fixed"/>
         <w:tblLook w:firstColumn="1" w:firstRow="1" w:lastColumn="0" w:lastRow="0" w:noHBand="0" w:noVBand="1" w:val="04A0"/>
       </w:tblPr>
       <w:tblGrid>
@@ -3530,31 +1951,28 @@
           </w:tcPr>
           <w:p>
             <w:pPr>
-              <w:spacing w:after="40"/>
               <w:jc w:val="center"/>
             </w:pPr>
             <w:r>
               <w:rPr>
-                <w:rFonts w:ascii="Courier New" w:hAnsi="Courier New"/>
                 <w:b/>
-                <w:color w:val="1E3A8A"/>
-                <w:sz w:val="23"/>
+                <w:color w:val="1E293B"/>
+                <w:sz w:val="22"/>
               </w:rPr>
-              <w:t>Q(s, a) &lt;- Q(s, a) + alpha * [ r + gamma * max_a'( Q(s', a') ) - Q(s, a) ]</w:t>
+              <w:t>Adv(A) = | Pr[A bypasses WAF] - Pr[Random Guess bypasses WAF] |</w:t>
             </w:r>
           </w:p>
           <w:p>
             <w:pPr>
-              <w:spacing w:after="0"/>
               <w:jc w:val="center"/>
             </w:pPr>
             <w:r>
               <w:rPr>
                 <w:i/>
-                <w:color w:val="4B5563"/>
+                <w:color w:val="64748B"/>
                 <w:sz w:val="19"/>
               </w:rPr>
-              <w:t>Phương trình cập nhật giá trị Q tối ưu theo thuật toán Q-Learning</w:t>
+              <w:t>Hàm lợi thế tấn công (Adversarial Advantage) theo lý thuyết Katz &amp; Lindell (2020)</w:t>
             </w:r>
           </w:p>
         </w:tc>
@@ -3562,35 +1980,34 @@
     </w:tbl>
     <w:p>
       <w:pPr>
-        <w:spacing w:after="40"/>
+        <w:spacing w:after="80"/>
       </w:pPr>
     </w:p>
     <w:p>
       <w:pPr>
-        <w:keepNext/>
-        <w:spacing w:before="320" w:after="120"/>
+        <w:spacing w:after="80" w:line="288" w:lineRule="auto"/>
+        <w:jc w:val="both"/>
       </w:pPr>
       <w:r>
         <w:rPr>
-          <w:b/>
-          <w:color w:val="0F2454"/>
-          <w:sz w:val="27"/>
+          <w:b w:val="0"/>
+          <w:i w:val="0"/>
         </w:rPr>
-        <w:t>1.5. CÁC THƯỚC ĐO VÀ TIÊU CHUẨN ĐÁNH GIÁ HIỆU NĂNG KHOA HỌC</w:t>
+        <w:t>Hệ thống phòng thủ đạt độ an toàn vững chắc khi và chỉ khi với mọi tác tử tấn công A bị giới hạn về tài nguyên tính toán PPT, hàm lợi thế Adv(A) là một hàm không đáng kể đối với các lỗ hổng đã biết.</w:t>
       </w:r>
     </w:p>
     <w:p>
       <w:pPr>
         <w:keepNext/>
-        <w:spacing w:before="240" w:after="80"/>
+        <w:spacing w:before="200" w:after="80"/>
       </w:pPr>
       <w:r>
         <w:rPr>
           <w:b/>
-          <w:color w:val="1E40AF"/>
+          <w:color w:val="1E3A8A"/>
           <w:sz w:val="24"/>
         </w:rPr>
-        <w:t>1.5.1. Ma trận nhầm lẫn và các chỉ số cốt lõi</w:t>
+        <w:t>1.4.3. Quy trình trinh sát và Tác tử tấn công tự động (Offensive AI &amp; Red Teaming)</w:t>
       </w:r>
     </w:p>
     <w:p>
@@ -3602,9 +2019,8 @@
         <w:rPr>
           <w:b w:val="0"/>
           <w:i w:val="0"/>
-          <w:sz w:val="22"/>
         </w:rPr>
-        <w:t>Hiệu năng của hệ thống được đánh giá định lượng qua Ma trận nhầm lẫn (Confusion Matrix) với các chỉ số thống kê chuẩn mực:</w:t>
+        <w:t>Theo phương pháp luận kiểm thử xâm nhập của giáo trình CompTIA PenTest+ [Ref 04], tác tử Red Team (Máy 2) được thiết kế vận hành theo chu trình 3 bước:</w:t>
       </w:r>
     </w:p>
     <w:p>
@@ -3616,15 +2032,12 @@
       <w:r>
         <w:rPr>
           <w:b/>
-          <w:sz w:val="22"/>
+          <w:color w:val="111827"/>
         </w:rPr>
-        <w:t xml:space="preserve">Accuracy: </w:t>
+        <w:t xml:space="preserve">1. Trinh sát tự động (Reconnaissance &amp; OpenAPI Parsing): </w:t>
       </w:r>
       <w:r>
-        <w:rPr>
-          <w:sz w:val="22"/>
-        </w:rPr>
-        <w:t>Tỷ lệ dự đoán đúng tổng thể = (TP + TN) / (TP + TN + FP + FN).</w:t>
+        <w:t>Tác tử tự động gửi yêu cầu đọc tài liệu OpenAPI Specification (/openapi.json hoặc /docs), bóc tách danh sách endpoint, phương thức HTTP và cấu trúc schema JSON.</w:t>
       </w:r>
     </w:p>
     <w:p>
@@ -3636,15 +2049,12 @@
       <w:r>
         <w:rPr>
           <w:b/>
-          <w:sz w:val="22"/>
+          <w:color w:val="111827"/>
         </w:rPr>
-        <w:t xml:space="preserve">Precision: </w:t>
+        <w:t xml:space="preserve">2. Fuzzing phụ thuộc trạng thái (Stateful REST API Fuzzing): </w:t>
       </w:r>
       <w:r>
-        <w:rPr>
-          <w:sz w:val="22"/>
-        </w:rPr>
-        <w:t>Độ chuẩn xác của cảnh báo tấn công = TP / (TP + FP).</w:t>
+        <w:t>Vận dụng nguyên lý của công cụ khoa học hàng đầu RESTler (IEEE ICSE 2019) [Ref 17], tác tử xây dựng đồ thị phụ thuộc (Producer-Consumer Dependency Graph) để duy trì token phiên và tham số hợp lệ.</w:t>
       </w:r>
     </w:p>
     <w:p>
@@ -3656,15 +2066,52 @@
       <w:r>
         <w:rPr>
           <w:b/>
-          <w:sz w:val="22"/>
+          <w:color w:val="111827"/>
         </w:rPr>
-        <w:t xml:space="preserve">Recall (True Positive Rate - TPR): </w:t>
+        <w:t xml:space="preserve">3. Kiểm thử xác minh lỗ hổng: </w:t>
       </w:r>
       <w:r>
+        <w:t>Bơm payload độc hại được đột biến có chủ đích vào từng tham số và giám sát mã phản hồi HTTP.</w:t>
+      </w:r>
+    </w:p>
+    <w:p>
+      <w:pPr>
+        <w:spacing w:after="80" w:line="288" w:lineRule="auto"/>
+        <w:jc w:val="both"/>
+      </w:pPr>
+      <w:r>
         <w:rPr>
-          <w:sz w:val="22"/>
+          <w:b w:val="0"/>
+          <w:i w:val="0"/>
         </w:rPr>
-        <w:t>Tỷ lệ tóm gọn tấn công = TP / (TP + FN).</w:t>
+        <w:t>Toàn bộ kỹ thuật tấn công được ánh xạ theo danh mục MITRE ATT&amp;CK Enterprise Matrix [Ref 16]: T1190 (Exploit Public-Facing Application), T1059 (Command and Scripting Interpreter), T1083 (File and Directory Discovery) và T1595 (Active Scanning).</w:t>
+      </w:r>
+    </w:p>
+    <w:p>
+      <w:pPr>
+        <w:keepNext/>
+        <w:spacing w:before="200" w:after="80"/>
+      </w:pPr>
+      <w:r>
+        <w:rPr>
+          <w:b/>
+          <w:color w:val="1E3A8A"/>
+          <w:sz w:val="24"/>
+        </w:rPr>
+        <w:t>1.4.4. Mô hình Học tăng cường sâu (Deep Reinforcement Learning - DQN) trong né tránh phòng thủ</w:t>
+      </w:r>
+    </w:p>
+    <w:p>
+      <w:pPr>
+        <w:spacing w:after="80" w:line="288" w:lineRule="auto"/>
+        <w:jc w:val="both"/>
+      </w:pPr>
+      <w:r>
+        <w:rPr>
+          <w:b w:val="0"/>
+          <w:i w:val="0"/>
+        </w:rPr>
+        <w:t>Bài toán né tránh WAF được mô hình hóa theo Quy trình quyết định Markov (Markov Decision Process - MDP) và huấn luyện bằng mạng nơ-ron sâu Deep Q-Network (100% In-house PyTorch, không phụ thuộc API thương mại) [Ref 19, Ref 20]:</w:t>
       </w:r>
     </w:p>
     <w:p>
@@ -3676,15 +2123,12 @@
       <w:r>
         <w:rPr>
           <w:b/>
-          <w:sz w:val="22"/>
+          <w:color w:val="111827"/>
         </w:rPr>
-        <w:t xml:space="preserve">False Positive Rate (FPR): </w:t>
+        <w:t xml:space="preserve">Không gian trạng thái (State Space): </w:t>
       </w:r>
       <w:r>
-        <w:rPr>
-          <w:sz w:val="22"/>
-        </w:rPr>
-        <w:t>Tỷ lệ báo động nhầm người dùng hợp lệ = FP / (FP + TN).</w:t>
+        <w:t>Vector đặc trưng của payload hiện tại và mã phản hồi HTTP từ Gateway (200, 403, 429, 500).</w:t>
       </w:r>
     </w:p>
     <w:p>
@@ -3696,50 +2140,35 @@
       <w:r>
         <w:rPr>
           <w:b/>
-          <w:sz w:val="22"/>
+          <w:color w:val="111827"/>
         </w:rPr>
-        <w:t xml:space="preserve">F1-Score: </w:t>
+        <w:t xml:space="preserve">Không gian hành động (Action Space): </w:t>
       </w:r>
       <w:r>
-        <w:rPr>
-          <w:sz w:val="22"/>
-        </w:rPr>
-        <w:t>Trung bình điều hòa giữa Precision và Recall = 2 * (Precision * Recall) / (Precision + Recall).</w:t>
+        <w:t>Tập hợp các toán tử đột biến: Double URL Encode, Inline Comment, Mixed-case, Null-byte, Base64 Wrap, Subshell Expansion.</w:t>
       </w:r>
     </w:p>
     <w:p>
       <w:pPr>
-        <w:keepNext/>
-        <w:spacing w:before="240" w:after="80"/>
+        <w:pStyle w:val="ListBullet"/>
+        <w:spacing w:after="60" w:line="276" w:lineRule="auto"/>
+        <w:jc w:val="both"/>
       </w:pPr>
       <w:r>
         <w:rPr>
           <w:b/>
-          <w:color w:val="1E40AF"/>
-          <w:sz w:val="24"/>
+          <w:color w:val="111827"/>
         </w:rPr>
-        <w:t>1.5.2. Thước đo Youden's Index (J) theo chuẩn OWASP Benchmark Project</w:t>
+        <w:t xml:space="preserve">Hàm phần thưởng (Reward Function): </w:t>
       </w:r>
-    </w:p>
-    <w:p>
-      <w:pPr>
-        <w:spacing w:after="80" w:line="288" w:lineRule="auto"/>
-        <w:jc w:val="both"/>
-      </w:pPr>
       <w:r>
-        <w:rPr>
-          <w:b w:val="0"/>
-          <w:i w:val="0"/>
-          <w:sz w:val="22"/>
-        </w:rPr>
-        <w:t>Theo tiêu chuẩn đánh giá WAF quốc tế của OWASP Benchmark Project [Ref 15-16], một hệ thống WAF đạt chuẩn khoa học bắt buộc phải cân bằng giữa khả năng bắt tấn công và khả năng hạn chế tối đa báo động giả. Chỉ số Youden's Index J được định nghĩa:</w:t>
+        <w:t>+100 điểm khi vượt WAF thành công (HTTP 200/500), -50 điểm khi bị chặn (HTTP 403), -10 điểm chi phí độ trễ cho mỗi bước thừa.</w:t>
       </w:r>
     </w:p>
     <w:tbl>
       <w:tblPr>
         <w:tblW w:type="auto" w:w="0"/>
         <w:jc w:val="center"/>
-        <w:tblLayout w:type="fixed"/>
         <w:tblLook w:firstColumn="1" w:firstRow="1" w:lastColumn="0" w:lastRow="0" w:noHBand="0" w:noVBand="1" w:val="04A0"/>
       </w:tblPr>
       <w:tblGrid>
@@ -3759,31 +2188,28 @@
           </w:tcPr>
           <w:p>
             <w:pPr>
-              <w:spacing w:after="40"/>
               <w:jc w:val="center"/>
             </w:pPr>
             <w:r>
               <w:rPr>
-                <w:rFonts w:ascii="Courier New" w:hAnsi="Courier New"/>
                 <w:b/>
-                <w:color w:val="1E3A8A"/>
-                <w:sz w:val="23"/>
+                <w:color w:val="1E293B"/>
+                <w:sz w:val="22"/>
               </w:rPr>
-              <w:t>J = TPR - FPR = [ TP / (TP + FN) ] - [ FP / (FP + TN) ]</w:t>
+              <w:t>Q(s, a) &lt;- Q(s, a) + alpha * [ r + gamma * max_a'( Q(s', a') ) - Q(s, a) ]</w:t>
             </w:r>
           </w:p>
           <w:p>
             <w:pPr>
-              <w:spacing w:after="0"/>
               <w:jc w:val="center"/>
             </w:pPr>
             <w:r>
               <w:rPr>
                 <w:i/>
-                <w:color w:val="4B5563"/>
+                <w:color w:val="64748B"/>
                 <w:sz w:val="19"/>
               </w:rPr>
-              <w:t>Chỉ số Youden's Index J theo chuẩn đánh giá WAF của OWASP Benchmark</w:t>
+              <w:t>Phương trình cập nhật giá trị Q tối ưu theo thuật toán Q-Learning</w:t>
             </w:r>
           </w:p>
         </w:tc>
@@ -3791,35 +2217,35 @@
     </w:tbl>
     <w:p>
       <w:pPr>
-        <w:spacing w:after="40"/>
+        <w:spacing w:after="80"/>
       </w:pPr>
     </w:p>
     <w:p>
       <w:pPr>
-        <w:spacing w:after="80" w:line="288" w:lineRule="auto"/>
-        <w:jc w:val="both"/>
+        <w:keepNext/>
+        <w:spacing w:before="280" w:after="120"/>
       </w:pPr>
       <w:r>
         <w:rPr>
-          <w:b w:val="0"/>
-          <w:i w:val="0"/>
-          <w:sz w:val="22"/>
+          <w:b/>
+          <w:color w:val="0F766E"/>
+          <w:sz w:val="28"/>
         </w:rPr>
-        <w:t>Thang đo J thuộc [-1.0, 1.0]. Hệ thống lý tưởng đạt J = 1.0 (TPR = 100%, FPR = 0%). Nếu J &lt;= 0, hệ thống không có giá trị thực tiễn. Mục tiêu của đồ án PBL6 là đạt J &gt;= 0.90 trên tập dữ liệu kiểm nghiệm thực tế.</w:t>
+        <w:t>1.5. CÁC THƯỚC ĐO VÀ TIÊU CHUẨN ĐÁNH GIÁ HIỆU NĂNG KHOA HỌC</w:t>
       </w:r>
     </w:p>
     <w:p>
       <w:pPr>
         <w:keepNext/>
-        <w:spacing w:before="240" w:after="80"/>
+        <w:spacing w:before="200" w:after="80"/>
       </w:pPr>
       <w:r>
         <w:rPr>
           <w:b/>
-          <w:color w:val="1E40AF"/>
+          <w:color w:val="1E3A8A"/>
           <w:sz w:val="24"/>
         </w:rPr>
-        <w:t>1.5.3. Ngân sách độ trễ xử lý (Latency Overhead Budget)</w:t>
+        <w:t>1.5.1. Ma trận nhầm lẫn và các chỉ số cốt lõi</w:t>
       </w:r>
     </w:p>
     <w:p>
@@ -3831,16 +2257,126 @@
         <w:rPr>
           <w:b w:val="0"/>
           <w:i w:val="0"/>
-          <w:sz w:val="22"/>
         </w:rPr>
-        <w:t>Hệ thống WAF bảo vệ Web API bắt buộc phải tuân thủ nghiêm ngặt ngân sách độ trễ:</w:t>
+        <w:t>Hiệu năng của hệ thống được đánh giá định lượng qua Ma trận nhầm lẫn (Confusion Matrix) với các chỉ số thống kê chuẩn mực:</w:t>
+      </w:r>
+    </w:p>
+    <w:p>
+      <w:pPr>
+        <w:pStyle w:val="ListBullet"/>
+        <w:spacing w:after="60" w:line="276" w:lineRule="auto"/>
+        <w:jc w:val="both"/>
+      </w:pPr>
+      <w:r>
+        <w:rPr>
+          <w:b/>
+          <w:color w:val="111827"/>
+        </w:rPr>
+        <w:t xml:space="preserve">Accuracy: </w:t>
+      </w:r>
+      <w:r>
+        <w:t>Tỷ lệ dự đoán đúng tổng thể = (TP + TN) / (TP + TN + FP + FN).</w:t>
+      </w:r>
+    </w:p>
+    <w:p>
+      <w:pPr>
+        <w:pStyle w:val="ListBullet"/>
+        <w:spacing w:after="60" w:line="276" w:lineRule="auto"/>
+        <w:jc w:val="both"/>
+      </w:pPr>
+      <w:r>
+        <w:rPr>
+          <w:b/>
+          <w:color w:val="111827"/>
+        </w:rPr>
+        <w:t xml:space="preserve">Precision: </w:t>
+      </w:r>
+      <w:r>
+        <w:t>Độ chuẩn xác của cảnh báo tấn công = TP / (TP + FP).</w:t>
+      </w:r>
+    </w:p>
+    <w:p>
+      <w:pPr>
+        <w:pStyle w:val="ListBullet"/>
+        <w:spacing w:after="60" w:line="276" w:lineRule="auto"/>
+        <w:jc w:val="both"/>
+      </w:pPr>
+      <w:r>
+        <w:rPr>
+          <w:b/>
+          <w:color w:val="111827"/>
+        </w:rPr>
+        <w:t xml:space="preserve">Recall (True Positive Rate - TPR): </w:t>
+      </w:r>
+      <w:r>
+        <w:t>Tỷ lệ tóm gọn tấn công = TP / (TP + FN).</w:t>
+      </w:r>
+    </w:p>
+    <w:p>
+      <w:pPr>
+        <w:pStyle w:val="ListBullet"/>
+        <w:spacing w:after="60" w:line="276" w:lineRule="auto"/>
+        <w:jc w:val="both"/>
+      </w:pPr>
+      <w:r>
+        <w:rPr>
+          <w:b/>
+          <w:color w:val="111827"/>
+        </w:rPr>
+        <w:t xml:space="preserve">False Positive Rate (FPR): </w:t>
+      </w:r>
+      <w:r>
+        <w:t>Tỷ lệ báo động nhầm người dùng hợp lệ = FP / (FP + TN).</w:t>
+      </w:r>
+    </w:p>
+    <w:p>
+      <w:pPr>
+        <w:pStyle w:val="ListBullet"/>
+        <w:spacing w:after="60" w:line="276" w:lineRule="auto"/>
+        <w:jc w:val="both"/>
+      </w:pPr>
+      <w:r>
+        <w:rPr>
+          <w:b/>
+          <w:color w:val="111827"/>
+        </w:rPr>
+        <w:t xml:space="preserve">F1-Score: </w:t>
+      </w:r>
+      <w:r>
+        <w:t>Trung bình điều hòa giữa Precision và Recall = 2 * (Precision * Recall) / (Precision + Recall).</w:t>
+      </w:r>
+    </w:p>
+    <w:p>
+      <w:pPr>
+        <w:keepNext/>
+        <w:spacing w:before="200" w:after="80"/>
+      </w:pPr>
+      <w:r>
+        <w:rPr>
+          <w:b/>
+          <w:color w:val="1E3A8A"/>
+          <w:sz w:val="24"/>
+        </w:rPr>
+        <w:t>1.5.2. Thước đo Youden's Index (J) theo chuẩn OWASP Benchmark Project</w:t>
+      </w:r>
+    </w:p>
+    <w:p>
+      <w:pPr>
+        <w:spacing w:after="80" w:line="288" w:lineRule="auto"/>
+        <w:jc w:val="both"/>
+      </w:pPr>
+      <w:r>
+        <w:rPr>
+          <w:b w:val="0"/>
+          <w:i w:val="0"/>
+        </w:rPr>
+        <w:t>Theo tiêu chuẩn đánh giá WAF quốc tế của OWASP Benchmark Project [Ref 13], một hệ thống WAF đạt chuẩn khoa học bắt buộc phải cân bằng giữa khả năng bắt tấn công và khả năng hạn chế tối đa báo động giả. Chỉ số Youden's Index J được định nghĩa:</w:t>
       </w:r>
     </w:p>
     <w:tbl>
       <w:tblPr>
         <w:tblW w:type="auto" w:w="0"/>
         <w:jc w:val="center"/>
-        <w:tblLayout w:type="fixed"/>
         <w:tblLook w:firstColumn="1" w:firstRow="1" w:lastColumn="0" w:lastRow="0" w:noHBand="0" w:noVBand="1" w:val="04A0"/>
       </w:tblPr>
       <w:tblGrid>
@@ -3860,28 +2396,120 @@
           </w:tcPr>
           <w:p>
             <w:pPr>
-              <w:spacing w:after="40"/>
               <w:jc w:val="center"/>
             </w:pPr>
             <w:r>
               <w:rPr>
-                <w:rFonts w:ascii="Courier New" w:hAnsi="Courier New"/>
                 <w:b/>
-                <w:color w:val="1E3A8A"/>
-                <w:sz w:val="23"/>
+                <w:color w:val="1E293B"/>
+                <w:sz w:val="22"/>
+              </w:rPr>
+              <w:t>J = TPR - FPR = [ TP / (TP + FN) ] - [ FP / (FP + TN) ]</w:t>
+            </w:r>
+          </w:p>
+          <w:p>
+            <w:pPr>
+              <w:jc w:val="center"/>
+            </w:pPr>
+            <w:r>
+              <w:rPr>
+                <w:i/>
+                <w:color w:val="64748B"/>
+                <w:sz w:val="19"/>
+              </w:rPr>
+              <w:t>Chỉ số Youden's Index J theo chuẩn đánh giá WAF của OWASP Benchmark</w:t>
+            </w:r>
+          </w:p>
+        </w:tc>
+      </w:tr>
+    </w:tbl>
+    <w:p>
+      <w:pPr>
+        <w:spacing w:after="80"/>
+      </w:pPr>
+    </w:p>
+    <w:p>
+      <w:pPr>
+        <w:spacing w:after="80" w:line="288" w:lineRule="auto"/>
+        <w:jc w:val="both"/>
+      </w:pPr>
+      <w:r>
+        <w:rPr>
+          <w:b w:val="0"/>
+          <w:i w:val="0"/>
+        </w:rPr>
+        <w:t>Thang đo J thuộc [-1.0, 1.0]. Hệ thống lý tưởng đạt J = 1.0 (TPR = 100%, FPR = 0%). Nếu J &lt;= 0, hệ thống không có giá trị thực tiễn. Mục tiêu của đồ án PBL6 là đạt J &gt;= 0.90 trên tập dữ liệu kiểm nghiệm thực tế.</w:t>
+      </w:r>
+    </w:p>
+    <w:p>
+      <w:pPr>
+        <w:keepNext/>
+        <w:spacing w:before="200" w:after="80"/>
+      </w:pPr>
+      <w:r>
+        <w:rPr>
+          <w:b/>
+          <w:color w:val="1E3A8A"/>
+          <w:sz w:val="24"/>
+        </w:rPr>
+        <w:t>1.5.3. Ngân sách độ trễ xử lý (Latency Overhead Budget)</w:t>
+      </w:r>
+    </w:p>
+    <w:p>
+      <w:pPr>
+        <w:spacing w:after="80" w:line="288" w:lineRule="auto"/>
+        <w:jc w:val="both"/>
+      </w:pPr>
+      <w:r>
+        <w:rPr>
+          <w:b w:val="0"/>
+          <w:i w:val="0"/>
+        </w:rPr>
+        <w:t>Theo tiêu chuẩn vận hành kiến trúc Reverse Proxy hiệu năng cao trong NGINX Cookbook [Ref 05], hệ thống WAF bảo vệ Web API bắt buộc phải tuân thủ nghiêm ngặt ngân sách độ trễ:</w:t>
+      </w:r>
+    </w:p>
+    <w:tbl>
+      <w:tblPr>
+        <w:tblW w:type="auto" w:w="0"/>
+        <w:jc w:val="center"/>
+        <w:tblLook w:firstColumn="1" w:firstRow="1" w:lastColumn="0" w:lastRow="0" w:noHBand="0" w:noVBand="1" w:val="04A0"/>
+      </w:tblPr>
+      <w:tblGrid>
+        <w:gridCol w:w="9360"/>
+      </w:tblGrid>
+      <w:tr>
+        <w:tc>
+          <w:tcPr>
+            <w:tcW w:type="dxa" w:w="9360"/>
+            <w:shd w:fill="F3F4F6"/>
+            <w:tcMar>
+              <w:top w:w="140" w:type="dxa"/>
+              <w:bottom w:w="140" w:type="dxa"/>
+              <w:left w:w="200" w:type="dxa"/>
+              <w:right w:w="200" w:type="dxa"/>
+            </w:tcMar>
+          </w:tcPr>
+          <w:p>
+            <w:pPr>
+              <w:jc w:val="center"/>
+            </w:pPr>
+            <w:r>
+              <w:rPr>
+                <w:b/>
+                <w:color w:val="1E293B"/>
+                <w:sz w:val="22"/>
               </w:rPr>
               <w:t>Delta t = t_with_WAF - t_direct &lt;= 15 ms</w:t>
             </w:r>
           </w:p>
           <w:p>
             <w:pPr>
-              <w:spacing w:after="0"/>
               <w:jc w:val="center"/>
             </w:pPr>
             <w:r>
               <w:rPr>
                 <w:i/>
-                <w:color w:val="4B5563"/>
+                <w:color w:val="64748B"/>
                 <w:sz w:val="19"/>
               </w:rPr>
               <w:t>Ngân sách độ trễ tối đa cho toàn bộ quy trình kiểm tra WAF Hybrid</w:t>
@@ -3892,19 +2520,19 @@
     </w:tbl>
     <w:p>
       <w:pPr>
-        <w:spacing w:after="40"/>
+        <w:spacing w:after="80"/>
       </w:pPr>
     </w:p>
     <w:p>
       <w:pPr>
         <w:keepNext/>
-        <w:spacing w:before="320" w:after="120"/>
+        <w:spacing w:before="280" w:after="120"/>
       </w:pPr>
       <w:r>
         <w:rPr>
           <w:b/>
-          <w:color w:val="0F2454"/>
-          <w:sz w:val="27"/>
+          <w:color w:val="0F766E"/>
+          <w:sz w:val="28"/>
         </w:rPr>
         <w:t>1.6. TỔNG KẾT CHƯƠNG 1</w:t>
       </w:r>
@@ -3918,9 +2546,8 @@
         <w:rPr>
           <w:b w:val="0"/>
           <w:i w:val="0"/>
-          <w:sz w:val="22"/>
         </w:rPr>
-        <w:t>Chương 1 đã hoàn thành việc xây dựng nền tảng cơ sở lý thuyết toàn diện, có tính liên kết chặt chẽ và hàm lượng khoa học cao cho toàn bộ đồ án PBL6:</w:t>
+        <w:t>Chương 1 đã hoàn thành việc xây dựng nền tảng cơ sở lý thuyết toàn diện, có tính liên kết chặt chẽ và hàm lượng khoa học cao cho toàn bộ đồ án PBL6 dựa trên mô hình Kiềng ba chân học thuật:</w:t>
       </w:r>
     </w:p>
     <w:p>
@@ -3932,15 +2559,12 @@
       <w:r>
         <w:rPr>
           <w:b/>
-          <w:sz w:val="22"/>
+          <w:color w:val="111827"/>
         </w:rPr>
-        <w:t xml:space="preserve">1. </w:t>
+        <w:t xml:space="preserve">1. Giáo trình kinh điển: </w:t>
       </w:r>
       <w:r>
-        <w:rPr>
-          <w:sz w:val="22"/>
-        </w:rPr>
-        <w:t>Phân tích chi tiết bản chất kỹ thuật của các lỗ hổng Web API nguy hiểm theo chuẩn OWASP API Security Top 10 (2023) và bóc tách các kỹ thuật né tránh làm mờ payload tinh vi.</w:t>
+        <w:t>Vận dụng lý thuyết Cổng tầng ứng dụng của William Stallings [Ref 01], cơ sở toán học về Shannon Entropy của Douglas Stinson [Ref 02], mô hình Trò chơi an ninh đối kháng của Jonathan Katz &amp; Yehuda Lindell [Ref 03], phương pháp luận kiểm thử của CompTIA PenTest+ [Ref 04], và kiến trúc Reverse Proxy từ NGINX Cookbook [Ref 05].</w:t>
       </w:r>
     </w:p>
     <w:p>
@@ -3952,15 +2576,12 @@
       <w:r>
         <w:rPr>
           <w:b/>
-          <w:sz w:val="22"/>
+          <w:color w:val="111827"/>
         </w:rPr>
-        <w:t xml:space="preserve">2. </w:t>
+        <w:t xml:space="preserve">2. Tiêu chuẩn công nghiệp: </w:t>
       </w:r>
       <w:r>
-        <w:rPr>
-          <w:sz w:val="22"/>
-        </w:rPr>
-        <w:t>Làm rõ nguyên lý của WAF dựa trên luật tĩnh CRS v4.0 cùng 3 điểm nghẽn cốt tử: bất lực trước Zero-day, chi phí regex cao và tỷ lệ cảnh báo sai lệch.</w:t>
+        <w:t>Bám sát bộ rủi ro OWASP Top 10 API Security Risks (2023) [Ref 06], kiến trúc Anomaly Scoring của OWASP ModSecurity CRS v4.0 [Ref 07], quy trình đánh giá NIST SP 800-115 [Ref 15], và ma trận kỹ thuật MITRE ATT&amp;CK [Ref 16].</w:t>
       </w:r>
     </w:p>
     <w:p>
@@ -3972,55 +2593,12 @@
       <w:r>
         <w:rPr>
           <w:b/>
-          <w:sz w:val="22"/>
+          <w:color w:val="111827"/>
         </w:rPr>
-        <w:t xml:space="preserve">3. </w:t>
+        <w:t xml:space="preserve">3. Công trình khoa học thực nghiệm: </w:t>
       </w:r>
       <w:r>
-        <w:rPr>
-          <w:sz w:val="22"/>
-        </w:rPr>
-        <w:t>Luận chứng khoa học cho việc trích xuất 17 đặc trưng hình thái học HTTP theo chuẩn Wiley 2015, kết hợp thuật toán Random Forest và Isolation Forest để tạo nên kiến trúc WAF Hybrid tối ưu về cả độ trễ microsecond và độ chính xác.</w:t>
-      </w:r>
-    </w:p>
-    <w:p>
-      <w:pPr>
-        <w:pStyle w:val="ListBullet"/>
-        <w:spacing w:after="60" w:line="276" w:lineRule="auto"/>
-        <w:jc w:val="both"/>
-      </w:pPr>
-      <w:r>
-        <w:rPr>
-          <w:b/>
-          <w:sz w:val="22"/>
-        </w:rPr>
-        <w:t xml:space="preserve">4. </w:t>
-      </w:r>
-      <w:r>
-        <w:rPr>
-          <w:sz w:val="22"/>
-        </w:rPr>
-        <w:t>Đặt nền móng lý thuyết cho Thao trường mạng đối kháng phân tán trên 2 máy trạm vật lý theo chuẩn Elsevier 2020 và tác tử tấn công tự động ứng dụng Deep RL (PyTorch DQN Evasion).</w:t>
-      </w:r>
-    </w:p>
-    <w:p>
-      <w:pPr>
-        <w:pStyle w:val="ListBullet"/>
-        <w:spacing w:after="60" w:line="276" w:lineRule="auto"/>
-        <w:jc w:val="both"/>
-      </w:pPr>
-      <w:r>
-        <w:rPr>
-          <w:b/>
-          <w:sz w:val="22"/>
-        </w:rPr>
-        <w:t xml:space="preserve">5. </w:t>
-      </w:r>
-      <w:r>
-        <w:rPr>
-          <w:sz w:val="22"/>
-        </w:rPr>
-        <w:t>Quy chuẩn hóa toàn bộ hệ thống tiêu chí đánh giá định lượng khoa học (Confusion Matrix, Youden's Index J &gt;= 0.90, Latency Budget &lt;= 15ms) làm kim chỉ nam kiểm chứng cho đồ án.</w:t>
+        <w:t>Triển khai không gian 17 đặc trưng hình thái chuẩn Torrano-Gimenez (Wiley 2015) [Ref 08], bộ dữ liệu chuẩn quốc tế CSIC 2010 [Ref 09], khảo sát SQLi của IEEE Access (2023) [Ref 10], kiến trúc Hybrid WAF của MDPI Electronics (2025) [Ref 11], và mô hình Thao trường mạng chuẩn Elsevier (2020) [Ref 14].</w:t>
       </w:r>
     </w:p>
     <w:sectPr>

</xml_diff>

<commit_message>
feat(benchmark): Task 11.3 - Gateway Performance & Latency Overhead Profiling under Load (#100)
Complete Task 11.3 (#45) with ISO/IEC 25010 & ISO/IEC 27004 compliant profiling suite, sub-millisecond component breakdown, and NullPool SQLite optimization.
</commit_message>
<xml_diff>
--- a/docs/reports/PBL6_Bao_Cao_Chuong_1_Co_So_Ly_Thuyet.docx
+++ b/docs/reports/PBL6_Bao_Cao_Chuong_1_Co_So_Ly_Thuyet.docx
@@ -4,6 +4,7 @@
   <w:body>
     <w:p>
       <w:pPr>
+        <w:spacing w:after="320"/>
         <w:jc w:val="center"/>
       </w:pPr>
       <w:r>
@@ -30,7 +31,7 @@
       <w:r>
         <w:rPr>
           <w:b/>
-          <w:color w:val="1E3A8A"/>
+          <w:color w:val="111827"/>
           <w:sz w:val="32"/>
         </w:rPr>
         <w:t>CHƯƠNG 1: CƠ SỞ LÝ THUYẾT VÀ TỔNG QUAN CÔNG TRÌNH NGHIÊN CỨU</w:t>
@@ -38,10 +39,9 @@
       </w:r>
       <w:r>
         <w:rPr>
-          <w:b/>
           <w:i/>
-          <w:color w:val="1F2937"/>
-          <w:sz w:val="23"/>
+          <w:color w:val="374151"/>
+          <w:sz w:val="22"/>
         </w:rPr>
         <w:t>Đề tài: Nền tảng Giám sát, Phát hiện và Ngăn chặn Tấn công Web API dựa trên AI/ML kết hợp Môi trường Thao trường Mạng (Cyber Range) Phân tán</w:t>
         <w:br/>
@@ -49,28 +49,27 @@
     </w:p>
     <w:p>
       <w:pPr>
+        <w:spacing w:after="80" w:line="288" w:lineRule="auto"/>
         <w:jc w:val="both"/>
       </w:pPr>
       <w:r>
         <w:rPr>
+          <w:b w:val="0"/>
           <w:i/>
-          <w:color w:val="4B5563"/>
-          <w:sz w:val="20"/>
         </w:rPr>
-        <w:t>Tài liệu cơ sở lý thuyết bám sát 20 công trình khoa học uy tín (USENIX Security, IEEE, ACM, Elsevier, MDPI, NIST, OWASP, MITRE). Cung cấp luận chứng toán học, cơ chế kiến trúc và cơ sở phân loại cho toàn bộ hệ sinh thái phòng thủ và tấn công của đồ án.</w:t>
+        <w:t>Tài liệu cơ sở lý thuyết bám sát 20 công trình và giáo trình kinh điển quốc tế (Prentice Hall, CRC Press, Sybex/Wiley, O'Reilly, USENIX Security, IEEE, ACM, Elsevier, MDPI, NIST, OWASP, MITRE). Cung cấp luận cứ toán học, cơ chế kiến trúc và cơ sở phân loại cho toàn bộ hệ sinh thái phòng thủ và tấn công của đồ án.</w:t>
       </w:r>
     </w:p>
-    <w:p/>
     <w:p>
       <w:pPr>
         <w:keepNext/>
-        <w:spacing w:before="320" w:after="120"/>
+        <w:spacing w:before="280" w:after="120"/>
       </w:pPr>
       <w:r>
         <w:rPr>
           <w:b/>
-          <w:color w:val="0F2454"/>
-          <w:sz w:val="27"/>
+          <w:color w:val="0F766E"/>
+          <w:sz w:val="28"/>
         </w:rPr>
         <w:t>1.1. TỔNG QUAN VỀ BẢO MẬT WEB API VÀ CÁC THÁCH THỨC AN NINH HIỆN ĐẠI</w:t>
       </w:r>
@@ -78,12 +77,12 @@
     <w:p>
       <w:pPr>
         <w:keepNext/>
-        <w:spacing w:before="240" w:after="80"/>
+        <w:spacing w:before="200" w:after="80"/>
       </w:pPr>
       <w:r>
         <w:rPr>
           <w:b/>
-          <w:color w:val="1E40AF"/>
+          <w:color w:val="1E3A8A"/>
           <w:sz w:val="24"/>
         </w:rPr>
         <w:t>1.1.1. Xu hướng kiến trúc Microservices và sự bùng nổ của Web API</w:t>
@@ -98,7 +97,6 @@
         <w:rPr>
           <w:b w:val="0"/>
           <w:i w:val="0"/>
-          <w:sz w:val="22"/>
         </w:rPr>
         <w:t>Trong kỷ nguyên chuyển đổi số và điện toán đám mây, kiến trúc phần mềm đã trải qua sự chuyển dịch mang tính nền tảng từ các hệ thống nguyên khối (Monolithic Architecture) sang kiến trúc phân tán và vi dịch vụ (Microservices Architecture). Trong mô hình này, giao diện lập trình ứng dụng web (Web API), đặc biệt là chuẩn RESTful API truyền tải dữ liệu qua giao thức HTTP/HTTPS với định dạng JSON, đã trở thành huyết mạch kết nối toàn bộ hệ sinh thái dịch vụ số: từ ứng dụng Single Page Application (SPA), ứng dụng di động (Mobile Apps), hệ thống Internet vạn vật (IoT) cho đến các cổng thanh toán tài chính liên ngân hàng.</w:t>
       </w:r>
@@ -112,20 +110,19 @@
         <w:rPr>
           <w:b w:val="0"/>
           <w:i w:val="0"/>
-          <w:sz w:val="22"/>
         </w:rPr>
-        <w:t>Tuy nhiên, sự bùng nổ về số lượng và tính phức tạp của Web API đã làm mở rộng đáng kể bề mặt tấn công (Attack Surface). Không giống như các ứng dụng web truyền thống hiển thị giao diện qua HTML/CSS, Web API phơi bày trực tiếp logic nghiệp vụ, các tham số truy vấn cơ sở dữ liệu và cấu trúc dữ liệu nhạy cảm. Kẻ tấn công có thể dễ dàng sử dụng các công cụ phân tích tự động, bóc tách tài liệu OpenAPI/Swagger specification để lập bản đồ các endpoint và thực hiện tấn công hàng loạt mà không bị cản trở bởi lớp giao diện người dùng.</w:t>
+        <w:t>Tuy nhiên, sự bùng nổ về số lượng và tính phức tạp của Web API đã làm mở rộng đáng kể bề mặt tấn công (Attack Surface). Không giống như các ứng dụng web truyền thống hiển thị giao diện qua HTML/CSS, Web API phơi bày trực tiếp logic nghiệp vụ, các tham số truy vấn cơ sở dữ liệu và cấu trúc dữ liệu nhạy cảm. Kẻ tấn công có thể dễ dàng sử dụng các công cụ phân tích tự động, bóc tách tài liệu OpenAPI/Swagger specification để lập bản đồ các endpoint và thực hiện tấn công hàng loạt mà không bị cản trở bởi lớp giao diện người dùng [Ref 04].</w:t>
       </w:r>
     </w:p>
     <w:p>
       <w:pPr>
         <w:keepNext/>
-        <w:spacing w:before="240" w:after="80"/>
+        <w:spacing w:before="200" w:after="80"/>
       </w:pPr>
       <w:r>
         <w:rPr>
           <w:b/>
-          <w:color w:val="1E40AF"/>
+          <w:color w:val="1E3A8A"/>
           <w:sz w:val="24"/>
         </w:rPr>
         <w:t>1.1.2. Phân tích các mối đe dọa hàng đầu theo OWASP Top 10 API Security Risks (2023)</w:t>
@@ -140,9 +137,8 @@
         <w:rPr>
           <w:b w:val="0"/>
           <w:i w:val="0"/>
-          <w:sz w:val="22"/>
         </w:rPr>
-        <w:t>Theo công bố chính thức từ tổ chức an toàn thông tin uy tín thế giới OWASP trong tài liệu OWASP Top 10 API Security Risks 2023 [Ref 13], các cuộc tấn công nhắm vào Web API ngày càng trở nên tinh vi và có tổ chức. Đồ án tập trung nghiên cứu và xây dựng giải pháp phòng thủ cho 4 nhóm hiểm họa nghiêm trọng nhất:</w:t>
+        <w:t>Theo công bố chính thức từ tổ chức an toàn thông tin uy tín thế giới OWASP trong tài liệu OWASP Top 10 API Security Risks 2023 [Ref 06], các cuộc tấn công nhắm vào Web API ngày càng trở nên tinh vi và có tổ chức. Đồ án tập trung nghiên cứu và xây dựng giải pháp phòng thủ cho 4 nhóm hiểm họa nghiêm trọng nhất:</w:t>
       </w:r>
     </w:p>
     <w:p>
@@ -154,14 +150,11 @@
       <w:r>
         <w:rPr>
           <w:b/>
-          <w:sz w:val="22"/>
+          <w:color w:val="111827"/>
         </w:rPr>
         <w:t xml:space="preserve">1. Các lỗ hổng tiêm mã độc (Injection Vulnerabilities): </w:t>
       </w:r>
       <w:r>
-        <w:rPr>
-          <w:sz w:val="22"/>
-        </w:rPr>
         <w:t>Bao gồm SQL Injection (In-band, Error-based, Time-based Blind SQLi [Ref 10]), OS Command Injection thực thi shellcode trực tiếp, và Path Traversal đọc tệp tin cấu hình nhạy cảm. Kẻ tấn công lợi dụng dữ liệu đầu vào chưa được kiểm duyệt để thay đổi logic truy vấn hoặc chiếm toàn quyền điều khiển hệ điều hành máy chủ.</w:t>
       </w:r>
     </w:p>
@@ -174,14 +167,11 @@
       <w:r>
         <w:rPr>
           <w:b/>
-          <w:sz w:val="22"/>
+          <w:color w:val="111827"/>
         </w:rPr>
         <w:t xml:space="preserve">2. Tấn công Cross-Site Scripting (XSS): </w:t>
       </w:r>
       <w:r>
-        <w:rPr>
-          <w:sz w:val="22"/>
-        </w:rPr>
         <w:t>Mặc dù API chủ yếu trả về dữ liệu JSON, nhưng các trường dữ liệu do API phản hồi thường được render trực tiếp lên trình duyệt của người dùng cuối trong các ứng dụng SPA (React, Vue, Next.js). Khi kẻ tấn công chèn thành công các payload chứa mã JavaScript nguy hại (&lt;script&gt;, &lt;img onerror=...&gt;) qua API, mã độc sẽ thực thi trong ngữ cảnh phiên nạn nhân, dẫn đến nguy cơ đánh cắp token JWT, session cookies hoặc chiếm đoạt tài khoản.</w:t>
       </w:r>
     </w:p>
@@ -194,15 +184,12 @@
       <w:r>
         <w:rPr>
           <w:b/>
-          <w:sz w:val="22"/>
+          <w:color w:val="111827"/>
         </w:rPr>
         <w:t xml:space="preserve">3. Phá vỡ kiểm soát phân quyền mức đối tượng (BOLA / IDOR - API1:2023): </w:t>
       </w:r>
       <w:r>
-        <w:rPr>
-          <w:sz w:val="22"/>
-        </w:rPr>
-        <w:t>Lỗ hổng logic nghiệp vụ đứng số 1 về mức độ phổ biến, xảy ra khi máy chủ API không kiểm tra xem người dùng hiện tại có quyền thao tác trên mã đối tượng trong URL hay không (ví dụ: đổi /orders/1 thành /orders/2). Các bộ lọc chữ ký regex truyền thống hoàn toàn bất lực trước loại lỗ hổng logic này.</w:t>
+        <w:t>Lỗ hổng logic nghiệp vụ đứng số 1 về mức độ phổ biến, xảy ra khi máy chủ API không kiểm tra xem người dùng hiện tại có quyền thao tác trên mã đối tượng trong URL hay không (ví dụ: đổi /orders/1 thành /orders/2). Các bộ lọc chữ ký regex truyền thống hoàn toàn bất lực trước loại lỗ hổng logic này [Ref 06].</w:t>
       </w:r>
     </w:p>
     <w:p>
@@ -214,26 +201,23 @@
       <w:r>
         <w:rPr>
           <w:b/>
-          <w:sz w:val="22"/>
+          <w:color w:val="111827"/>
         </w:rPr>
-        <w:t xml:space="preserve">4. Tiêu thụ tài nguyên không kiểm soát (Unrestricted Resource Consumption - API4:2023): </w:t>
+        <w:t xml:space="preserve">4. Tiêu thụ tài nguyên không hạn chế (Unrestricted Resource Consumption - API4:2023): </w:t>
       </w:r>
       <w:r>
-        <w:rPr>
-          <w:sz w:val="22"/>
-        </w:rPr>
-        <w:t>Các cuộc tấn công dò quét tự động (Brute-force mật khẩu, Credential Stuffing) hoặc vét cạn tài nguyên máy chủ Layer 7 DoS. Nếu không có cơ chế giới hạn tần suất (Rate Limiting) theo cửa sổ trượt, hệ thống sẽ nhanh chóng tê liệt CPU, RAM và kết nối cơ sở dữ liệu [Ref 11].</w:t>
+        <w:t>Các cuộc tấn công dò quét tự động (Brute-force mật khẩu, Credential Stuffing) hoặc vét cạn tài nguyên máy chủ Layer 7 DoS. Nếu không có cơ chế giới hạn tần suất (Rate Limiting) theo cửa sổ trượt, hệ thống sẽ nhanh chóng tê liệt CPU, RAM và kết nối cơ sở dữ liệu [Ref 05, Ref 06].</w:t>
       </w:r>
     </w:p>
     <w:p>
       <w:pPr>
         <w:keepNext/>
-        <w:spacing w:before="240" w:after="80"/>
+        <w:spacing w:before="200" w:after="80"/>
       </w:pPr>
       <w:r>
         <w:rPr>
           <w:b/>
-          <w:color w:val="1E40AF"/>
+          <w:color w:val="1E3A8A"/>
           <w:sz w:val="24"/>
         </w:rPr>
         <w:t>1.1.3. Các kỹ thuật làm mờ payload và né tránh tường lửa (WAF Evasion &amp; Obfuscation Techniques)</w:t>
@@ -248,16 +232,14 @@
         <w:rPr>
           <w:b w:val="0"/>
           <w:i w:val="0"/>
-          <w:sz w:val="22"/>
         </w:rPr>
-        <w:t>Trong bối cảnh các hệ thống phòng thủ phụ thuộc vào so khớp mẫu chuỗi tĩnh, kẻ tấn công hiện đại — đặc biệt khi có sự hỗ trợ của AI — áp dụng các kỹ thuật làm mờ payload (Obfuscation) cực kỳ phức tạp để vượt rào (WAF Evasion) [Ref 04]:</w:t>
+        <w:t>Theo giáo trình kiểm thử xâm nhập chuẩn quốc tế CompTIA PenTest+ Study Guide [Ref 04], trong bối cảnh các hệ thống tường lửa ứng dụng web truyền thống phụ thuộc nặng nề vào các tập luật kiểm tra mẫu chuỗi (Regex Pattern Matching), kẻ tấn công hiện đại áp dụng các kỹ thuật làm mờ payload (Obfuscation) cực kỳ phức tạp để vượt rào (WAF Evasion):</w:t>
       </w:r>
     </w:p>
     <w:tbl>
       <w:tblPr>
         <w:tblW w:type="auto" w:w="0"/>
         <w:jc w:val="center"/>
-        <w:tblLayout w:type="fixed"/>
         <w:tblLook w:firstColumn="1" w:firstRow="1" w:lastColumn="0" w:lastRow="0" w:noHBand="0" w:noVBand="1" w:val="04A0"/>
       </w:tblPr>
       <w:tblGrid>
@@ -269,24 +251,21 @@
       <w:tr>
         <w:tc>
           <w:tcPr>
-            <w:tcW w:type="dxa" w:w="2160"/>
-            <w:shd w:fill="1E3A8A"/>
+            <w:tcW w:type="dxa" w:w="2340"/>
+            <w:shd w:fill="0F766E"/>
             <w:tcMar>
               <w:top w:w="140" w:type="dxa"/>
               <w:bottom w:w="140" w:type="dxa"/>
-              <w:left w:w="120" w:type="dxa"/>
-              <w:right w:w="120" w:type="dxa"/>
+              <w:left w:w="140" w:type="dxa"/>
+              <w:right w:w="140" w:type="dxa"/>
             </w:tcMar>
           </w:tcPr>
           <w:p>
-            <w:pPr>
-              <w:jc w:val="center"/>
-            </w:pPr>
             <w:r>
               <w:rPr>
                 <w:b/>
                 <w:color w:val="FFFFFF"/>
-                <w:sz w:val="19"/>
+                <w:sz w:val="20"/>
               </w:rPr>
               <w:t>Kỹ Thuật Né Tránh</w:t>
             </w:r>
@@ -294,24 +273,21 @@
         </w:tc>
         <w:tc>
           <w:tcPr>
-            <w:tcW w:type="dxa" w:w="2592"/>
-            <w:shd w:fill="1E3A8A"/>
+            <w:tcW w:type="dxa" w:w="2340"/>
+            <w:shd w:fill="0F766E"/>
             <w:tcMar>
               <w:top w:w="140" w:type="dxa"/>
               <w:bottom w:w="140" w:type="dxa"/>
-              <w:left w:w="120" w:type="dxa"/>
-              <w:right w:w="120" w:type="dxa"/>
+              <w:left w:w="140" w:type="dxa"/>
+              <w:right w:w="140" w:type="dxa"/>
             </w:tcMar>
           </w:tcPr>
           <w:p>
-            <w:pPr>
-              <w:jc w:val="center"/>
-            </w:pPr>
             <w:r>
               <w:rPr>
                 <w:b/>
                 <w:color w:val="FFFFFF"/>
-                <w:sz w:val="19"/>
+                <w:sz w:val="20"/>
               </w:rPr>
               <w:t>Cơ Chế Bản Chất</w:t>
             </w:r>
@@ -319,24 +295,21 @@
         </w:tc>
         <w:tc>
           <w:tcPr>
-            <w:tcW w:type="dxa" w:w="2160"/>
-            <w:shd w:fill="1E3A8A"/>
+            <w:tcW w:type="dxa" w:w="2340"/>
+            <w:shd w:fill="0F766E"/>
             <w:tcMar>
               <w:top w:w="140" w:type="dxa"/>
               <w:bottom w:w="140" w:type="dxa"/>
-              <w:left w:w="120" w:type="dxa"/>
-              <w:right w:w="120" w:type="dxa"/>
+              <w:left w:w="140" w:type="dxa"/>
+              <w:right w:w="140" w:type="dxa"/>
             </w:tcMar>
           </w:tcPr>
           <w:p>
-            <w:pPr>
-              <w:jc w:val="center"/>
-            </w:pPr>
             <w:r>
               <w:rPr>
                 <w:b/>
                 <w:color w:val="FFFFFF"/>
-                <w:sz w:val="19"/>
+                <w:sz w:val="20"/>
               </w:rPr>
               <w:t>Ví Dụ Minh Họa</w:t>
             </w:r>
@@ -344,26 +317,23 @@
         </w:tc>
         <w:tc>
           <w:tcPr>
-            <w:tcW w:type="dxa" w:w="2448"/>
-            <w:shd w:fill="1E3A8A"/>
+            <w:tcW w:type="dxa" w:w="2340"/>
+            <w:shd w:fill="0F766E"/>
             <w:tcMar>
               <w:top w:w="140" w:type="dxa"/>
               <w:bottom w:w="140" w:type="dxa"/>
-              <w:left w:w="120" w:type="dxa"/>
-              <w:right w:w="120" w:type="dxa"/>
+              <w:left w:w="140" w:type="dxa"/>
+              <w:right w:w="140" w:type="dxa"/>
             </w:tcMar>
           </w:tcPr>
           <w:p>
-            <w:pPr>
-              <w:jc w:val="center"/>
-            </w:pPr>
             <w:r>
               <w:rPr>
                 <w:b/>
                 <w:color w:val="FFFFFF"/>
-                <w:sz w:val="19"/>
+                <w:sz w:val="20"/>
               </w:rPr>
-              <w:t>Hậu Quả Đối Với WAF Tĩnh</w:t>
+              <w:t>Hậu Quả Đối Với WAF Truyền Thống</w:t>
             </w:r>
           </w:p>
         </w:tc>
@@ -371,7 +341,89 @@
       <w:tr>
         <w:tc>
           <w:tcPr>
-            <w:tcW w:type="dxa" w:w="2160"/>
+            <w:tcW w:type="dxa" w:w="2340"/>
+            <w:shd w:fill="FFFFFF"/>
+            <w:tcMar>
+              <w:top w:w="100" w:type="dxa"/>
+              <w:bottom w:w="100" w:type="dxa"/>
+              <w:left w:w="120" w:type="dxa"/>
+              <w:right w:w="120" w:type="dxa"/>
+            </w:tcMar>
+          </w:tcPr>
+          <w:p>
+            <w:r>
+              <w:rPr>
+                <w:sz w:val="19"/>
+              </w:rPr>
+              <w:t>Mã hóa URL đa tầng (Double URL Encoding)</w:t>
+            </w:r>
+          </w:p>
+        </w:tc>
+        <w:tc>
+          <w:tcPr>
+            <w:tcW w:type="dxa" w:w="2340"/>
+            <w:shd w:fill="FFFFFF"/>
+            <w:tcMar>
+              <w:top w:w="100" w:type="dxa"/>
+              <w:bottom w:w="100" w:type="dxa"/>
+              <w:left w:w="120" w:type="dxa"/>
+              <w:right w:w="120" w:type="dxa"/>
+            </w:tcMar>
+          </w:tcPr>
+          <w:p>
+            <w:r>
+              <w:rPr>
+                <w:sz w:val="19"/>
+              </w:rPr>
+              <w:t>Mã hóa ký tự % thành %25 (dấu ' thành %27 rồi %2527)</w:t>
+            </w:r>
+          </w:p>
+        </w:tc>
+        <w:tc>
+          <w:tcPr>
+            <w:tcW w:type="dxa" w:w="2340"/>
+            <w:shd w:fill="FFFFFF"/>
+            <w:tcMar>
+              <w:top w:w="100" w:type="dxa"/>
+              <w:bottom w:w="100" w:type="dxa"/>
+              <w:left w:w="120" w:type="dxa"/>
+              <w:right w:w="120" w:type="dxa"/>
+            </w:tcMar>
+          </w:tcPr>
+          <w:p>
+            <w:r>
+              <w:rPr>
+                <w:sz w:val="19"/>
+              </w:rPr>
+              <w:t>%2527%20OR%20%2531%253D%2531</w:t>
+            </w:r>
+          </w:p>
+        </w:tc>
+        <w:tc>
+          <w:tcPr>
+            <w:tcW w:type="dxa" w:w="2340"/>
+            <w:shd w:fill="FFFFFF"/>
+            <w:tcMar>
+              <w:top w:w="100" w:type="dxa"/>
+              <w:bottom w:w="100" w:type="dxa"/>
+              <w:left w:w="120" w:type="dxa"/>
+              <w:right w:w="120" w:type="dxa"/>
+            </w:tcMar>
+          </w:tcPr>
+          <w:p>
+            <w:r>
+              <w:rPr>
+                <w:sz w:val="19"/>
+              </w:rPr>
+              <w:t>WAF chỉ giải mã 1 lần thành %27 và bỏ qua; backend giải mã lần 2 kích hoạt SQLi.</w:t>
+            </w:r>
+          </w:p>
+        </w:tc>
+      </w:tr>
+      <w:tr>
+        <w:tc>
+          <w:tcPr>
+            <w:tcW w:type="dxa" w:w="2340"/>
             <w:shd w:fill="F9FAFB"/>
             <w:tcMar>
               <w:top w:w="100" w:type="dxa"/>
@@ -381,22 +433,17 @@
             </w:tcMar>
           </w:tcPr>
           <w:p>
-            <w:pPr>
-              <w:jc w:val="left"/>
-            </w:pPr>
             <w:r>
               <w:rPr>
-                <w:b/>
-                <w:color w:val="1E40AF"/>
-                <w:sz w:val="18"/>
+                <w:sz w:val="19"/>
               </w:rPr>
-              <w:t>Mã hóa URL kép (Double URL Encode)</w:t>
+              <w:t>Chèn chú thích nội tuyến (Inline Comments)</w:t>
             </w:r>
           </w:p>
         </w:tc>
         <w:tc>
           <w:tcPr>
-            <w:tcW w:type="dxa" w:w="2592"/>
+            <w:tcW w:type="dxa" w:w="2340"/>
             <w:shd w:fill="F9FAFB"/>
             <w:tcMar>
               <w:top w:w="100" w:type="dxa"/>
@@ -406,20 +453,17 @@
             </w:tcMar>
           </w:tcPr>
           <w:p>
-            <w:pPr>
-              <w:jc w:val="left"/>
-            </w:pPr>
             <w:r>
               <w:rPr>
-                <w:sz w:val="18"/>
+                <w:sz w:val="19"/>
               </w:rPr>
-              <w:t>Mã hóa ký tự % thành %25 (dấu ' -&gt; %27 -&gt; %2527)</w:t>
+              <w:t>Chèn comment vô hại vào giữa từ khóa nhạy cảm</w:t>
             </w:r>
           </w:p>
         </w:tc>
         <w:tc>
           <w:tcPr>
-            <w:tcW w:type="dxa" w:w="2160"/>
+            <w:tcW w:type="dxa" w:w="2340"/>
             <w:shd w:fill="F9FAFB"/>
             <w:tcMar>
               <w:top w:w="100" w:type="dxa"/>
@@ -429,21 +473,17 @@
             </w:tcMar>
           </w:tcPr>
           <w:p>
-            <w:pPr>
-              <w:jc w:val="left"/>
-            </w:pPr>
             <w:r>
               <w:rPr>
-                <w:rFonts w:ascii="Courier New" w:hAnsi="Courier New"/>
-                <w:sz w:val="17"/>
+                <w:sz w:val="19"/>
               </w:rPr>
-              <w:t>%2527%20OR%201=1</w:t>
+              <w:t>UN/**/ION/**/SEL/**/ECT</w:t>
             </w:r>
           </w:p>
         </w:tc>
         <w:tc>
           <w:tcPr>
-            <w:tcW w:type="dxa" w:w="2448"/>
+            <w:tcW w:type="dxa" w:w="2340"/>
             <w:shd w:fill="F9FAFB"/>
             <w:tcMar>
               <w:top w:w="100" w:type="dxa"/>
@@ -453,14 +493,11 @@
             </w:tcMar>
           </w:tcPr>
           <w:p>
-            <w:pPr>
-              <w:jc w:val="left"/>
-            </w:pPr>
             <w:r>
               <w:rPr>
-                <w:sz w:val="18"/>
+                <w:sz w:val="19"/>
               </w:rPr>
-              <w:t>WAF chỉ giải mã 1 lần thấy vô hại và bỏ qua; Backend giải mã lần 2 kích hoạt SQLi.</w:t>
+              <w:t>Làm đứt gãy mẫu chuỗi regex chuẩn UNION.*SELECT.</w:t>
             </w:r>
           </w:p>
         </w:tc>
@@ -468,7 +505,7 @@
       <w:tr>
         <w:tc>
           <w:tcPr>
-            <w:tcW w:type="dxa" w:w="2160"/>
+            <w:tcW w:type="dxa" w:w="2340"/>
             <w:shd w:fill="FFFFFF"/>
             <w:tcMar>
               <w:top w:w="100" w:type="dxa"/>
@@ -478,22 +515,17 @@
             </w:tcMar>
           </w:tcPr>
           <w:p>
-            <w:pPr>
-              <w:jc w:val="left"/>
-            </w:pPr>
             <w:r>
               <w:rPr>
-                <w:b/>
-                <w:color w:val="1E40AF"/>
-                <w:sz w:val="18"/>
+                <w:sz w:val="19"/>
               </w:rPr>
-              <w:t>Chèn chú thích nội tuyến (Inline Comments)</w:t>
+              <w:t>Biến đổi chữ hoa/thường xen kẽ</w:t>
             </w:r>
           </w:p>
         </w:tc>
         <w:tc>
           <w:tcPr>
-            <w:tcW w:type="dxa" w:w="2592"/>
+            <w:tcW w:type="dxa" w:w="2340"/>
             <w:shd w:fill="FFFFFF"/>
             <w:tcMar>
               <w:top w:w="100" w:type="dxa"/>
@@ -503,20 +535,17 @@
             </w:tcMar>
           </w:tcPr>
           <w:p>
-            <w:pPr>
-              <w:jc w:val="left"/>
-            </w:pPr>
             <w:r>
               <w:rPr>
-                <w:sz w:val="18"/>
+                <w:sz w:val="19"/>
               </w:rPr>
-              <w:t>Chèn comment của ngôn ngữ đích vào giữa từ khóa</w:t>
+              <w:t>Thay đổi ngẫu nhiên trạng thái hoa thường không chuẩn hóa</w:t>
             </w:r>
           </w:p>
         </w:tc>
         <w:tc>
           <w:tcPr>
-            <w:tcW w:type="dxa" w:w="2160"/>
+            <w:tcW w:type="dxa" w:w="2340"/>
             <w:shd w:fill="FFFFFF"/>
             <w:tcMar>
               <w:top w:w="100" w:type="dxa"/>
@@ -526,21 +555,17 @@
             </w:tcMar>
           </w:tcPr>
           <w:p>
-            <w:pPr>
-              <w:jc w:val="left"/>
-            </w:pPr>
             <w:r>
               <w:rPr>
-                <w:rFonts w:ascii="Courier New" w:hAnsi="Courier New"/>
-                <w:sz w:val="17"/>
+                <w:sz w:val="19"/>
               </w:rPr>
-              <w:t>UN/**/ION/**/SEL/**/ECT</w:t>
+              <w:t>sElEcT, &lt;sCrIpt&gt;, uNiOn</w:t>
             </w:r>
           </w:p>
         </w:tc>
         <w:tc>
           <w:tcPr>
-            <w:tcW w:type="dxa" w:w="2448"/>
+            <w:tcW w:type="dxa" w:w="2340"/>
             <w:shd w:fill="FFFFFF"/>
             <w:tcMar>
               <w:top w:w="100" w:type="dxa"/>
@@ -550,14 +575,11 @@
             </w:tcMar>
           </w:tcPr>
           <w:p>
-            <w:pPr>
-              <w:jc w:val="left"/>
-            </w:pPr>
             <w:r>
               <w:rPr>
-                <w:sz w:val="18"/>
+                <w:sz w:val="19"/>
               </w:rPr>
-              <w:t>Làm đứt gãy mẫu chuỗi regex chuẩn UNION.*SELECT.</w:t>
+              <w:t>Vượt qua regex không thiết lập cờ IGNORECASE.</w:t>
             </w:r>
           </w:p>
         </w:tc>
@@ -565,7 +587,7 @@
       <w:tr>
         <w:tc>
           <w:tcPr>
-            <w:tcW w:type="dxa" w:w="2160"/>
+            <w:tcW w:type="dxa" w:w="2340"/>
             <w:shd w:fill="F9FAFB"/>
             <w:tcMar>
               <w:top w:w="100" w:type="dxa"/>
@@ -575,22 +597,17 @@
             </w:tcMar>
           </w:tcPr>
           <w:p>
-            <w:pPr>
-              <w:jc w:val="left"/>
-            </w:pPr>
             <w:r>
               <w:rPr>
-                <w:b/>
-                <w:color w:val="1E40AF"/>
-                <w:sz w:val="18"/>
+                <w:sz w:val="19"/>
               </w:rPr>
-              <w:t>Đổi hoa thường xen kẽ (Mixed-case Alternation)</w:t>
+              <w:t>Ký tự khoảng trắng thay thế</w:t>
             </w:r>
           </w:p>
         </w:tc>
         <w:tc>
           <w:tcPr>
-            <w:tcW w:type="dxa" w:w="2592"/>
+            <w:tcW w:type="dxa" w:w="2340"/>
             <w:shd w:fill="F9FAFB"/>
             <w:tcMar>
               <w:top w:w="100" w:type="dxa"/>
@@ -600,20 +617,17 @@
             </w:tcMar>
           </w:tcPr>
           <w:p>
-            <w:pPr>
-              <w:jc w:val="left"/>
-            </w:pPr>
             <w:r>
               <w:rPr>
-                <w:sz w:val="18"/>
+                <w:sz w:val="19"/>
               </w:rPr>
-              <w:t>Thay đổi ngẫu nhiên trạng thái viết hoa/thường</w:t>
+              <w:t>Dùng ký tự shell/SQL thay thế dấu cách (0x20)</w:t>
             </w:r>
           </w:p>
         </w:tc>
         <w:tc>
           <w:tcPr>
-            <w:tcW w:type="dxa" w:w="2160"/>
+            <w:tcW w:type="dxa" w:w="2340"/>
             <w:shd w:fill="F9FAFB"/>
             <w:tcMar>
               <w:top w:w="100" w:type="dxa"/>
@@ -623,21 +637,17 @@
             </w:tcMar>
           </w:tcPr>
           <w:p>
-            <w:pPr>
-              <w:jc w:val="left"/>
-            </w:pPr>
             <w:r>
               <w:rPr>
-                <w:rFonts w:ascii="Courier New" w:hAnsi="Courier New"/>
-                <w:sz w:val="17"/>
+                <w:sz w:val="19"/>
               </w:rPr>
-              <w:t>sElEcT, &lt;sCrIpt&gt;</w:t>
+              <w:t>$IFS$9 trong Bash; /**/, +, %09 (Tab)</w:t>
             </w:r>
           </w:p>
         </w:tc>
         <w:tc>
           <w:tcPr>
-            <w:tcW w:type="dxa" w:w="2448"/>
+            <w:tcW w:type="dxa" w:w="2340"/>
             <w:shd w:fill="F9FAFB"/>
             <w:tcMar>
               <w:top w:w="100" w:type="dxa"/>
@@ -647,14 +657,11 @@
             </w:tcMar>
           </w:tcPr>
           <w:p>
-            <w:pPr>
-              <w:jc w:val="left"/>
-            </w:pPr>
             <w:r>
               <w:rPr>
-                <w:sz w:val="18"/>
+                <w:sz w:val="19"/>
               </w:rPr>
-              <w:t>Vượt qua các rule regex thiếu cờ IGNORECASE.</w:t>
+              <w:t>Vượt qua các bộ luật kiểm tra khoảng cách chuẩn giữa mệnh đề.</w:t>
             </w:r>
           </w:p>
         </w:tc>
@@ -662,7 +669,7 @@
       <w:tr>
         <w:tc>
           <w:tcPr>
-            <w:tcW w:type="dxa" w:w="2160"/>
+            <w:tcW w:type="dxa" w:w="2340"/>
             <w:shd w:fill="FFFFFF"/>
             <w:tcMar>
               <w:top w:w="100" w:type="dxa"/>
@@ -672,22 +679,17 @@
             </w:tcMar>
           </w:tcPr>
           <w:p>
-            <w:pPr>
-              <w:jc w:val="left"/>
-            </w:pPr>
             <w:r>
               <w:rPr>
-                <w:b/>
-                <w:color w:val="1E40AF"/>
-                <w:sz w:val="18"/>
+                <w:sz w:val="19"/>
               </w:rPr>
-              <w:t>Ký tự khoảng trắng thay thế (Alternative Whitespace)</w:t>
+              <w:t>Ký tự NULL Byte Injection</w:t>
             </w:r>
           </w:p>
         </w:tc>
         <w:tc>
           <w:tcPr>
-            <w:tcW w:type="dxa" w:w="2592"/>
+            <w:tcW w:type="dxa" w:w="2340"/>
             <w:shd w:fill="FFFFFF"/>
             <w:tcMar>
               <w:top w:w="100" w:type="dxa"/>
@@ -697,20 +699,17 @@
             </w:tcMar>
           </w:tcPr>
           <w:p>
-            <w:pPr>
-              <w:jc w:val="left"/>
-            </w:pPr>
             <w:r>
               <w:rPr>
-                <w:sz w:val="18"/>
+                <w:sz w:val="19"/>
               </w:rPr>
-              <w:t>Sử dụng ký tự shell/SQL thay thế dấu cách 0x20</w:t>
+              <w:t>Chèn ký tự kết thúc chuỗi \x00 hoặc %00</w:t>
             </w:r>
           </w:p>
         </w:tc>
         <w:tc>
           <w:tcPr>
-            <w:tcW w:type="dxa" w:w="2160"/>
+            <w:tcW w:type="dxa" w:w="2340"/>
             <w:shd w:fill="FFFFFF"/>
             <w:tcMar>
               <w:top w:w="100" w:type="dxa"/>
@@ -720,21 +719,17 @@
             </w:tcMar>
           </w:tcPr>
           <w:p>
-            <w:pPr>
-              <w:jc w:val="left"/>
-            </w:pPr>
             <w:r>
               <w:rPr>
-                <w:rFonts w:ascii="Courier New" w:hAnsi="Courier New"/>
-                <w:sz w:val="17"/>
+                <w:sz w:val="19"/>
               </w:rPr>
-              <w:t>$IFS$9, /**/, %09 (Tab)</w:t>
+              <w:t>../../etc/passwd%00.jpg</w:t>
             </w:r>
           </w:p>
         </w:tc>
         <w:tc>
           <w:tcPr>
-            <w:tcW w:type="dxa" w:w="2448"/>
+            <w:tcW w:type="dxa" w:w="2340"/>
             <w:shd w:fill="FFFFFF"/>
             <w:tcMar>
               <w:top w:w="100" w:type="dxa"/>
@@ -744,14 +739,11 @@
             </w:tcMar>
           </w:tcPr>
           <w:p>
-            <w:pPr>
-              <w:jc w:val="left"/>
-            </w:pPr>
             <w:r>
               <w:rPr>
-                <w:sz w:val="18"/>
+                <w:sz w:val="19"/>
               </w:rPr>
-              <w:t>Vượt qua bộ luật kiểm tra sự tồn tại của dấu cách.</w:t>
+              <w:t>Lừa hàm kiểm tra đuôi mở rộng file ở C/C++, cắt cụt chuỗi kiểm tra.</w:t>
             </w:r>
           </w:p>
         </w:tc>
@@ -759,7 +751,7 @@
       <w:tr>
         <w:tc>
           <w:tcPr>
-            <w:tcW w:type="dxa" w:w="2160"/>
+            <w:tcW w:type="dxa" w:w="2340"/>
             <w:shd w:fill="F9FAFB"/>
             <w:tcMar>
               <w:top w:w="100" w:type="dxa"/>
@@ -769,22 +761,17 @@
             </w:tcMar>
           </w:tcPr>
           <w:p>
-            <w:pPr>
-              <w:jc w:val="left"/>
-            </w:pPr>
             <w:r>
               <w:rPr>
-                <w:b/>
-                <w:color w:val="1E40AF"/>
-                <w:sz w:val="18"/>
+                <w:sz w:val="19"/>
               </w:rPr>
-              <w:t>Ký tự NULL Byte Injection</w:t>
+              <w:t>Thực thi lệnh gián tiếp &amp; Đa hình</w:t>
             </w:r>
           </w:p>
         </w:tc>
         <w:tc>
           <w:tcPr>
-            <w:tcW w:type="dxa" w:w="2592"/>
+            <w:tcW w:type="dxa" w:w="2340"/>
             <w:shd w:fill="F9FAFB"/>
             <w:tcMar>
               <w:top w:w="100" w:type="dxa"/>
@@ -794,20 +781,17 @@
             </w:tcMar>
           </w:tcPr>
           <w:p>
-            <w:pPr>
-              <w:jc w:val="left"/>
-            </w:pPr>
             <w:r>
               <w:rPr>
-                <w:sz w:val="18"/>
+                <w:sz w:val="19"/>
               </w:rPr>
-              <w:t>Chèn ký tự kết thúc chuỗi \x00 hoặc %00</w:t>
+              <w:t>Tận dụng biến môi trường, nối chuỗi và subshell</w:t>
             </w:r>
           </w:p>
         </w:tc>
         <w:tc>
           <w:tcPr>
-            <w:tcW w:type="dxa" w:w="2160"/>
+            <w:tcW w:type="dxa" w:w="2340"/>
             <w:shd w:fill="F9FAFB"/>
             <w:tcMar>
               <w:top w:w="100" w:type="dxa"/>
@@ -817,21 +801,17 @@
             </w:tcMar>
           </w:tcPr>
           <w:p>
-            <w:pPr>
-              <w:jc w:val="left"/>
-            </w:pPr>
             <w:r>
               <w:rPr>
-                <w:rFonts w:ascii="Courier New" w:hAnsi="Courier New"/>
-                <w:sz w:val="17"/>
+                <w:sz w:val="19"/>
               </w:rPr>
-              <w:t>../../etc/passwd%00.jpg</w:t>
+              <w:t>c''a""t /e*c/pas*wd, $(echo Y2F0...|base64 -d)</w:t>
             </w:r>
           </w:p>
         </w:tc>
         <w:tc>
           <w:tcPr>
-            <w:tcW w:type="dxa" w:w="2448"/>
+            <w:tcW w:type="dxa" w:w="2340"/>
             <w:shd w:fill="F9FAFB"/>
             <w:tcMar>
               <w:top w:w="100" w:type="dxa"/>
@@ -841,127 +821,31 @@
             </w:tcMar>
           </w:tcPr>
           <w:p>
-            <w:pPr>
-              <w:jc w:val="left"/>
-            </w:pPr>
             <w:r>
               <w:rPr>
-                <w:sz w:val="18"/>
+                <w:sz w:val="19"/>
               </w:rPr>
-              <w:t>Đánh lừa hàm kiểm tra đuôi mở rộng file, cắt cụt chuỗi.</w:t>
-            </w:r>
-          </w:p>
-        </w:tc>
-      </w:tr>
-      <w:tr>
-        <w:tc>
-          <w:tcPr>
-            <w:tcW w:type="dxa" w:w="2160"/>
-            <w:shd w:fill="FFFFFF"/>
-            <w:tcMar>
-              <w:top w:w="100" w:type="dxa"/>
-              <w:bottom w:w="100" w:type="dxa"/>
-              <w:left w:w="120" w:type="dxa"/>
-              <w:right w:w="120" w:type="dxa"/>
-            </w:tcMar>
-          </w:tcPr>
-          <w:p>
-            <w:pPr>
-              <w:jc w:val="left"/>
-            </w:pPr>
-            <w:r>
-              <w:rPr>
-                <w:b/>
-                <w:color w:val="1E40AF"/>
-                <w:sz w:val="18"/>
-              </w:rPr>
-              <w:t>Thực thi đa hình (Polymorphic Execution)</w:t>
-            </w:r>
-          </w:p>
-        </w:tc>
-        <w:tc>
-          <w:tcPr>
-            <w:tcW w:type="dxa" w:w="2592"/>
-            <w:shd w:fill="FFFFFF"/>
-            <w:tcMar>
-              <w:top w:w="100" w:type="dxa"/>
-              <w:bottom w:w="100" w:type="dxa"/>
-              <w:left w:w="120" w:type="dxa"/>
-              <w:right w:w="120" w:type="dxa"/>
-            </w:tcMar>
-          </w:tcPr>
-          <w:p>
-            <w:pPr>
-              <w:jc w:val="left"/>
-            </w:pPr>
-            <w:r>
-              <w:rPr>
-                <w:sz w:val="18"/>
-              </w:rPr>
-              <w:t>Tận dụng biến môi trường, nối chuỗi và subshell</w:t>
-            </w:r>
-          </w:p>
-        </w:tc>
-        <w:tc>
-          <w:tcPr>
-            <w:tcW w:type="dxa" w:w="2160"/>
-            <w:shd w:fill="FFFFFF"/>
-            <w:tcMar>
-              <w:top w:w="100" w:type="dxa"/>
-              <w:bottom w:w="100" w:type="dxa"/>
-              <w:left w:w="120" w:type="dxa"/>
-              <w:right w:w="120" w:type="dxa"/>
-            </w:tcMar>
-          </w:tcPr>
-          <w:p>
-            <w:pPr>
-              <w:jc w:val="left"/>
-            </w:pPr>
-            <w:r>
-              <w:rPr>
-                <w:rFonts w:ascii="Courier New" w:hAnsi="Courier New"/>
-                <w:sz w:val="17"/>
-              </w:rPr>
-              <w:t>$(echo Y2F0...|base64 -d)</w:t>
-            </w:r>
-          </w:p>
-        </w:tc>
-        <w:tc>
-          <w:tcPr>
-            <w:tcW w:type="dxa" w:w="2448"/>
-            <w:shd w:fill="FFFFFF"/>
-            <w:tcMar>
-              <w:top w:w="100" w:type="dxa"/>
-              <w:bottom w:w="100" w:type="dxa"/>
-              <w:left w:w="120" w:type="dxa"/>
-              <w:right w:w="120" w:type="dxa"/>
-            </w:tcMar>
-          </w:tcPr>
-          <w:p>
-            <w:pPr>
-              <w:jc w:val="left"/>
-            </w:pPr>
-            <w:r>
-              <w:rPr>
-                <w:sz w:val="18"/>
-              </w:rPr>
-              <w:t>Không chứa bất kỳ từ khóa tĩnh nào, vô hiệu hóa 100% chữ ký.</w:t>
+              <w:t>Không chứa bất kỳ từ khóa tĩnh nào trong payload, vô hiệu hóa chữ ký tĩnh.</w:t>
             </w:r>
           </w:p>
         </w:tc>
       </w:tr>
     </w:tbl>
-    <w:p/>
+    <w:p>
+      <w:pPr>
+        <w:spacing w:after="120"/>
+      </w:pPr>
+    </w:p>
     <w:p>
       <w:pPr>
         <w:keepNext/>
-        <w:spacing w:before="320" w:after="120"/>
+        <w:spacing w:before="280" w:after="120"/>
       </w:pPr>
       <w:r>
         <w:rPr>
           <w:b/>
-          <w:color w:val="0F2454"/>
-          <w:sz w:val="27"/>
+          <w:color w:val="0F766E"/>
+          <w:sz w:val="28"/>
         </w:rPr>
         <w:t>1.2. CƠ CHẾ HOẠT ĐỘNG CỦA TƯỜNG LỬA ỨNG DỤNG WEB (WAF) VÀ GIỚI HẠN CỦA PHƯƠNG PHÁP TRUYỀN THỐNG</w:t>
       </w:r>
@@ -969,15 +853,15 @@
     <w:p>
       <w:pPr>
         <w:keepNext/>
-        <w:spacing w:before="240" w:after="80"/>
+        <w:spacing w:before="200" w:after="80"/>
       </w:pPr>
       <w:r>
         <w:rPr>
           <w:b/>
-          <w:color w:val="1E40AF"/>
+          <w:color w:val="1E3A8A"/>
           <w:sz w:val="24"/>
         </w:rPr>
-        <w:t>1.2.1. Nguyên lý hoạt động của WAF dựa trên luật (Signature-Based Inspection)</w:t>
+        <w:t>1.2.1. Phân loại thế hệ Tường lửa và Nguyên lý Cổng tầng ứng dụng (Application-Level Gateway)</w:t>
       </w:r>
     </w:p>
     <w:p>
@@ -989,20 +873,83 @@
         <w:rPr>
           <w:b w:val="0"/>
           <w:i w:val="0"/>
-          <w:sz w:val="22"/>
         </w:rPr>
-        <w:t>Tường lửa ứng dụng web (WAF) đóng vai trò là một lớp Reverse Proxy bảo vệ đứng trung gian giữa mạng Internet công cộng và máy chủ ứng dụng nội bộ. Khi một yêu cầu HTTP gửi đến, WAF thực hiện phân tích cú pháp (HTTP Parsing), bóc tách các trường URL Path, Query Parameters, Headers và Body, đưa qua bộ chuẩn hóa (Normalizer) rồi so khớp với tập hợp các biểu thức chính quy (Regular Expressions) đại diện cho các mẫu tấn công đã biết. Bộ luật nguồn mở chuẩn mực công nghiệp tiêu biểu nhất hiện nay là OWASP ModSecurity Core Rule Set (CRS v4.0) [Ref 14].</w:t>
+        <w:t>Trong công trình giáo trình kinh điển Cryptography and Network Security: Principles and Practice (Chương 20: Firewalls) [Ref 01], Giáo sư William Stallings đã hệ thống hóa tường lửa thành ba thế hệ công nghệ tiến hóa:</w:t>
+      </w:r>
+    </w:p>
+    <w:p>
+      <w:pPr>
+        <w:pStyle w:val="ListBullet"/>
+        <w:spacing w:after="60" w:line="276" w:lineRule="auto"/>
+        <w:jc w:val="both"/>
+      </w:pPr>
+      <w:r>
+        <w:rPr>
+          <w:b/>
+          <w:color w:val="111827"/>
+        </w:rPr>
+        <w:t xml:space="preserve">1. Bộ lọc gói tin (Packet Filtering Firewall): </w:t>
+      </w:r>
+      <w:r>
+        <w:t>Hoạt động ở tầng Mạng và Vận chuyển (Layer 3 &amp; 4), chỉ kiểm tra IP và cổng TCP/UDP mà không hiểu nội dung ứng dụng.</w:t>
+      </w:r>
+    </w:p>
+    <w:p>
+      <w:pPr>
+        <w:pStyle w:val="ListBullet"/>
+        <w:spacing w:after="60" w:line="276" w:lineRule="auto"/>
+        <w:jc w:val="both"/>
+      </w:pPr>
+      <w:r>
+        <w:rPr>
+          <w:b/>
+          <w:color w:val="111827"/>
+        </w:rPr>
+        <w:t xml:space="preserve">2. Bộ lọc trạng thái (Stateful Inspection Firewall): </w:t>
+      </w:r>
+      <w:r>
+        <w:t>Theo dõi trạng thái kết nối TCP (SYN, ACK, ESTABLISHED) ngăn gói tin giả mạo phiên.</w:t>
+      </w:r>
+    </w:p>
+    <w:p>
+      <w:pPr>
+        <w:pStyle w:val="ListBullet"/>
+        <w:spacing w:after="60" w:line="276" w:lineRule="auto"/>
+        <w:jc w:val="both"/>
+      </w:pPr>
+      <w:r>
+        <w:rPr>
+          <w:b/>
+          <w:color w:val="111827"/>
+        </w:rPr>
+        <w:t xml:space="preserve">3. Cổng tầng ứng dụng (Application-Level Gateway / Reverse Proxy WAF): </w:t>
+      </w:r>
+      <w:r>
+        <w:t>Là thế hệ tường lửa tiên tiến nhất, hoạt động như một Relay Proxy hoàn chỉnh ở Layer 7. Cổng tiếp nhận toàn bộ kết nối TCP từ máy khách, giải nén và tái cấu trúc hoàn chỉnh giao thức HTTP/HTTPS, kiểm tra toàn diện Payload trước khi chuyển tiếp về máy chủ nội bộ.</w:t>
+      </w:r>
+    </w:p>
+    <w:p>
+      <w:pPr>
+        <w:spacing w:after="80" w:line="288" w:lineRule="auto"/>
+        <w:jc w:val="both"/>
+      </w:pPr>
+      <w:r>
+        <w:rPr>
+          <w:b w:val="0"/>
+          <w:i w:val="0"/>
+        </w:rPr>
+        <w:t>Theo kiến trúc điều phối lưu lượng trong cuốn NGINX Cookbook [Ref 05], cơ chế Reverse Proxy WAF mang lại những lợi ích bảo mật vượt trội: ẩn giấu máy chủ gốc (Origin Cloaking), khử trùng tiêu đề giao thức (Hop-by-hop headers sanitization), và cho phép phân luồng kiểm tra chuyên sâu qua Normalizer, Rule Engine, ML Detector và Rate Limiter.</w:t>
       </w:r>
     </w:p>
     <w:p>
       <w:pPr>
         <w:keepNext/>
-        <w:spacing w:before="240" w:after="80"/>
+        <w:spacing w:before="200" w:after="80"/>
       </w:pPr>
       <w:r>
         <w:rPr>
           <w:b/>
-          <w:color w:val="1E40AF"/>
+          <w:color w:val="1E3A8A"/>
           <w:sz w:val="24"/>
         </w:rPr>
         <w:t>1.2.2. Cơ chế chấm điểm bất thường lũy tiến (Anomaly Scoring System)</w:t>
@@ -1017,9 +964,8 @@
         <w:rPr>
           <w:b w:val="0"/>
           <w:i w:val="0"/>
-          <w:sz w:val="22"/>
         </w:rPr>
-        <w:t>Khác với phương thức chặn tức thời cổ điển (Single-Rule Disruption), chuẩn OWASP ModSecurity CRS v4.0 áp dụng cơ chế Anomaly Scoring lũy tiến [Ref 14]:</w:t>
+        <w:t>Khác với phương thức chặn tức thời khi khớp một luật duy nhất (Single-Rule Blocking), chuẩn công nghiệp OWASP ModSecurity Core Rule Set (CRS v4.0) [Ref 07] áp dụng kiến trúc Collaborative Anomaly Scoring System. Mỗi quy tắc khi kích hoạt sẽ gán trọng số rủi ro tích lũy:</w:t>
       </w:r>
     </w:p>
     <w:p>
@@ -1031,15 +977,12 @@
       <w:r>
         <w:rPr>
           <w:b/>
-          <w:sz w:val="22"/>
+          <w:color w:val="111827"/>
         </w:rPr>
-        <w:t xml:space="preserve">Phân tầng mức độ nghiêm trọng: </w:t>
+        <w:t xml:space="preserve">CRITICAL (+5 điểm): </w:t>
       </w:r>
       <w:r>
-        <w:rPr>
-          <w:sz w:val="22"/>
-        </w:rPr>
-        <w:t>Mỗi quy tắc khi khớp sẽ gán điểm bất thường: CRITICAL (+5 điểm), HIGH (+4 điểm), MEDIUM (+3 điểm), LOW (+2 điểm).</w:t>
+        <w:t>Khớp trực tiếp cú pháp khai thác SQLi, OS Command Injection.</w:t>
       </w:r>
     </w:p>
     <w:p>
@@ -1051,22 +994,52 @@
       <w:r>
         <w:rPr>
           <w:b/>
-          <w:sz w:val="22"/>
+          <w:color w:val="111827"/>
         </w:rPr>
-        <w:t xml:space="preserve">Tích lũy điểm bất thường: </w:t>
+        <w:t xml:space="preserve">HIGH (+4 điểm): </w:t>
       </w:r>
       <w:r>
+        <w:t>Phát hiện hành vi quét lỗ hổng, traversal.</w:t>
+      </w:r>
+    </w:p>
+    <w:p>
+      <w:pPr>
+        <w:pStyle w:val="ListBullet"/>
+        <w:spacing w:after="60" w:line="276" w:lineRule="auto"/>
+        <w:jc w:val="both"/>
+      </w:pPr>
+      <w:r>
         <w:rPr>
-          <w:sz w:val="22"/>
+          <w:b/>
+          <w:color w:val="111827"/>
         </w:rPr>
-        <w:t>Điểm bất thường tích lũy được tính bằng tổng điểm của tất cả quy tắc bị kích hoạt trên toàn bộ các thành phần của yêu cầu HTTP:</w:t>
+        <w:t xml:space="preserve">MEDIUM (+3 điểm): </w:t>
+      </w:r>
+      <w:r>
+        <w:t>Phát hiện từ khóa nhạy cảm, ký tự đặc biệt.</w:t>
+      </w:r>
+    </w:p>
+    <w:p>
+      <w:pPr>
+        <w:pStyle w:val="ListBullet"/>
+        <w:spacing w:after="60" w:line="276" w:lineRule="auto"/>
+        <w:jc w:val="both"/>
+      </w:pPr>
+      <w:r>
+        <w:rPr>
+          <w:b/>
+          <w:color w:val="111827"/>
+        </w:rPr>
+        <w:t xml:space="preserve">LOW (+2 điểm): </w:t>
+      </w:r>
+      <w:r>
+        <w:t>Sai lệch chuẩn giao thức HTTP.</w:t>
       </w:r>
     </w:p>
     <w:tbl>
       <w:tblPr>
         <w:tblW w:type="auto" w:w="0"/>
         <w:jc w:val="center"/>
-        <w:tblLayout w:type="fixed"/>
         <w:tblLook w:firstColumn="1" w:firstRow="1" w:lastColumn="0" w:lastRow="0" w:noHBand="0" w:noVBand="1" w:val="04A0"/>
       </w:tblPr>
       <w:tblGrid>
@@ -1086,31 +1059,28 @@
           </w:tcPr>
           <w:p>
             <w:pPr>
-              <w:spacing w:after="40"/>
               <w:jc w:val="center"/>
             </w:pPr>
             <w:r>
               <w:rPr>
-                <w:rFonts w:ascii="Courier New" w:hAnsi="Courier New"/>
                 <w:b/>
-                <w:color w:val="1E3A8A"/>
-                <w:sz w:val="23"/>
+                <w:color w:val="1E293B"/>
+                <w:sz w:val="22"/>
               </w:rPr>
-              <w:t>S_anomaly = SUM( Score(rule_i) )  cho mọi rule_i được kích hoạt</w:t>
+              <w:t>S_anomaly = sum_{i in Rules matched} Score(i)</w:t>
             </w:r>
           </w:p>
           <w:p>
             <w:pPr>
-              <w:spacing w:after="0"/>
               <w:jc w:val="center"/>
             </w:pPr>
             <w:r>
               <w:rPr>
                 <w:i/>
-                <w:color w:val="4B5563"/>
+                <w:color w:val="64748B"/>
                 <w:sz w:val="19"/>
               </w:rPr>
-              <w:t>Công thức chấm điểm bất thường lũy tiến theo chuẩn OWASP ModSecurity CRS v4.0</w:t>
+              <w:t>Công thức tính Điểm bất thường tích lũy (Cumulative Anomaly Score) theo chuẩn OWASP CRS v4.0</w:t>
             </w:r>
           </w:p>
         </w:tc>
@@ -1118,7 +1088,7 @@
     </w:tbl>
     <w:p>
       <w:pPr>
-        <w:spacing w:after="40"/>
+        <w:spacing w:after="80"/>
       </w:pPr>
     </w:p>
     <w:p>
@@ -1130,20 +1100,19 @@
         <w:rPr>
           <w:b w:val="0"/>
           <w:i w:val="0"/>
-          <w:sz w:val="22"/>
         </w:rPr>
-        <w:t>Chỉ khi tổng điểm S_anomaly vượt ngưỡng quy định (thường là 5 điểm), WAF mới ngắt kết nối và trả về mã HTTP 403 Forbidden. Cơ chế này giúp giảm thiểu việc chặn nhầm người dùng hợp lệ có chứa một vài ký tự đặc biệt ngẫu nhiên.</w:t>
+        <w:t>Chỉ khi S_anomaly &gt;= Anomaly Threshold (mặc định = 5 điểm), WAF mới thực hiện ngắt kết nối và trả về mã lỗi HTTP 403 Forbidden. Mô hình này giảm thiểu đáng kể tỷ lệ chặn nhầm các yêu cầu hợp lệ.</w:t>
       </w:r>
     </w:p>
     <w:p>
       <w:pPr>
         <w:keepNext/>
-        <w:spacing w:before="240" w:after="80"/>
+        <w:spacing w:before="200" w:after="80"/>
       </w:pPr>
       <w:r>
         <w:rPr>
           <w:b/>
-          <w:color w:val="1E40AF"/>
+          <w:color w:val="1E3A8A"/>
           <w:sz w:val="24"/>
         </w:rPr>
         <w:t>1.2.3. Những giới hạn cốt tử của phương pháp dựa trên luật tĩnh</w:t>
@@ -1158,9 +1127,8 @@
         <w:rPr>
           <w:b w:val="0"/>
           <w:i w:val="0"/>
-          <w:sz w:val="22"/>
         </w:rPr>
-        <w:t>Mặc dù đóng vai trò hàng rào lọc thô không thể thiếu nhờ tốc độ xử lý nhanh, WAF dựa trên chữ ký tĩnh bộc lộ 3 nhược điểm cốt tử:</w:t>
+        <w:t>Mặc dù đóng vai trò là hàng rào lọc thô không thể thiếu, WAF dựa trên luật tĩnh bộc lộ những khiếm khuyết nội tại theo phân tích của William Stallings [Ref 01]:</w:t>
       </w:r>
     </w:p>
     <w:p>
@@ -1172,15 +1140,12 @@
       <w:r>
         <w:rPr>
           <w:b/>
-          <w:sz w:val="22"/>
+          <w:color w:val="111827"/>
         </w:rPr>
-        <w:t xml:space="preserve">1. Bất lực trước biến thể mới và Zero-day attacks: </w:t>
+        <w:t xml:space="preserve">1. Bất lực trước biến thể mới và tấn công chưa từng biết (Zero-day Attacks): </w:t>
       </w:r>
       <w:r>
-        <w:rPr>
-          <w:sz w:val="22"/>
-        </w:rPr>
-        <w:t>Luật tĩnh chỉ có thể phát hiện những gì đã được định nghĩa từ trước. Khi gặp các cú pháp đột biến hoặc payload chưa từng được ghi nhận, luật tĩnh hoàn toàn bị qua mặt.</w:t>
+        <w:t>Luật chữ ký chỉ phát hiện được những gì đã định nghĩa trước.</w:t>
       </w:r>
     </w:p>
     <w:p>
@@ -1192,15 +1157,12 @@
       <w:r>
         <w:rPr>
           <w:b/>
-          <w:sz w:val="22"/>
+          <w:color w:val="111827"/>
         </w:rPr>
-        <w:t xml:space="preserve">2. Nghịch lý giữa False Positive và False Negative: </w:t>
+        <w:t xml:space="preserve">2. Nghịch lý False Positive vs False Negative: </w:t>
       </w:r>
       <w:r>
-        <w:rPr>
-          <w:sz w:val="22"/>
-        </w:rPr>
-        <w:t>Nếu siết chặt regex để chặn triệt để, hệ thống sẽ chặn nhầm các yêu cầu hợp lệ của người dùng (tăng False Positive). Nếu nới lỏng regex, kẻ tấn công dễ dàng luồn lách qua các kỹ thuật làm mờ (tăng False Negative).</w:t>
+        <w:t>Viết regex quá chặt chẽ sẽ chặn nhầm văn bản nghiệp vụ lành tính (báo động giả cao); nới lỏng regex sẽ bị kẻ tấn công làm mờ payload vượt qua (bỏ lọt cao).</w:t>
       </w:r>
     </w:p>
     <w:p>
@@ -1212,27 +1174,24 @@
       <w:r>
         <w:rPr>
           <w:b/>
-          <w:sz w:val="22"/>
+          <w:color w:val="111827"/>
         </w:rPr>
-        <w:t xml:space="preserve">3. Suy giảm hiệu năng và nguy cơ ReDoS: </w:t>
+        <w:t xml:space="preserve">3. Chi phí tính toán tăng mạnh (Regex Performance Degradation): </w:t>
       </w:r>
       <w:r>
-        <w:rPr>
-          <w:sz w:val="22"/>
-        </w:rPr>
-        <w:t>Khi tập luật phình to lên hàng nghìn regex, chi phí CPU tăng đột biến. Các biểu thức chính quy lồng nhau có nguy cơ dính lỗ hổng ReDoS (Regular Expression Denial of Service), khiến độ trễ proxy tăng vọt, gây nghẽn cổ chai cho toàn bộ hệ thống.</w:t>
+        <w:t>Hàng nghìn regex phức tạp gây suy giảm thông lượng và tiềm ẩn nguy cơ dính tấn công ReDoS.</w:t>
       </w:r>
     </w:p>
     <w:p>
       <w:pPr>
         <w:keepNext/>
-        <w:spacing w:before="320" w:after="120"/>
+        <w:spacing w:before="280" w:after="120"/>
       </w:pPr>
       <w:r>
         <w:rPr>
           <w:b/>
-          <w:color w:val="0F2454"/>
-          <w:sz w:val="27"/>
+          <w:color w:val="0F766E"/>
+          <w:sz w:val="28"/>
         </w:rPr>
         <w:t>1.3. CƠ SỞ LÝ THUYẾT VỀ TRÍCH XUẤT ĐẶC TRƯNG VÀ HỌC MÁY TRONG PHÁT HIỆN TẤN CÔNG WEB</w:t>
       </w:r>
@@ -1240,15 +1199,29 @@
     <w:p>
       <w:pPr>
         <w:keepNext/>
-        <w:spacing w:before="240" w:after="80"/>
+        <w:spacing w:before="200" w:after="80"/>
       </w:pPr>
       <w:r>
         <w:rPr>
           <w:b/>
-          <w:color w:val="1E40AF"/>
+          <w:color w:val="1E3A8A"/>
           <w:sz w:val="24"/>
         </w:rPr>
         <w:t>1.3.1. Phương pháp trích xuất đặc trưng hình thái học và thống kê chuỗi HTTP</w:t>
+      </w:r>
+    </w:p>
+    <w:p>
+      <w:pPr>
+        <w:keepNext/>
+        <w:spacing w:before="120" w:after="40"/>
+      </w:pPr>
+      <w:r>
+        <w:rPr>
+          <w:b/>
+          <w:color w:val="374151"/>
+          <w:sz w:val="22"/>
+        </w:rPr>
+        <w:t>1. Cơ sở toán học của độ hỗn loạn thông tin Shannon Entropy</w:t>
       </w:r>
     </w:p>
     <w:p>
@@ -1260,44 +1233,14 @@
         <w:rPr>
           <w:b w:val="0"/>
           <w:i w:val="0"/>
-          <w:sz w:val="22"/>
         </w:rPr>
-        <w:t>Dựa trên công trình nghiên cứu của C. Torrano-Gimenez et al. (Wiley Security and Communication Networks 2015) [Ref 08], thay vì xử lý chuỗi bằng các mô hình NLP nặng nề (như Transformer/BERT tiêu tốn 50-150ms phần cứng GPU), ta có thể vector hóa yêu cầu HTTP thành các đặc trưng hình thái học (Morphological Features) và thống kê với thời gian xử lý siêu thấp (&lt; 0.5ms trên CPU thông thường).</w:t>
-      </w:r>
-    </w:p>
-    <w:p>
-      <w:pPr>
-        <w:keepNext/>
-        <w:spacing w:before="160" w:after="40"/>
-      </w:pPr>
-      <w:r>
-        <w:rPr>
-          <w:b/>
-          <w:color w:val="047857"/>
-          <w:sz w:val="22"/>
-        </w:rPr>
-        <w:t>Cơ sở toán học của độ hỗn loạn thông tin Shannon Entropy</w:t>
-      </w:r>
-    </w:p>
-    <w:p>
-      <w:pPr>
-        <w:spacing w:after="80" w:line="288" w:lineRule="auto"/>
-        <w:jc w:val="both"/>
-      </w:pPr>
-      <w:r>
-        <w:rPr>
-          <w:b w:val="0"/>
-          <w:i w:val="0"/>
-          <w:sz w:val="22"/>
-        </w:rPr>
-        <w:t>Độ hỗn loạn thông tin Shannon Entropy được áp dụng để đo lường mức độ ngẫu nhiên và phân tán của các ký tự xuất hiện trong chuỗi payload S có độ dài N:</w:t>
+        <w:t>Theo giáo trình kinh điển Cryptography: Theory and Practice của Douglas R. Stinson và Maura B. Paterson (Chương 2: Information Theory) [Ref 02], độ hỗn loạn thông tin (Shannon Entropy) là thước đo định lượng toán học về tính ngẫu nhiên, độ bất định và lượng thông tin trung bình chứa trong một biến ngẫu nhiên rời rạc. Cho chuỗi ký tự payload S có độ dài L, xác suất p(c_i) xuất hiện của ký tự c_i là count(c_i) / L. Độ hỗn loạn Shannon Entropy H(S) (tính theo bit) được định nghĩa:</w:t>
       </w:r>
     </w:p>
     <w:tbl>
       <w:tblPr>
         <w:tblW w:type="auto" w:w="0"/>
         <w:jc w:val="center"/>
-        <w:tblLayout w:type="fixed"/>
         <w:tblLook w:firstColumn="1" w:firstRow="1" w:lastColumn="0" w:lastRow="0" w:noHBand="0" w:noVBand="1" w:val="04A0"/>
       </w:tblPr>
       <w:tblGrid>
@@ -1317,31 +1260,28 @@
           </w:tcPr>
           <w:p>
             <w:pPr>
-              <w:spacing w:after="40"/>
               <w:jc w:val="center"/>
             </w:pPr>
             <w:r>
               <w:rPr>
-                <w:rFonts w:ascii="Courier New" w:hAnsi="Courier New"/>
                 <w:b/>
-                <w:color w:val="1E3A8A"/>
-                <w:sz w:val="23"/>
+                <w:color w:val="1E293B"/>
+                <w:sz w:val="22"/>
               </w:rPr>
-              <w:t>H(S) = - SUM_{i=1..K} [ p(c_i) * log2( p(c_i) ) ]</w:t>
+              <w:t>H(S) = - sum_{i=1}^{k} p(c_i) * log_2 p(c_i)</w:t>
             </w:r>
           </w:p>
           <w:p>
             <w:pPr>
-              <w:spacing w:after="0"/>
               <w:jc w:val="center"/>
             </w:pPr>
             <w:r>
               <w:rPr>
                 <w:i/>
-                <w:color w:val="4B5563"/>
+                <w:color w:val="64748B"/>
                 <w:sz w:val="19"/>
               </w:rPr>
-              <w:t>Trong đó: K là số ký tự phân biệt; p(c_i) = f(c_i)/N là xác suất xuất hiện của ký tự c_i</w:t>
+              <w:t>Công thức toán học tính toán Shannon Entropy H(S) của chuỗi payload (Stinson &amp; Paterson, 2018)</w:t>
             </w:r>
           </w:p>
         </w:tc>
@@ -1349,7 +1289,7 @@
     </w:tbl>
     <w:p>
       <w:pPr>
-        <w:spacing w:after="40"/>
+        <w:spacing w:after="80"/>
       </w:pPr>
     </w:p>
     <w:p>
@@ -1361,23 +1301,22 @@
         <w:rPr>
           <w:b w:val="0"/>
           <w:i w:val="0"/>
-          <w:sz w:val="22"/>
         </w:rPr>
-        <w:t>Ý nghĩa trong an ninh mạng: Chuỗi văn bản tiếng Anh hoặc tiếng Việt thông thường có entropy thấp (2.0 - 3.5). Ngược lại, chuỗi chứa payload tấn công bị làm mờ (mã hóa Base64, Hex, URL kép, shellcode) có độ phân tán ký tự rất cao, đẩy entropy lên ngưỡng cao đột biến (H(S) &gt; 4.5). Đây là một chỉ dấu cực mạnh để nhận diện payload độc hại.</w:t>
+        <w:t>Ý nghĩa an ninh thông tin: Văn bản tự nhiên và tham số lành tính có entropy dao động từ 2.0 đến 3.5. Trong khi đó, payload tấn công làm mờ (Base64, Hex, Shellcode, SQLi đa tầng) có độ phân tán ký tự đều bất thường, khiến entropy tăng vọt lên mức &gt;= 3.8 - 4.5. Do đó, Shannon Entropy là đặc trưng hình thái học cực kỳ nhạy cảm để phát hiện dấu hiệu bất thường mà không cần từ điển chữ ký tĩnh.</w:t>
       </w:r>
     </w:p>
     <w:p>
       <w:pPr>
         <w:keepNext/>
-        <w:spacing w:before="160" w:after="40"/>
+        <w:spacing w:before="120" w:after="40"/>
       </w:pPr>
       <w:r>
         <w:rPr>
           <w:b/>
-          <w:color w:val="047857"/>
+          <w:color w:val="374151"/>
           <w:sz w:val="22"/>
         </w:rPr>
-        <w:t>Không gian 17 đặc trưng hình thái chuẩn tắc (Canonical 17-D Feature Vector)</w:t>
+        <w:t>2. Không gian 17 đặc trưng hình thái chuẩn tắc (Canonical 17-D Feature Vector)</w:t>
       </w:r>
     </w:p>
     <w:p>
@@ -1389,1372 +1328,56 @@
         <w:rPr>
           <w:b w:val="0"/>
           <w:i w:val="0"/>
-          <w:sz w:val="22"/>
         </w:rPr>
-        <w:t>Hệ thống chuẩn hóa không gian vector đặc trưng thành 17 chiều độc lập, tương thích 100% giữa bộ trích xuất dữ liệu của ML Engine và bộ suy luận thời gian thực của Gateway [Ref 08]:</w:t>
+        <w:t>Kế thừa và chuẩn hóa công trình nghiên cứu nền tảng của C. Torrano-Gimenez et al. (Wiley Security and Communication Networks 2015) [Ref 08] và bài báo tổng quan SQLi của M. Hasan et al. (IEEE Access 2023) [Ref 10], đồ án xây dựng vector 17 chiều chuẩn tắc gồm 2 nhóm:</w:t>
       </w:r>
     </w:p>
-    <w:tbl>
-      <w:tblPr>
-        <w:tblW w:type="auto" w:w="0"/>
-        <w:jc w:val="center"/>
-        <w:tblLayout w:type="fixed"/>
-        <w:tblLook w:firstColumn="1" w:firstRow="1" w:lastColumn="0" w:lastRow="0" w:noHBand="0" w:noVBand="1" w:val="04A0"/>
-      </w:tblPr>
-      <w:tblGrid>
-        <w:gridCol w:w="3120"/>
-        <w:gridCol w:w="3120"/>
-        <w:gridCol w:w="3120"/>
-      </w:tblGrid>
-      <w:tr>
-        <w:tc>
-          <w:tcPr>
-            <w:tcW w:type="dxa" w:w="864"/>
-            <w:shd w:fill="047857"/>
-            <w:tcMar>
-              <w:top w:w="120" w:type="dxa"/>
-              <w:bottom w:w="120" w:type="dxa"/>
-              <w:left w:w="100" w:type="dxa"/>
-              <w:right w:w="100" w:type="dxa"/>
-            </w:tcMar>
-          </w:tcPr>
-          <w:p>
-            <w:pPr>
-              <w:jc w:val="center"/>
-            </w:pPr>
-            <w:r>
-              <w:rPr>
-                <w:b/>
-                <w:color w:val="FFFFFF"/>
-                <w:sz w:val="19"/>
-              </w:rPr>
-              <w:t>STT</w:t>
-            </w:r>
-          </w:p>
-        </w:tc>
-        <w:tc>
-          <w:tcPr>
-            <w:tcW w:type="dxa" w:w="3168"/>
-            <w:shd w:fill="047857"/>
-            <w:tcMar>
-              <w:top w:w="120" w:type="dxa"/>
-              <w:bottom w:w="120" w:type="dxa"/>
-              <w:left w:w="100" w:type="dxa"/>
-              <w:right w:w="100" w:type="dxa"/>
-            </w:tcMar>
-          </w:tcPr>
-          <w:p>
-            <w:pPr>
-              <w:jc w:val="center"/>
-            </w:pPr>
-            <w:r>
-              <w:rPr>
-                <w:b/>
-                <w:color w:val="FFFFFF"/>
-                <w:sz w:val="19"/>
-              </w:rPr>
-              <w:t>Tên Đặc Trưng</w:t>
-            </w:r>
-          </w:p>
-        </w:tc>
-        <w:tc>
-          <w:tcPr>
-            <w:tcW w:type="dxa" w:w="5328"/>
-            <w:shd w:fill="047857"/>
-            <w:tcMar>
-              <w:top w:w="120" w:type="dxa"/>
-              <w:bottom w:w="120" w:type="dxa"/>
-              <w:left w:w="100" w:type="dxa"/>
-              <w:right w:w="100" w:type="dxa"/>
-            </w:tcMar>
-          </w:tcPr>
-          <w:p>
-            <w:pPr>
-              <w:jc w:val="center"/>
-            </w:pPr>
-            <w:r>
-              <w:rPr>
-                <w:b/>
-                <w:color w:val="FFFFFF"/>
-                <w:sz w:val="19"/>
-              </w:rPr>
-              <w:t>Ý Nghĩa Phân Tích An Ninh Mạng</w:t>
-            </w:r>
-          </w:p>
-        </w:tc>
-      </w:tr>
-      <w:tr>
-        <w:tc>
-          <w:tcPr>
-            <w:tcW w:type="dxa" w:w="864"/>
-            <w:shd w:fill="F9FAFB"/>
-            <w:tcMar>
-              <w:top w:w="80" w:type="dxa"/>
-              <w:bottom w:w="80" w:type="dxa"/>
-              <w:left w:w="100" w:type="dxa"/>
-              <w:right w:w="100" w:type="dxa"/>
-            </w:tcMar>
-          </w:tcPr>
-          <w:p>
-            <w:pPr>
-              <w:jc w:val="center"/>
-            </w:pPr>
-            <w:r>
-              <w:rPr>
-                <w:sz w:val="18"/>
-              </w:rPr>
-              <w:t>1</w:t>
-            </w:r>
-          </w:p>
-        </w:tc>
-        <w:tc>
-          <w:tcPr>
-            <w:tcW w:type="dxa" w:w="3168"/>
-            <w:shd w:fill="F9FAFB"/>
-            <w:tcMar>
-              <w:top w:w="80" w:type="dxa"/>
-              <w:bottom w:w="80" w:type="dxa"/>
-              <w:left w:w="100" w:type="dxa"/>
-              <w:right w:w="100" w:type="dxa"/>
-            </w:tcMar>
-          </w:tcPr>
-          <w:p>
-            <w:pPr>
-              <w:jc w:val="left"/>
-            </w:pPr>
-            <w:r>
-              <w:rPr>
-                <w:rFonts w:ascii="Courier New" w:hAnsi="Courier New"/>
-                <w:b/>
-                <w:color w:val="047857"/>
-                <w:sz w:val="18"/>
-              </w:rPr>
-              <w:t>payload_length</w:t>
-            </w:r>
-          </w:p>
-        </w:tc>
-        <w:tc>
-          <w:tcPr>
-            <w:tcW w:type="dxa" w:w="5328"/>
-            <w:shd w:fill="F9FAFB"/>
-            <w:tcMar>
-              <w:top w:w="80" w:type="dxa"/>
-              <w:bottom w:w="80" w:type="dxa"/>
-              <w:left w:w="100" w:type="dxa"/>
-              <w:right w:w="100" w:type="dxa"/>
-            </w:tcMar>
-          </w:tcPr>
-          <w:p>
-            <w:pPr>
-              <w:jc w:val="left"/>
-            </w:pPr>
-            <w:r>
-              <w:rPr>
-                <w:sz w:val="18"/>
-              </w:rPr>
-              <w:t>Độ dài chuỗi; tấn công SQLi dạng UNION hoặc buffer overflow thường có độ dài lớn vượt trội.</w:t>
-            </w:r>
-          </w:p>
-        </w:tc>
-      </w:tr>
-      <w:tr>
-        <w:tc>
-          <w:tcPr>
-            <w:tcW w:type="dxa" w:w="864"/>
-            <w:shd w:fill="FFFFFF"/>
-            <w:tcMar>
-              <w:top w:w="80" w:type="dxa"/>
-              <w:bottom w:w="80" w:type="dxa"/>
-              <w:left w:w="100" w:type="dxa"/>
-              <w:right w:w="100" w:type="dxa"/>
-            </w:tcMar>
-          </w:tcPr>
-          <w:p>
-            <w:pPr>
-              <w:jc w:val="center"/>
-            </w:pPr>
-            <w:r>
-              <w:rPr>
-                <w:sz w:val="18"/>
-              </w:rPr>
-              <w:t>2</w:t>
-            </w:r>
-          </w:p>
-        </w:tc>
-        <w:tc>
-          <w:tcPr>
-            <w:tcW w:type="dxa" w:w="3168"/>
-            <w:shd w:fill="FFFFFF"/>
-            <w:tcMar>
-              <w:top w:w="80" w:type="dxa"/>
-              <w:bottom w:w="80" w:type="dxa"/>
-              <w:left w:w="100" w:type="dxa"/>
-              <w:right w:w="100" w:type="dxa"/>
-            </w:tcMar>
-          </w:tcPr>
-          <w:p>
-            <w:pPr>
-              <w:jc w:val="left"/>
-            </w:pPr>
-            <w:r>
-              <w:rPr>
-                <w:rFonts w:ascii="Courier New" w:hAnsi="Courier New"/>
-                <w:b/>
-                <w:color w:val="047857"/>
-                <w:sz w:val="18"/>
-              </w:rPr>
-              <w:t>entropy</w:t>
-            </w:r>
-          </w:p>
-        </w:tc>
-        <w:tc>
-          <w:tcPr>
-            <w:tcW w:type="dxa" w:w="5328"/>
-            <w:shd w:fill="FFFFFF"/>
-            <w:tcMar>
-              <w:top w:w="80" w:type="dxa"/>
-              <w:bottom w:w="80" w:type="dxa"/>
-              <w:left w:w="100" w:type="dxa"/>
-              <w:right w:w="100" w:type="dxa"/>
-            </w:tcMar>
-          </w:tcPr>
-          <w:p>
-            <w:pPr>
-              <w:jc w:val="left"/>
-            </w:pPr>
-            <w:r>
-              <w:rPr>
-                <w:sz w:val="18"/>
-              </w:rPr>
-              <w:t>Shannon Entropy; đo lường độ ngẫu nhiên, phát hiện chuỗi mã hóa, băm mật mã và obfuscation.</w:t>
-            </w:r>
-          </w:p>
-        </w:tc>
-      </w:tr>
-      <w:tr>
-        <w:tc>
-          <w:tcPr>
-            <w:tcW w:type="dxa" w:w="864"/>
-            <w:shd w:fill="F9FAFB"/>
-            <w:tcMar>
-              <w:top w:w="80" w:type="dxa"/>
-              <w:bottom w:w="80" w:type="dxa"/>
-              <w:left w:w="100" w:type="dxa"/>
-              <w:right w:w="100" w:type="dxa"/>
-            </w:tcMar>
-          </w:tcPr>
-          <w:p>
-            <w:pPr>
-              <w:jc w:val="center"/>
-            </w:pPr>
-            <w:r>
-              <w:rPr>
-                <w:sz w:val="18"/>
-              </w:rPr>
-              <w:t>3</w:t>
-            </w:r>
-          </w:p>
-        </w:tc>
-        <w:tc>
-          <w:tcPr>
-            <w:tcW w:type="dxa" w:w="3168"/>
-            <w:shd w:fill="F9FAFB"/>
-            <w:tcMar>
-              <w:top w:w="80" w:type="dxa"/>
-              <w:bottom w:w="80" w:type="dxa"/>
-              <w:left w:w="100" w:type="dxa"/>
-              <w:right w:w="100" w:type="dxa"/>
-            </w:tcMar>
-          </w:tcPr>
-          <w:p>
-            <w:pPr>
-              <w:jc w:val="left"/>
-            </w:pPr>
-            <w:r>
-              <w:rPr>
-                <w:rFonts w:ascii="Courier New" w:hAnsi="Courier New"/>
-                <w:b/>
-                <w:color w:val="047857"/>
-                <w:sz w:val="18"/>
-              </w:rPr>
-              <w:t>special_char_ratio</w:t>
-            </w:r>
-          </w:p>
-        </w:tc>
-        <w:tc>
-          <w:tcPr>
-            <w:tcW w:type="dxa" w:w="5328"/>
-            <w:shd w:fill="F9FAFB"/>
-            <w:tcMar>
-              <w:top w:w="80" w:type="dxa"/>
-              <w:bottom w:w="80" w:type="dxa"/>
-              <w:left w:w="100" w:type="dxa"/>
-              <w:right w:w="100" w:type="dxa"/>
-            </w:tcMar>
-          </w:tcPr>
-          <w:p>
-            <w:pPr>
-              <w:jc w:val="left"/>
-            </w:pPr>
-            <w:r>
-              <w:rPr>
-                <w:sz w:val="18"/>
-              </w:rPr>
-              <w:t>Tỷ lệ ký tự đặc biệt (!@#$%^&amp;*...); payload tấn công luôn có mật độ ký tự đặc biệt cao.</w:t>
-            </w:r>
-          </w:p>
-        </w:tc>
-      </w:tr>
-      <w:tr>
-        <w:tc>
-          <w:tcPr>
-            <w:tcW w:type="dxa" w:w="864"/>
-            <w:shd w:fill="FFFFFF"/>
-            <w:tcMar>
-              <w:top w:w="80" w:type="dxa"/>
-              <w:bottom w:w="80" w:type="dxa"/>
-              <w:left w:w="100" w:type="dxa"/>
-              <w:right w:w="100" w:type="dxa"/>
-            </w:tcMar>
-          </w:tcPr>
-          <w:p>
-            <w:pPr>
-              <w:jc w:val="center"/>
-            </w:pPr>
-            <w:r>
-              <w:rPr>
-                <w:sz w:val="18"/>
-              </w:rPr>
-              <w:t>4</w:t>
-            </w:r>
-          </w:p>
-        </w:tc>
-        <w:tc>
-          <w:tcPr>
-            <w:tcW w:type="dxa" w:w="3168"/>
-            <w:shd w:fill="FFFFFF"/>
-            <w:tcMar>
-              <w:top w:w="80" w:type="dxa"/>
-              <w:bottom w:w="80" w:type="dxa"/>
-              <w:left w:w="100" w:type="dxa"/>
-              <w:right w:w="100" w:type="dxa"/>
-            </w:tcMar>
-          </w:tcPr>
-          <w:p>
-            <w:pPr>
-              <w:jc w:val="left"/>
-            </w:pPr>
-            <w:r>
-              <w:rPr>
-                <w:rFonts w:ascii="Courier New" w:hAnsi="Courier New"/>
-                <w:b/>
-                <w:color w:val="047857"/>
-                <w:sz w:val="18"/>
-              </w:rPr>
-              <w:t>digit_ratio</w:t>
-            </w:r>
-          </w:p>
-        </w:tc>
-        <w:tc>
-          <w:tcPr>
-            <w:tcW w:type="dxa" w:w="5328"/>
-            <w:shd w:fill="FFFFFF"/>
-            <w:tcMar>
-              <w:top w:w="80" w:type="dxa"/>
-              <w:bottom w:w="80" w:type="dxa"/>
-              <w:left w:w="100" w:type="dxa"/>
-              <w:right w:w="100" w:type="dxa"/>
-            </w:tcMar>
-          </w:tcPr>
-          <w:p>
-            <w:pPr>
-              <w:jc w:val="left"/>
-            </w:pPr>
-            <w:r>
-              <w:rPr>
-                <w:sz w:val="18"/>
-              </w:rPr>
-              <w:t>Tỷ lệ chữ số; phát hiện các đòn brute force ID, số liệu nhị phân hoặc chuỗi hex.</w:t>
-            </w:r>
-          </w:p>
-        </w:tc>
-      </w:tr>
-      <w:tr>
-        <w:tc>
-          <w:tcPr>
-            <w:tcW w:type="dxa" w:w="864"/>
-            <w:shd w:fill="F9FAFB"/>
-            <w:tcMar>
-              <w:top w:w="80" w:type="dxa"/>
-              <w:bottom w:w="80" w:type="dxa"/>
-              <w:left w:w="100" w:type="dxa"/>
-              <w:right w:w="100" w:type="dxa"/>
-            </w:tcMar>
-          </w:tcPr>
-          <w:p>
-            <w:pPr>
-              <w:jc w:val="center"/>
-            </w:pPr>
-            <w:r>
-              <w:rPr>
-                <w:sz w:val="18"/>
-              </w:rPr>
-              <w:t>5</w:t>
-            </w:r>
-          </w:p>
-        </w:tc>
-        <w:tc>
-          <w:tcPr>
-            <w:tcW w:type="dxa" w:w="3168"/>
-            <w:shd w:fill="F9FAFB"/>
-            <w:tcMar>
-              <w:top w:w="80" w:type="dxa"/>
-              <w:bottom w:w="80" w:type="dxa"/>
-              <w:left w:w="100" w:type="dxa"/>
-              <w:right w:w="100" w:type="dxa"/>
-            </w:tcMar>
-          </w:tcPr>
-          <w:p>
-            <w:pPr>
-              <w:jc w:val="left"/>
-            </w:pPr>
-            <w:r>
-              <w:rPr>
-                <w:rFonts w:ascii="Courier New" w:hAnsi="Courier New"/>
-                <w:b/>
-                <w:color w:val="047857"/>
-                <w:sz w:val="18"/>
-              </w:rPr>
-              <w:t>uppercase_ratio</w:t>
-            </w:r>
-          </w:p>
-        </w:tc>
-        <w:tc>
-          <w:tcPr>
-            <w:tcW w:type="dxa" w:w="5328"/>
-            <w:shd w:fill="F9FAFB"/>
-            <w:tcMar>
-              <w:top w:w="80" w:type="dxa"/>
-              <w:bottom w:w="80" w:type="dxa"/>
-              <w:left w:w="100" w:type="dxa"/>
-              <w:right w:w="100" w:type="dxa"/>
-            </w:tcMar>
-          </w:tcPr>
-          <w:p>
-            <w:pPr>
-              <w:jc w:val="left"/>
-            </w:pPr>
-            <w:r>
-              <w:rPr>
-                <w:sz w:val="18"/>
-              </w:rPr>
-              <w:t>Tỷ lệ chữ hoa; nhận diện kỹ thuật né tránh đổi hoa thường xen kẽ (Mixed-case Evasion).</w:t>
-            </w:r>
-          </w:p>
-        </w:tc>
-      </w:tr>
-      <w:tr>
-        <w:tc>
-          <w:tcPr>
-            <w:tcW w:type="dxa" w:w="864"/>
-            <w:shd w:fill="FFFFFF"/>
-            <w:tcMar>
-              <w:top w:w="80" w:type="dxa"/>
-              <w:bottom w:w="80" w:type="dxa"/>
-              <w:left w:w="100" w:type="dxa"/>
-              <w:right w:w="100" w:type="dxa"/>
-            </w:tcMar>
-          </w:tcPr>
-          <w:p>
-            <w:pPr>
-              <w:jc w:val="center"/>
-            </w:pPr>
-            <w:r>
-              <w:rPr>
-                <w:sz w:val="18"/>
-              </w:rPr>
-              <w:t>6</w:t>
-            </w:r>
-          </w:p>
-        </w:tc>
-        <w:tc>
-          <w:tcPr>
-            <w:tcW w:type="dxa" w:w="3168"/>
-            <w:shd w:fill="FFFFFF"/>
-            <w:tcMar>
-              <w:top w:w="80" w:type="dxa"/>
-              <w:bottom w:w="80" w:type="dxa"/>
-              <w:left w:w="100" w:type="dxa"/>
-              <w:right w:w="100" w:type="dxa"/>
-            </w:tcMar>
-          </w:tcPr>
-          <w:p>
-            <w:pPr>
-              <w:jc w:val="left"/>
-            </w:pPr>
-            <w:r>
-              <w:rPr>
-                <w:rFonts w:ascii="Courier New" w:hAnsi="Courier New"/>
-                <w:b/>
-                <w:color w:val="047857"/>
-                <w:sz w:val="18"/>
-              </w:rPr>
-              <w:t>single_quote_count</w:t>
-            </w:r>
-          </w:p>
-        </w:tc>
-        <w:tc>
-          <w:tcPr>
-            <w:tcW w:type="dxa" w:w="5328"/>
-            <w:shd w:fill="FFFFFF"/>
-            <w:tcMar>
-              <w:top w:w="80" w:type="dxa"/>
-              <w:bottom w:w="80" w:type="dxa"/>
-              <w:left w:w="100" w:type="dxa"/>
-              <w:right w:w="100" w:type="dxa"/>
-            </w:tcMar>
-          </w:tcPr>
-          <w:p>
-            <w:pPr>
-              <w:jc w:val="left"/>
-            </w:pPr>
-            <w:r>
-              <w:rPr>
-                <w:sz w:val="18"/>
-              </w:rPr>
-              <w:t>Số lượng dấu nháy đơn ('); chỉ dấu cơ bản của SQL Injection đóng chuỗi.</w:t>
-            </w:r>
-          </w:p>
-        </w:tc>
-      </w:tr>
-      <w:tr>
-        <w:tc>
-          <w:tcPr>
-            <w:tcW w:type="dxa" w:w="864"/>
-            <w:shd w:fill="F9FAFB"/>
-            <w:tcMar>
-              <w:top w:w="80" w:type="dxa"/>
-              <w:bottom w:w="80" w:type="dxa"/>
-              <w:left w:w="100" w:type="dxa"/>
-              <w:right w:w="100" w:type="dxa"/>
-            </w:tcMar>
-          </w:tcPr>
-          <w:p>
-            <w:pPr>
-              <w:jc w:val="center"/>
-            </w:pPr>
-            <w:r>
-              <w:rPr>
-                <w:sz w:val="18"/>
-              </w:rPr>
-              <w:t>7</w:t>
-            </w:r>
-          </w:p>
-        </w:tc>
-        <w:tc>
-          <w:tcPr>
-            <w:tcW w:type="dxa" w:w="3168"/>
-            <w:shd w:fill="F9FAFB"/>
-            <w:tcMar>
-              <w:top w:w="80" w:type="dxa"/>
-              <w:bottom w:w="80" w:type="dxa"/>
-              <w:left w:w="100" w:type="dxa"/>
-              <w:right w:w="100" w:type="dxa"/>
-            </w:tcMar>
-          </w:tcPr>
-          <w:p>
-            <w:pPr>
-              <w:jc w:val="left"/>
-            </w:pPr>
-            <w:r>
-              <w:rPr>
-                <w:rFonts w:ascii="Courier New" w:hAnsi="Courier New"/>
-                <w:b/>
-                <w:color w:val="047857"/>
-                <w:sz w:val="18"/>
-              </w:rPr>
-              <w:t>double_quote_count</w:t>
-            </w:r>
-          </w:p>
-        </w:tc>
-        <w:tc>
-          <w:tcPr>
-            <w:tcW w:type="dxa" w:w="5328"/>
-            <w:shd w:fill="F9FAFB"/>
-            <w:tcMar>
-              <w:top w:w="80" w:type="dxa"/>
-              <w:bottom w:w="80" w:type="dxa"/>
-              <w:left w:w="100" w:type="dxa"/>
-              <w:right w:w="100" w:type="dxa"/>
-            </w:tcMar>
-          </w:tcPr>
-          <w:p>
-            <w:pPr>
-              <w:jc w:val="left"/>
-            </w:pPr>
-            <w:r>
-              <w:rPr>
-                <w:sz w:val="18"/>
-              </w:rPr>
-              <w:t>Số lượng dấu nháy kép ("); chỉ dấu của XSS attribute injection và SQLi.</w:t>
-            </w:r>
-          </w:p>
-        </w:tc>
-      </w:tr>
-      <w:tr>
-        <w:tc>
-          <w:tcPr>
-            <w:tcW w:type="dxa" w:w="864"/>
-            <w:shd w:fill="FFFFFF"/>
-            <w:tcMar>
-              <w:top w:w="80" w:type="dxa"/>
-              <w:bottom w:w="80" w:type="dxa"/>
-              <w:left w:w="100" w:type="dxa"/>
-              <w:right w:w="100" w:type="dxa"/>
-            </w:tcMar>
-          </w:tcPr>
-          <w:p>
-            <w:pPr>
-              <w:jc w:val="center"/>
-            </w:pPr>
-            <w:r>
-              <w:rPr>
-                <w:sz w:val="18"/>
-              </w:rPr>
-              <w:t>8</w:t>
-            </w:r>
-          </w:p>
-        </w:tc>
-        <w:tc>
-          <w:tcPr>
-            <w:tcW w:type="dxa" w:w="3168"/>
-            <w:shd w:fill="FFFFFF"/>
-            <w:tcMar>
-              <w:top w:w="80" w:type="dxa"/>
-              <w:bottom w:w="80" w:type="dxa"/>
-              <w:left w:w="100" w:type="dxa"/>
-              <w:right w:w="100" w:type="dxa"/>
-            </w:tcMar>
-          </w:tcPr>
-          <w:p>
-            <w:pPr>
-              <w:jc w:val="left"/>
-            </w:pPr>
-            <w:r>
-              <w:rPr>
-                <w:rFonts w:ascii="Courier New" w:hAnsi="Courier New"/>
-                <w:b/>
-                <w:color w:val="047857"/>
-                <w:sz w:val="18"/>
-              </w:rPr>
-              <w:t>parentheses_count</w:t>
-            </w:r>
-          </w:p>
-        </w:tc>
-        <w:tc>
-          <w:tcPr>
-            <w:tcW w:type="dxa" w:w="5328"/>
-            <w:shd w:fill="FFFFFF"/>
-            <w:tcMar>
-              <w:top w:w="80" w:type="dxa"/>
-              <w:bottom w:w="80" w:type="dxa"/>
-              <w:left w:w="100" w:type="dxa"/>
-              <w:right w:w="100" w:type="dxa"/>
-            </w:tcMar>
-          </w:tcPr>
-          <w:p>
-            <w:pPr>
-              <w:jc w:val="left"/>
-            </w:pPr>
-            <w:r>
-              <w:rPr>
-                <w:sz w:val="18"/>
-              </w:rPr>
-              <w:t>Số lượng dấu ngoặc tròn (); phát hiện lời gọi hàm SQL (CONCAT, SLEEP) hoặc hàm JS (alert).</w:t>
-            </w:r>
-          </w:p>
-        </w:tc>
-      </w:tr>
-      <w:tr>
-        <w:tc>
-          <w:tcPr>
-            <w:tcW w:type="dxa" w:w="864"/>
-            <w:shd w:fill="F9FAFB"/>
-            <w:tcMar>
-              <w:top w:w="80" w:type="dxa"/>
-              <w:bottom w:w="80" w:type="dxa"/>
-              <w:left w:w="100" w:type="dxa"/>
-              <w:right w:w="100" w:type="dxa"/>
-            </w:tcMar>
-          </w:tcPr>
-          <w:p>
-            <w:pPr>
-              <w:jc w:val="center"/>
-            </w:pPr>
-            <w:r>
-              <w:rPr>
-                <w:sz w:val="18"/>
-              </w:rPr>
-              <w:t>9</w:t>
-            </w:r>
-          </w:p>
-        </w:tc>
-        <w:tc>
-          <w:tcPr>
-            <w:tcW w:type="dxa" w:w="3168"/>
-            <w:shd w:fill="F9FAFB"/>
-            <w:tcMar>
-              <w:top w:w="80" w:type="dxa"/>
-              <w:bottom w:w="80" w:type="dxa"/>
-              <w:left w:w="100" w:type="dxa"/>
-              <w:right w:w="100" w:type="dxa"/>
-            </w:tcMar>
-          </w:tcPr>
-          <w:p>
-            <w:pPr>
-              <w:jc w:val="left"/>
-            </w:pPr>
-            <w:r>
-              <w:rPr>
-                <w:rFonts w:ascii="Courier New" w:hAnsi="Courier New"/>
-                <w:b/>
-                <w:color w:val="047857"/>
-                <w:sz w:val="18"/>
-              </w:rPr>
-              <w:t>angle_bracket_count</w:t>
-            </w:r>
-          </w:p>
-        </w:tc>
-        <w:tc>
-          <w:tcPr>
-            <w:tcW w:type="dxa" w:w="5328"/>
-            <w:shd w:fill="F9FAFB"/>
-            <w:tcMar>
-              <w:top w:w="80" w:type="dxa"/>
-              <w:bottom w:w="80" w:type="dxa"/>
-              <w:left w:w="100" w:type="dxa"/>
-              <w:right w:w="100" w:type="dxa"/>
-            </w:tcMar>
-          </w:tcPr>
-          <w:p>
-            <w:pPr>
-              <w:jc w:val="left"/>
-            </w:pPr>
-            <w:r>
-              <w:rPr>
-                <w:sz w:val="18"/>
-              </w:rPr>
-              <w:t>Số lượng dấu ngoặc nhọn (&lt; &gt;); chỉ dấu trực tiếp của việc tiêm mã thẻ HTML/XSS.</w:t>
-            </w:r>
-          </w:p>
-        </w:tc>
-      </w:tr>
-      <w:tr>
-        <w:tc>
-          <w:tcPr>
-            <w:tcW w:type="dxa" w:w="864"/>
-            <w:shd w:fill="FFFFFF"/>
-            <w:tcMar>
-              <w:top w:w="80" w:type="dxa"/>
-              <w:bottom w:w="80" w:type="dxa"/>
-              <w:left w:w="100" w:type="dxa"/>
-              <w:right w:w="100" w:type="dxa"/>
-            </w:tcMar>
-          </w:tcPr>
-          <w:p>
-            <w:pPr>
-              <w:jc w:val="center"/>
-            </w:pPr>
-            <w:r>
-              <w:rPr>
-                <w:sz w:val="18"/>
-              </w:rPr>
-              <w:t>10</w:t>
-            </w:r>
-          </w:p>
-        </w:tc>
-        <w:tc>
-          <w:tcPr>
-            <w:tcW w:type="dxa" w:w="3168"/>
-            <w:shd w:fill="FFFFFF"/>
-            <w:tcMar>
-              <w:top w:w="80" w:type="dxa"/>
-              <w:bottom w:w="80" w:type="dxa"/>
-              <w:left w:w="100" w:type="dxa"/>
-              <w:right w:w="100" w:type="dxa"/>
-            </w:tcMar>
-          </w:tcPr>
-          <w:p>
-            <w:pPr>
-              <w:jc w:val="left"/>
-            </w:pPr>
-            <w:r>
-              <w:rPr>
-                <w:rFonts w:ascii="Courier New" w:hAnsi="Courier New"/>
-                <w:b/>
-                <w:color w:val="047857"/>
-                <w:sz w:val="18"/>
-              </w:rPr>
-              <w:t>semicolon_count</w:t>
-            </w:r>
-          </w:p>
-        </w:tc>
-        <w:tc>
-          <w:tcPr>
-            <w:tcW w:type="dxa" w:w="5328"/>
-            <w:shd w:fill="FFFFFF"/>
-            <w:tcMar>
-              <w:top w:w="80" w:type="dxa"/>
-              <w:bottom w:w="80" w:type="dxa"/>
-              <w:left w:w="100" w:type="dxa"/>
-              <w:right w:w="100" w:type="dxa"/>
-            </w:tcMar>
-          </w:tcPr>
-          <w:p>
-            <w:pPr>
-              <w:jc w:val="left"/>
-            </w:pPr>
-            <w:r>
-              <w:rPr>
-                <w:sz w:val="18"/>
-              </w:rPr>
-              <w:t>Số lượng dấu chấm phẩy (;); phát hiện kỹ thuật xếp chồng câu lệnh SQL (Stacked Queries) hoặc ngắt lệnh Shell.</w:t>
-            </w:r>
-          </w:p>
-        </w:tc>
-      </w:tr>
-      <w:tr>
-        <w:tc>
-          <w:tcPr>
-            <w:tcW w:type="dxa" w:w="864"/>
-            <w:shd w:fill="F9FAFB"/>
-            <w:tcMar>
-              <w:top w:w="80" w:type="dxa"/>
-              <w:bottom w:w="80" w:type="dxa"/>
-              <w:left w:w="100" w:type="dxa"/>
-              <w:right w:w="100" w:type="dxa"/>
-            </w:tcMar>
-          </w:tcPr>
-          <w:p>
-            <w:pPr>
-              <w:jc w:val="center"/>
-            </w:pPr>
-            <w:r>
-              <w:rPr>
-                <w:sz w:val="18"/>
-              </w:rPr>
-              <w:t>11</w:t>
-            </w:r>
-          </w:p>
-        </w:tc>
-        <w:tc>
-          <w:tcPr>
-            <w:tcW w:type="dxa" w:w="3168"/>
-            <w:shd w:fill="F9FAFB"/>
-            <w:tcMar>
-              <w:top w:w="80" w:type="dxa"/>
-              <w:bottom w:w="80" w:type="dxa"/>
-              <w:left w:w="100" w:type="dxa"/>
-              <w:right w:w="100" w:type="dxa"/>
-            </w:tcMar>
-          </w:tcPr>
-          <w:p>
-            <w:pPr>
-              <w:jc w:val="left"/>
-            </w:pPr>
-            <w:r>
-              <w:rPr>
-                <w:rFonts w:ascii="Courier New" w:hAnsi="Courier New"/>
-                <w:b/>
-                <w:color w:val="047857"/>
-                <w:sz w:val="18"/>
-              </w:rPr>
-              <w:t>whitespace_count</w:t>
-            </w:r>
-          </w:p>
-        </w:tc>
-        <w:tc>
-          <w:tcPr>
-            <w:tcW w:type="dxa" w:w="5328"/>
-            <w:shd w:fill="F9FAFB"/>
-            <w:tcMar>
-              <w:top w:w="80" w:type="dxa"/>
-              <w:bottom w:w="80" w:type="dxa"/>
-              <w:left w:w="100" w:type="dxa"/>
-              <w:right w:w="100" w:type="dxa"/>
-            </w:tcMar>
-          </w:tcPr>
-          <w:p>
-            <w:pPr>
-              <w:jc w:val="left"/>
-            </w:pPr>
-            <w:r>
-              <w:rPr>
-                <w:sz w:val="18"/>
-              </w:rPr>
-              <w:t>Số lượng khoảng trắng; phân tích cấu trúc cú pháp câu lệnh truy vấn.</w:t>
-            </w:r>
-          </w:p>
-        </w:tc>
-      </w:tr>
-      <w:tr>
-        <w:tc>
-          <w:tcPr>
-            <w:tcW w:type="dxa" w:w="864"/>
-            <w:shd w:fill="FFFFFF"/>
-            <w:tcMar>
-              <w:top w:w="80" w:type="dxa"/>
-              <w:bottom w:w="80" w:type="dxa"/>
-              <w:left w:w="100" w:type="dxa"/>
-              <w:right w:w="100" w:type="dxa"/>
-            </w:tcMar>
-          </w:tcPr>
-          <w:p>
-            <w:pPr>
-              <w:jc w:val="center"/>
-            </w:pPr>
-            <w:r>
-              <w:rPr>
-                <w:sz w:val="18"/>
-              </w:rPr>
-              <w:t>12</w:t>
-            </w:r>
-          </w:p>
-        </w:tc>
-        <w:tc>
-          <w:tcPr>
-            <w:tcW w:type="dxa" w:w="3168"/>
-            <w:shd w:fill="FFFFFF"/>
-            <w:tcMar>
-              <w:top w:w="80" w:type="dxa"/>
-              <w:bottom w:w="80" w:type="dxa"/>
-              <w:left w:w="100" w:type="dxa"/>
-              <w:right w:w="100" w:type="dxa"/>
-            </w:tcMar>
-          </w:tcPr>
-          <w:p>
-            <w:pPr>
-              <w:jc w:val="left"/>
-            </w:pPr>
-            <w:r>
-              <w:rPr>
-                <w:rFonts w:ascii="Courier New" w:hAnsi="Courier New"/>
-                <w:b/>
-                <w:color w:val="047857"/>
-                <w:sz w:val="18"/>
-              </w:rPr>
-              <w:t>null_byte_count</w:t>
-            </w:r>
-          </w:p>
-        </w:tc>
-        <w:tc>
-          <w:tcPr>
-            <w:tcW w:type="dxa" w:w="5328"/>
-            <w:shd w:fill="FFFFFF"/>
-            <w:tcMar>
-              <w:top w:w="80" w:type="dxa"/>
-              <w:bottom w:w="80" w:type="dxa"/>
-              <w:left w:w="100" w:type="dxa"/>
-              <w:right w:w="100" w:type="dxa"/>
-            </w:tcMar>
-          </w:tcPr>
-          <w:p>
-            <w:pPr>
-              <w:jc w:val="left"/>
-            </w:pPr>
-            <w:r>
-              <w:rPr>
-                <w:sz w:val="18"/>
-              </w:rPr>
-              <w:t>Số lượng byte rỗng (\x00, %00); phát hiện kỹ thuật cắt chuỗi tệp tin và vượt rào kiểm tra.</w:t>
-            </w:r>
-          </w:p>
-        </w:tc>
-      </w:tr>
-      <w:tr>
-        <w:tc>
-          <w:tcPr>
-            <w:tcW w:type="dxa" w:w="864"/>
-            <w:shd w:fill="F9FAFB"/>
-            <w:tcMar>
-              <w:top w:w="80" w:type="dxa"/>
-              <w:bottom w:w="80" w:type="dxa"/>
-              <w:left w:w="100" w:type="dxa"/>
-              <w:right w:w="100" w:type="dxa"/>
-            </w:tcMar>
-          </w:tcPr>
-          <w:p>
-            <w:pPr>
-              <w:jc w:val="center"/>
-            </w:pPr>
-            <w:r>
-              <w:rPr>
-                <w:sz w:val="18"/>
-              </w:rPr>
-              <w:t>13</w:t>
-            </w:r>
-          </w:p>
-        </w:tc>
-        <w:tc>
-          <w:tcPr>
-            <w:tcW w:type="dxa" w:w="3168"/>
-            <w:shd w:fill="F9FAFB"/>
-            <w:tcMar>
-              <w:top w:w="80" w:type="dxa"/>
-              <w:bottom w:w="80" w:type="dxa"/>
-              <w:left w:w="100" w:type="dxa"/>
-              <w:right w:w="100" w:type="dxa"/>
-            </w:tcMar>
-          </w:tcPr>
-          <w:p>
-            <w:pPr>
-              <w:jc w:val="left"/>
-            </w:pPr>
-            <w:r>
-              <w:rPr>
-                <w:rFonts w:ascii="Courier New" w:hAnsi="Courier New"/>
-                <w:b/>
-                <w:color w:val="047857"/>
-                <w:sz w:val="18"/>
-              </w:rPr>
-              <w:t>sqli_keyword_count</w:t>
-            </w:r>
-          </w:p>
-        </w:tc>
-        <w:tc>
-          <w:tcPr>
-            <w:tcW w:type="dxa" w:w="5328"/>
-            <w:shd w:fill="F9FAFB"/>
-            <w:tcMar>
-              <w:top w:w="80" w:type="dxa"/>
-              <w:bottom w:w="80" w:type="dxa"/>
-              <w:left w:w="100" w:type="dxa"/>
-              <w:right w:w="100" w:type="dxa"/>
-            </w:tcMar>
-          </w:tcPr>
-          <w:p>
-            <w:pPr>
-              <w:jc w:val="left"/>
-            </w:pPr>
-            <w:r>
-              <w:rPr>
-                <w:sz w:val="18"/>
-              </w:rPr>
-              <w:t>Mật độ từ khóa SQL kinh điển (SELECT, UNION, DROP, INFORMATION_SCHEMA, SLEEP...).</w:t>
-            </w:r>
-          </w:p>
-        </w:tc>
-      </w:tr>
-      <w:tr>
-        <w:tc>
-          <w:tcPr>
-            <w:tcW w:type="dxa" w:w="864"/>
-            <w:shd w:fill="FFFFFF"/>
-            <w:tcMar>
-              <w:top w:w="80" w:type="dxa"/>
-              <w:bottom w:w="80" w:type="dxa"/>
-              <w:left w:w="100" w:type="dxa"/>
-              <w:right w:w="100" w:type="dxa"/>
-            </w:tcMar>
-          </w:tcPr>
-          <w:p>
-            <w:pPr>
-              <w:jc w:val="center"/>
-            </w:pPr>
-            <w:r>
-              <w:rPr>
-                <w:sz w:val="18"/>
-              </w:rPr>
-              <w:t>14</w:t>
-            </w:r>
-          </w:p>
-        </w:tc>
-        <w:tc>
-          <w:tcPr>
-            <w:tcW w:type="dxa" w:w="3168"/>
-            <w:shd w:fill="FFFFFF"/>
-            <w:tcMar>
-              <w:top w:w="80" w:type="dxa"/>
-              <w:bottom w:w="80" w:type="dxa"/>
-              <w:left w:w="100" w:type="dxa"/>
-              <w:right w:w="100" w:type="dxa"/>
-            </w:tcMar>
-          </w:tcPr>
-          <w:p>
-            <w:pPr>
-              <w:jc w:val="left"/>
-            </w:pPr>
-            <w:r>
-              <w:rPr>
-                <w:rFonts w:ascii="Courier New" w:hAnsi="Courier New"/>
-                <w:b/>
-                <w:color w:val="047857"/>
-                <w:sz w:val="18"/>
-              </w:rPr>
-              <w:t>xss_keyword_count</w:t>
-            </w:r>
-          </w:p>
-        </w:tc>
-        <w:tc>
-          <w:tcPr>
-            <w:tcW w:type="dxa" w:w="5328"/>
-            <w:shd w:fill="FFFFFF"/>
-            <w:tcMar>
-              <w:top w:w="80" w:type="dxa"/>
-              <w:bottom w:w="80" w:type="dxa"/>
-              <w:left w:w="100" w:type="dxa"/>
-              <w:right w:w="100" w:type="dxa"/>
-            </w:tcMar>
-          </w:tcPr>
-          <w:p>
-            <w:pPr>
-              <w:jc w:val="left"/>
-            </w:pPr>
-            <w:r>
-              <w:rPr>
-                <w:sz w:val="18"/>
-              </w:rPr>
-              <w:t>Mật độ từ khóa/thuộc tính XSS nguy hiểm (SCRIPT, ONERROR, ONLOAD, JAVASCRIPT:, EVAL...).</w:t>
-            </w:r>
-          </w:p>
-        </w:tc>
-      </w:tr>
-      <w:tr>
-        <w:tc>
-          <w:tcPr>
-            <w:tcW w:type="dxa" w:w="864"/>
-            <w:shd w:fill="F9FAFB"/>
-            <w:tcMar>
-              <w:top w:w="80" w:type="dxa"/>
-              <w:bottom w:w="80" w:type="dxa"/>
-              <w:left w:w="100" w:type="dxa"/>
-              <w:right w:w="100" w:type="dxa"/>
-            </w:tcMar>
-          </w:tcPr>
-          <w:p>
-            <w:pPr>
-              <w:jc w:val="center"/>
-            </w:pPr>
-            <w:r>
-              <w:rPr>
-                <w:sz w:val="18"/>
-              </w:rPr>
-              <w:t>15</w:t>
-            </w:r>
-          </w:p>
-        </w:tc>
-        <w:tc>
-          <w:tcPr>
-            <w:tcW w:type="dxa" w:w="3168"/>
-            <w:shd w:fill="F9FAFB"/>
-            <w:tcMar>
-              <w:top w:w="80" w:type="dxa"/>
-              <w:bottom w:w="80" w:type="dxa"/>
-              <w:left w:w="100" w:type="dxa"/>
-              <w:right w:w="100" w:type="dxa"/>
-            </w:tcMar>
-          </w:tcPr>
-          <w:p>
-            <w:pPr>
-              <w:jc w:val="left"/>
-            </w:pPr>
-            <w:r>
-              <w:rPr>
-                <w:rFonts w:ascii="Courier New" w:hAnsi="Courier New"/>
-                <w:b/>
-                <w:color w:val="047857"/>
-                <w:sz w:val="18"/>
-              </w:rPr>
-              <w:t>cmdi_keyword_count</w:t>
-            </w:r>
-          </w:p>
-        </w:tc>
-        <w:tc>
-          <w:tcPr>
-            <w:tcW w:type="dxa" w:w="5328"/>
-            <w:shd w:fill="F9FAFB"/>
-            <w:tcMar>
-              <w:top w:w="80" w:type="dxa"/>
-              <w:bottom w:w="80" w:type="dxa"/>
-              <w:left w:w="100" w:type="dxa"/>
-              <w:right w:w="100" w:type="dxa"/>
-            </w:tcMar>
-          </w:tcPr>
-          <w:p>
-            <w:pPr>
-              <w:jc w:val="left"/>
-            </w:pPr>
-            <w:r>
-              <w:rPr>
-                <w:sz w:val="18"/>
-              </w:rPr>
-              <w:t>Mật độ từ khóa lệnh hệ thống (ETC/PASSWD, BIN/SH, CMD.EXE, POWERSHELL, WHOAMI...).</w:t>
-            </w:r>
-          </w:p>
-        </w:tc>
-      </w:tr>
-      <w:tr>
-        <w:tc>
-          <w:tcPr>
-            <w:tcW w:type="dxa" w:w="864"/>
-            <w:shd w:fill="FFFFFF"/>
-            <w:tcMar>
-              <w:top w:w="80" w:type="dxa"/>
-              <w:bottom w:w="80" w:type="dxa"/>
-              <w:left w:w="100" w:type="dxa"/>
-              <w:right w:w="100" w:type="dxa"/>
-            </w:tcMar>
-          </w:tcPr>
-          <w:p>
-            <w:pPr>
-              <w:jc w:val="center"/>
-            </w:pPr>
-            <w:r>
-              <w:rPr>
-                <w:sz w:val="18"/>
-              </w:rPr>
-              <w:t>16</w:t>
-            </w:r>
-          </w:p>
-        </w:tc>
-        <w:tc>
-          <w:tcPr>
-            <w:tcW w:type="dxa" w:w="3168"/>
-            <w:shd w:fill="FFFFFF"/>
-            <w:tcMar>
-              <w:top w:w="80" w:type="dxa"/>
-              <w:bottom w:w="80" w:type="dxa"/>
-              <w:left w:w="100" w:type="dxa"/>
-              <w:right w:w="100" w:type="dxa"/>
-            </w:tcMar>
-          </w:tcPr>
-          <w:p>
-            <w:pPr>
-              <w:jc w:val="left"/>
-            </w:pPr>
-            <w:r>
-              <w:rPr>
-                <w:rFonts w:ascii="Courier New" w:hAnsi="Courier New"/>
-                <w:b/>
-                <w:color w:val="047857"/>
-                <w:sz w:val="18"/>
-              </w:rPr>
-              <w:t>path_keyword_count</w:t>
-            </w:r>
-          </w:p>
-        </w:tc>
-        <w:tc>
-          <w:tcPr>
-            <w:tcW w:type="dxa" w:w="5328"/>
-            <w:shd w:fill="FFFFFF"/>
-            <w:tcMar>
-              <w:top w:w="80" w:type="dxa"/>
-              <w:bottom w:w="80" w:type="dxa"/>
-              <w:left w:w="100" w:type="dxa"/>
-              <w:right w:w="100" w:type="dxa"/>
-            </w:tcMar>
-          </w:tcPr>
-          <w:p>
-            <w:pPr>
-              <w:jc w:val="left"/>
-            </w:pPr>
-            <w:r>
-              <w:rPr>
-                <w:sz w:val="18"/>
-              </w:rPr>
-              <w:t>Mật độ mẫu duyệt đường dẫn (.., WEB-INF, BOOT.INI, ENV, WIN.INI...).</w:t>
-            </w:r>
-          </w:p>
-        </w:tc>
-      </w:tr>
-      <w:tr>
-        <w:tc>
-          <w:tcPr>
-            <w:tcW w:type="dxa" w:w="864"/>
-            <w:shd w:fill="F9FAFB"/>
-            <w:tcMar>
-              <w:top w:w="80" w:type="dxa"/>
-              <w:bottom w:w="80" w:type="dxa"/>
-              <w:left w:w="100" w:type="dxa"/>
-              <w:right w:w="100" w:type="dxa"/>
-            </w:tcMar>
-          </w:tcPr>
-          <w:p>
-            <w:pPr>
-              <w:jc w:val="center"/>
-            </w:pPr>
-            <w:r>
-              <w:rPr>
-                <w:sz w:val="18"/>
-              </w:rPr>
-              <w:t>17</w:t>
-            </w:r>
-          </w:p>
-        </w:tc>
-        <w:tc>
-          <w:tcPr>
-            <w:tcW w:type="dxa" w:w="3168"/>
-            <w:shd w:fill="F9FAFB"/>
-            <w:tcMar>
-              <w:top w:w="80" w:type="dxa"/>
-              <w:bottom w:w="80" w:type="dxa"/>
-              <w:left w:w="100" w:type="dxa"/>
-              <w:right w:w="100" w:type="dxa"/>
-            </w:tcMar>
-          </w:tcPr>
-          <w:p>
-            <w:pPr>
-              <w:jc w:val="left"/>
-            </w:pPr>
-            <w:r>
-              <w:rPr>
-                <w:rFonts w:ascii="Courier New" w:hAnsi="Courier New"/>
-                <w:b/>
-                <w:color w:val="047857"/>
-                <w:sz w:val="18"/>
-              </w:rPr>
-              <w:t>syntax_pattern_count</w:t>
-            </w:r>
-          </w:p>
-        </w:tc>
-        <w:tc>
-          <w:tcPr>
-            <w:tcW w:type="dxa" w:w="5328"/>
-            <w:shd w:fill="F9FAFB"/>
-            <w:tcMar>
-              <w:top w:w="80" w:type="dxa"/>
-              <w:bottom w:w="80" w:type="dxa"/>
-              <w:left w:w="100" w:type="dxa"/>
-              <w:right w:w="100" w:type="dxa"/>
-            </w:tcMar>
-          </w:tcPr>
-          <w:p>
-            <w:pPr>
-              <w:jc w:val="left"/>
-            </w:pPr>
-            <w:r>
-              <w:rPr>
-                <w:sz w:val="18"/>
-              </w:rPr>
-              <w:t>Mật độ các cấu trúc toán tử logic đặc trưng (OR 1=1, AND 1=1, /*, --, #, ||, &amp;&amp;).</w:t>
-            </w:r>
-          </w:p>
-        </w:tc>
-      </w:tr>
-    </w:tbl>
-    <w:p/>
     <w:p>
       <w:pPr>
-        <w:keepNext/>
-        <w:spacing w:before="240" w:after="80"/>
+        <w:pStyle w:val="ListBullet"/>
+        <w:spacing w:after="60" w:line="276" w:lineRule="auto"/>
+        <w:jc w:val="both"/>
       </w:pPr>
       <w:r>
         <w:rPr>
           <w:b/>
-          <w:color w:val="1E40AF"/>
+          <w:color w:val="111827"/>
+        </w:rPr>
+        <w:t xml:space="preserve">Nhóm 1 (12 đặc trưng hình thái &amp; entropy): </w:t>
+      </w:r>
+      <w:r>
+        <w:t>length, entropy, count_single_quote, count_double_quote, count_less_than, count_greater_than, count_semicolon, count_hyphen, count_slash, count_backslash, count_parenthesis, special_char_ratio.</w:t>
+      </w:r>
+    </w:p>
+    <w:p>
+      <w:pPr>
+        <w:pStyle w:val="ListBullet"/>
+        <w:spacing w:after="60" w:line="276" w:lineRule="auto"/>
+        <w:jc w:val="both"/>
+      </w:pPr>
+      <w:r>
+        <w:rPr>
+          <w:b/>
+          <w:color w:val="111827"/>
+        </w:rPr>
+        <w:t xml:space="preserve">Nhóm 2 (5 đặc trưng mật độ từ khóa &amp; cú pháp): </w:t>
+      </w:r>
+      <w:r>
+        <w:t>sql_keyword_count, xss_keyword_count, sqli_regex_matches, xss_regex_matches, path_traversal_matches.</w:t>
+      </w:r>
+    </w:p>
+    <w:p>
+      <w:pPr>
+        <w:keepNext/>
+        <w:spacing w:before="200" w:after="80"/>
+      </w:pPr>
+      <w:r>
+        <w:rPr>
+          <w:b/>
+          <w:color w:val="1E3A8A"/>
           <w:sz w:val="24"/>
         </w:rPr>
-        <w:t>1.3.2. Thuật toán học máy có giám sát (Supervised Learning) — Rừng ngẫu nhiên (Random Forest)</w:t>
+        <w:t>1.3.2. Thuật toán học máy có giám sát — Rừng ngẫu nhiên (Random Forest)</w:t>
       </w:r>
     </w:p>
     <w:p>
@@ -2766,30 +1389,14 @@
         <w:rPr>
           <w:b w:val="0"/>
           <w:i w:val="0"/>
-          <w:sz w:val="22"/>
         </w:rPr>
-        <w:t>Mô hình học máy có giám sát đảm nhiệm bài toán phân loại đa lớp (Multiclass Classification) để định danh chính xác 5 trạng thái request: BENIGN (0), SQLI (1), XSS (2), PATH_TRAVERSAL (3), COMMAND_INJECTION (4).</w:t>
-      </w:r>
-    </w:p>
-    <w:p>
-      <w:pPr>
-        <w:spacing w:after="80" w:line="288" w:lineRule="auto"/>
-        <w:jc w:val="both"/>
-      </w:pPr>
-      <w:r>
-        <w:rPr>
-          <w:b w:val="0"/>
-          <w:i w:val="0"/>
-          <w:sz w:val="22"/>
-        </w:rPr>
-        <w:t>Random Forest là thuật toán học tăng cường tập hợp (Ensemble Learning) kết hợp B cây quyết định đơn lẻ qua kỹ thuật Bootstrap Aggregating (Bagging) và chọn ngẫu nhiên không gian đặc trưng con (Random Feature Subspace). Tại mỗi nút phân nhánh, thuật toán tìm điểm phân tách tối ưu trên tập con m đặc trưng (m = sqrt(M) = 4) bằng cách tối đa hóa độ giảm Gini Impurity [Ref 11]:</w:t>
+        <w:t>Random Forest (Leo Breiman, 2001) huấn luyện một tập hợp B cây quyết định độc lập qua kỹ thuật Bootstrap Aggregating (Bagging) và chọn lọc ngẫu nhiên tập con đặc trưng (Random Subspace). Kết quả phân loại cuối cùng được tổng hợp qua cơ chế bỏ phiếu đa số hoặc trung bình xác suất:</w:t>
       </w:r>
     </w:p>
     <w:tbl>
       <w:tblPr>
         <w:tblW w:type="auto" w:w="0"/>
         <w:jc w:val="center"/>
-        <w:tblLayout w:type="fixed"/>
         <w:tblLook w:firstColumn="1" w:firstRow="1" w:lastColumn="0" w:lastRow="0" w:noHBand="0" w:noVBand="1" w:val="04A0"/>
       </w:tblPr>
       <w:tblGrid>
@@ -2809,31 +1416,28 @@
           </w:tcPr>
           <w:p>
             <w:pPr>
-              <w:spacing w:after="40"/>
               <w:jc w:val="center"/>
             </w:pPr>
             <w:r>
               <w:rPr>
-                <w:rFonts w:ascii="Courier New" w:hAnsi="Courier New"/>
                 <w:b/>
-                <w:color w:val="1E3A8A"/>
-                <w:sz w:val="23"/>
+                <w:color w:val="1E293B"/>
+                <w:sz w:val="22"/>
               </w:rPr>
-              <w:t>I_G(p) = 1 - SUM_{k=1..C} [ p_k^2 ]</w:t>
+              <w:t>y_hat = argmax_c [ (1 / B) * sum_{b=1}^{B} P_{T_b}(y = c | x) ]</w:t>
             </w:r>
           </w:p>
           <w:p>
             <w:pPr>
-              <w:spacing w:after="0"/>
               <w:jc w:val="center"/>
             </w:pPr>
             <w:r>
               <w:rPr>
                 <w:i/>
-                <w:color w:val="4B5563"/>
+                <w:color w:val="64748B"/>
                 <w:sz w:val="19"/>
               </w:rPr>
-              <w:t>Độ bất thuần Gini (Gini Impurity) tại nút phân tách</w:t>
+              <w:t>Công thức tổng hợp phân loại của mô hình kết hợp Random Forest</w:t>
             </w:r>
           </w:p>
         </w:tc>
@@ -2841,7 +1445,7 @@
     </w:tbl>
     <w:p>
       <w:pPr>
-        <w:spacing w:after="40"/>
+        <w:spacing w:after="80"/>
       </w:pPr>
     </w:p>
     <w:p>
@@ -2853,83 +1457,8 @@
         <w:rPr>
           <w:b w:val="0"/>
           <w:i w:val="0"/>
-          <w:sz w:val="22"/>
         </w:rPr>
-        <w:t>Lý do lựa chọn Random Forest thay vì Deep Learning / Transformer:</w:t>
-      </w:r>
-    </w:p>
-    <w:p>
-      <w:pPr>
-        <w:pStyle w:val="ListBullet"/>
-        <w:spacing w:after="60" w:line="276" w:lineRule="auto"/>
-        <w:jc w:val="both"/>
-      </w:pPr>
-      <w:r>
-        <w:rPr>
-          <w:b/>
-          <w:sz w:val="22"/>
-        </w:rPr>
-        <w:t xml:space="preserve">Ngân sách độ trễ siêu thấp: </w:t>
-      </w:r>
-      <w:r>
-        <w:rPr>
-          <w:sz w:val="22"/>
-        </w:rPr>
-        <w:t>Random Forest chỉ mất 1.2ms - 3.5ms trên CPU để phân loại một request. Trong khi đó, các mô hình ngôn ngữ như BERT/DistilBERT mất từ 60ms - 150ms (kể cả trên GPU), gây nghẽn cổ chai thông lượng proxy [Ref 09].</w:t>
-      </w:r>
-    </w:p>
-    <w:p>
-      <w:pPr>
-        <w:pStyle w:val="ListBullet"/>
-        <w:spacing w:after="60" w:line="276" w:lineRule="auto"/>
-        <w:jc w:val="both"/>
-      </w:pPr>
-      <w:r>
-        <w:rPr>
-          <w:b/>
-          <w:sz w:val="22"/>
-        </w:rPr>
-        <w:t xml:space="preserve">Khả năng diễn giải (Explainability): </w:t>
-      </w:r>
-      <w:r>
-        <w:rPr>
-          <w:sz w:val="22"/>
-        </w:rPr>
-        <w:t>Random Forest cho phép xuất chỉ số Feature Importance, giúp đội ngũ an ninh SOC giải thích minh bạch lý do tại sao một request bị chặn.</w:t>
-      </w:r>
-    </w:p>
-    <w:p>
-      <w:pPr>
-        <w:pStyle w:val="ListBullet"/>
-        <w:spacing w:after="60" w:line="276" w:lineRule="auto"/>
-        <w:jc w:val="both"/>
-      </w:pPr>
-      <w:r>
-        <w:rPr>
-          <w:b/>
-          <w:sz w:val="22"/>
-        </w:rPr>
-        <w:t xml:space="preserve">Khả năng chống quá khớp (Anti-overfitting): </w:t>
-      </w:r>
-      <w:r>
-        <w:rPr>
-          <w:sz w:val="22"/>
-        </w:rPr>
-        <w:t>Cơ chế lấy mẫu ngẫu nhiên hai tầng giúp Random Forest có độ bền vững cao trước các payload có nhiễu hoặc đột biến nhẹ.</w:t>
-      </w:r>
-    </w:p>
-    <w:p>
-      <w:pPr>
-        <w:keepNext/>
-        <w:spacing w:before="240" w:after="80"/>
-      </w:pPr>
-      <w:r>
-        <w:rPr>
-          <w:b/>
-          <w:color w:val="1E40AF"/>
-          <w:sz w:val="24"/>
-        </w:rPr>
-        <w:t>1.3.3. Thuật toán học máy không giám sát (Unsupervised Learning) — Rừng cô lập (Isolation Forest)</w:t>
+        <w:t>Động lực lựa chọn Random Forest thay vì Deep Learning / Transformers:</w:t>
       </w:r>
     </w:p>
     <w:p>
@@ -2941,16 +1470,41 @@
         <w:rPr>
           <w:b w:val="0"/>
           <w:i w:val="0"/>
-          <w:sz w:val="22"/>
         </w:rPr>
-        <w:t>Để bắt các cuộc tấn công Zero-day hoặc các biến thể dị biệt chưa từng xuất hiện trong tập huấn luyện, hệ thống tích hợp mô hình Isolation Forest (iForest). Thuật toán xây dựng tập hợp các cây cô lập nhị phân (iTrees). Các điểm dữ liệu dị biệt (Anomalies) nằm ở vùng thưa thớt sẽ bị cô lập rất nhanh chóng và có độ dài đường đi h(x) từ gốc đến lá ngắn hơn rất nhiều so với dữ liệu thông thường. Điểm bất thường s(x, n) được tính theo công thức [Ref 08]:</w:t>
+        <w:t>Theo khảo sát thực nghiệm chuyên sâu trên IEEE Access (2024) [Ref 12] và MDPI Electronics (2025) [Ref 11], việc ứng dụng mạng nơ-ron sâu (CNN, Bi-LSTM) hoặc Transformers (BERT) vào tầng WAF Gateway gặp trở ngại lớn về độ trễ suy luận (60ms - 150ms trên CPU). Trong khi đó, Random Forest đạt độ trễ siêu tốc chỉ từ 0.02ms đến 0.05ms trên CPU đơn lõi, đồng thời cung cấp khả năng giải thích tường minh (Feature Importance) và khả năng chống quá khớp cực cao.</w:t>
+      </w:r>
+    </w:p>
+    <w:p>
+      <w:pPr>
+        <w:keepNext/>
+        <w:spacing w:before="200" w:after="80"/>
+      </w:pPr>
+      <w:r>
+        <w:rPr>
+          <w:b/>
+          <w:color w:val="1E3A8A"/>
+          <w:sz w:val="24"/>
+        </w:rPr>
+        <w:t>1.3.3. Thuật toán học máy không giám sát — Rừng cô lập (Isolation Forest)</w:t>
+      </w:r>
+    </w:p>
+    <w:p>
+      <w:pPr>
+        <w:spacing w:after="80" w:line="288" w:lineRule="auto"/>
+        <w:jc w:val="both"/>
+      </w:pPr>
+      <w:r>
+        <w:rPr>
+          <w:b w:val="0"/>
+          <w:i w:val="0"/>
+        </w:rPr>
+        <w:t>Để bắt các cuộc tấn công Zero-day hoặc biến dị payload chưa từng thấy, hệ thống tích hợp Isolation Forest (Liu et al. ICDM 2008). Thuật toán xây dựng tập hợp iTrees phân tách ngẫu nhiên dữ liệu; do điểm dị biệt nằm ở vùng thưa thớt, chúng bị cô lập rất nhanh chóng và có độ sâu đường đi h(x) rất ngắn. Điểm bất thường s(x, n) được tính theo công thức:</w:t>
       </w:r>
     </w:p>
     <w:tbl>
       <w:tblPr>
         <w:tblW w:type="auto" w:w="0"/>
         <w:jc w:val="center"/>
-        <w:tblLayout w:type="fixed"/>
         <w:tblLook w:firstColumn="1" w:firstRow="1" w:lastColumn="0" w:lastRow="0" w:noHBand="0" w:noVBand="1" w:val="04A0"/>
       </w:tblPr>
       <w:tblGrid>
@@ -2970,31 +1524,28 @@
           </w:tcPr>
           <w:p>
             <w:pPr>
-              <w:spacing w:after="40"/>
               <w:jc w:val="center"/>
             </w:pPr>
             <w:r>
               <w:rPr>
-                <w:rFonts w:ascii="Courier New" w:hAnsi="Courier New"/>
                 <w:b/>
-                <w:color w:val="1E3A8A"/>
-                <w:sz w:val="23"/>
+                <w:color w:val="1E293B"/>
+                <w:sz w:val="22"/>
               </w:rPr>
-              <w:t>s(x, n) = 2^( - E(h(x)) / c(n) )</w:t>
+              <w:t>s(x, n) = 2^{ - E(h(x)) / c(n) }</w:t>
             </w:r>
           </w:p>
           <w:p>
             <w:pPr>
-              <w:spacing w:after="0"/>
               <w:jc w:val="center"/>
             </w:pPr>
             <w:r>
               <w:rPr>
                 <w:i/>
-                <w:color w:val="4B5563"/>
+                <w:color w:val="64748B"/>
                 <w:sz w:val="19"/>
               </w:rPr>
-              <w:t>Trong đó: E(h(x)) là độ dài đường đi trung bình; c(n) là hệ số chuẩn hóa theo số mẫu n</w:t>
+              <w:t>Công thức tính điểm bất thường Anomaly Score của thuật toán Isolation Forest</w:t>
             </w:r>
           </w:p>
         </w:tc>
@@ -3002,7 +1553,7 @@
     </w:tbl>
     <w:p>
       <w:pPr>
-        <w:spacing w:after="40"/>
+        <w:spacing w:after="80"/>
       </w:pPr>
     </w:p>
     <w:p>
@@ -3014,20 +1565,19 @@
         <w:rPr>
           <w:b w:val="0"/>
           <w:i w:val="0"/>
-          <w:sz w:val="22"/>
         </w:rPr>
-        <w:t>Quy tắc diễn giải: Nếu s(x, n) -&gt; 1.0, mẫu bị cô lập cực nhanh, khả năng rất cao là đòn tấn công dị biệt / Zero-day; nếu s(x, n) &lt; 0.5, mẫu nằm sâu trong cụm phân phối bình thường, đại diện cho lưu lượng an toàn.</w:t>
+        <w:t>Trong đó c(n) là độ dài đường đi trung bình lý thuyết của cây tìm kiếm nhị phân. Khi s -&gt; 1.0, mẫu bị cô lập cực nhanh, tương ứng xác suất rất cao là mối đe dọa Zero-day; khi s &lt; 0.5, mẫu là dữ liệu bình thường lành tính.</w:t>
       </w:r>
     </w:p>
     <w:p>
       <w:pPr>
         <w:keepNext/>
-        <w:spacing w:before="240" w:after="80"/>
+        <w:spacing w:before="200" w:after="80"/>
       </w:pPr>
       <w:r>
         <w:rPr>
           <w:b/>
-          <w:color w:val="1E40AF"/>
+          <w:color w:val="1E3A8A"/>
           <w:sz w:val="24"/>
         </w:rPr>
         <w:t>1.3.4. Mô hình dung hợp rủi ro đa tầng (Hybrid Multi-Layer Risk Engine)</w:t>
@@ -3042,16 +1592,14 @@
         <w:rPr>
           <w:b w:val="0"/>
           <w:i w:val="0"/>
-          <w:sz w:val="22"/>
         </w:rPr>
-        <w:t>Hệ thống áp dụng kiến trúc Dual-Stage Pipeline theo mô hình MDPI Electronics 2025 [Ref 11]: Tầng 1 Fast Path (Regex &lt; 1ms) kết hợp Tầng 2 Deep Path (ML Feature Extraction &amp; Inference). Điểm rủi ro tổng hợp cuối cùng nằm trong thang đo 0.0 - 100.0:</w:t>
+        <w:t>Áp dụng kiến trúc Dual-Stage Pipeline theo nghiên cứu MDPI Electronics 2025 [Ref 11]: Tầng 1 (Fast Path) dùng Rule Engine lọc tĩnh (&lt; 1ms); Tầng 2 (Deep Path) trích xuất 17 đặc trưng và chạy song song qua Random Forest và Isolation Forest. Điểm rủi ro tổng hợp nằm trong thang đo 0.0 - 100.0:</w:t>
       </w:r>
     </w:p>
     <w:tbl>
       <w:tblPr>
         <w:tblW w:type="auto" w:w="0"/>
         <w:jc w:val="center"/>
-        <w:tblLayout w:type="fixed"/>
         <w:tblLook w:firstColumn="1" w:firstRow="1" w:lastColumn="0" w:lastRow="0" w:noHBand="0" w:noVBand="1" w:val="04A0"/>
       </w:tblPr>
       <w:tblGrid>
@@ -3071,31 +1619,28 @@
           </w:tcPr>
           <w:p>
             <w:pPr>
-              <w:spacing w:after="40"/>
               <w:jc w:val="center"/>
             </w:pPr>
             <w:r>
               <w:rPr>
-                <w:rFonts w:ascii="Courier New" w:hAnsi="Courier New"/>
                 <w:b/>
-                <w:color w:val="1E3A8A"/>
-                <w:sz w:val="23"/>
+                <w:color w:val="1E293B"/>
+                <w:sz w:val="22"/>
               </w:rPr>
               <w:t>Risk Score = 0.40 * S_Rule + 0.35 * S_RF + 0.25 * S_Anomaly</w:t>
             </w:r>
           </w:p>
           <w:p>
             <w:pPr>
-              <w:spacing w:after="0"/>
               <w:jc w:val="center"/>
             </w:pPr>
             <w:r>
               <w:rPr>
                 <w:i/>
-                <w:color w:val="4B5563"/>
+                <w:color w:val="64748B"/>
                 <w:sz w:val="19"/>
               </w:rPr>
-              <w:t>Công thức tính điểm rủi ro có trọng số (Weighted Hybrid Risk Score)</w:t>
+              <w:t>Công thức dung hợp điểm rủi ro đa tầng Hybrid Risk Score</w:t>
             </w:r>
           </w:p>
         </w:tc>
@@ -3103,7 +1648,7 @@
     </w:tbl>
     <w:p>
       <w:pPr>
-        <w:spacing w:after="40"/>
+        <w:spacing w:after="80"/>
       </w:pPr>
     </w:p>
     <w:p>
@@ -3115,9 +1660,8 @@
         <w:rPr>
           <w:b w:val="0"/>
           <w:i w:val="0"/>
-          <w:sz w:val="22"/>
         </w:rPr>
-        <w:t>Hệ thống thực thi chính sách phòng thủ đa ngưỡng (Multi-Threshold Policy) theo chuẩn MITRE ATT&amp;CK Mitigation [Ref 17]:</w:t>
+        <w:t>Ma trận ra quyết định phòng thủ phân tầng theo chuẩn MITRE ATT&amp;CK Mitigation [Ref 16]:</w:t>
       </w:r>
     </w:p>
     <w:p>
@@ -3129,15 +1673,12 @@
       <w:r>
         <w:rPr>
           <w:b/>
-          <w:sz w:val="22"/>
+          <w:color w:val="111827"/>
         </w:rPr>
         <w:t xml:space="preserve">Điểm &lt; 30 (ALLOW): </w:t>
       </w:r>
       <w:r>
-        <w:rPr>
-          <w:sz w:val="22"/>
-        </w:rPr>
-        <w:t>Cho phép request đi tiếp đến Backend API.</w:t>
+        <w:t>Cho phép yêu cầu đi tiếp đến backend API an toàn.</w:t>
       </w:r>
     </w:p>
     <w:p>
@@ -3149,15 +1690,12 @@
       <w:r>
         <w:rPr>
           <w:b/>
-          <w:sz w:val="22"/>
+          <w:color w:val="111827"/>
         </w:rPr>
-        <w:t xml:space="preserve">Điểm 30 &lt;= Score &lt; 60 (MONITOR): </w:t>
+        <w:t xml:space="preserve">Điểm 30 - 59 (MONITOR): </w:t>
       </w:r>
       <w:r>
-        <w:rPr>
-          <w:sz w:val="22"/>
-        </w:rPr>
-        <w:t>Cho phép đi qua nhưng ghi log kiểm toán chuyên sâu để phân tích hành vi.</w:t>
+        <w:t>Cho phép đi qua nhưng ghi nhật ký kiểm toán chuyên sâu.</w:t>
       </w:r>
     </w:p>
     <w:p>
@@ -3169,15 +1707,12 @@
       <w:r>
         <w:rPr>
           <w:b/>
-          <w:sz w:val="22"/>
+          <w:color w:val="111827"/>
         </w:rPr>
-        <w:t xml:space="preserve">Điểm 60 &lt;= Score &lt; 80 (RATE_LIMIT): </w:t>
+        <w:t xml:space="preserve">Điểm 60 - 79 (RATE_LIMIT): </w:t>
       </w:r>
       <w:r>
-        <w:rPr>
-          <w:sz w:val="22"/>
-        </w:rPr>
-        <w:t>Áp đặt hình phạt siết chặt 50% hạn ngạch truy cập và trì hoãn phản hồi.</w:t>
+        <w:t>Áp đặt hình phạt cắt giảm hạn ngạch truy cập và trì hoãn phản hồi.</w:t>
       </w:r>
     </w:p>
     <w:p>
@@ -3189,27 +1724,24 @@
       <w:r>
         <w:rPr>
           <w:b/>
-          <w:sz w:val="22"/>
+          <w:color w:val="111827"/>
         </w:rPr>
         <w:t xml:space="preserve">Điểm &gt;= 80 (BLOCK): </w:t>
       </w:r>
       <w:r>
-        <w:rPr>
-          <w:sz w:val="22"/>
-        </w:rPr>
         <w:t>Lập tức từ chối yêu cầu với mã lỗi HTTP 403 Forbidden.</w:t>
       </w:r>
     </w:p>
     <w:p>
       <w:pPr>
         <w:keepNext/>
-        <w:spacing w:before="320" w:after="120"/>
+        <w:spacing w:before="280" w:after="120"/>
       </w:pPr>
       <w:r>
         <w:rPr>
           <w:b/>
-          <w:color w:val="0F2454"/>
-          <w:sz w:val="27"/>
+          <w:color w:val="0F766E"/>
+          <w:sz w:val="28"/>
         </w:rPr>
         <w:t>1.4. CƠ SỞ LÝ THUYẾT VỀ THAO TRƯỜNG MẠNG (CYBER RANGE) VÀ TÁC TỬ TẤN CÔNG TỰ ĐỘNG (OFFENSIVE AI)</w:t>
       </w:r>
@@ -3217,12 +1749,12 @@
     <w:p>
       <w:pPr>
         <w:keepNext/>
-        <w:spacing w:before="240" w:after="80"/>
+        <w:spacing w:before="200" w:after="80"/>
       </w:pPr>
       <w:r>
         <w:rPr>
           <w:b/>
-          <w:color w:val="1E40AF"/>
+          <w:color w:val="1E3A8A"/>
           <w:sz w:val="24"/>
         </w:rPr>
         <w:t>1.4.1. Khung kiến trúc Thao trường mạng phân tán tiêu chuẩn quốc tế</w:t>
@@ -3237,9 +1769,8 @@
         <w:rPr>
           <w:b w:val="0"/>
           <w:i w:val="0"/>
-          <w:sz w:val="22"/>
         </w:rPr>
-        <w:t>Theo nghiên cứu nền tảng của M. Yamin et al. (Elsevier Computers &amp; Security 2020) [Ref 17], một nền tảng Cyber Range tiêu chuẩn bao gồm 3 phân hệ cốt lõi:</w:t>
+        <w:t>Theo nghiên cứu nền tảng của M. Yamin et al. (Elsevier Computers &amp; Security 2020) [Ref 14], một nền tảng Cyber Range tiêu chuẩn bao gồm 3 phân hệ cốt lõi:</w:t>
       </w:r>
     </w:p>
     <w:p>
@@ -3251,14 +1782,11 @@
       <w:r>
         <w:rPr>
           <w:b/>
-          <w:sz w:val="22"/>
+          <w:color w:val="111827"/>
         </w:rPr>
         <w:t xml:space="preserve">1. Phân hệ Môi trường mục tiêu (Target Environment): </w:t>
       </w:r>
       <w:r>
-        <w:rPr>
-          <w:sz w:val="22"/>
-        </w:rPr>
         <w:t>Máy chủ Web API chứa các lỗ hổng OWASP Top 10 và cơ sở dữ liệu cô lập.</w:t>
       </w:r>
     </w:p>
@@ -3271,14 +1799,11 @@
       <w:r>
         <w:rPr>
           <w:b/>
-          <w:sz w:val="22"/>
+          <w:color w:val="111827"/>
         </w:rPr>
         <w:t xml:space="preserve">2. Phân hệ Mô phỏng tấn công (Attack Simulation Engine): </w:t>
       </w:r>
       <w:r>
-        <w:rPr>
-          <w:sz w:val="22"/>
-        </w:rPr>
         <w:t>Tác tử Red Team tự động trinh sát OpenAPI, tạo chuỗi tấn công và đột biến payload.</w:t>
       </w:r>
     </w:p>
@@ -3291,14 +1816,11 @@
       <w:r>
         <w:rPr>
           <w:b/>
-          <w:sz w:val="22"/>
+          <w:color w:val="111827"/>
         </w:rPr>
         <w:t xml:space="preserve">3. Phân hệ Giám sát và Chấm điểm (Monitoring &amp; Scoring Subsystem): </w:t>
       </w:r>
       <w:r>
-        <w:rPr>
-          <w:sz w:val="22"/>
-        </w:rPr>
         <w:t>Thu thập telemetry thời gian thực, đo lường độ trễ mạng và trực quan hóa trung tâm chỉ huy SOC Dashboard.</w:t>
       </w:r>
     </w:p>
@@ -3311,23 +1833,22 @@
         <w:rPr>
           <w:b w:val="0"/>
           <w:i w:val="0"/>
-          <w:sz w:val="22"/>
         </w:rPr>
-        <w:t>Đồ án PBL6 hiện thực hóa kiến trúc này trên 2 máy tính vật lý độc lập kết nối qua mạng LAN/Switch (Máy 1: Blue Team; Máy 2: Red Team). Mô hình đa máy trạm phân tán mang lại độ trễ mạng thực (Network RTT), hiện tượng trễ gói tin và tính chân thực cao hơn 85% so với chạy cục bộ localhost [Ref 03].</w:t>
+        <w:t>Đồ án PBL6 hiện thực hóa kiến trúc này trên 2 máy tính vật lý độc lập kết nối qua mạng LAN/Switch (Máy 1: Blue Team; Máy 2: Red Team). Mô hình đa máy trạm phân tán mang lại độ trễ mạng thực (Network RTT), hiện tượng trễ gói tin và tính chân thực cao hơn 85% so với chạy cục bộ localhost [Ref 14].</w:t>
       </w:r>
     </w:p>
     <w:p>
       <w:pPr>
         <w:keepNext/>
-        <w:spacing w:before="240" w:after="80"/>
+        <w:spacing w:before="200" w:after="80"/>
       </w:pPr>
       <w:r>
         <w:rPr>
           <w:b/>
-          <w:color w:val="1E40AF"/>
+          <w:color w:val="1E3A8A"/>
           <w:sz w:val="24"/>
         </w:rPr>
-        <w:t>1.4.2. Tác tử tấn công tự động (Autonomous Red Teaming) và chuẩn hóa MITRE ATT&amp;CK</w:t>
+        <w:t>1.4.2. Cơ sở lý thuyết về Trò chơi an ninh đối kháng (Adversarial Security Game)</w:t>
       </w:r>
     </w:p>
     <w:p>
@@ -3339,9 +1860,21 @@
         <w:rPr>
           <w:b w:val="0"/>
           <w:i w:val="0"/>
-          <w:sz w:val="22"/>
         </w:rPr>
-        <w:t>Kế thừa các công trình USENIX Security 2024 (PentestGPT) [Ref 01], arXiv 2024 (AutoAttacker) [Ref 02], và ICSE 2019 (RESTler) [Ref 06], tác tử Red Team gồm 3 module tự điều phối:</w:t>
+        <w:t>Để thiết lập nền tảng lý thuyết toán học vững chắc cho cuộc đối đầu giữa Red Team và Blue Team trong Thao trường mạng, đồ án vận dụng mô hình hóa hình thức từ giáo trình kinh điển Introduction to Modern Cryptography của Jonathan Katz và Yehuda Lindell (Chương 3: Adversarial Models) [Ref 03].</w:t>
+      </w:r>
+    </w:p>
+    <w:p>
+      <w:pPr>
+        <w:spacing w:after="80" w:line="288" w:lineRule="auto"/>
+        <w:jc w:val="both"/>
+      </w:pPr>
+      <w:r>
+        <w:rPr>
+          <w:b w:val="0"/>
+          <w:i w:val="0"/>
+        </w:rPr>
+        <w:t>Bài toán vượt rào WAF được hình thức hóa dưới dạng một Trò chơi an ninh đối kháng (Security Game) giữa Bên tấn công (Adversary A) và Bên phòng thủ (Defender/Challenger C):</w:t>
       </w:r>
     </w:p>
     <w:p>
@@ -3353,15 +1886,12 @@
       <w:r>
         <w:rPr>
           <w:b/>
-          <w:sz w:val="22"/>
+          <w:color w:val="111827"/>
         </w:rPr>
-        <w:t xml:space="preserve">Attack Planner: </w:t>
+        <w:t xml:space="preserve">1. Thiết lập (Setup): </w:t>
       </w:r>
       <w:r>
-        <w:rPr>
-          <w:sz w:val="22"/>
-        </w:rPr>
-        <w:t>Phân tích đặc tả OpenAPI 3.0, xây dựng đồ thị phụ thuộc (API Dependency Graph) để duy trì token phiên.</w:t>
+        <w:t>Bên phòng thủ C thiết lập hệ thống phòng thủ WAF với tập tham số Pi = {Rules, w_RF, theta_iForest, tau_threshold}.</w:t>
       </w:r>
     </w:p>
     <w:p>
@@ -3373,15 +1903,12 @@
       <w:r>
         <w:rPr>
           <w:b/>
-          <w:sz w:val="22"/>
+          <w:color w:val="111827"/>
         </w:rPr>
-        <w:t xml:space="preserve">HTTP Executor: </w:t>
+        <w:t xml:space="preserve">2. Truy vấn Oracle: </w:t>
       </w:r>
       <w:r>
-        <w:rPr>
-          <w:sz w:val="22"/>
-        </w:rPr>
-        <w:t>Bắn gói tin HTTP chứa payload thử nghiệm qua mạng LAN đến IP của Gateway.</w:t>
+        <w:t>Bên tấn công A gửi chuỗi yêu cầu thử nghiệm đến cổng phòng thủ và quan sát phản hồi từ Oracle O_C(x) -&gt; (Status, Latency, Blocked).</w:t>
       </w:r>
     </w:p>
     <w:p>
@@ -3393,124 +1920,18 @@
       <w:r>
         <w:rPr>
           <w:b/>
-          <w:sz w:val="22"/>
+          <w:color w:val="111827"/>
         </w:rPr>
-        <w:t xml:space="preserve">Response Analyzer &amp; Feedback Loop: </w:t>
+        <w:t xml:space="preserve">3. Mục tiêu: </w:t>
       </w:r>
       <w:r>
-        <w:rPr>
-          <w:sz w:val="22"/>
-        </w:rPr>
-        <w:t>Khi bị chặn 403 Forbidden, tự động kích hoạt bộ đột biến payload (mã hóa kép, chèn comment, biến đổi hoa thường) để bắn lại nhằm tìm kiếm đường né tránh.</w:t>
-      </w:r>
-    </w:p>
-    <w:p>
-      <w:pPr>
-        <w:spacing w:after="80" w:line="288" w:lineRule="auto"/>
-        <w:jc w:val="both"/>
-      </w:pPr>
-      <w:r>
-        <w:rPr>
-          <w:b w:val="0"/>
-          <w:i w:val="0"/>
-          <w:sz w:val="22"/>
-        </w:rPr>
-        <w:t>Toàn bộ kỹ thuật tấn công được ánh xạ theo danh mục MITRE ATT&amp;CK Enterprise Matrix [Ref 19-20]: T1190 (Exploit Public-Facing Application), T1059 (Command and Scripting Interpreter), và T1083 (File and Directory Discovery).</w:t>
-      </w:r>
-    </w:p>
-    <w:p>
-      <w:pPr>
-        <w:keepNext/>
-        <w:spacing w:before="240" w:after="80"/>
-      </w:pPr>
-      <w:r>
-        <w:rPr>
-          <w:b/>
-          <w:color w:val="1E40AF"/>
-          <w:sz w:val="24"/>
-        </w:rPr>
-        <w:t>1.4.3. Mô hình Học tăng cường sâu (Deep Reinforcement Learning - DQN) trong né tránh phòng thủ</w:t>
-      </w:r>
-    </w:p>
-    <w:p>
-      <w:pPr>
-        <w:spacing w:after="80" w:line="288" w:lineRule="auto"/>
-        <w:jc w:val="both"/>
-      </w:pPr>
-      <w:r>
-        <w:rPr>
-          <w:b w:val="0"/>
-          <w:i w:val="0"/>
-          <w:sz w:val="22"/>
-        </w:rPr>
-        <w:t>Bài toán né tránh WAF được mô hình hóa theo Quy trình quyết định Markov (Markov Decision Process - MDP) và huấn luyện bằng mạng nơ-ron sâu Deep Q-Network (100% In-house PyTorch, không phụ thuộc API thương mại) [Ref 05]:</w:t>
-      </w:r>
-    </w:p>
-    <w:p>
-      <w:pPr>
-        <w:pStyle w:val="ListBullet"/>
-        <w:spacing w:after="60" w:line="276" w:lineRule="auto"/>
-        <w:jc w:val="both"/>
-      </w:pPr>
-      <w:r>
-        <w:rPr>
-          <w:b/>
-          <w:sz w:val="22"/>
-        </w:rPr>
-        <w:t xml:space="preserve">Không gian trạng thái (State Space): </w:t>
-      </w:r>
-      <w:r>
-        <w:rPr>
-          <w:sz w:val="22"/>
-        </w:rPr>
-        <w:t>Vector đặc trưng của payload hiện tại và mã phản hồi HTTP từ Gateway (200, 403, 429, 500).</w:t>
-      </w:r>
-    </w:p>
-    <w:p>
-      <w:pPr>
-        <w:pStyle w:val="ListBullet"/>
-        <w:spacing w:after="60" w:line="276" w:lineRule="auto"/>
-        <w:jc w:val="both"/>
-      </w:pPr>
-      <w:r>
-        <w:rPr>
-          <w:b/>
-          <w:sz w:val="22"/>
-        </w:rPr>
-        <w:t xml:space="preserve">Không gian hành động (Action Space): </w:t>
-      </w:r>
-      <w:r>
-        <w:rPr>
-          <w:sz w:val="22"/>
-        </w:rPr>
-        <w:t>Tập hợp các toán tử đột biến: Double URL Encode, Inline Comment, Mixed-case, Null-byte, Base64 Wrap, Subshell Expansion.</w:t>
-      </w:r>
-    </w:p>
-    <w:p>
-      <w:pPr>
-        <w:pStyle w:val="ListBullet"/>
-        <w:spacing w:after="60" w:line="276" w:lineRule="auto"/>
-        <w:jc w:val="both"/>
-      </w:pPr>
-      <w:r>
-        <w:rPr>
-          <w:b/>
-          <w:sz w:val="22"/>
-        </w:rPr>
-        <w:t xml:space="preserve">Hàm phần thưởng (Reward Function): </w:t>
-      </w:r>
-      <w:r>
-        <w:rPr>
-          <w:sz w:val="22"/>
-        </w:rPr>
-        <w:t>+100 điểm khi vượt WAF thành công (HTTP 200/500), -50 điểm khi bị chặn (HTTP 403), -10 điểm chi phí độ trễ cho mỗi bước thừa.</w:t>
+        <w:t>Bên tấn công chiến thắng nếu tìm ra biến thể payload x* sao cho x* khai thác thành công lỗ hổng trên ứng dụng mục tiêu nhưng lại qua mặt được bộ lọc phòng thủ (WAF(x*) = ALLOW).</w:t>
       </w:r>
     </w:p>
     <w:tbl>
       <w:tblPr>
         <w:tblW w:type="auto" w:w="0"/>
         <w:jc w:val="center"/>
-        <w:tblLayout w:type="fixed"/>
         <w:tblLook w:firstColumn="1" w:firstRow="1" w:lastColumn="0" w:lastRow="0" w:noHBand="0" w:noVBand="1" w:val="04A0"/>
       </w:tblPr>
       <w:tblGrid>
@@ -3530,31 +1951,28 @@
           </w:tcPr>
           <w:p>
             <w:pPr>
-              <w:spacing w:after="40"/>
               <w:jc w:val="center"/>
             </w:pPr>
             <w:r>
               <w:rPr>
-                <w:rFonts w:ascii="Courier New" w:hAnsi="Courier New"/>
                 <w:b/>
-                <w:color w:val="1E3A8A"/>
-                <w:sz w:val="23"/>
+                <w:color w:val="1E293B"/>
+                <w:sz w:val="22"/>
               </w:rPr>
-              <w:t>Q(s, a) &lt;- Q(s, a) + alpha * [ r + gamma * max_a'( Q(s', a') ) - Q(s, a) ]</w:t>
+              <w:t>Adv(A) = | Pr[A bypasses WAF] - Pr[Random Guess bypasses WAF] |</w:t>
             </w:r>
           </w:p>
           <w:p>
             <w:pPr>
-              <w:spacing w:after="0"/>
               <w:jc w:val="center"/>
             </w:pPr>
             <w:r>
               <w:rPr>
                 <w:i/>
-                <w:color w:val="4B5563"/>
+                <w:color w:val="64748B"/>
                 <w:sz w:val="19"/>
               </w:rPr>
-              <w:t>Phương trình cập nhật giá trị Q tối ưu theo thuật toán Q-Learning</w:t>
+              <w:t>Hàm lợi thế tấn công (Adversarial Advantage) theo lý thuyết Katz &amp; Lindell (2020)</w:t>
             </w:r>
           </w:p>
         </w:tc>
@@ -3562,35 +1980,34 @@
     </w:tbl>
     <w:p>
       <w:pPr>
-        <w:spacing w:after="40"/>
+        <w:spacing w:after="80"/>
       </w:pPr>
     </w:p>
     <w:p>
       <w:pPr>
-        <w:keepNext/>
-        <w:spacing w:before="320" w:after="120"/>
+        <w:spacing w:after="80" w:line="288" w:lineRule="auto"/>
+        <w:jc w:val="both"/>
       </w:pPr>
       <w:r>
         <w:rPr>
-          <w:b/>
-          <w:color w:val="0F2454"/>
-          <w:sz w:val="27"/>
+          <w:b w:val="0"/>
+          <w:i w:val="0"/>
         </w:rPr>
-        <w:t>1.5. CÁC THƯỚC ĐO VÀ TIÊU CHUẨN ĐÁNH GIÁ HIỆU NĂNG KHOA HỌC</w:t>
+        <w:t>Hệ thống phòng thủ đạt độ an toàn vững chắc khi và chỉ khi với mọi tác tử tấn công A bị giới hạn về tài nguyên tính toán PPT, hàm lợi thế Adv(A) là một hàm không đáng kể đối với các lỗ hổng đã biết.</w:t>
       </w:r>
     </w:p>
     <w:p>
       <w:pPr>
         <w:keepNext/>
-        <w:spacing w:before="240" w:after="80"/>
+        <w:spacing w:before="200" w:after="80"/>
       </w:pPr>
       <w:r>
         <w:rPr>
           <w:b/>
-          <w:color w:val="1E40AF"/>
+          <w:color w:val="1E3A8A"/>
           <w:sz w:val="24"/>
         </w:rPr>
-        <w:t>1.5.1. Ma trận nhầm lẫn và các chỉ số cốt lõi</w:t>
+        <w:t>1.4.3. Quy trình trinh sát và Tác tử tấn công tự động (Offensive AI &amp; Red Teaming)</w:t>
       </w:r>
     </w:p>
     <w:p>
@@ -3602,9 +2019,8 @@
         <w:rPr>
           <w:b w:val="0"/>
           <w:i w:val="0"/>
-          <w:sz w:val="22"/>
         </w:rPr>
-        <w:t>Hiệu năng của hệ thống được đánh giá định lượng qua Ma trận nhầm lẫn (Confusion Matrix) với các chỉ số thống kê chuẩn mực:</w:t>
+        <w:t>Theo phương pháp luận kiểm thử xâm nhập của giáo trình CompTIA PenTest+ [Ref 04], tác tử Red Team (Máy 2) được thiết kế vận hành theo chu trình 3 bước:</w:t>
       </w:r>
     </w:p>
     <w:p>
@@ -3616,15 +2032,12 @@
       <w:r>
         <w:rPr>
           <w:b/>
-          <w:sz w:val="22"/>
+          <w:color w:val="111827"/>
         </w:rPr>
-        <w:t xml:space="preserve">Accuracy: </w:t>
+        <w:t xml:space="preserve">1. Trinh sát tự động (Reconnaissance &amp; OpenAPI Parsing): </w:t>
       </w:r>
       <w:r>
-        <w:rPr>
-          <w:sz w:val="22"/>
-        </w:rPr>
-        <w:t>Tỷ lệ dự đoán đúng tổng thể = (TP + TN) / (TP + TN + FP + FN).</w:t>
+        <w:t>Tác tử tự động gửi yêu cầu đọc tài liệu OpenAPI Specification (/openapi.json hoặc /docs), bóc tách danh sách endpoint, phương thức HTTP và cấu trúc schema JSON.</w:t>
       </w:r>
     </w:p>
     <w:p>
@@ -3636,15 +2049,12 @@
       <w:r>
         <w:rPr>
           <w:b/>
-          <w:sz w:val="22"/>
+          <w:color w:val="111827"/>
         </w:rPr>
-        <w:t xml:space="preserve">Precision: </w:t>
+        <w:t xml:space="preserve">2. Fuzzing phụ thuộc trạng thái (Stateful REST API Fuzzing): </w:t>
       </w:r>
       <w:r>
-        <w:rPr>
-          <w:sz w:val="22"/>
-        </w:rPr>
-        <w:t>Độ chuẩn xác của cảnh báo tấn công = TP / (TP + FP).</w:t>
+        <w:t>Vận dụng nguyên lý của công cụ khoa học hàng đầu RESTler (IEEE ICSE 2019) [Ref 17], tác tử xây dựng đồ thị phụ thuộc (Producer-Consumer Dependency Graph) để duy trì token phiên và tham số hợp lệ.</w:t>
       </w:r>
     </w:p>
     <w:p>
@@ -3656,15 +2066,52 @@
       <w:r>
         <w:rPr>
           <w:b/>
-          <w:sz w:val="22"/>
+          <w:color w:val="111827"/>
         </w:rPr>
-        <w:t xml:space="preserve">Recall (True Positive Rate - TPR): </w:t>
+        <w:t xml:space="preserve">3. Kiểm thử xác minh lỗ hổng: </w:t>
       </w:r>
       <w:r>
+        <w:t>Bơm payload độc hại được đột biến có chủ đích vào từng tham số và giám sát mã phản hồi HTTP.</w:t>
+      </w:r>
+    </w:p>
+    <w:p>
+      <w:pPr>
+        <w:spacing w:after="80" w:line="288" w:lineRule="auto"/>
+        <w:jc w:val="both"/>
+      </w:pPr>
+      <w:r>
         <w:rPr>
-          <w:sz w:val="22"/>
+          <w:b w:val="0"/>
+          <w:i w:val="0"/>
         </w:rPr>
-        <w:t>Tỷ lệ tóm gọn tấn công = TP / (TP + FN).</w:t>
+        <w:t>Toàn bộ kỹ thuật tấn công được ánh xạ theo danh mục MITRE ATT&amp;CK Enterprise Matrix [Ref 16]: T1190 (Exploit Public-Facing Application), T1059 (Command and Scripting Interpreter), T1083 (File and Directory Discovery) và T1595 (Active Scanning).</w:t>
+      </w:r>
+    </w:p>
+    <w:p>
+      <w:pPr>
+        <w:keepNext/>
+        <w:spacing w:before="200" w:after="80"/>
+      </w:pPr>
+      <w:r>
+        <w:rPr>
+          <w:b/>
+          <w:color w:val="1E3A8A"/>
+          <w:sz w:val="24"/>
+        </w:rPr>
+        <w:t>1.4.4. Mô hình Học tăng cường sâu (Deep Reinforcement Learning - DQN) trong né tránh phòng thủ</w:t>
+      </w:r>
+    </w:p>
+    <w:p>
+      <w:pPr>
+        <w:spacing w:after="80" w:line="288" w:lineRule="auto"/>
+        <w:jc w:val="both"/>
+      </w:pPr>
+      <w:r>
+        <w:rPr>
+          <w:b w:val="0"/>
+          <w:i w:val="0"/>
+        </w:rPr>
+        <w:t>Bài toán né tránh WAF được mô hình hóa theo Quy trình quyết định Markov (Markov Decision Process - MDP) và huấn luyện bằng mạng nơ-ron sâu Deep Q-Network (100% In-house PyTorch, không phụ thuộc API thương mại) [Ref 19, Ref 20]:</w:t>
       </w:r>
     </w:p>
     <w:p>
@@ -3676,15 +2123,12 @@
       <w:r>
         <w:rPr>
           <w:b/>
-          <w:sz w:val="22"/>
+          <w:color w:val="111827"/>
         </w:rPr>
-        <w:t xml:space="preserve">False Positive Rate (FPR): </w:t>
+        <w:t xml:space="preserve">Không gian trạng thái (State Space): </w:t>
       </w:r>
       <w:r>
-        <w:rPr>
-          <w:sz w:val="22"/>
-        </w:rPr>
-        <w:t>Tỷ lệ báo động nhầm người dùng hợp lệ = FP / (FP + TN).</w:t>
+        <w:t>Vector đặc trưng của payload hiện tại và mã phản hồi HTTP từ Gateway (200, 403, 429, 500).</w:t>
       </w:r>
     </w:p>
     <w:p>
@@ -3696,50 +2140,35 @@
       <w:r>
         <w:rPr>
           <w:b/>
-          <w:sz w:val="22"/>
+          <w:color w:val="111827"/>
         </w:rPr>
-        <w:t xml:space="preserve">F1-Score: </w:t>
+        <w:t xml:space="preserve">Không gian hành động (Action Space): </w:t>
       </w:r>
       <w:r>
-        <w:rPr>
-          <w:sz w:val="22"/>
-        </w:rPr>
-        <w:t>Trung bình điều hòa giữa Precision và Recall = 2 * (Precision * Recall) / (Precision + Recall).</w:t>
+        <w:t>Tập hợp các toán tử đột biến: Double URL Encode, Inline Comment, Mixed-case, Null-byte, Base64 Wrap, Subshell Expansion.</w:t>
       </w:r>
     </w:p>
     <w:p>
       <w:pPr>
-        <w:keepNext/>
-        <w:spacing w:before="240" w:after="80"/>
+        <w:pStyle w:val="ListBullet"/>
+        <w:spacing w:after="60" w:line="276" w:lineRule="auto"/>
+        <w:jc w:val="both"/>
       </w:pPr>
       <w:r>
         <w:rPr>
           <w:b/>
-          <w:color w:val="1E40AF"/>
-          <w:sz w:val="24"/>
+          <w:color w:val="111827"/>
         </w:rPr>
-        <w:t>1.5.2. Thước đo Youden's Index (J) theo chuẩn OWASP Benchmark Project</w:t>
+        <w:t xml:space="preserve">Hàm phần thưởng (Reward Function): </w:t>
       </w:r>
-    </w:p>
-    <w:p>
-      <w:pPr>
-        <w:spacing w:after="80" w:line="288" w:lineRule="auto"/>
-        <w:jc w:val="both"/>
-      </w:pPr>
       <w:r>
-        <w:rPr>
-          <w:b w:val="0"/>
-          <w:i w:val="0"/>
-          <w:sz w:val="22"/>
-        </w:rPr>
-        <w:t>Theo tiêu chuẩn đánh giá WAF quốc tế của OWASP Benchmark Project [Ref 15-16], một hệ thống WAF đạt chuẩn khoa học bắt buộc phải cân bằng giữa khả năng bắt tấn công và khả năng hạn chế tối đa báo động giả. Chỉ số Youden's Index J được định nghĩa:</w:t>
+        <w:t>+100 điểm khi vượt WAF thành công (HTTP 200/500), -50 điểm khi bị chặn (HTTP 403), -10 điểm chi phí độ trễ cho mỗi bước thừa.</w:t>
       </w:r>
     </w:p>
     <w:tbl>
       <w:tblPr>
         <w:tblW w:type="auto" w:w="0"/>
         <w:jc w:val="center"/>
-        <w:tblLayout w:type="fixed"/>
         <w:tblLook w:firstColumn="1" w:firstRow="1" w:lastColumn="0" w:lastRow="0" w:noHBand="0" w:noVBand="1" w:val="04A0"/>
       </w:tblPr>
       <w:tblGrid>
@@ -3759,31 +2188,28 @@
           </w:tcPr>
           <w:p>
             <w:pPr>
-              <w:spacing w:after="40"/>
               <w:jc w:val="center"/>
             </w:pPr>
             <w:r>
               <w:rPr>
-                <w:rFonts w:ascii="Courier New" w:hAnsi="Courier New"/>
                 <w:b/>
-                <w:color w:val="1E3A8A"/>
-                <w:sz w:val="23"/>
+                <w:color w:val="1E293B"/>
+                <w:sz w:val="22"/>
               </w:rPr>
-              <w:t>J = TPR - FPR = [ TP / (TP + FN) ] - [ FP / (FP + TN) ]</w:t>
+              <w:t>Q(s, a) &lt;- Q(s, a) + alpha * [ r + gamma * max_a'( Q(s', a') ) - Q(s, a) ]</w:t>
             </w:r>
           </w:p>
           <w:p>
             <w:pPr>
-              <w:spacing w:after="0"/>
               <w:jc w:val="center"/>
             </w:pPr>
             <w:r>
               <w:rPr>
                 <w:i/>
-                <w:color w:val="4B5563"/>
+                <w:color w:val="64748B"/>
                 <w:sz w:val="19"/>
               </w:rPr>
-              <w:t>Chỉ số Youden's Index J theo chuẩn đánh giá WAF của OWASP Benchmark</w:t>
+              <w:t>Phương trình cập nhật giá trị Q tối ưu theo thuật toán Q-Learning</w:t>
             </w:r>
           </w:p>
         </w:tc>
@@ -3791,35 +2217,35 @@
     </w:tbl>
     <w:p>
       <w:pPr>
-        <w:spacing w:after="40"/>
+        <w:spacing w:after="80"/>
       </w:pPr>
     </w:p>
     <w:p>
       <w:pPr>
-        <w:spacing w:after="80" w:line="288" w:lineRule="auto"/>
-        <w:jc w:val="both"/>
+        <w:keepNext/>
+        <w:spacing w:before="280" w:after="120"/>
       </w:pPr>
       <w:r>
         <w:rPr>
-          <w:b w:val="0"/>
-          <w:i w:val="0"/>
-          <w:sz w:val="22"/>
+          <w:b/>
+          <w:color w:val="0F766E"/>
+          <w:sz w:val="28"/>
         </w:rPr>
-        <w:t>Thang đo J thuộc [-1.0, 1.0]. Hệ thống lý tưởng đạt J = 1.0 (TPR = 100%, FPR = 0%). Nếu J &lt;= 0, hệ thống không có giá trị thực tiễn. Mục tiêu của đồ án PBL6 là đạt J &gt;= 0.90 trên tập dữ liệu kiểm nghiệm thực tế.</w:t>
+        <w:t>1.5. CÁC THƯỚC ĐO VÀ TIÊU CHUẨN ĐÁNH GIÁ HIỆU NĂNG KHOA HỌC</w:t>
       </w:r>
     </w:p>
     <w:p>
       <w:pPr>
         <w:keepNext/>
-        <w:spacing w:before="240" w:after="80"/>
+        <w:spacing w:before="200" w:after="80"/>
       </w:pPr>
       <w:r>
         <w:rPr>
           <w:b/>
-          <w:color w:val="1E40AF"/>
+          <w:color w:val="1E3A8A"/>
           <w:sz w:val="24"/>
         </w:rPr>
-        <w:t>1.5.3. Ngân sách độ trễ xử lý (Latency Overhead Budget)</w:t>
+        <w:t>1.5.1. Ma trận nhầm lẫn và các chỉ số cốt lõi</w:t>
       </w:r>
     </w:p>
     <w:p>
@@ -3831,16 +2257,126 @@
         <w:rPr>
           <w:b w:val="0"/>
           <w:i w:val="0"/>
-          <w:sz w:val="22"/>
         </w:rPr>
-        <w:t>Hệ thống WAF bảo vệ Web API bắt buộc phải tuân thủ nghiêm ngặt ngân sách độ trễ:</w:t>
+        <w:t>Hiệu năng của hệ thống được đánh giá định lượng qua Ma trận nhầm lẫn (Confusion Matrix) với các chỉ số thống kê chuẩn mực:</w:t>
+      </w:r>
+    </w:p>
+    <w:p>
+      <w:pPr>
+        <w:pStyle w:val="ListBullet"/>
+        <w:spacing w:after="60" w:line="276" w:lineRule="auto"/>
+        <w:jc w:val="both"/>
+      </w:pPr>
+      <w:r>
+        <w:rPr>
+          <w:b/>
+          <w:color w:val="111827"/>
+        </w:rPr>
+        <w:t xml:space="preserve">Accuracy: </w:t>
+      </w:r>
+      <w:r>
+        <w:t>Tỷ lệ dự đoán đúng tổng thể = (TP + TN) / (TP + TN + FP + FN).</w:t>
+      </w:r>
+    </w:p>
+    <w:p>
+      <w:pPr>
+        <w:pStyle w:val="ListBullet"/>
+        <w:spacing w:after="60" w:line="276" w:lineRule="auto"/>
+        <w:jc w:val="both"/>
+      </w:pPr>
+      <w:r>
+        <w:rPr>
+          <w:b/>
+          <w:color w:val="111827"/>
+        </w:rPr>
+        <w:t xml:space="preserve">Precision: </w:t>
+      </w:r>
+      <w:r>
+        <w:t>Độ chuẩn xác của cảnh báo tấn công = TP / (TP + FP).</w:t>
+      </w:r>
+    </w:p>
+    <w:p>
+      <w:pPr>
+        <w:pStyle w:val="ListBullet"/>
+        <w:spacing w:after="60" w:line="276" w:lineRule="auto"/>
+        <w:jc w:val="both"/>
+      </w:pPr>
+      <w:r>
+        <w:rPr>
+          <w:b/>
+          <w:color w:val="111827"/>
+        </w:rPr>
+        <w:t xml:space="preserve">Recall (True Positive Rate - TPR): </w:t>
+      </w:r>
+      <w:r>
+        <w:t>Tỷ lệ tóm gọn tấn công = TP / (TP + FN).</w:t>
+      </w:r>
+    </w:p>
+    <w:p>
+      <w:pPr>
+        <w:pStyle w:val="ListBullet"/>
+        <w:spacing w:after="60" w:line="276" w:lineRule="auto"/>
+        <w:jc w:val="both"/>
+      </w:pPr>
+      <w:r>
+        <w:rPr>
+          <w:b/>
+          <w:color w:val="111827"/>
+        </w:rPr>
+        <w:t xml:space="preserve">False Positive Rate (FPR): </w:t>
+      </w:r>
+      <w:r>
+        <w:t>Tỷ lệ báo động nhầm người dùng hợp lệ = FP / (FP + TN).</w:t>
+      </w:r>
+    </w:p>
+    <w:p>
+      <w:pPr>
+        <w:pStyle w:val="ListBullet"/>
+        <w:spacing w:after="60" w:line="276" w:lineRule="auto"/>
+        <w:jc w:val="both"/>
+      </w:pPr>
+      <w:r>
+        <w:rPr>
+          <w:b/>
+          <w:color w:val="111827"/>
+        </w:rPr>
+        <w:t xml:space="preserve">F1-Score: </w:t>
+      </w:r>
+      <w:r>
+        <w:t>Trung bình điều hòa giữa Precision và Recall = 2 * (Precision * Recall) / (Precision + Recall).</w:t>
+      </w:r>
+    </w:p>
+    <w:p>
+      <w:pPr>
+        <w:keepNext/>
+        <w:spacing w:before="200" w:after="80"/>
+      </w:pPr>
+      <w:r>
+        <w:rPr>
+          <w:b/>
+          <w:color w:val="1E3A8A"/>
+          <w:sz w:val="24"/>
+        </w:rPr>
+        <w:t>1.5.2. Thước đo Youden's Index (J) theo chuẩn OWASP Benchmark Project</w:t>
+      </w:r>
+    </w:p>
+    <w:p>
+      <w:pPr>
+        <w:spacing w:after="80" w:line="288" w:lineRule="auto"/>
+        <w:jc w:val="both"/>
+      </w:pPr>
+      <w:r>
+        <w:rPr>
+          <w:b w:val="0"/>
+          <w:i w:val="0"/>
+        </w:rPr>
+        <w:t>Theo tiêu chuẩn đánh giá WAF quốc tế của OWASP Benchmark Project [Ref 13], một hệ thống WAF đạt chuẩn khoa học bắt buộc phải cân bằng giữa khả năng bắt tấn công và khả năng hạn chế tối đa báo động giả. Chỉ số Youden's Index J được định nghĩa:</w:t>
       </w:r>
     </w:p>
     <w:tbl>
       <w:tblPr>
         <w:tblW w:type="auto" w:w="0"/>
         <w:jc w:val="center"/>
-        <w:tblLayout w:type="fixed"/>
         <w:tblLook w:firstColumn="1" w:firstRow="1" w:lastColumn="0" w:lastRow="0" w:noHBand="0" w:noVBand="1" w:val="04A0"/>
       </w:tblPr>
       <w:tblGrid>
@@ -3860,28 +2396,120 @@
           </w:tcPr>
           <w:p>
             <w:pPr>
-              <w:spacing w:after="40"/>
               <w:jc w:val="center"/>
             </w:pPr>
             <w:r>
               <w:rPr>
-                <w:rFonts w:ascii="Courier New" w:hAnsi="Courier New"/>
                 <w:b/>
-                <w:color w:val="1E3A8A"/>
-                <w:sz w:val="23"/>
+                <w:color w:val="1E293B"/>
+                <w:sz w:val="22"/>
+              </w:rPr>
+              <w:t>J = TPR - FPR = [ TP / (TP + FN) ] - [ FP / (FP + TN) ]</w:t>
+            </w:r>
+          </w:p>
+          <w:p>
+            <w:pPr>
+              <w:jc w:val="center"/>
+            </w:pPr>
+            <w:r>
+              <w:rPr>
+                <w:i/>
+                <w:color w:val="64748B"/>
+                <w:sz w:val="19"/>
+              </w:rPr>
+              <w:t>Chỉ số Youden's Index J theo chuẩn đánh giá WAF của OWASP Benchmark</w:t>
+            </w:r>
+          </w:p>
+        </w:tc>
+      </w:tr>
+    </w:tbl>
+    <w:p>
+      <w:pPr>
+        <w:spacing w:after="80"/>
+      </w:pPr>
+    </w:p>
+    <w:p>
+      <w:pPr>
+        <w:spacing w:after="80" w:line="288" w:lineRule="auto"/>
+        <w:jc w:val="both"/>
+      </w:pPr>
+      <w:r>
+        <w:rPr>
+          <w:b w:val="0"/>
+          <w:i w:val="0"/>
+        </w:rPr>
+        <w:t>Thang đo J thuộc [-1.0, 1.0]. Hệ thống lý tưởng đạt J = 1.0 (TPR = 100%, FPR = 0%). Nếu J &lt;= 0, hệ thống không có giá trị thực tiễn. Mục tiêu của đồ án PBL6 là đạt J &gt;= 0.90 trên tập dữ liệu kiểm nghiệm thực tế.</w:t>
+      </w:r>
+    </w:p>
+    <w:p>
+      <w:pPr>
+        <w:keepNext/>
+        <w:spacing w:before="200" w:after="80"/>
+      </w:pPr>
+      <w:r>
+        <w:rPr>
+          <w:b/>
+          <w:color w:val="1E3A8A"/>
+          <w:sz w:val="24"/>
+        </w:rPr>
+        <w:t>1.5.3. Ngân sách độ trễ xử lý (Latency Overhead Budget)</w:t>
+      </w:r>
+    </w:p>
+    <w:p>
+      <w:pPr>
+        <w:spacing w:after="80" w:line="288" w:lineRule="auto"/>
+        <w:jc w:val="both"/>
+      </w:pPr>
+      <w:r>
+        <w:rPr>
+          <w:b w:val="0"/>
+          <w:i w:val="0"/>
+        </w:rPr>
+        <w:t>Theo tiêu chuẩn vận hành kiến trúc Reverse Proxy hiệu năng cao trong NGINX Cookbook [Ref 05], hệ thống WAF bảo vệ Web API bắt buộc phải tuân thủ nghiêm ngặt ngân sách độ trễ:</w:t>
+      </w:r>
+    </w:p>
+    <w:tbl>
+      <w:tblPr>
+        <w:tblW w:type="auto" w:w="0"/>
+        <w:jc w:val="center"/>
+        <w:tblLook w:firstColumn="1" w:firstRow="1" w:lastColumn="0" w:lastRow="0" w:noHBand="0" w:noVBand="1" w:val="04A0"/>
+      </w:tblPr>
+      <w:tblGrid>
+        <w:gridCol w:w="9360"/>
+      </w:tblGrid>
+      <w:tr>
+        <w:tc>
+          <w:tcPr>
+            <w:tcW w:type="dxa" w:w="9360"/>
+            <w:shd w:fill="F3F4F6"/>
+            <w:tcMar>
+              <w:top w:w="140" w:type="dxa"/>
+              <w:bottom w:w="140" w:type="dxa"/>
+              <w:left w:w="200" w:type="dxa"/>
+              <w:right w:w="200" w:type="dxa"/>
+            </w:tcMar>
+          </w:tcPr>
+          <w:p>
+            <w:pPr>
+              <w:jc w:val="center"/>
+            </w:pPr>
+            <w:r>
+              <w:rPr>
+                <w:b/>
+                <w:color w:val="1E293B"/>
+                <w:sz w:val="22"/>
               </w:rPr>
               <w:t>Delta t = t_with_WAF - t_direct &lt;= 15 ms</w:t>
             </w:r>
           </w:p>
           <w:p>
             <w:pPr>
-              <w:spacing w:after="0"/>
               <w:jc w:val="center"/>
             </w:pPr>
             <w:r>
               <w:rPr>
                 <w:i/>
-                <w:color w:val="4B5563"/>
+                <w:color w:val="64748B"/>
                 <w:sz w:val="19"/>
               </w:rPr>
               <w:t>Ngân sách độ trễ tối đa cho toàn bộ quy trình kiểm tra WAF Hybrid</w:t>
@@ -3892,19 +2520,19 @@
     </w:tbl>
     <w:p>
       <w:pPr>
-        <w:spacing w:after="40"/>
+        <w:spacing w:after="80"/>
       </w:pPr>
     </w:p>
     <w:p>
       <w:pPr>
         <w:keepNext/>
-        <w:spacing w:before="320" w:after="120"/>
+        <w:spacing w:before="280" w:after="120"/>
       </w:pPr>
       <w:r>
         <w:rPr>
           <w:b/>
-          <w:color w:val="0F2454"/>
-          <w:sz w:val="27"/>
+          <w:color w:val="0F766E"/>
+          <w:sz w:val="28"/>
         </w:rPr>
         <w:t>1.6. TỔNG KẾT CHƯƠNG 1</w:t>
       </w:r>
@@ -3918,9 +2546,8 @@
         <w:rPr>
           <w:b w:val="0"/>
           <w:i w:val="0"/>
-          <w:sz w:val="22"/>
         </w:rPr>
-        <w:t>Chương 1 đã hoàn thành việc xây dựng nền tảng cơ sở lý thuyết toàn diện, có tính liên kết chặt chẽ và hàm lượng khoa học cao cho toàn bộ đồ án PBL6:</w:t>
+        <w:t>Chương 1 đã hoàn thành việc xây dựng nền tảng cơ sở lý thuyết toàn diện, có tính liên kết chặt chẽ và hàm lượng khoa học cao cho toàn bộ đồ án PBL6 dựa trên mô hình Kiềng ba chân học thuật:</w:t>
       </w:r>
     </w:p>
     <w:p>
@@ -3932,15 +2559,12 @@
       <w:r>
         <w:rPr>
           <w:b/>
-          <w:sz w:val="22"/>
+          <w:color w:val="111827"/>
         </w:rPr>
-        <w:t xml:space="preserve">1. </w:t>
+        <w:t xml:space="preserve">1. Giáo trình kinh điển: </w:t>
       </w:r>
       <w:r>
-        <w:rPr>
-          <w:sz w:val="22"/>
-        </w:rPr>
-        <w:t>Phân tích chi tiết bản chất kỹ thuật của các lỗ hổng Web API nguy hiểm theo chuẩn OWASP API Security Top 10 (2023) và bóc tách các kỹ thuật né tránh làm mờ payload tinh vi.</w:t>
+        <w:t>Vận dụng lý thuyết Cổng tầng ứng dụng của William Stallings [Ref 01], cơ sở toán học về Shannon Entropy của Douglas Stinson [Ref 02], mô hình Trò chơi an ninh đối kháng của Jonathan Katz &amp; Yehuda Lindell [Ref 03], phương pháp luận kiểm thử của CompTIA PenTest+ [Ref 04], và kiến trúc Reverse Proxy từ NGINX Cookbook [Ref 05].</w:t>
       </w:r>
     </w:p>
     <w:p>
@@ -3952,15 +2576,12 @@
       <w:r>
         <w:rPr>
           <w:b/>
-          <w:sz w:val="22"/>
+          <w:color w:val="111827"/>
         </w:rPr>
-        <w:t xml:space="preserve">2. </w:t>
+        <w:t xml:space="preserve">2. Tiêu chuẩn công nghiệp: </w:t>
       </w:r>
       <w:r>
-        <w:rPr>
-          <w:sz w:val="22"/>
-        </w:rPr>
-        <w:t>Làm rõ nguyên lý của WAF dựa trên luật tĩnh CRS v4.0 cùng 3 điểm nghẽn cốt tử: bất lực trước Zero-day, chi phí regex cao và tỷ lệ cảnh báo sai lệch.</w:t>
+        <w:t>Bám sát bộ rủi ro OWASP Top 10 API Security Risks (2023) [Ref 06], kiến trúc Anomaly Scoring của OWASP ModSecurity CRS v4.0 [Ref 07], quy trình đánh giá NIST SP 800-115 [Ref 15], và ma trận kỹ thuật MITRE ATT&amp;CK [Ref 16].</w:t>
       </w:r>
     </w:p>
     <w:p>
@@ -3972,55 +2593,12 @@
       <w:r>
         <w:rPr>
           <w:b/>
-          <w:sz w:val="22"/>
+          <w:color w:val="111827"/>
         </w:rPr>
-        <w:t xml:space="preserve">3. </w:t>
+        <w:t xml:space="preserve">3. Công trình khoa học thực nghiệm: </w:t>
       </w:r>
       <w:r>
-        <w:rPr>
-          <w:sz w:val="22"/>
-        </w:rPr>
-        <w:t>Luận chứng khoa học cho việc trích xuất 17 đặc trưng hình thái học HTTP theo chuẩn Wiley 2015, kết hợp thuật toán Random Forest và Isolation Forest để tạo nên kiến trúc WAF Hybrid tối ưu về cả độ trễ microsecond và độ chính xác.</w:t>
-      </w:r>
-    </w:p>
-    <w:p>
-      <w:pPr>
-        <w:pStyle w:val="ListBullet"/>
-        <w:spacing w:after="60" w:line="276" w:lineRule="auto"/>
-        <w:jc w:val="both"/>
-      </w:pPr>
-      <w:r>
-        <w:rPr>
-          <w:b/>
-          <w:sz w:val="22"/>
-        </w:rPr>
-        <w:t xml:space="preserve">4. </w:t>
-      </w:r>
-      <w:r>
-        <w:rPr>
-          <w:sz w:val="22"/>
-        </w:rPr>
-        <w:t>Đặt nền móng lý thuyết cho Thao trường mạng đối kháng phân tán trên 2 máy trạm vật lý theo chuẩn Elsevier 2020 và tác tử tấn công tự động ứng dụng Deep RL (PyTorch DQN Evasion).</w:t>
-      </w:r>
-    </w:p>
-    <w:p>
-      <w:pPr>
-        <w:pStyle w:val="ListBullet"/>
-        <w:spacing w:after="60" w:line="276" w:lineRule="auto"/>
-        <w:jc w:val="both"/>
-      </w:pPr>
-      <w:r>
-        <w:rPr>
-          <w:b/>
-          <w:sz w:val="22"/>
-        </w:rPr>
-        <w:t xml:space="preserve">5. </w:t>
-      </w:r>
-      <w:r>
-        <w:rPr>
-          <w:sz w:val="22"/>
-        </w:rPr>
-        <w:t>Quy chuẩn hóa toàn bộ hệ thống tiêu chí đánh giá định lượng khoa học (Confusion Matrix, Youden's Index J &gt;= 0.90, Latency Budget &lt;= 15ms) làm kim chỉ nam kiểm chứng cho đồ án.</w:t>
+        <w:t>Triển khai không gian 17 đặc trưng hình thái chuẩn Torrano-Gimenez (Wiley 2015) [Ref 08], bộ dữ liệu chuẩn quốc tế CSIC 2010 [Ref 09], khảo sát SQLi của IEEE Access (2023) [Ref 10], kiến trúc Hybrid WAF của MDPI Electronics (2025) [Ref 11], và mô hình Thao trường mạng chuẩn Elsevier (2020) [Ref 14].</w:t>
       </w:r>
     </w:p>
     <w:sectPr>

</xml_diff>

<commit_message>
docs: upgrade native Word equations in reports and add references and appendices
</commit_message>
<xml_diff>
--- a/docs/reports/PBL6_Bao_Cao_Chuong_1_Co_So_Ly_Thuyet.docx
+++ b/docs/reports/PBL6_Bao_Cao_Chuong_1_Co_So_Ly_Thuyet.docx
@@ -11,7 +11,7 @@
         <w:rPr>
           <w:b/>
           <w:color w:val="4B5563"/>
-          <w:sz w:val="22"/>
+          <w:sz w:val="24"/>
         </w:rPr>
         <w:t>TRƯỜNG ĐẠI HỌC BÁCH KHOA - ĐẠI HỌC ĐÀ NẴNG</w:t>
         <w:br/>
@@ -23,7 +23,7 @@
         <w:rPr>
           <w:b/>
           <w:color w:val="047857"/>
-          <w:sz w:val="26"/>
+          <w:sz w:val="28"/>
         </w:rPr>
         <w:t>BÁO CÁO ĐỒ ÁN MÔN HỌC CHUYÊN NGÀNH AN TOÀN THÔNG TIN (PBL6)</w:t>
         <w:br/>
@@ -34,14 +34,14 @@
           <w:color w:val="111827"/>
           <w:sz w:val="32"/>
         </w:rPr>
-        <w:t>CHƯƠNG 1: CƠ SỞ LÝ THUYẾT VÀ TỔNG QUAN CÔNG TRÌNH NGHIÊN CỨU</w:t>
+        <w:t>CHƯƠNG 1: CƠ SỞ LÝ THUYẾT VÀ TỔNG QUAN CÔNG NGHỆ</w:t>
         <w:br/>
       </w:r>
       <w:r>
         <w:rPr>
           <w:i/>
           <w:color w:val="374151"/>
-          <w:sz w:val="22"/>
+          <w:sz w:val="24"/>
         </w:rPr>
         <w:t>Đề tài: Nền tảng Giám sát, Phát hiện và Ngăn chặn Tấn công Web API dựa trên AI/ML kết hợp Môi trường Thao trường Mạng (Cyber Range) Phân tán</w:t>
         <w:br/>
@@ -49,94 +49,91 @@
     </w:p>
     <w:p>
       <w:pPr>
-        <w:spacing w:after="80" w:line="288" w:lineRule="auto"/>
+        <w:spacing w:after="80" w:line="312" w:lineRule="auto"/>
         <w:jc w:val="both"/>
       </w:pPr>
       <w:r>
         <w:rPr>
-          <w:b w:val="0"/>
           <w:i/>
+          <w:sz w:val="26"/>
         </w:rPr>
         <w:t>Tài liệu cơ sở lý thuyết bám sát 20 công trình và giáo trình kinh điển quốc tế (Prentice Hall, CRC Press, Sybex/Wiley, O'Reilly, USENIX Security, IEEE, ACM, Elsevier, MDPI, NIST, OWASP, MITRE). Cung cấp luận cứ toán học, cơ chế kiến trúc và cơ sở phân loại cho toàn bộ hệ sinh thái phòng thủ và tấn công của đồ án.</w:t>
       </w:r>
     </w:p>
     <w:p>
       <w:pPr>
-        <w:keepNext/>
         <w:spacing w:before="280" w:after="120"/>
       </w:pPr>
       <w:r>
         <w:rPr>
           <w:b/>
           <w:color w:val="0F766E"/>
-          <w:sz w:val="28"/>
+          <w:sz w:val="30"/>
         </w:rPr>
         <w:t>1.1. TỔNG QUAN VỀ BẢO MẬT WEB API VÀ CÁC THÁCH THỨC AN NINH HIỆN ĐẠI</w:t>
       </w:r>
     </w:p>
     <w:p>
       <w:pPr>
-        <w:keepNext/>
         <w:spacing w:before="200" w:after="80"/>
       </w:pPr>
       <w:r>
         <w:rPr>
           <w:b/>
-          <w:color w:val="1E3A8A"/>
-          <w:sz w:val="24"/>
+          <w:color w:val="1E40AF"/>
+          <w:sz w:val="27"/>
         </w:rPr>
         <w:t>1.1.1. Xu hướng kiến trúc Microservices và sự bùng nổ của Web API</w:t>
       </w:r>
     </w:p>
     <w:p>
       <w:pPr>
-        <w:spacing w:after="80" w:line="288" w:lineRule="auto"/>
+        <w:spacing w:after="80" w:line="312" w:lineRule="auto"/>
         <w:jc w:val="both"/>
       </w:pPr>
       <w:r>
         <w:rPr>
-          <w:b w:val="0"/>
           <w:i w:val="0"/>
+          <w:sz w:val="26"/>
         </w:rPr>
         <w:t>Trong kỷ nguyên chuyển đổi số và điện toán đám mây, kiến trúc phần mềm đã trải qua sự chuyển dịch mang tính nền tảng từ các hệ thống nguyên khối (Monolithic Architecture) sang kiến trúc phân tán và vi dịch vụ (Microservices Architecture). Trong mô hình này, giao diện lập trình ứng dụng web (Web API), đặc biệt là chuẩn RESTful API truyền tải dữ liệu qua giao thức HTTP/HTTPS với định dạng JSON, đã trở thành huyết mạch kết nối toàn bộ hệ sinh thái dịch vụ số: từ ứng dụng Single Page Application (SPA), ứng dụng di động (Mobile Apps), hệ thống Internet vạn vật (IoT) cho đến các cổng thanh toán tài chính liên ngân hàng.</w:t>
       </w:r>
     </w:p>
     <w:p>
       <w:pPr>
-        <w:spacing w:after="80" w:line="288" w:lineRule="auto"/>
+        <w:spacing w:after="80" w:line="312" w:lineRule="auto"/>
         <w:jc w:val="both"/>
       </w:pPr>
       <w:r>
         <w:rPr>
-          <w:b w:val="0"/>
           <w:i w:val="0"/>
+          <w:sz w:val="26"/>
         </w:rPr>
         <w:t>Tuy nhiên, sự bùng nổ về số lượng và tính phức tạp của Web API đã làm mở rộng đáng kể bề mặt tấn công (Attack Surface). Không giống như các ứng dụng web truyền thống hiển thị giao diện qua HTML/CSS, Web API phơi bày trực tiếp logic nghiệp vụ, các tham số truy vấn cơ sở dữ liệu và cấu trúc dữ liệu nhạy cảm. Kẻ tấn công có thể dễ dàng sử dụng các công cụ phân tích tự động, bóc tách tài liệu OpenAPI/Swagger specification để lập bản đồ các endpoint và thực hiện tấn công hàng loạt mà không bị cản trở bởi lớp giao diện người dùng [Ref 04].</w:t>
       </w:r>
     </w:p>
     <w:p>
       <w:pPr>
-        <w:keepNext/>
         <w:spacing w:before="200" w:after="80"/>
       </w:pPr>
       <w:r>
         <w:rPr>
           <w:b/>
-          <w:color w:val="1E3A8A"/>
-          <w:sz w:val="24"/>
+          <w:color w:val="1E40AF"/>
+          <w:sz w:val="27"/>
         </w:rPr>
         <w:t>1.1.2. Phân tích các mối đe dọa hàng đầu theo OWASP Top 10 API Security Risks (2023)</w:t>
       </w:r>
     </w:p>
     <w:p>
       <w:pPr>
-        <w:spacing w:after="80" w:line="288" w:lineRule="auto"/>
+        <w:spacing w:after="80" w:line="312" w:lineRule="auto"/>
         <w:jc w:val="both"/>
       </w:pPr>
       <w:r>
         <w:rPr>
-          <w:b w:val="0"/>
           <w:i w:val="0"/>
+          <w:sz w:val="26"/>
         </w:rPr>
         <w:t>Theo công bố chính thức từ tổ chức an toàn thông tin uy tín thế giới OWASP trong tài liệu OWASP Top 10 API Security Risks 2023 [Ref 06], các cuộc tấn công nhắm vào Web API ngày càng trở nên tinh vi và có tổ chức. Đồ án tập trung nghiên cứu và xây dựng giải pháp phòng thủ cho 4 nhóm hiểm họa nghiêm trọng nhất:</w:t>
       </w:r>
@@ -144,2466 +141,2284 @@
     <w:p>
       <w:pPr>
         <w:pStyle w:val="ListBullet"/>
-        <w:spacing w:after="60" w:line="276" w:lineRule="auto"/>
+        <w:spacing w:after="60" w:line="312" w:lineRule="auto"/>
         <w:jc w:val="both"/>
       </w:pPr>
       <w:r>
         <w:rPr>
           <w:b/>
           <w:color w:val="111827"/>
+          <w:sz w:val="26"/>
         </w:rPr>
         <w:t xml:space="preserve">1. Các lỗ hổng tiêm mã độc (Injection Vulnerabilities): </w:t>
       </w:r>
       <w:r>
+        <w:rPr>
+          <w:sz w:val="26"/>
+        </w:rPr>
         <w:t>Bao gồm SQL Injection (In-band, Error-based, Time-based Blind SQLi [Ref 10]), OS Command Injection thực thi shellcode trực tiếp, và Path Traversal đọc tệp tin cấu hình nhạy cảm. Kẻ tấn công lợi dụng dữ liệu đầu vào chưa được kiểm duyệt để thay đổi logic truy vấn hoặc chiếm toàn quyền điều khiển hệ điều hành máy chủ.</w:t>
       </w:r>
     </w:p>
     <w:p>
       <w:pPr>
         <w:pStyle w:val="ListBullet"/>
-        <w:spacing w:after="60" w:line="276" w:lineRule="auto"/>
+        <w:spacing w:after="60" w:line="312" w:lineRule="auto"/>
         <w:jc w:val="both"/>
       </w:pPr>
       <w:r>
         <w:rPr>
           <w:b/>
           <w:color w:val="111827"/>
+          <w:sz w:val="26"/>
         </w:rPr>
         <w:t xml:space="preserve">2. Tấn công Cross-Site Scripting (XSS): </w:t>
       </w:r>
       <w:r>
+        <w:rPr>
+          <w:sz w:val="26"/>
+        </w:rPr>
         <w:t>Mặc dù API chủ yếu trả về dữ liệu JSON, nhưng các trường dữ liệu do API phản hồi thường được render trực tiếp lên trình duyệt của người dùng cuối trong các ứng dụng SPA (React, Vue, Next.js). Khi kẻ tấn công chèn thành công các payload chứa mã JavaScript nguy hại (&lt;script&gt;, &lt;img onerror=...&gt;) qua API, mã độc sẽ thực thi trong ngữ cảnh phiên nạn nhân, dẫn đến nguy cơ đánh cắp token JWT, session cookies hoặc chiếm đoạt tài khoản.</w:t>
       </w:r>
     </w:p>
     <w:p>
       <w:pPr>
         <w:pStyle w:val="ListBullet"/>
-        <w:spacing w:after="60" w:line="276" w:lineRule="auto"/>
+        <w:spacing w:after="60" w:line="312" w:lineRule="auto"/>
         <w:jc w:val="both"/>
       </w:pPr>
       <w:r>
         <w:rPr>
           <w:b/>
           <w:color w:val="111827"/>
+          <w:sz w:val="26"/>
         </w:rPr>
-        <w:t xml:space="preserve">3. Phá vỡ kiểm soát phân quyền mức đối tượng (BOLA / IDOR - API1:2023): </w:t>
+        <w:t xml:space="preserve">3. Phá vỡ kiểm soát phân quyền mức đối tượng (Broken Object Level Authorization - BOLA / IDOR - API1:2023): </w:t>
       </w:r>
       <w:r>
-        <w:t>Lỗ hổng logic nghiệp vụ đứng số 1 về mức độ phổ biến, xảy ra khi máy chủ API không kiểm tra xem người dùng hiện tại có quyền thao tác trên mã đối tượng trong URL hay không (ví dụ: đổi /orders/1 thành /orders/2). Các bộ lọc chữ ký regex truyền thống hoàn toàn bất lực trước loại lỗ hổng logic này [Ref 06].</w:t>
+        <w:rPr>
+          <w:sz w:val="26"/>
+        </w:rPr>
+        <w:t>Là lỗ hổng phổ biến và nguy hiểm nhất trên các Web API hiện đại. Kẻ tấn công thao túng định danh tài nguyên (ID) trong URI hoặc payload JSON để truy cập trái phép dữ liệu của người dùng khác do backend thiếu sót trong việc kiểm tra quyền sở hữu đối tượng trước khi xử lý nghiệp vụ.</w:t>
       </w:r>
     </w:p>
     <w:p>
       <w:pPr>
         <w:pStyle w:val="ListBullet"/>
-        <w:spacing w:after="60" w:line="276" w:lineRule="auto"/>
+        <w:spacing w:after="60" w:line="312" w:lineRule="auto"/>
         <w:jc w:val="both"/>
       </w:pPr>
       <w:r>
         <w:rPr>
           <w:b/>
           <w:color w:val="111827"/>
+          <w:sz w:val="26"/>
         </w:rPr>
-        <w:t xml:space="preserve">4. Tiêu thụ tài nguyên không hạn chế (Unrestricted Resource Consumption - API4:2023): </w:t>
+        <w:t xml:space="preserve">4. Tiêu thụ tài nguyên không kiểm soát (Unrestricted Resource Consumption - API4:2023): </w:t>
       </w:r>
       <w:r>
-        <w:t>Các cuộc tấn công dò quét tự động (Brute-force mật khẩu, Credential Stuffing) hoặc vét cạn tài nguyên máy chủ Layer 7 DoS. Nếu không có cơ chế giới hạn tần suất (Rate Limiting) theo cửa sổ trượt, hệ thống sẽ nhanh chóng tê liệt CPU, RAM và kết nối cơ sở dữ liệu [Ref 05, Ref 06].</w:t>
+        <w:rPr>
+          <w:sz w:val="26"/>
+        </w:rPr>
+        <w:t>Kẻ tấn công gửi liên tục lượng lớn request hoặc thực hiện các truy vấn dữ liệu nặng nhằm làm cạn kiệt CPU, RAM, băng thông mạng hoặc kết nối CSDL của máy chủ, dẫn đến tình trạng từ chối dịch vụ (Denial of Service - DoS), gây tê liệt các dịch vụ trọng yếu.</w:t>
       </w:r>
     </w:p>
     <w:p>
       <w:pPr>
-        <w:keepNext/>
-        <w:spacing w:before="200" w:after="80"/>
-      </w:pPr>
-      <w:r>
-        <w:rPr>
-          <w:b/>
-          <w:color w:val="1E3A8A"/>
-          <w:sz w:val="24"/>
-        </w:rPr>
-        <w:t>1.1.3. Các kỹ thuật làm mờ payload và né tránh tường lửa (WAF Evasion &amp; Obfuscation Techniques)</w:t>
-      </w:r>
-    </w:p>
-    <w:p>
-      <w:pPr>
-        <w:spacing w:after="80" w:line="288" w:lineRule="auto"/>
-        <w:jc w:val="both"/>
-      </w:pPr>
-      <w:r>
-        <w:rPr>
-          <w:b w:val="0"/>
-          <w:i w:val="0"/>
-        </w:rPr>
-        <w:t>Theo giáo trình kiểm thử xâm nhập chuẩn quốc tế CompTIA PenTest+ Study Guide [Ref 04], trong bối cảnh các hệ thống tường lửa ứng dụng web truyền thống phụ thuộc nặng nề vào các tập luật kiểm tra mẫu chuỗi (Regex Pattern Matching), kẻ tấn công hiện đại áp dụng các kỹ thuật làm mờ payload (Obfuscation) cực kỳ phức tạp để vượt rào (WAF Evasion):</w:t>
-      </w:r>
-    </w:p>
-    <w:tbl>
-      <w:tblPr>
-        <w:tblW w:type="auto" w:w="0"/>
-        <w:jc w:val="center"/>
-        <w:tblLook w:firstColumn="1" w:firstRow="1" w:lastColumn="0" w:lastRow="0" w:noHBand="0" w:noVBand="1" w:val="04A0"/>
-      </w:tblPr>
-      <w:tblGrid>
-        <w:gridCol w:w="2340"/>
-        <w:gridCol w:w="2340"/>
-        <w:gridCol w:w="2340"/>
-        <w:gridCol w:w="2340"/>
-      </w:tblGrid>
-      <w:tr>
-        <w:tc>
-          <w:tcPr>
-            <w:tcW w:type="dxa" w:w="2340"/>
-            <w:shd w:fill="0F766E"/>
-            <w:tcMar>
-              <w:top w:w="140" w:type="dxa"/>
-              <w:bottom w:w="140" w:type="dxa"/>
-              <w:left w:w="140" w:type="dxa"/>
-              <w:right w:w="140" w:type="dxa"/>
-            </w:tcMar>
-          </w:tcPr>
-          <w:p>
-            <w:r>
-              <w:rPr>
-                <w:b/>
-                <w:color w:val="FFFFFF"/>
-                <w:sz w:val="20"/>
-              </w:rPr>
-              <w:t>Kỹ Thuật Né Tránh</w:t>
-            </w:r>
-          </w:p>
-        </w:tc>
-        <w:tc>
-          <w:tcPr>
-            <w:tcW w:type="dxa" w:w="2340"/>
-            <w:shd w:fill="0F766E"/>
-            <w:tcMar>
-              <w:top w:w="140" w:type="dxa"/>
-              <w:bottom w:w="140" w:type="dxa"/>
-              <w:left w:w="140" w:type="dxa"/>
-              <w:right w:w="140" w:type="dxa"/>
-            </w:tcMar>
-          </w:tcPr>
-          <w:p>
-            <w:r>
-              <w:rPr>
-                <w:b/>
-                <w:color w:val="FFFFFF"/>
-                <w:sz w:val="20"/>
-              </w:rPr>
-              <w:t>Cơ Chế Bản Chất</w:t>
-            </w:r>
-          </w:p>
-        </w:tc>
-        <w:tc>
-          <w:tcPr>
-            <w:tcW w:type="dxa" w:w="2340"/>
-            <w:shd w:fill="0F766E"/>
-            <w:tcMar>
-              <w:top w:w="140" w:type="dxa"/>
-              <w:bottom w:w="140" w:type="dxa"/>
-              <w:left w:w="140" w:type="dxa"/>
-              <w:right w:w="140" w:type="dxa"/>
-            </w:tcMar>
-          </w:tcPr>
-          <w:p>
-            <w:r>
-              <w:rPr>
-                <w:b/>
-                <w:color w:val="FFFFFF"/>
-                <w:sz w:val="20"/>
-              </w:rPr>
-              <w:t>Ví Dụ Minh Họa</w:t>
-            </w:r>
-          </w:p>
-        </w:tc>
-        <w:tc>
-          <w:tcPr>
-            <w:tcW w:type="dxa" w:w="2340"/>
-            <w:shd w:fill="0F766E"/>
-            <w:tcMar>
-              <w:top w:w="140" w:type="dxa"/>
-              <w:bottom w:w="140" w:type="dxa"/>
-              <w:left w:w="140" w:type="dxa"/>
-              <w:right w:w="140" w:type="dxa"/>
-            </w:tcMar>
-          </w:tcPr>
-          <w:p>
-            <w:r>
-              <w:rPr>
-                <w:b/>
-                <w:color w:val="FFFFFF"/>
-                <w:sz w:val="20"/>
-              </w:rPr>
-              <w:t>Hậu Quả Đối Với WAF Truyền Thống</w:t>
-            </w:r>
-          </w:p>
-        </w:tc>
-      </w:tr>
-      <w:tr>
-        <w:tc>
-          <w:tcPr>
-            <w:tcW w:type="dxa" w:w="2340"/>
-            <w:shd w:fill="FFFFFF"/>
-            <w:tcMar>
-              <w:top w:w="100" w:type="dxa"/>
-              <w:bottom w:w="100" w:type="dxa"/>
-              <w:left w:w="120" w:type="dxa"/>
-              <w:right w:w="120" w:type="dxa"/>
-            </w:tcMar>
-          </w:tcPr>
-          <w:p>
-            <w:r>
-              <w:rPr>
-                <w:sz w:val="19"/>
-              </w:rPr>
-              <w:t>Mã hóa URL đa tầng (Double URL Encoding)</w:t>
-            </w:r>
-          </w:p>
-        </w:tc>
-        <w:tc>
-          <w:tcPr>
-            <w:tcW w:type="dxa" w:w="2340"/>
-            <w:shd w:fill="FFFFFF"/>
-            <w:tcMar>
-              <w:top w:w="100" w:type="dxa"/>
-              <w:bottom w:w="100" w:type="dxa"/>
-              <w:left w:w="120" w:type="dxa"/>
-              <w:right w:w="120" w:type="dxa"/>
-            </w:tcMar>
-          </w:tcPr>
-          <w:p>
-            <w:r>
-              <w:rPr>
-                <w:sz w:val="19"/>
-              </w:rPr>
-              <w:t>Mã hóa ký tự % thành %25 (dấu ' thành %27 rồi %2527)</w:t>
-            </w:r>
-          </w:p>
-        </w:tc>
-        <w:tc>
-          <w:tcPr>
-            <w:tcW w:type="dxa" w:w="2340"/>
-            <w:shd w:fill="FFFFFF"/>
-            <w:tcMar>
-              <w:top w:w="100" w:type="dxa"/>
-              <w:bottom w:w="100" w:type="dxa"/>
-              <w:left w:w="120" w:type="dxa"/>
-              <w:right w:w="120" w:type="dxa"/>
-            </w:tcMar>
-          </w:tcPr>
-          <w:p>
-            <w:r>
-              <w:rPr>
-                <w:sz w:val="19"/>
-              </w:rPr>
-              <w:t>%2527%20OR%20%2531%253D%2531</w:t>
-            </w:r>
-          </w:p>
-        </w:tc>
-        <w:tc>
-          <w:tcPr>
-            <w:tcW w:type="dxa" w:w="2340"/>
-            <w:shd w:fill="FFFFFF"/>
-            <w:tcMar>
-              <w:top w:w="100" w:type="dxa"/>
-              <w:bottom w:w="100" w:type="dxa"/>
-              <w:left w:w="120" w:type="dxa"/>
-              <w:right w:w="120" w:type="dxa"/>
-            </w:tcMar>
-          </w:tcPr>
-          <w:p>
-            <w:r>
-              <w:rPr>
-                <w:sz w:val="19"/>
-              </w:rPr>
-              <w:t>WAF chỉ giải mã 1 lần thành %27 và bỏ qua; backend giải mã lần 2 kích hoạt SQLi.</w:t>
-            </w:r>
-          </w:p>
-        </w:tc>
-      </w:tr>
-      <w:tr>
-        <w:tc>
-          <w:tcPr>
-            <w:tcW w:type="dxa" w:w="2340"/>
-            <w:shd w:fill="F9FAFB"/>
-            <w:tcMar>
-              <w:top w:w="100" w:type="dxa"/>
-              <w:bottom w:w="100" w:type="dxa"/>
-              <w:left w:w="120" w:type="dxa"/>
-              <w:right w:w="120" w:type="dxa"/>
-            </w:tcMar>
-          </w:tcPr>
-          <w:p>
-            <w:r>
-              <w:rPr>
-                <w:sz w:val="19"/>
-              </w:rPr>
-              <w:t>Chèn chú thích nội tuyến (Inline Comments)</w:t>
-            </w:r>
-          </w:p>
-        </w:tc>
-        <w:tc>
-          <w:tcPr>
-            <w:tcW w:type="dxa" w:w="2340"/>
-            <w:shd w:fill="F9FAFB"/>
-            <w:tcMar>
-              <w:top w:w="100" w:type="dxa"/>
-              <w:bottom w:w="100" w:type="dxa"/>
-              <w:left w:w="120" w:type="dxa"/>
-              <w:right w:w="120" w:type="dxa"/>
-            </w:tcMar>
-          </w:tcPr>
-          <w:p>
-            <w:r>
-              <w:rPr>
-                <w:sz w:val="19"/>
-              </w:rPr>
-              <w:t>Chèn comment vô hại vào giữa từ khóa nhạy cảm</w:t>
-            </w:r>
-          </w:p>
-        </w:tc>
-        <w:tc>
-          <w:tcPr>
-            <w:tcW w:type="dxa" w:w="2340"/>
-            <w:shd w:fill="F9FAFB"/>
-            <w:tcMar>
-              <w:top w:w="100" w:type="dxa"/>
-              <w:bottom w:w="100" w:type="dxa"/>
-              <w:left w:w="120" w:type="dxa"/>
-              <w:right w:w="120" w:type="dxa"/>
-            </w:tcMar>
-          </w:tcPr>
-          <w:p>
-            <w:r>
-              <w:rPr>
-                <w:sz w:val="19"/>
-              </w:rPr>
-              <w:t>UN/**/ION/**/SEL/**/ECT</w:t>
-            </w:r>
-          </w:p>
-        </w:tc>
-        <w:tc>
-          <w:tcPr>
-            <w:tcW w:type="dxa" w:w="2340"/>
-            <w:shd w:fill="F9FAFB"/>
-            <w:tcMar>
-              <w:top w:w="100" w:type="dxa"/>
-              <w:bottom w:w="100" w:type="dxa"/>
-              <w:left w:w="120" w:type="dxa"/>
-              <w:right w:w="120" w:type="dxa"/>
-            </w:tcMar>
-          </w:tcPr>
-          <w:p>
-            <w:r>
-              <w:rPr>
-                <w:sz w:val="19"/>
-              </w:rPr>
-              <w:t>Làm đứt gãy mẫu chuỗi regex chuẩn UNION.*SELECT.</w:t>
-            </w:r>
-          </w:p>
-        </w:tc>
-      </w:tr>
-      <w:tr>
-        <w:tc>
-          <w:tcPr>
-            <w:tcW w:type="dxa" w:w="2340"/>
-            <w:shd w:fill="FFFFFF"/>
-            <w:tcMar>
-              <w:top w:w="100" w:type="dxa"/>
-              <w:bottom w:w="100" w:type="dxa"/>
-              <w:left w:w="120" w:type="dxa"/>
-              <w:right w:w="120" w:type="dxa"/>
-            </w:tcMar>
-          </w:tcPr>
-          <w:p>
-            <w:r>
-              <w:rPr>
-                <w:sz w:val="19"/>
-              </w:rPr>
-              <w:t>Biến đổi chữ hoa/thường xen kẽ</w:t>
-            </w:r>
-          </w:p>
-        </w:tc>
-        <w:tc>
-          <w:tcPr>
-            <w:tcW w:type="dxa" w:w="2340"/>
-            <w:shd w:fill="FFFFFF"/>
-            <w:tcMar>
-              <w:top w:w="100" w:type="dxa"/>
-              <w:bottom w:w="100" w:type="dxa"/>
-              <w:left w:w="120" w:type="dxa"/>
-              <w:right w:w="120" w:type="dxa"/>
-            </w:tcMar>
-          </w:tcPr>
-          <w:p>
-            <w:r>
-              <w:rPr>
-                <w:sz w:val="19"/>
-              </w:rPr>
-              <w:t>Thay đổi ngẫu nhiên trạng thái hoa thường không chuẩn hóa</w:t>
-            </w:r>
-          </w:p>
-        </w:tc>
-        <w:tc>
-          <w:tcPr>
-            <w:tcW w:type="dxa" w:w="2340"/>
-            <w:shd w:fill="FFFFFF"/>
-            <w:tcMar>
-              <w:top w:w="100" w:type="dxa"/>
-              <w:bottom w:w="100" w:type="dxa"/>
-              <w:left w:w="120" w:type="dxa"/>
-              <w:right w:w="120" w:type="dxa"/>
-            </w:tcMar>
-          </w:tcPr>
-          <w:p>
-            <w:r>
-              <w:rPr>
-                <w:sz w:val="19"/>
-              </w:rPr>
-              <w:t>sElEcT, &lt;sCrIpt&gt;, uNiOn</w:t>
-            </w:r>
-          </w:p>
-        </w:tc>
-        <w:tc>
-          <w:tcPr>
-            <w:tcW w:type="dxa" w:w="2340"/>
-            <w:shd w:fill="FFFFFF"/>
-            <w:tcMar>
-              <w:top w:w="100" w:type="dxa"/>
-              <w:bottom w:w="100" w:type="dxa"/>
-              <w:left w:w="120" w:type="dxa"/>
-              <w:right w:w="120" w:type="dxa"/>
-            </w:tcMar>
-          </w:tcPr>
-          <w:p>
-            <w:r>
-              <w:rPr>
-                <w:sz w:val="19"/>
-              </w:rPr>
-              <w:t>Vượt qua regex không thiết lập cờ IGNORECASE.</w:t>
-            </w:r>
-          </w:p>
-        </w:tc>
-      </w:tr>
-      <w:tr>
-        <w:tc>
-          <w:tcPr>
-            <w:tcW w:type="dxa" w:w="2340"/>
-            <w:shd w:fill="F9FAFB"/>
-            <w:tcMar>
-              <w:top w:w="100" w:type="dxa"/>
-              <w:bottom w:w="100" w:type="dxa"/>
-              <w:left w:w="120" w:type="dxa"/>
-              <w:right w:w="120" w:type="dxa"/>
-            </w:tcMar>
-          </w:tcPr>
-          <w:p>
-            <w:r>
-              <w:rPr>
-                <w:sz w:val="19"/>
-              </w:rPr>
-              <w:t>Ký tự khoảng trắng thay thế</w:t>
-            </w:r>
-          </w:p>
-        </w:tc>
-        <w:tc>
-          <w:tcPr>
-            <w:tcW w:type="dxa" w:w="2340"/>
-            <w:shd w:fill="F9FAFB"/>
-            <w:tcMar>
-              <w:top w:w="100" w:type="dxa"/>
-              <w:bottom w:w="100" w:type="dxa"/>
-              <w:left w:w="120" w:type="dxa"/>
-              <w:right w:w="120" w:type="dxa"/>
-            </w:tcMar>
-          </w:tcPr>
-          <w:p>
-            <w:r>
-              <w:rPr>
-                <w:sz w:val="19"/>
-              </w:rPr>
-              <w:t>Dùng ký tự shell/SQL thay thế dấu cách (0x20)</w:t>
-            </w:r>
-          </w:p>
-        </w:tc>
-        <w:tc>
-          <w:tcPr>
-            <w:tcW w:type="dxa" w:w="2340"/>
-            <w:shd w:fill="F9FAFB"/>
-            <w:tcMar>
-              <w:top w:w="100" w:type="dxa"/>
-              <w:bottom w:w="100" w:type="dxa"/>
-              <w:left w:w="120" w:type="dxa"/>
-              <w:right w:w="120" w:type="dxa"/>
-            </w:tcMar>
-          </w:tcPr>
-          <w:p>
-            <w:r>
-              <w:rPr>
-                <w:sz w:val="19"/>
-              </w:rPr>
-              <w:t>$IFS$9 trong Bash; /**/, +, %09 (Tab)</w:t>
-            </w:r>
-          </w:p>
-        </w:tc>
-        <w:tc>
-          <w:tcPr>
-            <w:tcW w:type="dxa" w:w="2340"/>
-            <w:shd w:fill="F9FAFB"/>
-            <w:tcMar>
-              <w:top w:w="100" w:type="dxa"/>
-              <w:bottom w:w="100" w:type="dxa"/>
-              <w:left w:w="120" w:type="dxa"/>
-              <w:right w:w="120" w:type="dxa"/>
-            </w:tcMar>
-          </w:tcPr>
-          <w:p>
-            <w:r>
-              <w:rPr>
-                <w:sz w:val="19"/>
-              </w:rPr>
-              <w:t>Vượt qua các bộ luật kiểm tra khoảng cách chuẩn giữa mệnh đề.</w:t>
-            </w:r>
-          </w:p>
-        </w:tc>
-      </w:tr>
-      <w:tr>
-        <w:tc>
-          <w:tcPr>
-            <w:tcW w:type="dxa" w:w="2340"/>
-            <w:shd w:fill="FFFFFF"/>
-            <w:tcMar>
-              <w:top w:w="100" w:type="dxa"/>
-              <w:bottom w:w="100" w:type="dxa"/>
-              <w:left w:w="120" w:type="dxa"/>
-              <w:right w:w="120" w:type="dxa"/>
-            </w:tcMar>
-          </w:tcPr>
-          <w:p>
-            <w:r>
-              <w:rPr>
-                <w:sz w:val="19"/>
-              </w:rPr>
-              <w:t>Ký tự NULL Byte Injection</w:t>
-            </w:r>
-          </w:p>
-        </w:tc>
-        <w:tc>
-          <w:tcPr>
-            <w:tcW w:type="dxa" w:w="2340"/>
-            <w:shd w:fill="FFFFFF"/>
-            <w:tcMar>
-              <w:top w:w="100" w:type="dxa"/>
-              <w:bottom w:w="100" w:type="dxa"/>
-              <w:left w:w="120" w:type="dxa"/>
-              <w:right w:w="120" w:type="dxa"/>
-            </w:tcMar>
-          </w:tcPr>
-          <w:p>
-            <w:r>
-              <w:rPr>
-                <w:sz w:val="19"/>
-              </w:rPr>
-              <w:t>Chèn ký tự kết thúc chuỗi \x00 hoặc %00</w:t>
-            </w:r>
-          </w:p>
-        </w:tc>
-        <w:tc>
-          <w:tcPr>
-            <w:tcW w:type="dxa" w:w="2340"/>
-            <w:shd w:fill="FFFFFF"/>
-            <w:tcMar>
-              <w:top w:w="100" w:type="dxa"/>
-              <w:bottom w:w="100" w:type="dxa"/>
-              <w:left w:w="120" w:type="dxa"/>
-              <w:right w:w="120" w:type="dxa"/>
-            </w:tcMar>
-          </w:tcPr>
-          <w:p>
-            <w:r>
-              <w:rPr>
-                <w:sz w:val="19"/>
-              </w:rPr>
-              <w:t>../../etc/passwd%00.jpg</w:t>
-            </w:r>
-          </w:p>
-        </w:tc>
-        <w:tc>
-          <w:tcPr>
-            <w:tcW w:type="dxa" w:w="2340"/>
-            <w:shd w:fill="FFFFFF"/>
-            <w:tcMar>
-              <w:top w:w="100" w:type="dxa"/>
-              <w:bottom w:w="100" w:type="dxa"/>
-              <w:left w:w="120" w:type="dxa"/>
-              <w:right w:w="120" w:type="dxa"/>
-            </w:tcMar>
-          </w:tcPr>
-          <w:p>
-            <w:r>
-              <w:rPr>
-                <w:sz w:val="19"/>
-              </w:rPr>
-              <w:t>Lừa hàm kiểm tra đuôi mở rộng file ở C/C++, cắt cụt chuỗi kiểm tra.</w:t>
-            </w:r>
-          </w:p>
-        </w:tc>
-      </w:tr>
-      <w:tr>
-        <w:tc>
-          <w:tcPr>
-            <w:tcW w:type="dxa" w:w="2340"/>
-            <w:shd w:fill="F9FAFB"/>
-            <w:tcMar>
-              <w:top w:w="100" w:type="dxa"/>
-              <w:bottom w:w="100" w:type="dxa"/>
-              <w:left w:w="120" w:type="dxa"/>
-              <w:right w:w="120" w:type="dxa"/>
-            </w:tcMar>
-          </w:tcPr>
-          <w:p>
-            <w:r>
-              <w:rPr>
-                <w:sz w:val="19"/>
-              </w:rPr>
-              <w:t>Thực thi lệnh gián tiếp &amp; Đa hình</w:t>
-            </w:r>
-          </w:p>
-        </w:tc>
-        <w:tc>
-          <w:tcPr>
-            <w:tcW w:type="dxa" w:w="2340"/>
-            <w:shd w:fill="F9FAFB"/>
-            <w:tcMar>
-              <w:top w:w="100" w:type="dxa"/>
-              <w:bottom w:w="100" w:type="dxa"/>
-              <w:left w:w="120" w:type="dxa"/>
-              <w:right w:w="120" w:type="dxa"/>
-            </w:tcMar>
-          </w:tcPr>
-          <w:p>
-            <w:r>
-              <w:rPr>
-                <w:sz w:val="19"/>
-              </w:rPr>
-              <w:t>Tận dụng biến môi trường, nối chuỗi và subshell</w:t>
-            </w:r>
-          </w:p>
-        </w:tc>
-        <w:tc>
-          <w:tcPr>
-            <w:tcW w:type="dxa" w:w="2340"/>
-            <w:shd w:fill="F9FAFB"/>
-            <w:tcMar>
-              <w:top w:w="100" w:type="dxa"/>
-              <w:bottom w:w="100" w:type="dxa"/>
-              <w:left w:w="120" w:type="dxa"/>
-              <w:right w:w="120" w:type="dxa"/>
-            </w:tcMar>
-          </w:tcPr>
-          <w:p>
-            <w:r>
-              <w:rPr>
-                <w:sz w:val="19"/>
-              </w:rPr>
-              <w:t>c''a""t /e*c/pas*wd, $(echo Y2F0...|base64 -d)</w:t>
-            </w:r>
-          </w:p>
-        </w:tc>
-        <w:tc>
-          <w:tcPr>
-            <w:tcW w:type="dxa" w:w="2340"/>
-            <w:shd w:fill="F9FAFB"/>
-            <w:tcMar>
-              <w:top w:w="100" w:type="dxa"/>
-              <w:bottom w:w="100" w:type="dxa"/>
-              <w:left w:w="120" w:type="dxa"/>
-              <w:right w:w="120" w:type="dxa"/>
-            </w:tcMar>
-          </w:tcPr>
-          <w:p>
-            <w:r>
-              <w:rPr>
-                <w:sz w:val="19"/>
-              </w:rPr>
-              <w:t>Không chứa bất kỳ từ khóa tĩnh nào trong payload, vô hiệu hóa chữ ký tĩnh.</w:t>
-            </w:r>
-          </w:p>
-        </w:tc>
-      </w:tr>
-    </w:tbl>
-    <w:p>
-      <w:pPr>
-        <w:spacing w:after="120"/>
-      </w:pPr>
-    </w:p>
-    <w:p>
-      <w:pPr>
-        <w:keepNext/>
         <w:spacing w:before="280" w:after="120"/>
       </w:pPr>
       <w:r>
         <w:rPr>
           <w:b/>
           <w:color w:val="0F766E"/>
-          <w:sz w:val="28"/>
+          <w:sz w:val="30"/>
         </w:rPr>
-        <w:t>1.2. CƠ CHẾ HOẠT ĐỘNG CỦA TƯỜNG LỬA ỨNG DỤNG WEB (WAF) VÀ GIỚI HẠN CỦA PHƯƠNG PHÁP TRUYỀN THỐNG</w:t>
+        <w:t>1.2. CƠ SỞ LÝ THUYẾT VỀ TƯỜNG LỬA ỨNG DỤNG WEB (WAF) VÀ HỆ THỐNG LUẬT CHỮ KÝ</w:t>
       </w:r>
     </w:p>
     <w:p>
       <w:pPr>
-        <w:keepNext/>
         <w:spacing w:before="200" w:after="80"/>
       </w:pPr>
       <w:r>
         <w:rPr>
           <w:b/>
-          <w:color w:val="1E3A8A"/>
-          <w:sz w:val="24"/>
+          <w:color w:val="1E40AF"/>
+          <w:sz w:val="27"/>
         </w:rPr>
-        <w:t>1.2.1. Phân loại thế hệ Tường lửa và Nguyên lý Cổng tầng ứng dụng (Application-Level Gateway)</w:t>
+        <w:t>1.2.1. Kiến trúc Cổng tầng ứng dụng (Application-Level Gateway) và Reverse Proxy</w:t>
       </w:r>
     </w:p>
     <w:p>
       <w:pPr>
-        <w:spacing w:after="80" w:line="288" w:lineRule="auto"/>
+        <w:spacing w:after="80" w:line="312" w:lineRule="auto"/>
         <w:jc w:val="both"/>
       </w:pPr>
       <w:r>
         <w:rPr>
-          <w:b w:val="0"/>
           <w:i w:val="0"/>
+          <w:sz w:val="26"/>
         </w:rPr>
-        <w:t>Trong công trình giáo trình kinh điển Cryptography and Network Security: Principles and Practice (Chương 20: Firewalls) [Ref 01], Giáo sư William Stallings đã hệ thống hóa tường lửa thành ba thế hệ công nghệ tiến hóa:</w:t>
+        <w:t>Theo giáo trình kinh điển Cryptography and Network Security của William Stallings (Pearson / Prentice Hall) [Ref 01], hệ thống tường lửa (Firewall) được phân loại thành ba thế hệ chính:</w:t>
       </w:r>
     </w:p>
     <w:p>
       <w:pPr>
         <w:pStyle w:val="ListBullet"/>
-        <w:spacing w:after="60" w:line="276" w:lineRule="auto"/>
+        <w:spacing w:after="60" w:line="312" w:lineRule="auto"/>
         <w:jc w:val="both"/>
       </w:pPr>
       <w:r>
         <w:rPr>
           <w:b/>
           <w:color w:val="111827"/>
+          <w:sz w:val="26"/>
         </w:rPr>
         <w:t xml:space="preserve">1. Bộ lọc gói tin (Packet Filtering Firewall): </w:t>
       </w:r>
       <w:r>
-        <w:t>Hoạt động ở tầng Mạng và Vận chuyển (Layer 3 &amp; 4), chỉ kiểm tra IP và cổng TCP/UDP mà không hiểu nội dung ứng dụng.</w:t>
+        <w:rPr>
+          <w:sz w:val="26"/>
+        </w:rPr>
+        <w:t>Hoạt động tại tầng Network/Transport (Layer 3/4), chỉ kiểm tra địa chỉ IP, cổng (Port) và cờ TCP mà không hiểu được nội dung bên trong gói tin.</w:t>
       </w:r>
     </w:p>
     <w:p>
       <w:pPr>
         <w:pStyle w:val="ListBullet"/>
-        <w:spacing w:after="60" w:line="276" w:lineRule="auto"/>
+        <w:spacing w:after="60" w:line="312" w:lineRule="auto"/>
         <w:jc w:val="both"/>
       </w:pPr>
       <w:r>
         <w:rPr>
           <w:b/>
           <w:color w:val="111827"/>
+          <w:sz w:val="26"/>
         </w:rPr>
-        <w:t xml:space="preserve">2. Bộ lọc trạng thái (Stateful Inspection Firewall): </w:t>
+        <w:t xml:space="preserve">2. Tường lửa trạng thái (Stateful Inspection Firewall): </w:t>
       </w:r>
       <w:r>
-        <w:t>Theo dõi trạng thái kết nối TCP (SYN, ACK, ESTABLISHED) ngăn gói tin giả mạo phiên.</w:t>
+        <w:rPr>
+          <w:sz w:val="26"/>
+        </w:rPr>
+        <w:t>Theo dõi bảng trạng thái của các luồng kết nối TCP/UDP nhưng vẫn bị giới hạn về khả năng bóc tách payload ứng dụng.</w:t>
       </w:r>
     </w:p>
     <w:p>
       <w:pPr>
         <w:pStyle w:val="ListBullet"/>
-        <w:spacing w:after="60" w:line="276" w:lineRule="auto"/>
+        <w:spacing w:after="60" w:line="312" w:lineRule="auto"/>
         <w:jc w:val="both"/>
       </w:pPr>
       <w:r>
         <w:rPr>
           <w:b/>
           <w:color w:val="111827"/>
+          <w:sz w:val="26"/>
         </w:rPr>
-        <w:t xml:space="preserve">3. Cổng tầng ứng dụng (Application-Level Gateway / Reverse Proxy WAF): </w:t>
+        <w:t xml:space="preserve">3. Cổng tầng ứng dụng (Application-Level Gateway / Reverse Proxy): </w:t>
       </w:r>
       <w:r>
-        <w:t>Là thế hệ tường lửa tiên tiến nhất, hoạt động như một Relay Proxy hoàn chỉnh ở Layer 7. Cổng tiếp nhận toàn bộ kết nối TCP từ máy khách, giải nén và tái cấu trúc hoàn chỉnh giao thức HTTP/HTTPS, kiểm tra toàn diện Payload trước khi chuyển tiếp về máy chủ nội bộ.</w:t>
+        <w:rPr>
+          <w:sz w:val="26"/>
+        </w:rPr>
+        <w:t>Đóng vai trò máy chủ trung gian (Proxy) đứng trước hệ thống backend thực tế. Nó chủ động đón nhận toàn bộ kết nối TCP từ máy khách, phân tích toàn diện giao thức tầng ứng dụng (HTTP/HTTPS), giải mã nội dung (URI, Headers, Body) và thực thi chính sách an ninh trước khi quyết định chuyển tiếp (forward) request đến cụm máy chủ nội bộ.</w:t>
       </w:r>
     </w:p>
     <w:p>
       <w:pPr>
-        <w:spacing w:after="80" w:line="288" w:lineRule="auto"/>
+        <w:spacing w:after="80" w:line="312" w:lineRule="auto"/>
         <w:jc w:val="both"/>
       </w:pPr>
       <w:r>
         <w:rPr>
-          <w:b w:val="0"/>
           <w:i w:val="0"/>
+          <w:sz w:val="26"/>
         </w:rPr>
-        <w:t>Theo kiến trúc điều phối lưu lượng trong cuốn NGINX Cookbook [Ref 05], cơ chế Reverse Proxy WAF mang lại những lợi ích bảo mật vượt trội: ẩn giấu máy chủ gốc (Origin Cloaking), khử trùng tiêu đề giao thức (Hop-by-hop headers sanitization), và cho phép phân luồng kiểm tra chuyên sâu qua Normalizer, Rule Engine, ML Detector và Rate Limiter.</w:t>
+        <w:t>Đồ án PBL6 lựa chọn hiện thực hóa giải pháp WAF Security Gateway theo mô hình Reverse Proxy hiệu năng cao bám sát tiêu chuẩn vận hành trong NGINX Cookbook của Derek DeJonghe (O'Reilly Media) [Ref 05]. Mô hình này đảm bảo tính trong suốt hoàn toàn đối với máy khách bên ngoài, đồng thời che giấu hoàn toàn địa chỉ IP thực tế và cấu trúc mạng nội bộ của máy chủ backend.</w:t>
       </w:r>
     </w:p>
     <w:p>
       <w:pPr>
-        <w:keepNext/>
         <w:spacing w:before="200" w:after="80"/>
       </w:pPr>
       <w:r>
         <w:rPr>
           <w:b/>
-          <w:color w:val="1E3A8A"/>
-          <w:sz w:val="24"/>
+          <w:color w:val="1E40AF"/>
+          <w:sz w:val="27"/>
         </w:rPr>
-        <w:t>1.2.2. Cơ chế chấm điểm bất thường lũy tiến (Anomaly Scoring System)</w:t>
+        <w:t>1.2.2. Cơ chế đối sánh luật chữ ký và giải mã chuẩn hóa (Normalization)</w:t>
       </w:r>
     </w:p>
     <w:p>
       <w:pPr>
-        <w:spacing w:after="80" w:line="288" w:lineRule="auto"/>
+        <w:spacing w:after="80" w:line="312" w:lineRule="auto"/>
         <w:jc w:val="both"/>
       </w:pPr>
       <w:r>
         <w:rPr>
-          <w:b w:val="0"/>
           <w:i w:val="0"/>
+          <w:sz w:val="26"/>
         </w:rPr>
-        <w:t>Khác với phương thức chặn tức thời khi khớp một luật duy nhất (Single-Rule Blocking), chuẩn công nghiệp OWASP ModSecurity Core Rule Set (CRS v4.0) [Ref 07] áp dụng kiến trúc Collaborative Anomaly Scoring System. Mỗi quy tắc khi kích hoạt sẽ gán trọng số rủi ro tích lũy:</w:t>
+        <w:t>Một thách thức lớn trong việc bảo vệ Web API là kẻ tấn công thường áp dụng các kỹ thuật né tránh (Evasion Techniques) bằng cách mã hóa hoặc làm biến dạng payload độc hại: URL Encoding, Double URL Encoding, Unicode Fullwidth/Overlong Encoding, Base64 Encoding, hoặc chèn các ký tự rác (Null Byte, Comment Syntax).</w:t>
+      </w:r>
+    </w:p>
+    <w:p>
+      <w:pPr>
+        <w:spacing w:after="80" w:line="312" w:lineRule="auto"/>
+        <w:jc w:val="both"/>
+      </w:pPr>
+      <w:r>
+        <w:rPr>
+          <w:i w:val="0"/>
+          <w:sz w:val="26"/>
+        </w:rPr>
+        <w:t>Theo đặc tả tiêu chuẩn công nghiệp ModSecurity Core Rule Set (CRS v4.0.0) [Ref 07], WAF Security Gateway trong đồ án triển khai quy trình Chuẩn hóa dữ liệu nhiều giai đoạn (Multi-stage Normalization Pipeline):</w:t>
       </w:r>
     </w:p>
     <w:p>
       <w:pPr>
         <w:pStyle w:val="ListBullet"/>
-        <w:spacing w:after="60" w:line="276" w:lineRule="auto"/>
+        <w:spacing w:after="60" w:line="312" w:lineRule="auto"/>
         <w:jc w:val="both"/>
       </w:pPr>
       <w:r>
         <w:rPr>
           <w:b/>
           <w:color w:val="111827"/>
+          <w:sz w:val="26"/>
         </w:rPr>
-        <w:t xml:space="preserve">CRITICAL (+5 điểm): </w:t>
+        <w:t xml:space="preserve">Giai đoạn 1: </w:t>
       </w:r>
       <w:r>
-        <w:t>Khớp trực tiếp cú pháp khai thác SQLi, OS Command Injection.</w:t>
+        <w:rPr>
+          <w:sz w:val="26"/>
+        </w:rPr>
+        <w:t>Đệ quy giải mã URL Decoding (tối đa 3 vòng lặp) để bóc tách triệt để các payload lồng nhau.</w:t>
       </w:r>
     </w:p>
     <w:p>
       <w:pPr>
         <w:pStyle w:val="ListBullet"/>
-        <w:spacing w:after="60" w:line="276" w:lineRule="auto"/>
+        <w:spacing w:after="60" w:line="312" w:lineRule="auto"/>
         <w:jc w:val="both"/>
       </w:pPr>
       <w:r>
         <w:rPr>
           <w:b/>
           <w:color w:val="111827"/>
+          <w:sz w:val="26"/>
         </w:rPr>
-        <w:t xml:space="preserve">HIGH (+4 điểm): </w:t>
+        <w:t xml:space="preserve">Giai đoạn 2: </w:t>
       </w:r>
       <w:r>
-        <w:t>Phát hiện hành vi quét lỗ hổng, traversal.</w:t>
+        <w:rPr>
+          <w:sz w:val="26"/>
+        </w:rPr>
+        <w:t>Chuyển đổi toàn bộ ký tự sang chữ thường (Lowercase Transformation) và loại bỏ ký tự Null Byte (\x00).</w:t>
       </w:r>
     </w:p>
     <w:p>
       <w:pPr>
         <w:pStyle w:val="ListBullet"/>
-        <w:spacing w:after="60" w:line="276" w:lineRule="auto"/>
+        <w:spacing w:after="60" w:line="312" w:lineRule="auto"/>
         <w:jc w:val="both"/>
       </w:pPr>
       <w:r>
         <w:rPr>
           <w:b/>
           <w:color w:val="111827"/>
+          <w:sz w:val="26"/>
         </w:rPr>
-        <w:t xml:space="preserve">MEDIUM (+3 điểm): </w:t>
+        <w:t xml:space="preserve">Giai đoạn 3: </w:t>
       </w:r>
       <w:r>
-        <w:t>Phát hiện từ khóa nhạy cảm, ký tự đặc biệt.</w:t>
+        <w:rPr>
+          <w:sz w:val="26"/>
+        </w:rPr>
+        <w:t>Nén các khoảng trắng liên tiếp và chuẩn hóa dấu phân cách đường dẫn (\ -&gt; /).</w:t>
+      </w:r>
+    </w:p>
+    <w:p>
+      <w:pPr>
+        <w:spacing w:before="200" w:after="80"/>
+      </w:pPr>
+      <w:r>
+        <w:rPr>
+          <w:b/>
+          <w:color w:val="1E40AF"/>
+          <w:sz w:val="27"/>
+        </w:rPr>
+        <w:t>1.2.3. Cơ chế tính điểm bất thường tích lũy (Anomaly Scoring Model)</w:t>
+      </w:r>
+    </w:p>
+    <w:p>
+      <w:pPr>
+        <w:spacing w:after="80" w:line="312" w:lineRule="auto"/>
+        <w:jc w:val="both"/>
+      </w:pPr>
+      <w:r>
+        <w:rPr>
+          <w:i w:val="0"/>
+          <w:sz w:val="26"/>
+        </w:rPr>
+        <w:t>Thay vì áp dụng cơ chế Chặn tức thì (Traditional Blocking Mode) dễ gây ra tình trạng báo động nhầm (False Positives), hệ thống áp dụng Cơ chế tính điểm bất thường tích lũy (Anomaly Scoring Model) theo chuẩn ModSecurity CRS v4.0.0 [Ref 07]. Mỗi quy tắc chữ ký khi khớp sẽ gắn một trọng số rủi ro tương ứng với mức độ nghiêm trọng:</w:t>
       </w:r>
     </w:p>
     <w:p>
       <w:pPr>
         <w:pStyle w:val="ListBullet"/>
-        <w:spacing w:after="60" w:line="276" w:lineRule="auto"/>
+        <w:spacing w:after="60" w:line="312" w:lineRule="auto"/>
         <w:jc w:val="both"/>
       </w:pPr>
       <w:r>
         <w:rPr>
           <w:b/>
           <w:color w:val="111827"/>
+          <w:sz w:val="26"/>
         </w:rPr>
-        <w:t xml:space="preserve">LOW (+2 điểm): </w:t>
+        <w:t xml:space="preserve">CRITICAL (+5 điểm): </w:t>
       </w:r>
       <w:r>
-        <w:t>Sai lệch chuẩn giao thức HTTP.</w:t>
-      </w:r>
-    </w:p>
-    <w:tbl>
-      <w:tblPr>
-        <w:tblW w:type="auto" w:w="0"/>
-        <w:jc w:val="center"/>
-        <w:tblLook w:firstColumn="1" w:firstRow="1" w:lastColumn="0" w:lastRow="0" w:noHBand="0" w:noVBand="1" w:val="04A0"/>
-      </w:tblPr>
-      <w:tblGrid>
-        <w:gridCol w:w="9360"/>
-      </w:tblGrid>
-      <w:tr>
-        <w:tc>
-          <w:tcPr>
-            <w:tcW w:type="dxa" w:w="9360"/>
-            <w:shd w:fill="F3F4F6"/>
-            <w:tcMar>
-              <w:top w:w="140" w:type="dxa"/>
-              <w:bottom w:w="140" w:type="dxa"/>
-              <w:left w:w="200" w:type="dxa"/>
-              <w:right w:w="200" w:type="dxa"/>
-            </w:tcMar>
-          </w:tcPr>
-          <w:p>
-            <w:pPr>
-              <w:jc w:val="center"/>
-            </w:pPr>
-            <w:r>
-              <w:rPr>
-                <w:b/>
-                <w:color w:val="1E293B"/>
-                <w:sz w:val="22"/>
-              </w:rPr>
-              <w:t>S_anomaly = sum_{i in Rules matched} Score(i)</w:t>
-            </w:r>
-          </w:p>
-          <w:p>
-            <w:pPr>
-              <w:jc w:val="center"/>
-            </w:pPr>
-            <w:r>
-              <w:rPr>
-                <w:i/>
-                <w:color w:val="64748B"/>
-                <w:sz w:val="19"/>
-              </w:rPr>
-              <w:t>Công thức tính Điểm bất thường tích lũy (Cumulative Anomaly Score) theo chuẩn OWASP CRS v4.0</w:t>
-            </w:r>
-          </w:p>
-        </w:tc>
-      </w:tr>
-    </w:tbl>
-    <w:p>
-      <w:pPr>
-        <w:spacing w:after="80"/>
-      </w:pPr>
-    </w:p>
-    <w:p>
-      <w:pPr>
-        <w:spacing w:after="80" w:line="288" w:lineRule="auto"/>
-        <w:jc w:val="both"/>
-      </w:pPr>
-      <w:r>
         <w:rPr>
-          <w:b w:val="0"/>
-          <w:i w:val="0"/>
+          <w:sz w:val="26"/>
         </w:rPr>
-        <w:t>Chỉ khi S_anomaly &gt;= Anomaly Threshold (mặc định = 5 điểm), WAF mới thực hiện ngắt kết nối và trả về mã lỗi HTTP 403 Forbidden. Mô hình này giảm thiểu đáng kể tỷ lệ chặn nhầm các yêu cầu hợp lệ.</w:t>
-      </w:r>
-    </w:p>
-    <w:p>
-      <w:pPr>
-        <w:keepNext/>
-        <w:spacing w:before="200" w:after="80"/>
-      </w:pPr>
-      <w:r>
-        <w:rPr>
-          <w:b/>
-          <w:color w:val="1E3A8A"/>
-          <w:sz w:val="24"/>
-        </w:rPr>
-        <w:t>1.2.3. Những giới hạn cốt tử của phương pháp dựa trên luật tĩnh</w:t>
-      </w:r>
-    </w:p>
-    <w:p>
-      <w:pPr>
-        <w:spacing w:after="80" w:line="288" w:lineRule="auto"/>
-        <w:jc w:val="both"/>
-      </w:pPr>
-      <w:r>
-        <w:rPr>
-          <w:b w:val="0"/>
-          <w:i w:val="0"/>
-        </w:rPr>
-        <w:t>Mặc dù đóng vai trò là hàng rào lọc thô không thể thiếu, WAF dựa trên luật tĩnh bộc lộ những khiếm khuyết nội tại theo phân tích của William Stallings [Ref 01]:</w:t>
+        <w:t>Khớp dấu hiệu tiêm mã độc nguy hiểm (SQLi, RCE, Shell Command).</w:t>
       </w:r>
     </w:p>
     <w:p>
       <w:pPr>
         <w:pStyle w:val="ListBullet"/>
-        <w:spacing w:after="60" w:line="276" w:lineRule="auto"/>
+        <w:spacing w:after="60" w:line="312" w:lineRule="auto"/>
         <w:jc w:val="both"/>
       </w:pPr>
       <w:r>
         <w:rPr>
           <w:b/>
           <w:color w:val="111827"/>
+          <w:sz w:val="26"/>
         </w:rPr>
-        <w:t xml:space="preserve">1. Bất lực trước biến thể mới và tấn công chưa từng biết (Zero-day Attacks): </w:t>
+        <w:t xml:space="preserve">HIGH (+4 điểm): </w:t>
       </w:r>
       <w:r>
-        <w:t>Luật chữ ký chỉ phát hiện được những gì đã định nghĩa trước.</w:t>
+        <w:rPr>
+          <w:sz w:val="26"/>
+        </w:rPr>
+        <w:t>Khớp dấu hiệu XSS hoặc đọc tệp tin hệ thống (LFI / Path Traversal).</w:t>
       </w:r>
     </w:p>
     <w:p>
       <w:pPr>
         <w:pStyle w:val="ListBullet"/>
-        <w:spacing w:after="60" w:line="276" w:lineRule="auto"/>
+        <w:spacing w:after="60" w:line="312" w:lineRule="auto"/>
         <w:jc w:val="both"/>
       </w:pPr>
       <w:r>
         <w:rPr>
           <w:b/>
           <w:color w:val="111827"/>
+          <w:sz w:val="26"/>
         </w:rPr>
-        <w:t xml:space="preserve">2. Nghịch lý False Positive vs False Negative: </w:t>
+        <w:t xml:space="preserve">MEDIUM (+3 điểm): </w:t>
       </w:r>
       <w:r>
-        <w:t>Viết regex quá chặt chẽ sẽ chặn nhầm văn bản nghiệp vụ lành tính (báo động giả cao); nới lỏng regex sẽ bị kẻ tấn công làm mờ payload vượt qua (bỏ lọt cao).</w:t>
+        <w:rPr>
+          <w:sz w:val="26"/>
+        </w:rPr>
+        <w:t>Khớp dấu hiệu thăm dò, quét lỗ hổng hoặc user-agent khả nghi.</w:t>
       </w:r>
     </w:p>
     <w:p>
       <w:pPr>
         <w:pStyle w:val="ListBullet"/>
-        <w:spacing w:after="60" w:line="276" w:lineRule="auto"/>
+        <w:spacing w:after="60" w:line="312" w:lineRule="auto"/>
         <w:jc w:val="both"/>
       </w:pPr>
       <w:r>
         <w:rPr>
           <w:b/>
           <w:color w:val="111827"/>
+          <w:sz w:val="26"/>
         </w:rPr>
-        <w:t xml:space="preserve">3. Chi phí tính toán tăng mạnh (Regex Performance Degradation): </w:t>
+        <w:t xml:space="preserve">LOW (+2 điểm): </w:t>
       </w:r>
       <w:r>
-        <w:t>Hàng nghìn regex phức tạp gây suy giảm thông lượng và tiềm ẩn nguy cơ dính tấn công ReDoS.</w:t>
+        <w:rPr>
+          <w:sz w:val="26"/>
+        </w:rPr>
+        <w:t>Sai lệch chuẩn giao thức HTTP.</w:t>
       </w:r>
     </w:p>
     <w:p>
       <w:pPr>
-        <w:keepNext/>
+        <w:spacing w:before="160" w:after="40" w:line="276" w:lineRule="auto"/>
+        <w:jc w:val="center"/>
+      </w:pPr>
+      <m:oMathPara>
+        <m:oMath>
+          <m:sSub>
+            <m:e>
+              <m:r>
+                <m:t>S</m:t>
+              </m:r>
+            </m:e>
+            <m:sub>
+              <m:r>
+                <m:rPr>
+                  <m:nor/>
+                </m:rPr>
+                <m:t>anomaly</m:t>
+              </m:r>
+            </m:sub>
+          </m:sSub>
+          <m:r>
+            <m:t>=</m:t>
+          </m:r>
+          <m:nary>
+            <m:naryPr>
+              <m:chr m:val="∑"/>
+              <m:limLoc m:val="subSup"/>
+              <m:grow m:val="1"/>
+              <m:subHide m:val="off"/>
+              <m:supHide m:val="on"/>
+            </m:naryPr>
+            <m:sub>
+              <m:r>
+                <m:t>i∈</m:t>
+              </m:r>
+              <m:r>
+                <m:rPr>
+                  <m:nor/>
+                </m:rPr>
+                <m:t>Rules matched</m:t>
+              </m:r>
+            </m:sub>
+            <m:sup/>
+            <m:e>
+              <m:r>
+                <m:rPr>
+                  <m:nor/>
+                </m:rPr>
+                <m:t>Score</m:t>
+              </m:r>
+              <m:r>
+                <m:t>(i)</m:t>
+              </m:r>
+            </m:e>
+          </m:nary>
+        </m:oMath>
+      </m:oMathPara>
+    </w:p>
+    <w:p>
+      <w:pPr>
+        <w:spacing w:before="0" w:after="160"/>
+        <w:jc w:val="center"/>
+      </w:pPr>
+      <w:r>
+        <w:rPr>
+          <w:i/>
+          <w:color w:val="4B5563"/>
+          <w:sz w:val="20"/>
+        </w:rPr>
+        <w:t>Công thức (1.1): Công thức tính Điểm bất thường tích lũy (Cumulative Anomaly Score) theo chuẩn OWASP CRS v4.0 [Ref 07]</w:t>
+      </w:r>
+    </w:p>
+    <w:p>
+      <w:pPr>
+        <w:spacing w:after="80" w:line="312" w:lineRule="auto"/>
+        <w:jc w:val="both"/>
+      </w:pPr>
+      <w:r>
+        <w:rPr>
+          <w:i w:val="0"/>
+          <w:sz w:val="26"/>
+        </w:rPr>
+        <w:t>Chỉ khi S_anomaly &gt;= Anomaly Threshold (mặc định là 5.0 điểm), WAF mới thực hiện ngắt kết nối và trả về mã lỗi HTTP 403 Forbidden. Mô hình này giúp giảm thiểu đáng kể tỷ lệ chặn nhầm các yêu cầu hợp lệ.</w:t>
+      </w:r>
+    </w:p>
+    <w:p>
+      <w:pPr>
         <w:spacing w:before="280" w:after="120"/>
       </w:pPr>
       <w:r>
         <w:rPr>
           <w:b/>
           <w:color w:val="0F766E"/>
-          <w:sz w:val="28"/>
+          <w:sz w:val="30"/>
         </w:rPr>
-        <w:t>1.3. CƠ SỞ LÝ THUYẾT VỀ TRÍCH XUẤT ĐẶC TRƯNG VÀ HỌC MÁY TRONG PHÁT HIỆN TẤN CÔNG WEB</w:t>
+        <w:t>1.3. CƠ SỞ LÝ THUYẾT VỀ HỌC MÁY TRONG PHÁT HIỆN TẤN CÔNG WEB</w:t>
       </w:r>
     </w:p>
     <w:p>
       <w:pPr>
-        <w:keepNext/>
         <w:spacing w:before="200" w:after="80"/>
       </w:pPr>
       <w:r>
         <w:rPr>
           <w:b/>
-          <w:color w:val="1E3A8A"/>
-          <w:sz w:val="24"/>
+          <w:color w:val="1E40AF"/>
+          <w:sz w:val="27"/>
         </w:rPr>
-        <w:t>1.3.1. Phương pháp trích xuất đặc trưng hình thái học và thống kê chuỗi HTTP</w:t>
+        <w:t>1.3.1. Kỹ nghệ trích xuất đặc trưng hình thái (Payload Morphology &amp; Statistical Features)</w:t>
       </w:r>
     </w:p>
     <w:p>
       <w:pPr>
-        <w:keepNext/>
-        <w:spacing w:before="120" w:after="40"/>
-      </w:pPr>
-      <w:r>
-        <w:rPr>
-          <w:b/>
-          <w:color w:val="374151"/>
-          <w:sz w:val="22"/>
-        </w:rPr>
-        <w:t>1. Cơ sở toán học của độ hỗn loạn thông tin Shannon Entropy</w:t>
-      </w:r>
-    </w:p>
-    <w:p>
-      <w:pPr>
-        <w:spacing w:after="80" w:line="288" w:lineRule="auto"/>
+        <w:spacing w:after="80" w:line="312" w:lineRule="auto"/>
         <w:jc w:val="both"/>
       </w:pPr>
       <w:r>
         <w:rPr>
-          <w:b w:val="0"/>
           <w:i w:val="0"/>
+          <w:sz w:val="26"/>
         </w:rPr>
-        <w:t>Theo giáo trình kinh điển Cryptography: Theory and Practice của Douglas R. Stinson và Maura B. Paterson (Chương 2: Information Theory) [Ref 02], độ hỗn loạn thông tin (Shannon Entropy) là thước đo định lượng toán học về tính ngẫu nhiên, độ bất định và lượng thông tin trung bình chứa trong một biến ngẫu nhiên rời rạc. Cho chuỗi ký tự payload S có độ dài L, xác suất p(c_i) xuất hiện của ký tự c_i là count(c_i) / L. Độ hỗn loạn Shannon Entropy H(S) (tính theo bit) được định nghĩa:</w:t>
-      </w:r>
-    </w:p>
-    <w:tbl>
-      <w:tblPr>
-        <w:tblW w:type="auto" w:w="0"/>
-        <w:jc w:val="center"/>
-        <w:tblLook w:firstColumn="1" w:firstRow="1" w:lastColumn="0" w:lastRow="0" w:noHBand="0" w:noVBand="1" w:val="04A0"/>
-      </w:tblPr>
-      <w:tblGrid>
-        <w:gridCol w:w="9360"/>
-      </w:tblGrid>
-      <w:tr>
-        <w:tc>
-          <w:tcPr>
-            <w:tcW w:type="dxa" w:w="9360"/>
-            <w:shd w:fill="F3F4F6"/>
-            <w:tcMar>
-              <w:top w:w="140" w:type="dxa"/>
-              <w:bottom w:w="140" w:type="dxa"/>
-              <w:left w:w="200" w:type="dxa"/>
-              <w:right w:w="200" w:type="dxa"/>
-            </w:tcMar>
-          </w:tcPr>
-          <w:p>
-            <w:pPr>
-              <w:jc w:val="center"/>
-            </w:pPr>
-            <w:r>
-              <w:rPr>
-                <w:b/>
-                <w:color w:val="1E293B"/>
-                <w:sz w:val="22"/>
-              </w:rPr>
-              <w:t>H(S) = - sum_{i=1}^{k} p(c_i) * log_2 p(c_i)</w:t>
-            </w:r>
-          </w:p>
-          <w:p>
-            <w:pPr>
-              <w:jc w:val="center"/>
-            </w:pPr>
-            <w:r>
-              <w:rPr>
-                <w:i/>
-                <w:color w:val="64748B"/>
-                <w:sz w:val="19"/>
-              </w:rPr>
-              <w:t>Công thức toán học tính toán Shannon Entropy H(S) của chuỗi payload (Stinson &amp; Paterson, 2018)</w:t>
-            </w:r>
-          </w:p>
-        </w:tc>
-      </w:tr>
-    </w:tbl>
-    <w:p>
-      <w:pPr>
-        <w:spacing w:after="80"/>
-      </w:pPr>
-    </w:p>
-    <w:p>
-      <w:pPr>
-        <w:spacing w:after="80" w:line="288" w:lineRule="auto"/>
-        <w:jc w:val="both"/>
-      </w:pPr>
-      <w:r>
-        <w:rPr>
-          <w:b w:val="0"/>
-          <w:i w:val="0"/>
-        </w:rPr>
-        <w:t>Ý nghĩa an ninh thông tin: Văn bản tự nhiên và tham số lành tính có entropy dao động từ 2.0 đến 3.5. Trong khi đó, payload tấn công làm mờ (Base64, Hex, Shellcode, SQLi đa tầng) có độ phân tán ký tự đều bất thường, khiến entropy tăng vọt lên mức &gt;= 3.8 - 4.5. Do đó, Shannon Entropy là đặc trưng hình thái học cực kỳ nhạy cảm để phát hiện dấu hiệu bất thường mà không cần từ điển chữ ký tĩnh.</w:t>
-      </w:r>
-    </w:p>
-    <w:p>
-      <w:pPr>
-        <w:keepNext/>
-        <w:spacing w:before="120" w:after="40"/>
-      </w:pPr>
-      <w:r>
-        <w:rPr>
-          <w:b/>
-          <w:color w:val="374151"/>
-          <w:sz w:val="22"/>
-        </w:rPr>
-        <w:t>2. Không gian 17 đặc trưng hình thái chuẩn tắc (Canonical 17-D Feature Vector)</w:t>
-      </w:r>
-    </w:p>
-    <w:p>
-      <w:pPr>
-        <w:spacing w:after="80" w:line="288" w:lineRule="auto"/>
-        <w:jc w:val="both"/>
-      </w:pPr>
-      <w:r>
-        <w:rPr>
-          <w:b w:val="0"/>
-          <w:i w:val="0"/>
-        </w:rPr>
-        <w:t>Kế thừa và chuẩn hóa công trình nghiên cứu nền tảng của C. Torrano-Gimenez et al. (Wiley Security and Communication Networks 2015) [Ref 08] và bài báo tổng quan SQLi của M. Hasan et al. (IEEE Access 2023) [Ref 10], đồ án xây dựng vector 17 chiều chuẩn tắc gồm 2 nhóm:</w:t>
+        <w:t>Hạn chế cốt tử của hệ thống luật chữ ký truyền thống là hoàn toàn bất lực trước các cuộc tấn công Zero-day hoặc các biến thể mã độc bị làm rối vượt qua từ điển regex. Để giải quyết triệt để vấn đề này, đồ án PBL6 triển khai mô hình học máy dựa trên Kỹ nghệ trích xuất vector 17 đặc trưng hình thái thống kê bám sát công trình nghiên cứu trên tạp chí Wiley Security and Communication Networks [Ref 15]:</w:t>
       </w:r>
     </w:p>
     <w:p>
       <w:pPr>
         <w:pStyle w:val="ListBullet"/>
-        <w:spacing w:after="60" w:line="276" w:lineRule="auto"/>
+        <w:spacing w:after="60" w:line="312" w:lineRule="auto"/>
         <w:jc w:val="both"/>
       </w:pPr>
       <w:r>
         <w:rPr>
           <w:b/>
           <w:color w:val="111827"/>
+          <w:sz w:val="26"/>
         </w:rPr>
-        <w:t xml:space="preserve">Nhóm 1 (12 đặc trưng hình thái &amp; entropy): </w:t>
+        <w:t xml:space="preserve">1. Đặc trưng độ dài và tỷ lệ cấu trúc: </w:t>
       </w:r>
       <w:r>
-        <w:t>length, entropy, count_single_quote, count_double_quote, count_less_than, count_greater_than, count_semicolon, count_hyphen, count_slash, count_backslash, count_parenthesis, special_char_ratio.</w:t>
+        <w:rPr>
+          <w:sz w:val="26"/>
+        </w:rPr>
+        <w:t>Độ dài chuỗi payload (payload_length), tỷ lệ chữ số (digit_ratio), tỷ lệ chữ cái (alpha_ratio), tỷ lệ ký tự đặc biệt (special_char_ratio).</w:t>
       </w:r>
     </w:p>
     <w:p>
       <w:pPr>
         <w:pStyle w:val="ListBullet"/>
-        <w:spacing w:after="60" w:line="276" w:lineRule="auto"/>
+        <w:spacing w:after="60" w:line="312" w:lineRule="auto"/>
         <w:jc w:val="both"/>
       </w:pPr>
       <w:r>
         <w:rPr>
           <w:b/>
           <w:color w:val="111827"/>
+          <w:sz w:val="26"/>
         </w:rPr>
-        <w:t xml:space="preserve">Nhóm 2 (5 đặc trưng mật độ từ khóa &amp; cú pháp): </w:t>
+        <w:t xml:space="preserve">2. Đặc trưng từ khóa nguy hại theo ngữ cảnh: </w:t>
       </w:r>
       <w:r>
-        <w:t>sql_keyword_count, xss_keyword_count, sqli_regex_matches, xss_regex_matches, path_traversal_matches.</w:t>
+        <w:rPr>
+          <w:sz w:val="26"/>
+        </w:rPr>
+        <w:t>Tần suất xuất hiện các token nhạy cảm trong SQLi (SELECT, UNION, DROP, OR, AND), trong XSS (&lt;script&gt;, onerror, onload), trong Path Traversal (../, ..\\) và trong Command Injection (;, |, &amp;&amp;, /bin/sh, cmd.exe).</w:t>
       </w:r>
     </w:p>
     <w:p>
       <w:pPr>
-        <w:keepNext/>
+        <w:pStyle w:val="ListBullet"/>
+        <w:spacing w:after="60" w:line="312" w:lineRule="auto"/>
+        <w:jc w:val="both"/>
+      </w:pPr>
+      <w:r>
+        <w:rPr>
+          <w:b/>
+          <w:color w:val="111827"/>
+          <w:sz w:val="26"/>
+        </w:rPr>
+        <w:t xml:space="preserve">3. Đặc trưng độ hỗn loạn thông tin (Shannon Entropy): </w:t>
+      </w:r>
+      <w:r>
+        <w:rPr>
+          <w:sz w:val="26"/>
+        </w:rPr>
+        <w:t>Được xác định theo định lý lý thuyết thông tin của Claude Shannon trong giáo trình Cryptography: Theory and Practice của Douglas R. Stinson và Maura B. Paterson [Ref 02].</w:t>
+      </w:r>
+    </w:p>
+    <w:p>
+      <w:pPr>
+        <w:spacing w:before="160" w:after="40" w:line="276" w:lineRule="auto"/>
+        <w:jc w:val="center"/>
+      </w:pPr>
+      <m:oMathPara>
+        <m:oMath>
+          <m:r>
+            <m:t>H(S)=−</m:t>
+          </m:r>
+          <m:nary>
+            <m:naryPr>
+              <m:chr m:val="∑"/>
+              <m:limLoc m:val="subSup"/>
+              <m:grow m:val="1"/>
+              <m:subHide m:val="off"/>
+              <m:supHide m:val="off"/>
+            </m:naryPr>
+            <m:sub>
+              <m:r>
+                <m:t>i=1</m:t>
+              </m:r>
+            </m:sub>
+            <m:sup>
+              <m:r>
+                <m:t>k</m:t>
+              </m:r>
+            </m:sup>
+            <m:e>
+              <m:r>
+                <m:t>p(</m:t>
+              </m:r>
+            </m:e>
+          </m:nary>
+          <m:sSub>
+            <m:e>
+              <m:r>
+                <m:t>c</m:t>
+              </m:r>
+            </m:e>
+            <m:sub>
+              <m:r>
+                <m:t>i</m:t>
+              </m:r>
+            </m:sub>
+          </m:sSub>
+          <m:r>
+            <m:t>)</m:t>
+          </m:r>
+          <m:sSub>
+            <m:e>
+              <m:r>
+                <m:rPr>
+                  <m:sty m:val="p"/>
+                </m:rPr>
+                <m:t>log</m:t>
+              </m:r>
+            </m:e>
+            <m:sub>
+              <m:r>
+                <m:t>2</m:t>
+              </m:r>
+            </m:sub>
+          </m:sSub>
+          <m:r>
+            <m:t>p(</m:t>
+          </m:r>
+          <m:sSub>
+            <m:e>
+              <m:r>
+                <m:t>c</m:t>
+              </m:r>
+            </m:e>
+            <m:sub>
+              <m:r>
+                <m:t>i</m:t>
+              </m:r>
+            </m:sub>
+          </m:sSub>
+          <m:r>
+            <m:t>)</m:t>
+          </m:r>
+        </m:oMath>
+      </m:oMathPara>
+    </w:p>
+    <w:p>
+      <w:pPr>
+        <w:spacing w:before="0" w:after="160"/>
+        <w:jc w:val="center"/>
+      </w:pPr>
+      <w:r>
+        <w:rPr>
+          <w:i/>
+          <w:color w:val="4B5563"/>
+          <w:sz w:val="20"/>
+        </w:rPr>
+        <w:t>Công thức (1.2): Công thức toán học tính toán Shannon Entropy H(S) của chuỗi payload (Stinson &amp; Paterson [Ref 02])</w:t>
+      </w:r>
+    </w:p>
+    <w:p>
+      <w:pPr>
+        <w:spacing w:after="80" w:line="312" w:lineRule="auto"/>
+        <w:jc w:val="both"/>
+      </w:pPr>
+      <w:r>
+        <w:rPr>
+          <w:i w:val="0"/>
+          <w:sz w:val="26"/>
+        </w:rPr>
+        <w:t>Trong đó p(c_i) là tần suất xuất hiện tương đối của ký tự c_i trong chuỗi. Các payload bị làm rối bằng Base64, mã hex hoặc mã hóa URL đệ quy luôn có độ hỗn loạn Shannon Entropy xấp xỉ mức tối đa, tạo ra ranh giới phân tách toán học cực kỳ rõ ràng so với các tham số nghiệp vụ thông thường.</w:t>
+      </w:r>
+    </w:p>
+    <w:p>
+      <w:pPr>
         <w:spacing w:before="200" w:after="80"/>
       </w:pPr>
       <w:r>
         <w:rPr>
           <w:b/>
-          <w:color w:val="1E3A8A"/>
-          <w:sz w:val="24"/>
+          <w:color w:val="1E40AF"/>
+          <w:sz w:val="27"/>
         </w:rPr>
-        <w:t>1.3.2. Thuật toán học máy có giám sát — Rừng ngẫu nhiên (Random Forest)</w:t>
+        <w:t>1.3.2. Thuật toán Random Forest và cơ chế Ensemble Learning</w:t>
       </w:r>
     </w:p>
     <w:p>
       <w:pPr>
-        <w:spacing w:after="80" w:line="288" w:lineRule="auto"/>
+        <w:spacing w:after="80" w:line="312" w:lineRule="auto"/>
         <w:jc w:val="both"/>
       </w:pPr>
       <w:r>
         <w:rPr>
-          <w:b w:val="0"/>
           <w:i w:val="0"/>
+          <w:sz w:val="26"/>
         </w:rPr>
-        <w:t>Random Forest (Leo Breiman, 2001) huấn luyện một tập hợp B cây quyết định độc lập qua kỹ thuật Bootstrap Aggregating (Bagging) và chọn lọc ngẫu nhiên tập con đặc trưng (Random Subspace). Kết quả phân loại cuối cùng được tổng hợp qua cơ chế bỏ phiếu đa số hoặc trung bình xác suất:</w:t>
+        <w:t>Theo công trình nền tảng Random Forests của Leo Breiman (Machine Learning 2001) [Ref 12], Random Forest là thuật toán học máy có giám sát (Supervised Learning) dựa trên nguyên lý kết hợp (Ensemble Learning) nhiều cây quyết định ngẫu nhiên (Random Decision Trees) bằng kỹ thuật Bootstrap Aggregating (Bagging).</w:t>
       </w:r>
-    </w:p>
-    <w:tbl>
-      <w:tblPr>
-        <w:tblW w:type="auto" w:w="0"/>
-        <w:jc w:val="center"/>
-        <w:tblLook w:firstColumn="1" w:firstRow="1" w:lastColumn="0" w:lastRow="0" w:noHBand="0" w:noVBand="1" w:val="04A0"/>
-      </w:tblPr>
-      <w:tblGrid>
-        <w:gridCol w:w="9360"/>
-      </w:tblGrid>
-      <w:tr>
-        <w:tc>
-          <w:tcPr>
-            <w:tcW w:type="dxa" w:w="9360"/>
-            <w:shd w:fill="F3F4F6"/>
-            <w:tcMar>
-              <w:top w:w="140" w:type="dxa"/>
-              <w:bottom w:w="140" w:type="dxa"/>
-              <w:left w:w="200" w:type="dxa"/>
-              <w:right w:w="200" w:type="dxa"/>
-            </w:tcMar>
-          </w:tcPr>
-          <w:p>
-            <w:pPr>
-              <w:jc w:val="center"/>
-            </w:pPr>
-            <w:r>
-              <w:rPr>
-                <w:b/>
-                <w:color w:val="1E293B"/>
-                <w:sz w:val="22"/>
-              </w:rPr>
-              <w:t>y_hat = argmax_c [ (1 / B) * sum_{b=1}^{B} P_{T_b}(y = c | x) ]</w:t>
-            </w:r>
-          </w:p>
-          <w:p>
-            <w:pPr>
-              <w:jc w:val="center"/>
-            </w:pPr>
-            <w:r>
-              <w:rPr>
-                <w:i/>
-                <w:color w:val="64748B"/>
-                <w:sz w:val="19"/>
-              </w:rPr>
-              <w:t>Công thức tổng hợp phân loại của mô hình kết hợp Random Forest</w:t>
-            </w:r>
-          </w:p>
-        </w:tc>
-      </w:tr>
-    </w:tbl>
-    <w:p>
-      <w:pPr>
-        <w:spacing w:after="80"/>
-      </w:pPr>
     </w:p>
     <w:p>
       <w:pPr>
-        <w:spacing w:after="80" w:line="288" w:lineRule="auto"/>
+        <w:spacing w:before="160" w:after="40" w:line="276" w:lineRule="auto"/>
+        <w:jc w:val="center"/>
+      </w:pPr>
+      <m:oMathPara>
+        <m:oMath>
+          <m:acc>
+            <m:accPr>
+              <m:chr m:val="̂"/>
+            </m:accPr>
+            <m:e>
+              <m:r>
+                <m:t>y</m:t>
+              </m:r>
+            </m:e>
+          </m:acc>
+          <m:r>
+            <m:t>=</m:t>
+          </m:r>
+          <m:r>
+            <m:rPr>
+              <m:sty m:val="p"/>
+            </m:rPr>
+            <m:t>\arg</m:t>
+          </m:r>
+          <m:sSub>
+            <m:e>
+              <m:r>
+                <m:t>max</m:t>
+              </m:r>
+            </m:e>
+            <m:sub>
+              <m:r>
+                <m:t>c∈{0,1}</m:t>
+              </m:r>
+            </m:sub>
+          </m:sSub>
+          <m:d>
+            <m:dPr>
+              <m:sepChr m:val=""/>
+            </m:dPr>
+            <m:e>
+              <m:f>
+                <m:fPr>
+                  <m:type m:val="bar"/>
+                </m:fPr>
+                <m:num>
+                  <m:r>
+                    <m:t>1</m:t>
+                  </m:r>
+                </m:num>
+                <m:den>
+                  <m:r>
+                    <m:t>B</m:t>
+                  </m:r>
+                </m:den>
+              </m:f>
+              <m:nary>
+                <m:naryPr>
+                  <m:chr m:val="∑"/>
+                  <m:limLoc m:val="subSup"/>
+                  <m:grow m:val="1"/>
+                  <m:subHide m:val="off"/>
+                  <m:supHide m:val="off"/>
+                </m:naryPr>
+                <m:sub>
+                  <m:r>
+                    <m:t>b=1</m:t>
+                  </m:r>
+                </m:sub>
+                <m:sup>
+                  <m:r>
+                    <m:t>B</m:t>
+                  </m:r>
+                </m:sup>
+                <m:e>
+                  <m:sSub>
+                    <m:e>
+                      <m:r>
+                        <m:t>P</m:t>
+                      </m:r>
+                    </m:e>
+                    <m:sub>
+                      <m:sSub>
+                        <m:e>
+                          <m:r>
+                            <m:t>T</m:t>
+                          </m:r>
+                        </m:e>
+                        <m:sub>
+                          <m:r>
+                            <m:t>b</m:t>
+                          </m:r>
+                        </m:sub>
+                      </m:sSub>
+                    </m:sub>
+                  </m:sSub>
+                </m:e>
+              </m:nary>
+              <m:r>
+                <m:t>(</m:t>
+              </m:r>
+              <m:r>
+                <m:t>y</m:t>
+              </m:r>
+              <m:r>
+                <m:t>=</m:t>
+              </m:r>
+              <m:r>
+                <m:t>c</m:t>
+              </m:r>
+              <m:r>
+                <m:t>∣</m:t>
+              </m:r>
+              <m:r>
+                <m:t>x</m:t>
+              </m:r>
+              <m:r>
+                <m:t>)</m:t>
+              </m:r>
+            </m:e>
+          </m:d>
+        </m:oMath>
+      </m:oMathPara>
+    </w:p>
+    <w:p>
+      <w:pPr>
+        <w:spacing w:before="0" w:after="160"/>
+        <w:jc w:val="center"/>
+      </w:pPr>
+      <w:r>
+        <w:rPr>
+          <w:i/>
+          <w:color w:val="4B5563"/>
+          <w:sz w:val="20"/>
+        </w:rPr>
+        <w:t>Công thức (1.3): Công thức tổng hợp phân loại của mô hình kết hợp Random Forest theo Breiman [Ref 12]</w:t>
+      </w:r>
+    </w:p>
+    <w:p>
+      <w:pPr>
+        <w:spacing w:after="80" w:line="312" w:lineRule="auto"/>
         <w:jc w:val="both"/>
       </w:pPr>
       <w:r>
         <w:rPr>
-          <w:b w:val="0"/>
           <w:i w:val="0"/>
+          <w:sz w:val="26"/>
         </w:rPr>
-        <w:t>Động lực lựa chọn Random Forest thay vì Deep Learning / Transformers:</w:t>
+        <w:t>Nhờ cơ chế lấy mẫu ngẫu nhiên có hoàn lại (Bootstrap) và chọn tập con ngẫu nhiên các đặc trưng tại mỗi điểm phân nhánh (Feature Subsampling), Random Forest triệt tiêu hiện tượng quá khớp (Overfitting), có khả năng chống chịu nhiễu đối kháng vượt trội so với các thuật toán Boosting tuần tự [Ref 14].</w:t>
       </w:r>
     </w:p>
     <w:p>
       <w:pPr>
-        <w:spacing w:after="80" w:line="288" w:lineRule="auto"/>
-        <w:jc w:val="both"/>
-      </w:pPr>
-      <w:r>
-        <w:rPr>
-          <w:b w:val="0"/>
-          <w:i w:val="0"/>
-        </w:rPr>
-        <w:t>Theo khảo sát thực nghiệm chuyên sâu trên IEEE Access (2024) [Ref 12] và MDPI Electronics (2025) [Ref 11], việc ứng dụng mạng nơ-ron sâu (CNN, Bi-LSTM) hoặc Transformers (BERT) vào tầng WAF Gateway gặp trở ngại lớn về độ trễ suy luận (60ms - 150ms trên CPU). Trong khi đó, Random Forest đạt độ trễ siêu tốc chỉ từ 0.02ms đến 0.05ms trên CPU đơn lõi, đồng thời cung cấp khả năng giải thích tường minh (Feature Importance) và khả năng chống quá khớp cực cao.</w:t>
-      </w:r>
-    </w:p>
-    <w:p>
-      <w:pPr>
-        <w:keepNext/>
         <w:spacing w:before="200" w:after="80"/>
       </w:pPr>
       <w:r>
         <w:rPr>
           <w:b/>
-          <w:color w:val="1E3A8A"/>
-          <w:sz w:val="24"/>
+          <w:color w:val="1E40AF"/>
+          <w:sz w:val="27"/>
         </w:rPr>
-        <w:t>1.3.3. Thuật toán học máy không giám sát — Rừng cô lập (Isolation Forest)</w:t>
+        <w:t>1.3.3. Thuật toán Isolation Forest trong phát hiện tấn công Zero-day</w:t>
       </w:r>
     </w:p>
     <w:p>
       <w:pPr>
-        <w:spacing w:after="80" w:line="288" w:lineRule="auto"/>
+        <w:spacing w:after="80" w:line="312" w:lineRule="auto"/>
         <w:jc w:val="both"/>
       </w:pPr>
       <w:r>
         <w:rPr>
-          <w:b w:val="0"/>
           <w:i w:val="0"/>
+          <w:sz w:val="26"/>
         </w:rPr>
-        <w:t>Để bắt các cuộc tấn công Zero-day hoặc biến dị payload chưa từng thấy, hệ thống tích hợp Isolation Forest (Liu et al. ICDM 2008). Thuật toán xây dựng tập hợp iTrees phân tách ngẫu nhiên dữ liệu; do điểm dị biệt nằm ở vùng thưa thớt, chúng bị cô lập rất nhanh chóng và có độ sâu đường đi h(x) rất ngắn. Điểm bất thường s(x, n) được tính theo công thức:</w:t>
+        <w:t>Để phát hiện các mẫu tấn công dị biệt chưa từng xuất hiện trong tập huấn luyện (Zero-day Anomalies), hệ thống tích hợp thuật toán học không giám sát Isolation Forest của Fei Tony Liu, Kai Ming Ting và Zhi-Hua Zhou (IEEE ICDM 2008) [Ref 11]. Thuật toán hoạt động dựa trên nguyên lý: các điểm dị biệt (anomalies) luôn có số lượng ít và giá trị đặc trưng rất khác biệt so với đa số điểm dữ liệu bình thường, do đó chúng sẽ bị cô lập ở các độ sâu rất nông của cây iTree.</w:t>
       </w:r>
-    </w:p>
-    <w:tbl>
-      <w:tblPr>
-        <w:tblW w:type="auto" w:w="0"/>
-        <w:jc w:val="center"/>
-        <w:tblLook w:firstColumn="1" w:firstRow="1" w:lastColumn="0" w:lastRow="0" w:noHBand="0" w:noVBand="1" w:val="04A0"/>
-      </w:tblPr>
-      <w:tblGrid>
-        <w:gridCol w:w="9360"/>
-      </w:tblGrid>
-      <w:tr>
-        <w:tc>
-          <w:tcPr>
-            <w:tcW w:type="dxa" w:w="9360"/>
-            <w:shd w:fill="F3F4F6"/>
-            <w:tcMar>
-              <w:top w:w="140" w:type="dxa"/>
-              <w:bottom w:w="140" w:type="dxa"/>
-              <w:left w:w="200" w:type="dxa"/>
-              <w:right w:w="200" w:type="dxa"/>
-            </w:tcMar>
-          </w:tcPr>
-          <w:p>
-            <w:pPr>
-              <w:jc w:val="center"/>
-            </w:pPr>
-            <w:r>
-              <w:rPr>
-                <w:b/>
-                <w:color w:val="1E293B"/>
-                <w:sz w:val="22"/>
-              </w:rPr>
-              <w:t>s(x, n) = 2^{ - E(h(x)) / c(n) }</w:t>
-            </w:r>
-          </w:p>
-          <w:p>
-            <w:pPr>
-              <w:jc w:val="center"/>
-            </w:pPr>
-            <w:r>
-              <w:rPr>
-                <w:i/>
-                <w:color w:val="64748B"/>
-                <w:sz w:val="19"/>
-              </w:rPr>
-              <w:t>Công thức tính điểm bất thường Anomaly Score của thuật toán Isolation Forest</w:t>
-            </w:r>
-          </w:p>
-        </w:tc>
-      </w:tr>
-    </w:tbl>
-    <w:p>
-      <w:pPr>
-        <w:spacing w:after="80"/>
-      </w:pPr>
     </w:p>
     <w:p>
       <w:pPr>
-        <w:spacing w:after="80" w:line="288" w:lineRule="auto"/>
+        <w:spacing w:before="160" w:after="40" w:line="276" w:lineRule="auto"/>
+        <w:jc w:val="center"/>
+      </w:pPr>
+      <m:oMathPara>
+        <m:oMath>
+          <m:r>
+            <m:t>s(x,n)=</m:t>
+          </m:r>
+          <m:sSup>
+            <m:e>
+              <m:r>
+                <m:t>2</m:t>
+              </m:r>
+            </m:e>
+            <m:sup>
+              <m:r>
+                <m:t>−</m:t>
+              </m:r>
+              <m:f>
+                <m:fPr>
+                  <m:type m:val="bar"/>
+                </m:fPr>
+                <m:num>
+                  <m:r>
+                    <m:t>E(h(x))</m:t>
+                  </m:r>
+                </m:num>
+                <m:den>
+                  <m:r>
+                    <m:t>c(n)</m:t>
+                  </m:r>
+                </m:den>
+              </m:f>
+            </m:sup>
+          </m:sSup>
+        </m:oMath>
+      </m:oMathPara>
+    </w:p>
+    <w:p>
+      <w:pPr>
+        <w:spacing w:before="0" w:after="160"/>
+        <w:jc w:val="center"/>
+      </w:pPr>
+      <w:r>
+        <w:rPr>
+          <w:i/>
+          <w:color w:val="4B5563"/>
+          <w:sz w:val="20"/>
+        </w:rPr>
+        <w:t>Công thức (1.4): Công thức tính điểm bất thường Anomaly Score của thuật toán Isolation Forest [Ref 11]</w:t>
+      </w:r>
+    </w:p>
+    <w:p>
+      <w:pPr>
+        <w:spacing w:before="160" w:after="40" w:line="276" w:lineRule="auto"/>
+        <w:jc w:val="center"/>
+      </w:pPr>
+      <m:oMathPara>
+        <m:oMath>
+          <m:r>
+            <m:t>c(n)=2</m:t>
+          </m:r>
+          <m:d>
+            <m:dPr>
+              <m:sepChr m:val=""/>
+            </m:dPr>
+            <m:e>
+              <m:r>
+                <m:rPr>
+                  <m:sty m:val="p"/>
+                </m:rPr>
+                <m:t>ln</m:t>
+              </m:r>
+              <m:r>
+                <m:t>(</m:t>
+              </m:r>
+              <m:r>
+                <m:t>n</m:t>
+              </m:r>
+              <m:r>
+                <m:t>−</m:t>
+              </m:r>
+              <m:r>
+                <m:t>1</m:t>
+              </m:r>
+              <m:r>
+                <m:t>)</m:t>
+              </m:r>
+              <m:r>
+                <m:t>+</m:t>
+              </m:r>
+              <m:r>
+                <m:t>0.5772156649</m:t>
+              </m:r>
+            </m:e>
+          </m:d>
+          <m:r>
+            <m:t>−</m:t>
+          </m:r>
+          <m:f>
+            <m:fPr>
+              <m:type m:val="bar"/>
+            </m:fPr>
+            <m:num>
+              <m:r>
+                <m:t>2(n−1)</m:t>
+              </m:r>
+            </m:num>
+            <m:den>
+              <m:r>
+                <m:t>n</m:t>
+              </m:r>
+            </m:den>
+          </m:f>
+        </m:oMath>
+      </m:oMathPara>
+    </w:p>
+    <w:p>
+      <w:pPr>
+        <w:spacing w:before="0" w:after="160"/>
+        <w:jc w:val="center"/>
+      </w:pPr>
+      <w:r>
+        <w:rPr>
+          <w:i/>
+          <w:color w:val="4B5563"/>
+          <w:sz w:val="20"/>
+        </w:rPr>
+        <w:t>Công thức (1.5): Độ dài đường đi trung bình lý thuyết của cây tìm kiếm nhị phân không thành công [Ref 11]</w:t>
+      </w:r>
+    </w:p>
+    <w:p>
+      <w:pPr>
+        <w:spacing w:after="80" w:line="312" w:lineRule="auto"/>
         <w:jc w:val="both"/>
       </w:pPr>
       <w:r>
         <w:rPr>
-          <w:b w:val="0"/>
           <w:i w:val="0"/>
+          <w:sz w:val="26"/>
         </w:rPr>
-        <w:t>Trong đó c(n) là độ dài đường đi trung bình lý thuyết của cây tìm kiếm nhị phân. Khi s -&gt; 1.0, mẫu bị cô lập cực nhanh, tương ứng xác suất rất cao là mối đe dọa Zero-day; khi s &lt; 0.5, mẫu là dữ liệu bình thường lành tính.</w:t>
+        <w:t>Trong đó h(x) là số lần phân nhánh để cô lập điểm x, E(h(x)) là kỳ vọng độ sâu qua rừng cây, và c(n) là hệ số chuẩn hóa theo kích thước tập mẫu n. Khi s(x, n) tiến sát 1.0, điểm dữ liệu có xác suất cực cao là một hành vi bất thường hoặc cuộc tấn công mới chưa từng được gán nhãn.</w:t>
       </w:r>
     </w:p>
     <w:p>
       <w:pPr>
-        <w:keepNext/>
         <w:spacing w:before="200" w:after="80"/>
       </w:pPr>
       <w:r>
         <w:rPr>
           <w:b/>
-          <w:color w:val="1E3A8A"/>
-          <w:sz w:val="24"/>
+          <w:color w:val="1E40AF"/>
+          <w:sz w:val="27"/>
         </w:rPr>
         <w:t>1.3.4. Mô hình dung hợp rủi ro đa tầng (Hybrid Multi-Layer Risk Engine)</w:t>
       </w:r>
     </w:p>
     <w:p>
       <w:pPr>
-        <w:spacing w:after="80" w:line="288" w:lineRule="auto"/>
+        <w:spacing w:after="80" w:line="312" w:lineRule="auto"/>
         <w:jc w:val="both"/>
       </w:pPr>
       <w:r>
         <w:rPr>
-          <w:b w:val="0"/>
           <w:i w:val="0"/>
+          <w:sz w:val="26"/>
         </w:rPr>
-        <w:t>Áp dụng kiến trúc Dual-Stage Pipeline theo nghiên cứu MDPI Electronics 2025 [Ref 11]: Tầng 1 (Fast Path) dùng Rule Engine lọc tĩnh (&lt; 1ms); Tầng 2 (Deep Path) trích xuất 17 đặc trưng và chạy song song qua Random Forest và Isolation Forest. Điểm rủi ro tổng hợp nằm trong thang đo 0.0 - 100.0:</w:t>
+        <w:t>Bám sát nghiên cứu mới nhất trên tạp chí khoa học quốc tế MDPI Electronics (2025) [Ref 13], hệ thống xây dựng cơ chế Dung hợp rủi ro Đa tầng (Dual-Stage Hybrid Pipeline) kết hợp sức mạnh phân tích chuyên sâu của cả 3 tầng phòng thủ:</w:t>
       </w:r>
-    </w:p>
-    <w:tbl>
-      <w:tblPr>
-        <w:tblW w:type="auto" w:w="0"/>
-        <w:jc w:val="center"/>
-        <w:tblLook w:firstColumn="1" w:firstRow="1" w:lastColumn="0" w:lastRow="0" w:noHBand="0" w:noVBand="1" w:val="04A0"/>
-      </w:tblPr>
-      <w:tblGrid>
-        <w:gridCol w:w="9360"/>
-      </w:tblGrid>
-      <w:tr>
-        <w:tc>
-          <w:tcPr>
-            <w:tcW w:type="dxa" w:w="9360"/>
-            <w:shd w:fill="F3F4F6"/>
-            <w:tcMar>
-              <w:top w:w="140" w:type="dxa"/>
-              <w:bottom w:w="140" w:type="dxa"/>
-              <w:left w:w="200" w:type="dxa"/>
-              <w:right w:w="200" w:type="dxa"/>
-            </w:tcMar>
-          </w:tcPr>
-          <w:p>
-            <w:pPr>
-              <w:jc w:val="center"/>
-            </w:pPr>
-            <w:r>
-              <w:rPr>
-                <w:b/>
-                <w:color w:val="1E293B"/>
-                <w:sz w:val="22"/>
-              </w:rPr>
-              <w:t>Risk Score = 0.40 * S_Rule + 0.35 * S_RF + 0.25 * S_Anomaly</w:t>
-            </w:r>
-          </w:p>
-          <w:p>
-            <w:pPr>
-              <w:jc w:val="center"/>
-            </w:pPr>
-            <w:r>
-              <w:rPr>
-                <w:i/>
-                <w:color w:val="64748B"/>
-                <w:sz w:val="19"/>
-              </w:rPr>
-              <w:t>Công thức dung hợp điểm rủi ro đa tầng Hybrid Risk Score</w:t>
-            </w:r>
-          </w:p>
-        </w:tc>
-      </w:tr>
-    </w:tbl>
-    <w:p>
-      <w:pPr>
-        <w:spacing w:after="80"/>
-      </w:pPr>
     </w:p>
     <w:p>
       <w:pPr>
-        <w:spacing w:after="80" w:line="288" w:lineRule="auto"/>
+        <w:spacing w:before="160" w:after="40" w:line="276" w:lineRule="auto"/>
+        <w:jc w:val="center"/>
+      </w:pPr>
+      <m:oMathPara>
+        <m:oMath>
+          <m:r>
+            <m:rPr>
+              <m:nor/>
+            </m:rPr>
+            <m:t>Risk Score</m:t>
+          </m:r>
+          <m:r>
+            <m:t>=0.40·</m:t>
+          </m:r>
+          <m:sSub>
+            <m:e>
+              <m:r>
+                <m:t>S</m:t>
+              </m:r>
+            </m:e>
+            <m:sub>
+              <m:r>
+                <m:rPr>
+                  <m:nor/>
+                </m:rPr>
+                <m:t>Rule</m:t>
+              </m:r>
+            </m:sub>
+          </m:sSub>
+          <m:r>
+            <m:t>+0.35·</m:t>
+          </m:r>
+          <m:sSub>
+            <m:e>
+              <m:r>
+                <m:t>S</m:t>
+              </m:r>
+            </m:e>
+            <m:sub>
+              <m:r>
+                <m:rPr>
+                  <m:nor/>
+                </m:rPr>
+                <m:t>RF</m:t>
+              </m:r>
+            </m:sub>
+          </m:sSub>
+          <m:r>
+            <m:t>+0.25·</m:t>
+          </m:r>
+          <m:sSub>
+            <m:e>
+              <m:r>
+                <m:t>S</m:t>
+              </m:r>
+            </m:e>
+            <m:sub>
+              <m:r>
+                <m:rPr>
+                  <m:nor/>
+                </m:rPr>
+                <m:t>Anomaly</m:t>
+              </m:r>
+            </m:sub>
+          </m:sSub>
+        </m:oMath>
+      </m:oMathPara>
+    </w:p>
+    <w:p>
+      <w:pPr>
+        <w:spacing w:before="0" w:after="160"/>
+        <w:jc w:val="center"/>
+      </w:pPr>
+      <w:r>
+        <w:rPr>
+          <w:i/>
+          <w:color w:val="4B5563"/>
+          <w:sz w:val="20"/>
+        </w:rPr>
+        <w:t>Công thức (1.6): Công thức dung hợp điểm rủi ro đa tầng Hybrid Risk Score [Ref 13]</w:t>
+      </w:r>
+    </w:p>
+    <w:p>
+      <w:pPr>
+        <w:spacing w:after="80" w:line="312" w:lineRule="auto"/>
         <w:jc w:val="both"/>
       </w:pPr>
       <w:r>
         <w:rPr>
-          <w:b w:val="0"/>
           <w:i w:val="0"/>
+          <w:sz w:val="26"/>
         </w:rPr>
-        <w:t>Ma trận ra quyết định phòng thủ phân tầng theo chuẩn MITRE ATT&amp;CK Mitigation [Ref 16]:</w:t>
+        <w:t>Ma trận ra quyết định phòng thủ phân tầng theo chuẩn MITRE ATT&amp;CK Mitigation [Ref 10]:</w:t>
       </w:r>
     </w:p>
     <w:p>
       <w:pPr>
         <w:pStyle w:val="ListBullet"/>
-        <w:spacing w:after="60" w:line="276" w:lineRule="auto"/>
+        <w:spacing w:after="60" w:line="312" w:lineRule="auto"/>
         <w:jc w:val="both"/>
       </w:pPr>
       <w:r>
         <w:rPr>
           <w:b/>
           <w:color w:val="111827"/>
+          <w:sz w:val="26"/>
         </w:rPr>
         <w:t xml:space="preserve">Điểm &lt; 30 (ALLOW): </w:t>
       </w:r>
       <w:r>
+        <w:rPr>
+          <w:sz w:val="26"/>
+        </w:rPr>
         <w:t>Cho phép yêu cầu đi tiếp đến backend API an toàn.</w:t>
       </w:r>
     </w:p>
     <w:p>
       <w:pPr>
         <w:pStyle w:val="ListBullet"/>
-        <w:spacing w:after="60" w:line="276" w:lineRule="auto"/>
+        <w:spacing w:after="60" w:line="312" w:lineRule="auto"/>
         <w:jc w:val="both"/>
       </w:pPr>
       <w:r>
         <w:rPr>
           <w:b/>
           <w:color w:val="111827"/>
+          <w:sz w:val="26"/>
         </w:rPr>
         <w:t xml:space="preserve">Điểm 30 - 59 (MONITOR): </w:t>
       </w:r>
       <w:r>
+        <w:rPr>
+          <w:sz w:val="26"/>
+        </w:rPr>
         <w:t>Cho phép đi qua nhưng ghi nhật ký kiểm toán chuyên sâu.</w:t>
       </w:r>
     </w:p>
     <w:p>
       <w:pPr>
         <w:pStyle w:val="ListBullet"/>
-        <w:spacing w:after="60" w:line="276" w:lineRule="auto"/>
+        <w:spacing w:after="60" w:line="312" w:lineRule="auto"/>
         <w:jc w:val="both"/>
       </w:pPr>
       <w:r>
         <w:rPr>
           <w:b/>
           <w:color w:val="111827"/>
+          <w:sz w:val="26"/>
         </w:rPr>
         <w:t xml:space="preserve">Điểm 60 - 79 (RATE_LIMIT): </w:t>
       </w:r>
       <w:r>
+        <w:rPr>
+          <w:sz w:val="26"/>
+        </w:rPr>
         <w:t>Áp đặt hình phạt cắt giảm hạn ngạch truy cập và trì hoãn phản hồi.</w:t>
       </w:r>
     </w:p>
     <w:p>
       <w:pPr>
         <w:pStyle w:val="ListBullet"/>
-        <w:spacing w:after="60" w:line="276" w:lineRule="auto"/>
+        <w:spacing w:after="60" w:line="312" w:lineRule="auto"/>
         <w:jc w:val="both"/>
       </w:pPr>
       <w:r>
         <w:rPr>
           <w:b/>
           <w:color w:val="111827"/>
+          <w:sz w:val="26"/>
         </w:rPr>
         <w:t xml:space="preserve">Điểm &gt;= 80 (BLOCK): </w:t>
       </w:r>
       <w:r>
+        <w:rPr>
+          <w:sz w:val="26"/>
+        </w:rPr>
         <w:t>Lập tức từ chối yêu cầu với mã lỗi HTTP 403 Forbidden.</w:t>
       </w:r>
     </w:p>
     <w:p>
       <w:pPr>
-        <w:keepNext/>
         <w:spacing w:before="280" w:after="120"/>
       </w:pPr>
       <w:r>
         <w:rPr>
           <w:b/>
           <w:color w:val="0F766E"/>
-          <w:sz w:val="28"/>
+          <w:sz w:val="30"/>
         </w:rPr>
         <w:t>1.4. CƠ SỞ LÝ THUYẾT VỀ THAO TRƯỜNG MẠNG (CYBER RANGE) VÀ TÁC TỬ TẤN CÔNG TỰ ĐỘNG (OFFENSIVE AI)</w:t>
       </w:r>
     </w:p>
     <w:p>
       <w:pPr>
-        <w:keepNext/>
         <w:spacing w:before="200" w:after="80"/>
       </w:pPr>
       <w:r>
         <w:rPr>
           <w:b/>
-          <w:color w:val="1E3A8A"/>
-          <w:sz w:val="24"/>
+          <w:color w:val="1E40AF"/>
+          <w:sz w:val="27"/>
         </w:rPr>
         <w:t>1.4.1. Khung kiến trúc Thao trường mạng phân tán tiêu chuẩn quốc tế</w:t>
       </w:r>
     </w:p>
     <w:p>
       <w:pPr>
-        <w:spacing w:after="80" w:line="288" w:lineRule="auto"/>
+        <w:spacing w:after="80" w:line="312" w:lineRule="auto"/>
         <w:jc w:val="both"/>
       </w:pPr>
       <w:r>
         <w:rPr>
-          <w:b w:val="0"/>
           <w:i w:val="0"/>
+          <w:sz w:val="26"/>
         </w:rPr>
-        <w:t>Theo nghiên cứu nền tảng của M. Yamin et al. (Elsevier Computers &amp; Security 2020) [Ref 14], một nền tảng Cyber Range tiêu chuẩn bao gồm 3 phân hệ cốt lõi:</w:t>
+        <w:t>Theo nghiên cứu nền tảng của M. Yamin et al. (Elsevier Computers &amp; Security 2020) [Ref 16], một hệ thống Thao trường mạng (Cyber Range) tiêu chuẩn bao gồm 3 trụ cột cấu trúc:</w:t>
       </w:r>
     </w:p>
     <w:p>
       <w:pPr>
         <w:pStyle w:val="ListBullet"/>
-        <w:spacing w:after="60" w:line="276" w:lineRule="auto"/>
+        <w:spacing w:after="60" w:line="312" w:lineRule="auto"/>
         <w:jc w:val="both"/>
       </w:pPr>
       <w:r>
         <w:rPr>
           <w:b/>
           <w:color w:val="111827"/>
+          <w:sz w:val="26"/>
         </w:rPr>
         <w:t xml:space="preserve">1. Phân hệ Môi trường mục tiêu (Target Environment): </w:t>
       </w:r>
       <w:r>
-        <w:t>Máy chủ Web API chứa các lỗ hổng OWASP Top 10 và cơ sở dữ liệu cô lập.</w:t>
+        <w:rPr>
+          <w:sz w:val="26"/>
+        </w:rPr>
+        <w:t>Máy chủ Web API chứa các lỗ hổng mô phỏng thực tế.</w:t>
       </w:r>
     </w:p>
     <w:p>
       <w:pPr>
         <w:pStyle w:val="ListBullet"/>
-        <w:spacing w:after="60" w:line="276" w:lineRule="auto"/>
+        <w:spacing w:after="60" w:line="312" w:lineRule="auto"/>
         <w:jc w:val="both"/>
       </w:pPr>
       <w:r>
         <w:rPr>
           <w:b/>
           <w:color w:val="111827"/>
+          <w:sz w:val="26"/>
         </w:rPr>
         <w:t xml:space="preserve">2. Phân hệ Mô phỏng tấn công (Attack Simulation Engine): </w:t>
       </w:r>
       <w:r>
-        <w:t>Tác tử Red Team tự động trinh sát OpenAPI, tạo chuỗi tấn công và đột biến payload.</w:t>
+        <w:rPr>
+          <w:sz w:val="26"/>
+        </w:rPr>
+        <w:t>Tác tử Red Team tự động triển khai các chiến dịch tấn công.</w:t>
       </w:r>
     </w:p>
     <w:p>
       <w:pPr>
         <w:pStyle w:val="ListBullet"/>
-        <w:spacing w:after="60" w:line="276" w:lineRule="auto"/>
+        <w:spacing w:after="60" w:line="312" w:lineRule="auto"/>
         <w:jc w:val="both"/>
       </w:pPr>
       <w:r>
         <w:rPr>
           <w:b/>
           <w:color w:val="111827"/>
+          <w:sz w:val="26"/>
         </w:rPr>
         <w:t xml:space="preserve">3. Phân hệ Giám sát và Chấm điểm (Monitoring &amp; Scoring Subsystem): </w:t>
       </w:r>
       <w:r>
-        <w:t>Thu thập telemetry thời gian thực, đo lường độ trễ mạng và trực quan hóa trung tâm chỉ huy SOC Dashboard.</w:t>
+        <w:rPr>
+          <w:sz w:val="26"/>
+        </w:rPr>
+        <w:t>Thu thập telemetry thời gian thực, đo lường độ trễ và tỷ lệ chặn.</w:t>
       </w:r>
     </w:p>
     <w:p>
       <w:pPr>
-        <w:spacing w:after="80" w:line="288" w:lineRule="auto"/>
+        <w:spacing w:after="80" w:line="312" w:lineRule="auto"/>
         <w:jc w:val="both"/>
       </w:pPr>
       <w:r>
         <w:rPr>
-          <w:b w:val="0"/>
           <w:i w:val="0"/>
+          <w:sz w:val="26"/>
         </w:rPr>
-        <w:t>Đồ án PBL6 hiện thực hóa kiến trúc này trên 2 máy tính vật lý độc lập kết nối qua mạng LAN/Switch (Máy 1: Blue Team; Máy 2: Red Team). Mô hình đa máy trạm phân tán mang lại độ trễ mạng thực (Network RTT), hiện tượng trễ gói tin và tính chân thực cao hơn 85% so với chạy cục bộ localhost [Ref 14].</w:t>
+        <w:t>Đồ án PBL6 hiện thực hóa kiến trúc này trên 2 máy tính vật lý độc lập kết nối qua mạng LAN/Switch Gigabit Ethernet, phân tách hoàn toàn ranh giới giữa bên Tấn công (Red Team Node) và bên Phòng thủ (Blue Team Security Gateway).</w:t>
       </w:r>
     </w:p>
     <w:p>
       <w:pPr>
-        <w:keepNext/>
         <w:spacing w:before="200" w:after="80"/>
       </w:pPr>
       <w:r>
         <w:rPr>
           <w:b/>
-          <w:color w:val="1E3A8A"/>
-          <w:sz w:val="24"/>
+          <w:color w:val="1E40AF"/>
+          <w:sz w:val="27"/>
         </w:rPr>
         <w:t>1.4.2. Cơ sở lý thuyết về Trò chơi an ninh đối kháng (Adversarial Security Game)</w:t>
       </w:r>
     </w:p>
     <w:p>
       <w:pPr>
-        <w:spacing w:after="80" w:line="288" w:lineRule="auto"/>
+        <w:spacing w:after="80" w:line="312" w:lineRule="auto"/>
         <w:jc w:val="both"/>
       </w:pPr>
       <w:r>
         <w:rPr>
-          <w:b w:val="0"/>
           <w:i w:val="0"/>
+          <w:sz w:val="26"/>
         </w:rPr>
-        <w:t>Để thiết lập nền tảng lý thuyết toán học vững chắc cho cuộc đối đầu giữa Red Team và Blue Team trong Thao trường mạng, đồ án vận dụng mô hình hóa hình thức từ giáo trình kinh điển Introduction to Modern Cryptography của Jonathan Katz và Yehuda Lindell (Chương 3: Adversarial Models) [Ref 03].</w:t>
+        <w:t>Để thiết lập nền tảng lý thuyết toán học vững chắc cho cuộc đối đầu giữa Red Team và Blue Team, đồ án vận dụng Lý thuyết Trò chơi An ninh Đối kháng (Security Game) được giảng dạy trong giáo trình kinh điển Introduction to Modern Cryptography của Jonathan Katz và Yehuda Lindell (CRC Press) [Ref 03].</w:t>
       </w:r>
     </w:p>
     <w:p>
       <w:pPr>
-        <w:spacing w:after="80" w:line="288" w:lineRule="auto"/>
+        <w:spacing w:before="160" w:after="40" w:line="276" w:lineRule="auto"/>
+        <w:jc w:val="center"/>
+      </w:pPr>
+      <m:oMathPara>
+        <m:oMath>
+          <m:r>
+            <m:rPr>
+              <m:sty m:val="b"/>
+            </m:rPr>
+            <m:t>Adv</m:t>
+          </m:r>
+          <m:r>
+            <m:t>(𝒜)=</m:t>
+          </m:r>
+          <m:d>
+            <m:dPr>
+              <m:begChr m:val="|"/>
+              <m:sepChr m:val=""/>
+              <m:endChr m:val="|"/>
+            </m:dPr>
+            <m:e>
+              <m:r>
+                <m:t>Pr</m:t>
+              </m:r>
+              <m:r>
+                <m:t>[</m:t>
+              </m:r>
+              <m:r>
+                <m:t>𝒜</m:t>
+              </m:r>
+              <m:r>
+                <m:rPr>
+                  <m:nor/>
+                </m:rPr>
+                <m:t> bypasses WAF</m:t>
+              </m:r>
+              <m:r>
+                <m:t>]</m:t>
+              </m:r>
+              <m:r>
+                <m:t>−</m:t>
+              </m:r>
+              <m:r>
+                <m:t>Pr</m:t>
+              </m:r>
+              <m:r>
+                <m:t>[</m:t>
+              </m:r>
+              <m:r>
+                <m:rPr>
+                  <m:nor/>
+                </m:rPr>
+                <m:t>Random Guess bypasses WAF</m:t>
+              </m:r>
+              <m:r>
+                <m:t>]</m:t>
+              </m:r>
+            </m:e>
+          </m:d>
+        </m:oMath>
+      </m:oMathPara>
+    </w:p>
+    <w:p>
+      <w:pPr>
+        <w:spacing w:before="0" w:after="160"/>
+        <w:jc w:val="center"/>
+      </w:pPr>
+      <w:r>
+        <w:rPr>
+          <w:i/>
+          <w:color w:val="4B5563"/>
+          <w:sz w:val="20"/>
+        </w:rPr>
+        <w:t>Công thức (1.7): Hàm lợi thế tấn công đối kháng (Adversarial Advantage) theo lý thuyết Katz &amp; Lindell [Ref 03]</w:t>
+      </w:r>
+    </w:p>
+    <w:p>
+      <w:pPr>
+        <w:spacing w:after="80" w:line="312" w:lineRule="auto"/>
         <w:jc w:val="both"/>
       </w:pPr>
       <w:r>
         <w:rPr>
-          <w:b w:val="0"/>
           <w:i w:val="0"/>
+          <w:sz w:val="26"/>
         </w:rPr>
-        <w:t>Bài toán vượt rào WAF được hình thức hóa dưới dạng một Trò chơi an ninh đối kháng (Security Game) giữa Bên tấn công (Adversary A) và Bên phòng thủ (Defender/Challenger C):</w:t>
+        <w:t>Hệ thống phòng thủ đạt độ an toàn vững chắc khi và chỉ khi với mọi tác tử tấn công A bị giới hạn tài nguyên đa thức, hàm lợi thế Adv(A) tiệm cận về 0 (negligible function).</w:t>
+      </w:r>
+    </w:p>
+    <w:p>
+      <w:pPr>
+        <w:spacing w:before="200" w:after="80"/>
+      </w:pPr>
+      <w:r>
+        <w:rPr>
+          <w:b/>
+          <w:color w:val="1E40AF"/>
+          <w:sz w:val="27"/>
+        </w:rPr>
+        <w:t>1.4.3. Quy trình trinh sát và Tác tử tấn công tự động (Offensive AI &amp; Red Teaming)</w:t>
+      </w:r>
+    </w:p>
+    <w:p>
+      <w:pPr>
+        <w:spacing w:after="80" w:line="312" w:lineRule="auto"/>
+        <w:jc w:val="both"/>
+      </w:pPr>
+      <w:r>
+        <w:rPr>
+          <w:i w:val="0"/>
+          <w:sz w:val="26"/>
+        </w:rPr>
+        <w:t>Theo phương pháp luận kiểm thử xâm nhập của giáo trình CompTIA PenTest+ [Ref 04], tác tử Red Team tự động vận hành qua 3 pha chiến thuật:</w:t>
       </w:r>
     </w:p>
     <w:p>
       <w:pPr>
         <w:pStyle w:val="ListBullet"/>
-        <w:spacing w:after="60" w:line="276" w:lineRule="auto"/>
+        <w:spacing w:after="60" w:line="312" w:lineRule="auto"/>
         <w:jc w:val="both"/>
       </w:pPr>
       <w:r>
         <w:rPr>
           <w:b/>
           <w:color w:val="111827"/>
+          <w:sz w:val="26"/>
         </w:rPr>
-        <w:t xml:space="preserve">1. Thiết lập (Setup): </w:t>
+        <w:t xml:space="preserve">1. Trinh sát tự động (Reconnaissance &amp; OpenAPI Parsing): </w:t>
       </w:r>
       <w:r>
-        <w:t>Bên phòng thủ C thiết lập hệ thống phòng thủ WAF với tập tham số Pi = {Rules, w_RF, theta_iForest, tau_threshold}.</w:t>
+        <w:rPr>
+          <w:sz w:val="26"/>
+        </w:rPr>
+        <w:t>Bóc tách schema Swagger / OpenAPI để lập danh mục endpoint và kiểu dữ liệu.</w:t>
       </w:r>
     </w:p>
     <w:p>
       <w:pPr>
         <w:pStyle w:val="ListBullet"/>
-        <w:spacing w:after="60" w:line="276" w:lineRule="auto"/>
+        <w:spacing w:after="60" w:line="312" w:lineRule="auto"/>
         <w:jc w:val="both"/>
       </w:pPr>
       <w:r>
         <w:rPr>
           <w:b/>
           <w:color w:val="111827"/>
+          <w:sz w:val="26"/>
         </w:rPr>
-        <w:t xml:space="preserve">2. Truy vấn Oracle: </w:t>
+        <w:t xml:space="preserve">2. Fuzzing phụ thuộc trạng thái (Stateful REST API Fuzzing): </w:t>
       </w:r>
       <w:r>
-        <w:t>Bên tấn công A gửi chuỗi yêu cầu thử nghiệm đến cổng phòng thủ và quan sát phản hồi từ Oracle O_C(x) -&gt; (Status, Latency, Blocked).</w:t>
+        <w:rPr>
+          <w:sz w:val="26"/>
+        </w:rPr>
+        <w:t>Sinh chuỗi request có cấu trúc bám sát ngữ cảnh nghiệp vụ.</w:t>
       </w:r>
     </w:p>
     <w:p>
       <w:pPr>
         <w:pStyle w:val="ListBullet"/>
-        <w:spacing w:after="60" w:line="276" w:lineRule="auto"/>
+        <w:spacing w:after="60" w:line="312" w:lineRule="auto"/>
         <w:jc w:val="both"/>
       </w:pPr>
       <w:r>
         <w:rPr>
           <w:b/>
           <w:color w:val="111827"/>
+          <w:sz w:val="26"/>
         </w:rPr>
-        <w:t xml:space="preserve">3. Mục tiêu: </w:t>
+        <w:t xml:space="preserve">3. Kiểm thử xác minh lỗ hổng: </w:t>
       </w:r>
       <w:r>
-        <w:t>Bên tấn công chiến thắng nếu tìm ra biến thể payload x* sao cho x* khai thác thành công lỗ hổng trên ứng dụng mục tiêu nhưng lại qua mặt được bộ lọc phòng thủ (WAF(x*) = ALLOW).</w:t>
-      </w:r>
-    </w:p>
-    <w:tbl>
-      <w:tblPr>
-        <w:tblW w:type="auto" w:w="0"/>
-        <w:jc w:val="center"/>
-        <w:tblLook w:firstColumn="1" w:firstRow="1" w:lastColumn="0" w:lastRow="0" w:noHBand="0" w:noVBand="1" w:val="04A0"/>
-      </w:tblPr>
-      <w:tblGrid>
-        <w:gridCol w:w="9360"/>
-      </w:tblGrid>
-      <w:tr>
-        <w:tc>
-          <w:tcPr>
-            <w:tcW w:type="dxa" w:w="9360"/>
-            <w:shd w:fill="F3F4F6"/>
-            <w:tcMar>
-              <w:top w:w="140" w:type="dxa"/>
-              <w:bottom w:w="140" w:type="dxa"/>
-              <w:left w:w="200" w:type="dxa"/>
-              <w:right w:w="200" w:type="dxa"/>
-            </w:tcMar>
-          </w:tcPr>
-          <w:p>
-            <w:pPr>
-              <w:jc w:val="center"/>
-            </w:pPr>
-            <w:r>
-              <w:rPr>
-                <w:b/>
-                <w:color w:val="1E293B"/>
-                <w:sz w:val="22"/>
-              </w:rPr>
-              <w:t>Adv(A) = | Pr[A bypasses WAF] - Pr[Random Guess bypasses WAF] |</w:t>
-            </w:r>
-          </w:p>
-          <w:p>
-            <w:pPr>
-              <w:jc w:val="center"/>
-            </w:pPr>
-            <w:r>
-              <w:rPr>
-                <w:i/>
-                <w:color w:val="64748B"/>
-                <w:sz w:val="19"/>
-              </w:rPr>
-              <w:t>Hàm lợi thế tấn công (Adversarial Advantage) theo lý thuyết Katz &amp; Lindell (2020)</w:t>
-            </w:r>
-          </w:p>
-        </w:tc>
-      </w:tr>
-    </w:tbl>
-    <w:p>
-      <w:pPr>
-        <w:spacing w:after="80"/>
-      </w:pPr>
-    </w:p>
-    <w:p>
-      <w:pPr>
-        <w:spacing w:after="80" w:line="288" w:lineRule="auto"/>
-        <w:jc w:val="both"/>
-      </w:pPr>
-      <w:r>
         <w:rPr>
-          <w:b w:val="0"/>
-          <w:i w:val="0"/>
+          <w:sz w:val="26"/>
         </w:rPr>
-        <w:t>Hệ thống phòng thủ đạt độ an toàn vững chắc khi và chỉ khi với mọi tác tử tấn công A bị giới hạn về tài nguyên tính toán PPT, hàm lợi thế Adv(A) là một hàm không đáng kể đối với các lỗ hổng đã biết.</w:t>
+        <w:t>Bơm payload độc hại được đột biến có chủ đích vào từng trường tham số.</w:t>
       </w:r>
     </w:p>
     <w:p>
       <w:pPr>
-        <w:keepNext/>
         <w:spacing w:before="200" w:after="80"/>
       </w:pPr>
       <w:r>
         <w:rPr>
           <w:b/>
-          <w:color w:val="1E3A8A"/>
-          <w:sz w:val="24"/>
+          <w:color w:val="1E40AF"/>
+          <w:sz w:val="27"/>
         </w:rPr>
-        <w:t>1.4.3. Quy trình trinh sát và Tác tử tấn công tự động (Offensive AI &amp; Red Teaming)</w:t>
+        <w:t>1.4.4. Mô hình Học tăng cường sâu (Deep Reinforcement Learning - DQN) trong né tránh phòng thủ</w:t>
       </w:r>
     </w:p>
     <w:p>
       <w:pPr>
-        <w:spacing w:after="80" w:line="288" w:lineRule="auto"/>
+        <w:spacing w:after="80" w:line="312" w:lineRule="auto"/>
         <w:jc w:val="both"/>
       </w:pPr>
       <w:r>
         <w:rPr>
-          <w:b w:val="0"/>
           <w:i w:val="0"/>
+          <w:sz w:val="26"/>
         </w:rPr>
-        <w:t>Theo phương pháp luận kiểm thử xâm nhập của giáo trình CompTIA PenTest+ [Ref 04], tác tử Red Team (Máy 2) được thiết kế vận hành theo chu trình 3 bước:</w:t>
+        <w:t>Bài toán né tránh WAF được mô hình hóa theo Quy trình quyết định Markov (Markov Decision Process - MDP) bám sát giáo trình Reinforcement Learning của Sutton &amp; Barto (MIT Press) [Ref 17] và kiến trúc Deep Q-Network của DeepMind (Nature 2015) [Ref 18]:</w:t>
       </w:r>
     </w:p>
     <w:p>
       <w:pPr>
         <w:pStyle w:val="ListBullet"/>
-        <w:spacing w:after="60" w:line="276" w:lineRule="auto"/>
+        <w:spacing w:after="60" w:line="312" w:lineRule="auto"/>
         <w:jc w:val="both"/>
       </w:pPr>
       <w:r>
         <w:rPr>
           <w:b/>
           <w:color w:val="111827"/>
+          <w:sz w:val="26"/>
         </w:rPr>
-        <w:t xml:space="preserve">1. Trinh sát tự động (Reconnaissance &amp; OpenAPI Parsing): </w:t>
+        <w:t xml:space="preserve">Không gian trạng thái (State Space): </w:t>
       </w:r>
       <w:r>
-        <w:t>Tác tử tự động gửi yêu cầu đọc tài liệu OpenAPI Specification (/openapi.json hoặc /docs), bóc tách danh sách endpoint, phương thức HTTP và cấu trúc schema JSON.</w:t>
+        <w:rPr>
+          <w:sz w:val="26"/>
+        </w:rPr>
+        <w:t>Vector đặc trưng của payload hiện tại và mã phản hồi HTTP từ WAF Gateway.</w:t>
       </w:r>
     </w:p>
     <w:p>
       <w:pPr>
         <w:pStyle w:val="ListBullet"/>
-        <w:spacing w:after="60" w:line="276" w:lineRule="auto"/>
+        <w:spacing w:after="60" w:line="312" w:lineRule="auto"/>
         <w:jc w:val="both"/>
       </w:pPr>
       <w:r>
         <w:rPr>
           <w:b/>
           <w:color w:val="111827"/>
+          <w:sz w:val="26"/>
         </w:rPr>
-        <w:t xml:space="preserve">2. Fuzzing phụ thuộc trạng thái (Stateful REST API Fuzzing): </w:t>
+        <w:t xml:space="preserve">Không gian hành động (Action Space): </w:t>
       </w:r>
       <w:r>
-        <w:t>Vận dụng nguyên lý của công cụ khoa học hàng đầu RESTler (IEEE ICSE 2019) [Ref 17], tác tử xây dựng đồ thị phụ thuộc (Producer-Consumer Dependency Graph) để duy trì token phiên và tham số hợp lệ.</w:t>
+        <w:rPr>
+          <w:sz w:val="26"/>
+        </w:rPr>
+        <w:t>Tập hợp các toán tử đột biến: Double URL Encode, Case Alternation, Comment Injection, Hex Encoding.</w:t>
       </w:r>
     </w:p>
     <w:p>
       <w:pPr>
         <w:pStyle w:val="ListBullet"/>
-        <w:spacing w:after="60" w:line="276" w:lineRule="auto"/>
+        <w:spacing w:after="60" w:line="312" w:lineRule="auto"/>
         <w:jc w:val="both"/>
       </w:pPr>
       <w:r>
         <w:rPr>
           <w:b/>
           <w:color w:val="111827"/>
+          <w:sz w:val="26"/>
         </w:rPr>
-        <w:t xml:space="preserve">3. Kiểm thử xác minh lỗ hổng: </w:t>
+        <w:t xml:space="preserve">Hàm phần thưởng (Reward Function): </w:t>
       </w:r>
       <w:r>
-        <w:t>Bơm payload độc hại được đột biến có chủ đích vào từng tham số và giám sát mã phản hồi HTTP.</w:t>
+        <w:rPr>
+          <w:sz w:val="26"/>
+        </w:rPr>
+        <w:t>+100 điểm khi vượt WAF thành công (HTTP 200), -50 điểm khi bị chặn (HTTP 403).</w:t>
       </w:r>
     </w:p>
     <w:p>
       <w:pPr>
-        <w:spacing w:after="80" w:line="288" w:lineRule="auto"/>
-        <w:jc w:val="both"/>
+        <w:spacing w:before="160" w:after="40" w:line="276" w:lineRule="auto"/>
+        <w:jc w:val="center"/>
+      </w:pPr>
+      <m:oMathPara>
+        <m:oMath>
+          <m:r>
+            <m:t>Q(s,a)←Q(s,a)+α</m:t>
+          </m:r>
+          <m:d>
+            <m:dPr>
+              <m:begChr m:val="["/>
+              <m:sepChr m:val=""/>
+              <m:endChr m:val="]"/>
+            </m:dPr>
+            <m:e>
+              <m:r>
+                <m:t>r</m:t>
+              </m:r>
+              <m:r>
+                <m:t>+</m:t>
+              </m:r>
+              <m:r>
+                <m:t>γ</m:t>
+              </m:r>
+              <m:sSub>
+                <m:e>
+                  <m:r>
+                    <m:t>max</m:t>
+                  </m:r>
+                </m:e>
+                <m:sub>
+                  <m:sSup>
+                    <m:e>
+                      <m:r>
+                        <m:t>a</m:t>
+                      </m:r>
+                    </m:e>
+                    <m:sup>
+                      <m:r>
+                        <m:t>′</m:t>
+                      </m:r>
+                    </m:sup>
+                  </m:sSup>
+                </m:sub>
+              </m:sSub>
+              <m:r>
+                <m:t>Q</m:t>
+              </m:r>
+              <m:r>
+                <m:t>(</m:t>
+              </m:r>
+              <m:sSup>
+                <m:e>
+                  <m:r>
+                    <m:t>s</m:t>
+                  </m:r>
+                </m:e>
+                <m:sup>
+                  <m:r>
+                    <m:t>′</m:t>
+                  </m:r>
+                </m:sup>
+              </m:sSup>
+              <m:r>
+                <m:t>,</m:t>
+              </m:r>
+              <m:sSup>
+                <m:e>
+                  <m:r>
+                    <m:t>a</m:t>
+                  </m:r>
+                </m:e>
+                <m:sup>
+                  <m:r>
+                    <m:t>′</m:t>
+                  </m:r>
+                </m:sup>
+              </m:sSup>
+              <m:r>
+                <m:t>)</m:t>
+              </m:r>
+              <m:r>
+                <m:t>−</m:t>
+              </m:r>
+              <m:r>
+                <m:t>Q</m:t>
+              </m:r>
+              <m:r>
+                <m:t>(</m:t>
+              </m:r>
+              <m:r>
+                <m:t>s</m:t>
+              </m:r>
+              <m:r>
+                <m:t>,</m:t>
+              </m:r>
+              <m:r>
+                <m:t>a</m:t>
+              </m:r>
+              <m:r>
+                <m:t>)</m:t>
+              </m:r>
+            </m:e>
+          </m:d>
+        </m:oMath>
+      </m:oMathPara>
+    </w:p>
+    <w:p>
+      <w:pPr>
+        <w:spacing w:before="0" w:after="160"/>
+        <w:jc w:val="center"/>
       </w:pPr>
       <w:r>
         <w:rPr>
-          <w:b w:val="0"/>
-          <w:i w:val="0"/>
+          <w:i/>
+          <w:color w:val="4B5563"/>
+          <w:sz w:val="20"/>
         </w:rPr>
-        <w:t>Toàn bộ kỹ thuật tấn công được ánh xạ theo danh mục MITRE ATT&amp;CK Enterprise Matrix [Ref 16]: T1190 (Exploit Public-Facing Application), T1059 (Command and Scripting Interpreter), T1083 (File and Directory Discovery) và T1595 (Active Scanning).</w:t>
+        <w:t>Công thức (1.8): Phương trình Bellman cập nhật giá trị Q tối ưu theo thuật toán Q-Learning [Ref 17]</w:t>
       </w:r>
     </w:p>
     <w:p>
       <w:pPr>
-        <w:keepNext/>
+        <w:spacing w:before="280" w:after="120"/>
+      </w:pPr>
+      <w:r>
+        <w:rPr>
+          <w:b/>
+          <w:color w:val="0F766E"/>
+          <w:sz w:val="30"/>
+        </w:rPr>
+        <w:t>1.5. CÁC THƯỚC ĐO VÀ TIÊU CHUẨN ĐÁNH GIÁ HIỆU NĂNG KHOA HỌC</w:t>
+      </w:r>
+    </w:p>
+    <w:p>
+      <w:pPr>
         <w:spacing w:before="200" w:after="80"/>
       </w:pPr>
       <w:r>
         <w:rPr>
           <w:b/>
-          <w:color w:val="1E3A8A"/>
-          <w:sz w:val="24"/>
+          <w:color w:val="1E40AF"/>
+          <w:sz w:val="27"/>
         </w:rPr>
-        <w:t>1.4.4. Mô hình Học tăng cường sâu (Deep Reinforcement Learning - DQN) trong né tránh phòng thủ</w:t>
+        <w:t>1.5.1. Ma trận nhầm lẫn và các chỉ số cốt lõi</w:t>
       </w:r>
     </w:p>
     <w:p>
       <w:pPr>
-        <w:spacing w:after="80" w:line="288" w:lineRule="auto"/>
+        <w:spacing w:after="80" w:line="312" w:lineRule="auto"/>
         <w:jc w:val="both"/>
       </w:pPr>
       <w:r>
         <w:rPr>
-          <w:b w:val="0"/>
           <w:i w:val="0"/>
+          <w:sz w:val="26"/>
         </w:rPr>
-        <w:t>Bài toán né tránh WAF được mô hình hóa theo Quy trình quyết định Markov (Markov Decision Process - MDP) và huấn luyện bằng mạng nơ-ron sâu Deep Q-Network (100% In-house PyTorch, không phụ thuộc API thương mại) [Ref 19, Ref 20]:</w:t>
+        <w:t>Hiệu năng của hệ thống được đánh giá định lượng qua Ma trận nhầm lẫn (Confusion Matrix) với các đại lượng: True Positive (TP), True Negative (TN), False Positive (FP), False Negative (FN):</w:t>
       </w:r>
     </w:p>
     <w:p>
       <w:pPr>
         <w:pStyle w:val="ListBullet"/>
-        <w:spacing w:after="60" w:line="276" w:lineRule="auto"/>
+        <w:spacing w:after="60" w:line="312" w:lineRule="auto"/>
         <w:jc w:val="both"/>
       </w:pPr>
       <w:r>
         <w:rPr>
           <w:b/>
           <w:color w:val="111827"/>
+          <w:sz w:val="26"/>
         </w:rPr>
-        <w:t xml:space="preserve">Không gian trạng thái (State Space): </w:t>
+        <w:t xml:space="preserve">Accuracy: </w:t>
       </w:r>
       <w:r>
-        <w:t>Vector đặc trưng của payload hiện tại và mã phản hồi HTTP từ Gateway (200, 403, 429, 500).</w:t>
+        <w:rPr>
+          <w:sz w:val="26"/>
+        </w:rPr>
+        <w:t>Tỷ lệ dự đoán đúng tổng thể = (TP + TN) / (TP + TN + FP + FN).</w:t>
       </w:r>
     </w:p>
     <w:p>
       <w:pPr>
         <w:pStyle w:val="ListBullet"/>
-        <w:spacing w:after="60" w:line="276" w:lineRule="auto"/>
+        <w:spacing w:after="60" w:line="312" w:lineRule="auto"/>
         <w:jc w:val="both"/>
       </w:pPr>
       <w:r>
         <w:rPr>
           <w:b/>
           <w:color w:val="111827"/>
+          <w:sz w:val="26"/>
         </w:rPr>
-        <w:t xml:space="preserve">Không gian hành động (Action Space): </w:t>
+        <w:t xml:space="preserve">Precision: </w:t>
       </w:r>
       <w:r>
-        <w:t>Tập hợp các toán tử đột biến: Double URL Encode, Inline Comment, Mixed-case, Null-byte, Base64 Wrap, Subshell Expansion.</w:t>
+        <w:rPr>
+          <w:sz w:val="26"/>
+        </w:rPr>
+        <w:t>Độ chuẩn xác của cảnh báo tấn công = TP / (TP + FP).</w:t>
       </w:r>
     </w:p>
     <w:p>
       <w:pPr>
         <w:pStyle w:val="ListBullet"/>
-        <w:spacing w:after="60" w:line="276" w:lineRule="auto"/>
+        <w:spacing w:after="60" w:line="312" w:lineRule="auto"/>
         <w:jc w:val="both"/>
       </w:pPr>
       <w:r>
         <w:rPr>
           <w:b/>
           <w:color w:val="111827"/>
+          <w:sz w:val="26"/>
         </w:rPr>
-        <w:t xml:space="preserve">Hàm phần thưởng (Reward Function): </w:t>
+        <w:t xml:space="preserve">Recall (True Positive Rate - TPR): </w:t>
       </w:r>
       <w:r>
-        <w:t>+100 điểm khi vượt WAF thành công (HTTP 200/500), -50 điểm khi bị chặn (HTTP 403), -10 điểm chi phí độ trễ cho mỗi bước thừa.</w:t>
+        <w:rPr>
+          <w:sz w:val="26"/>
+        </w:rPr>
+        <w:t>Tỷ lệ tóm gọn tấn công = TP / (TP + FN).</w:t>
       </w:r>
-    </w:p>
-    <w:tbl>
-      <w:tblPr>
-        <w:tblW w:type="auto" w:w="0"/>
-        <w:jc w:val="center"/>
-        <w:tblLook w:firstColumn="1" w:firstRow="1" w:lastColumn="0" w:lastRow="0" w:noHBand="0" w:noVBand="1" w:val="04A0"/>
-      </w:tblPr>
-      <w:tblGrid>
-        <w:gridCol w:w="9360"/>
-      </w:tblGrid>
-      <w:tr>
-        <w:tc>
-          <w:tcPr>
-            <w:tcW w:type="dxa" w:w="9360"/>
-            <w:shd w:fill="F3F4F6"/>
-            <w:tcMar>
-              <w:top w:w="140" w:type="dxa"/>
-              <w:bottom w:w="140" w:type="dxa"/>
-              <w:left w:w="200" w:type="dxa"/>
-              <w:right w:w="200" w:type="dxa"/>
-            </w:tcMar>
-          </w:tcPr>
-          <w:p>
-            <w:pPr>
-              <w:jc w:val="center"/>
-            </w:pPr>
-            <w:r>
-              <w:rPr>
-                <w:b/>
-                <w:color w:val="1E293B"/>
-                <w:sz w:val="22"/>
-              </w:rPr>
-              <w:t>Q(s, a) &lt;- Q(s, a) + alpha * [ r + gamma * max_a'( Q(s', a') ) - Q(s, a) ]</w:t>
-            </w:r>
-          </w:p>
-          <w:p>
-            <w:pPr>
-              <w:jc w:val="center"/>
-            </w:pPr>
-            <w:r>
-              <w:rPr>
-                <w:i/>
-                <w:color w:val="64748B"/>
-                <w:sz w:val="19"/>
-              </w:rPr>
-              <w:t>Phương trình cập nhật giá trị Q tối ưu theo thuật toán Q-Learning</w:t>
-            </w:r>
-          </w:p>
-        </w:tc>
-      </w:tr>
-    </w:tbl>
-    <w:p>
-      <w:pPr>
-        <w:spacing w:after="80"/>
-      </w:pPr>
     </w:p>
     <w:p>
       <w:pPr>
-        <w:keepNext/>
+        <w:pStyle w:val="ListBullet"/>
+        <w:spacing w:after="60" w:line="312" w:lineRule="auto"/>
+        <w:jc w:val="both"/>
+      </w:pPr>
+      <w:r>
+        <w:rPr>
+          <w:b/>
+          <w:color w:val="111827"/>
+          <w:sz w:val="26"/>
+        </w:rPr>
+        <w:t xml:space="preserve">False Positive Rate (FPR): </w:t>
+      </w:r>
+      <w:r>
+        <w:rPr>
+          <w:sz w:val="26"/>
+        </w:rPr>
+        <w:t>Tỷ lệ báo động nhầm người dùng hợp lệ = FP / (FP + TN).</w:t>
+      </w:r>
+    </w:p>
+    <w:p>
+      <w:pPr>
+        <w:pStyle w:val="ListBullet"/>
+        <w:spacing w:after="60" w:line="312" w:lineRule="auto"/>
+        <w:jc w:val="both"/>
+      </w:pPr>
+      <w:r>
+        <w:rPr>
+          <w:b/>
+          <w:color w:val="111827"/>
+          <w:sz w:val="26"/>
+        </w:rPr>
+        <w:t xml:space="preserve">F1-Score: </w:t>
+      </w:r>
+      <w:r>
+        <w:rPr>
+          <w:sz w:val="26"/>
+        </w:rPr>
+        <w:t>Trung bình điều hòa giữa Precision và Recall = 2 * (Precision * Recall) / (Precision + Recall).</w:t>
+      </w:r>
+    </w:p>
+    <w:p>
+      <w:pPr>
+        <w:spacing w:before="200" w:after="80"/>
+      </w:pPr>
+      <w:r>
+        <w:rPr>
+          <w:b/>
+          <w:color w:val="1E40AF"/>
+          <w:sz w:val="27"/>
+        </w:rPr>
+        <w:t>1.5.2. Thước đo Youden's Index (J) theo chuẩn OWASP Benchmark Project</w:t>
+      </w:r>
+    </w:p>
+    <w:p>
+      <w:pPr>
+        <w:spacing w:after="80" w:line="312" w:lineRule="auto"/>
+        <w:jc w:val="both"/>
+      </w:pPr>
+      <w:r>
+        <w:rPr>
+          <w:i w:val="0"/>
+          <w:sz w:val="26"/>
+        </w:rPr>
+        <w:t>Theo tiêu chuẩn đánh giá WAF quốc tế của OWASP Benchmark Project [Ref 08], một hệ thống WAF đạt chuẩn khoa học không thể chỉ dựa vào Accuracy mà phải cân bằng tuyệt đối giữa khả năng chặn mã độc và tỷ lệ không làm gián đoạn người dùng hợp lệ:</w:t>
+      </w:r>
+    </w:p>
+    <w:p>
+      <w:pPr>
+        <w:spacing w:before="160" w:after="40" w:line="276" w:lineRule="auto"/>
+        <w:jc w:val="center"/>
+      </w:pPr>
+      <m:oMathPara>
+        <m:oMath>
+          <m:r>
+            <m:t>J=</m:t>
+          </m:r>
+          <m:r>
+            <m:rPr>
+              <m:nor/>
+            </m:rPr>
+            <m:t>TPR</m:t>
+          </m:r>
+          <m:r>
+            <m:t>−</m:t>
+          </m:r>
+          <m:r>
+            <m:rPr>
+              <m:nor/>
+            </m:rPr>
+            <m:t>FPR</m:t>
+          </m:r>
+          <m:r>
+            <m:t>=</m:t>
+          </m:r>
+          <m:f>
+            <m:fPr>
+              <m:type m:val="bar"/>
+            </m:fPr>
+            <m:num>
+              <m:r>
+                <m:rPr>
+                  <m:nor/>
+                </m:rPr>
+                <m:t>TP</m:t>
+              </m:r>
+            </m:num>
+            <m:den>
+              <m:r>
+                <m:rPr>
+                  <m:nor/>
+                </m:rPr>
+                <m:t>TP</m:t>
+              </m:r>
+              <m:r>
+                <m:t>+</m:t>
+              </m:r>
+              <m:r>
+                <m:rPr>
+                  <m:nor/>
+                </m:rPr>
+                <m:t>FN</m:t>
+              </m:r>
+            </m:den>
+          </m:f>
+          <m:r>
+            <m:t>−</m:t>
+          </m:r>
+          <m:f>
+            <m:fPr>
+              <m:type m:val="bar"/>
+            </m:fPr>
+            <m:num>
+              <m:r>
+                <m:rPr>
+                  <m:nor/>
+                </m:rPr>
+                <m:t>FP</m:t>
+              </m:r>
+            </m:num>
+            <m:den>
+              <m:r>
+                <m:rPr>
+                  <m:nor/>
+                </m:rPr>
+                <m:t>FP</m:t>
+              </m:r>
+              <m:r>
+                <m:t>+</m:t>
+              </m:r>
+              <m:r>
+                <m:rPr>
+                  <m:nor/>
+                </m:rPr>
+                <m:t>TN</m:t>
+              </m:r>
+            </m:den>
+          </m:f>
+        </m:oMath>
+      </m:oMathPara>
+    </w:p>
+    <w:p>
+      <w:pPr>
+        <w:spacing w:before="0" w:after="160"/>
+        <w:jc w:val="center"/>
+      </w:pPr>
+      <w:r>
+        <w:rPr>
+          <w:i/>
+          <w:color w:val="4B5563"/>
+          <w:sz w:val="20"/>
+        </w:rPr>
+        <w:t>Công thức (1.9): Chỉ số Youden's Index J theo chuẩn đánh giá WAF của OWASP Benchmark Project [Ref 08]</w:t>
+      </w:r>
+    </w:p>
+    <w:p>
+      <w:pPr>
+        <w:spacing w:after="80" w:line="312" w:lineRule="auto"/>
+        <w:jc w:val="both"/>
+      </w:pPr>
+      <w:r>
+        <w:rPr>
+          <w:i w:val="0"/>
+          <w:sz w:val="26"/>
+        </w:rPr>
+        <w:t>Thang đo J thuộc [-1.0, 1.0]. Hệ thống lý tưởng đạt J = 1.0 (TPR = 100%, FPR = 0%). Nếu J &lt;= 0, hệ thống phòng thủ hoàn toàn vô dụng hoặc gây hại cho dịch vụ.</w:t>
+      </w:r>
+    </w:p>
+    <w:p>
+      <w:pPr>
+        <w:spacing w:before="200" w:after="80"/>
+      </w:pPr>
+      <w:r>
+        <w:rPr>
+          <w:b/>
+          <w:color w:val="1E40AF"/>
+          <w:sz w:val="27"/>
+        </w:rPr>
+        <w:t>1.5.3. Ngân sách độ trễ xử lý (Latency Overhead Budget)</w:t>
+      </w:r>
+    </w:p>
+    <w:p>
+      <w:pPr>
+        <w:spacing w:after="80" w:line="312" w:lineRule="auto"/>
+        <w:jc w:val="both"/>
+      </w:pPr>
+      <w:r>
+        <w:rPr>
+          <w:i w:val="0"/>
+          <w:sz w:val="26"/>
+        </w:rPr>
+        <w:t>Theo tiêu chuẩn vận hành kiến trúc Reverse Proxy hiệu năng cao trong NGINX Cookbook [Ref 05], thời gian WAF can thiệp phân tích gói tin không được làm suy giảm trải nghiệm người dùng:</w:t>
+      </w:r>
+    </w:p>
+    <w:p>
+      <w:pPr>
+        <w:spacing w:before="160" w:after="40" w:line="276" w:lineRule="auto"/>
+        <w:jc w:val="center"/>
+      </w:pPr>
+      <m:oMathPara>
+        <m:oMath>
+          <m:r>
+            <m:t>Δt=</m:t>
+          </m:r>
+          <m:sSub>
+            <m:e>
+              <m:r>
+                <m:t>t</m:t>
+              </m:r>
+            </m:e>
+            <m:sub>
+              <m:r>
+                <m:rPr>
+                  <m:nor/>
+                </m:rPr>
+                <m:t>with\_WAF</m:t>
+              </m:r>
+            </m:sub>
+          </m:sSub>
+          <m:r>
+            <m:t>−</m:t>
+          </m:r>
+          <m:sSub>
+            <m:e>
+              <m:r>
+                <m:t>t</m:t>
+              </m:r>
+            </m:e>
+            <m:sub>
+              <m:r>
+                <m:rPr>
+                  <m:nor/>
+                </m:rPr>
+                <m:t>direct</m:t>
+              </m:r>
+            </m:sub>
+          </m:sSub>
+          <m:r>
+            <m:t>≤15</m:t>
+          </m:r>
+          <m:r>
+            <m:rPr>
+              <m:nor/>
+            </m:rPr>
+            <m:t> ms</m:t>
+          </m:r>
+        </m:oMath>
+      </m:oMathPara>
+    </w:p>
+    <w:p>
+      <w:pPr>
+        <w:spacing w:before="0" w:after="160"/>
+        <w:jc w:val="center"/>
+      </w:pPr>
+      <w:r>
+        <w:rPr>
+          <w:i/>
+          <w:color w:val="4B5563"/>
+          <w:sz w:val="20"/>
+        </w:rPr>
+        <w:t>Công thức (1.10): Ngân sách độ trễ tối đa cho toàn bộ quy trình kiểm tra WAF Hybrid [Ref 05]</w:t>
+      </w:r>
+    </w:p>
+    <w:p>
+      <w:pPr>
         <w:spacing w:before="280" w:after="120"/>
       </w:pPr>
       <w:r>
         <w:rPr>
           <w:b/>
           <w:color w:val="0F766E"/>
-          <w:sz w:val="28"/>
+          <w:sz w:val="30"/>
         </w:rPr>
-        <w:t>1.5. CÁC THƯỚC ĐO VÀ TIÊU CHUẨN ĐÁNH GIÁ HIỆU NĂNG KHOA HỌC</w:t>
+        <w:t>1.6. TỔNG KẾT CHƯƠNG 1</w:t>
       </w:r>
     </w:p>
     <w:p>
       <w:pPr>
-        <w:keepNext/>
-        <w:spacing w:before="200" w:after="80"/>
-      </w:pPr>
-      <w:r>
-        <w:rPr>
-          <w:b/>
-          <w:color w:val="1E3A8A"/>
-          <w:sz w:val="24"/>
-        </w:rPr>
-        <w:t>1.5.1. Ma trận nhầm lẫn và các chỉ số cốt lõi</w:t>
-      </w:r>
-    </w:p>
-    <w:p>
-      <w:pPr>
-        <w:spacing w:after="80" w:line="288" w:lineRule="auto"/>
+        <w:spacing w:after="80" w:line="312" w:lineRule="auto"/>
         <w:jc w:val="both"/>
       </w:pPr>
       <w:r>
         <w:rPr>
-          <w:b w:val="0"/>
           <w:i w:val="0"/>
+          <w:sz w:val="26"/>
         </w:rPr>
-        <w:t>Hiệu năng của hệ thống được đánh giá định lượng qua Ma trận nhầm lẫn (Confusion Matrix) với các chỉ số thống kê chuẩn mực:</w:t>
+        <w:t>Chương 1 đã hoàn thành việc xây dựng nền tảng cơ sở lý thuyết toàn diện, có tính liên kết chặt chẽ:</w:t>
       </w:r>
     </w:p>
     <w:p>
       <w:pPr>
         <w:pStyle w:val="ListBullet"/>
-        <w:spacing w:after="60" w:line="276" w:lineRule="auto"/>
+        <w:spacing w:after="60" w:line="312" w:lineRule="auto"/>
         <w:jc w:val="both"/>
       </w:pPr>
       <w:r>
         <w:rPr>
           <w:b/>
           <w:color w:val="111827"/>
+          <w:sz w:val="26"/>
         </w:rPr>
-        <w:t xml:space="preserve">Accuracy: </w:t>
+        <w:t xml:space="preserve">1. Giáo trình kinh điển: </w:t>
       </w:r>
       <w:r>
-        <w:t>Tỷ lệ dự đoán đúng tổng thể = (TP + TN) / (TP + TN + FP + FN).</w:t>
+        <w:rPr>
+          <w:sz w:val="26"/>
+        </w:rPr>
+        <w:t>Vận dụng lý thuyết Cổng tầng ứng dụng của William Stallings [Ref 01], lý thuyết thông tin Shannon của Douglas Stinson [Ref 02], và Trò chơi an ninh đối kháng của Katz &amp; Lindell [Ref 03].</w:t>
       </w:r>
     </w:p>
     <w:p>
       <w:pPr>
         <w:pStyle w:val="ListBullet"/>
-        <w:spacing w:after="60" w:line="276" w:lineRule="auto"/>
+        <w:spacing w:after="60" w:line="312" w:lineRule="auto"/>
         <w:jc w:val="both"/>
       </w:pPr>
       <w:r>
         <w:rPr>
           <w:b/>
           <w:color w:val="111827"/>
+          <w:sz w:val="26"/>
         </w:rPr>
-        <w:t xml:space="preserve">Precision: </w:t>
+        <w:t xml:space="preserve">2. Tiêu chuẩn công nghiệp: </w:t>
       </w:r>
       <w:r>
-        <w:t>Độ chuẩn xác của cảnh báo tấn công = TP / (TP + FP).</w:t>
+        <w:rPr>
+          <w:sz w:val="26"/>
+        </w:rPr>
+        <w:t>Bám sát bộ rủi ro OWASP Top 10 API Security Risks (2023) [Ref 06], kiến trúc phân tích tính điểm bất thường ModSecurity CRS v4 [Ref 07], và khung chuẩn đánh giá OWASP Benchmark [Ref 08].</w:t>
       </w:r>
     </w:p>
     <w:p>
       <w:pPr>
         <w:pStyle w:val="ListBullet"/>
-        <w:spacing w:after="60" w:line="276" w:lineRule="auto"/>
+        <w:spacing w:after="60" w:line="312" w:lineRule="auto"/>
         <w:jc w:val="both"/>
       </w:pPr>
       <w:r>
         <w:rPr>
           <w:b/>
           <w:color w:val="111827"/>
-        </w:rPr>
-        <w:t xml:space="preserve">Recall (True Positive Rate - TPR): </w:t>
-      </w:r>
-      <w:r>
-        <w:t>Tỷ lệ tóm gọn tấn công = TP / (TP + FN).</w:t>
-      </w:r>
-    </w:p>
-    <w:p>
-      <w:pPr>
-        <w:pStyle w:val="ListBullet"/>
-        <w:spacing w:after="60" w:line="276" w:lineRule="auto"/>
-        <w:jc w:val="both"/>
-      </w:pPr>
-      <w:r>
-        <w:rPr>
-          <w:b/>
-          <w:color w:val="111827"/>
-        </w:rPr>
-        <w:t xml:space="preserve">False Positive Rate (FPR): </w:t>
-      </w:r>
-      <w:r>
-        <w:t>Tỷ lệ báo động nhầm người dùng hợp lệ = FP / (FP + TN).</w:t>
-      </w:r>
-    </w:p>
-    <w:p>
-      <w:pPr>
-        <w:pStyle w:val="ListBullet"/>
-        <w:spacing w:after="60" w:line="276" w:lineRule="auto"/>
-        <w:jc w:val="both"/>
-      </w:pPr>
-      <w:r>
-        <w:rPr>
-          <w:b/>
-          <w:color w:val="111827"/>
-        </w:rPr>
-        <w:t xml:space="preserve">F1-Score: </w:t>
-      </w:r>
-      <w:r>
-        <w:t>Trung bình điều hòa giữa Precision và Recall = 2 * (Precision * Recall) / (Precision + Recall).</w:t>
-      </w:r>
-    </w:p>
-    <w:p>
-      <w:pPr>
-        <w:keepNext/>
-        <w:spacing w:before="200" w:after="80"/>
-      </w:pPr>
-      <w:r>
-        <w:rPr>
-          <w:b/>
-          <w:color w:val="1E3A8A"/>
-          <w:sz w:val="24"/>
-        </w:rPr>
-        <w:t>1.5.2. Thước đo Youden's Index (J) theo chuẩn OWASP Benchmark Project</w:t>
-      </w:r>
-    </w:p>
-    <w:p>
-      <w:pPr>
-        <w:spacing w:after="80" w:line="288" w:lineRule="auto"/>
-        <w:jc w:val="both"/>
-      </w:pPr>
-      <w:r>
-        <w:rPr>
-          <w:b w:val="0"/>
-          <w:i w:val="0"/>
-        </w:rPr>
-        <w:t>Theo tiêu chuẩn đánh giá WAF quốc tế của OWASP Benchmark Project [Ref 13], một hệ thống WAF đạt chuẩn khoa học bắt buộc phải cân bằng giữa khả năng bắt tấn công và khả năng hạn chế tối đa báo động giả. Chỉ số Youden's Index J được định nghĩa:</w:t>
-      </w:r>
-    </w:p>
-    <w:tbl>
-      <w:tblPr>
-        <w:tblW w:type="auto" w:w="0"/>
-        <w:jc w:val="center"/>
-        <w:tblLook w:firstColumn="1" w:firstRow="1" w:lastColumn="0" w:lastRow="0" w:noHBand="0" w:noVBand="1" w:val="04A0"/>
-      </w:tblPr>
-      <w:tblGrid>
-        <w:gridCol w:w="9360"/>
-      </w:tblGrid>
-      <w:tr>
-        <w:tc>
-          <w:tcPr>
-            <w:tcW w:type="dxa" w:w="9360"/>
-            <w:shd w:fill="F3F4F6"/>
-            <w:tcMar>
-              <w:top w:w="140" w:type="dxa"/>
-              <w:bottom w:w="140" w:type="dxa"/>
-              <w:left w:w="200" w:type="dxa"/>
-              <w:right w:w="200" w:type="dxa"/>
-            </w:tcMar>
-          </w:tcPr>
-          <w:p>
-            <w:pPr>
-              <w:jc w:val="center"/>
-            </w:pPr>
-            <w:r>
-              <w:rPr>
-                <w:b/>
-                <w:color w:val="1E293B"/>
-                <w:sz w:val="22"/>
-              </w:rPr>
-              <w:t>J = TPR - FPR = [ TP / (TP + FN) ] - [ FP / (FP + TN) ]</w:t>
-            </w:r>
-          </w:p>
-          <w:p>
-            <w:pPr>
-              <w:jc w:val="center"/>
-            </w:pPr>
-            <w:r>
-              <w:rPr>
-                <w:i/>
-                <w:color w:val="64748B"/>
-                <w:sz w:val="19"/>
-              </w:rPr>
-              <w:t>Chỉ số Youden's Index J theo chuẩn đánh giá WAF của OWASP Benchmark</w:t>
-            </w:r>
-          </w:p>
-        </w:tc>
-      </w:tr>
-    </w:tbl>
-    <w:p>
-      <w:pPr>
-        <w:spacing w:after="80"/>
-      </w:pPr>
-    </w:p>
-    <w:p>
-      <w:pPr>
-        <w:spacing w:after="80" w:line="288" w:lineRule="auto"/>
-        <w:jc w:val="both"/>
-      </w:pPr>
-      <w:r>
-        <w:rPr>
-          <w:b w:val="0"/>
-          <w:i w:val="0"/>
-        </w:rPr>
-        <w:t>Thang đo J thuộc [-1.0, 1.0]. Hệ thống lý tưởng đạt J = 1.0 (TPR = 100%, FPR = 0%). Nếu J &lt;= 0, hệ thống không có giá trị thực tiễn. Mục tiêu của đồ án PBL6 là đạt J &gt;= 0.90 trên tập dữ liệu kiểm nghiệm thực tế.</w:t>
-      </w:r>
-    </w:p>
-    <w:p>
-      <w:pPr>
-        <w:keepNext/>
-        <w:spacing w:before="200" w:after="80"/>
-      </w:pPr>
-      <w:r>
-        <w:rPr>
-          <w:b/>
-          <w:color w:val="1E3A8A"/>
-          <w:sz w:val="24"/>
-        </w:rPr>
-        <w:t>1.5.3. Ngân sách độ trễ xử lý (Latency Overhead Budget)</w:t>
-      </w:r>
-    </w:p>
-    <w:p>
-      <w:pPr>
-        <w:spacing w:after="80" w:line="288" w:lineRule="auto"/>
-        <w:jc w:val="both"/>
-      </w:pPr>
-      <w:r>
-        <w:rPr>
-          <w:b w:val="0"/>
-          <w:i w:val="0"/>
-        </w:rPr>
-        <w:t>Theo tiêu chuẩn vận hành kiến trúc Reverse Proxy hiệu năng cao trong NGINX Cookbook [Ref 05], hệ thống WAF bảo vệ Web API bắt buộc phải tuân thủ nghiêm ngặt ngân sách độ trễ:</w:t>
-      </w:r>
-    </w:p>
-    <w:tbl>
-      <w:tblPr>
-        <w:tblW w:type="auto" w:w="0"/>
-        <w:jc w:val="center"/>
-        <w:tblLook w:firstColumn="1" w:firstRow="1" w:lastColumn="0" w:lastRow="0" w:noHBand="0" w:noVBand="1" w:val="04A0"/>
-      </w:tblPr>
-      <w:tblGrid>
-        <w:gridCol w:w="9360"/>
-      </w:tblGrid>
-      <w:tr>
-        <w:tc>
-          <w:tcPr>
-            <w:tcW w:type="dxa" w:w="9360"/>
-            <w:shd w:fill="F3F4F6"/>
-            <w:tcMar>
-              <w:top w:w="140" w:type="dxa"/>
-              <w:bottom w:w="140" w:type="dxa"/>
-              <w:left w:w="200" w:type="dxa"/>
-              <w:right w:w="200" w:type="dxa"/>
-            </w:tcMar>
-          </w:tcPr>
-          <w:p>
-            <w:pPr>
-              <w:jc w:val="center"/>
-            </w:pPr>
-            <w:r>
-              <w:rPr>
-                <w:b/>
-                <w:color w:val="1E293B"/>
-                <w:sz w:val="22"/>
-              </w:rPr>
-              <w:t>Delta t = t_with_WAF - t_direct &lt;= 15 ms</w:t>
-            </w:r>
-          </w:p>
-          <w:p>
-            <w:pPr>
-              <w:jc w:val="center"/>
-            </w:pPr>
-            <w:r>
-              <w:rPr>
-                <w:i/>
-                <w:color w:val="64748B"/>
-                <w:sz w:val="19"/>
-              </w:rPr>
-              <w:t>Ngân sách độ trễ tối đa cho toàn bộ quy trình kiểm tra WAF Hybrid</w:t>
-            </w:r>
-          </w:p>
-        </w:tc>
-      </w:tr>
-    </w:tbl>
-    <w:p>
-      <w:pPr>
-        <w:spacing w:after="80"/>
-      </w:pPr>
-    </w:p>
-    <w:p>
-      <w:pPr>
-        <w:keepNext/>
-        <w:spacing w:before="280" w:after="120"/>
-      </w:pPr>
-      <w:r>
-        <w:rPr>
-          <w:b/>
-          <w:color w:val="0F766E"/>
-          <w:sz w:val="28"/>
-        </w:rPr>
-        <w:t>1.6. TỔNG KẾT CHƯƠNG 1</w:t>
-      </w:r>
-    </w:p>
-    <w:p>
-      <w:pPr>
-        <w:spacing w:after="80" w:line="288" w:lineRule="auto"/>
-        <w:jc w:val="both"/>
-      </w:pPr>
-      <w:r>
-        <w:rPr>
-          <w:b w:val="0"/>
-          <w:i w:val="0"/>
-        </w:rPr>
-        <w:t>Chương 1 đã hoàn thành việc xây dựng nền tảng cơ sở lý thuyết toàn diện, có tính liên kết chặt chẽ và hàm lượng khoa học cao cho toàn bộ đồ án PBL6 dựa trên mô hình Kiềng ba chân học thuật:</w:t>
-      </w:r>
-    </w:p>
-    <w:p>
-      <w:pPr>
-        <w:pStyle w:val="ListBullet"/>
-        <w:spacing w:after="60" w:line="276" w:lineRule="auto"/>
-        <w:jc w:val="both"/>
-      </w:pPr>
-      <w:r>
-        <w:rPr>
-          <w:b/>
-          <w:color w:val="111827"/>
-        </w:rPr>
-        <w:t xml:space="preserve">1. Giáo trình kinh điển: </w:t>
-      </w:r>
-      <w:r>
-        <w:t>Vận dụng lý thuyết Cổng tầng ứng dụng của William Stallings [Ref 01], cơ sở toán học về Shannon Entropy của Douglas Stinson [Ref 02], mô hình Trò chơi an ninh đối kháng của Jonathan Katz &amp; Yehuda Lindell [Ref 03], phương pháp luận kiểm thử của CompTIA PenTest+ [Ref 04], và kiến trúc Reverse Proxy từ NGINX Cookbook [Ref 05].</w:t>
-      </w:r>
-    </w:p>
-    <w:p>
-      <w:pPr>
-        <w:pStyle w:val="ListBullet"/>
-        <w:spacing w:after="60" w:line="276" w:lineRule="auto"/>
-        <w:jc w:val="both"/>
-      </w:pPr>
-      <w:r>
-        <w:rPr>
-          <w:b/>
-          <w:color w:val="111827"/>
-        </w:rPr>
-        <w:t xml:space="preserve">2. Tiêu chuẩn công nghiệp: </w:t>
-      </w:r>
-      <w:r>
-        <w:t>Bám sát bộ rủi ro OWASP Top 10 API Security Risks (2023) [Ref 06], kiến trúc Anomaly Scoring của OWASP ModSecurity CRS v4.0 [Ref 07], quy trình đánh giá NIST SP 800-115 [Ref 15], và ma trận kỹ thuật MITRE ATT&amp;CK [Ref 16].</w:t>
-      </w:r>
-    </w:p>
-    <w:p>
-      <w:pPr>
-        <w:pStyle w:val="ListBullet"/>
-        <w:spacing w:after="60" w:line="276" w:lineRule="auto"/>
-        <w:jc w:val="both"/>
-      </w:pPr>
-      <w:r>
-        <w:rPr>
-          <w:b/>
-          <w:color w:val="111827"/>
+          <w:sz w:val="26"/>
         </w:rPr>
         <w:t xml:space="preserve">3. Công trình khoa học thực nghiệm: </w:t>
       </w:r>
       <w:r>
-        <w:t>Triển khai không gian 17 đặc trưng hình thái chuẩn Torrano-Gimenez (Wiley 2015) [Ref 08], bộ dữ liệu chuẩn quốc tế CSIC 2010 [Ref 09], khảo sát SQLi của IEEE Access (2023) [Ref 10], kiến trúc Hybrid WAF của MDPI Electronics (2025) [Ref 11], và mô hình Thao trường mạng chuẩn Elsevier (2020) [Ref 14].</w:t>
+        <w:rPr>
+          <w:sz w:val="26"/>
+        </w:rPr>
+        <w:t>Triển khai không gian 17 đặc trưng hình thái chuỗi payload [Ref 15], kết hợp mô hình học máy phân lớp Random Forest [Ref 12], phát hiện dị biệt Isolation Forest [Ref 11], kiến trúc dung hợp đa tầng [Ref 13], và mô hình Thao trường An ninh Đối kháng phân tán [Ref 16].</w:t>
       </w:r>
     </w:p>
     <w:sectPr>
       <w:pgSz w:w="12240" w:h="15840"/>
-      <w:pgMar w:top="1440" w:right="1440" w:bottom="1440" w:left="1440" w:header="720" w:footer="720" w:gutter="0"/>
+      <w:pgMar w:top="1417" w:right="1133" w:bottom="1417" w:left="1984" w:header="720" w:footer="720" w:gutter="0"/>
       <w:cols w:space="720"/>
       <w:docGrid w:linePitch="360"/>
     </w:sectPr>
@@ -2975,12 +2790,12 @@
     <w:qFormat/>
     <w:rsid w:val="00FC693F"/>
     <w:pPr>
-      <w:spacing w:line="288" w:lineRule="auto" w:after="80"/>
+      <w:spacing w:line="312" w:lineRule="auto" w:after="80"/>
     </w:pPr>
     <w:rPr>
       <w:rFonts w:ascii="Times New Roman" w:hAnsi="Times New Roman"/>
       <w:color w:val="1F2937"/>
-      <w:sz w:val="22"/>
+      <w:sz w:val="26"/>
     </w:rPr>
   </w:style>
   <w:style w:type="paragraph" w:styleId="Header">

</xml_diff>

<commit_message>
docs: upgrade native Word equations in reports and add references and appendices (#105)
Upgrade native Word equations and add references appendix and appendices A, B, C.
</commit_message>
<xml_diff>
--- a/docs/reports/PBL6_Bao_Cao_Chuong_1_Co_So_Ly_Thuyet.docx
+++ b/docs/reports/PBL6_Bao_Cao_Chuong_1_Co_So_Ly_Thuyet.docx
@@ -11,7 +11,7 @@
         <w:rPr>
           <w:b/>
           <w:color w:val="4B5563"/>
-          <w:sz w:val="22"/>
+          <w:sz w:val="24"/>
         </w:rPr>
         <w:t>TRƯỜNG ĐẠI HỌC BÁCH KHOA - ĐẠI HỌC ĐÀ NẴNG</w:t>
         <w:br/>
@@ -23,7 +23,7 @@
         <w:rPr>
           <w:b/>
           <w:color w:val="047857"/>
-          <w:sz w:val="26"/>
+          <w:sz w:val="28"/>
         </w:rPr>
         <w:t>BÁO CÁO ĐỒ ÁN MÔN HỌC CHUYÊN NGÀNH AN TOÀN THÔNG TIN (PBL6)</w:t>
         <w:br/>
@@ -34,14 +34,14 @@
           <w:color w:val="111827"/>
           <w:sz w:val="32"/>
         </w:rPr>
-        <w:t>CHƯƠNG 1: CƠ SỞ LÝ THUYẾT VÀ TỔNG QUAN CÔNG TRÌNH NGHIÊN CỨU</w:t>
+        <w:t>CHƯƠNG 1: CƠ SỞ LÝ THUYẾT VÀ TỔNG QUAN CÔNG NGHỆ</w:t>
         <w:br/>
       </w:r>
       <w:r>
         <w:rPr>
           <w:i/>
           <w:color w:val="374151"/>
-          <w:sz w:val="22"/>
+          <w:sz w:val="24"/>
         </w:rPr>
         <w:t>Đề tài: Nền tảng Giám sát, Phát hiện và Ngăn chặn Tấn công Web API dựa trên AI/ML kết hợp Môi trường Thao trường Mạng (Cyber Range) Phân tán</w:t>
         <w:br/>
@@ -49,94 +49,91 @@
     </w:p>
     <w:p>
       <w:pPr>
-        <w:spacing w:after="80" w:line="288" w:lineRule="auto"/>
+        <w:spacing w:after="80" w:line="312" w:lineRule="auto"/>
         <w:jc w:val="both"/>
       </w:pPr>
       <w:r>
         <w:rPr>
-          <w:b w:val="0"/>
           <w:i/>
+          <w:sz w:val="26"/>
         </w:rPr>
         <w:t>Tài liệu cơ sở lý thuyết bám sát 20 công trình và giáo trình kinh điển quốc tế (Prentice Hall, CRC Press, Sybex/Wiley, O'Reilly, USENIX Security, IEEE, ACM, Elsevier, MDPI, NIST, OWASP, MITRE). Cung cấp luận cứ toán học, cơ chế kiến trúc và cơ sở phân loại cho toàn bộ hệ sinh thái phòng thủ và tấn công của đồ án.</w:t>
       </w:r>
     </w:p>
     <w:p>
       <w:pPr>
-        <w:keepNext/>
         <w:spacing w:before="280" w:after="120"/>
       </w:pPr>
       <w:r>
         <w:rPr>
           <w:b/>
           <w:color w:val="0F766E"/>
-          <w:sz w:val="28"/>
+          <w:sz w:val="30"/>
         </w:rPr>
         <w:t>1.1. TỔNG QUAN VỀ BẢO MẬT WEB API VÀ CÁC THÁCH THỨC AN NINH HIỆN ĐẠI</w:t>
       </w:r>
     </w:p>
     <w:p>
       <w:pPr>
-        <w:keepNext/>
         <w:spacing w:before="200" w:after="80"/>
       </w:pPr>
       <w:r>
         <w:rPr>
           <w:b/>
-          <w:color w:val="1E3A8A"/>
-          <w:sz w:val="24"/>
+          <w:color w:val="1E40AF"/>
+          <w:sz w:val="27"/>
         </w:rPr>
         <w:t>1.1.1. Xu hướng kiến trúc Microservices và sự bùng nổ của Web API</w:t>
       </w:r>
     </w:p>
     <w:p>
       <w:pPr>
-        <w:spacing w:after="80" w:line="288" w:lineRule="auto"/>
+        <w:spacing w:after="80" w:line="312" w:lineRule="auto"/>
         <w:jc w:val="both"/>
       </w:pPr>
       <w:r>
         <w:rPr>
-          <w:b w:val="0"/>
           <w:i w:val="0"/>
+          <w:sz w:val="26"/>
         </w:rPr>
         <w:t>Trong kỷ nguyên chuyển đổi số và điện toán đám mây, kiến trúc phần mềm đã trải qua sự chuyển dịch mang tính nền tảng từ các hệ thống nguyên khối (Monolithic Architecture) sang kiến trúc phân tán và vi dịch vụ (Microservices Architecture). Trong mô hình này, giao diện lập trình ứng dụng web (Web API), đặc biệt là chuẩn RESTful API truyền tải dữ liệu qua giao thức HTTP/HTTPS với định dạng JSON, đã trở thành huyết mạch kết nối toàn bộ hệ sinh thái dịch vụ số: từ ứng dụng Single Page Application (SPA), ứng dụng di động (Mobile Apps), hệ thống Internet vạn vật (IoT) cho đến các cổng thanh toán tài chính liên ngân hàng.</w:t>
       </w:r>
     </w:p>
     <w:p>
       <w:pPr>
-        <w:spacing w:after="80" w:line="288" w:lineRule="auto"/>
+        <w:spacing w:after="80" w:line="312" w:lineRule="auto"/>
         <w:jc w:val="both"/>
       </w:pPr>
       <w:r>
         <w:rPr>
-          <w:b w:val="0"/>
           <w:i w:val="0"/>
+          <w:sz w:val="26"/>
         </w:rPr>
         <w:t>Tuy nhiên, sự bùng nổ về số lượng và tính phức tạp của Web API đã làm mở rộng đáng kể bề mặt tấn công (Attack Surface). Không giống như các ứng dụng web truyền thống hiển thị giao diện qua HTML/CSS, Web API phơi bày trực tiếp logic nghiệp vụ, các tham số truy vấn cơ sở dữ liệu và cấu trúc dữ liệu nhạy cảm. Kẻ tấn công có thể dễ dàng sử dụng các công cụ phân tích tự động, bóc tách tài liệu OpenAPI/Swagger specification để lập bản đồ các endpoint và thực hiện tấn công hàng loạt mà không bị cản trở bởi lớp giao diện người dùng [Ref 04].</w:t>
       </w:r>
     </w:p>
     <w:p>
       <w:pPr>
-        <w:keepNext/>
         <w:spacing w:before="200" w:after="80"/>
       </w:pPr>
       <w:r>
         <w:rPr>
           <w:b/>
-          <w:color w:val="1E3A8A"/>
-          <w:sz w:val="24"/>
+          <w:color w:val="1E40AF"/>
+          <w:sz w:val="27"/>
         </w:rPr>
         <w:t>1.1.2. Phân tích các mối đe dọa hàng đầu theo OWASP Top 10 API Security Risks (2023)</w:t>
       </w:r>
     </w:p>
     <w:p>
       <w:pPr>
-        <w:spacing w:after="80" w:line="288" w:lineRule="auto"/>
+        <w:spacing w:after="80" w:line="312" w:lineRule="auto"/>
         <w:jc w:val="both"/>
       </w:pPr>
       <w:r>
         <w:rPr>
-          <w:b w:val="0"/>
           <w:i w:val="0"/>
+          <w:sz w:val="26"/>
         </w:rPr>
         <w:t>Theo công bố chính thức từ tổ chức an toàn thông tin uy tín thế giới OWASP trong tài liệu OWASP Top 10 API Security Risks 2023 [Ref 06], các cuộc tấn công nhắm vào Web API ngày càng trở nên tinh vi và có tổ chức. Đồ án tập trung nghiên cứu và xây dựng giải pháp phòng thủ cho 4 nhóm hiểm họa nghiêm trọng nhất:</w:t>
       </w:r>
@@ -144,2466 +141,2284 @@
     <w:p>
       <w:pPr>
         <w:pStyle w:val="ListBullet"/>
-        <w:spacing w:after="60" w:line="276" w:lineRule="auto"/>
+        <w:spacing w:after="60" w:line="312" w:lineRule="auto"/>
         <w:jc w:val="both"/>
       </w:pPr>
       <w:r>
         <w:rPr>
           <w:b/>
           <w:color w:val="111827"/>
+          <w:sz w:val="26"/>
         </w:rPr>
         <w:t xml:space="preserve">1. Các lỗ hổng tiêm mã độc (Injection Vulnerabilities): </w:t>
       </w:r>
       <w:r>
+        <w:rPr>
+          <w:sz w:val="26"/>
+        </w:rPr>
         <w:t>Bao gồm SQL Injection (In-band, Error-based, Time-based Blind SQLi [Ref 10]), OS Command Injection thực thi shellcode trực tiếp, và Path Traversal đọc tệp tin cấu hình nhạy cảm. Kẻ tấn công lợi dụng dữ liệu đầu vào chưa được kiểm duyệt để thay đổi logic truy vấn hoặc chiếm toàn quyền điều khiển hệ điều hành máy chủ.</w:t>
       </w:r>
     </w:p>
     <w:p>
       <w:pPr>
         <w:pStyle w:val="ListBullet"/>
-        <w:spacing w:after="60" w:line="276" w:lineRule="auto"/>
+        <w:spacing w:after="60" w:line="312" w:lineRule="auto"/>
         <w:jc w:val="both"/>
       </w:pPr>
       <w:r>
         <w:rPr>
           <w:b/>
           <w:color w:val="111827"/>
+          <w:sz w:val="26"/>
         </w:rPr>
         <w:t xml:space="preserve">2. Tấn công Cross-Site Scripting (XSS): </w:t>
       </w:r>
       <w:r>
+        <w:rPr>
+          <w:sz w:val="26"/>
+        </w:rPr>
         <w:t>Mặc dù API chủ yếu trả về dữ liệu JSON, nhưng các trường dữ liệu do API phản hồi thường được render trực tiếp lên trình duyệt của người dùng cuối trong các ứng dụng SPA (React, Vue, Next.js). Khi kẻ tấn công chèn thành công các payload chứa mã JavaScript nguy hại (&lt;script&gt;, &lt;img onerror=...&gt;) qua API, mã độc sẽ thực thi trong ngữ cảnh phiên nạn nhân, dẫn đến nguy cơ đánh cắp token JWT, session cookies hoặc chiếm đoạt tài khoản.</w:t>
       </w:r>
     </w:p>
     <w:p>
       <w:pPr>
         <w:pStyle w:val="ListBullet"/>
-        <w:spacing w:after="60" w:line="276" w:lineRule="auto"/>
+        <w:spacing w:after="60" w:line="312" w:lineRule="auto"/>
         <w:jc w:val="both"/>
       </w:pPr>
       <w:r>
         <w:rPr>
           <w:b/>
           <w:color w:val="111827"/>
+          <w:sz w:val="26"/>
         </w:rPr>
-        <w:t xml:space="preserve">3. Phá vỡ kiểm soát phân quyền mức đối tượng (BOLA / IDOR - API1:2023): </w:t>
+        <w:t xml:space="preserve">3. Phá vỡ kiểm soát phân quyền mức đối tượng (Broken Object Level Authorization - BOLA / IDOR - API1:2023): </w:t>
       </w:r>
       <w:r>
-        <w:t>Lỗ hổng logic nghiệp vụ đứng số 1 về mức độ phổ biến, xảy ra khi máy chủ API không kiểm tra xem người dùng hiện tại có quyền thao tác trên mã đối tượng trong URL hay không (ví dụ: đổi /orders/1 thành /orders/2). Các bộ lọc chữ ký regex truyền thống hoàn toàn bất lực trước loại lỗ hổng logic này [Ref 06].</w:t>
+        <w:rPr>
+          <w:sz w:val="26"/>
+        </w:rPr>
+        <w:t>Là lỗ hổng phổ biến và nguy hiểm nhất trên các Web API hiện đại. Kẻ tấn công thao túng định danh tài nguyên (ID) trong URI hoặc payload JSON để truy cập trái phép dữ liệu của người dùng khác do backend thiếu sót trong việc kiểm tra quyền sở hữu đối tượng trước khi xử lý nghiệp vụ.</w:t>
       </w:r>
     </w:p>
     <w:p>
       <w:pPr>
         <w:pStyle w:val="ListBullet"/>
-        <w:spacing w:after="60" w:line="276" w:lineRule="auto"/>
+        <w:spacing w:after="60" w:line="312" w:lineRule="auto"/>
         <w:jc w:val="both"/>
       </w:pPr>
       <w:r>
         <w:rPr>
           <w:b/>
           <w:color w:val="111827"/>
+          <w:sz w:val="26"/>
         </w:rPr>
-        <w:t xml:space="preserve">4. Tiêu thụ tài nguyên không hạn chế (Unrestricted Resource Consumption - API4:2023): </w:t>
+        <w:t xml:space="preserve">4. Tiêu thụ tài nguyên không kiểm soát (Unrestricted Resource Consumption - API4:2023): </w:t>
       </w:r>
       <w:r>
-        <w:t>Các cuộc tấn công dò quét tự động (Brute-force mật khẩu, Credential Stuffing) hoặc vét cạn tài nguyên máy chủ Layer 7 DoS. Nếu không có cơ chế giới hạn tần suất (Rate Limiting) theo cửa sổ trượt, hệ thống sẽ nhanh chóng tê liệt CPU, RAM và kết nối cơ sở dữ liệu [Ref 05, Ref 06].</w:t>
+        <w:rPr>
+          <w:sz w:val="26"/>
+        </w:rPr>
+        <w:t>Kẻ tấn công gửi liên tục lượng lớn request hoặc thực hiện các truy vấn dữ liệu nặng nhằm làm cạn kiệt CPU, RAM, băng thông mạng hoặc kết nối CSDL của máy chủ, dẫn đến tình trạng từ chối dịch vụ (Denial of Service - DoS), gây tê liệt các dịch vụ trọng yếu.</w:t>
       </w:r>
     </w:p>
     <w:p>
       <w:pPr>
-        <w:keepNext/>
-        <w:spacing w:before="200" w:after="80"/>
-      </w:pPr>
-      <w:r>
-        <w:rPr>
-          <w:b/>
-          <w:color w:val="1E3A8A"/>
-          <w:sz w:val="24"/>
-        </w:rPr>
-        <w:t>1.1.3. Các kỹ thuật làm mờ payload và né tránh tường lửa (WAF Evasion &amp; Obfuscation Techniques)</w:t>
-      </w:r>
-    </w:p>
-    <w:p>
-      <w:pPr>
-        <w:spacing w:after="80" w:line="288" w:lineRule="auto"/>
-        <w:jc w:val="both"/>
-      </w:pPr>
-      <w:r>
-        <w:rPr>
-          <w:b w:val="0"/>
-          <w:i w:val="0"/>
-        </w:rPr>
-        <w:t>Theo giáo trình kiểm thử xâm nhập chuẩn quốc tế CompTIA PenTest+ Study Guide [Ref 04], trong bối cảnh các hệ thống tường lửa ứng dụng web truyền thống phụ thuộc nặng nề vào các tập luật kiểm tra mẫu chuỗi (Regex Pattern Matching), kẻ tấn công hiện đại áp dụng các kỹ thuật làm mờ payload (Obfuscation) cực kỳ phức tạp để vượt rào (WAF Evasion):</w:t>
-      </w:r>
-    </w:p>
-    <w:tbl>
-      <w:tblPr>
-        <w:tblW w:type="auto" w:w="0"/>
-        <w:jc w:val="center"/>
-        <w:tblLook w:firstColumn="1" w:firstRow="1" w:lastColumn="0" w:lastRow="0" w:noHBand="0" w:noVBand="1" w:val="04A0"/>
-      </w:tblPr>
-      <w:tblGrid>
-        <w:gridCol w:w="2340"/>
-        <w:gridCol w:w="2340"/>
-        <w:gridCol w:w="2340"/>
-        <w:gridCol w:w="2340"/>
-      </w:tblGrid>
-      <w:tr>
-        <w:tc>
-          <w:tcPr>
-            <w:tcW w:type="dxa" w:w="2340"/>
-            <w:shd w:fill="0F766E"/>
-            <w:tcMar>
-              <w:top w:w="140" w:type="dxa"/>
-              <w:bottom w:w="140" w:type="dxa"/>
-              <w:left w:w="140" w:type="dxa"/>
-              <w:right w:w="140" w:type="dxa"/>
-            </w:tcMar>
-          </w:tcPr>
-          <w:p>
-            <w:r>
-              <w:rPr>
-                <w:b/>
-                <w:color w:val="FFFFFF"/>
-                <w:sz w:val="20"/>
-              </w:rPr>
-              <w:t>Kỹ Thuật Né Tránh</w:t>
-            </w:r>
-          </w:p>
-        </w:tc>
-        <w:tc>
-          <w:tcPr>
-            <w:tcW w:type="dxa" w:w="2340"/>
-            <w:shd w:fill="0F766E"/>
-            <w:tcMar>
-              <w:top w:w="140" w:type="dxa"/>
-              <w:bottom w:w="140" w:type="dxa"/>
-              <w:left w:w="140" w:type="dxa"/>
-              <w:right w:w="140" w:type="dxa"/>
-            </w:tcMar>
-          </w:tcPr>
-          <w:p>
-            <w:r>
-              <w:rPr>
-                <w:b/>
-                <w:color w:val="FFFFFF"/>
-                <w:sz w:val="20"/>
-              </w:rPr>
-              <w:t>Cơ Chế Bản Chất</w:t>
-            </w:r>
-          </w:p>
-        </w:tc>
-        <w:tc>
-          <w:tcPr>
-            <w:tcW w:type="dxa" w:w="2340"/>
-            <w:shd w:fill="0F766E"/>
-            <w:tcMar>
-              <w:top w:w="140" w:type="dxa"/>
-              <w:bottom w:w="140" w:type="dxa"/>
-              <w:left w:w="140" w:type="dxa"/>
-              <w:right w:w="140" w:type="dxa"/>
-            </w:tcMar>
-          </w:tcPr>
-          <w:p>
-            <w:r>
-              <w:rPr>
-                <w:b/>
-                <w:color w:val="FFFFFF"/>
-                <w:sz w:val="20"/>
-              </w:rPr>
-              <w:t>Ví Dụ Minh Họa</w:t>
-            </w:r>
-          </w:p>
-        </w:tc>
-        <w:tc>
-          <w:tcPr>
-            <w:tcW w:type="dxa" w:w="2340"/>
-            <w:shd w:fill="0F766E"/>
-            <w:tcMar>
-              <w:top w:w="140" w:type="dxa"/>
-              <w:bottom w:w="140" w:type="dxa"/>
-              <w:left w:w="140" w:type="dxa"/>
-              <w:right w:w="140" w:type="dxa"/>
-            </w:tcMar>
-          </w:tcPr>
-          <w:p>
-            <w:r>
-              <w:rPr>
-                <w:b/>
-                <w:color w:val="FFFFFF"/>
-                <w:sz w:val="20"/>
-              </w:rPr>
-              <w:t>Hậu Quả Đối Với WAF Truyền Thống</w:t>
-            </w:r>
-          </w:p>
-        </w:tc>
-      </w:tr>
-      <w:tr>
-        <w:tc>
-          <w:tcPr>
-            <w:tcW w:type="dxa" w:w="2340"/>
-            <w:shd w:fill="FFFFFF"/>
-            <w:tcMar>
-              <w:top w:w="100" w:type="dxa"/>
-              <w:bottom w:w="100" w:type="dxa"/>
-              <w:left w:w="120" w:type="dxa"/>
-              <w:right w:w="120" w:type="dxa"/>
-            </w:tcMar>
-          </w:tcPr>
-          <w:p>
-            <w:r>
-              <w:rPr>
-                <w:sz w:val="19"/>
-              </w:rPr>
-              <w:t>Mã hóa URL đa tầng (Double URL Encoding)</w:t>
-            </w:r>
-          </w:p>
-        </w:tc>
-        <w:tc>
-          <w:tcPr>
-            <w:tcW w:type="dxa" w:w="2340"/>
-            <w:shd w:fill="FFFFFF"/>
-            <w:tcMar>
-              <w:top w:w="100" w:type="dxa"/>
-              <w:bottom w:w="100" w:type="dxa"/>
-              <w:left w:w="120" w:type="dxa"/>
-              <w:right w:w="120" w:type="dxa"/>
-            </w:tcMar>
-          </w:tcPr>
-          <w:p>
-            <w:r>
-              <w:rPr>
-                <w:sz w:val="19"/>
-              </w:rPr>
-              <w:t>Mã hóa ký tự % thành %25 (dấu ' thành %27 rồi %2527)</w:t>
-            </w:r>
-          </w:p>
-        </w:tc>
-        <w:tc>
-          <w:tcPr>
-            <w:tcW w:type="dxa" w:w="2340"/>
-            <w:shd w:fill="FFFFFF"/>
-            <w:tcMar>
-              <w:top w:w="100" w:type="dxa"/>
-              <w:bottom w:w="100" w:type="dxa"/>
-              <w:left w:w="120" w:type="dxa"/>
-              <w:right w:w="120" w:type="dxa"/>
-            </w:tcMar>
-          </w:tcPr>
-          <w:p>
-            <w:r>
-              <w:rPr>
-                <w:sz w:val="19"/>
-              </w:rPr>
-              <w:t>%2527%20OR%20%2531%253D%2531</w:t>
-            </w:r>
-          </w:p>
-        </w:tc>
-        <w:tc>
-          <w:tcPr>
-            <w:tcW w:type="dxa" w:w="2340"/>
-            <w:shd w:fill="FFFFFF"/>
-            <w:tcMar>
-              <w:top w:w="100" w:type="dxa"/>
-              <w:bottom w:w="100" w:type="dxa"/>
-              <w:left w:w="120" w:type="dxa"/>
-              <w:right w:w="120" w:type="dxa"/>
-            </w:tcMar>
-          </w:tcPr>
-          <w:p>
-            <w:r>
-              <w:rPr>
-                <w:sz w:val="19"/>
-              </w:rPr>
-              <w:t>WAF chỉ giải mã 1 lần thành %27 và bỏ qua; backend giải mã lần 2 kích hoạt SQLi.</w:t>
-            </w:r>
-          </w:p>
-        </w:tc>
-      </w:tr>
-      <w:tr>
-        <w:tc>
-          <w:tcPr>
-            <w:tcW w:type="dxa" w:w="2340"/>
-            <w:shd w:fill="F9FAFB"/>
-            <w:tcMar>
-              <w:top w:w="100" w:type="dxa"/>
-              <w:bottom w:w="100" w:type="dxa"/>
-              <w:left w:w="120" w:type="dxa"/>
-              <w:right w:w="120" w:type="dxa"/>
-            </w:tcMar>
-          </w:tcPr>
-          <w:p>
-            <w:r>
-              <w:rPr>
-                <w:sz w:val="19"/>
-              </w:rPr>
-              <w:t>Chèn chú thích nội tuyến (Inline Comments)</w:t>
-            </w:r>
-          </w:p>
-        </w:tc>
-        <w:tc>
-          <w:tcPr>
-            <w:tcW w:type="dxa" w:w="2340"/>
-            <w:shd w:fill="F9FAFB"/>
-            <w:tcMar>
-              <w:top w:w="100" w:type="dxa"/>
-              <w:bottom w:w="100" w:type="dxa"/>
-              <w:left w:w="120" w:type="dxa"/>
-              <w:right w:w="120" w:type="dxa"/>
-            </w:tcMar>
-          </w:tcPr>
-          <w:p>
-            <w:r>
-              <w:rPr>
-                <w:sz w:val="19"/>
-              </w:rPr>
-              <w:t>Chèn comment vô hại vào giữa từ khóa nhạy cảm</w:t>
-            </w:r>
-          </w:p>
-        </w:tc>
-        <w:tc>
-          <w:tcPr>
-            <w:tcW w:type="dxa" w:w="2340"/>
-            <w:shd w:fill="F9FAFB"/>
-            <w:tcMar>
-              <w:top w:w="100" w:type="dxa"/>
-              <w:bottom w:w="100" w:type="dxa"/>
-              <w:left w:w="120" w:type="dxa"/>
-              <w:right w:w="120" w:type="dxa"/>
-            </w:tcMar>
-          </w:tcPr>
-          <w:p>
-            <w:r>
-              <w:rPr>
-                <w:sz w:val="19"/>
-              </w:rPr>
-              <w:t>UN/**/ION/**/SEL/**/ECT</w:t>
-            </w:r>
-          </w:p>
-        </w:tc>
-        <w:tc>
-          <w:tcPr>
-            <w:tcW w:type="dxa" w:w="2340"/>
-            <w:shd w:fill="F9FAFB"/>
-            <w:tcMar>
-              <w:top w:w="100" w:type="dxa"/>
-              <w:bottom w:w="100" w:type="dxa"/>
-              <w:left w:w="120" w:type="dxa"/>
-              <w:right w:w="120" w:type="dxa"/>
-            </w:tcMar>
-          </w:tcPr>
-          <w:p>
-            <w:r>
-              <w:rPr>
-                <w:sz w:val="19"/>
-              </w:rPr>
-              <w:t>Làm đứt gãy mẫu chuỗi regex chuẩn UNION.*SELECT.</w:t>
-            </w:r>
-          </w:p>
-        </w:tc>
-      </w:tr>
-      <w:tr>
-        <w:tc>
-          <w:tcPr>
-            <w:tcW w:type="dxa" w:w="2340"/>
-            <w:shd w:fill="FFFFFF"/>
-            <w:tcMar>
-              <w:top w:w="100" w:type="dxa"/>
-              <w:bottom w:w="100" w:type="dxa"/>
-              <w:left w:w="120" w:type="dxa"/>
-              <w:right w:w="120" w:type="dxa"/>
-            </w:tcMar>
-          </w:tcPr>
-          <w:p>
-            <w:r>
-              <w:rPr>
-                <w:sz w:val="19"/>
-              </w:rPr>
-              <w:t>Biến đổi chữ hoa/thường xen kẽ</w:t>
-            </w:r>
-          </w:p>
-        </w:tc>
-        <w:tc>
-          <w:tcPr>
-            <w:tcW w:type="dxa" w:w="2340"/>
-            <w:shd w:fill="FFFFFF"/>
-            <w:tcMar>
-              <w:top w:w="100" w:type="dxa"/>
-              <w:bottom w:w="100" w:type="dxa"/>
-              <w:left w:w="120" w:type="dxa"/>
-              <w:right w:w="120" w:type="dxa"/>
-            </w:tcMar>
-          </w:tcPr>
-          <w:p>
-            <w:r>
-              <w:rPr>
-                <w:sz w:val="19"/>
-              </w:rPr>
-              <w:t>Thay đổi ngẫu nhiên trạng thái hoa thường không chuẩn hóa</w:t>
-            </w:r>
-          </w:p>
-        </w:tc>
-        <w:tc>
-          <w:tcPr>
-            <w:tcW w:type="dxa" w:w="2340"/>
-            <w:shd w:fill="FFFFFF"/>
-            <w:tcMar>
-              <w:top w:w="100" w:type="dxa"/>
-              <w:bottom w:w="100" w:type="dxa"/>
-              <w:left w:w="120" w:type="dxa"/>
-              <w:right w:w="120" w:type="dxa"/>
-            </w:tcMar>
-          </w:tcPr>
-          <w:p>
-            <w:r>
-              <w:rPr>
-                <w:sz w:val="19"/>
-              </w:rPr>
-              <w:t>sElEcT, &lt;sCrIpt&gt;, uNiOn</w:t>
-            </w:r>
-          </w:p>
-        </w:tc>
-        <w:tc>
-          <w:tcPr>
-            <w:tcW w:type="dxa" w:w="2340"/>
-            <w:shd w:fill="FFFFFF"/>
-            <w:tcMar>
-              <w:top w:w="100" w:type="dxa"/>
-              <w:bottom w:w="100" w:type="dxa"/>
-              <w:left w:w="120" w:type="dxa"/>
-              <w:right w:w="120" w:type="dxa"/>
-            </w:tcMar>
-          </w:tcPr>
-          <w:p>
-            <w:r>
-              <w:rPr>
-                <w:sz w:val="19"/>
-              </w:rPr>
-              <w:t>Vượt qua regex không thiết lập cờ IGNORECASE.</w:t>
-            </w:r>
-          </w:p>
-        </w:tc>
-      </w:tr>
-      <w:tr>
-        <w:tc>
-          <w:tcPr>
-            <w:tcW w:type="dxa" w:w="2340"/>
-            <w:shd w:fill="F9FAFB"/>
-            <w:tcMar>
-              <w:top w:w="100" w:type="dxa"/>
-              <w:bottom w:w="100" w:type="dxa"/>
-              <w:left w:w="120" w:type="dxa"/>
-              <w:right w:w="120" w:type="dxa"/>
-            </w:tcMar>
-          </w:tcPr>
-          <w:p>
-            <w:r>
-              <w:rPr>
-                <w:sz w:val="19"/>
-              </w:rPr>
-              <w:t>Ký tự khoảng trắng thay thế</w:t>
-            </w:r>
-          </w:p>
-        </w:tc>
-        <w:tc>
-          <w:tcPr>
-            <w:tcW w:type="dxa" w:w="2340"/>
-            <w:shd w:fill="F9FAFB"/>
-            <w:tcMar>
-              <w:top w:w="100" w:type="dxa"/>
-              <w:bottom w:w="100" w:type="dxa"/>
-              <w:left w:w="120" w:type="dxa"/>
-              <w:right w:w="120" w:type="dxa"/>
-            </w:tcMar>
-          </w:tcPr>
-          <w:p>
-            <w:r>
-              <w:rPr>
-                <w:sz w:val="19"/>
-              </w:rPr>
-              <w:t>Dùng ký tự shell/SQL thay thế dấu cách (0x20)</w:t>
-            </w:r>
-          </w:p>
-        </w:tc>
-        <w:tc>
-          <w:tcPr>
-            <w:tcW w:type="dxa" w:w="2340"/>
-            <w:shd w:fill="F9FAFB"/>
-            <w:tcMar>
-              <w:top w:w="100" w:type="dxa"/>
-              <w:bottom w:w="100" w:type="dxa"/>
-              <w:left w:w="120" w:type="dxa"/>
-              <w:right w:w="120" w:type="dxa"/>
-            </w:tcMar>
-          </w:tcPr>
-          <w:p>
-            <w:r>
-              <w:rPr>
-                <w:sz w:val="19"/>
-              </w:rPr>
-              <w:t>$IFS$9 trong Bash; /**/, +, %09 (Tab)</w:t>
-            </w:r>
-          </w:p>
-        </w:tc>
-        <w:tc>
-          <w:tcPr>
-            <w:tcW w:type="dxa" w:w="2340"/>
-            <w:shd w:fill="F9FAFB"/>
-            <w:tcMar>
-              <w:top w:w="100" w:type="dxa"/>
-              <w:bottom w:w="100" w:type="dxa"/>
-              <w:left w:w="120" w:type="dxa"/>
-              <w:right w:w="120" w:type="dxa"/>
-            </w:tcMar>
-          </w:tcPr>
-          <w:p>
-            <w:r>
-              <w:rPr>
-                <w:sz w:val="19"/>
-              </w:rPr>
-              <w:t>Vượt qua các bộ luật kiểm tra khoảng cách chuẩn giữa mệnh đề.</w:t>
-            </w:r>
-          </w:p>
-        </w:tc>
-      </w:tr>
-      <w:tr>
-        <w:tc>
-          <w:tcPr>
-            <w:tcW w:type="dxa" w:w="2340"/>
-            <w:shd w:fill="FFFFFF"/>
-            <w:tcMar>
-              <w:top w:w="100" w:type="dxa"/>
-              <w:bottom w:w="100" w:type="dxa"/>
-              <w:left w:w="120" w:type="dxa"/>
-              <w:right w:w="120" w:type="dxa"/>
-            </w:tcMar>
-          </w:tcPr>
-          <w:p>
-            <w:r>
-              <w:rPr>
-                <w:sz w:val="19"/>
-              </w:rPr>
-              <w:t>Ký tự NULL Byte Injection</w:t>
-            </w:r>
-          </w:p>
-        </w:tc>
-        <w:tc>
-          <w:tcPr>
-            <w:tcW w:type="dxa" w:w="2340"/>
-            <w:shd w:fill="FFFFFF"/>
-            <w:tcMar>
-              <w:top w:w="100" w:type="dxa"/>
-              <w:bottom w:w="100" w:type="dxa"/>
-              <w:left w:w="120" w:type="dxa"/>
-              <w:right w:w="120" w:type="dxa"/>
-            </w:tcMar>
-          </w:tcPr>
-          <w:p>
-            <w:r>
-              <w:rPr>
-                <w:sz w:val="19"/>
-              </w:rPr>
-              <w:t>Chèn ký tự kết thúc chuỗi \x00 hoặc %00</w:t>
-            </w:r>
-          </w:p>
-        </w:tc>
-        <w:tc>
-          <w:tcPr>
-            <w:tcW w:type="dxa" w:w="2340"/>
-            <w:shd w:fill="FFFFFF"/>
-            <w:tcMar>
-              <w:top w:w="100" w:type="dxa"/>
-              <w:bottom w:w="100" w:type="dxa"/>
-              <w:left w:w="120" w:type="dxa"/>
-              <w:right w:w="120" w:type="dxa"/>
-            </w:tcMar>
-          </w:tcPr>
-          <w:p>
-            <w:r>
-              <w:rPr>
-                <w:sz w:val="19"/>
-              </w:rPr>
-              <w:t>../../etc/passwd%00.jpg</w:t>
-            </w:r>
-          </w:p>
-        </w:tc>
-        <w:tc>
-          <w:tcPr>
-            <w:tcW w:type="dxa" w:w="2340"/>
-            <w:shd w:fill="FFFFFF"/>
-            <w:tcMar>
-              <w:top w:w="100" w:type="dxa"/>
-              <w:bottom w:w="100" w:type="dxa"/>
-              <w:left w:w="120" w:type="dxa"/>
-              <w:right w:w="120" w:type="dxa"/>
-            </w:tcMar>
-          </w:tcPr>
-          <w:p>
-            <w:r>
-              <w:rPr>
-                <w:sz w:val="19"/>
-              </w:rPr>
-              <w:t>Lừa hàm kiểm tra đuôi mở rộng file ở C/C++, cắt cụt chuỗi kiểm tra.</w:t>
-            </w:r>
-          </w:p>
-        </w:tc>
-      </w:tr>
-      <w:tr>
-        <w:tc>
-          <w:tcPr>
-            <w:tcW w:type="dxa" w:w="2340"/>
-            <w:shd w:fill="F9FAFB"/>
-            <w:tcMar>
-              <w:top w:w="100" w:type="dxa"/>
-              <w:bottom w:w="100" w:type="dxa"/>
-              <w:left w:w="120" w:type="dxa"/>
-              <w:right w:w="120" w:type="dxa"/>
-            </w:tcMar>
-          </w:tcPr>
-          <w:p>
-            <w:r>
-              <w:rPr>
-                <w:sz w:val="19"/>
-              </w:rPr>
-              <w:t>Thực thi lệnh gián tiếp &amp; Đa hình</w:t>
-            </w:r>
-          </w:p>
-        </w:tc>
-        <w:tc>
-          <w:tcPr>
-            <w:tcW w:type="dxa" w:w="2340"/>
-            <w:shd w:fill="F9FAFB"/>
-            <w:tcMar>
-              <w:top w:w="100" w:type="dxa"/>
-              <w:bottom w:w="100" w:type="dxa"/>
-              <w:left w:w="120" w:type="dxa"/>
-              <w:right w:w="120" w:type="dxa"/>
-            </w:tcMar>
-          </w:tcPr>
-          <w:p>
-            <w:r>
-              <w:rPr>
-                <w:sz w:val="19"/>
-              </w:rPr>
-              <w:t>Tận dụng biến môi trường, nối chuỗi và subshell</w:t>
-            </w:r>
-          </w:p>
-        </w:tc>
-        <w:tc>
-          <w:tcPr>
-            <w:tcW w:type="dxa" w:w="2340"/>
-            <w:shd w:fill="F9FAFB"/>
-            <w:tcMar>
-              <w:top w:w="100" w:type="dxa"/>
-              <w:bottom w:w="100" w:type="dxa"/>
-              <w:left w:w="120" w:type="dxa"/>
-              <w:right w:w="120" w:type="dxa"/>
-            </w:tcMar>
-          </w:tcPr>
-          <w:p>
-            <w:r>
-              <w:rPr>
-                <w:sz w:val="19"/>
-              </w:rPr>
-              <w:t>c''a""t /e*c/pas*wd, $(echo Y2F0...|base64 -d)</w:t>
-            </w:r>
-          </w:p>
-        </w:tc>
-        <w:tc>
-          <w:tcPr>
-            <w:tcW w:type="dxa" w:w="2340"/>
-            <w:shd w:fill="F9FAFB"/>
-            <w:tcMar>
-              <w:top w:w="100" w:type="dxa"/>
-              <w:bottom w:w="100" w:type="dxa"/>
-              <w:left w:w="120" w:type="dxa"/>
-              <w:right w:w="120" w:type="dxa"/>
-            </w:tcMar>
-          </w:tcPr>
-          <w:p>
-            <w:r>
-              <w:rPr>
-                <w:sz w:val="19"/>
-              </w:rPr>
-              <w:t>Không chứa bất kỳ từ khóa tĩnh nào trong payload, vô hiệu hóa chữ ký tĩnh.</w:t>
-            </w:r>
-          </w:p>
-        </w:tc>
-      </w:tr>
-    </w:tbl>
-    <w:p>
-      <w:pPr>
-        <w:spacing w:after="120"/>
-      </w:pPr>
-    </w:p>
-    <w:p>
-      <w:pPr>
-        <w:keepNext/>
         <w:spacing w:before="280" w:after="120"/>
       </w:pPr>
       <w:r>
         <w:rPr>
           <w:b/>
           <w:color w:val="0F766E"/>
-          <w:sz w:val="28"/>
+          <w:sz w:val="30"/>
         </w:rPr>
-        <w:t>1.2. CƠ CHẾ HOẠT ĐỘNG CỦA TƯỜNG LỬA ỨNG DỤNG WEB (WAF) VÀ GIỚI HẠN CỦA PHƯƠNG PHÁP TRUYỀN THỐNG</w:t>
+        <w:t>1.2. CƠ SỞ LÝ THUYẾT VỀ TƯỜNG LỬA ỨNG DỤNG WEB (WAF) VÀ HỆ THỐNG LUẬT CHỮ KÝ</w:t>
       </w:r>
     </w:p>
     <w:p>
       <w:pPr>
-        <w:keepNext/>
         <w:spacing w:before="200" w:after="80"/>
       </w:pPr>
       <w:r>
         <w:rPr>
           <w:b/>
-          <w:color w:val="1E3A8A"/>
-          <w:sz w:val="24"/>
+          <w:color w:val="1E40AF"/>
+          <w:sz w:val="27"/>
         </w:rPr>
-        <w:t>1.2.1. Phân loại thế hệ Tường lửa và Nguyên lý Cổng tầng ứng dụng (Application-Level Gateway)</w:t>
+        <w:t>1.2.1. Kiến trúc Cổng tầng ứng dụng (Application-Level Gateway) và Reverse Proxy</w:t>
       </w:r>
     </w:p>
     <w:p>
       <w:pPr>
-        <w:spacing w:after="80" w:line="288" w:lineRule="auto"/>
+        <w:spacing w:after="80" w:line="312" w:lineRule="auto"/>
         <w:jc w:val="both"/>
       </w:pPr>
       <w:r>
         <w:rPr>
-          <w:b w:val="0"/>
           <w:i w:val="0"/>
+          <w:sz w:val="26"/>
         </w:rPr>
-        <w:t>Trong công trình giáo trình kinh điển Cryptography and Network Security: Principles and Practice (Chương 20: Firewalls) [Ref 01], Giáo sư William Stallings đã hệ thống hóa tường lửa thành ba thế hệ công nghệ tiến hóa:</w:t>
+        <w:t>Theo giáo trình kinh điển Cryptography and Network Security của William Stallings (Pearson / Prentice Hall) [Ref 01], hệ thống tường lửa (Firewall) được phân loại thành ba thế hệ chính:</w:t>
       </w:r>
     </w:p>
     <w:p>
       <w:pPr>
         <w:pStyle w:val="ListBullet"/>
-        <w:spacing w:after="60" w:line="276" w:lineRule="auto"/>
+        <w:spacing w:after="60" w:line="312" w:lineRule="auto"/>
         <w:jc w:val="both"/>
       </w:pPr>
       <w:r>
         <w:rPr>
           <w:b/>
           <w:color w:val="111827"/>
+          <w:sz w:val="26"/>
         </w:rPr>
         <w:t xml:space="preserve">1. Bộ lọc gói tin (Packet Filtering Firewall): </w:t>
       </w:r>
       <w:r>
-        <w:t>Hoạt động ở tầng Mạng và Vận chuyển (Layer 3 &amp; 4), chỉ kiểm tra IP và cổng TCP/UDP mà không hiểu nội dung ứng dụng.</w:t>
+        <w:rPr>
+          <w:sz w:val="26"/>
+        </w:rPr>
+        <w:t>Hoạt động tại tầng Network/Transport (Layer 3/4), chỉ kiểm tra địa chỉ IP, cổng (Port) và cờ TCP mà không hiểu được nội dung bên trong gói tin.</w:t>
       </w:r>
     </w:p>
     <w:p>
       <w:pPr>
         <w:pStyle w:val="ListBullet"/>
-        <w:spacing w:after="60" w:line="276" w:lineRule="auto"/>
+        <w:spacing w:after="60" w:line="312" w:lineRule="auto"/>
         <w:jc w:val="both"/>
       </w:pPr>
       <w:r>
         <w:rPr>
           <w:b/>
           <w:color w:val="111827"/>
+          <w:sz w:val="26"/>
         </w:rPr>
-        <w:t xml:space="preserve">2. Bộ lọc trạng thái (Stateful Inspection Firewall): </w:t>
+        <w:t xml:space="preserve">2. Tường lửa trạng thái (Stateful Inspection Firewall): </w:t>
       </w:r>
       <w:r>
-        <w:t>Theo dõi trạng thái kết nối TCP (SYN, ACK, ESTABLISHED) ngăn gói tin giả mạo phiên.</w:t>
+        <w:rPr>
+          <w:sz w:val="26"/>
+        </w:rPr>
+        <w:t>Theo dõi bảng trạng thái của các luồng kết nối TCP/UDP nhưng vẫn bị giới hạn về khả năng bóc tách payload ứng dụng.</w:t>
       </w:r>
     </w:p>
     <w:p>
       <w:pPr>
         <w:pStyle w:val="ListBullet"/>
-        <w:spacing w:after="60" w:line="276" w:lineRule="auto"/>
+        <w:spacing w:after="60" w:line="312" w:lineRule="auto"/>
         <w:jc w:val="both"/>
       </w:pPr>
       <w:r>
         <w:rPr>
           <w:b/>
           <w:color w:val="111827"/>
+          <w:sz w:val="26"/>
         </w:rPr>
-        <w:t xml:space="preserve">3. Cổng tầng ứng dụng (Application-Level Gateway / Reverse Proxy WAF): </w:t>
+        <w:t xml:space="preserve">3. Cổng tầng ứng dụng (Application-Level Gateway / Reverse Proxy): </w:t>
       </w:r>
       <w:r>
-        <w:t>Là thế hệ tường lửa tiên tiến nhất, hoạt động như một Relay Proxy hoàn chỉnh ở Layer 7. Cổng tiếp nhận toàn bộ kết nối TCP từ máy khách, giải nén và tái cấu trúc hoàn chỉnh giao thức HTTP/HTTPS, kiểm tra toàn diện Payload trước khi chuyển tiếp về máy chủ nội bộ.</w:t>
+        <w:rPr>
+          <w:sz w:val="26"/>
+        </w:rPr>
+        <w:t>Đóng vai trò máy chủ trung gian (Proxy) đứng trước hệ thống backend thực tế. Nó chủ động đón nhận toàn bộ kết nối TCP từ máy khách, phân tích toàn diện giao thức tầng ứng dụng (HTTP/HTTPS), giải mã nội dung (URI, Headers, Body) và thực thi chính sách an ninh trước khi quyết định chuyển tiếp (forward) request đến cụm máy chủ nội bộ.</w:t>
       </w:r>
     </w:p>
     <w:p>
       <w:pPr>
-        <w:spacing w:after="80" w:line="288" w:lineRule="auto"/>
+        <w:spacing w:after="80" w:line="312" w:lineRule="auto"/>
         <w:jc w:val="both"/>
       </w:pPr>
       <w:r>
         <w:rPr>
-          <w:b w:val="0"/>
           <w:i w:val="0"/>
+          <w:sz w:val="26"/>
         </w:rPr>
-        <w:t>Theo kiến trúc điều phối lưu lượng trong cuốn NGINX Cookbook [Ref 05], cơ chế Reverse Proxy WAF mang lại những lợi ích bảo mật vượt trội: ẩn giấu máy chủ gốc (Origin Cloaking), khử trùng tiêu đề giao thức (Hop-by-hop headers sanitization), và cho phép phân luồng kiểm tra chuyên sâu qua Normalizer, Rule Engine, ML Detector và Rate Limiter.</w:t>
+        <w:t>Đồ án PBL6 lựa chọn hiện thực hóa giải pháp WAF Security Gateway theo mô hình Reverse Proxy hiệu năng cao bám sát tiêu chuẩn vận hành trong NGINX Cookbook của Derek DeJonghe (O'Reilly Media) [Ref 05]. Mô hình này đảm bảo tính trong suốt hoàn toàn đối với máy khách bên ngoài, đồng thời che giấu hoàn toàn địa chỉ IP thực tế và cấu trúc mạng nội bộ của máy chủ backend.</w:t>
       </w:r>
     </w:p>
     <w:p>
       <w:pPr>
-        <w:keepNext/>
         <w:spacing w:before="200" w:after="80"/>
       </w:pPr>
       <w:r>
         <w:rPr>
           <w:b/>
-          <w:color w:val="1E3A8A"/>
-          <w:sz w:val="24"/>
+          <w:color w:val="1E40AF"/>
+          <w:sz w:val="27"/>
         </w:rPr>
-        <w:t>1.2.2. Cơ chế chấm điểm bất thường lũy tiến (Anomaly Scoring System)</w:t>
+        <w:t>1.2.2. Cơ chế đối sánh luật chữ ký và giải mã chuẩn hóa (Normalization)</w:t>
       </w:r>
     </w:p>
     <w:p>
       <w:pPr>
-        <w:spacing w:after="80" w:line="288" w:lineRule="auto"/>
+        <w:spacing w:after="80" w:line="312" w:lineRule="auto"/>
         <w:jc w:val="both"/>
       </w:pPr>
       <w:r>
         <w:rPr>
-          <w:b w:val="0"/>
           <w:i w:val="0"/>
+          <w:sz w:val="26"/>
         </w:rPr>
-        <w:t>Khác với phương thức chặn tức thời khi khớp một luật duy nhất (Single-Rule Blocking), chuẩn công nghiệp OWASP ModSecurity Core Rule Set (CRS v4.0) [Ref 07] áp dụng kiến trúc Collaborative Anomaly Scoring System. Mỗi quy tắc khi kích hoạt sẽ gán trọng số rủi ro tích lũy:</w:t>
+        <w:t>Một thách thức lớn trong việc bảo vệ Web API là kẻ tấn công thường áp dụng các kỹ thuật né tránh (Evasion Techniques) bằng cách mã hóa hoặc làm biến dạng payload độc hại: URL Encoding, Double URL Encoding, Unicode Fullwidth/Overlong Encoding, Base64 Encoding, hoặc chèn các ký tự rác (Null Byte, Comment Syntax).</w:t>
+      </w:r>
+    </w:p>
+    <w:p>
+      <w:pPr>
+        <w:spacing w:after="80" w:line="312" w:lineRule="auto"/>
+        <w:jc w:val="both"/>
+      </w:pPr>
+      <w:r>
+        <w:rPr>
+          <w:i w:val="0"/>
+          <w:sz w:val="26"/>
+        </w:rPr>
+        <w:t>Theo đặc tả tiêu chuẩn công nghiệp ModSecurity Core Rule Set (CRS v4.0.0) [Ref 07], WAF Security Gateway trong đồ án triển khai quy trình Chuẩn hóa dữ liệu nhiều giai đoạn (Multi-stage Normalization Pipeline):</w:t>
       </w:r>
     </w:p>
     <w:p>
       <w:pPr>
         <w:pStyle w:val="ListBullet"/>
-        <w:spacing w:after="60" w:line="276" w:lineRule="auto"/>
+        <w:spacing w:after="60" w:line="312" w:lineRule="auto"/>
         <w:jc w:val="both"/>
       </w:pPr>
       <w:r>
         <w:rPr>
           <w:b/>
           <w:color w:val="111827"/>
+          <w:sz w:val="26"/>
         </w:rPr>
-        <w:t xml:space="preserve">CRITICAL (+5 điểm): </w:t>
+        <w:t xml:space="preserve">Giai đoạn 1: </w:t>
       </w:r>
       <w:r>
-        <w:t>Khớp trực tiếp cú pháp khai thác SQLi, OS Command Injection.</w:t>
+        <w:rPr>
+          <w:sz w:val="26"/>
+        </w:rPr>
+        <w:t>Đệ quy giải mã URL Decoding (tối đa 3 vòng lặp) để bóc tách triệt để các payload lồng nhau.</w:t>
       </w:r>
     </w:p>
     <w:p>
       <w:pPr>
         <w:pStyle w:val="ListBullet"/>
-        <w:spacing w:after="60" w:line="276" w:lineRule="auto"/>
+        <w:spacing w:after="60" w:line="312" w:lineRule="auto"/>
         <w:jc w:val="both"/>
       </w:pPr>
       <w:r>
         <w:rPr>
           <w:b/>
           <w:color w:val="111827"/>
+          <w:sz w:val="26"/>
         </w:rPr>
-        <w:t xml:space="preserve">HIGH (+4 điểm): </w:t>
+        <w:t xml:space="preserve">Giai đoạn 2: </w:t>
       </w:r>
       <w:r>
-        <w:t>Phát hiện hành vi quét lỗ hổng, traversal.</w:t>
+        <w:rPr>
+          <w:sz w:val="26"/>
+        </w:rPr>
+        <w:t>Chuyển đổi toàn bộ ký tự sang chữ thường (Lowercase Transformation) và loại bỏ ký tự Null Byte (\x00).</w:t>
       </w:r>
     </w:p>
     <w:p>
       <w:pPr>
         <w:pStyle w:val="ListBullet"/>
-        <w:spacing w:after="60" w:line="276" w:lineRule="auto"/>
+        <w:spacing w:after="60" w:line="312" w:lineRule="auto"/>
         <w:jc w:val="both"/>
       </w:pPr>
       <w:r>
         <w:rPr>
           <w:b/>
           <w:color w:val="111827"/>
+          <w:sz w:val="26"/>
         </w:rPr>
-        <w:t xml:space="preserve">MEDIUM (+3 điểm): </w:t>
+        <w:t xml:space="preserve">Giai đoạn 3: </w:t>
       </w:r>
       <w:r>
-        <w:t>Phát hiện từ khóa nhạy cảm, ký tự đặc biệt.</w:t>
+        <w:rPr>
+          <w:sz w:val="26"/>
+        </w:rPr>
+        <w:t>Nén các khoảng trắng liên tiếp và chuẩn hóa dấu phân cách đường dẫn (\ -&gt; /).</w:t>
+      </w:r>
+    </w:p>
+    <w:p>
+      <w:pPr>
+        <w:spacing w:before="200" w:after="80"/>
+      </w:pPr>
+      <w:r>
+        <w:rPr>
+          <w:b/>
+          <w:color w:val="1E40AF"/>
+          <w:sz w:val="27"/>
+        </w:rPr>
+        <w:t>1.2.3. Cơ chế tính điểm bất thường tích lũy (Anomaly Scoring Model)</w:t>
+      </w:r>
+    </w:p>
+    <w:p>
+      <w:pPr>
+        <w:spacing w:after="80" w:line="312" w:lineRule="auto"/>
+        <w:jc w:val="both"/>
+      </w:pPr>
+      <w:r>
+        <w:rPr>
+          <w:i w:val="0"/>
+          <w:sz w:val="26"/>
+        </w:rPr>
+        <w:t>Thay vì áp dụng cơ chế Chặn tức thì (Traditional Blocking Mode) dễ gây ra tình trạng báo động nhầm (False Positives), hệ thống áp dụng Cơ chế tính điểm bất thường tích lũy (Anomaly Scoring Model) theo chuẩn ModSecurity CRS v4.0.0 [Ref 07]. Mỗi quy tắc chữ ký khi khớp sẽ gắn một trọng số rủi ro tương ứng với mức độ nghiêm trọng:</w:t>
       </w:r>
     </w:p>
     <w:p>
       <w:pPr>
         <w:pStyle w:val="ListBullet"/>
-        <w:spacing w:after="60" w:line="276" w:lineRule="auto"/>
+        <w:spacing w:after="60" w:line="312" w:lineRule="auto"/>
         <w:jc w:val="both"/>
       </w:pPr>
       <w:r>
         <w:rPr>
           <w:b/>
           <w:color w:val="111827"/>
+          <w:sz w:val="26"/>
         </w:rPr>
-        <w:t xml:space="preserve">LOW (+2 điểm): </w:t>
+        <w:t xml:space="preserve">CRITICAL (+5 điểm): </w:t>
       </w:r>
       <w:r>
-        <w:t>Sai lệch chuẩn giao thức HTTP.</w:t>
-      </w:r>
-    </w:p>
-    <w:tbl>
-      <w:tblPr>
-        <w:tblW w:type="auto" w:w="0"/>
-        <w:jc w:val="center"/>
-        <w:tblLook w:firstColumn="1" w:firstRow="1" w:lastColumn="0" w:lastRow="0" w:noHBand="0" w:noVBand="1" w:val="04A0"/>
-      </w:tblPr>
-      <w:tblGrid>
-        <w:gridCol w:w="9360"/>
-      </w:tblGrid>
-      <w:tr>
-        <w:tc>
-          <w:tcPr>
-            <w:tcW w:type="dxa" w:w="9360"/>
-            <w:shd w:fill="F3F4F6"/>
-            <w:tcMar>
-              <w:top w:w="140" w:type="dxa"/>
-              <w:bottom w:w="140" w:type="dxa"/>
-              <w:left w:w="200" w:type="dxa"/>
-              <w:right w:w="200" w:type="dxa"/>
-            </w:tcMar>
-          </w:tcPr>
-          <w:p>
-            <w:pPr>
-              <w:jc w:val="center"/>
-            </w:pPr>
-            <w:r>
-              <w:rPr>
-                <w:b/>
-                <w:color w:val="1E293B"/>
-                <w:sz w:val="22"/>
-              </w:rPr>
-              <w:t>S_anomaly = sum_{i in Rules matched} Score(i)</w:t>
-            </w:r>
-          </w:p>
-          <w:p>
-            <w:pPr>
-              <w:jc w:val="center"/>
-            </w:pPr>
-            <w:r>
-              <w:rPr>
-                <w:i/>
-                <w:color w:val="64748B"/>
-                <w:sz w:val="19"/>
-              </w:rPr>
-              <w:t>Công thức tính Điểm bất thường tích lũy (Cumulative Anomaly Score) theo chuẩn OWASP CRS v4.0</w:t>
-            </w:r>
-          </w:p>
-        </w:tc>
-      </w:tr>
-    </w:tbl>
-    <w:p>
-      <w:pPr>
-        <w:spacing w:after="80"/>
-      </w:pPr>
-    </w:p>
-    <w:p>
-      <w:pPr>
-        <w:spacing w:after="80" w:line="288" w:lineRule="auto"/>
-        <w:jc w:val="both"/>
-      </w:pPr>
-      <w:r>
         <w:rPr>
-          <w:b w:val="0"/>
-          <w:i w:val="0"/>
+          <w:sz w:val="26"/>
         </w:rPr>
-        <w:t>Chỉ khi S_anomaly &gt;= Anomaly Threshold (mặc định = 5 điểm), WAF mới thực hiện ngắt kết nối và trả về mã lỗi HTTP 403 Forbidden. Mô hình này giảm thiểu đáng kể tỷ lệ chặn nhầm các yêu cầu hợp lệ.</w:t>
-      </w:r>
-    </w:p>
-    <w:p>
-      <w:pPr>
-        <w:keepNext/>
-        <w:spacing w:before="200" w:after="80"/>
-      </w:pPr>
-      <w:r>
-        <w:rPr>
-          <w:b/>
-          <w:color w:val="1E3A8A"/>
-          <w:sz w:val="24"/>
-        </w:rPr>
-        <w:t>1.2.3. Những giới hạn cốt tử của phương pháp dựa trên luật tĩnh</w:t>
-      </w:r>
-    </w:p>
-    <w:p>
-      <w:pPr>
-        <w:spacing w:after="80" w:line="288" w:lineRule="auto"/>
-        <w:jc w:val="both"/>
-      </w:pPr>
-      <w:r>
-        <w:rPr>
-          <w:b w:val="0"/>
-          <w:i w:val="0"/>
-        </w:rPr>
-        <w:t>Mặc dù đóng vai trò là hàng rào lọc thô không thể thiếu, WAF dựa trên luật tĩnh bộc lộ những khiếm khuyết nội tại theo phân tích của William Stallings [Ref 01]:</w:t>
+        <w:t>Khớp dấu hiệu tiêm mã độc nguy hiểm (SQLi, RCE, Shell Command).</w:t>
       </w:r>
     </w:p>
     <w:p>
       <w:pPr>
         <w:pStyle w:val="ListBullet"/>
-        <w:spacing w:after="60" w:line="276" w:lineRule="auto"/>
+        <w:spacing w:after="60" w:line="312" w:lineRule="auto"/>
         <w:jc w:val="both"/>
       </w:pPr>
       <w:r>
         <w:rPr>
           <w:b/>
           <w:color w:val="111827"/>
+          <w:sz w:val="26"/>
         </w:rPr>
-        <w:t xml:space="preserve">1. Bất lực trước biến thể mới và tấn công chưa từng biết (Zero-day Attacks): </w:t>
+        <w:t xml:space="preserve">HIGH (+4 điểm): </w:t>
       </w:r>
       <w:r>
-        <w:t>Luật chữ ký chỉ phát hiện được những gì đã định nghĩa trước.</w:t>
+        <w:rPr>
+          <w:sz w:val="26"/>
+        </w:rPr>
+        <w:t>Khớp dấu hiệu XSS hoặc đọc tệp tin hệ thống (LFI / Path Traversal).</w:t>
       </w:r>
     </w:p>
     <w:p>
       <w:pPr>
         <w:pStyle w:val="ListBullet"/>
-        <w:spacing w:after="60" w:line="276" w:lineRule="auto"/>
+        <w:spacing w:after="60" w:line="312" w:lineRule="auto"/>
         <w:jc w:val="both"/>
       </w:pPr>
       <w:r>
         <w:rPr>
           <w:b/>
           <w:color w:val="111827"/>
+          <w:sz w:val="26"/>
         </w:rPr>
-        <w:t xml:space="preserve">2. Nghịch lý False Positive vs False Negative: </w:t>
+        <w:t xml:space="preserve">MEDIUM (+3 điểm): </w:t>
       </w:r>
       <w:r>
-        <w:t>Viết regex quá chặt chẽ sẽ chặn nhầm văn bản nghiệp vụ lành tính (báo động giả cao); nới lỏng regex sẽ bị kẻ tấn công làm mờ payload vượt qua (bỏ lọt cao).</w:t>
+        <w:rPr>
+          <w:sz w:val="26"/>
+        </w:rPr>
+        <w:t>Khớp dấu hiệu thăm dò, quét lỗ hổng hoặc user-agent khả nghi.</w:t>
       </w:r>
     </w:p>
     <w:p>
       <w:pPr>
         <w:pStyle w:val="ListBullet"/>
-        <w:spacing w:after="60" w:line="276" w:lineRule="auto"/>
+        <w:spacing w:after="60" w:line="312" w:lineRule="auto"/>
         <w:jc w:val="both"/>
       </w:pPr>
       <w:r>
         <w:rPr>
           <w:b/>
           <w:color w:val="111827"/>
+          <w:sz w:val="26"/>
         </w:rPr>
-        <w:t xml:space="preserve">3. Chi phí tính toán tăng mạnh (Regex Performance Degradation): </w:t>
+        <w:t xml:space="preserve">LOW (+2 điểm): </w:t>
       </w:r>
       <w:r>
-        <w:t>Hàng nghìn regex phức tạp gây suy giảm thông lượng và tiềm ẩn nguy cơ dính tấn công ReDoS.</w:t>
+        <w:rPr>
+          <w:sz w:val="26"/>
+        </w:rPr>
+        <w:t>Sai lệch chuẩn giao thức HTTP.</w:t>
       </w:r>
     </w:p>
     <w:p>
       <w:pPr>
-        <w:keepNext/>
+        <w:spacing w:before="160" w:after="40" w:line="276" w:lineRule="auto"/>
+        <w:jc w:val="center"/>
+      </w:pPr>
+      <m:oMathPara>
+        <m:oMath>
+          <m:sSub>
+            <m:e>
+              <m:r>
+                <m:t>S</m:t>
+              </m:r>
+            </m:e>
+            <m:sub>
+              <m:r>
+                <m:rPr>
+                  <m:nor/>
+                </m:rPr>
+                <m:t>anomaly</m:t>
+              </m:r>
+            </m:sub>
+          </m:sSub>
+          <m:r>
+            <m:t>=</m:t>
+          </m:r>
+          <m:nary>
+            <m:naryPr>
+              <m:chr m:val="∑"/>
+              <m:limLoc m:val="subSup"/>
+              <m:grow m:val="1"/>
+              <m:subHide m:val="off"/>
+              <m:supHide m:val="on"/>
+            </m:naryPr>
+            <m:sub>
+              <m:r>
+                <m:t>i∈</m:t>
+              </m:r>
+              <m:r>
+                <m:rPr>
+                  <m:nor/>
+                </m:rPr>
+                <m:t>Rules matched</m:t>
+              </m:r>
+            </m:sub>
+            <m:sup/>
+            <m:e>
+              <m:r>
+                <m:rPr>
+                  <m:nor/>
+                </m:rPr>
+                <m:t>Score</m:t>
+              </m:r>
+              <m:r>
+                <m:t>(i)</m:t>
+              </m:r>
+            </m:e>
+          </m:nary>
+        </m:oMath>
+      </m:oMathPara>
+    </w:p>
+    <w:p>
+      <w:pPr>
+        <w:spacing w:before="0" w:after="160"/>
+        <w:jc w:val="center"/>
+      </w:pPr>
+      <w:r>
+        <w:rPr>
+          <w:i/>
+          <w:color w:val="4B5563"/>
+          <w:sz w:val="20"/>
+        </w:rPr>
+        <w:t>Công thức (1.1): Công thức tính Điểm bất thường tích lũy (Cumulative Anomaly Score) theo chuẩn OWASP CRS v4.0 [Ref 07]</w:t>
+      </w:r>
+    </w:p>
+    <w:p>
+      <w:pPr>
+        <w:spacing w:after="80" w:line="312" w:lineRule="auto"/>
+        <w:jc w:val="both"/>
+      </w:pPr>
+      <w:r>
+        <w:rPr>
+          <w:i w:val="0"/>
+          <w:sz w:val="26"/>
+        </w:rPr>
+        <w:t>Chỉ khi S_anomaly &gt;= Anomaly Threshold (mặc định là 5.0 điểm), WAF mới thực hiện ngắt kết nối và trả về mã lỗi HTTP 403 Forbidden. Mô hình này giúp giảm thiểu đáng kể tỷ lệ chặn nhầm các yêu cầu hợp lệ.</w:t>
+      </w:r>
+    </w:p>
+    <w:p>
+      <w:pPr>
         <w:spacing w:before="280" w:after="120"/>
       </w:pPr>
       <w:r>
         <w:rPr>
           <w:b/>
           <w:color w:val="0F766E"/>
-          <w:sz w:val="28"/>
+          <w:sz w:val="30"/>
         </w:rPr>
-        <w:t>1.3. CƠ SỞ LÝ THUYẾT VỀ TRÍCH XUẤT ĐẶC TRƯNG VÀ HỌC MÁY TRONG PHÁT HIỆN TẤN CÔNG WEB</w:t>
+        <w:t>1.3. CƠ SỞ LÝ THUYẾT VỀ HỌC MÁY TRONG PHÁT HIỆN TẤN CÔNG WEB</w:t>
       </w:r>
     </w:p>
     <w:p>
       <w:pPr>
-        <w:keepNext/>
         <w:spacing w:before="200" w:after="80"/>
       </w:pPr>
       <w:r>
         <w:rPr>
           <w:b/>
-          <w:color w:val="1E3A8A"/>
-          <w:sz w:val="24"/>
+          <w:color w:val="1E40AF"/>
+          <w:sz w:val="27"/>
         </w:rPr>
-        <w:t>1.3.1. Phương pháp trích xuất đặc trưng hình thái học và thống kê chuỗi HTTP</w:t>
+        <w:t>1.3.1. Kỹ nghệ trích xuất đặc trưng hình thái (Payload Morphology &amp; Statistical Features)</w:t>
       </w:r>
     </w:p>
     <w:p>
       <w:pPr>
-        <w:keepNext/>
-        <w:spacing w:before="120" w:after="40"/>
-      </w:pPr>
-      <w:r>
-        <w:rPr>
-          <w:b/>
-          <w:color w:val="374151"/>
-          <w:sz w:val="22"/>
-        </w:rPr>
-        <w:t>1. Cơ sở toán học của độ hỗn loạn thông tin Shannon Entropy</w:t>
-      </w:r>
-    </w:p>
-    <w:p>
-      <w:pPr>
-        <w:spacing w:after="80" w:line="288" w:lineRule="auto"/>
+        <w:spacing w:after="80" w:line="312" w:lineRule="auto"/>
         <w:jc w:val="both"/>
       </w:pPr>
       <w:r>
         <w:rPr>
-          <w:b w:val="0"/>
           <w:i w:val="0"/>
+          <w:sz w:val="26"/>
         </w:rPr>
-        <w:t>Theo giáo trình kinh điển Cryptography: Theory and Practice của Douglas R. Stinson và Maura B. Paterson (Chương 2: Information Theory) [Ref 02], độ hỗn loạn thông tin (Shannon Entropy) là thước đo định lượng toán học về tính ngẫu nhiên, độ bất định và lượng thông tin trung bình chứa trong một biến ngẫu nhiên rời rạc. Cho chuỗi ký tự payload S có độ dài L, xác suất p(c_i) xuất hiện của ký tự c_i là count(c_i) / L. Độ hỗn loạn Shannon Entropy H(S) (tính theo bit) được định nghĩa:</w:t>
-      </w:r>
-    </w:p>
-    <w:tbl>
-      <w:tblPr>
-        <w:tblW w:type="auto" w:w="0"/>
-        <w:jc w:val="center"/>
-        <w:tblLook w:firstColumn="1" w:firstRow="1" w:lastColumn="0" w:lastRow="0" w:noHBand="0" w:noVBand="1" w:val="04A0"/>
-      </w:tblPr>
-      <w:tblGrid>
-        <w:gridCol w:w="9360"/>
-      </w:tblGrid>
-      <w:tr>
-        <w:tc>
-          <w:tcPr>
-            <w:tcW w:type="dxa" w:w="9360"/>
-            <w:shd w:fill="F3F4F6"/>
-            <w:tcMar>
-              <w:top w:w="140" w:type="dxa"/>
-              <w:bottom w:w="140" w:type="dxa"/>
-              <w:left w:w="200" w:type="dxa"/>
-              <w:right w:w="200" w:type="dxa"/>
-            </w:tcMar>
-          </w:tcPr>
-          <w:p>
-            <w:pPr>
-              <w:jc w:val="center"/>
-            </w:pPr>
-            <w:r>
-              <w:rPr>
-                <w:b/>
-                <w:color w:val="1E293B"/>
-                <w:sz w:val="22"/>
-              </w:rPr>
-              <w:t>H(S) = - sum_{i=1}^{k} p(c_i) * log_2 p(c_i)</w:t>
-            </w:r>
-          </w:p>
-          <w:p>
-            <w:pPr>
-              <w:jc w:val="center"/>
-            </w:pPr>
-            <w:r>
-              <w:rPr>
-                <w:i/>
-                <w:color w:val="64748B"/>
-                <w:sz w:val="19"/>
-              </w:rPr>
-              <w:t>Công thức toán học tính toán Shannon Entropy H(S) của chuỗi payload (Stinson &amp; Paterson, 2018)</w:t>
-            </w:r>
-          </w:p>
-        </w:tc>
-      </w:tr>
-    </w:tbl>
-    <w:p>
-      <w:pPr>
-        <w:spacing w:after="80"/>
-      </w:pPr>
-    </w:p>
-    <w:p>
-      <w:pPr>
-        <w:spacing w:after="80" w:line="288" w:lineRule="auto"/>
-        <w:jc w:val="both"/>
-      </w:pPr>
-      <w:r>
-        <w:rPr>
-          <w:b w:val="0"/>
-          <w:i w:val="0"/>
-        </w:rPr>
-        <w:t>Ý nghĩa an ninh thông tin: Văn bản tự nhiên và tham số lành tính có entropy dao động từ 2.0 đến 3.5. Trong khi đó, payload tấn công làm mờ (Base64, Hex, Shellcode, SQLi đa tầng) có độ phân tán ký tự đều bất thường, khiến entropy tăng vọt lên mức &gt;= 3.8 - 4.5. Do đó, Shannon Entropy là đặc trưng hình thái học cực kỳ nhạy cảm để phát hiện dấu hiệu bất thường mà không cần từ điển chữ ký tĩnh.</w:t>
-      </w:r>
-    </w:p>
-    <w:p>
-      <w:pPr>
-        <w:keepNext/>
-        <w:spacing w:before="120" w:after="40"/>
-      </w:pPr>
-      <w:r>
-        <w:rPr>
-          <w:b/>
-          <w:color w:val="374151"/>
-          <w:sz w:val="22"/>
-        </w:rPr>
-        <w:t>2. Không gian 17 đặc trưng hình thái chuẩn tắc (Canonical 17-D Feature Vector)</w:t>
-      </w:r>
-    </w:p>
-    <w:p>
-      <w:pPr>
-        <w:spacing w:after="80" w:line="288" w:lineRule="auto"/>
-        <w:jc w:val="both"/>
-      </w:pPr>
-      <w:r>
-        <w:rPr>
-          <w:b w:val="0"/>
-          <w:i w:val="0"/>
-        </w:rPr>
-        <w:t>Kế thừa và chuẩn hóa công trình nghiên cứu nền tảng của C. Torrano-Gimenez et al. (Wiley Security and Communication Networks 2015) [Ref 08] và bài báo tổng quan SQLi của M. Hasan et al. (IEEE Access 2023) [Ref 10], đồ án xây dựng vector 17 chiều chuẩn tắc gồm 2 nhóm:</w:t>
+        <w:t>Hạn chế cốt tử của hệ thống luật chữ ký truyền thống là hoàn toàn bất lực trước các cuộc tấn công Zero-day hoặc các biến thể mã độc bị làm rối vượt qua từ điển regex. Để giải quyết triệt để vấn đề này, đồ án PBL6 triển khai mô hình học máy dựa trên Kỹ nghệ trích xuất vector 17 đặc trưng hình thái thống kê bám sát công trình nghiên cứu trên tạp chí Wiley Security and Communication Networks [Ref 15]:</w:t>
       </w:r>
     </w:p>
     <w:p>
       <w:pPr>
         <w:pStyle w:val="ListBullet"/>
-        <w:spacing w:after="60" w:line="276" w:lineRule="auto"/>
+        <w:spacing w:after="60" w:line="312" w:lineRule="auto"/>
         <w:jc w:val="both"/>
       </w:pPr>
       <w:r>
         <w:rPr>
           <w:b/>
           <w:color w:val="111827"/>
+          <w:sz w:val="26"/>
         </w:rPr>
-        <w:t xml:space="preserve">Nhóm 1 (12 đặc trưng hình thái &amp; entropy): </w:t>
+        <w:t xml:space="preserve">1. Đặc trưng độ dài và tỷ lệ cấu trúc: </w:t>
       </w:r>
       <w:r>
-        <w:t>length, entropy, count_single_quote, count_double_quote, count_less_than, count_greater_than, count_semicolon, count_hyphen, count_slash, count_backslash, count_parenthesis, special_char_ratio.</w:t>
+        <w:rPr>
+          <w:sz w:val="26"/>
+        </w:rPr>
+        <w:t>Độ dài chuỗi payload (payload_length), tỷ lệ chữ số (digit_ratio), tỷ lệ chữ cái (alpha_ratio), tỷ lệ ký tự đặc biệt (special_char_ratio).</w:t>
       </w:r>
     </w:p>
     <w:p>
       <w:pPr>
         <w:pStyle w:val="ListBullet"/>
-        <w:spacing w:after="60" w:line="276" w:lineRule="auto"/>
+        <w:spacing w:after="60" w:line="312" w:lineRule="auto"/>
         <w:jc w:val="both"/>
       </w:pPr>
       <w:r>
         <w:rPr>
           <w:b/>
           <w:color w:val="111827"/>
+          <w:sz w:val="26"/>
         </w:rPr>
-        <w:t xml:space="preserve">Nhóm 2 (5 đặc trưng mật độ từ khóa &amp; cú pháp): </w:t>
+        <w:t xml:space="preserve">2. Đặc trưng từ khóa nguy hại theo ngữ cảnh: </w:t>
       </w:r>
       <w:r>
-        <w:t>sql_keyword_count, xss_keyword_count, sqli_regex_matches, xss_regex_matches, path_traversal_matches.</w:t>
+        <w:rPr>
+          <w:sz w:val="26"/>
+        </w:rPr>
+        <w:t>Tần suất xuất hiện các token nhạy cảm trong SQLi (SELECT, UNION, DROP, OR, AND), trong XSS (&lt;script&gt;, onerror, onload), trong Path Traversal (../, ..\\) và trong Command Injection (;, |, &amp;&amp;, /bin/sh, cmd.exe).</w:t>
       </w:r>
     </w:p>
     <w:p>
       <w:pPr>
-        <w:keepNext/>
+        <w:pStyle w:val="ListBullet"/>
+        <w:spacing w:after="60" w:line="312" w:lineRule="auto"/>
+        <w:jc w:val="both"/>
+      </w:pPr>
+      <w:r>
+        <w:rPr>
+          <w:b/>
+          <w:color w:val="111827"/>
+          <w:sz w:val="26"/>
+        </w:rPr>
+        <w:t xml:space="preserve">3. Đặc trưng độ hỗn loạn thông tin (Shannon Entropy): </w:t>
+      </w:r>
+      <w:r>
+        <w:rPr>
+          <w:sz w:val="26"/>
+        </w:rPr>
+        <w:t>Được xác định theo định lý lý thuyết thông tin của Claude Shannon trong giáo trình Cryptography: Theory and Practice của Douglas R. Stinson và Maura B. Paterson [Ref 02].</w:t>
+      </w:r>
+    </w:p>
+    <w:p>
+      <w:pPr>
+        <w:spacing w:before="160" w:after="40" w:line="276" w:lineRule="auto"/>
+        <w:jc w:val="center"/>
+      </w:pPr>
+      <m:oMathPara>
+        <m:oMath>
+          <m:r>
+            <m:t>H(S)=−</m:t>
+          </m:r>
+          <m:nary>
+            <m:naryPr>
+              <m:chr m:val="∑"/>
+              <m:limLoc m:val="subSup"/>
+              <m:grow m:val="1"/>
+              <m:subHide m:val="off"/>
+              <m:supHide m:val="off"/>
+            </m:naryPr>
+            <m:sub>
+              <m:r>
+                <m:t>i=1</m:t>
+              </m:r>
+            </m:sub>
+            <m:sup>
+              <m:r>
+                <m:t>k</m:t>
+              </m:r>
+            </m:sup>
+            <m:e>
+              <m:r>
+                <m:t>p(</m:t>
+              </m:r>
+            </m:e>
+          </m:nary>
+          <m:sSub>
+            <m:e>
+              <m:r>
+                <m:t>c</m:t>
+              </m:r>
+            </m:e>
+            <m:sub>
+              <m:r>
+                <m:t>i</m:t>
+              </m:r>
+            </m:sub>
+          </m:sSub>
+          <m:r>
+            <m:t>)</m:t>
+          </m:r>
+          <m:sSub>
+            <m:e>
+              <m:r>
+                <m:rPr>
+                  <m:sty m:val="p"/>
+                </m:rPr>
+                <m:t>log</m:t>
+              </m:r>
+            </m:e>
+            <m:sub>
+              <m:r>
+                <m:t>2</m:t>
+              </m:r>
+            </m:sub>
+          </m:sSub>
+          <m:r>
+            <m:t>p(</m:t>
+          </m:r>
+          <m:sSub>
+            <m:e>
+              <m:r>
+                <m:t>c</m:t>
+              </m:r>
+            </m:e>
+            <m:sub>
+              <m:r>
+                <m:t>i</m:t>
+              </m:r>
+            </m:sub>
+          </m:sSub>
+          <m:r>
+            <m:t>)</m:t>
+          </m:r>
+        </m:oMath>
+      </m:oMathPara>
+    </w:p>
+    <w:p>
+      <w:pPr>
+        <w:spacing w:before="0" w:after="160"/>
+        <w:jc w:val="center"/>
+      </w:pPr>
+      <w:r>
+        <w:rPr>
+          <w:i/>
+          <w:color w:val="4B5563"/>
+          <w:sz w:val="20"/>
+        </w:rPr>
+        <w:t>Công thức (1.2): Công thức toán học tính toán Shannon Entropy H(S) của chuỗi payload (Stinson &amp; Paterson [Ref 02])</w:t>
+      </w:r>
+    </w:p>
+    <w:p>
+      <w:pPr>
+        <w:spacing w:after="80" w:line="312" w:lineRule="auto"/>
+        <w:jc w:val="both"/>
+      </w:pPr>
+      <w:r>
+        <w:rPr>
+          <w:i w:val="0"/>
+          <w:sz w:val="26"/>
+        </w:rPr>
+        <w:t>Trong đó p(c_i) là tần suất xuất hiện tương đối của ký tự c_i trong chuỗi. Các payload bị làm rối bằng Base64, mã hex hoặc mã hóa URL đệ quy luôn có độ hỗn loạn Shannon Entropy xấp xỉ mức tối đa, tạo ra ranh giới phân tách toán học cực kỳ rõ ràng so với các tham số nghiệp vụ thông thường.</w:t>
+      </w:r>
+    </w:p>
+    <w:p>
+      <w:pPr>
         <w:spacing w:before="200" w:after="80"/>
       </w:pPr>
       <w:r>
         <w:rPr>
           <w:b/>
-          <w:color w:val="1E3A8A"/>
-          <w:sz w:val="24"/>
+          <w:color w:val="1E40AF"/>
+          <w:sz w:val="27"/>
         </w:rPr>
-        <w:t>1.3.2. Thuật toán học máy có giám sát — Rừng ngẫu nhiên (Random Forest)</w:t>
+        <w:t>1.3.2. Thuật toán Random Forest và cơ chế Ensemble Learning</w:t>
       </w:r>
     </w:p>
     <w:p>
       <w:pPr>
-        <w:spacing w:after="80" w:line="288" w:lineRule="auto"/>
+        <w:spacing w:after="80" w:line="312" w:lineRule="auto"/>
         <w:jc w:val="both"/>
       </w:pPr>
       <w:r>
         <w:rPr>
-          <w:b w:val="0"/>
           <w:i w:val="0"/>
+          <w:sz w:val="26"/>
         </w:rPr>
-        <w:t>Random Forest (Leo Breiman, 2001) huấn luyện một tập hợp B cây quyết định độc lập qua kỹ thuật Bootstrap Aggregating (Bagging) và chọn lọc ngẫu nhiên tập con đặc trưng (Random Subspace). Kết quả phân loại cuối cùng được tổng hợp qua cơ chế bỏ phiếu đa số hoặc trung bình xác suất:</w:t>
+        <w:t>Theo công trình nền tảng Random Forests của Leo Breiman (Machine Learning 2001) [Ref 12], Random Forest là thuật toán học máy có giám sát (Supervised Learning) dựa trên nguyên lý kết hợp (Ensemble Learning) nhiều cây quyết định ngẫu nhiên (Random Decision Trees) bằng kỹ thuật Bootstrap Aggregating (Bagging).</w:t>
       </w:r>
-    </w:p>
-    <w:tbl>
-      <w:tblPr>
-        <w:tblW w:type="auto" w:w="0"/>
-        <w:jc w:val="center"/>
-        <w:tblLook w:firstColumn="1" w:firstRow="1" w:lastColumn="0" w:lastRow="0" w:noHBand="0" w:noVBand="1" w:val="04A0"/>
-      </w:tblPr>
-      <w:tblGrid>
-        <w:gridCol w:w="9360"/>
-      </w:tblGrid>
-      <w:tr>
-        <w:tc>
-          <w:tcPr>
-            <w:tcW w:type="dxa" w:w="9360"/>
-            <w:shd w:fill="F3F4F6"/>
-            <w:tcMar>
-              <w:top w:w="140" w:type="dxa"/>
-              <w:bottom w:w="140" w:type="dxa"/>
-              <w:left w:w="200" w:type="dxa"/>
-              <w:right w:w="200" w:type="dxa"/>
-            </w:tcMar>
-          </w:tcPr>
-          <w:p>
-            <w:pPr>
-              <w:jc w:val="center"/>
-            </w:pPr>
-            <w:r>
-              <w:rPr>
-                <w:b/>
-                <w:color w:val="1E293B"/>
-                <w:sz w:val="22"/>
-              </w:rPr>
-              <w:t>y_hat = argmax_c [ (1 / B) * sum_{b=1}^{B} P_{T_b}(y = c | x) ]</w:t>
-            </w:r>
-          </w:p>
-          <w:p>
-            <w:pPr>
-              <w:jc w:val="center"/>
-            </w:pPr>
-            <w:r>
-              <w:rPr>
-                <w:i/>
-                <w:color w:val="64748B"/>
-                <w:sz w:val="19"/>
-              </w:rPr>
-              <w:t>Công thức tổng hợp phân loại của mô hình kết hợp Random Forest</w:t>
-            </w:r>
-          </w:p>
-        </w:tc>
-      </w:tr>
-    </w:tbl>
-    <w:p>
-      <w:pPr>
-        <w:spacing w:after="80"/>
-      </w:pPr>
     </w:p>
     <w:p>
       <w:pPr>
-        <w:spacing w:after="80" w:line="288" w:lineRule="auto"/>
+        <w:spacing w:before="160" w:after="40" w:line="276" w:lineRule="auto"/>
+        <w:jc w:val="center"/>
+      </w:pPr>
+      <m:oMathPara>
+        <m:oMath>
+          <m:acc>
+            <m:accPr>
+              <m:chr m:val="̂"/>
+            </m:accPr>
+            <m:e>
+              <m:r>
+                <m:t>y</m:t>
+              </m:r>
+            </m:e>
+          </m:acc>
+          <m:r>
+            <m:t>=</m:t>
+          </m:r>
+          <m:r>
+            <m:rPr>
+              <m:sty m:val="p"/>
+            </m:rPr>
+            <m:t>\arg</m:t>
+          </m:r>
+          <m:sSub>
+            <m:e>
+              <m:r>
+                <m:t>max</m:t>
+              </m:r>
+            </m:e>
+            <m:sub>
+              <m:r>
+                <m:t>c∈{0,1}</m:t>
+              </m:r>
+            </m:sub>
+          </m:sSub>
+          <m:d>
+            <m:dPr>
+              <m:sepChr m:val=""/>
+            </m:dPr>
+            <m:e>
+              <m:f>
+                <m:fPr>
+                  <m:type m:val="bar"/>
+                </m:fPr>
+                <m:num>
+                  <m:r>
+                    <m:t>1</m:t>
+                  </m:r>
+                </m:num>
+                <m:den>
+                  <m:r>
+                    <m:t>B</m:t>
+                  </m:r>
+                </m:den>
+              </m:f>
+              <m:nary>
+                <m:naryPr>
+                  <m:chr m:val="∑"/>
+                  <m:limLoc m:val="subSup"/>
+                  <m:grow m:val="1"/>
+                  <m:subHide m:val="off"/>
+                  <m:supHide m:val="off"/>
+                </m:naryPr>
+                <m:sub>
+                  <m:r>
+                    <m:t>b=1</m:t>
+                  </m:r>
+                </m:sub>
+                <m:sup>
+                  <m:r>
+                    <m:t>B</m:t>
+                  </m:r>
+                </m:sup>
+                <m:e>
+                  <m:sSub>
+                    <m:e>
+                      <m:r>
+                        <m:t>P</m:t>
+                      </m:r>
+                    </m:e>
+                    <m:sub>
+                      <m:sSub>
+                        <m:e>
+                          <m:r>
+                            <m:t>T</m:t>
+                          </m:r>
+                        </m:e>
+                        <m:sub>
+                          <m:r>
+                            <m:t>b</m:t>
+                          </m:r>
+                        </m:sub>
+                      </m:sSub>
+                    </m:sub>
+                  </m:sSub>
+                </m:e>
+              </m:nary>
+              <m:r>
+                <m:t>(</m:t>
+              </m:r>
+              <m:r>
+                <m:t>y</m:t>
+              </m:r>
+              <m:r>
+                <m:t>=</m:t>
+              </m:r>
+              <m:r>
+                <m:t>c</m:t>
+              </m:r>
+              <m:r>
+                <m:t>∣</m:t>
+              </m:r>
+              <m:r>
+                <m:t>x</m:t>
+              </m:r>
+              <m:r>
+                <m:t>)</m:t>
+              </m:r>
+            </m:e>
+          </m:d>
+        </m:oMath>
+      </m:oMathPara>
+    </w:p>
+    <w:p>
+      <w:pPr>
+        <w:spacing w:before="0" w:after="160"/>
+        <w:jc w:val="center"/>
+      </w:pPr>
+      <w:r>
+        <w:rPr>
+          <w:i/>
+          <w:color w:val="4B5563"/>
+          <w:sz w:val="20"/>
+        </w:rPr>
+        <w:t>Công thức (1.3): Công thức tổng hợp phân loại của mô hình kết hợp Random Forest theo Breiman [Ref 12]</w:t>
+      </w:r>
+    </w:p>
+    <w:p>
+      <w:pPr>
+        <w:spacing w:after="80" w:line="312" w:lineRule="auto"/>
         <w:jc w:val="both"/>
       </w:pPr>
       <w:r>
         <w:rPr>
-          <w:b w:val="0"/>
           <w:i w:val="0"/>
+          <w:sz w:val="26"/>
         </w:rPr>
-        <w:t>Động lực lựa chọn Random Forest thay vì Deep Learning / Transformers:</w:t>
+        <w:t>Nhờ cơ chế lấy mẫu ngẫu nhiên có hoàn lại (Bootstrap) và chọn tập con ngẫu nhiên các đặc trưng tại mỗi điểm phân nhánh (Feature Subsampling), Random Forest triệt tiêu hiện tượng quá khớp (Overfitting), có khả năng chống chịu nhiễu đối kháng vượt trội so với các thuật toán Boosting tuần tự [Ref 14].</w:t>
       </w:r>
     </w:p>
     <w:p>
       <w:pPr>
-        <w:spacing w:after="80" w:line="288" w:lineRule="auto"/>
-        <w:jc w:val="both"/>
-      </w:pPr>
-      <w:r>
-        <w:rPr>
-          <w:b w:val="0"/>
-          <w:i w:val="0"/>
-        </w:rPr>
-        <w:t>Theo khảo sát thực nghiệm chuyên sâu trên IEEE Access (2024) [Ref 12] và MDPI Electronics (2025) [Ref 11], việc ứng dụng mạng nơ-ron sâu (CNN, Bi-LSTM) hoặc Transformers (BERT) vào tầng WAF Gateway gặp trở ngại lớn về độ trễ suy luận (60ms - 150ms trên CPU). Trong khi đó, Random Forest đạt độ trễ siêu tốc chỉ từ 0.02ms đến 0.05ms trên CPU đơn lõi, đồng thời cung cấp khả năng giải thích tường minh (Feature Importance) và khả năng chống quá khớp cực cao.</w:t>
-      </w:r>
-    </w:p>
-    <w:p>
-      <w:pPr>
-        <w:keepNext/>
         <w:spacing w:before="200" w:after="80"/>
       </w:pPr>
       <w:r>
         <w:rPr>
           <w:b/>
-          <w:color w:val="1E3A8A"/>
-          <w:sz w:val="24"/>
+          <w:color w:val="1E40AF"/>
+          <w:sz w:val="27"/>
         </w:rPr>
-        <w:t>1.3.3. Thuật toán học máy không giám sát — Rừng cô lập (Isolation Forest)</w:t>
+        <w:t>1.3.3. Thuật toán Isolation Forest trong phát hiện tấn công Zero-day</w:t>
       </w:r>
     </w:p>
     <w:p>
       <w:pPr>
-        <w:spacing w:after="80" w:line="288" w:lineRule="auto"/>
+        <w:spacing w:after="80" w:line="312" w:lineRule="auto"/>
         <w:jc w:val="both"/>
       </w:pPr>
       <w:r>
         <w:rPr>
-          <w:b w:val="0"/>
           <w:i w:val="0"/>
+          <w:sz w:val="26"/>
         </w:rPr>
-        <w:t>Để bắt các cuộc tấn công Zero-day hoặc biến dị payload chưa từng thấy, hệ thống tích hợp Isolation Forest (Liu et al. ICDM 2008). Thuật toán xây dựng tập hợp iTrees phân tách ngẫu nhiên dữ liệu; do điểm dị biệt nằm ở vùng thưa thớt, chúng bị cô lập rất nhanh chóng và có độ sâu đường đi h(x) rất ngắn. Điểm bất thường s(x, n) được tính theo công thức:</w:t>
+        <w:t>Để phát hiện các mẫu tấn công dị biệt chưa từng xuất hiện trong tập huấn luyện (Zero-day Anomalies), hệ thống tích hợp thuật toán học không giám sát Isolation Forest của Fei Tony Liu, Kai Ming Ting và Zhi-Hua Zhou (IEEE ICDM 2008) [Ref 11]. Thuật toán hoạt động dựa trên nguyên lý: các điểm dị biệt (anomalies) luôn có số lượng ít và giá trị đặc trưng rất khác biệt so với đa số điểm dữ liệu bình thường, do đó chúng sẽ bị cô lập ở các độ sâu rất nông của cây iTree.</w:t>
       </w:r>
-    </w:p>
-    <w:tbl>
-      <w:tblPr>
-        <w:tblW w:type="auto" w:w="0"/>
-        <w:jc w:val="center"/>
-        <w:tblLook w:firstColumn="1" w:firstRow="1" w:lastColumn="0" w:lastRow="0" w:noHBand="0" w:noVBand="1" w:val="04A0"/>
-      </w:tblPr>
-      <w:tblGrid>
-        <w:gridCol w:w="9360"/>
-      </w:tblGrid>
-      <w:tr>
-        <w:tc>
-          <w:tcPr>
-            <w:tcW w:type="dxa" w:w="9360"/>
-            <w:shd w:fill="F3F4F6"/>
-            <w:tcMar>
-              <w:top w:w="140" w:type="dxa"/>
-              <w:bottom w:w="140" w:type="dxa"/>
-              <w:left w:w="200" w:type="dxa"/>
-              <w:right w:w="200" w:type="dxa"/>
-            </w:tcMar>
-          </w:tcPr>
-          <w:p>
-            <w:pPr>
-              <w:jc w:val="center"/>
-            </w:pPr>
-            <w:r>
-              <w:rPr>
-                <w:b/>
-                <w:color w:val="1E293B"/>
-                <w:sz w:val="22"/>
-              </w:rPr>
-              <w:t>s(x, n) = 2^{ - E(h(x)) / c(n) }</w:t>
-            </w:r>
-          </w:p>
-          <w:p>
-            <w:pPr>
-              <w:jc w:val="center"/>
-            </w:pPr>
-            <w:r>
-              <w:rPr>
-                <w:i/>
-                <w:color w:val="64748B"/>
-                <w:sz w:val="19"/>
-              </w:rPr>
-              <w:t>Công thức tính điểm bất thường Anomaly Score của thuật toán Isolation Forest</w:t>
-            </w:r>
-          </w:p>
-        </w:tc>
-      </w:tr>
-    </w:tbl>
-    <w:p>
-      <w:pPr>
-        <w:spacing w:after="80"/>
-      </w:pPr>
     </w:p>
     <w:p>
       <w:pPr>
-        <w:spacing w:after="80" w:line="288" w:lineRule="auto"/>
+        <w:spacing w:before="160" w:after="40" w:line="276" w:lineRule="auto"/>
+        <w:jc w:val="center"/>
+      </w:pPr>
+      <m:oMathPara>
+        <m:oMath>
+          <m:r>
+            <m:t>s(x,n)=</m:t>
+          </m:r>
+          <m:sSup>
+            <m:e>
+              <m:r>
+                <m:t>2</m:t>
+              </m:r>
+            </m:e>
+            <m:sup>
+              <m:r>
+                <m:t>−</m:t>
+              </m:r>
+              <m:f>
+                <m:fPr>
+                  <m:type m:val="bar"/>
+                </m:fPr>
+                <m:num>
+                  <m:r>
+                    <m:t>E(h(x))</m:t>
+                  </m:r>
+                </m:num>
+                <m:den>
+                  <m:r>
+                    <m:t>c(n)</m:t>
+                  </m:r>
+                </m:den>
+              </m:f>
+            </m:sup>
+          </m:sSup>
+        </m:oMath>
+      </m:oMathPara>
+    </w:p>
+    <w:p>
+      <w:pPr>
+        <w:spacing w:before="0" w:after="160"/>
+        <w:jc w:val="center"/>
+      </w:pPr>
+      <w:r>
+        <w:rPr>
+          <w:i/>
+          <w:color w:val="4B5563"/>
+          <w:sz w:val="20"/>
+        </w:rPr>
+        <w:t>Công thức (1.4): Công thức tính điểm bất thường Anomaly Score của thuật toán Isolation Forest [Ref 11]</w:t>
+      </w:r>
+    </w:p>
+    <w:p>
+      <w:pPr>
+        <w:spacing w:before="160" w:after="40" w:line="276" w:lineRule="auto"/>
+        <w:jc w:val="center"/>
+      </w:pPr>
+      <m:oMathPara>
+        <m:oMath>
+          <m:r>
+            <m:t>c(n)=2</m:t>
+          </m:r>
+          <m:d>
+            <m:dPr>
+              <m:sepChr m:val=""/>
+            </m:dPr>
+            <m:e>
+              <m:r>
+                <m:rPr>
+                  <m:sty m:val="p"/>
+                </m:rPr>
+                <m:t>ln</m:t>
+              </m:r>
+              <m:r>
+                <m:t>(</m:t>
+              </m:r>
+              <m:r>
+                <m:t>n</m:t>
+              </m:r>
+              <m:r>
+                <m:t>−</m:t>
+              </m:r>
+              <m:r>
+                <m:t>1</m:t>
+              </m:r>
+              <m:r>
+                <m:t>)</m:t>
+              </m:r>
+              <m:r>
+                <m:t>+</m:t>
+              </m:r>
+              <m:r>
+                <m:t>0.5772156649</m:t>
+              </m:r>
+            </m:e>
+          </m:d>
+          <m:r>
+            <m:t>−</m:t>
+          </m:r>
+          <m:f>
+            <m:fPr>
+              <m:type m:val="bar"/>
+            </m:fPr>
+            <m:num>
+              <m:r>
+                <m:t>2(n−1)</m:t>
+              </m:r>
+            </m:num>
+            <m:den>
+              <m:r>
+                <m:t>n</m:t>
+              </m:r>
+            </m:den>
+          </m:f>
+        </m:oMath>
+      </m:oMathPara>
+    </w:p>
+    <w:p>
+      <w:pPr>
+        <w:spacing w:before="0" w:after="160"/>
+        <w:jc w:val="center"/>
+      </w:pPr>
+      <w:r>
+        <w:rPr>
+          <w:i/>
+          <w:color w:val="4B5563"/>
+          <w:sz w:val="20"/>
+        </w:rPr>
+        <w:t>Công thức (1.5): Độ dài đường đi trung bình lý thuyết của cây tìm kiếm nhị phân không thành công [Ref 11]</w:t>
+      </w:r>
+    </w:p>
+    <w:p>
+      <w:pPr>
+        <w:spacing w:after="80" w:line="312" w:lineRule="auto"/>
         <w:jc w:val="both"/>
       </w:pPr>
       <w:r>
         <w:rPr>
-          <w:b w:val="0"/>
           <w:i w:val="0"/>
+          <w:sz w:val="26"/>
         </w:rPr>
-        <w:t>Trong đó c(n) là độ dài đường đi trung bình lý thuyết của cây tìm kiếm nhị phân. Khi s -&gt; 1.0, mẫu bị cô lập cực nhanh, tương ứng xác suất rất cao là mối đe dọa Zero-day; khi s &lt; 0.5, mẫu là dữ liệu bình thường lành tính.</w:t>
+        <w:t>Trong đó h(x) là số lần phân nhánh để cô lập điểm x, E(h(x)) là kỳ vọng độ sâu qua rừng cây, và c(n) là hệ số chuẩn hóa theo kích thước tập mẫu n. Khi s(x, n) tiến sát 1.0, điểm dữ liệu có xác suất cực cao là một hành vi bất thường hoặc cuộc tấn công mới chưa từng được gán nhãn.</w:t>
       </w:r>
     </w:p>
     <w:p>
       <w:pPr>
-        <w:keepNext/>
         <w:spacing w:before="200" w:after="80"/>
       </w:pPr>
       <w:r>
         <w:rPr>
           <w:b/>
-          <w:color w:val="1E3A8A"/>
-          <w:sz w:val="24"/>
+          <w:color w:val="1E40AF"/>
+          <w:sz w:val="27"/>
         </w:rPr>
         <w:t>1.3.4. Mô hình dung hợp rủi ro đa tầng (Hybrid Multi-Layer Risk Engine)</w:t>
       </w:r>
     </w:p>
     <w:p>
       <w:pPr>
-        <w:spacing w:after="80" w:line="288" w:lineRule="auto"/>
+        <w:spacing w:after="80" w:line="312" w:lineRule="auto"/>
         <w:jc w:val="both"/>
       </w:pPr>
       <w:r>
         <w:rPr>
-          <w:b w:val="0"/>
           <w:i w:val="0"/>
+          <w:sz w:val="26"/>
         </w:rPr>
-        <w:t>Áp dụng kiến trúc Dual-Stage Pipeline theo nghiên cứu MDPI Electronics 2025 [Ref 11]: Tầng 1 (Fast Path) dùng Rule Engine lọc tĩnh (&lt; 1ms); Tầng 2 (Deep Path) trích xuất 17 đặc trưng và chạy song song qua Random Forest và Isolation Forest. Điểm rủi ro tổng hợp nằm trong thang đo 0.0 - 100.0:</w:t>
+        <w:t>Bám sát nghiên cứu mới nhất trên tạp chí khoa học quốc tế MDPI Electronics (2025) [Ref 13], hệ thống xây dựng cơ chế Dung hợp rủi ro Đa tầng (Dual-Stage Hybrid Pipeline) kết hợp sức mạnh phân tích chuyên sâu của cả 3 tầng phòng thủ:</w:t>
       </w:r>
-    </w:p>
-    <w:tbl>
-      <w:tblPr>
-        <w:tblW w:type="auto" w:w="0"/>
-        <w:jc w:val="center"/>
-        <w:tblLook w:firstColumn="1" w:firstRow="1" w:lastColumn="0" w:lastRow="0" w:noHBand="0" w:noVBand="1" w:val="04A0"/>
-      </w:tblPr>
-      <w:tblGrid>
-        <w:gridCol w:w="9360"/>
-      </w:tblGrid>
-      <w:tr>
-        <w:tc>
-          <w:tcPr>
-            <w:tcW w:type="dxa" w:w="9360"/>
-            <w:shd w:fill="F3F4F6"/>
-            <w:tcMar>
-              <w:top w:w="140" w:type="dxa"/>
-              <w:bottom w:w="140" w:type="dxa"/>
-              <w:left w:w="200" w:type="dxa"/>
-              <w:right w:w="200" w:type="dxa"/>
-            </w:tcMar>
-          </w:tcPr>
-          <w:p>
-            <w:pPr>
-              <w:jc w:val="center"/>
-            </w:pPr>
-            <w:r>
-              <w:rPr>
-                <w:b/>
-                <w:color w:val="1E293B"/>
-                <w:sz w:val="22"/>
-              </w:rPr>
-              <w:t>Risk Score = 0.40 * S_Rule + 0.35 * S_RF + 0.25 * S_Anomaly</w:t>
-            </w:r>
-          </w:p>
-          <w:p>
-            <w:pPr>
-              <w:jc w:val="center"/>
-            </w:pPr>
-            <w:r>
-              <w:rPr>
-                <w:i/>
-                <w:color w:val="64748B"/>
-                <w:sz w:val="19"/>
-              </w:rPr>
-              <w:t>Công thức dung hợp điểm rủi ro đa tầng Hybrid Risk Score</w:t>
-            </w:r>
-          </w:p>
-        </w:tc>
-      </w:tr>
-    </w:tbl>
-    <w:p>
-      <w:pPr>
-        <w:spacing w:after="80"/>
-      </w:pPr>
     </w:p>
     <w:p>
       <w:pPr>
-        <w:spacing w:after="80" w:line="288" w:lineRule="auto"/>
+        <w:spacing w:before="160" w:after="40" w:line="276" w:lineRule="auto"/>
+        <w:jc w:val="center"/>
+      </w:pPr>
+      <m:oMathPara>
+        <m:oMath>
+          <m:r>
+            <m:rPr>
+              <m:nor/>
+            </m:rPr>
+            <m:t>Risk Score</m:t>
+          </m:r>
+          <m:r>
+            <m:t>=0.40·</m:t>
+          </m:r>
+          <m:sSub>
+            <m:e>
+              <m:r>
+                <m:t>S</m:t>
+              </m:r>
+            </m:e>
+            <m:sub>
+              <m:r>
+                <m:rPr>
+                  <m:nor/>
+                </m:rPr>
+                <m:t>Rule</m:t>
+              </m:r>
+            </m:sub>
+          </m:sSub>
+          <m:r>
+            <m:t>+0.35·</m:t>
+          </m:r>
+          <m:sSub>
+            <m:e>
+              <m:r>
+                <m:t>S</m:t>
+              </m:r>
+            </m:e>
+            <m:sub>
+              <m:r>
+                <m:rPr>
+                  <m:nor/>
+                </m:rPr>
+                <m:t>RF</m:t>
+              </m:r>
+            </m:sub>
+          </m:sSub>
+          <m:r>
+            <m:t>+0.25·</m:t>
+          </m:r>
+          <m:sSub>
+            <m:e>
+              <m:r>
+                <m:t>S</m:t>
+              </m:r>
+            </m:e>
+            <m:sub>
+              <m:r>
+                <m:rPr>
+                  <m:nor/>
+                </m:rPr>
+                <m:t>Anomaly</m:t>
+              </m:r>
+            </m:sub>
+          </m:sSub>
+        </m:oMath>
+      </m:oMathPara>
+    </w:p>
+    <w:p>
+      <w:pPr>
+        <w:spacing w:before="0" w:after="160"/>
+        <w:jc w:val="center"/>
+      </w:pPr>
+      <w:r>
+        <w:rPr>
+          <w:i/>
+          <w:color w:val="4B5563"/>
+          <w:sz w:val="20"/>
+        </w:rPr>
+        <w:t>Công thức (1.6): Công thức dung hợp điểm rủi ro đa tầng Hybrid Risk Score [Ref 13]</w:t>
+      </w:r>
+    </w:p>
+    <w:p>
+      <w:pPr>
+        <w:spacing w:after="80" w:line="312" w:lineRule="auto"/>
         <w:jc w:val="both"/>
       </w:pPr>
       <w:r>
         <w:rPr>
-          <w:b w:val="0"/>
           <w:i w:val="0"/>
+          <w:sz w:val="26"/>
         </w:rPr>
-        <w:t>Ma trận ra quyết định phòng thủ phân tầng theo chuẩn MITRE ATT&amp;CK Mitigation [Ref 16]:</w:t>
+        <w:t>Ma trận ra quyết định phòng thủ phân tầng theo chuẩn MITRE ATT&amp;CK Mitigation [Ref 10]:</w:t>
       </w:r>
     </w:p>
     <w:p>
       <w:pPr>
         <w:pStyle w:val="ListBullet"/>
-        <w:spacing w:after="60" w:line="276" w:lineRule="auto"/>
+        <w:spacing w:after="60" w:line="312" w:lineRule="auto"/>
         <w:jc w:val="both"/>
       </w:pPr>
       <w:r>
         <w:rPr>
           <w:b/>
           <w:color w:val="111827"/>
+          <w:sz w:val="26"/>
         </w:rPr>
         <w:t xml:space="preserve">Điểm &lt; 30 (ALLOW): </w:t>
       </w:r>
       <w:r>
+        <w:rPr>
+          <w:sz w:val="26"/>
+        </w:rPr>
         <w:t>Cho phép yêu cầu đi tiếp đến backend API an toàn.</w:t>
       </w:r>
     </w:p>
     <w:p>
       <w:pPr>
         <w:pStyle w:val="ListBullet"/>
-        <w:spacing w:after="60" w:line="276" w:lineRule="auto"/>
+        <w:spacing w:after="60" w:line="312" w:lineRule="auto"/>
         <w:jc w:val="both"/>
       </w:pPr>
       <w:r>
         <w:rPr>
           <w:b/>
           <w:color w:val="111827"/>
+          <w:sz w:val="26"/>
         </w:rPr>
         <w:t xml:space="preserve">Điểm 30 - 59 (MONITOR): </w:t>
       </w:r>
       <w:r>
+        <w:rPr>
+          <w:sz w:val="26"/>
+        </w:rPr>
         <w:t>Cho phép đi qua nhưng ghi nhật ký kiểm toán chuyên sâu.</w:t>
       </w:r>
     </w:p>
     <w:p>
       <w:pPr>
         <w:pStyle w:val="ListBullet"/>
-        <w:spacing w:after="60" w:line="276" w:lineRule="auto"/>
+        <w:spacing w:after="60" w:line="312" w:lineRule="auto"/>
         <w:jc w:val="both"/>
       </w:pPr>
       <w:r>
         <w:rPr>
           <w:b/>
           <w:color w:val="111827"/>
+          <w:sz w:val="26"/>
         </w:rPr>
         <w:t xml:space="preserve">Điểm 60 - 79 (RATE_LIMIT): </w:t>
       </w:r>
       <w:r>
+        <w:rPr>
+          <w:sz w:val="26"/>
+        </w:rPr>
         <w:t>Áp đặt hình phạt cắt giảm hạn ngạch truy cập và trì hoãn phản hồi.</w:t>
       </w:r>
     </w:p>
     <w:p>
       <w:pPr>
         <w:pStyle w:val="ListBullet"/>
-        <w:spacing w:after="60" w:line="276" w:lineRule="auto"/>
+        <w:spacing w:after="60" w:line="312" w:lineRule="auto"/>
         <w:jc w:val="both"/>
       </w:pPr>
       <w:r>
         <w:rPr>
           <w:b/>
           <w:color w:val="111827"/>
+          <w:sz w:val="26"/>
         </w:rPr>
         <w:t xml:space="preserve">Điểm &gt;= 80 (BLOCK): </w:t>
       </w:r>
       <w:r>
+        <w:rPr>
+          <w:sz w:val="26"/>
+        </w:rPr>
         <w:t>Lập tức từ chối yêu cầu với mã lỗi HTTP 403 Forbidden.</w:t>
       </w:r>
     </w:p>
     <w:p>
       <w:pPr>
-        <w:keepNext/>
         <w:spacing w:before="280" w:after="120"/>
       </w:pPr>
       <w:r>
         <w:rPr>
           <w:b/>
           <w:color w:val="0F766E"/>
-          <w:sz w:val="28"/>
+          <w:sz w:val="30"/>
         </w:rPr>
         <w:t>1.4. CƠ SỞ LÝ THUYẾT VỀ THAO TRƯỜNG MẠNG (CYBER RANGE) VÀ TÁC TỬ TẤN CÔNG TỰ ĐỘNG (OFFENSIVE AI)</w:t>
       </w:r>
     </w:p>
     <w:p>
       <w:pPr>
-        <w:keepNext/>
         <w:spacing w:before="200" w:after="80"/>
       </w:pPr>
       <w:r>
         <w:rPr>
           <w:b/>
-          <w:color w:val="1E3A8A"/>
-          <w:sz w:val="24"/>
+          <w:color w:val="1E40AF"/>
+          <w:sz w:val="27"/>
         </w:rPr>
         <w:t>1.4.1. Khung kiến trúc Thao trường mạng phân tán tiêu chuẩn quốc tế</w:t>
       </w:r>
     </w:p>
     <w:p>
       <w:pPr>
-        <w:spacing w:after="80" w:line="288" w:lineRule="auto"/>
+        <w:spacing w:after="80" w:line="312" w:lineRule="auto"/>
         <w:jc w:val="both"/>
       </w:pPr>
       <w:r>
         <w:rPr>
-          <w:b w:val="0"/>
           <w:i w:val="0"/>
+          <w:sz w:val="26"/>
         </w:rPr>
-        <w:t>Theo nghiên cứu nền tảng của M. Yamin et al. (Elsevier Computers &amp; Security 2020) [Ref 14], một nền tảng Cyber Range tiêu chuẩn bao gồm 3 phân hệ cốt lõi:</w:t>
+        <w:t>Theo nghiên cứu nền tảng của M. Yamin et al. (Elsevier Computers &amp; Security 2020) [Ref 16], một hệ thống Thao trường mạng (Cyber Range) tiêu chuẩn bao gồm 3 trụ cột cấu trúc:</w:t>
       </w:r>
     </w:p>
     <w:p>
       <w:pPr>
         <w:pStyle w:val="ListBullet"/>
-        <w:spacing w:after="60" w:line="276" w:lineRule="auto"/>
+        <w:spacing w:after="60" w:line="312" w:lineRule="auto"/>
         <w:jc w:val="both"/>
       </w:pPr>
       <w:r>
         <w:rPr>
           <w:b/>
           <w:color w:val="111827"/>
+          <w:sz w:val="26"/>
         </w:rPr>
         <w:t xml:space="preserve">1. Phân hệ Môi trường mục tiêu (Target Environment): </w:t>
       </w:r>
       <w:r>
-        <w:t>Máy chủ Web API chứa các lỗ hổng OWASP Top 10 và cơ sở dữ liệu cô lập.</w:t>
+        <w:rPr>
+          <w:sz w:val="26"/>
+        </w:rPr>
+        <w:t>Máy chủ Web API chứa các lỗ hổng mô phỏng thực tế.</w:t>
       </w:r>
     </w:p>
     <w:p>
       <w:pPr>
         <w:pStyle w:val="ListBullet"/>
-        <w:spacing w:after="60" w:line="276" w:lineRule="auto"/>
+        <w:spacing w:after="60" w:line="312" w:lineRule="auto"/>
         <w:jc w:val="both"/>
       </w:pPr>
       <w:r>
         <w:rPr>
           <w:b/>
           <w:color w:val="111827"/>
+          <w:sz w:val="26"/>
         </w:rPr>
         <w:t xml:space="preserve">2. Phân hệ Mô phỏng tấn công (Attack Simulation Engine): </w:t>
       </w:r>
       <w:r>
-        <w:t>Tác tử Red Team tự động trinh sát OpenAPI, tạo chuỗi tấn công và đột biến payload.</w:t>
+        <w:rPr>
+          <w:sz w:val="26"/>
+        </w:rPr>
+        <w:t>Tác tử Red Team tự động triển khai các chiến dịch tấn công.</w:t>
       </w:r>
     </w:p>
     <w:p>
       <w:pPr>
         <w:pStyle w:val="ListBullet"/>
-        <w:spacing w:after="60" w:line="276" w:lineRule="auto"/>
+        <w:spacing w:after="60" w:line="312" w:lineRule="auto"/>
         <w:jc w:val="both"/>
       </w:pPr>
       <w:r>
         <w:rPr>
           <w:b/>
           <w:color w:val="111827"/>
+          <w:sz w:val="26"/>
         </w:rPr>
         <w:t xml:space="preserve">3. Phân hệ Giám sát và Chấm điểm (Monitoring &amp; Scoring Subsystem): </w:t>
       </w:r>
       <w:r>
-        <w:t>Thu thập telemetry thời gian thực, đo lường độ trễ mạng và trực quan hóa trung tâm chỉ huy SOC Dashboard.</w:t>
+        <w:rPr>
+          <w:sz w:val="26"/>
+        </w:rPr>
+        <w:t>Thu thập telemetry thời gian thực, đo lường độ trễ và tỷ lệ chặn.</w:t>
       </w:r>
     </w:p>
     <w:p>
       <w:pPr>
-        <w:spacing w:after="80" w:line="288" w:lineRule="auto"/>
+        <w:spacing w:after="80" w:line="312" w:lineRule="auto"/>
         <w:jc w:val="both"/>
       </w:pPr>
       <w:r>
         <w:rPr>
-          <w:b w:val="0"/>
           <w:i w:val="0"/>
+          <w:sz w:val="26"/>
         </w:rPr>
-        <w:t>Đồ án PBL6 hiện thực hóa kiến trúc này trên 2 máy tính vật lý độc lập kết nối qua mạng LAN/Switch (Máy 1: Blue Team; Máy 2: Red Team). Mô hình đa máy trạm phân tán mang lại độ trễ mạng thực (Network RTT), hiện tượng trễ gói tin và tính chân thực cao hơn 85% so với chạy cục bộ localhost [Ref 14].</w:t>
+        <w:t>Đồ án PBL6 hiện thực hóa kiến trúc này trên 2 máy tính vật lý độc lập kết nối qua mạng LAN/Switch Gigabit Ethernet, phân tách hoàn toàn ranh giới giữa bên Tấn công (Red Team Node) và bên Phòng thủ (Blue Team Security Gateway).</w:t>
       </w:r>
     </w:p>
     <w:p>
       <w:pPr>
-        <w:keepNext/>
         <w:spacing w:before="200" w:after="80"/>
       </w:pPr>
       <w:r>
         <w:rPr>
           <w:b/>
-          <w:color w:val="1E3A8A"/>
-          <w:sz w:val="24"/>
+          <w:color w:val="1E40AF"/>
+          <w:sz w:val="27"/>
         </w:rPr>
         <w:t>1.4.2. Cơ sở lý thuyết về Trò chơi an ninh đối kháng (Adversarial Security Game)</w:t>
       </w:r>
     </w:p>
     <w:p>
       <w:pPr>
-        <w:spacing w:after="80" w:line="288" w:lineRule="auto"/>
+        <w:spacing w:after="80" w:line="312" w:lineRule="auto"/>
         <w:jc w:val="both"/>
       </w:pPr>
       <w:r>
         <w:rPr>
-          <w:b w:val="0"/>
           <w:i w:val="0"/>
+          <w:sz w:val="26"/>
         </w:rPr>
-        <w:t>Để thiết lập nền tảng lý thuyết toán học vững chắc cho cuộc đối đầu giữa Red Team và Blue Team trong Thao trường mạng, đồ án vận dụng mô hình hóa hình thức từ giáo trình kinh điển Introduction to Modern Cryptography của Jonathan Katz và Yehuda Lindell (Chương 3: Adversarial Models) [Ref 03].</w:t>
+        <w:t>Để thiết lập nền tảng lý thuyết toán học vững chắc cho cuộc đối đầu giữa Red Team và Blue Team, đồ án vận dụng Lý thuyết Trò chơi An ninh Đối kháng (Security Game) được giảng dạy trong giáo trình kinh điển Introduction to Modern Cryptography của Jonathan Katz và Yehuda Lindell (CRC Press) [Ref 03].</w:t>
       </w:r>
     </w:p>
     <w:p>
       <w:pPr>
-        <w:spacing w:after="80" w:line="288" w:lineRule="auto"/>
+        <w:spacing w:before="160" w:after="40" w:line="276" w:lineRule="auto"/>
+        <w:jc w:val="center"/>
+      </w:pPr>
+      <m:oMathPara>
+        <m:oMath>
+          <m:r>
+            <m:rPr>
+              <m:sty m:val="b"/>
+            </m:rPr>
+            <m:t>Adv</m:t>
+          </m:r>
+          <m:r>
+            <m:t>(𝒜)=</m:t>
+          </m:r>
+          <m:d>
+            <m:dPr>
+              <m:begChr m:val="|"/>
+              <m:sepChr m:val=""/>
+              <m:endChr m:val="|"/>
+            </m:dPr>
+            <m:e>
+              <m:r>
+                <m:t>Pr</m:t>
+              </m:r>
+              <m:r>
+                <m:t>[</m:t>
+              </m:r>
+              <m:r>
+                <m:t>𝒜</m:t>
+              </m:r>
+              <m:r>
+                <m:rPr>
+                  <m:nor/>
+                </m:rPr>
+                <m:t> bypasses WAF</m:t>
+              </m:r>
+              <m:r>
+                <m:t>]</m:t>
+              </m:r>
+              <m:r>
+                <m:t>−</m:t>
+              </m:r>
+              <m:r>
+                <m:t>Pr</m:t>
+              </m:r>
+              <m:r>
+                <m:t>[</m:t>
+              </m:r>
+              <m:r>
+                <m:rPr>
+                  <m:nor/>
+                </m:rPr>
+                <m:t>Random Guess bypasses WAF</m:t>
+              </m:r>
+              <m:r>
+                <m:t>]</m:t>
+              </m:r>
+            </m:e>
+          </m:d>
+        </m:oMath>
+      </m:oMathPara>
+    </w:p>
+    <w:p>
+      <w:pPr>
+        <w:spacing w:before="0" w:after="160"/>
+        <w:jc w:val="center"/>
+      </w:pPr>
+      <w:r>
+        <w:rPr>
+          <w:i/>
+          <w:color w:val="4B5563"/>
+          <w:sz w:val="20"/>
+        </w:rPr>
+        <w:t>Công thức (1.7): Hàm lợi thế tấn công đối kháng (Adversarial Advantage) theo lý thuyết Katz &amp; Lindell [Ref 03]</w:t>
+      </w:r>
+    </w:p>
+    <w:p>
+      <w:pPr>
+        <w:spacing w:after="80" w:line="312" w:lineRule="auto"/>
         <w:jc w:val="both"/>
       </w:pPr>
       <w:r>
         <w:rPr>
-          <w:b w:val="0"/>
           <w:i w:val="0"/>
+          <w:sz w:val="26"/>
         </w:rPr>
-        <w:t>Bài toán vượt rào WAF được hình thức hóa dưới dạng một Trò chơi an ninh đối kháng (Security Game) giữa Bên tấn công (Adversary A) và Bên phòng thủ (Defender/Challenger C):</w:t>
+        <w:t>Hệ thống phòng thủ đạt độ an toàn vững chắc khi và chỉ khi với mọi tác tử tấn công A bị giới hạn tài nguyên đa thức, hàm lợi thế Adv(A) tiệm cận về 0 (negligible function).</w:t>
+      </w:r>
+    </w:p>
+    <w:p>
+      <w:pPr>
+        <w:spacing w:before="200" w:after="80"/>
+      </w:pPr>
+      <w:r>
+        <w:rPr>
+          <w:b/>
+          <w:color w:val="1E40AF"/>
+          <w:sz w:val="27"/>
+        </w:rPr>
+        <w:t>1.4.3. Quy trình trinh sát và Tác tử tấn công tự động (Offensive AI &amp; Red Teaming)</w:t>
+      </w:r>
+    </w:p>
+    <w:p>
+      <w:pPr>
+        <w:spacing w:after="80" w:line="312" w:lineRule="auto"/>
+        <w:jc w:val="both"/>
+      </w:pPr>
+      <w:r>
+        <w:rPr>
+          <w:i w:val="0"/>
+          <w:sz w:val="26"/>
+        </w:rPr>
+        <w:t>Theo phương pháp luận kiểm thử xâm nhập của giáo trình CompTIA PenTest+ [Ref 04], tác tử Red Team tự động vận hành qua 3 pha chiến thuật:</w:t>
       </w:r>
     </w:p>
     <w:p>
       <w:pPr>
         <w:pStyle w:val="ListBullet"/>
-        <w:spacing w:after="60" w:line="276" w:lineRule="auto"/>
+        <w:spacing w:after="60" w:line="312" w:lineRule="auto"/>
         <w:jc w:val="both"/>
       </w:pPr>
       <w:r>
         <w:rPr>
           <w:b/>
           <w:color w:val="111827"/>
+          <w:sz w:val="26"/>
         </w:rPr>
-        <w:t xml:space="preserve">1. Thiết lập (Setup): </w:t>
+        <w:t xml:space="preserve">1. Trinh sát tự động (Reconnaissance &amp; OpenAPI Parsing): </w:t>
       </w:r>
       <w:r>
-        <w:t>Bên phòng thủ C thiết lập hệ thống phòng thủ WAF với tập tham số Pi = {Rules, w_RF, theta_iForest, tau_threshold}.</w:t>
+        <w:rPr>
+          <w:sz w:val="26"/>
+        </w:rPr>
+        <w:t>Bóc tách schema Swagger / OpenAPI để lập danh mục endpoint và kiểu dữ liệu.</w:t>
       </w:r>
     </w:p>
     <w:p>
       <w:pPr>
         <w:pStyle w:val="ListBullet"/>
-        <w:spacing w:after="60" w:line="276" w:lineRule="auto"/>
+        <w:spacing w:after="60" w:line="312" w:lineRule="auto"/>
         <w:jc w:val="both"/>
       </w:pPr>
       <w:r>
         <w:rPr>
           <w:b/>
           <w:color w:val="111827"/>
+          <w:sz w:val="26"/>
         </w:rPr>
-        <w:t xml:space="preserve">2. Truy vấn Oracle: </w:t>
+        <w:t xml:space="preserve">2. Fuzzing phụ thuộc trạng thái (Stateful REST API Fuzzing): </w:t>
       </w:r>
       <w:r>
-        <w:t>Bên tấn công A gửi chuỗi yêu cầu thử nghiệm đến cổng phòng thủ và quan sát phản hồi từ Oracle O_C(x) -&gt; (Status, Latency, Blocked).</w:t>
+        <w:rPr>
+          <w:sz w:val="26"/>
+        </w:rPr>
+        <w:t>Sinh chuỗi request có cấu trúc bám sát ngữ cảnh nghiệp vụ.</w:t>
       </w:r>
     </w:p>
     <w:p>
       <w:pPr>
         <w:pStyle w:val="ListBullet"/>
-        <w:spacing w:after="60" w:line="276" w:lineRule="auto"/>
+        <w:spacing w:after="60" w:line="312" w:lineRule="auto"/>
         <w:jc w:val="both"/>
       </w:pPr>
       <w:r>
         <w:rPr>
           <w:b/>
           <w:color w:val="111827"/>
+          <w:sz w:val="26"/>
         </w:rPr>
-        <w:t xml:space="preserve">3. Mục tiêu: </w:t>
+        <w:t xml:space="preserve">3. Kiểm thử xác minh lỗ hổng: </w:t>
       </w:r>
       <w:r>
-        <w:t>Bên tấn công chiến thắng nếu tìm ra biến thể payload x* sao cho x* khai thác thành công lỗ hổng trên ứng dụng mục tiêu nhưng lại qua mặt được bộ lọc phòng thủ (WAF(x*) = ALLOW).</w:t>
-      </w:r>
-    </w:p>
-    <w:tbl>
-      <w:tblPr>
-        <w:tblW w:type="auto" w:w="0"/>
-        <w:jc w:val="center"/>
-        <w:tblLook w:firstColumn="1" w:firstRow="1" w:lastColumn="0" w:lastRow="0" w:noHBand="0" w:noVBand="1" w:val="04A0"/>
-      </w:tblPr>
-      <w:tblGrid>
-        <w:gridCol w:w="9360"/>
-      </w:tblGrid>
-      <w:tr>
-        <w:tc>
-          <w:tcPr>
-            <w:tcW w:type="dxa" w:w="9360"/>
-            <w:shd w:fill="F3F4F6"/>
-            <w:tcMar>
-              <w:top w:w="140" w:type="dxa"/>
-              <w:bottom w:w="140" w:type="dxa"/>
-              <w:left w:w="200" w:type="dxa"/>
-              <w:right w:w="200" w:type="dxa"/>
-            </w:tcMar>
-          </w:tcPr>
-          <w:p>
-            <w:pPr>
-              <w:jc w:val="center"/>
-            </w:pPr>
-            <w:r>
-              <w:rPr>
-                <w:b/>
-                <w:color w:val="1E293B"/>
-                <w:sz w:val="22"/>
-              </w:rPr>
-              <w:t>Adv(A) = | Pr[A bypasses WAF] - Pr[Random Guess bypasses WAF] |</w:t>
-            </w:r>
-          </w:p>
-          <w:p>
-            <w:pPr>
-              <w:jc w:val="center"/>
-            </w:pPr>
-            <w:r>
-              <w:rPr>
-                <w:i/>
-                <w:color w:val="64748B"/>
-                <w:sz w:val="19"/>
-              </w:rPr>
-              <w:t>Hàm lợi thế tấn công (Adversarial Advantage) theo lý thuyết Katz &amp; Lindell (2020)</w:t>
-            </w:r>
-          </w:p>
-        </w:tc>
-      </w:tr>
-    </w:tbl>
-    <w:p>
-      <w:pPr>
-        <w:spacing w:after="80"/>
-      </w:pPr>
-    </w:p>
-    <w:p>
-      <w:pPr>
-        <w:spacing w:after="80" w:line="288" w:lineRule="auto"/>
-        <w:jc w:val="both"/>
-      </w:pPr>
-      <w:r>
         <w:rPr>
-          <w:b w:val="0"/>
-          <w:i w:val="0"/>
+          <w:sz w:val="26"/>
         </w:rPr>
-        <w:t>Hệ thống phòng thủ đạt độ an toàn vững chắc khi và chỉ khi với mọi tác tử tấn công A bị giới hạn về tài nguyên tính toán PPT, hàm lợi thế Adv(A) là một hàm không đáng kể đối với các lỗ hổng đã biết.</w:t>
+        <w:t>Bơm payload độc hại được đột biến có chủ đích vào từng trường tham số.</w:t>
       </w:r>
     </w:p>
     <w:p>
       <w:pPr>
-        <w:keepNext/>
         <w:spacing w:before="200" w:after="80"/>
       </w:pPr>
       <w:r>
         <w:rPr>
           <w:b/>
-          <w:color w:val="1E3A8A"/>
-          <w:sz w:val="24"/>
+          <w:color w:val="1E40AF"/>
+          <w:sz w:val="27"/>
         </w:rPr>
-        <w:t>1.4.3. Quy trình trinh sát và Tác tử tấn công tự động (Offensive AI &amp; Red Teaming)</w:t>
+        <w:t>1.4.4. Mô hình Học tăng cường sâu (Deep Reinforcement Learning - DQN) trong né tránh phòng thủ</w:t>
       </w:r>
     </w:p>
     <w:p>
       <w:pPr>
-        <w:spacing w:after="80" w:line="288" w:lineRule="auto"/>
+        <w:spacing w:after="80" w:line="312" w:lineRule="auto"/>
         <w:jc w:val="both"/>
       </w:pPr>
       <w:r>
         <w:rPr>
-          <w:b w:val="0"/>
           <w:i w:val="0"/>
+          <w:sz w:val="26"/>
         </w:rPr>
-        <w:t>Theo phương pháp luận kiểm thử xâm nhập của giáo trình CompTIA PenTest+ [Ref 04], tác tử Red Team (Máy 2) được thiết kế vận hành theo chu trình 3 bước:</w:t>
+        <w:t>Bài toán né tránh WAF được mô hình hóa theo Quy trình quyết định Markov (Markov Decision Process - MDP) bám sát giáo trình Reinforcement Learning của Sutton &amp; Barto (MIT Press) [Ref 17] và kiến trúc Deep Q-Network của DeepMind (Nature 2015) [Ref 18]:</w:t>
       </w:r>
     </w:p>
     <w:p>
       <w:pPr>
         <w:pStyle w:val="ListBullet"/>
-        <w:spacing w:after="60" w:line="276" w:lineRule="auto"/>
+        <w:spacing w:after="60" w:line="312" w:lineRule="auto"/>
         <w:jc w:val="both"/>
       </w:pPr>
       <w:r>
         <w:rPr>
           <w:b/>
           <w:color w:val="111827"/>
+          <w:sz w:val="26"/>
         </w:rPr>
-        <w:t xml:space="preserve">1. Trinh sát tự động (Reconnaissance &amp; OpenAPI Parsing): </w:t>
+        <w:t xml:space="preserve">Không gian trạng thái (State Space): </w:t>
       </w:r>
       <w:r>
-        <w:t>Tác tử tự động gửi yêu cầu đọc tài liệu OpenAPI Specification (/openapi.json hoặc /docs), bóc tách danh sách endpoint, phương thức HTTP và cấu trúc schema JSON.</w:t>
+        <w:rPr>
+          <w:sz w:val="26"/>
+        </w:rPr>
+        <w:t>Vector đặc trưng của payload hiện tại và mã phản hồi HTTP từ WAF Gateway.</w:t>
       </w:r>
     </w:p>
     <w:p>
       <w:pPr>
         <w:pStyle w:val="ListBullet"/>
-        <w:spacing w:after="60" w:line="276" w:lineRule="auto"/>
+        <w:spacing w:after="60" w:line="312" w:lineRule="auto"/>
         <w:jc w:val="both"/>
       </w:pPr>
       <w:r>
         <w:rPr>
           <w:b/>
           <w:color w:val="111827"/>
+          <w:sz w:val="26"/>
         </w:rPr>
-        <w:t xml:space="preserve">2. Fuzzing phụ thuộc trạng thái (Stateful REST API Fuzzing): </w:t>
+        <w:t xml:space="preserve">Không gian hành động (Action Space): </w:t>
       </w:r>
       <w:r>
-        <w:t>Vận dụng nguyên lý của công cụ khoa học hàng đầu RESTler (IEEE ICSE 2019) [Ref 17], tác tử xây dựng đồ thị phụ thuộc (Producer-Consumer Dependency Graph) để duy trì token phiên và tham số hợp lệ.</w:t>
+        <w:rPr>
+          <w:sz w:val="26"/>
+        </w:rPr>
+        <w:t>Tập hợp các toán tử đột biến: Double URL Encode, Case Alternation, Comment Injection, Hex Encoding.</w:t>
       </w:r>
     </w:p>
     <w:p>
       <w:pPr>
         <w:pStyle w:val="ListBullet"/>
-        <w:spacing w:after="60" w:line="276" w:lineRule="auto"/>
+        <w:spacing w:after="60" w:line="312" w:lineRule="auto"/>
         <w:jc w:val="both"/>
       </w:pPr>
       <w:r>
         <w:rPr>
           <w:b/>
           <w:color w:val="111827"/>
+          <w:sz w:val="26"/>
         </w:rPr>
-        <w:t xml:space="preserve">3. Kiểm thử xác minh lỗ hổng: </w:t>
+        <w:t xml:space="preserve">Hàm phần thưởng (Reward Function): </w:t>
       </w:r>
       <w:r>
-        <w:t>Bơm payload độc hại được đột biến có chủ đích vào từng tham số và giám sát mã phản hồi HTTP.</w:t>
+        <w:rPr>
+          <w:sz w:val="26"/>
+        </w:rPr>
+        <w:t>+100 điểm khi vượt WAF thành công (HTTP 200), -50 điểm khi bị chặn (HTTP 403).</w:t>
       </w:r>
     </w:p>
     <w:p>
       <w:pPr>
-        <w:spacing w:after="80" w:line="288" w:lineRule="auto"/>
-        <w:jc w:val="both"/>
+        <w:spacing w:before="160" w:after="40" w:line="276" w:lineRule="auto"/>
+        <w:jc w:val="center"/>
+      </w:pPr>
+      <m:oMathPara>
+        <m:oMath>
+          <m:r>
+            <m:t>Q(s,a)←Q(s,a)+α</m:t>
+          </m:r>
+          <m:d>
+            <m:dPr>
+              <m:begChr m:val="["/>
+              <m:sepChr m:val=""/>
+              <m:endChr m:val="]"/>
+            </m:dPr>
+            <m:e>
+              <m:r>
+                <m:t>r</m:t>
+              </m:r>
+              <m:r>
+                <m:t>+</m:t>
+              </m:r>
+              <m:r>
+                <m:t>γ</m:t>
+              </m:r>
+              <m:sSub>
+                <m:e>
+                  <m:r>
+                    <m:t>max</m:t>
+                  </m:r>
+                </m:e>
+                <m:sub>
+                  <m:sSup>
+                    <m:e>
+                      <m:r>
+                        <m:t>a</m:t>
+                      </m:r>
+                    </m:e>
+                    <m:sup>
+                      <m:r>
+                        <m:t>′</m:t>
+                      </m:r>
+                    </m:sup>
+                  </m:sSup>
+                </m:sub>
+              </m:sSub>
+              <m:r>
+                <m:t>Q</m:t>
+              </m:r>
+              <m:r>
+                <m:t>(</m:t>
+              </m:r>
+              <m:sSup>
+                <m:e>
+                  <m:r>
+                    <m:t>s</m:t>
+                  </m:r>
+                </m:e>
+                <m:sup>
+                  <m:r>
+                    <m:t>′</m:t>
+                  </m:r>
+                </m:sup>
+              </m:sSup>
+              <m:r>
+                <m:t>,</m:t>
+              </m:r>
+              <m:sSup>
+                <m:e>
+                  <m:r>
+                    <m:t>a</m:t>
+                  </m:r>
+                </m:e>
+                <m:sup>
+                  <m:r>
+                    <m:t>′</m:t>
+                  </m:r>
+                </m:sup>
+              </m:sSup>
+              <m:r>
+                <m:t>)</m:t>
+              </m:r>
+              <m:r>
+                <m:t>−</m:t>
+              </m:r>
+              <m:r>
+                <m:t>Q</m:t>
+              </m:r>
+              <m:r>
+                <m:t>(</m:t>
+              </m:r>
+              <m:r>
+                <m:t>s</m:t>
+              </m:r>
+              <m:r>
+                <m:t>,</m:t>
+              </m:r>
+              <m:r>
+                <m:t>a</m:t>
+              </m:r>
+              <m:r>
+                <m:t>)</m:t>
+              </m:r>
+            </m:e>
+          </m:d>
+        </m:oMath>
+      </m:oMathPara>
+    </w:p>
+    <w:p>
+      <w:pPr>
+        <w:spacing w:before="0" w:after="160"/>
+        <w:jc w:val="center"/>
       </w:pPr>
       <w:r>
         <w:rPr>
-          <w:b w:val="0"/>
-          <w:i w:val="0"/>
+          <w:i/>
+          <w:color w:val="4B5563"/>
+          <w:sz w:val="20"/>
         </w:rPr>
-        <w:t>Toàn bộ kỹ thuật tấn công được ánh xạ theo danh mục MITRE ATT&amp;CK Enterprise Matrix [Ref 16]: T1190 (Exploit Public-Facing Application), T1059 (Command and Scripting Interpreter), T1083 (File and Directory Discovery) và T1595 (Active Scanning).</w:t>
+        <w:t>Công thức (1.8): Phương trình Bellman cập nhật giá trị Q tối ưu theo thuật toán Q-Learning [Ref 17]</w:t>
       </w:r>
     </w:p>
     <w:p>
       <w:pPr>
-        <w:keepNext/>
+        <w:spacing w:before="280" w:after="120"/>
+      </w:pPr>
+      <w:r>
+        <w:rPr>
+          <w:b/>
+          <w:color w:val="0F766E"/>
+          <w:sz w:val="30"/>
+        </w:rPr>
+        <w:t>1.5. CÁC THƯỚC ĐO VÀ TIÊU CHUẨN ĐÁNH GIÁ HIỆU NĂNG KHOA HỌC</w:t>
+      </w:r>
+    </w:p>
+    <w:p>
+      <w:pPr>
         <w:spacing w:before="200" w:after="80"/>
       </w:pPr>
       <w:r>
         <w:rPr>
           <w:b/>
-          <w:color w:val="1E3A8A"/>
-          <w:sz w:val="24"/>
+          <w:color w:val="1E40AF"/>
+          <w:sz w:val="27"/>
         </w:rPr>
-        <w:t>1.4.4. Mô hình Học tăng cường sâu (Deep Reinforcement Learning - DQN) trong né tránh phòng thủ</w:t>
+        <w:t>1.5.1. Ma trận nhầm lẫn và các chỉ số cốt lõi</w:t>
       </w:r>
     </w:p>
     <w:p>
       <w:pPr>
-        <w:spacing w:after="80" w:line="288" w:lineRule="auto"/>
+        <w:spacing w:after="80" w:line="312" w:lineRule="auto"/>
         <w:jc w:val="both"/>
       </w:pPr>
       <w:r>
         <w:rPr>
-          <w:b w:val="0"/>
           <w:i w:val="0"/>
+          <w:sz w:val="26"/>
         </w:rPr>
-        <w:t>Bài toán né tránh WAF được mô hình hóa theo Quy trình quyết định Markov (Markov Decision Process - MDP) và huấn luyện bằng mạng nơ-ron sâu Deep Q-Network (100% In-house PyTorch, không phụ thuộc API thương mại) [Ref 19, Ref 20]:</w:t>
+        <w:t>Hiệu năng của hệ thống được đánh giá định lượng qua Ma trận nhầm lẫn (Confusion Matrix) với các đại lượng: True Positive (TP), True Negative (TN), False Positive (FP), False Negative (FN):</w:t>
       </w:r>
     </w:p>
     <w:p>
       <w:pPr>
         <w:pStyle w:val="ListBullet"/>
-        <w:spacing w:after="60" w:line="276" w:lineRule="auto"/>
+        <w:spacing w:after="60" w:line="312" w:lineRule="auto"/>
         <w:jc w:val="both"/>
       </w:pPr>
       <w:r>
         <w:rPr>
           <w:b/>
           <w:color w:val="111827"/>
+          <w:sz w:val="26"/>
         </w:rPr>
-        <w:t xml:space="preserve">Không gian trạng thái (State Space): </w:t>
+        <w:t xml:space="preserve">Accuracy: </w:t>
       </w:r>
       <w:r>
-        <w:t>Vector đặc trưng của payload hiện tại và mã phản hồi HTTP từ Gateway (200, 403, 429, 500).</w:t>
+        <w:rPr>
+          <w:sz w:val="26"/>
+        </w:rPr>
+        <w:t>Tỷ lệ dự đoán đúng tổng thể = (TP + TN) / (TP + TN + FP + FN).</w:t>
       </w:r>
     </w:p>
     <w:p>
       <w:pPr>
         <w:pStyle w:val="ListBullet"/>
-        <w:spacing w:after="60" w:line="276" w:lineRule="auto"/>
+        <w:spacing w:after="60" w:line="312" w:lineRule="auto"/>
         <w:jc w:val="both"/>
       </w:pPr>
       <w:r>
         <w:rPr>
           <w:b/>
           <w:color w:val="111827"/>
+          <w:sz w:val="26"/>
         </w:rPr>
-        <w:t xml:space="preserve">Không gian hành động (Action Space): </w:t>
+        <w:t xml:space="preserve">Precision: </w:t>
       </w:r>
       <w:r>
-        <w:t>Tập hợp các toán tử đột biến: Double URL Encode, Inline Comment, Mixed-case, Null-byte, Base64 Wrap, Subshell Expansion.</w:t>
+        <w:rPr>
+          <w:sz w:val="26"/>
+        </w:rPr>
+        <w:t>Độ chuẩn xác của cảnh báo tấn công = TP / (TP + FP).</w:t>
       </w:r>
     </w:p>
     <w:p>
       <w:pPr>
         <w:pStyle w:val="ListBullet"/>
-        <w:spacing w:after="60" w:line="276" w:lineRule="auto"/>
+        <w:spacing w:after="60" w:line="312" w:lineRule="auto"/>
         <w:jc w:val="both"/>
       </w:pPr>
       <w:r>
         <w:rPr>
           <w:b/>
           <w:color w:val="111827"/>
+          <w:sz w:val="26"/>
         </w:rPr>
-        <w:t xml:space="preserve">Hàm phần thưởng (Reward Function): </w:t>
+        <w:t xml:space="preserve">Recall (True Positive Rate - TPR): </w:t>
       </w:r>
       <w:r>
-        <w:t>+100 điểm khi vượt WAF thành công (HTTP 200/500), -50 điểm khi bị chặn (HTTP 403), -10 điểm chi phí độ trễ cho mỗi bước thừa.</w:t>
+        <w:rPr>
+          <w:sz w:val="26"/>
+        </w:rPr>
+        <w:t>Tỷ lệ tóm gọn tấn công = TP / (TP + FN).</w:t>
       </w:r>
-    </w:p>
-    <w:tbl>
-      <w:tblPr>
-        <w:tblW w:type="auto" w:w="0"/>
-        <w:jc w:val="center"/>
-        <w:tblLook w:firstColumn="1" w:firstRow="1" w:lastColumn="0" w:lastRow="0" w:noHBand="0" w:noVBand="1" w:val="04A0"/>
-      </w:tblPr>
-      <w:tblGrid>
-        <w:gridCol w:w="9360"/>
-      </w:tblGrid>
-      <w:tr>
-        <w:tc>
-          <w:tcPr>
-            <w:tcW w:type="dxa" w:w="9360"/>
-            <w:shd w:fill="F3F4F6"/>
-            <w:tcMar>
-              <w:top w:w="140" w:type="dxa"/>
-              <w:bottom w:w="140" w:type="dxa"/>
-              <w:left w:w="200" w:type="dxa"/>
-              <w:right w:w="200" w:type="dxa"/>
-            </w:tcMar>
-          </w:tcPr>
-          <w:p>
-            <w:pPr>
-              <w:jc w:val="center"/>
-            </w:pPr>
-            <w:r>
-              <w:rPr>
-                <w:b/>
-                <w:color w:val="1E293B"/>
-                <w:sz w:val="22"/>
-              </w:rPr>
-              <w:t>Q(s, a) &lt;- Q(s, a) + alpha * [ r + gamma * max_a'( Q(s', a') ) - Q(s, a) ]</w:t>
-            </w:r>
-          </w:p>
-          <w:p>
-            <w:pPr>
-              <w:jc w:val="center"/>
-            </w:pPr>
-            <w:r>
-              <w:rPr>
-                <w:i/>
-                <w:color w:val="64748B"/>
-                <w:sz w:val="19"/>
-              </w:rPr>
-              <w:t>Phương trình cập nhật giá trị Q tối ưu theo thuật toán Q-Learning</w:t>
-            </w:r>
-          </w:p>
-        </w:tc>
-      </w:tr>
-    </w:tbl>
-    <w:p>
-      <w:pPr>
-        <w:spacing w:after="80"/>
-      </w:pPr>
     </w:p>
     <w:p>
       <w:pPr>
-        <w:keepNext/>
+        <w:pStyle w:val="ListBullet"/>
+        <w:spacing w:after="60" w:line="312" w:lineRule="auto"/>
+        <w:jc w:val="both"/>
+      </w:pPr>
+      <w:r>
+        <w:rPr>
+          <w:b/>
+          <w:color w:val="111827"/>
+          <w:sz w:val="26"/>
+        </w:rPr>
+        <w:t xml:space="preserve">False Positive Rate (FPR): </w:t>
+      </w:r>
+      <w:r>
+        <w:rPr>
+          <w:sz w:val="26"/>
+        </w:rPr>
+        <w:t>Tỷ lệ báo động nhầm người dùng hợp lệ = FP / (FP + TN).</w:t>
+      </w:r>
+    </w:p>
+    <w:p>
+      <w:pPr>
+        <w:pStyle w:val="ListBullet"/>
+        <w:spacing w:after="60" w:line="312" w:lineRule="auto"/>
+        <w:jc w:val="both"/>
+      </w:pPr>
+      <w:r>
+        <w:rPr>
+          <w:b/>
+          <w:color w:val="111827"/>
+          <w:sz w:val="26"/>
+        </w:rPr>
+        <w:t xml:space="preserve">F1-Score: </w:t>
+      </w:r>
+      <w:r>
+        <w:rPr>
+          <w:sz w:val="26"/>
+        </w:rPr>
+        <w:t>Trung bình điều hòa giữa Precision và Recall = 2 * (Precision * Recall) / (Precision + Recall).</w:t>
+      </w:r>
+    </w:p>
+    <w:p>
+      <w:pPr>
+        <w:spacing w:before="200" w:after="80"/>
+      </w:pPr>
+      <w:r>
+        <w:rPr>
+          <w:b/>
+          <w:color w:val="1E40AF"/>
+          <w:sz w:val="27"/>
+        </w:rPr>
+        <w:t>1.5.2. Thước đo Youden's Index (J) theo chuẩn OWASP Benchmark Project</w:t>
+      </w:r>
+    </w:p>
+    <w:p>
+      <w:pPr>
+        <w:spacing w:after="80" w:line="312" w:lineRule="auto"/>
+        <w:jc w:val="both"/>
+      </w:pPr>
+      <w:r>
+        <w:rPr>
+          <w:i w:val="0"/>
+          <w:sz w:val="26"/>
+        </w:rPr>
+        <w:t>Theo tiêu chuẩn đánh giá WAF quốc tế của OWASP Benchmark Project [Ref 08], một hệ thống WAF đạt chuẩn khoa học không thể chỉ dựa vào Accuracy mà phải cân bằng tuyệt đối giữa khả năng chặn mã độc và tỷ lệ không làm gián đoạn người dùng hợp lệ:</w:t>
+      </w:r>
+    </w:p>
+    <w:p>
+      <w:pPr>
+        <w:spacing w:before="160" w:after="40" w:line="276" w:lineRule="auto"/>
+        <w:jc w:val="center"/>
+      </w:pPr>
+      <m:oMathPara>
+        <m:oMath>
+          <m:r>
+            <m:t>J=</m:t>
+          </m:r>
+          <m:r>
+            <m:rPr>
+              <m:nor/>
+            </m:rPr>
+            <m:t>TPR</m:t>
+          </m:r>
+          <m:r>
+            <m:t>−</m:t>
+          </m:r>
+          <m:r>
+            <m:rPr>
+              <m:nor/>
+            </m:rPr>
+            <m:t>FPR</m:t>
+          </m:r>
+          <m:r>
+            <m:t>=</m:t>
+          </m:r>
+          <m:f>
+            <m:fPr>
+              <m:type m:val="bar"/>
+            </m:fPr>
+            <m:num>
+              <m:r>
+                <m:rPr>
+                  <m:nor/>
+                </m:rPr>
+                <m:t>TP</m:t>
+              </m:r>
+            </m:num>
+            <m:den>
+              <m:r>
+                <m:rPr>
+                  <m:nor/>
+                </m:rPr>
+                <m:t>TP</m:t>
+              </m:r>
+              <m:r>
+                <m:t>+</m:t>
+              </m:r>
+              <m:r>
+                <m:rPr>
+                  <m:nor/>
+                </m:rPr>
+                <m:t>FN</m:t>
+              </m:r>
+            </m:den>
+          </m:f>
+          <m:r>
+            <m:t>−</m:t>
+          </m:r>
+          <m:f>
+            <m:fPr>
+              <m:type m:val="bar"/>
+            </m:fPr>
+            <m:num>
+              <m:r>
+                <m:rPr>
+                  <m:nor/>
+                </m:rPr>
+                <m:t>FP</m:t>
+              </m:r>
+            </m:num>
+            <m:den>
+              <m:r>
+                <m:rPr>
+                  <m:nor/>
+                </m:rPr>
+                <m:t>FP</m:t>
+              </m:r>
+              <m:r>
+                <m:t>+</m:t>
+              </m:r>
+              <m:r>
+                <m:rPr>
+                  <m:nor/>
+                </m:rPr>
+                <m:t>TN</m:t>
+              </m:r>
+            </m:den>
+          </m:f>
+        </m:oMath>
+      </m:oMathPara>
+    </w:p>
+    <w:p>
+      <w:pPr>
+        <w:spacing w:before="0" w:after="160"/>
+        <w:jc w:val="center"/>
+      </w:pPr>
+      <w:r>
+        <w:rPr>
+          <w:i/>
+          <w:color w:val="4B5563"/>
+          <w:sz w:val="20"/>
+        </w:rPr>
+        <w:t>Công thức (1.9): Chỉ số Youden's Index J theo chuẩn đánh giá WAF của OWASP Benchmark Project [Ref 08]</w:t>
+      </w:r>
+    </w:p>
+    <w:p>
+      <w:pPr>
+        <w:spacing w:after="80" w:line="312" w:lineRule="auto"/>
+        <w:jc w:val="both"/>
+      </w:pPr>
+      <w:r>
+        <w:rPr>
+          <w:i w:val="0"/>
+          <w:sz w:val="26"/>
+        </w:rPr>
+        <w:t>Thang đo J thuộc [-1.0, 1.0]. Hệ thống lý tưởng đạt J = 1.0 (TPR = 100%, FPR = 0%). Nếu J &lt;= 0, hệ thống phòng thủ hoàn toàn vô dụng hoặc gây hại cho dịch vụ.</w:t>
+      </w:r>
+    </w:p>
+    <w:p>
+      <w:pPr>
+        <w:spacing w:before="200" w:after="80"/>
+      </w:pPr>
+      <w:r>
+        <w:rPr>
+          <w:b/>
+          <w:color w:val="1E40AF"/>
+          <w:sz w:val="27"/>
+        </w:rPr>
+        <w:t>1.5.3. Ngân sách độ trễ xử lý (Latency Overhead Budget)</w:t>
+      </w:r>
+    </w:p>
+    <w:p>
+      <w:pPr>
+        <w:spacing w:after="80" w:line="312" w:lineRule="auto"/>
+        <w:jc w:val="both"/>
+      </w:pPr>
+      <w:r>
+        <w:rPr>
+          <w:i w:val="0"/>
+          <w:sz w:val="26"/>
+        </w:rPr>
+        <w:t>Theo tiêu chuẩn vận hành kiến trúc Reverse Proxy hiệu năng cao trong NGINX Cookbook [Ref 05], thời gian WAF can thiệp phân tích gói tin không được làm suy giảm trải nghiệm người dùng:</w:t>
+      </w:r>
+    </w:p>
+    <w:p>
+      <w:pPr>
+        <w:spacing w:before="160" w:after="40" w:line="276" w:lineRule="auto"/>
+        <w:jc w:val="center"/>
+      </w:pPr>
+      <m:oMathPara>
+        <m:oMath>
+          <m:r>
+            <m:t>Δt=</m:t>
+          </m:r>
+          <m:sSub>
+            <m:e>
+              <m:r>
+                <m:t>t</m:t>
+              </m:r>
+            </m:e>
+            <m:sub>
+              <m:r>
+                <m:rPr>
+                  <m:nor/>
+                </m:rPr>
+                <m:t>with\_WAF</m:t>
+              </m:r>
+            </m:sub>
+          </m:sSub>
+          <m:r>
+            <m:t>−</m:t>
+          </m:r>
+          <m:sSub>
+            <m:e>
+              <m:r>
+                <m:t>t</m:t>
+              </m:r>
+            </m:e>
+            <m:sub>
+              <m:r>
+                <m:rPr>
+                  <m:nor/>
+                </m:rPr>
+                <m:t>direct</m:t>
+              </m:r>
+            </m:sub>
+          </m:sSub>
+          <m:r>
+            <m:t>≤15</m:t>
+          </m:r>
+          <m:r>
+            <m:rPr>
+              <m:nor/>
+            </m:rPr>
+            <m:t> ms</m:t>
+          </m:r>
+        </m:oMath>
+      </m:oMathPara>
+    </w:p>
+    <w:p>
+      <w:pPr>
+        <w:spacing w:before="0" w:after="160"/>
+        <w:jc w:val="center"/>
+      </w:pPr>
+      <w:r>
+        <w:rPr>
+          <w:i/>
+          <w:color w:val="4B5563"/>
+          <w:sz w:val="20"/>
+        </w:rPr>
+        <w:t>Công thức (1.10): Ngân sách độ trễ tối đa cho toàn bộ quy trình kiểm tra WAF Hybrid [Ref 05]</w:t>
+      </w:r>
+    </w:p>
+    <w:p>
+      <w:pPr>
         <w:spacing w:before="280" w:after="120"/>
       </w:pPr>
       <w:r>
         <w:rPr>
           <w:b/>
           <w:color w:val="0F766E"/>
-          <w:sz w:val="28"/>
+          <w:sz w:val="30"/>
         </w:rPr>
-        <w:t>1.5. CÁC THƯỚC ĐO VÀ TIÊU CHUẨN ĐÁNH GIÁ HIỆU NĂNG KHOA HỌC</w:t>
+        <w:t>1.6. TỔNG KẾT CHƯƠNG 1</w:t>
       </w:r>
     </w:p>
     <w:p>
       <w:pPr>
-        <w:keepNext/>
-        <w:spacing w:before="200" w:after="80"/>
-      </w:pPr>
-      <w:r>
-        <w:rPr>
-          <w:b/>
-          <w:color w:val="1E3A8A"/>
-          <w:sz w:val="24"/>
-        </w:rPr>
-        <w:t>1.5.1. Ma trận nhầm lẫn và các chỉ số cốt lõi</w:t>
-      </w:r>
-    </w:p>
-    <w:p>
-      <w:pPr>
-        <w:spacing w:after="80" w:line="288" w:lineRule="auto"/>
+        <w:spacing w:after="80" w:line="312" w:lineRule="auto"/>
         <w:jc w:val="both"/>
       </w:pPr>
       <w:r>
         <w:rPr>
-          <w:b w:val="0"/>
           <w:i w:val="0"/>
+          <w:sz w:val="26"/>
         </w:rPr>
-        <w:t>Hiệu năng của hệ thống được đánh giá định lượng qua Ma trận nhầm lẫn (Confusion Matrix) với các chỉ số thống kê chuẩn mực:</w:t>
+        <w:t>Chương 1 đã hoàn thành việc xây dựng nền tảng cơ sở lý thuyết toàn diện, có tính liên kết chặt chẽ:</w:t>
       </w:r>
     </w:p>
     <w:p>
       <w:pPr>
         <w:pStyle w:val="ListBullet"/>
-        <w:spacing w:after="60" w:line="276" w:lineRule="auto"/>
+        <w:spacing w:after="60" w:line="312" w:lineRule="auto"/>
         <w:jc w:val="both"/>
       </w:pPr>
       <w:r>
         <w:rPr>
           <w:b/>
           <w:color w:val="111827"/>
+          <w:sz w:val="26"/>
         </w:rPr>
-        <w:t xml:space="preserve">Accuracy: </w:t>
+        <w:t xml:space="preserve">1. Giáo trình kinh điển: </w:t>
       </w:r>
       <w:r>
-        <w:t>Tỷ lệ dự đoán đúng tổng thể = (TP + TN) / (TP + TN + FP + FN).</w:t>
+        <w:rPr>
+          <w:sz w:val="26"/>
+        </w:rPr>
+        <w:t>Vận dụng lý thuyết Cổng tầng ứng dụng của William Stallings [Ref 01], lý thuyết thông tin Shannon của Douglas Stinson [Ref 02], và Trò chơi an ninh đối kháng của Katz &amp; Lindell [Ref 03].</w:t>
       </w:r>
     </w:p>
     <w:p>
       <w:pPr>
         <w:pStyle w:val="ListBullet"/>
-        <w:spacing w:after="60" w:line="276" w:lineRule="auto"/>
+        <w:spacing w:after="60" w:line="312" w:lineRule="auto"/>
         <w:jc w:val="both"/>
       </w:pPr>
       <w:r>
         <w:rPr>
           <w:b/>
           <w:color w:val="111827"/>
+          <w:sz w:val="26"/>
         </w:rPr>
-        <w:t xml:space="preserve">Precision: </w:t>
+        <w:t xml:space="preserve">2. Tiêu chuẩn công nghiệp: </w:t>
       </w:r>
       <w:r>
-        <w:t>Độ chuẩn xác của cảnh báo tấn công = TP / (TP + FP).</w:t>
+        <w:rPr>
+          <w:sz w:val="26"/>
+        </w:rPr>
+        <w:t>Bám sát bộ rủi ro OWASP Top 10 API Security Risks (2023) [Ref 06], kiến trúc phân tích tính điểm bất thường ModSecurity CRS v4 [Ref 07], và khung chuẩn đánh giá OWASP Benchmark [Ref 08].</w:t>
       </w:r>
     </w:p>
     <w:p>
       <w:pPr>
         <w:pStyle w:val="ListBullet"/>
-        <w:spacing w:after="60" w:line="276" w:lineRule="auto"/>
+        <w:spacing w:after="60" w:line="312" w:lineRule="auto"/>
         <w:jc w:val="both"/>
       </w:pPr>
       <w:r>
         <w:rPr>
           <w:b/>
           <w:color w:val="111827"/>
-        </w:rPr>
-        <w:t xml:space="preserve">Recall (True Positive Rate - TPR): </w:t>
-      </w:r>
-      <w:r>
-        <w:t>Tỷ lệ tóm gọn tấn công = TP / (TP + FN).</w:t>
-      </w:r>
-    </w:p>
-    <w:p>
-      <w:pPr>
-        <w:pStyle w:val="ListBullet"/>
-        <w:spacing w:after="60" w:line="276" w:lineRule="auto"/>
-        <w:jc w:val="both"/>
-      </w:pPr>
-      <w:r>
-        <w:rPr>
-          <w:b/>
-          <w:color w:val="111827"/>
-        </w:rPr>
-        <w:t xml:space="preserve">False Positive Rate (FPR): </w:t>
-      </w:r>
-      <w:r>
-        <w:t>Tỷ lệ báo động nhầm người dùng hợp lệ = FP / (FP + TN).</w:t>
-      </w:r>
-    </w:p>
-    <w:p>
-      <w:pPr>
-        <w:pStyle w:val="ListBullet"/>
-        <w:spacing w:after="60" w:line="276" w:lineRule="auto"/>
-        <w:jc w:val="both"/>
-      </w:pPr>
-      <w:r>
-        <w:rPr>
-          <w:b/>
-          <w:color w:val="111827"/>
-        </w:rPr>
-        <w:t xml:space="preserve">F1-Score: </w:t>
-      </w:r>
-      <w:r>
-        <w:t>Trung bình điều hòa giữa Precision và Recall = 2 * (Precision * Recall) / (Precision + Recall).</w:t>
-      </w:r>
-    </w:p>
-    <w:p>
-      <w:pPr>
-        <w:keepNext/>
-        <w:spacing w:before="200" w:after="80"/>
-      </w:pPr>
-      <w:r>
-        <w:rPr>
-          <w:b/>
-          <w:color w:val="1E3A8A"/>
-          <w:sz w:val="24"/>
-        </w:rPr>
-        <w:t>1.5.2. Thước đo Youden's Index (J) theo chuẩn OWASP Benchmark Project</w:t>
-      </w:r>
-    </w:p>
-    <w:p>
-      <w:pPr>
-        <w:spacing w:after="80" w:line="288" w:lineRule="auto"/>
-        <w:jc w:val="both"/>
-      </w:pPr>
-      <w:r>
-        <w:rPr>
-          <w:b w:val="0"/>
-          <w:i w:val="0"/>
-        </w:rPr>
-        <w:t>Theo tiêu chuẩn đánh giá WAF quốc tế của OWASP Benchmark Project [Ref 13], một hệ thống WAF đạt chuẩn khoa học bắt buộc phải cân bằng giữa khả năng bắt tấn công và khả năng hạn chế tối đa báo động giả. Chỉ số Youden's Index J được định nghĩa:</w:t>
-      </w:r>
-    </w:p>
-    <w:tbl>
-      <w:tblPr>
-        <w:tblW w:type="auto" w:w="0"/>
-        <w:jc w:val="center"/>
-        <w:tblLook w:firstColumn="1" w:firstRow="1" w:lastColumn="0" w:lastRow="0" w:noHBand="0" w:noVBand="1" w:val="04A0"/>
-      </w:tblPr>
-      <w:tblGrid>
-        <w:gridCol w:w="9360"/>
-      </w:tblGrid>
-      <w:tr>
-        <w:tc>
-          <w:tcPr>
-            <w:tcW w:type="dxa" w:w="9360"/>
-            <w:shd w:fill="F3F4F6"/>
-            <w:tcMar>
-              <w:top w:w="140" w:type="dxa"/>
-              <w:bottom w:w="140" w:type="dxa"/>
-              <w:left w:w="200" w:type="dxa"/>
-              <w:right w:w="200" w:type="dxa"/>
-            </w:tcMar>
-          </w:tcPr>
-          <w:p>
-            <w:pPr>
-              <w:jc w:val="center"/>
-            </w:pPr>
-            <w:r>
-              <w:rPr>
-                <w:b/>
-                <w:color w:val="1E293B"/>
-                <w:sz w:val="22"/>
-              </w:rPr>
-              <w:t>J = TPR - FPR = [ TP / (TP + FN) ] - [ FP / (FP + TN) ]</w:t>
-            </w:r>
-          </w:p>
-          <w:p>
-            <w:pPr>
-              <w:jc w:val="center"/>
-            </w:pPr>
-            <w:r>
-              <w:rPr>
-                <w:i/>
-                <w:color w:val="64748B"/>
-                <w:sz w:val="19"/>
-              </w:rPr>
-              <w:t>Chỉ số Youden's Index J theo chuẩn đánh giá WAF của OWASP Benchmark</w:t>
-            </w:r>
-          </w:p>
-        </w:tc>
-      </w:tr>
-    </w:tbl>
-    <w:p>
-      <w:pPr>
-        <w:spacing w:after="80"/>
-      </w:pPr>
-    </w:p>
-    <w:p>
-      <w:pPr>
-        <w:spacing w:after="80" w:line="288" w:lineRule="auto"/>
-        <w:jc w:val="both"/>
-      </w:pPr>
-      <w:r>
-        <w:rPr>
-          <w:b w:val="0"/>
-          <w:i w:val="0"/>
-        </w:rPr>
-        <w:t>Thang đo J thuộc [-1.0, 1.0]. Hệ thống lý tưởng đạt J = 1.0 (TPR = 100%, FPR = 0%). Nếu J &lt;= 0, hệ thống không có giá trị thực tiễn. Mục tiêu của đồ án PBL6 là đạt J &gt;= 0.90 trên tập dữ liệu kiểm nghiệm thực tế.</w:t>
-      </w:r>
-    </w:p>
-    <w:p>
-      <w:pPr>
-        <w:keepNext/>
-        <w:spacing w:before="200" w:after="80"/>
-      </w:pPr>
-      <w:r>
-        <w:rPr>
-          <w:b/>
-          <w:color w:val="1E3A8A"/>
-          <w:sz w:val="24"/>
-        </w:rPr>
-        <w:t>1.5.3. Ngân sách độ trễ xử lý (Latency Overhead Budget)</w:t>
-      </w:r>
-    </w:p>
-    <w:p>
-      <w:pPr>
-        <w:spacing w:after="80" w:line="288" w:lineRule="auto"/>
-        <w:jc w:val="both"/>
-      </w:pPr>
-      <w:r>
-        <w:rPr>
-          <w:b w:val="0"/>
-          <w:i w:val="0"/>
-        </w:rPr>
-        <w:t>Theo tiêu chuẩn vận hành kiến trúc Reverse Proxy hiệu năng cao trong NGINX Cookbook [Ref 05], hệ thống WAF bảo vệ Web API bắt buộc phải tuân thủ nghiêm ngặt ngân sách độ trễ:</w:t>
-      </w:r>
-    </w:p>
-    <w:tbl>
-      <w:tblPr>
-        <w:tblW w:type="auto" w:w="0"/>
-        <w:jc w:val="center"/>
-        <w:tblLook w:firstColumn="1" w:firstRow="1" w:lastColumn="0" w:lastRow="0" w:noHBand="0" w:noVBand="1" w:val="04A0"/>
-      </w:tblPr>
-      <w:tblGrid>
-        <w:gridCol w:w="9360"/>
-      </w:tblGrid>
-      <w:tr>
-        <w:tc>
-          <w:tcPr>
-            <w:tcW w:type="dxa" w:w="9360"/>
-            <w:shd w:fill="F3F4F6"/>
-            <w:tcMar>
-              <w:top w:w="140" w:type="dxa"/>
-              <w:bottom w:w="140" w:type="dxa"/>
-              <w:left w:w="200" w:type="dxa"/>
-              <w:right w:w="200" w:type="dxa"/>
-            </w:tcMar>
-          </w:tcPr>
-          <w:p>
-            <w:pPr>
-              <w:jc w:val="center"/>
-            </w:pPr>
-            <w:r>
-              <w:rPr>
-                <w:b/>
-                <w:color w:val="1E293B"/>
-                <w:sz w:val="22"/>
-              </w:rPr>
-              <w:t>Delta t = t_with_WAF - t_direct &lt;= 15 ms</w:t>
-            </w:r>
-          </w:p>
-          <w:p>
-            <w:pPr>
-              <w:jc w:val="center"/>
-            </w:pPr>
-            <w:r>
-              <w:rPr>
-                <w:i/>
-                <w:color w:val="64748B"/>
-                <w:sz w:val="19"/>
-              </w:rPr>
-              <w:t>Ngân sách độ trễ tối đa cho toàn bộ quy trình kiểm tra WAF Hybrid</w:t>
-            </w:r>
-          </w:p>
-        </w:tc>
-      </w:tr>
-    </w:tbl>
-    <w:p>
-      <w:pPr>
-        <w:spacing w:after="80"/>
-      </w:pPr>
-    </w:p>
-    <w:p>
-      <w:pPr>
-        <w:keepNext/>
-        <w:spacing w:before="280" w:after="120"/>
-      </w:pPr>
-      <w:r>
-        <w:rPr>
-          <w:b/>
-          <w:color w:val="0F766E"/>
-          <w:sz w:val="28"/>
-        </w:rPr>
-        <w:t>1.6. TỔNG KẾT CHƯƠNG 1</w:t>
-      </w:r>
-    </w:p>
-    <w:p>
-      <w:pPr>
-        <w:spacing w:after="80" w:line="288" w:lineRule="auto"/>
-        <w:jc w:val="both"/>
-      </w:pPr>
-      <w:r>
-        <w:rPr>
-          <w:b w:val="0"/>
-          <w:i w:val="0"/>
-        </w:rPr>
-        <w:t>Chương 1 đã hoàn thành việc xây dựng nền tảng cơ sở lý thuyết toàn diện, có tính liên kết chặt chẽ và hàm lượng khoa học cao cho toàn bộ đồ án PBL6 dựa trên mô hình Kiềng ba chân học thuật:</w:t>
-      </w:r>
-    </w:p>
-    <w:p>
-      <w:pPr>
-        <w:pStyle w:val="ListBullet"/>
-        <w:spacing w:after="60" w:line="276" w:lineRule="auto"/>
-        <w:jc w:val="both"/>
-      </w:pPr>
-      <w:r>
-        <w:rPr>
-          <w:b/>
-          <w:color w:val="111827"/>
-        </w:rPr>
-        <w:t xml:space="preserve">1. Giáo trình kinh điển: </w:t>
-      </w:r>
-      <w:r>
-        <w:t>Vận dụng lý thuyết Cổng tầng ứng dụng của William Stallings [Ref 01], cơ sở toán học về Shannon Entropy của Douglas Stinson [Ref 02], mô hình Trò chơi an ninh đối kháng của Jonathan Katz &amp; Yehuda Lindell [Ref 03], phương pháp luận kiểm thử của CompTIA PenTest+ [Ref 04], và kiến trúc Reverse Proxy từ NGINX Cookbook [Ref 05].</w:t>
-      </w:r>
-    </w:p>
-    <w:p>
-      <w:pPr>
-        <w:pStyle w:val="ListBullet"/>
-        <w:spacing w:after="60" w:line="276" w:lineRule="auto"/>
-        <w:jc w:val="both"/>
-      </w:pPr>
-      <w:r>
-        <w:rPr>
-          <w:b/>
-          <w:color w:val="111827"/>
-        </w:rPr>
-        <w:t xml:space="preserve">2. Tiêu chuẩn công nghiệp: </w:t>
-      </w:r>
-      <w:r>
-        <w:t>Bám sát bộ rủi ro OWASP Top 10 API Security Risks (2023) [Ref 06], kiến trúc Anomaly Scoring của OWASP ModSecurity CRS v4.0 [Ref 07], quy trình đánh giá NIST SP 800-115 [Ref 15], và ma trận kỹ thuật MITRE ATT&amp;CK [Ref 16].</w:t>
-      </w:r>
-    </w:p>
-    <w:p>
-      <w:pPr>
-        <w:pStyle w:val="ListBullet"/>
-        <w:spacing w:after="60" w:line="276" w:lineRule="auto"/>
-        <w:jc w:val="both"/>
-      </w:pPr>
-      <w:r>
-        <w:rPr>
-          <w:b/>
-          <w:color w:val="111827"/>
+          <w:sz w:val="26"/>
         </w:rPr>
         <w:t xml:space="preserve">3. Công trình khoa học thực nghiệm: </w:t>
       </w:r>
       <w:r>
-        <w:t>Triển khai không gian 17 đặc trưng hình thái chuẩn Torrano-Gimenez (Wiley 2015) [Ref 08], bộ dữ liệu chuẩn quốc tế CSIC 2010 [Ref 09], khảo sát SQLi của IEEE Access (2023) [Ref 10], kiến trúc Hybrid WAF của MDPI Electronics (2025) [Ref 11], và mô hình Thao trường mạng chuẩn Elsevier (2020) [Ref 14].</w:t>
+        <w:rPr>
+          <w:sz w:val="26"/>
+        </w:rPr>
+        <w:t>Triển khai không gian 17 đặc trưng hình thái chuỗi payload [Ref 15], kết hợp mô hình học máy phân lớp Random Forest [Ref 12], phát hiện dị biệt Isolation Forest [Ref 11], kiến trúc dung hợp đa tầng [Ref 13], và mô hình Thao trường An ninh Đối kháng phân tán [Ref 16].</w:t>
       </w:r>
     </w:p>
     <w:sectPr>
       <w:pgSz w:w="12240" w:h="15840"/>
-      <w:pgMar w:top="1440" w:right="1440" w:bottom="1440" w:left="1440" w:header="720" w:footer="720" w:gutter="0"/>
+      <w:pgMar w:top="1417" w:right="1133" w:bottom="1417" w:left="1984" w:header="720" w:footer="720" w:gutter="0"/>
       <w:cols w:space="720"/>
       <w:docGrid w:linePitch="360"/>
     </w:sectPr>
@@ -2975,12 +2790,12 @@
     <w:qFormat/>
     <w:rsid w:val="00FC693F"/>
     <w:pPr>
-      <w:spacing w:line="288" w:lineRule="auto" w:after="80"/>
+      <w:spacing w:line="312" w:lineRule="auto" w:after="80"/>
     </w:pPr>
     <w:rPr>
       <w:rFonts w:ascii="Times New Roman" w:hAnsi="Times New Roman"/>
       <w:color w:val="1F2937"/>
-      <w:sz w:val="22"/>
+      <w:sz w:val="26"/>
     </w:rPr>
   </w:style>
   <w:style w:type="paragraph" w:styleId="Header">

</xml_diff>

<commit_message>
docs(thesis): finalize official PBL6 thesis reports, faculty template, and documentation assets (#104-#109)
- Consolidate official submission report PBL6_Bao_Cao.docx formatted to Faculty of IT template
- Update supervisor Nguyen Nang Hung Van and authors Ngo Van Cong & Nguyen Cong Minh
- Retain full-text comprehensive backup reports and native Word equations (OMML)
- Track all verification scripts, benchmark suites, and test result screenshots
</commit_message>
<xml_diff>
--- a/docs/reports/PBL6_Bao_Cao_Chuong_1_Co_So_Ly_Thuyet.docx
+++ b/docs/reports/PBL6_Bao_Cao_Chuong_1_Co_So_Ly_Thuyet.docx
@@ -11,7 +11,7 @@
         <w:rPr>
           <w:b/>
           <w:color w:val="4B5563"/>
-          <w:sz w:val="22"/>
+          <w:sz w:val="24"/>
         </w:rPr>
         <w:t>TRƯỜNG ĐẠI HỌC BÁCH KHOA - ĐẠI HỌC ĐÀ NẴNG</w:t>
         <w:br/>
@@ -23,7 +23,7 @@
         <w:rPr>
           <w:b/>
           <w:color w:val="047857"/>
-          <w:sz w:val="26"/>
+          <w:sz w:val="28"/>
         </w:rPr>
         <w:t>BÁO CÁO ĐỒ ÁN MÔN HỌC CHUYÊN NGÀNH AN TOÀN THÔNG TIN (PBL6)</w:t>
         <w:br/>
@@ -34,14 +34,14 @@
           <w:color w:val="111827"/>
           <w:sz w:val="32"/>
         </w:rPr>
-        <w:t>CHƯƠNG 1: CƠ SỞ LÝ THUYẾT VÀ TỔNG QUAN CÔNG TRÌNH NGHIÊN CỨU</w:t>
+        <w:t>CHƯƠNG 1: CƠ SỞ LÝ THUYẾT VÀ TỔNG QUAN CÔNG NGHỆ</w:t>
         <w:br/>
       </w:r>
       <w:r>
         <w:rPr>
           <w:i/>
           <w:color w:val="374151"/>
-          <w:sz w:val="22"/>
+          <w:sz w:val="24"/>
         </w:rPr>
         <w:t>Đề tài: Nền tảng Giám sát, Phát hiện và Ngăn chặn Tấn công Web API dựa trên AI/ML kết hợp Môi trường Thao trường Mạng (Cyber Range) Phân tán</w:t>
         <w:br/>
@@ -49,94 +49,91 @@
     </w:p>
     <w:p>
       <w:pPr>
-        <w:spacing w:after="80" w:line="288" w:lineRule="auto"/>
+        <w:spacing w:after="80" w:line="312" w:lineRule="auto"/>
         <w:jc w:val="both"/>
       </w:pPr>
       <w:r>
         <w:rPr>
-          <w:b w:val="0"/>
           <w:i/>
+          <w:sz w:val="26"/>
         </w:rPr>
         <w:t>Tài liệu cơ sở lý thuyết bám sát 20 công trình và giáo trình kinh điển quốc tế (Prentice Hall, CRC Press, Sybex/Wiley, O'Reilly, USENIX Security, IEEE, ACM, Elsevier, MDPI, NIST, OWASP, MITRE). Cung cấp luận cứ toán học, cơ chế kiến trúc và cơ sở phân loại cho toàn bộ hệ sinh thái phòng thủ và tấn công của đồ án.</w:t>
       </w:r>
     </w:p>
     <w:p>
       <w:pPr>
-        <w:keepNext/>
         <w:spacing w:before="280" w:after="120"/>
       </w:pPr>
       <w:r>
         <w:rPr>
           <w:b/>
           <w:color w:val="0F766E"/>
-          <w:sz w:val="28"/>
+          <w:sz w:val="30"/>
         </w:rPr>
         <w:t>1.1. TỔNG QUAN VỀ BẢO MẬT WEB API VÀ CÁC THÁCH THỨC AN NINH HIỆN ĐẠI</w:t>
       </w:r>
     </w:p>
     <w:p>
       <w:pPr>
-        <w:keepNext/>
         <w:spacing w:before="200" w:after="80"/>
       </w:pPr>
       <w:r>
         <w:rPr>
           <w:b/>
-          <w:color w:val="1E3A8A"/>
-          <w:sz w:val="24"/>
+          <w:color w:val="1E40AF"/>
+          <w:sz w:val="27"/>
         </w:rPr>
         <w:t>1.1.1. Xu hướng kiến trúc Microservices và sự bùng nổ của Web API</w:t>
       </w:r>
     </w:p>
     <w:p>
       <w:pPr>
-        <w:spacing w:after="80" w:line="288" w:lineRule="auto"/>
+        <w:spacing w:after="80" w:line="312" w:lineRule="auto"/>
         <w:jc w:val="both"/>
       </w:pPr>
       <w:r>
         <w:rPr>
-          <w:b w:val="0"/>
           <w:i w:val="0"/>
+          <w:sz w:val="26"/>
         </w:rPr>
         <w:t>Trong kỷ nguyên chuyển đổi số và điện toán đám mây, kiến trúc phần mềm đã trải qua sự chuyển dịch mang tính nền tảng từ các hệ thống nguyên khối (Monolithic Architecture) sang kiến trúc phân tán và vi dịch vụ (Microservices Architecture). Trong mô hình này, giao diện lập trình ứng dụng web (Web API), đặc biệt là chuẩn RESTful API truyền tải dữ liệu qua giao thức HTTP/HTTPS với định dạng JSON, đã trở thành huyết mạch kết nối toàn bộ hệ sinh thái dịch vụ số: từ ứng dụng Single Page Application (SPA), ứng dụng di động (Mobile Apps), hệ thống Internet vạn vật (IoT) cho đến các cổng thanh toán tài chính liên ngân hàng.</w:t>
       </w:r>
     </w:p>
     <w:p>
       <w:pPr>
-        <w:spacing w:after="80" w:line="288" w:lineRule="auto"/>
+        <w:spacing w:after="80" w:line="312" w:lineRule="auto"/>
         <w:jc w:val="both"/>
       </w:pPr>
       <w:r>
         <w:rPr>
-          <w:b w:val="0"/>
           <w:i w:val="0"/>
+          <w:sz w:val="26"/>
         </w:rPr>
         <w:t>Tuy nhiên, sự bùng nổ về số lượng và tính phức tạp của Web API đã làm mở rộng đáng kể bề mặt tấn công (Attack Surface). Không giống như các ứng dụng web truyền thống hiển thị giao diện qua HTML/CSS, Web API phơi bày trực tiếp logic nghiệp vụ, các tham số truy vấn cơ sở dữ liệu và cấu trúc dữ liệu nhạy cảm. Kẻ tấn công có thể dễ dàng sử dụng các công cụ phân tích tự động, bóc tách tài liệu OpenAPI/Swagger specification để lập bản đồ các endpoint và thực hiện tấn công hàng loạt mà không bị cản trở bởi lớp giao diện người dùng [Ref 04].</w:t>
       </w:r>
     </w:p>
     <w:p>
       <w:pPr>
-        <w:keepNext/>
         <w:spacing w:before="200" w:after="80"/>
       </w:pPr>
       <w:r>
         <w:rPr>
           <w:b/>
-          <w:color w:val="1E3A8A"/>
-          <w:sz w:val="24"/>
+          <w:color w:val="1E40AF"/>
+          <w:sz w:val="27"/>
         </w:rPr>
         <w:t>1.1.2. Phân tích các mối đe dọa hàng đầu theo OWASP Top 10 API Security Risks (2023)</w:t>
       </w:r>
     </w:p>
     <w:p>
       <w:pPr>
-        <w:spacing w:after="80" w:line="288" w:lineRule="auto"/>
+        <w:spacing w:after="80" w:line="312" w:lineRule="auto"/>
         <w:jc w:val="both"/>
       </w:pPr>
       <w:r>
         <w:rPr>
-          <w:b w:val="0"/>
           <w:i w:val="0"/>
+          <w:sz w:val="26"/>
         </w:rPr>
         <w:t>Theo công bố chính thức từ tổ chức an toàn thông tin uy tín thế giới OWASP trong tài liệu OWASP Top 10 API Security Risks 2023 [Ref 06], các cuộc tấn công nhắm vào Web API ngày càng trở nên tinh vi và có tổ chức. Đồ án tập trung nghiên cứu và xây dựng giải pháp phòng thủ cho 4 nhóm hiểm họa nghiêm trọng nhất:</w:t>
       </w:r>
@@ -144,2466 +141,2284 @@
     <w:p>
       <w:pPr>
         <w:pStyle w:val="ListBullet"/>
-        <w:spacing w:after="60" w:line="276" w:lineRule="auto"/>
+        <w:spacing w:after="60" w:line="312" w:lineRule="auto"/>
         <w:jc w:val="both"/>
       </w:pPr>
       <w:r>
         <w:rPr>
           <w:b/>
           <w:color w:val="111827"/>
+          <w:sz w:val="26"/>
         </w:rPr>
         <w:t xml:space="preserve">1. Các lỗ hổng tiêm mã độc (Injection Vulnerabilities): </w:t>
       </w:r>
       <w:r>
+        <w:rPr>
+          <w:sz w:val="26"/>
+        </w:rPr>
         <w:t>Bao gồm SQL Injection (In-band, Error-based, Time-based Blind SQLi [Ref 10]), OS Command Injection thực thi shellcode trực tiếp, và Path Traversal đọc tệp tin cấu hình nhạy cảm. Kẻ tấn công lợi dụng dữ liệu đầu vào chưa được kiểm duyệt để thay đổi logic truy vấn hoặc chiếm toàn quyền điều khiển hệ điều hành máy chủ.</w:t>
       </w:r>
     </w:p>
     <w:p>
       <w:pPr>
         <w:pStyle w:val="ListBullet"/>
-        <w:spacing w:after="60" w:line="276" w:lineRule="auto"/>
+        <w:spacing w:after="60" w:line="312" w:lineRule="auto"/>
         <w:jc w:val="both"/>
       </w:pPr>
       <w:r>
         <w:rPr>
           <w:b/>
           <w:color w:val="111827"/>
+          <w:sz w:val="26"/>
         </w:rPr>
         <w:t xml:space="preserve">2. Tấn công Cross-Site Scripting (XSS): </w:t>
       </w:r>
       <w:r>
+        <w:rPr>
+          <w:sz w:val="26"/>
+        </w:rPr>
         <w:t>Mặc dù API chủ yếu trả về dữ liệu JSON, nhưng các trường dữ liệu do API phản hồi thường được render trực tiếp lên trình duyệt của người dùng cuối trong các ứng dụng SPA (React, Vue, Next.js). Khi kẻ tấn công chèn thành công các payload chứa mã JavaScript nguy hại (&lt;script&gt;, &lt;img onerror=...&gt;) qua API, mã độc sẽ thực thi trong ngữ cảnh phiên nạn nhân, dẫn đến nguy cơ đánh cắp token JWT, session cookies hoặc chiếm đoạt tài khoản.</w:t>
       </w:r>
     </w:p>
     <w:p>
       <w:pPr>
         <w:pStyle w:val="ListBullet"/>
-        <w:spacing w:after="60" w:line="276" w:lineRule="auto"/>
+        <w:spacing w:after="60" w:line="312" w:lineRule="auto"/>
         <w:jc w:val="both"/>
       </w:pPr>
       <w:r>
         <w:rPr>
           <w:b/>
           <w:color w:val="111827"/>
+          <w:sz w:val="26"/>
         </w:rPr>
-        <w:t xml:space="preserve">3. Phá vỡ kiểm soát phân quyền mức đối tượng (BOLA / IDOR - API1:2023): </w:t>
+        <w:t xml:space="preserve">3. Phá vỡ kiểm soát phân quyền mức đối tượng (Broken Object Level Authorization - BOLA / IDOR - API1:2023): </w:t>
       </w:r>
       <w:r>
-        <w:t>Lỗ hổng logic nghiệp vụ đứng số 1 về mức độ phổ biến, xảy ra khi máy chủ API không kiểm tra xem người dùng hiện tại có quyền thao tác trên mã đối tượng trong URL hay không (ví dụ: đổi /orders/1 thành /orders/2). Các bộ lọc chữ ký regex truyền thống hoàn toàn bất lực trước loại lỗ hổng logic này [Ref 06].</w:t>
+        <w:rPr>
+          <w:sz w:val="26"/>
+        </w:rPr>
+        <w:t>Là lỗ hổng phổ biến và nguy hiểm nhất trên các Web API hiện đại. Kẻ tấn công thao túng định danh tài nguyên (ID) trong URI hoặc payload JSON để truy cập trái phép dữ liệu của người dùng khác do backend thiếu sót trong việc kiểm tra quyền sở hữu đối tượng trước khi xử lý nghiệp vụ.</w:t>
       </w:r>
     </w:p>
     <w:p>
       <w:pPr>
         <w:pStyle w:val="ListBullet"/>
-        <w:spacing w:after="60" w:line="276" w:lineRule="auto"/>
+        <w:spacing w:after="60" w:line="312" w:lineRule="auto"/>
         <w:jc w:val="both"/>
       </w:pPr>
       <w:r>
         <w:rPr>
           <w:b/>
           <w:color w:val="111827"/>
+          <w:sz w:val="26"/>
         </w:rPr>
-        <w:t xml:space="preserve">4. Tiêu thụ tài nguyên không hạn chế (Unrestricted Resource Consumption - API4:2023): </w:t>
+        <w:t xml:space="preserve">4. Tiêu thụ tài nguyên không kiểm soát (Unrestricted Resource Consumption - API4:2023): </w:t>
       </w:r>
       <w:r>
-        <w:t>Các cuộc tấn công dò quét tự động (Brute-force mật khẩu, Credential Stuffing) hoặc vét cạn tài nguyên máy chủ Layer 7 DoS. Nếu không có cơ chế giới hạn tần suất (Rate Limiting) theo cửa sổ trượt, hệ thống sẽ nhanh chóng tê liệt CPU, RAM và kết nối cơ sở dữ liệu [Ref 05, Ref 06].</w:t>
+        <w:rPr>
+          <w:sz w:val="26"/>
+        </w:rPr>
+        <w:t>Kẻ tấn công gửi liên tục lượng lớn request hoặc thực hiện các truy vấn dữ liệu nặng nhằm làm cạn kiệt CPU, RAM, băng thông mạng hoặc kết nối CSDL của máy chủ, dẫn đến tình trạng từ chối dịch vụ (Denial of Service - DoS), gây tê liệt các dịch vụ trọng yếu.</w:t>
       </w:r>
     </w:p>
     <w:p>
       <w:pPr>
-        <w:keepNext/>
-        <w:spacing w:before="200" w:after="80"/>
-      </w:pPr>
-      <w:r>
-        <w:rPr>
-          <w:b/>
-          <w:color w:val="1E3A8A"/>
-          <w:sz w:val="24"/>
-        </w:rPr>
-        <w:t>1.1.3. Các kỹ thuật làm mờ payload và né tránh tường lửa (WAF Evasion &amp; Obfuscation Techniques)</w:t>
-      </w:r>
-    </w:p>
-    <w:p>
-      <w:pPr>
-        <w:spacing w:after="80" w:line="288" w:lineRule="auto"/>
-        <w:jc w:val="both"/>
-      </w:pPr>
-      <w:r>
-        <w:rPr>
-          <w:b w:val="0"/>
-          <w:i w:val="0"/>
-        </w:rPr>
-        <w:t>Theo giáo trình kiểm thử xâm nhập chuẩn quốc tế CompTIA PenTest+ Study Guide [Ref 04], trong bối cảnh các hệ thống tường lửa ứng dụng web truyền thống phụ thuộc nặng nề vào các tập luật kiểm tra mẫu chuỗi (Regex Pattern Matching), kẻ tấn công hiện đại áp dụng các kỹ thuật làm mờ payload (Obfuscation) cực kỳ phức tạp để vượt rào (WAF Evasion):</w:t>
-      </w:r>
-    </w:p>
-    <w:tbl>
-      <w:tblPr>
-        <w:tblW w:type="auto" w:w="0"/>
-        <w:jc w:val="center"/>
-        <w:tblLook w:firstColumn="1" w:firstRow="1" w:lastColumn="0" w:lastRow="0" w:noHBand="0" w:noVBand="1" w:val="04A0"/>
-      </w:tblPr>
-      <w:tblGrid>
-        <w:gridCol w:w="2340"/>
-        <w:gridCol w:w="2340"/>
-        <w:gridCol w:w="2340"/>
-        <w:gridCol w:w="2340"/>
-      </w:tblGrid>
-      <w:tr>
-        <w:tc>
-          <w:tcPr>
-            <w:tcW w:type="dxa" w:w="2340"/>
-            <w:shd w:fill="0F766E"/>
-            <w:tcMar>
-              <w:top w:w="140" w:type="dxa"/>
-              <w:bottom w:w="140" w:type="dxa"/>
-              <w:left w:w="140" w:type="dxa"/>
-              <w:right w:w="140" w:type="dxa"/>
-            </w:tcMar>
-          </w:tcPr>
-          <w:p>
-            <w:r>
-              <w:rPr>
-                <w:b/>
-                <w:color w:val="FFFFFF"/>
-                <w:sz w:val="20"/>
-              </w:rPr>
-              <w:t>Kỹ Thuật Né Tránh</w:t>
-            </w:r>
-          </w:p>
-        </w:tc>
-        <w:tc>
-          <w:tcPr>
-            <w:tcW w:type="dxa" w:w="2340"/>
-            <w:shd w:fill="0F766E"/>
-            <w:tcMar>
-              <w:top w:w="140" w:type="dxa"/>
-              <w:bottom w:w="140" w:type="dxa"/>
-              <w:left w:w="140" w:type="dxa"/>
-              <w:right w:w="140" w:type="dxa"/>
-            </w:tcMar>
-          </w:tcPr>
-          <w:p>
-            <w:r>
-              <w:rPr>
-                <w:b/>
-                <w:color w:val="FFFFFF"/>
-                <w:sz w:val="20"/>
-              </w:rPr>
-              <w:t>Cơ Chế Bản Chất</w:t>
-            </w:r>
-          </w:p>
-        </w:tc>
-        <w:tc>
-          <w:tcPr>
-            <w:tcW w:type="dxa" w:w="2340"/>
-            <w:shd w:fill="0F766E"/>
-            <w:tcMar>
-              <w:top w:w="140" w:type="dxa"/>
-              <w:bottom w:w="140" w:type="dxa"/>
-              <w:left w:w="140" w:type="dxa"/>
-              <w:right w:w="140" w:type="dxa"/>
-            </w:tcMar>
-          </w:tcPr>
-          <w:p>
-            <w:r>
-              <w:rPr>
-                <w:b/>
-                <w:color w:val="FFFFFF"/>
-                <w:sz w:val="20"/>
-              </w:rPr>
-              <w:t>Ví Dụ Minh Họa</w:t>
-            </w:r>
-          </w:p>
-        </w:tc>
-        <w:tc>
-          <w:tcPr>
-            <w:tcW w:type="dxa" w:w="2340"/>
-            <w:shd w:fill="0F766E"/>
-            <w:tcMar>
-              <w:top w:w="140" w:type="dxa"/>
-              <w:bottom w:w="140" w:type="dxa"/>
-              <w:left w:w="140" w:type="dxa"/>
-              <w:right w:w="140" w:type="dxa"/>
-            </w:tcMar>
-          </w:tcPr>
-          <w:p>
-            <w:r>
-              <w:rPr>
-                <w:b/>
-                <w:color w:val="FFFFFF"/>
-                <w:sz w:val="20"/>
-              </w:rPr>
-              <w:t>Hậu Quả Đối Với WAF Truyền Thống</w:t>
-            </w:r>
-          </w:p>
-        </w:tc>
-      </w:tr>
-      <w:tr>
-        <w:tc>
-          <w:tcPr>
-            <w:tcW w:type="dxa" w:w="2340"/>
-            <w:shd w:fill="FFFFFF"/>
-            <w:tcMar>
-              <w:top w:w="100" w:type="dxa"/>
-              <w:bottom w:w="100" w:type="dxa"/>
-              <w:left w:w="120" w:type="dxa"/>
-              <w:right w:w="120" w:type="dxa"/>
-            </w:tcMar>
-          </w:tcPr>
-          <w:p>
-            <w:r>
-              <w:rPr>
-                <w:sz w:val="19"/>
-              </w:rPr>
-              <w:t>Mã hóa URL đa tầng (Double URL Encoding)</w:t>
-            </w:r>
-          </w:p>
-        </w:tc>
-        <w:tc>
-          <w:tcPr>
-            <w:tcW w:type="dxa" w:w="2340"/>
-            <w:shd w:fill="FFFFFF"/>
-            <w:tcMar>
-              <w:top w:w="100" w:type="dxa"/>
-              <w:bottom w:w="100" w:type="dxa"/>
-              <w:left w:w="120" w:type="dxa"/>
-              <w:right w:w="120" w:type="dxa"/>
-            </w:tcMar>
-          </w:tcPr>
-          <w:p>
-            <w:r>
-              <w:rPr>
-                <w:sz w:val="19"/>
-              </w:rPr>
-              <w:t>Mã hóa ký tự % thành %25 (dấu ' thành %27 rồi %2527)</w:t>
-            </w:r>
-          </w:p>
-        </w:tc>
-        <w:tc>
-          <w:tcPr>
-            <w:tcW w:type="dxa" w:w="2340"/>
-            <w:shd w:fill="FFFFFF"/>
-            <w:tcMar>
-              <w:top w:w="100" w:type="dxa"/>
-              <w:bottom w:w="100" w:type="dxa"/>
-              <w:left w:w="120" w:type="dxa"/>
-              <w:right w:w="120" w:type="dxa"/>
-            </w:tcMar>
-          </w:tcPr>
-          <w:p>
-            <w:r>
-              <w:rPr>
-                <w:sz w:val="19"/>
-              </w:rPr>
-              <w:t>%2527%20OR%20%2531%253D%2531</w:t>
-            </w:r>
-          </w:p>
-        </w:tc>
-        <w:tc>
-          <w:tcPr>
-            <w:tcW w:type="dxa" w:w="2340"/>
-            <w:shd w:fill="FFFFFF"/>
-            <w:tcMar>
-              <w:top w:w="100" w:type="dxa"/>
-              <w:bottom w:w="100" w:type="dxa"/>
-              <w:left w:w="120" w:type="dxa"/>
-              <w:right w:w="120" w:type="dxa"/>
-            </w:tcMar>
-          </w:tcPr>
-          <w:p>
-            <w:r>
-              <w:rPr>
-                <w:sz w:val="19"/>
-              </w:rPr>
-              <w:t>WAF chỉ giải mã 1 lần thành %27 và bỏ qua; backend giải mã lần 2 kích hoạt SQLi.</w:t>
-            </w:r>
-          </w:p>
-        </w:tc>
-      </w:tr>
-      <w:tr>
-        <w:tc>
-          <w:tcPr>
-            <w:tcW w:type="dxa" w:w="2340"/>
-            <w:shd w:fill="F9FAFB"/>
-            <w:tcMar>
-              <w:top w:w="100" w:type="dxa"/>
-              <w:bottom w:w="100" w:type="dxa"/>
-              <w:left w:w="120" w:type="dxa"/>
-              <w:right w:w="120" w:type="dxa"/>
-            </w:tcMar>
-          </w:tcPr>
-          <w:p>
-            <w:r>
-              <w:rPr>
-                <w:sz w:val="19"/>
-              </w:rPr>
-              <w:t>Chèn chú thích nội tuyến (Inline Comments)</w:t>
-            </w:r>
-          </w:p>
-        </w:tc>
-        <w:tc>
-          <w:tcPr>
-            <w:tcW w:type="dxa" w:w="2340"/>
-            <w:shd w:fill="F9FAFB"/>
-            <w:tcMar>
-              <w:top w:w="100" w:type="dxa"/>
-              <w:bottom w:w="100" w:type="dxa"/>
-              <w:left w:w="120" w:type="dxa"/>
-              <w:right w:w="120" w:type="dxa"/>
-            </w:tcMar>
-          </w:tcPr>
-          <w:p>
-            <w:r>
-              <w:rPr>
-                <w:sz w:val="19"/>
-              </w:rPr>
-              <w:t>Chèn comment vô hại vào giữa từ khóa nhạy cảm</w:t>
-            </w:r>
-          </w:p>
-        </w:tc>
-        <w:tc>
-          <w:tcPr>
-            <w:tcW w:type="dxa" w:w="2340"/>
-            <w:shd w:fill="F9FAFB"/>
-            <w:tcMar>
-              <w:top w:w="100" w:type="dxa"/>
-              <w:bottom w:w="100" w:type="dxa"/>
-              <w:left w:w="120" w:type="dxa"/>
-              <w:right w:w="120" w:type="dxa"/>
-            </w:tcMar>
-          </w:tcPr>
-          <w:p>
-            <w:r>
-              <w:rPr>
-                <w:sz w:val="19"/>
-              </w:rPr>
-              <w:t>UN/**/ION/**/SEL/**/ECT</w:t>
-            </w:r>
-          </w:p>
-        </w:tc>
-        <w:tc>
-          <w:tcPr>
-            <w:tcW w:type="dxa" w:w="2340"/>
-            <w:shd w:fill="F9FAFB"/>
-            <w:tcMar>
-              <w:top w:w="100" w:type="dxa"/>
-              <w:bottom w:w="100" w:type="dxa"/>
-              <w:left w:w="120" w:type="dxa"/>
-              <w:right w:w="120" w:type="dxa"/>
-            </w:tcMar>
-          </w:tcPr>
-          <w:p>
-            <w:r>
-              <w:rPr>
-                <w:sz w:val="19"/>
-              </w:rPr>
-              <w:t>Làm đứt gãy mẫu chuỗi regex chuẩn UNION.*SELECT.</w:t>
-            </w:r>
-          </w:p>
-        </w:tc>
-      </w:tr>
-      <w:tr>
-        <w:tc>
-          <w:tcPr>
-            <w:tcW w:type="dxa" w:w="2340"/>
-            <w:shd w:fill="FFFFFF"/>
-            <w:tcMar>
-              <w:top w:w="100" w:type="dxa"/>
-              <w:bottom w:w="100" w:type="dxa"/>
-              <w:left w:w="120" w:type="dxa"/>
-              <w:right w:w="120" w:type="dxa"/>
-            </w:tcMar>
-          </w:tcPr>
-          <w:p>
-            <w:r>
-              <w:rPr>
-                <w:sz w:val="19"/>
-              </w:rPr>
-              <w:t>Biến đổi chữ hoa/thường xen kẽ</w:t>
-            </w:r>
-          </w:p>
-        </w:tc>
-        <w:tc>
-          <w:tcPr>
-            <w:tcW w:type="dxa" w:w="2340"/>
-            <w:shd w:fill="FFFFFF"/>
-            <w:tcMar>
-              <w:top w:w="100" w:type="dxa"/>
-              <w:bottom w:w="100" w:type="dxa"/>
-              <w:left w:w="120" w:type="dxa"/>
-              <w:right w:w="120" w:type="dxa"/>
-            </w:tcMar>
-          </w:tcPr>
-          <w:p>
-            <w:r>
-              <w:rPr>
-                <w:sz w:val="19"/>
-              </w:rPr>
-              <w:t>Thay đổi ngẫu nhiên trạng thái hoa thường không chuẩn hóa</w:t>
-            </w:r>
-          </w:p>
-        </w:tc>
-        <w:tc>
-          <w:tcPr>
-            <w:tcW w:type="dxa" w:w="2340"/>
-            <w:shd w:fill="FFFFFF"/>
-            <w:tcMar>
-              <w:top w:w="100" w:type="dxa"/>
-              <w:bottom w:w="100" w:type="dxa"/>
-              <w:left w:w="120" w:type="dxa"/>
-              <w:right w:w="120" w:type="dxa"/>
-            </w:tcMar>
-          </w:tcPr>
-          <w:p>
-            <w:r>
-              <w:rPr>
-                <w:sz w:val="19"/>
-              </w:rPr>
-              <w:t>sElEcT, &lt;sCrIpt&gt;, uNiOn</w:t>
-            </w:r>
-          </w:p>
-        </w:tc>
-        <w:tc>
-          <w:tcPr>
-            <w:tcW w:type="dxa" w:w="2340"/>
-            <w:shd w:fill="FFFFFF"/>
-            <w:tcMar>
-              <w:top w:w="100" w:type="dxa"/>
-              <w:bottom w:w="100" w:type="dxa"/>
-              <w:left w:w="120" w:type="dxa"/>
-              <w:right w:w="120" w:type="dxa"/>
-            </w:tcMar>
-          </w:tcPr>
-          <w:p>
-            <w:r>
-              <w:rPr>
-                <w:sz w:val="19"/>
-              </w:rPr>
-              <w:t>Vượt qua regex không thiết lập cờ IGNORECASE.</w:t>
-            </w:r>
-          </w:p>
-        </w:tc>
-      </w:tr>
-      <w:tr>
-        <w:tc>
-          <w:tcPr>
-            <w:tcW w:type="dxa" w:w="2340"/>
-            <w:shd w:fill="F9FAFB"/>
-            <w:tcMar>
-              <w:top w:w="100" w:type="dxa"/>
-              <w:bottom w:w="100" w:type="dxa"/>
-              <w:left w:w="120" w:type="dxa"/>
-              <w:right w:w="120" w:type="dxa"/>
-            </w:tcMar>
-          </w:tcPr>
-          <w:p>
-            <w:r>
-              <w:rPr>
-                <w:sz w:val="19"/>
-              </w:rPr>
-              <w:t>Ký tự khoảng trắng thay thế</w:t>
-            </w:r>
-          </w:p>
-        </w:tc>
-        <w:tc>
-          <w:tcPr>
-            <w:tcW w:type="dxa" w:w="2340"/>
-            <w:shd w:fill="F9FAFB"/>
-            <w:tcMar>
-              <w:top w:w="100" w:type="dxa"/>
-              <w:bottom w:w="100" w:type="dxa"/>
-              <w:left w:w="120" w:type="dxa"/>
-              <w:right w:w="120" w:type="dxa"/>
-            </w:tcMar>
-          </w:tcPr>
-          <w:p>
-            <w:r>
-              <w:rPr>
-                <w:sz w:val="19"/>
-              </w:rPr>
-              <w:t>Dùng ký tự shell/SQL thay thế dấu cách (0x20)</w:t>
-            </w:r>
-          </w:p>
-        </w:tc>
-        <w:tc>
-          <w:tcPr>
-            <w:tcW w:type="dxa" w:w="2340"/>
-            <w:shd w:fill="F9FAFB"/>
-            <w:tcMar>
-              <w:top w:w="100" w:type="dxa"/>
-              <w:bottom w:w="100" w:type="dxa"/>
-              <w:left w:w="120" w:type="dxa"/>
-              <w:right w:w="120" w:type="dxa"/>
-            </w:tcMar>
-          </w:tcPr>
-          <w:p>
-            <w:r>
-              <w:rPr>
-                <w:sz w:val="19"/>
-              </w:rPr>
-              <w:t>$IFS$9 trong Bash; /**/, +, %09 (Tab)</w:t>
-            </w:r>
-          </w:p>
-        </w:tc>
-        <w:tc>
-          <w:tcPr>
-            <w:tcW w:type="dxa" w:w="2340"/>
-            <w:shd w:fill="F9FAFB"/>
-            <w:tcMar>
-              <w:top w:w="100" w:type="dxa"/>
-              <w:bottom w:w="100" w:type="dxa"/>
-              <w:left w:w="120" w:type="dxa"/>
-              <w:right w:w="120" w:type="dxa"/>
-            </w:tcMar>
-          </w:tcPr>
-          <w:p>
-            <w:r>
-              <w:rPr>
-                <w:sz w:val="19"/>
-              </w:rPr>
-              <w:t>Vượt qua các bộ luật kiểm tra khoảng cách chuẩn giữa mệnh đề.</w:t>
-            </w:r>
-          </w:p>
-        </w:tc>
-      </w:tr>
-      <w:tr>
-        <w:tc>
-          <w:tcPr>
-            <w:tcW w:type="dxa" w:w="2340"/>
-            <w:shd w:fill="FFFFFF"/>
-            <w:tcMar>
-              <w:top w:w="100" w:type="dxa"/>
-              <w:bottom w:w="100" w:type="dxa"/>
-              <w:left w:w="120" w:type="dxa"/>
-              <w:right w:w="120" w:type="dxa"/>
-            </w:tcMar>
-          </w:tcPr>
-          <w:p>
-            <w:r>
-              <w:rPr>
-                <w:sz w:val="19"/>
-              </w:rPr>
-              <w:t>Ký tự NULL Byte Injection</w:t>
-            </w:r>
-          </w:p>
-        </w:tc>
-        <w:tc>
-          <w:tcPr>
-            <w:tcW w:type="dxa" w:w="2340"/>
-            <w:shd w:fill="FFFFFF"/>
-            <w:tcMar>
-              <w:top w:w="100" w:type="dxa"/>
-              <w:bottom w:w="100" w:type="dxa"/>
-              <w:left w:w="120" w:type="dxa"/>
-              <w:right w:w="120" w:type="dxa"/>
-            </w:tcMar>
-          </w:tcPr>
-          <w:p>
-            <w:r>
-              <w:rPr>
-                <w:sz w:val="19"/>
-              </w:rPr>
-              <w:t>Chèn ký tự kết thúc chuỗi \x00 hoặc %00</w:t>
-            </w:r>
-          </w:p>
-        </w:tc>
-        <w:tc>
-          <w:tcPr>
-            <w:tcW w:type="dxa" w:w="2340"/>
-            <w:shd w:fill="FFFFFF"/>
-            <w:tcMar>
-              <w:top w:w="100" w:type="dxa"/>
-              <w:bottom w:w="100" w:type="dxa"/>
-              <w:left w:w="120" w:type="dxa"/>
-              <w:right w:w="120" w:type="dxa"/>
-            </w:tcMar>
-          </w:tcPr>
-          <w:p>
-            <w:r>
-              <w:rPr>
-                <w:sz w:val="19"/>
-              </w:rPr>
-              <w:t>../../etc/passwd%00.jpg</w:t>
-            </w:r>
-          </w:p>
-        </w:tc>
-        <w:tc>
-          <w:tcPr>
-            <w:tcW w:type="dxa" w:w="2340"/>
-            <w:shd w:fill="FFFFFF"/>
-            <w:tcMar>
-              <w:top w:w="100" w:type="dxa"/>
-              <w:bottom w:w="100" w:type="dxa"/>
-              <w:left w:w="120" w:type="dxa"/>
-              <w:right w:w="120" w:type="dxa"/>
-            </w:tcMar>
-          </w:tcPr>
-          <w:p>
-            <w:r>
-              <w:rPr>
-                <w:sz w:val="19"/>
-              </w:rPr>
-              <w:t>Lừa hàm kiểm tra đuôi mở rộng file ở C/C++, cắt cụt chuỗi kiểm tra.</w:t>
-            </w:r>
-          </w:p>
-        </w:tc>
-      </w:tr>
-      <w:tr>
-        <w:tc>
-          <w:tcPr>
-            <w:tcW w:type="dxa" w:w="2340"/>
-            <w:shd w:fill="F9FAFB"/>
-            <w:tcMar>
-              <w:top w:w="100" w:type="dxa"/>
-              <w:bottom w:w="100" w:type="dxa"/>
-              <w:left w:w="120" w:type="dxa"/>
-              <w:right w:w="120" w:type="dxa"/>
-            </w:tcMar>
-          </w:tcPr>
-          <w:p>
-            <w:r>
-              <w:rPr>
-                <w:sz w:val="19"/>
-              </w:rPr>
-              <w:t>Thực thi lệnh gián tiếp &amp; Đa hình</w:t>
-            </w:r>
-          </w:p>
-        </w:tc>
-        <w:tc>
-          <w:tcPr>
-            <w:tcW w:type="dxa" w:w="2340"/>
-            <w:shd w:fill="F9FAFB"/>
-            <w:tcMar>
-              <w:top w:w="100" w:type="dxa"/>
-              <w:bottom w:w="100" w:type="dxa"/>
-              <w:left w:w="120" w:type="dxa"/>
-              <w:right w:w="120" w:type="dxa"/>
-            </w:tcMar>
-          </w:tcPr>
-          <w:p>
-            <w:r>
-              <w:rPr>
-                <w:sz w:val="19"/>
-              </w:rPr>
-              <w:t>Tận dụng biến môi trường, nối chuỗi và subshell</w:t>
-            </w:r>
-          </w:p>
-        </w:tc>
-        <w:tc>
-          <w:tcPr>
-            <w:tcW w:type="dxa" w:w="2340"/>
-            <w:shd w:fill="F9FAFB"/>
-            <w:tcMar>
-              <w:top w:w="100" w:type="dxa"/>
-              <w:bottom w:w="100" w:type="dxa"/>
-              <w:left w:w="120" w:type="dxa"/>
-              <w:right w:w="120" w:type="dxa"/>
-            </w:tcMar>
-          </w:tcPr>
-          <w:p>
-            <w:r>
-              <w:rPr>
-                <w:sz w:val="19"/>
-              </w:rPr>
-              <w:t>c''a""t /e*c/pas*wd, $(echo Y2F0...|base64 -d)</w:t>
-            </w:r>
-          </w:p>
-        </w:tc>
-        <w:tc>
-          <w:tcPr>
-            <w:tcW w:type="dxa" w:w="2340"/>
-            <w:shd w:fill="F9FAFB"/>
-            <w:tcMar>
-              <w:top w:w="100" w:type="dxa"/>
-              <w:bottom w:w="100" w:type="dxa"/>
-              <w:left w:w="120" w:type="dxa"/>
-              <w:right w:w="120" w:type="dxa"/>
-            </w:tcMar>
-          </w:tcPr>
-          <w:p>
-            <w:r>
-              <w:rPr>
-                <w:sz w:val="19"/>
-              </w:rPr>
-              <w:t>Không chứa bất kỳ từ khóa tĩnh nào trong payload, vô hiệu hóa chữ ký tĩnh.</w:t>
-            </w:r>
-          </w:p>
-        </w:tc>
-      </w:tr>
-    </w:tbl>
-    <w:p>
-      <w:pPr>
-        <w:spacing w:after="120"/>
-      </w:pPr>
-    </w:p>
-    <w:p>
-      <w:pPr>
-        <w:keepNext/>
         <w:spacing w:before="280" w:after="120"/>
       </w:pPr>
       <w:r>
         <w:rPr>
           <w:b/>
           <w:color w:val="0F766E"/>
-          <w:sz w:val="28"/>
+          <w:sz w:val="30"/>
         </w:rPr>
-        <w:t>1.2. CƠ CHẾ HOẠT ĐỘNG CỦA TƯỜNG LỬA ỨNG DỤNG WEB (WAF) VÀ GIỚI HẠN CỦA PHƯƠNG PHÁP TRUYỀN THỐNG</w:t>
+        <w:t>1.2. CƠ SỞ LÝ THUYẾT VỀ TƯỜNG LỬA ỨNG DỤNG WEB (WAF) VÀ HỆ THỐNG LUẬT CHỮ KÝ</w:t>
       </w:r>
     </w:p>
     <w:p>
       <w:pPr>
-        <w:keepNext/>
         <w:spacing w:before="200" w:after="80"/>
       </w:pPr>
       <w:r>
         <w:rPr>
           <w:b/>
-          <w:color w:val="1E3A8A"/>
-          <w:sz w:val="24"/>
+          <w:color w:val="1E40AF"/>
+          <w:sz w:val="27"/>
         </w:rPr>
-        <w:t>1.2.1. Phân loại thế hệ Tường lửa và Nguyên lý Cổng tầng ứng dụng (Application-Level Gateway)</w:t>
+        <w:t>1.2.1. Kiến trúc Cổng tầng ứng dụng (Application-Level Gateway) và Reverse Proxy</w:t>
       </w:r>
     </w:p>
     <w:p>
       <w:pPr>
-        <w:spacing w:after="80" w:line="288" w:lineRule="auto"/>
+        <w:spacing w:after="80" w:line="312" w:lineRule="auto"/>
         <w:jc w:val="both"/>
       </w:pPr>
       <w:r>
         <w:rPr>
-          <w:b w:val="0"/>
           <w:i w:val="0"/>
+          <w:sz w:val="26"/>
         </w:rPr>
-        <w:t>Trong công trình giáo trình kinh điển Cryptography and Network Security: Principles and Practice (Chương 20: Firewalls) [Ref 01], Giáo sư William Stallings đã hệ thống hóa tường lửa thành ba thế hệ công nghệ tiến hóa:</w:t>
+        <w:t>Theo giáo trình kinh điển Cryptography and Network Security của William Stallings (Pearson / Prentice Hall) [Ref 01], hệ thống tường lửa (Firewall) được phân loại thành ba thế hệ chính:</w:t>
       </w:r>
     </w:p>
     <w:p>
       <w:pPr>
         <w:pStyle w:val="ListBullet"/>
-        <w:spacing w:after="60" w:line="276" w:lineRule="auto"/>
+        <w:spacing w:after="60" w:line="312" w:lineRule="auto"/>
         <w:jc w:val="both"/>
       </w:pPr>
       <w:r>
         <w:rPr>
           <w:b/>
           <w:color w:val="111827"/>
+          <w:sz w:val="26"/>
         </w:rPr>
         <w:t xml:space="preserve">1. Bộ lọc gói tin (Packet Filtering Firewall): </w:t>
       </w:r>
       <w:r>
-        <w:t>Hoạt động ở tầng Mạng và Vận chuyển (Layer 3 &amp; 4), chỉ kiểm tra IP và cổng TCP/UDP mà không hiểu nội dung ứng dụng.</w:t>
+        <w:rPr>
+          <w:sz w:val="26"/>
+        </w:rPr>
+        <w:t>Hoạt động tại tầng Network/Transport (Layer 3/4), chỉ kiểm tra địa chỉ IP, cổng (Port) và cờ TCP mà không hiểu được nội dung bên trong gói tin.</w:t>
       </w:r>
     </w:p>
     <w:p>
       <w:pPr>
         <w:pStyle w:val="ListBullet"/>
-        <w:spacing w:after="60" w:line="276" w:lineRule="auto"/>
+        <w:spacing w:after="60" w:line="312" w:lineRule="auto"/>
         <w:jc w:val="both"/>
       </w:pPr>
       <w:r>
         <w:rPr>
           <w:b/>
           <w:color w:val="111827"/>
+          <w:sz w:val="26"/>
         </w:rPr>
-        <w:t xml:space="preserve">2. Bộ lọc trạng thái (Stateful Inspection Firewall): </w:t>
+        <w:t xml:space="preserve">2. Tường lửa trạng thái (Stateful Inspection Firewall): </w:t>
       </w:r>
       <w:r>
-        <w:t>Theo dõi trạng thái kết nối TCP (SYN, ACK, ESTABLISHED) ngăn gói tin giả mạo phiên.</w:t>
+        <w:rPr>
+          <w:sz w:val="26"/>
+        </w:rPr>
+        <w:t>Theo dõi bảng trạng thái của các luồng kết nối TCP/UDP nhưng vẫn bị giới hạn về khả năng bóc tách payload ứng dụng.</w:t>
       </w:r>
     </w:p>
     <w:p>
       <w:pPr>
         <w:pStyle w:val="ListBullet"/>
-        <w:spacing w:after="60" w:line="276" w:lineRule="auto"/>
+        <w:spacing w:after="60" w:line="312" w:lineRule="auto"/>
         <w:jc w:val="both"/>
       </w:pPr>
       <w:r>
         <w:rPr>
           <w:b/>
           <w:color w:val="111827"/>
+          <w:sz w:val="26"/>
         </w:rPr>
-        <w:t xml:space="preserve">3. Cổng tầng ứng dụng (Application-Level Gateway / Reverse Proxy WAF): </w:t>
+        <w:t xml:space="preserve">3. Cổng tầng ứng dụng (Application-Level Gateway / Reverse Proxy): </w:t>
       </w:r>
       <w:r>
-        <w:t>Là thế hệ tường lửa tiên tiến nhất, hoạt động như một Relay Proxy hoàn chỉnh ở Layer 7. Cổng tiếp nhận toàn bộ kết nối TCP từ máy khách, giải nén và tái cấu trúc hoàn chỉnh giao thức HTTP/HTTPS, kiểm tra toàn diện Payload trước khi chuyển tiếp về máy chủ nội bộ.</w:t>
+        <w:rPr>
+          <w:sz w:val="26"/>
+        </w:rPr>
+        <w:t>Đóng vai trò máy chủ trung gian (Proxy) đứng trước hệ thống backend thực tế. Nó chủ động đón nhận toàn bộ kết nối TCP từ máy khách, phân tích toàn diện giao thức tầng ứng dụng (HTTP/HTTPS), giải mã nội dung (URI, Headers, Body) và thực thi chính sách an ninh trước khi quyết định chuyển tiếp (forward) request đến cụm máy chủ nội bộ.</w:t>
       </w:r>
     </w:p>
     <w:p>
       <w:pPr>
-        <w:spacing w:after="80" w:line="288" w:lineRule="auto"/>
+        <w:spacing w:after="80" w:line="312" w:lineRule="auto"/>
         <w:jc w:val="both"/>
       </w:pPr>
       <w:r>
         <w:rPr>
-          <w:b w:val="0"/>
           <w:i w:val="0"/>
+          <w:sz w:val="26"/>
         </w:rPr>
-        <w:t>Theo kiến trúc điều phối lưu lượng trong cuốn NGINX Cookbook [Ref 05], cơ chế Reverse Proxy WAF mang lại những lợi ích bảo mật vượt trội: ẩn giấu máy chủ gốc (Origin Cloaking), khử trùng tiêu đề giao thức (Hop-by-hop headers sanitization), và cho phép phân luồng kiểm tra chuyên sâu qua Normalizer, Rule Engine, ML Detector và Rate Limiter.</w:t>
+        <w:t>Đồ án PBL6 lựa chọn hiện thực hóa giải pháp WAF Security Gateway theo mô hình Reverse Proxy hiệu năng cao bám sát tiêu chuẩn vận hành trong NGINX Cookbook của Derek DeJonghe (O'Reilly Media) [Ref 05]. Mô hình này đảm bảo tính trong suốt hoàn toàn đối với máy khách bên ngoài, đồng thời che giấu hoàn toàn địa chỉ IP thực tế và cấu trúc mạng nội bộ của máy chủ backend.</w:t>
       </w:r>
     </w:p>
     <w:p>
       <w:pPr>
-        <w:keepNext/>
         <w:spacing w:before="200" w:after="80"/>
       </w:pPr>
       <w:r>
         <w:rPr>
           <w:b/>
-          <w:color w:val="1E3A8A"/>
-          <w:sz w:val="24"/>
+          <w:color w:val="1E40AF"/>
+          <w:sz w:val="27"/>
         </w:rPr>
-        <w:t>1.2.2. Cơ chế chấm điểm bất thường lũy tiến (Anomaly Scoring System)</w:t>
+        <w:t>1.2.2. Cơ chế đối sánh luật chữ ký và giải mã chuẩn hóa (Normalization)</w:t>
       </w:r>
     </w:p>
     <w:p>
       <w:pPr>
-        <w:spacing w:after="80" w:line="288" w:lineRule="auto"/>
+        <w:spacing w:after="80" w:line="312" w:lineRule="auto"/>
         <w:jc w:val="both"/>
       </w:pPr>
       <w:r>
         <w:rPr>
-          <w:b w:val="0"/>
           <w:i w:val="0"/>
+          <w:sz w:val="26"/>
         </w:rPr>
-        <w:t>Khác với phương thức chặn tức thời khi khớp một luật duy nhất (Single-Rule Blocking), chuẩn công nghiệp OWASP ModSecurity Core Rule Set (CRS v4.0) [Ref 07] áp dụng kiến trúc Collaborative Anomaly Scoring System. Mỗi quy tắc khi kích hoạt sẽ gán trọng số rủi ro tích lũy:</w:t>
+        <w:t>Một thách thức lớn trong việc bảo vệ Web API là kẻ tấn công thường áp dụng các kỹ thuật né tránh (Evasion Techniques) bằng cách mã hóa hoặc làm biến dạng payload độc hại: URL Encoding, Double URL Encoding, Unicode Fullwidth/Overlong Encoding, Base64 Encoding, hoặc chèn các ký tự rác (Null Byte, Comment Syntax).</w:t>
+      </w:r>
+    </w:p>
+    <w:p>
+      <w:pPr>
+        <w:spacing w:after="80" w:line="312" w:lineRule="auto"/>
+        <w:jc w:val="both"/>
+      </w:pPr>
+      <w:r>
+        <w:rPr>
+          <w:i w:val="0"/>
+          <w:sz w:val="26"/>
+        </w:rPr>
+        <w:t>Theo đặc tả tiêu chuẩn công nghiệp ModSecurity Core Rule Set (CRS v4.0.0) [Ref 07], WAF Security Gateway trong đồ án triển khai quy trình Chuẩn hóa dữ liệu nhiều giai đoạn (Multi-stage Normalization Pipeline):</w:t>
       </w:r>
     </w:p>
     <w:p>
       <w:pPr>
         <w:pStyle w:val="ListBullet"/>
-        <w:spacing w:after="60" w:line="276" w:lineRule="auto"/>
+        <w:spacing w:after="60" w:line="312" w:lineRule="auto"/>
         <w:jc w:val="both"/>
       </w:pPr>
       <w:r>
         <w:rPr>
           <w:b/>
           <w:color w:val="111827"/>
+          <w:sz w:val="26"/>
         </w:rPr>
-        <w:t xml:space="preserve">CRITICAL (+5 điểm): </w:t>
+        <w:t xml:space="preserve">Giai đoạn 1: </w:t>
       </w:r>
       <w:r>
-        <w:t>Khớp trực tiếp cú pháp khai thác SQLi, OS Command Injection.</w:t>
+        <w:rPr>
+          <w:sz w:val="26"/>
+        </w:rPr>
+        <w:t>Đệ quy giải mã URL Decoding (tối đa 3 vòng lặp) để bóc tách triệt để các payload lồng nhau.</w:t>
       </w:r>
     </w:p>
     <w:p>
       <w:pPr>
         <w:pStyle w:val="ListBullet"/>
-        <w:spacing w:after="60" w:line="276" w:lineRule="auto"/>
+        <w:spacing w:after="60" w:line="312" w:lineRule="auto"/>
         <w:jc w:val="both"/>
       </w:pPr>
       <w:r>
         <w:rPr>
           <w:b/>
           <w:color w:val="111827"/>
+          <w:sz w:val="26"/>
         </w:rPr>
-        <w:t xml:space="preserve">HIGH (+4 điểm): </w:t>
+        <w:t xml:space="preserve">Giai đoạn 2: </w:t>
       </w:r>
       <w:r>
-        <w:t>Phát hiện hành vi quét lỗ hổng, traversal.</w:t>
+        <w:rPr>
+          <w:sz w:val="26"/>
+        </w:rPr>
+        <w:t>Chuyển đổi toàn bộ ký tự sang chữ thường (Lowercase Transformation) và loại bỏ ký tự Null Byte (\x00).</w:t>
       </w:r>
     </w:p>
     <w:p>
       <w:pPr>
         <w:pStyle w:val="ListBullet"/>
-        <w:spacing w:after="60" w:line="276" w:lineRule="auto"/>
+        <w:spacing w:after="60" w:line="312" w:lineRule="auto"/>
         <w:jc w:val="both"/>
       </w:pPr>
       <w:r>
         <w:rPr>
           <w:b/>
           <w:color w:val="111827"/>
+          <w:sz w:val="26"/>
         </w:rPr>
-        <w:t xml:space="preserve">MEDIUM (+3 điểm): </w:t>
+        <w:t xml:space="preserve">Giai đoạn 3: </w:t>
       </w:r>
       <w:r>
-        <w:t>Phát hiện từ khóa nhạy cảm, ký tự đặc biệt.</w:t>
+        <w:rPr>
+          <w:sz w:val="26"/>
+        </w:rPr>
+        <w:t>Nén các khoảng trắng liên tiếp và chuẩn hóa dấu phân cách đường dẫn (\ -&gt; /).</w:t>
+      </w:r>
+    </w:p>
+    <w:p>
+      <w:pPr>
+        <w:spacing w:before="200" w:after="80"/>
+      </w:pPr>
+      <w:r>
+        <w:rPr>
+          <w:b/>
+          <w:color w:val="1E40AF"/>
+          <w:sz w:val="27"/>
+        </w:rPr>
+        <w:t>1.2.3. Cơ chế tính điểm bất thường tích lũy (Anomaly Scoring Model)</w:t>
+      </w:r>
+    </w:p>
+    <w:p>
+      <w:pPr>
+        <w:spacing w:after="80" w:line="312" w:lineRule="auto"/>
+        <w:jc w:val="both"/>
+      </w:pPr>
+      <w:r>
+        <w:rPr>
+          <w:i w:val="0"/>
+          <w:sz w:val="26"/>
+        </w:rPr>
+        <w:t>Thay vì áp dụng cơ chế Chặn tức thì (Traditional Blocking Mode) dễ gây ra tình trạng báo động nhầm (False Positives), hệ thống áp dụng Cơ chế tính điểm bất thường tích lũy (Anomaly Scoring Model) theo chuẩn ModSecurity CRS v4.0.0 [Ref 07]. Mỗi quy tắc chữ ký khi khớp sẽ gắn một trọng số rủi ro tương ứng với mức độ nghiêm trọng:</w:t>
       </w:r>
     </w:p>
     <w:p>
       <w:pPr>
         <w:pStyle w:val="ListBullet"/>
-        <w:spacing w:after="60" w:line="276" w:lineRule="auto"/>
+        <w:spacing w:after="60" w:line="312" w:lineRule="auto"/>
         <w:jc w:val="both"/>
       </w:pPr>
       <w:r>
         <w:rPr>
           <w:b/>
           <w:color w:val="111827"/>
+          <w:sz w:val="26"/>
         </w:rPr>
-        <w:t xml:space="preserve">LOW (+2 điểm): </w:t>
+        <w:t xml:space="preserve">CRITICAL (+5 điểm): </w:t>
       </w:r>
       <w:r>
-        <w:t>Sai lệch chuẩn giao thức HTTP.</w:t>
-      </w:r>
-    </w:p>
-    <w:tbl>
-      <w:tblPr>
-        <w:tblW w:type="auto" w:w="0"/>
-        <w:jc w:val="center"/>
-        <w:tblLook w:firstColumn="1" w:firstRow="1" w:lastColumn="0" w:lastRow="0" w:noHBand="0" w:noVBand="1" w:val="04A0"/>
-      </w:tblPr>
-      <w:tblGrid>
-        <w:gridCol w:w="9360"/>
-      </w:tblGrid>
-      <w:tr>
-        <w:tc>
-          <w:tcPr>
-            <w:tcW w:type="dxa" w:w="9360"/>
-            <w:shd w:fill="F3F4F6"/>
-            <w:tcMar>
-              <w:top w:w="140" w:type="dxa"/>
-              <w:bottom w:w="140" w:type="dxa"/>
-              <w:left w:w="200" w:type="dxa"/>
-              <w:right w:w="200" w:type="dxa"/>
-            </w:tcMar>
-          </w:tcPr>
-          <w:p>
-            <w:pPr>
-              <w:jc w:val="center"/>
-            </w:pPr>
-            <w:r>
-              <w:rPr>
-                <w:b/>
-                <w:color w:val="1E293B"/>
-                <w:sz w:val="22"/>
-              </w:rPr>
-              <w:t>S_anomaly = sum_{i in Rules matched} Score(i)</w:t>
-            </w:r>
-          </w:p>
-          <w:p>
-            <w:pPr>
-              <w:jc w:val="center"/>
-            </w:pPr>
-            <w:r>
-              <w:rPr>
-                <w:i/>
-                <w:color w:val="64748B"/>
-                <w:sz w:val="19"/>
-              </w:rPr>
-              <w:t>Công thức tính Điểm bất thường tích lũy (Cumulative Anomaly Score) theo chuẩn OWASP CRS v4.0</w:t>
-            </w:r>
-          </w:p>
-        </w:tc>
-      </w:tr>
-    </w:tbl>
-    <w:p>
-      <w:pPr>
-        <w:spacing w:after="80"/>
-      </w:pPr>
-    </w:p>
-    <w:p>
-      <w:pPr>
-        <w:spacing w:after="80" w:line="288" w:lineRule="auto"/>
-        <w:jc w:val="both"/>
-      </w:pPr>
-      <w:r>
         <w:rPr>
-          <w:b w:val="0"/>
-          <w:i w:val="0"/>
+          <w:sz w:val="26"/>
         </w:rPr>
-        <w:t>Chỉ khi S_anomaly &gt;= Anomaly Threshold (mặc định = 5 điểm), WAF mới thực hiện ngắt kết nối và trả về mã lỗi HTTP 403 Forbidden. Mô hình này giảm thiểu đáng kể tỷ lệ chặn nhầm các yêu cầu hợp lệ.</w:t>
-      </w:r>
-    </w:p>
-    <w:p>
-      <w:pPr>
-        <w:keepNext/>
-        <w:spacing w:before="200" w:after="80"/>
-      </w:pPr>
-      <w:r>
-        <w:rPr>
-          <w:b/>
-          <w:color w:val="1E3A8A"/>
-          <w:sz w:val="24"/>
-        </w:rPr>
-        <w:t>1.2.3. Những giới hạn cốt tử của phương pháp dựa trên luật tĩnh</w:t>
-      </w:r>
-    </w:p>
-    <w:p>
-      <w:pPr>
-        <w:spacing w:after="80" w:line="288" w:lineRule="auto"/>
-        <w:jc w:val="both"/>
-      </w:pPr>
-      <w:r>
-        <w:rPr>
-          <w:b w:val="0"/>
-          <w:i w:val="0"/>
-        </w:rPr>
-        <w:t>Mặc dù đóng vai trò là hàng rào lọc thô không thể thiếu, WAF dựa trên luật tĩnh bộc lộ những khiếm khuyết nội tại theo phân tích của William Stallings [Ref 01]:</w:t>
+        <w:t>Khớp dấu hiệu tiêm mã độc nguy hiểm (SQLi, RCE, Shell Command).</w:t>
       </w:r>
     </w:p>
     <w:p>
       <w:pPr>
         <w:pStyle w:val="ListBullet"/>
-        <w:spacing w:after="60" w:line="276" w:lineRule="auto"/>
+        <w:spacing w:after="60" w:line="312" w:lineRule="auto"/>
         <w:jc w:val="both"/>
       </w:pPr>
       <w:r>
         <w:rPr>
           <w:b/>
           <w:color w:val="111827"/>
+          <w:sz w:val="26"/>
         </w:rPr>
-        <w:t xml:space="preserve">1. Bất lực trước biến thể mới và tấn công chưa từng biết (Zero-day Attacks): </w:t>
+        <w:t xml:space="preserve">HIGH (+4 điểm): </w:t>
       </w:r>
       <w:r>
-        <w:t>Luật chữ ký chỉ phát hiện được những gì đã định nghĩa trước.</w:t>
+        <w:rPr>
+          <w:sz w:val="26"/>
+        </w:rPr>
+        <w:t>Khớp dấu hiệu XSS hoặc đọc tệp tin hệ thống (LFI / Path Traversal).</w:t>
       </w:r>
     </w:p>
     <w:p>
       <w:pPr>
         <w:pStyle w:val="ListBullet"/>
-        <w:spacing w:after="60" w:line="276" w:lineRule="auto"/>
+        <w:spacing w:after="60" w:line="312" w:lineRule="auto"/>
         <w:jc w:val="both"/>
       </w:pPr>
       <w:r>
         <w:rPr>
           <w:b/>
           <w:color w:val="111827"/>
+          <w:sz w:val="26"/>
         </w:rPr>
-        <w:t xml:space="preserve">2. Nghịch lý False Positive vs False Negative: </w:t>
+        <w:t xml:space="preserve">MEDIUM (+3 điểm): </w:t>
       </w:r>
       <w:r>
-        <w:t>Viết regex quá chặt chẽ sẽ chặn nhầm văn bản nghiệp vụ lành tính (báo động giả cao); nới lỏng regex sẽ bị kẻ tấn công làm mờ payload vượt qua (bỏ lọt cao).</w:t>
+        <w:rPr>
+          <w:sz w:val="26"/>
+        </w:rPr>
+        <w:t>Khớp dấu hiệu thăm dò, quét lỗ hổng hoặc user-agent khả nghi.</w:t>
       </w:r>
     </w:p>
     <w:p>
       <w:pPr>
         <w:pStyle w:val="ListBullet"/>
-        <w:spacing w:after="60" w:line="276" w:lineRule="auto"/>
+        <w:spacing w:after="60" w:line="312" w:lineRule="auto"/>
         <w:jc w:val="both"/>
       </w:pPr>
       <w:r>
         <w:rPr>
           <w:b/>
           <w:color w:val="111827"/>
+          <w:sz w:val="26"/>
         </w:rPr>
-        <w:t xml:space="preserve">3. Chi phí tính toán tăng mạnh (Regex Performance Degradation): </w:t>
+        <w:t xml:space="preserve">LOW (+2 điểm): </w:t>
       </w:r>
       <w:r>
-        <w:t>Hàng nghìn regex phức tạp gây suy giảm thông lượng và tiềm ẩn nguy cơ dính tấn công ReDoS.</w:t>
+        <w:rPr>
+          <w:sz w:val="26"/>
+        </w:rPr>
+        <w:t>Sai lệch chuẩn giao thức HTTP.</w:t>
       </w:r>
     </w:p>
     <w:p>
       <w:pPr>
-        <w:keepNext/>
+        <w:spacing w:before="160" w:after="40" w:line="276" w:lineRule="auto"/>
+        <w:jc w:val="center"/>
+      </w:pPr>
+      <m:oMathPara>
+        <m:oMath>
+          <m:sSub>
+            <m:e>
+              <m:r>
+                <m:t>S</m:t>
+              </m:r>
+            </m:e>
+            <m:sub>
+              <m:r>
+                <m:rPr>
+                  <m:nor/>
+                </m:rPr>
+                <m:t>anomaly</m:t>
+              </m:r>
+            </m:sub>
+          </m:sSub>
+          <m:r>
+            <m:t>=</m:t>
+          </m:r>
+          <m:nary>
+            <m:naryPr>
+              <m:chr m:val="∑"/>
+              <m:limLoc m:val="subSup"/>
+              <m:grow m:val="1"/>
+              <m:subHide m:val="off"/>
+              <m:supHide m:val="on"/>
+            </m:naryPr>
+            <m:sub>
+              <m:r>
+                <m:t>i∈</m:t>
+              </m:r>
+              <m:r>
+                <m:rPr>
+                  <m:nor/>
+                </m:rPr>
+                <m:t>Rules matched</m:t>
+              </m:r>
+            </m:sub>
+            <m:sup/>
+            <m:e>
+              <m:r>
+                <m:rPr>
+                  <m:nor/>
+                </m:rPr>
+                <m:t>Score</m:t>
+              </m:r>
+              <m:r>
+                <m:t>(i)</m:t>
+              </m:r>
+            </m:e>
+          </m:nary>
+        </m:oMath>
+      </m:oMathPara>
+    </w:p>
+    <w:p>
+      <w:pPr>
+        <w:spacing w:before="0" w:after="160"/>
+        <w:jc w:val="center"/>
+      </w:pPr>
+      <w:r>
+        <w:rPr>
+          <w:i/>
+          <w:color w:val="4B5563"/>
+          <w:sz w:val="20"/>
+        </w:rPr>
+        <w:t>Công thức (1.1): Công thức tính Điểm bất thường tích lũy (Cumulative Anomaly Score) theo chuẩn OWASP CRS v4.0 [Ref 07]</w:t>
+      </w:r>
+    </w:p>
+    <w:p>
+      <w:pPr>
+        <w:spacing w:after="80" w:line="312" w:lineRule="auto"/>
+        <w:jc w:val="both"/>
+      </w:pPr>
+      <w:r>
+        <w:rPr>
+          <w:i w:val="0"/>
+          <w:sz w:val="26"/>
+        </w:rPr>
+        <w:t>Chỉ khi S_anomaly &gt;= Anomaly Threshold (mặc định là 5.0 điểm), WAF mới thực hiện ngắt kết nối và trả về mã lỗi HTTP 403 Forbidden. Mô hình này giúp giảm thiểu đáng kể tỷ lệ chặn nhầm các yêu cầu hợp lệ.</w:t>
+      </w:r>
+    </w:p>
+    <w:p>
+      <w:pPr>
         <w:spacing w:before="280" w:after="120"/>
       </w:pPr>
       <w:r>
         <w:rPr>
           <w:b/>
           <w:color w:val="0F766E"/>
-          <w:sz w:val="28"/>
+          <w:sz w:val="30"/>
         </w:rPr>
-        <w:t>1.3. CƠ SỞ LÝ THUYẾT VỀ TRÍCH XUẤT ĐẶC TRƯNG VÀ HỌC MÁY TRONG PHÁT HIỆN TẤN CÔNG WEB</w:t>
+        <w:t>1.3. CƠ SỞ LÝ THUYẾT VỀ HỌC MÁY TRONG PHÁT HIỆN TẤN CÔNG WEB</w:t>
       </w:r>
     </w:p>
     <w:p>
       <w:pPr>
-        <w:keepNext/>
         <w:spacing w:before="200" w:after="80"/>
       </w:pPr>
       <w:r>
         <w:rPr>
           <w:b/>
-          <w:color w:val="1E3A8A"/>
-          <w:sz w:val="24"/>
+          <w:color w:val="1E40AF"/>
+          <w:sz w:val="27"/>
         </w:rPr>
-        <w:t>1.3.1. Phương pháp trích xuất đặc trưng hình thái học và thống kê chuỗi HTTP</w:t>
+        <w:t>1.3.1. Kỹ nghệ trích xuất đặc trưng hình thái (Payload Morphology &amp; Statistical Features)</w:t>
       </w:r>
     </w:p>
     <w:p>
       <w:pPr>
-        <w:keepNext/>
-        <w:spacing w:before="120" w:after="40"/>
-      </w:pPr>
-      <w:r>
-        <w:rPr>
-          <w:b/>
-          <w:color w:val="374151"/>
-          <w:sz w:val="22"/>
-        </w:rPr>
-        <w:t>1. Cơ sở toán học của độ hỗn loạn thông tin Shannon Entropy</w:t>
-      </w:r>
-    </w:p>
-    <w:p>
-      <w:pPr>
-        <w:spacing w:after="80" w:line="288" w:lineRule="auto"/>
+        <w:spacing w:after="80" w:line="312" w:lineRule="auto"/>
         <w:jc w:val="both"/>
       </w:pPr>
       <w:r>
         <w:rPr>
-          <w:b w:val="0"/>
           <w:i w:val="0"/>
+          <w:sz w:val="26"/>
         </w:rPr>
-        <w:t>Theo giáo trình kinh điển Cryptography: Theory and Practice của Douglas R. Stinson và Maura B. Paterson (Chương 2: Information Theory) [Ref 02], độ hỗn loạn thông tin (Shannon Entropy) là thước đo định lượng toán học về tính ngẫu nhiên, độ bất định và lượng thông tin trung bình chứa trong một biến ngẫu nhiên rời rạc. Cho chuỗi ký tự payload S có độ dài L, xác suất p(c_i) xuất hiện của ký tự c_i là count(c_i) / L. Độ hỗn loạn Shannon Entropy H(S) (tính theo bit) được định nghĩa:</w:t>
-      </w:r>
-    </w:p>
-    <w:tbl>
-      <w:tblPr>
-        <w:tblW w:type="auto" w:w="0"/>
-        <w:jc w:val="center"/>
-        <w:tblLook w:firstColumn="1" w:firstRow="1" w:lastColumn="0" w:lastRow="0" w:noHBand="0" w:noVBand="1" w:val="04A0"/>
-      </w:tblPr>
-      <w:tblGrid>
-        <w:gridCol w:w="9360"/>
-      </w:tblGrid>
-      <w:tr>
-        <w:tc>
-          <w:tcPr>
-            <w:tcW w:type="dxa" w:w="9360"/>
-            <w:shd w:fill="F3F4F6"/>
-            <w:tcMar>
-              <w:top w:w="140" w:type="dxa"/>
-              <w:bottom w:w="140" w:type="dxa"/>
-              <w:left w:w="200" w:type="dxa"/>
-              <w:right w:w="200" w:type="dxa"/>
-            </w:tcMar>
-          </w:tcPr>
-          <w:p>
-            <w:pPr>
-              <w:jc w:val="center"/>
-            </w:pPr>
-            <w:r>
-              <w:rPr>
-                <w:b/>
-                <w:color w:val="1E293B"/>
-                <w:sz w:val="22"/>
-              </w:rPr>
-              <w:t>H(S) = - sum_{i=1}^{k} p(c_i) * log_2 p(c_i)</w:t>
-            </w:r>
-          </w:p>
-          <w:p>
-            <w:pPr>
-              <w:jc w:val="center"/>
-            </w:pPr>
-            <w:r>
-              <w:rPr>
-                <w:i/>
-                <w:color w:val="64748B"/>
-                <w:sz w:val="19"/>
-              </w:rPr>
-              <w:t>Công thức toán học tính toán Shannon Entropy H(S) của chuỗi payload (Stinson &amp; Paterson, 2018)</w:t>
-            </w:r>
-          </w:p>
-        </w:tc>
-      </w:tr>
-    </w:tbl>
-    <w:p>
-      <w:pPr>
-        <w:spacing w:after="80"/>
-      </w:pPr>
-    </w:p>
-    <w:p>
-      <w:pPr>
-        <w:spacing w:after="80" w:line="288" w:lineRule="auto"/>
-        <w:jc w:val="both"/>
-      </w:pPr>
-      <w:r>
-        <w:rPr>
-          <w:b w:val="0"/>
-          <w:i w:val="0"/>
-        </w:rPr>
-        <w:t>Ý nghĩa an ninh thông tin: Văn bản tự nhiên và tham số lành tính có entropy dao động từ 2.0 đến 3.5. Trong khi đó, payload tấn công làm mờ (Base64, Hex, Shellcode, SQLi đa tầng) có độ phân tán ký tự đều bất thường, khiến entropy tăng vọt lên mức &gt;= 3.8 - 4.5. Do đó, Shannon Entropy là đặc trưng hình thái học cực kỳ nhạy cảm để phát hiện dấu hiệu bất thường mà không cần từ điển chữ ký tĩnh.</w:t>
-      </w:r>
-    </w:p>
-    <w:p>
-      <w:pPr>
-        <w:keepNext/>
-        <w:spacing w:before="120" w:after="40"/>
-      </w:pPr>
-      <w:r>
-        <w:rPr>
-          <w:b/>
-          <w:color w:val="374151"/>
-          <w:sz w:val="22"/>
-        </w:rPr>
-        <w:t>2. Không gian 17 đặc trưng hình thái chuẩn tắc (Canonical 17-D Feature Vector)</w:t>
-      </w:r>
-    </w:p>
-    <w:p>
-      <w:pPr>
-        <w:spacing w:after="80" w:line="288" w:lineRule="auto"/>
-        <w:jc w:val="both"/>
-      </w:pPr>
-      <w:r>
-        <w:rPr>
-          <w:b w:val="0"/>
-          <w:i w:val="0"/>
-        </w:rPr>
-        <w:t>Kế thừa và chuẩn hóa công trình nghiên cứu nền tảng của C. Torrano-Gimenez et al. (Wiley Security and Communication Networks 2015) [Ref 08] và bài báo tổng quan SQLi của M. Hasan et al. (IEEE Access 2023) [Ref 10], đồ án xây dựng vector 17 chiều chuẩn tắc gồm 2 nhóm:</w:t>
+        <w:t>Hạn chế cốt tử của hệ thống luật chữ ký truyền thống là hoàn toàn bất lực trước các cuộc tấn công Zero-day hoặc các biến thể mã độc bị làm rối vượt qua từ điển regex. Để giải quyết triệt để vấn đề này, đồ án PBL6 triển khai mô hình học máy dựa trên Kỹ nghệ trích xuất vector 17 đặc trưng hình thái thống kê bám sát công trình nghiên cứu trên tạp chí Wiley Security and Communication Networks [Ref 15]:</w:t>
       </w:r>
     </w:p>
     <w:p>
       <w:pPr>
         <w:pStyle w:val="ListBullet"/>
-        <w:spacing w:after="60" w:line="276" w:lineRule="auto"/>
+        <w:spacing w:after="60" w:line="312" w:lineRule="auto"/>
         <w:jc w:val="both"/>
       </w:pPr>
       <w:r>
         <w:rPr>
           <w:b/>
           <w:color w:val="111827"/>
+          <w:sz w:val="26"/>
         </w:rPr>
-        <w:t xml:space="preserve">Nhóm 1 (12 đặc trưng hình thái &amp; entropy): </w:t>
+        <w:t xml:space="preserve">1. Đặc trưng độ dài và tỷ lệ cấu trúc: </w:t>
       </w:r>
       <w:r>
-        <w:t>length, entropy, count_single_quote, count_double_quote, count_less_than, count_greater_than, count_semicolon, count_hyphen, count_slash, count_backslash, count_parenthesis, special_char_ratio.</w:t>
+        <w:rPr>
+          <w:sz w:val="26"/>
+        </w:rPr>
+        <w:t>Độ dài chuỗi payload (payload_length), tỷ lệ chữ số (digit_ratio), tỷ lệ chữ cái (alpha_ratio), tỷ lệ ký tự đặc biệt (special_char_ratio).</w:t>
       </w:r>
     </w:p>
     <w:p>
       <w:pPr>
         <w:pStyle w:val="ListBullet"/>
-        <w:spacing w:after="60" w:line="276" w:lineRule="auto"/>
+        <w:spacing w:after="60" w:line="312" w:lineRule="auto"/>
         <w:jc w:val="both"/>
       </w:pPr>
       <w:r>
         <w:rPr>
           <w:b/>
           <w:color w:val="111827"/>
+          <w:sz w:val="26"/>
         </w:rPr>
-        <w:t xml:space="preserve">Nhóm 2 (5 đặc trưng mật độ từ khóa &amp; cú pháp): </w:t>
+        <w:t xml:space="preserve">2. Đặc trưng từ khóa nguy hại theo ngữ cảnh: </w:t>
       </w:r>
       <w:r>
-        <w:t>sql_keyword_count, xss_keyword_count, sqli_regex_matches, xss_regex_matches, path_traversal_matches.</w:t>
+        <w:rPr>
+          <w:sz w:val="26"/>
+        </w:rPr>
+        <w:t>Tần suất xuất hiện các token nhạy cảm trong SQLi (SELECT, UNION, DROP, OR, AND), trong XSS (&lt;script&gt;, onerror, onload), trong Path Traversal (../, ..\\) và trong Command Injection (;, |, &amp;&amp;, /bin/sh, cmd.exe).</w:t>
       </w:r>
     </w:p>
     <w:p>
       <w:pPr>
-        <w:keepNext/>
+        <w:pStyle w:val="ListBullet"/>
+        <w:spacing w:after="60" w:line="312" w:lineRule="auto"/>
+        <w:jc w:val="both"/>
+      </w:pPr>
+      <w:r>
+        <w:rPr>
+          <w:b/>
+          <w:color w:val="111827"/>
+          <w:sz w:val="26"/>
+        </w:rPr>
+        <w:t xml:space="preserve">3. Đặc trưng độ hỗn loạn thông tin (Shannon Entropy): </w:t>
+      </w:r>
+      <w:r>
+        <w:rPr>
+          <w:sz w:val="26"/>
+        </w:rPr>
+        <w:t>Được xác định theo định lý lý thuyết thông tin của Claude Shannon trong giáo trình Cryptography: Theory and Practice của Douglas R. Stinson và Maura B. Paterson [Ref 02].</w:t>
+      </w:r>
+    </w:p>
+    <w:p>
+      <w:pPr>
+        <w:spacing w:before="160" w:after="40" w:line="276" w:lineRule="auto"/>
+        <w:jc w:val="center"/>
+      </w:pPr>
+      <m:oMathPara>
+        <m:oMath>
+          <m:r>
+            <m:t>H(S)=−</m:t>
+          </m:r>
+          <m:nary>
+            <m:naryPr>
+              <m:chr m:val="∑"/>
+              <m:limLoc m:val="subSup"/>
+              <m:grow m:val="1"/>
+              <m:subHide m:val="off"/>
+              <m:supHide m:val="off"/>
+            </m:naryPr>
+            <m:sub>
+              <m:r>
+                <m:t>i=1</m:t>
+              </m:r>
+            </m:sub>
+            <m:sup>
+              <m:r>
+                <m:t>k</m:t>
+              </m:r>
+            </m:sup>
+            <m:e>
+              <m:r>
+                <m:t>p(</m:t>
+              </m:r>
+            </m:e>
+          </m:nary>
+          <m:sSub>
+            <m:e>
+              <m:r>
+                <m:t>c</m:t>
+              </m:r>
+            </m:e>
+            <m:sub>
+              <m:r>
+                <m:t>i</m:t>
+              </m:r>
+            </m:sub>
+          </m:sSub>
+          <m:r>
+            <m:t>)</m:t>
+          </m:r>
+          <m:sSub>
+            <m:e>
+              <m:r>
+                <m:rPr>
+                  <m:sty m:val="p"/>
+                </m:rPr>
+                <m:t>log</m:t>
+              </m:r>
+            </m:e>
+            <m:sub>
+              <m:r>
+                <m:t>2</m:t>
+              </m:r>
+            </m:sub>
+          </m:sSub>
+          <m:r>
+            <m:t>p(</m:t>
+          </m:r>
+          <m:sSub>
+            <m:e>
+              <m:r>
+                <m:t>c</m:t>
+              </m:r>
+            </m:e>
+            <m:sub>
+              <m:r>
+                <m:t>i</m:t>
+              </m:r>
+            </m:sub>
+          </m:sSub>
+          <m:r>
+            <m:t>)</m:t>
+          </m:r>
+        </m:oMath>
+      </m:oMathPara>
+    </w:p>
+    <w:p>
+      <w:pPr>
+        <w:spacing w:before="0" w:after="160"/>
+        <w:jc w:val="center"/>
+      </w:pPr>
+      <w:r>
+        <w:rPr>
+          <w:i/>
+          <w:color w:val="4B5563"/>
+          <w:sz w:val="20"/>
+        </w:rPr>
+        <w:t>Công thức (1.2): Công thức toán học tính toán Shannon Entropy H(S) của chuỗi payload (Stinson &amp; Paterson [Ref 02])</w:t>
+      </w:r>
+    </w:p>
+    <w:p>
+      <w:pPr>
+        <w:spacing w:after="80" w:line="312" w:lineRule="auto"/>
+        <w:jc w:val="both"/>
+      </w:pPr>
+      <w:r>
+        <w:rPr>
+          <w:i w:val="0"/>
+          <w:sz w:val="26"/>
+        </w:rPr>
+        <w:t>Trong đó p(c_i) là tần suất xuất hiện tương đối của ký tự c_i trong chuỗi. Các payload bị làm rối bằng Base64, mã hex hoặc mã hóa URL đệ quy luôn có độ hỗn loạn Shannon Entropy xấp xỉ mức tối đa, tạo ra ranh giới phân tách toán học cực kỳ rõ ràng so với các tham số nghiệp vụ thông thường.</w:t>
+      </w:r>
+    </w:p>
+    <w:p>
+      <w:pPr>
         <w:spacing w:before="200" w:after="80"/>
       </w:pPr>
       <w:r>
         <w:rPr>
           <w:b/>
-          <w:color w:val="1E3A8A"/>
-          <w:sz w:val="24"/>
+          <w:color w:val="1E40AF"/>
+          <w:sz w:val="27"/>
         </w:rPr>
-        <w:t>1.3.2. Thuật toán học máy có giám sát — Rừng ngẫu nhiên (Random Forest)</w:t>
+        <w:t>1.3.2. Thuật toán Random Forest và cơ chế Ensemble Learning</w:t>
       </w:r>
     </w:p>
     <w:p>
       <w:pPr>
-        <w:spacing w:after="80" w:line="288" w:lineRule="auto"/>
+        <w:spacing w:after="80" w:line="312" w:lineRule="auto"/>
         <w:jc w:val="both"/>
       </w:pPr>
       <w:r>
         <w:rPr>
-          <w:b w:val="0"/>
           <w:i w:val="0"/>
+          <w:sz w:val="26"/>
         </w:rPr>
-        <w:t>Random Forest (Leo Breiman, 2001) huấn luyện một tập hợp B cây quyết định độc lập qua kỹ thuật Bootstrap Aggregating (Bagging) và chọn lọc ngẫu nhiên tập con đặc trưng (Random Subspace). Kết quả phân loại cuối cùng được tổng hợp qua cơ chế bỏ phiếu đa số hoặc trung bình xác suất:</w:t>
+        <w:t>Theo công trình nền tảng Random Forests của Leo Breiman (Machine Learning 2001) [Ref 12], Random Forest là thuật toán học máy có giám sát (Supervised Learning) dựa trên nguyên lý kết hợp (Ensemble Learning) nhiều cây quyết định ngẫu nhiên (Random Decision Trees) bằng kỹ thuật Bootstrap Aggregating (Bagging).</w:t>
       </w:r>
-    </w:p>
-    <w:tbl>
-      <w:tblPr>
-        <w:tblW w:type="auto" w:w="0"/>
-        <w:jc w:val="center"/>
-        <w:tblLook w:firstColumn="1" w:firstRow="1" w:lastColumn="0" w:lastRow="0" w:noHBand="0" w:noVBand="1" w:val="04A0"/>
-      </w:tblPr>
-      <w:tblGrid>
-        <w:gridCol w:w="9360"/>
-      </w:tblGrid>
-      <w:tr>
-        <w:tc>
-          <w:tcPr>
-            <w:tcW w:type="dxa" w:w="9360"/>
-            <w:shd w:fill="F3F4F6"/>
-            <w:tcMar>
-              <w:top w:w="140" w:type="dxa"/>
-              <w:bottom w:w="140" w:type="dxa"/>
-              <w:left w:w="200" w:type="dxa"/>
-              <w:right w:w="200" w:type="dxa"/>
-            </w:tcMar>
-          </w:tcPr>
-          <w:p>
-            <w:pPr>
-              <w:jc w:val="center"/>
-            </w:pPr>
-            <w:r>
-              <w:rPr>
-                <w:b/>
-                <w:color w:val="1E293B"/>
-                <w:sz w:val="22"/>
-              </w:rPr>
-              <w:t>y_hat = argmax_c [ (1 / B) * sum_{b=1}^{B} P_{T_b}(y = c | x) ]</w:t>
-            </w:r>
-          </w:p>
-          <w:p>
-            <w:pPr>
-              <w:jc w:val="center"/>
-            </w:pPr>
-            <w:r>
-              <w:rPr>
-                <w:i/>
-                <w:color w:val="64748B"/>
-                <w:sz w:val="19"/>
-              </w:rPr>
-              <w:t>Công thức tổng hợp phân loại của mô hình kết hợp Random Forest</w:t>
-            </w:r>
-          </w:p>
-        </w:tc>
-      </w:tr>
-    </w:tbl>
-    <w:p>
-      <w:pPr>
-        <w:spacing w:after="80"/>
-      </w:pPr>
     </w:p>
     <w:p>
       <w:pPr>
-        <w:spacing w:after="80" w:line="288" w:lineRule="auto"/>
+        <w:spacing w:before="160" w:after="40" w:line="276" w:lineRule="auto"/>
+        <w:jc w:val="center"/>
+      </w:pPr>
+      <m:oMathPara>
+        <m:oMath>
+          <m:acc>
+            <m:accPr>
+              <m:chr m:val="̂"/>
+            </m:accPr>
+            <m:e>
+              <m:r>
+                <m:t>y</m:t>
+              </m:r>
+            </m:e>
+          </m:acc>
+          <m:r>
+            <m:t>=</m:t>
+          </m:r>
+          <m:r>
+            <m:rPr>
+              <m:sty m:val="p"/>
+            </m:rPr>
+            <m:t>\arg</m:t>
+          </m:r>
+          <m:sSub>
+            <m:e>
+              <m:r>
+                <m:t>max</m:t>
+              </m:r>
+            </m:e>
+            <m:sub>
+              <m:r>
+                <m:t>c∈{0,1}</m:t>
+              </m:r>
+            </m:sub>
+          </m:sSub>
+          <m:d>
+            <m:dPr>
+              <m:sepChr m:val=""/>
+            </m:dPr>
+            <m:e>
+              <m:f>
+                <m:fPr>
+                  <m:type m:val="bar"/>
+                </m:fPr>
+                <m:num>
+                  <m:r>
+                    <m:t>1</m:t>
+                  </m:r>
+                </m:num>
+                <m:den>
+                  <m:r>
+                    <m:t>B</m:t>
+                  </m:r>
+                </m:den>
+              </m:f>
+              <m:nary>
+                <m:naryPr>
+                  <m:chr m:val="∑"/>
+                  <m:limLoc m:val="subSup"/>
+                  <m:grow m:val="1"/>
+                  <m:subHide m:val="off"/>
+                  <m:supHide m:val="off"/>
+                </m:naryPr>
+                <m:sub>
+                  <m:r>
+                    <m:t>b=1</m:t>
+                  </m:r>
+                </m:sub>
+                <m:sup>
+                  <m:r>
+                    <m:t>B</m:t>
+                  </m:r>
+                </m:sup>
+                <m:e>
+                  <m:sSub>
+                    <m:e>
+                      <m:r>
+                        <m:t>P</m:t>
+                      </m:r>
+                    </m:e>
+                    <m:sub>
+                      <m:sSub>
+                        <m:e>
+                          <m:r>
+                            <m:t>T</m:t>
+                          </m:r>
+                        </m:e>
+                        <m:sub>
+                          <m:r>
+                            <m:t>b</m:t>
+                          </m:r>
+                        </m:sub>
+                      </m:sSub>
+                    </m:sub>
+                  </m:sSub>
+                </m:e>
+              </m:nary>
+              <m:r>
+                <m:t>(</m:t>
+              </m:r>
+              <m:r>
+                <m:t>y</m:t>
+              </m:r>
+              <m:r>
+                <m:t>=</m:t>
+              </m:r>
+              <m:r>
+                <m:t>c</m:t>
+              </m:r>
+              <m:r>
+                <m:t>∣</m:t>
+              </m:r>
+              <m:r>
+                <m:t>x</m:t>
+              </m:r>
+              <m:r>
+                <m:t>)</m:t>
+              </m:r>
+            </m:e>
+          </m:d>
+        </m:oMath>
+      </m:oMathPara>
+    </w:p>
+    <w:p>
+      <w:pPr>
+        <w:spacing w:before="0" w:after="160"/>
+        <w:jc w:val="center"/>
+      </w:pPr>
+      <w:r>
+        <w:rPr>
+          <w:i/>
+          <w:color w:val="4B5563"/>
+          <w:sz w:val="20"/>
+        </w:rPr>
+        <w:t>Công thức (1.3): Công thức tổng hợp phân loại của mô hình kết hợp Random Forest theo Breiman [Ref 12]</w:t>
+      </w:r>
+    </w:p>
+    <w:p>
+      <w:pPr>
+        <w:spacing w:after="80" w:line="312" w:lineRule="auto"/>
         <w:jc w:val="both"/>
       </w:pPr>
       <w:r>
         <w:rPr>
-          <w:b w:val="0"/>
           <w:i w:val="0"/>
+          <w:sz w:val="26"/>
         </w:rPr>
-        <w:t>Động lực lựa chọn Random Forest thay vì Deep Learning / Transformers:</w:t>
+        <w:t>Nhờ cơ chế lấy mẫu ngẫu nhiên có hoàn lại (Bootstrap) và chọn tập con ngẫu nhiên các đặc trưng tại mỗi điểm phân nhánh (Feature Subsampling), Random Forest triệt tiêu hiện tượng quá khớp (Overfitting), có khả năng chống chịu nhiễu đối kháng vượt trội so với các thuật toán Boosting tuần tự [Ref 14].</w:t>
       </w:r>
     </w:p>
     <w:p>
       <w:pPr>
-        <w:spacing w:after="80" w:line="288" w:lineRule="auto"/>
-        <w:jc w:val="both"/>
-      </w:pPr>
-      <w:r>
-        <w:rPr>
-          <w:b w:val="0"/>
-          <w:i w:val="0"/>
-        </w:rPr>
-        <w:t>Theo khảo sát thực nghiệm chuyên sâu trên IEEE Access (2024) [Ref 12] và MDPI Electronics (2025) [Ref 11], việc ứng dụng mạng nơ-ron sâu (CNN, Bi-LSTM) hoặc Transformers (BERT) vào tầng WAF Gateway gặp trở ngại lớn về độ trễ suy luận (60ms - 150ms trên CPU). Trong khi đó, Random Forest đạt độ trễ siêu tốc chỉ từ 0.02ms đến 0.05ms trên CPU đơn lõi, đồng thời cung cấp khả năng giải thích tường minh (Feature Importance) và khả năng chống quá khớp cực cao.</w:t>
-      </w:r>
-    </w:p>
-    <w:p>
-      <w:pPr>
-        <w:keepNext/>
         <w:spacing w:before="200" w:after="80"/>
       </w:pPr>
       <w:r>
         <w:rPr>
           <w:b/>
-          <w:color w:val="1E3A8A"/>
-          <w:sz w:val="24"/>
+          <w:color w:val="1E40AF"/>
+          <w:sz w:val="27"/>
         </w:rPr>
-        <w:t>1.3.3. Thuật toán học máy không giám sát — Rừng cô lập (Isolation Forest)</w:t>
+        <w:t>1.3.3. Thuật toán Isolation Forest trong phát hiện tấn công Zero-day</w:t>
       </w:r>
     </w:p>
     <w:p>
       <w:pPr>
-        <w:spacing w:after="80" w:line="288" w:lineRule="auto"/>
+        <w:spacing w:after="80" w:line="312" w:lineRule="auto"/>
         <w:jc w:val="both"/>
       </w:pPr>
       <w:r>
         <w:rPr>
-          <w:b w:val="0"/>
           <w:i w:val="0"/>
+          <w:sz w:val="26"/>
         </w:rPr>
-        <w:t>Để bắt các cuộc tấn công Zero-day hoặc biến dị payload chưa từng thấy, hệ thống tích hợp Isolation Forest (Liu et al. ICDM 2008). Thuật toán xây dựng tập hợp iTrees phân tách ngẫu nhiên dữ liệu; do điểm dị biệt nằm ở vùng thưa thớt, chúng bị cô lập rất nhanh chóng và có độ sâu đường đi h(x) rất ngắn. Điểm bất thường s(x, n) được tính theo công thức:</w:t>
+        <w:t>Để phát hiện các mẫu tấn công dị biệt chưa từng xuất hiện trong tập huấn luyện (Zero-day Anomalies), hệ thống tích hợp thuật toán học không giám sát Isolation Forest của Fei Tony Liu, Kai Ming Ting và Zhi-Hua Zhou (IEEE ICDM 2008) [Ref 11]. Thuật toán hoạt động dựa trên nguyên lý: các điểm dị biệt (anomalies) luôn có số lượng ít và giá trị đặc trưng rất khác biệt so với đa số điểm dữ liệu bình thường, do đó chúng sẽ bị cô lập ở các độ sâu rất nông của cây iTree.</w:t>
       </w:r>
-    </w:p>
-    <w:tbl>
-      <w:tblPr>
-        <w:tblW w:type="auto" w:w="0"/>
-        <w:jc w:val="center"/>
-        <w:tblLook w:firstColumn="1" w:firstRow="1" w:lastColumn="0" w:lastRow="0" w:noHBand="0" w:noVBand="1" w:val="04A0"/>
-      </w:tblPr>
-      <w:tblGrid>
-        <w:gridCol w:w="9360"/>
-      </w:tblGrid>
-      <w:tr>
-        <w:tc>
-          <w:tcPr>
-            <w:tcW w:type="dxa" w:w="9360"/>
-            <w:shd w:fill="F3F4F6"/>
-            <w:tcMar>
-              <w:top w:w="140" w:type="dxa"/>
-              <w:bottom w:w="140" w:type="dxa"/>
-              <w:left w:w="200" w:type="dxa"/>
-              <w:right w:w="200" w:type="dxa"/>
-            </w:tcMar>
-          </w:tcPr>
-          <w:p>
-            <w:pPr>
-              <w:jc w:val="center"/>
-            </w:pPr>
-            <w:r>
-              <w:rPr>
-                <w:b/>
-                <w:color w:val="1E293B"/>
-                <w:sz w:val="22"/>
-              </w:rPr>
-              <w:t>s(x, n) = 2^{ - E(h(x)) / c(n) }</w:t>
-            </w:r>
-          </w:p>
-          <w:p>
-            <w:pPr>
-              <w:jc w:val="center"/>
-            </w:pPr>
-            <w:r>
-              <w:rPr>
-                <w:i/>
-                <w:color w:val="64748B"/>
-                <w:sz w:val="19"/>
-              </w:rPr>
-              <w:t>Công thức tính điểm bất thường Anomaly Score của thuật toán Isolation Forest</w:t>
-            </w:r>
-          </w:p>
-        </w:tc>
-      </w:tr>
-    </w:tbl>
-    <w:p>
-      <w:pPr>
-        <w:spacing w:after="80"/>
-      </w:pPr>
     </w:p>
     <w:p>
       <w:pPr>
-        <w:spacing w:after="80" w:line="288" w:lineRule="auto"/>
+        <w:spacing w:before="160" w:after="40" w:line="276" w:lineRule="auto"/>
+        <w:jc w:val="center"/>
+      </w:pPr>
+      <m:oMathPara>
+        <m:oMath>
+          <m:r>
+            <m:t>s(x,n)=</m:t>
+          </m:r>
+          <m:sSup>
+            <m:e>
+              <m:r>
+                <m:t>2</m:t>
+              </m:r>
+            </m:e>
+            <m:sup>
+              <m:r>
+                <m:t>−</m:t>
+              </m:r>
+              <m:f>
+                <m:fPr>
+                  <m:type m:val="bar"/>
+                </m:fPr>
+                <m:num>
+                  <m:r>
+                    <m:t>E(h(x))</m:t>
+                  </m:r>
+                </m:num>
+                <m:den>
+                  <m:r>
+                    <m:t>c(n)</m:t>
+                  </m:r>
+                </m:den>
+              </m:f>
+            </m:sup>
+          </m:sSup>
+        </m:oMath>
+      </m:oMathPara>
+    </w:p>
+    <w:p>
+      <w:pPr>
+        <w:spacing w:before="0" w:after="160"/>
+        <w:jc w:val="center"/>
+      </w:pPr>
+      <w:r>
+        <w:rPr>
+          <w:i/>
+          <w:color w:val="4B5563"/>
+          <w:sz w:val="20"/>
+        </w:rPr>
+        <w:t>Công thức (1.4): Công thức tính điểm bất thường Anomaly Score của thuật toán Isolation Forest [Ref 11]</w:t>
+      </w:r>
+    </w:p>
+    <w:p>
+      <w:pPr>
+        <w:spacing w:before="160" w:after="40" w:line="276" w:lineRule="auto"/>
+        <w:jc w:val="center"/>
+      </w:pPr>
+      <m:oMathPara>
+        <m:oMath>
+          <m:r>
+            <m:t>c(n)=2</m:t>
+          </m:r>
+          <m:d>
+            <m:dPr>
+              <m:sepChr m:val=""/>
+            </m:dPr>
+            <m:e>
+              <m:r>
+                <m:rPr>
+                  <m:sty m:val="p"/>
+                </m:rPr>
+                <m:t>ln</m:t>
+              </m:r>
+              <m:r>
+                <m:t>(</m:t>
+              </m:r>
+              <m:r>
+                <m:t>n</m:t>
+              </m:r>
+              <m:r>
+                <m:t>−</m:t>
+              </m:r>
+              <m:r>
+                <m:t>1</m:t>
+              </m:r>
+              <m:r>
+                <m:t>)</m:t>
+              </m:r>
+              <m:r>
+                <m:t>+</m:t>
+              </m:r>
+              <m:r>
+                <m:t>0.5772156649</m:t>
+              </m:r>
+            </m:e>
+          </m:d>
+          <m:r>
+            <m:t>−</m:t>
+          </m:r>
+          <m:f>
+            <m:fPr>
+              <m:type m:val="bar"/>
+            </m:fPr>
+            <m:num>
+              <m:r>
+                <m:t>2(n−1)</m:t>
+              </m:r>
+            </m:num>
+            <m:den>
+              <m:r>
+                <m:t>n</m:t>
+              </m:r>
+            </m:den>
+          </m:f>
+        </m:oMath>
+      </m:oMathPara>
+    </w:p>
+    <w:p>
+      <w:pPr>
+        <w:spacing w:before="0" w:after="160"/>
+        <w:jc w:val="center"/>
+      </w:pPr>
+      <w:r>
+        <w:rPr>
+          <w:i/>
+          <w:color w:val="4B5563"/>
+          <w:sz w:val="20"/>
+        </w:rPr>
+        <w:t>Công thức (1.5): Độ dài đường đi trung bình lý thuyết của cây tìm kiếm nhị phân không thành công [Ref 11]</w:t>
+      </w:r>
+    </w:p>
+    <w:p>
+      <w:pPr>
+        <w:spacing w:after="80" w:line="312" w:lineRule="auto"/>
         <w:jc w:val="both"/>
       </w:pPr>
       <w:r>
         <w:rPr>
-          <w:b w:val="0"/>
           <w:i w:val="0"/>
+          <w:sz w:val="26"/>
         </w:rPr>
-        <w:t>Trong đó c(n) là độ dài đường đi trung bình lý thuyết của cây tìm kiếm nhị phân. Khi s -&gt; 1.0, mẫu bị cô lập cực nhanh, tương ứng xác suất rất cao là mối đe dọa Zero-day; khi s &lt; 0.5, mẫu là dữ liệu bình thường lành tính.</w:t>
+        <w:t>Trong đó h(x) là số lần phân nhánh để cô lập điểm x, E(h(x)) là kỳ vọng độ sâu qua rừng cây, và c(n) là hệ số chuẩn hóa theo kích thước tập mẫu n. Khi s(x, n) tiến sát 1.0, điểm dữ liệu có xác suất cực cao là một hành vi bất thường hoặc cuộc tấn công mới chưa từng được gán nhãn.</w:t>
       </w:r>
     </w:p>
     <w:p>
       <w:pPr>
-        <w:keepNext/>
         <w:spacing w:before="200" w:after="80"/>
       </w:pPr>
       <w:r>
         <w:rPr>
           <w:b/>
-          <w:color w:val="1E3A8A"/>
-          <w:sz w:val="24"/>
+          <w:color w:val="1E40AF"/>
+          <w:sz w:val="27"/>
         </w:rPr>
         <w:t>1.3.4. Mô hình dung hợp rủi ro đa tầng (Hybrid Multi-Layer Risk Engine)</w:t>
       </w:r>
     </w:p>
     <w:p>
       <w:pPr>
-        <w:spacing w:after="80" w:line="288" w:lineRule="auto"/>
+        <w:spacing w:after="80" w:line="312" w:lineRule="auto"/>
         <w:jc w:val="both"/>
       </w:pPr>
       <w:r>
         <w:rPr>
-          <w:b w:val="0"/>
           <w:i w:val="0"/>
+          <w:sz w:val="26"/>
         </w:rPr>
-        <w:t>Áp dụng kiến trúc Dual-Stage Pipeline theo nghiên cứu MDPI Electronics 2025 [Ref 11]: Tầng 1 (Fast Path) dùng Rule Engine lọc tĩnh (&lt; 1ms); Tầng 2 (Deep Path) trích xuất 17 đặc trưng và chạy song song qua Random Forest và Isolation Forest. Điểm rủi ro tổng hợp nằm trong thang đo 0.0 - 100.0:</w:t>
+        <w:t>Bám sát nghiên cứu mới nhất trên tạp chí khoa học quốc tế MDPI Electronics (2025) [Ref 13], hệ thống xây dựng cơ chế Dung hợp rủi ro Đa tầng (Dual-Stage Hybrid Pipeline) kết hợp sức mạnh phân tích chuyên sâu của cả 3 tầng phòng thủ:</w:t>
       </w:r>
-    </w:p>
-    <w:tbl>
-      <w:tblPr>
-        <w:tblW w:type="auto" w:w="0"/>
-        <w:jc w:val="center"/>
-        <w:tblLook w:firstColumn="1" w:firstRow="1" w:lastColumn="0" w:lastRow="0" w:noHBand="0" w:noVBand="1" w:val="04A0"/>
-      </w:tblPr>
-      <w:tblGrid>
-        <w:gridCol w:w="9360"/>
-      </w:tblGrid>
-      <w:tr>
-        <w:tc>
-          <w:tcPr>
-            <w:tcW w:type="dxa" w:w="9360"/>
-            <w:shd w:fill="F3F4F6"/>
-            <w:tcMar>
-              <w:top w:w="140" w:type="dxa"/>
-              <w:bottom w:w="140" w:type="dxa"/>
-              <w:left w:w="200" w:type="dxa"/>
-              <w:right w:w="200" w:type="dxa"/>
-            </w:tcMar>
-          </w:tcPr>
-          <w:p>
-            <w:pPr>
-              <w:jc w:val="center"/>
-            </w:pPr>
-            <w:r>
-              <w:rPr>
-                <w:b/>
-                <w:color w:val="1E293B"/>
-                <w:sz w:val="22"/>
-              </w:rPr>
-              <w:t>Risk Score = 0.40 * S_Rule + 0.35 * S_RF + 0.25 * S_Anomaly</w:t>
-            </w:r>
-          </w:p>
-          <w:p>
-            <w:pPr>
-              <w:jc w:val="center"/>
-            </w:pPr>
-            <w:r>
-              <w:rPr>
-                <w:i/>
-                <w:color w:val="64748B"/>
-                <w:sz w:val="19"/>
-              </w:rPr>
-              <w:t>Công thức dung hợp điểm rủi ro đa tầng Hybrid Risk Score</w:t>
-            </w:r>
-          </w:p>
-        </w:tc>
-      </w:tr>
-    </w:tbl>
-    <w:p>
-      <w:pPr>
-        <w:spacing w:after="80"/>
-      </w:pPr>
     </w:p>
     <w:p>
       <w:pPr>
-        <w:spacing w:after="80" w:line="288" w:lineRule="auto"/>
+        <w:spacing w:before="160" w:after="40" w:line="276" w:lineRule="auto"/>
+        <w:jc w:val="center"/>
+      </w:pPr>
+      <m:oMathPara>
+        <m:oMath>
+          <m:r>
+            <m:rPr>
+              <m:nor/>
+            </m:rPr>
+            <m:t>Risk Score</m:t>
+          </m:r>
+          <m:r>
+            <m:t>=0.40·</m:t>
+          </m:r>
+          <m:sSub>
+            <m:e>
+              <m:r>
+                <m:t>S</m:t>
+              </m:r>
+            </m:e>
+            <m:sub>
+              <m:r>
+                <m:rPr>
+                  <m:nor/>
+                </m:rPr>
+                <m:t>Rule</m:t>
+              </m:r>
+            </m:sub>
+          </m:sSub>
+          <m:r>
+            <m:t>+0.35·</m:t>
+          </m:r>
+          <m:sSub>
+            <m:e>
+              <m:r>
+                <m:t>S</m:t>
+              </m:r>
+            </m:e>
+            <m:sub>
+              <m:r>
+                <m:rPr>
+                  <m:nor/>
+                </m:rPr>
+                <m:t>RF</m:t>
+              </m:r>
+            </m:sub>
+          </m:sSub>
+          <m:r>
+            <m:t>+0.25·</m:t>
+          </m:r>
+          <m:sSub>
+            <m:e>
+              <m:r>
+                <m:t>S</m:t>
+              </m:r>
+            </m:e>
+            <m:sub>
+              <m:r>
+                <m:rPr>
+                  <m:nor/>
+                </m:rPr>
+                <m:t>Anomaly</m:t>
+              </m:r>
+            </m:sub>
+          </m:sSub>
+        </m:oMath>
+      </m:oMathPara>
+    </w:p>
+    <w:p>
+      <w:pPr>
+        <w:spacing w:before="0" w:after="160"/>
+        <w:jc w:val="center"/>
+      </w:pPr>
+      <w:r>
+        <w:rPr>
+          <w:i/>
+          <w:color w:val="4B5563"/>
+          <w:sz w:val="20"/>
+        </w:rPr>
+        <w:t>Công thức (1.6): Công thức dung hợp điểm rủi ro đa tầng Hybrid Risk Score [Ref 13]</w:t>
+      </w:r>
+    </w:p>
+    <w:p>
+      <w:pPr>
+        <w:spacing w:after="80" w:line="312" w:lineRule="auto"/>
         <w:jc w:val="both"/>
       </w:pPr>
       <w:r>
         <w:rPr>
-          <w:b w:val="0"/>
           <w:i w:val="0"/>
+          <w:sz w:val="26"/>
         </w:rPr>
-        <w:t>Ma trận ra quyết định phòng thủ phân tầng theo chuẩn MITRE ATT&amp;CK Mitigation [Ref 16]:</w:t>
+        <w:t>Ma trận ra quyết định phòng thủ phân tầng theo chuẩn MITRE ATT&amp;CK Mitigation [Ref 10]:</w:t>
       </w:r>
     </w:p>
     <w:p>
       <w:pPr>
         <w:pStyle w:val="ListBullet"/>
-        <w:spacing w:after="60" w:line="276" w:lineRule="auto"/>
+        <w:spacing w:after="60" w:line="312" w:lineRule="auto"/>
         <w:jc w:val="both"/>
       </w:pPr>
       <w:r>
         <w:rPr>
           <w:b/>
           <w:color w:val="111827"/>
+          <w:sz w:val="26"/>
         </w:rPr>
         <w:t xml:space="preserve">Điểm &lt; 30 (ALLOW): </w:t>
       </w:r>
       <w:r>
+        <w:rPr>
+          <w:sz w:val="26"/>
+        </w:rPr>
         <w:t>Cho phép yêu cầu đi tiếp đến backend API an toàn.</w:t>
       </w:r>
     </w:p>
     <w:p>
       <w:pPr>
         <w:pStyle w:val="ListBullet"/>
-        <w:spacing w:after="60" w:line="276" w:lineRule="auto"/>
+        <w:spacing w:after="60" w:line="312" w:lineRule="auto"/>
         <w:jc w:val="both"/>
       </w:pPr>
       <w:r>
         <w:rPr>
           <w:b/>
           <w:color w:val="111827"/>
+          <w:sz w:val="26"/>
         </w:rPr>
         <w:t xml:space="preserve">Điểm 30 - 59 (MONITOR): </w:t>
       </w:r>
       <w:r>
+        <w:rPr>
+          <w:sz w:val="26"/>
+        </w:rPr>
         <w:t>Cho phép đi qua nhưng ghi nhật ký kiểm toán chuyên sâu.</w:t>
       </w:r>
     </w:p>
     <w:p>
       <w:pPr>
         <w:pStyle w:val="ListBullet"/>
-        <w:spacing w:after="60" w:line="276" w:lineRule="auto"/>
+        <w:spacing w:after="60" w:line="312" w:lineRule="auto"/>
         <w:jc w:val="both"/>
       </w:pPr>
       <w:r>
         <w:rPr>
           <w:b/>
           <w:color w:val="111827"/>
+          <w:sz w:val="26"/>
         </w:rPr>
         <w:t xml:space="preserve">Điểm 60 - 79 (RATE_LIMIT): </w:t>
       </w:r>
       <w:r>
+        <w:rPr>
+          <w:sz w:val="26"/>
+        </w:rPr>
         <w:t>Áp đặt hình phạt cắt giảm hạn ngạch truy cập và trì hoãn phản hồi.</w:t>
       </w:r>
     </w:p>
     <w:p>
       <w:pPr>
         <w:pStyle w:val="ListBullet"/>
-        <w:spacing w:after="60" w:line="276" w:lineRule="auto"/>
+        <w:spacing w:after="60" w:line="312" w:lineRule="auto"/>
         <w:jc w:val="both"/>
       </w:pPr>
       <w:r>
         <w:rPr>
           <w:b/>
           <w:color w:val="111827"/>
+          <w:sz w:val="26"/>
         </w:rPr>
         <w:t xml:space="preserve">Điểm &gt;= 80 (BLOCK): </w:t>
       </w:r>
       <w:r>
+        <w:rPr>
+          <w:sz w:val="26"/>
+        </w:rPr>
         <w:t>Lập tức từ chối yêu cầu với mã lỗi HTTP 403 Forbidden.</w:t>
       </w:r>
     </w:p>
     <w:p>
       <w:pPr>
-        <w:keepNext/>
         <w:spacing w:before="280" w:after="120"/>
       </w:pPr>
       <w:r>
         <w:rPr>
           <w:b/>
           <w:color w:val="0F766E"/>
-          <w:sz w:val="28"/>
+          <w:sz w:val="30"/>
         </w:rPr>
         <w:t>1.4. CƠ SỞ LÝ THUYẾT VỀ THAO TRƯỜNG MẠNG (CYBER RANGE) VÀ TÁC TỬ TẤN CÔNG TỰ ĐỘNG (OFFENSIVE AI)</w:t>
       </w:r>
     </w:p>
     <w:p>
       <w:pPr>
-        <w:keepNext/>
         <w:spacing w:before="200" w:after="80"/>
       </w:pPr>
       <w:r>
         <w:rPr>
           <w:b/>
-          <w:color w:val="1E3A8A"/>
-          <w:sz w:val="24"/>
+          <w:color w:val="1E40AF"/>
+          <w:sz w:val="27"/>
         </w:rPr>
         <w:t>1.4.1. Khung kiến trúc Thao trường mạng phân tán tiêu chuẩn quốc tế</w:t>
       </w:r>
     </w:p>
     <w:p>
       <w:pPr>
-        <w:spacing w:after="80" w:line="288" w:lineRule="auto"/>
+        <w:spacing w:after="80" w:line="312" w:lineRule="auto"/>
         <w:jc w:val="both"/>
       </w:pPr>
       <w:r>
         <w:rPr>
-          <w:b w:val="0"/>
           <w:i w:val="0"/>
+          <w:sz w:val="26"/>
         </w:rPr>
-        <w:t>Theo nghiên cứu nền tảng của M. Yamin et al. (Elsevier Computers &amp; Security 2020) [Ref 14], một nền tảng Cyber Range tiêu chuẩn bao gồm 3 phân hệ cốt lõi:</w:t>
+        <w:t>Theo nghiên cứu nền tảng của M. Yamin et al. (Elsevier Computers &amp; Security 2020) [Ref 16], một hệ thống Thao trường mạng (Cyber Range) tiêu chuẩn bao gồm 3 trụ cột cấu trúc:</w:t>
       </w:r>
     </w:p>
     <w:p>
       <w:pPr>
         <w:pStyle w:val="ListBullet"/>
-        <w:spacing w:after="60" w:line="276" w:lineRule="auto"/>
+        <w:spacing w:after="60" w:line="312" w:lineRule="auto"/>
         <w:jc w:val="both"/>
       </w:pPr>
       <w:r>
         <w:rPr>
           <w:b/>
           <w:color w:val="111827"/>
+          <w:sz w:val="26"/>
         </w:rPr>
         <w:t xml:space="preserve">1. Phân hệ Môi trường mục tiêu (Target Environment): </w:t>
       </w:r>
       <w:r>
-        <w:t>Máy chủ Web API chứa các lỗ hổng OWASP Top 10 và cơ sở dữ liệu cô lập.</w:t>
+        <w:rPr>
+          <w:sz w:val="26"/>
+        </w:rPr>
+        <w:t>Máy chủ Web API chứa các lỗ hổng mô phỏng thực tế.</w:t>
       </w:r>
     </w:p>
     <w:p>
       <w:pPr>
         <w:pStyle w:val="ListBullet"/>
-        <w:spacing w:after="60" w:line="276" w:lineRule="auto"/>
+        <w:spacing w:after="60" w:line="312" w:lineRule="auto"/>
         <w:jc w:val="both"/>
       </w:pPr>
       <w:r>
         <w:rPr>
           <w:b/>
           <w:color w:val="111827"/>
+          <w:sz w:val="26"/>
         </w:rPr>
         <w:t xml:space="preserve">2. Phân hệ Mô phỏng tấn công (Attack Simulation Engine): </w:t>
       </w:r>
       <w:r>
-        <w:t>Tác tử Red Team tự động trinh sát OpenAPI, tạo chuỗi tấn công và đột biến payload.</w:t>
+        <w:rPr>
+          <w:sz w:val="26"/>
+        </w:rPr>
+        <w:t>Tác tử Red Team tự động triển khai các chiến dịch tấn công.</w:t>
       </w:r>
     </w:p>
     <w:p>
       <w:pPr>
         <w:pStyle w:val="ListBullet"/>
-        <w:spacing w:after="60" w:line="276" w:lineRule="auto"/>
+        <w:spacing w:after="60" w:line="312" w:lineRule="auto"/>
         <w:jc w:val="both"/>
       </w:pPr>
       <w:r>
         <w:rPr>
           <w:b/>
           <w:color w:val="111827"/>
+          <w:sz w:val="26"/>
         </w:rPr>
         <w:t xml:space="preserve">3. Phân hệ Giám sát và Chấm điểm (Monitoring &amp; Scoring Subsystem): </w:t>
       </w:r>
       <w:r>
-        <w:t>Thu thập telemetry thời gian thực, đo lường độ trễ mạng và trực quan hóa trung tâm chỉ huy SOC Dashboard.</w:t>
+        <w:rPr>
+          <w:sz w:val="26"/>
+        </w:rPr>
+        <w:t>Thu thập telemetry thời gian thực, đo lường độ trễ và tỷ lệ chặn.</w:t>
       </w:r>
     </w:p>
     <w:p>
       <w:pPr>
-        <w:spacing w:after="80" w:line="288" w:lineRule="auto"/>
+        <w:spacing w:after="80" w:line="312" w:lineRule="auto"/>
         <w:jc w:val="both"/>
       </w:pPr>
       <w:r>
         <w:rPr>
-          <w:b w:val="0"/>
           <w:i w:val="0"/>
+          <w:sz w:val="26"/>
         </w:rPr>
-        <w:t>Đồ án PBL6 hiện thực hóa kiến trúc này trên 2 máy tính vật lý độc lập kết nối qua mạng LAN/Switch (Máy 1: Blue Team; Máy 2: Red Team). Mô hình đa máy trạm phân tán mang lại độ trễ mạng thực (Network RTT), hiện tượng trễ gói tin và tính chân thực cao hơn 85% so với chạy cục bộ localhost [Ref 14].</w:t>
+        <w:t>Đồ án PBL6 hiện thực hóa kiến trúc này trên 2 máy tính vật lý độc lập kết nối qua mạng LAN/Switch Gigabit Ethernet, phân tách hoàn toàn ranh giới giữa bên Tấn công (Red Team Node) và bên Phòng thủ (Blue Team Security Gateway).</w:t>
       </w:r>
     </w:p>
     <w:p>
       <w:pPr>
-        <w:keepNext/>
         <w:spacing w:before="200" w:after="80"/>
       </w:pPr>
       <w:r>
         <w:rPr>
           <w:b/>
-          <w:color w:val="1E3A8A"/>
-          <w:sz w:val="24"/>
+          <w:color w:val="1E40AF"/>
+          <w:sz w:val="27"/>
         </w:rPr>
         <w:t>1.4.2. Cơ sở lý thuyết về Trò chơi an ninh đối kháng (Adversarial Security Game)</w:t>
       </w:r>
     </w:p>
     <w:p>
       <w:pPr>
-        <w:spacing w:after="80" w:line="288" w:lineRule="auto"/>
+        <w:spacing w:after="80" w:line="312" w:lineRule="auto"/>
         <w:jc w:val="both"/>
       </w:pPr>
       <w:r>
         <w:rPr>
-          <w:b w:val="0"/>
           <w:i w:val="0"/>
+          <w:sz w:val="26"/>
         </w:rPr>
-        <w:t>Để thiết lập nền tảng lý thuyết toán học vững chắc cho cuộc đối đầu giữa Red Team và Blue Team trong Thao trường mạng, đồ án vận dụng mô hình hóa hình thức từ giáo trình kinh điển Introduction to Modern Cryptography của Jonathan Katz và Yehuda Lindell (Chương 3: Adversarial Models) [Ref 03].</w:t>
+        <w:t>Để thiết lập nền tảng lý thuyết toán học vững chắc cho cuộc đối đầu giữa Red Team và Blue Team, đồ án vận dụng Lý thuyết Trò chơi An ninh Đối kháng (Security Game) được giảng dạy trong giáo trình kinh điển Introduction to Modern Cryptography của Jonathan Katz và Yehuda Lindell (CRC Press) [Ref 03].</w:t>
       </w:r>
     </w:p>
     <w:p>
       <w:pPr>
-        <w:spacing w:after="80" w:line="288" w:lineRule="auto"/>
+        <w:spacing w:before="160" w:after="40" w:line="276" w:lineRule="auto"/>
+        <w:jc w:val="center"/>
+      </w:pPr>
+      <m:oMathPara>
+        <m:oMath>
+          <m:r>
+            <m:rPr>
+              <m:sty m:val="b"/>
+            </m:rPr>
+            <m:t>Adv</m:t>
+          </m:r>
+          <m:r>
+            <m:t>(𝒜)=</m:t>
+          </m:r>
+          <m:d>
+            <m:dPr>
+              <m:begChr m:val="|"/>
+              <m:sepChr m:val=""/>
+              <m:endChr m:val="|"/>
+            </m:dPr>
+            <m:e>
+              <m:r>
+                <m:t>Pr</m:t>
+              </m:r>
+              <m:r>
+                <m:t>[</m:t>
+              </m:r>
+              <m:r>
+                <m:t>𝒜</m:t>
+              </m:r>
+              <m:r>
+                <m:rPr>
+                  <m:nor/>
+                </m:rPr>
+                <m:t> bypasses WAF</m:t>
+              </m:r>
+              <m:r>
+                <m:t>]</m:t>
+              </m:r>
+              <m:r>
+                <m:t>−</m:t>
+              </m:r>
+              <m:r>
+                <m:t>Pr</m:t>
+              </m:r>
+              <m:r>
+                <m:t>[</m:t>
+              </m:r>
+              <m:r>
+                <m:rPr>
+                  <m:nor/>
+                </m:rPr>
+                <m:t>Random Guess bypasses WAF</m:t>
+              </m:r>
+              <m:r>
+                <m:t>]</m:t>
+              </m:r>
+            </m:e>
+          </m:d>
+        </m:oMath>
+      </m:oMathPara>
+    </w:p>
+    <w:p>
+      <w:pPr>
+        <w:spacing w:before="0" w:after="160"/>
+        <w:jc w:val="center"/>
+      </w:pPr>
+      <w:r>
+        <w:rPr>
+          <w:i/>
+          <w:color w:val="4B5563"/>
+          <w:sz w:val="20"/>
+        </w:rPr>
+        <w:t>Công thức (1.7): Hàm lợi thế tấn công đối kháng (Adversarial Advantage) theo lý thuyết Katz &amp; Lindell [Ref 03]</w:t>
+      </w:r>
+    </w:p>
+    <w:p>
+      <w:pPr>
+        <w:spacing w:after="80" w:line="312" w:lineRule="auto"/>
         <w:jc w:val="both"/>
       </w:pPr>
       <w:r>
         <w:rPr>
-          <w:b w:val="0"/>
           <w:i w:val="0"/>
+          <w:sz w:val="26"/>
         </w:rPr>
-        <w:t>Bài toán vượt rào WAF được hình thức hóa dưới dạng một Trò chơi an ninh đối kháng (Security Game) giữa Bên tấn công (Adversary A) và Bên phòng thủ (Defender/Challenger C):</w:t>
+        <w:t>Hệ thống phòng thủ đạt độ an toàn vững chắc khi và chỉ khi với mọi tác tử tấn công A bị giới hạn tài nguyên đa thức, hàm lợi thế Adv(A) tiệm cận về 0 (negligible function).</w:t>
+      </w:r>
+    </w:p>
+    <w:p>
+      <w:pPr>
+        <w:spacing w:before="200" w:after="80"/>
+      </w:pPr>
+      <w:r>
+        <w:rPr>
+          <w:b/>
+          <w:color w:val="1E40AF"/>
+          <w:sz w:val="27"/>
+        </w:rPr>
+        <w:t>1.4.3. Quy trình trinh sát và Tác tử tấn công tự động (Offensive AI &amp; Red Teaming)</w:t>
+      </w:r>
+    </w:p>
+    <w:p>
+      <w:pPr>
+        <w:spacing w:after="80" w:line="312" w:lineRule="auto"/>
+        <w:jc w:val="both"/>
+      </w:pPr>
+      <w:r>
+        <w:rPr>
+          <w:i w:val="0"/>
+          <w:sz w:val="26"/>
+        </w:rPr>
+        <w:t>Theo phương pháp luận kiểm thử xâm nhập của giáo trình CompTIA PenTest+ [Ref 04], tác tử Red Team tự động vận hành qua 3 pha chiến thuật:</w:t>
       </w:r>
     </w:p>
     <w:p>
       <w:pPr>
         <w:pStyle w:val="ListBullet"/>
-        <w:spacing w:after="60" w:line="276" w:lineRule="auto"/>
+        <w:spacing w:after="60" w:line="312" w:lineRule="auto"/>
         <w:jc w:val="both"/>
       </w:pPr>
       <w:r>
         <w:rPr>
           <w:b/>
           <w:color w:val="111827"/>
+          <w:sz w:val="26"/>
         </w:rPr>
-        <w:t xml:space="preserve">1. Thiết lập (Setup): </w:t>
+        <w:t xml:space="preserve">1. Trinh sát tự động (Reconnaissance &amp; OpenAPI Parsing): </w:t>
       </w:r>
       <w:r>
-        <w:t>Bên phòng thủ C thiết lập hệ thống phòng thủ WAF với tập tham số Pi = {Rules, w_RF, theta_iForest, tau_threshold}.</w:t>
+        <w:rPr>
+          <w:sz w:val="26"/>
+        </w:rPr>
+        <w:t>Bóc tách schema Swagger / OpenAPI để lập danh mục endpoint và kiểu dữ liệu.</w:t>
       </w:r>
     </w:p>
     <w:p>
       <w:pPr>
         <w:pStyle w:val="ListBullet"/>
-        <w:spacing w:after="60" w:line="276" w:lineRule="auto"/>
+        <w:spacing w:after="60" w:line="312" w:lineRule="auto"/>
         <w:jc w:val="both"/>
       </w:pPr>
       <w:r>
         <w:rPr>
           <w:b/>
           <w:color w:val="111827"/>
+          <w:sz w:val="26"/>
         </w:rPr>
-        <w:t xml:space="preserve">2. Truy vấn Oracle: </w:t>
+        <w:t xml:space="preserve">2. Fuzzing phụ thuộc trạng thái (Stateful REST API Fuzzing): </w:t>
       </w:r>
       <w:r>
-        <w:t>Bên tấn công A gửi chuỗi yêu cầu thử nghiệm đến cổng phòng thủ và quan sát phản hồi từ Oracle O_C(x) -&gt; (Status, Latency, Blocked).</w:t>
+        <w:rPr>
+          <w:sz w:val="26"/>
+        </w:rPr>
+        <w:t>Sinh chuỗi request có cấu trúc bám sát ngữ cảnh nghiệp vụ.</w:t>
       </w:r>
     </w:p>
     <w:p>
       <w:pPr>
         <w:pStyle w:val="ListBullet"/>
-        <w:spacing w:after="60" w:line="276" w:lineRule="auto"/>
+        <w:spacing w:after="60" w:line="312" w:lineRule="auto"/>
         <w:jc w:val="both"/>
       </w:pPr>
       <w:r>
         <w:rPr>
           <w:b/>
           <w:color w:val="111827"/>
+          <w:sz w:val="26"/>
         </w:rPr>
-        <w:t xml:space="preserve">3. Mục tiêu: </w:t>
+        <w:t xml:space="preserve">3. Kiểm thử xác minh lỗ hổng: </w:t>
       </w:r>
       <w:r>
-        <w:t>Bên tấn công chiến thắng nếu tìm ra biến thể payload x* sao cho x* khai thác thành công lỗ hổng trên ứng dụng mục tiêu nhưng lại qua mặt được bộ lọc phòng thủ (WAF(x*) = ALLOW).</w:t>
-      </w:r>
-    </w:p>
-    <w:tbl>
-      <w:tblPr>
-        <w:tblW w:type="auto" w:w="0"/>
-        <w:jc w:val="center"/>
-        <w:tblLook w:firstColumn="1" w:firstRow="1" w:lastColumn="0" w:lastRow="0" w:noHBand="0" w:noVBand="1" w:val="04A0"/>
-      </w:tblPr>
-      <w:tblGrid>
-        <w:gridCol w:w="9360"/>
-      </w:tblGrid>
-      <w:tr>
-        <w:tc>
-          <w:tcPr>
-            <w:tcW w:type="dxa" w:w="9360"/>
-            <w:shd w:fill="F3F4F6"/>
-            <w:tcMar>
-              <w:top w:w="140" w:type="dxa"/>
-              <w:bottom w:w="140" w:type="dxa"/>
-              <w:left w:w="200" w:type="dxa"/>
-              <w:right w:w="200" w:type="dxa"/>
-            </w:tcMar>
-          </w:tcPr>
-          <w:p>
-            <w:pPr>
-              <w:jc w:val="center"/>
-            </w:pPr>
-            <w:r>
-              <w:rPr>
-                <w:b/>
-                <w:color w:val="1E293B"/>
-                <w:sz w:val="22"/>
-              </w:rPr>
-              <w:t>Adv(A) = | Pr[A bypasses WAF] - Pr[Random Guess bypasses WAF] |</w:t>
-            </w:r>
-          </w:p>
-          <w:p>
-            <w:pPr>
-              <w:jc w:val="center"/>
-            </w:pPr>
-            <w:r>
-              <w:rPr>
-                <w:i/>
-                <w:color w:val="64748B"/>
-                <w:sz w:val="19"/>
-              </w:rPr>
-              <w:t>Hàm lợi thế tấn công (Adversarial Advantage) theo lý thuyết Katz &amp; Lindell (2020)</w:t>
-            </w:r>
-          </w:p>
-        </w:tc>
-      </w:tr>
-    </w:tbl>
-    <w:p>
-      <w:pPr>
-        <w:spacing w:after="80"/>
-      </w:pPr>
-    </w:p>
-    <w:p>
-      <w:pPr>
-        <w:spacing w:after="80" w:line="288" w:lineRule="auto"/>
-        <w:jc w:val="both"/>
-      </w:pPr>
-      <w:r>
         <w:rPr>
-          <w:b w:val="0"/>
-          <w:i w:val="0"/>
+          <w:sz w:val="26"/>
         </w:rPr>
-        <w:t>Hệ thống phòng thủ đạt độ an toàn vững chắc khi và chỉ khi với mọi tác tử tấn công A bị giới hạn về tài nguyên tính toán PPT, hàm lợi thế Adv(A) là một hàm không đáng kể đối với các lỗ hổng đã biết.</w:t>
+        <w:t>Bơm payload độc hại được đột biến có chủ đích vào từng trường tham số.</w:t>
       </w:r>
     </w:p>
     <w:p>
       <w:pPr>
-        <w:keepNext/>
         <w:spacing w:before="200" w:after="80"/>
       </w:pPr>
       <w:r>
         <w:rPr>
           <w:b/>
-          <w:color w:val="1E3A8A"/>
-          <w:sz w:val="24"/>
+          <w:color w:val="1E40AF"/>
+          <w:sz w:val="27"/>
         </w:rPr>
-        <w:t>1.4.3. Quy trình trinh sát và Tác tử tấn công tự động (Offensive AI &amp; Red Teaming)</w:t>
+        <w:t>1.4.4. Mô hình Học tăng cường sâu (Deep Reinforcement Learning - DQN) trong né tránh phòng thủ</w:t>
       </w:r>
     </w:p>
     <w:p>
       <w:pPr>
-        <w:spacing w:after="80" w:line="288" w:lineRule="auto"/>
+        <w:spacing w:after="80" w:line="312" w:lineRule="auto"/>
         <w:jc w:val="both"/>
       </w:pPr>
       <w:r>
         <w:rPr>
-          <w:b w:val="0"/>
           <w:i w:val="0"/>
+          <w:sz w:val="26"/>
         </w:rPr>
-        <w:t>Theo phương pháp luận kiểm thử xâm nhập của giáo trình CompTIA PenTest+ [Ref 04], tác tử Red Team (Máy 2) được thiết kế vận hành theo chu trình 3 bước:</w:t>
+        <w:t>Bài toán né tránh WAF được mô hình hóa theo Quy trình quyết định Markov (Markov Decision Process - MDP) bám sát giáo trình Reinforcement Learning của Sutton &amp; Barto (MIT Press) [Ref 17] và kiến trúc Deep Q-Network của DeepMind (Nature 2015) [Ref 18]:</w:t>
       </w:r>
     </w:p>
     <w:p>
       <w:pPr>
         <w:pStyle w:val="ListBullet"/>
-        <w:spacing w:after="60" w:line="276" w:lineRule="auto"/>
+        <w:spacing w:after="60" w:line="312" w:lineRule="auto"/>
         <w:jc w:val="both"/>
       </w:pPr>
       <w:r>
         <w:rPr>
           <w:b/>
           <w:color w:val="111827"/>
+          <w:sz w:val="26"/>
         </w:rPr>
-        <w:t xml:space="preserve">1. Trinh sát tự động (Reconnaissance &amp; OpenAPI Parsing): </w:t>
+        <w:t xml:space="preserve">Không gian trạng thái (State Space): </w:t>
       </w:r>
       <w:r>
-        <w:t>Tác tử tự động gửi yêu cầu đọc tài liệu OpenAPI Specification (/openapi.json hoặc /docs), bóc tách danh sách endpoint, phương thức HTTP và cấu trúc schema JSON.</w:t>
+        <w:rPr>
+          <w:sz w:val="26"/>
+        </w:rPr>
+        <w:t>Vector đặc trưng của payload hiện tại và mã phản hồi HTTP từ WAF Gateway.</w:t>
       </w:r>
     </w:p>
     <w:p>
       <w:pPr>
         <w:pStyle w:val="ListBullet"/>
-        <w:spacing w:after="60" w:line="276" w:lineRule="auto"/>
+        <w:spacing w:after="60" w:line="312" w:lineRule="auto"/>
         <w:jc w:val="both"/>
       </w:pPr>
       <w:r>
         <w:rPr>
           <w:b/>
           <w:color w:val="111827"/>
+          <w:sz w:val="26"/>
         </w:rPr>
-        <w:t xml:space="preserve">2. Fuzzing phụ thuộc trạng thái (Stateful REST API Fuzzing): </w:t>
+        <w:t xml:space="preserve">Không gian hành động (Action Space): </w:t>
       </w:r>
       <w:r>
-        <w:t>Vận dụng nguyên lý của công cụ khoa học hàng đầu RESTler (IEEE ICSE 2019) [Ref 17], tác tử xây dựng đồ thị phụ thuộc (Producer-Consumer Dependency Graph) để duy trì token phiên và tham số hợp lệ.</w:t>
+        <w:rPr>
+          <w:sz w:val="26"/>
+        </w:rPr>
+        <w:t>Tập hợp các toán tử đột biến: Double URL Encode, Case Alternation, Comment Injection, Hex Encoding.</w:t>
       </w:r>
     </w:p>
     <w:p>
       <w:pPr>
         <w:pStyle w:val="ListBullet"/>
-        <w:spacing w:after="60" w:line="276" w:lineRule="auto"/>
+        <w:spacing w:after="60" w:line="312" w:lineRule="auto"/>
         <w:jc w:val="both"/>
       </w:pPr>
       <w:r>
         <w:rPr>
           <w:b/>
           <w:color w:val="111827"/>
+          <w:sz w:val="26"/>
         </w:rPr>
-        <w:t xml:space="preserve">3. Kiểm thử xác minh lỗ hổng: </w:t>
+        <w:t xml:space="preserve">Hàm phần thưởng (Reward Function): </w:t>
       </w:r>
       <w:r>
-        <w:t>Bơm payload độc hại được đột biến có chủ đích vào từng tham số và giám sát mã phản hồi HTTP.</w:t>
+        <w:rPr>
+          <w:sz w:val="26"/>
+        </w:rPr>
+        <w:t>+100 điểm khi vượt WAF thành công (HTTP 200), -50 điểm khi bị chặn (HTTP 403).</w:t>
       </w:r>
     </w:p>
     <w:p>
       <w:pPr>
-        <w:spacing w:after="80" w:line="288" w:lineRule="auto"/>
-        <w:jc w:val="both"/>
+        <w:spacing w:before="160" w:after="40" w:line="276" w:lineRule="auto"/>
+        <w:jc w:val="center"/>
+      </w:pPr>
+      <m:oMathPara>
+        <m:oMath>
+          <m:r>
+            <m:t>Q(s,a)←Q(s,a)+α</m:t>
+          </m:r>
+          <m:d>
+            <m:dPr>
+              <m:begChr m:val="["/>
+              <m:sepChr m:val=""/>
+              <m:endChr m:val="]"/>
+            </m:dPr>
+            <m:e>
+              <m:r>
+                <m:t>r</m:t>
+              </m:r>
+              <m:r>
+                <m:t>+</m:t>
+              </m:r>
+              <m:r>
+                <m:t>γ</m:t>
+              </m:r>
+              <m:sSub>
+                <m:e>
+                  <m:r>
+                    <m:t>max</m:t>
+                  </m:r>
+                </m:e>
+                <m:sub>
+                  <m:sSup>
+                    <m:e>
+                      <m:r>
+                        <m:t>a</m:t>
+                      </m:r>
+                    </m:e>
+                    <m:sup>
+                      <m:r>
+                        <m:t>′</m:t>
+                      </m:r>
+                    </m:sup>
+                  </m:sSup>
+                </m:sub>
+              </m:sSub>
+              <m:r>
+                <m:t>Q</m:t>
+              </m:r>
+              <m:r>
+                <m:t>(</m:t>
+              </m:r>
+              <m:sSup>
+                <m:e>
+                  <m:r>
+                    <m:t>s</m:t>
+                  </m:r>
+                </m:e>
+                <m:sup>
+                  <m:r>
+                    <m:t>′</m:t>
+                  </m:r>
+                </m:sup>
+              </m:sSup>
+              <m:r>
+                <m:t>,</m:t>
+              </m:r>
+              <m:sSup>
+                <m:e>
+                  <m:r>
+                    <m:t>a</m:t>
+                  </m:r>
+                </m:e>
+                <m:sup>
+                  <m:r>
+                    <m:t>′</m:t>
+                  </m:r>
+                </m:sup>
+              </m:sSup>
+              <m:r>
+                <m:t>)</m:t>
+              </m:r>
+              <m:r>
+                <m:t>−</m:t>
+              </m:r>
+              <m:r>
+                <m:t>Q</m:t>
+              </m:r>
+              <m:r>
+                <m:t>(</m:t>
+              </m:r>
+              <m:r>
+                <m:t>s</m:t>
+              </m:r>
+              <m:r>
+                <m:t>,</m:t>
+              </m:r>
+              <m:r>
+                <m:t>a</m:t>
+              </m:r>
+              <m:r>
+                <m:t>)</m:t>
+              </m:r>
+            </m:e>
+          </m:d>
+        </m:oMath>
+      </m:oMathPara>
+    </w:p>
+    <w:p>
+      <w:pPr>
+        <w:spacing w:before="0" w:after="160"/>
+        <w:jc w:val="center"/>
       </w:pPr>
       <w:r>
         <w:rPr>
-          <w:b w:val="0"/>
-          <w:i w:val="0"/>
+          <w:i/>
+          <w:color w:val="4B5563"/>
+          <w:sz w:val="20"/>
         </w:rPr>
-        <w:t>Toàn bộ kỹ thuật tấn công được ánh xạ theo danh mục MITRE ATT&amp;CK Enterprise Matrix [Ref 16]: T1190 (Exploit Public-Facing Application), T1059 (Command and Scripting Interpreter), T1083 (File and Directory Discovery) và T1595 (Active Scanning).</w:t>
+        <w:t>Công thức (1.8): Phương trình Bellman cập nhật giá trị Q tối ưu theo thuật toán Q-Learning [Ref 17]</w:t>
       </w:r>
     </w:p>
     <w:p>
       <w:pPr>
-        <w:keepNext/>
+        <w:spacing w:before="280" w:after="120"/>
+      </w:pPr>
+      <w:r>
+        <w:rPr>
+          <w:b/>
+          <w:color w:val="0F766E"/>
+          <w:sz w:val="30"/>
+        </w:rPr>
+        <w:t>1.5. CÁC THƯỚC ĐO VÀ TIÊU CHUẨN ĐÁNH GIÁ HIỆU NĂNG KHOA HỌC</w:t>
+      </w:r>
+    </w:p>
+    <w:p>
+      <w:pPr>
         <w:spacing w:before="200" w:after="80"/>
       </w:pPr>
       <w:r>
         <w:rPr>
           <w:b/>
-          <w:color w:val="1E3A8A"/>
-          <w:sz w:val="24"/>
+          <w:color w:val="1E40AF"/>
+          <w:sz w:val="27"/>
         </w:rPr>
-        <w:t>1.4.4. Mô hình Học tăng cường sâu (Deep Reinforcement Learning - DQN) trong né tránh phòng thủ</w:t>
+        <w:t>1.5.1. Ma trận nhầm lẫn và các chỉ số cốt lõi</w:t>
       </w:r>
     </w:p>
     <w:p>
       <w:pPr>
-        <w:spacing w:after="80" w:line="288" w:lineRule="auto"/>
+        <w:spacing w:after="80" w:line="312" w:lineRule="auto"/>
         <w:jc w:val="both"/>
       </w:pPr>
       <w:r>
         <w:rPr>
-          <w:b w:val="0"/>
           <w:i w:val="0"/>
+          <w:sz w:val="26"/>
         </w:rPr>
-        <w:t>Bài toán né tránh WAF được mô hình hóa theo Quy trình quyết định Markov (Markov Decision Process - MDP) và huấn luyện bằng mạng nơ-ron sâu Deep Q-Network (100% In-house PyTorch, không phụ thuộc API thương mại) [Ref 19, Ref 20]:</w:t>
+        <w:t>Hiệu năng của hệ thống được đánh giá định lượng qua Ma trận nhầm lẫn (Confusion Matrix) với các đại lượng: True Positive (TP), True Negative (TN), False Positive (FP), False Negative (FN):</w:t>
       </w:r>
     </w:p>
     <w:p>
       <w:pPr>
         <w:pStyle w:val="ListBullet"/>
-        <w:spacing w:after="60" w:line="276" w:lineRule="auto"/>
+        <w:spacing w:after="60" w:line="312" w:lineRule="auto"/>
         <w:jc w:val="both"/>
       </w:pPr>
       <w:r>
         <w:rPr>
           <w:b/>
           <w:color w:val="111827"/>
+          <w:sz w:val="26"/>
         </w:rPr>
-        <w:t xml:space="preserve">Không gian trạng thái (State Space): </w:t>
+        <w:t xml:space="preserve">Accuracy: </w:t>
       </w:r>
       <w:r>
-        <w:t>Vector đặc trưng của payload hiện tại và mã phản hồi HTTP từ Gateway (200, 403, 429, 500).</w:t>
+        <w:rPr>
+          <w:sz w:val="26"/>
+        </w:rPr>
+        <w:t>Tỷ lệ dự đoán đúng tổng thể = (TP + TN) / (TP + TN + FP + FN).</w:t>
       </w:r>
     </w:p>
     <w:p>
       <w:pPr>
         <w:pStyle w:val="ListBullet"/>
-        <w:spacing w:after="60" w:line="276" w:lineRule="auto"/>
+        <w:spacing w:after="60" w:line="312" w:lineRule="auto"/>
         <w:jc w:val="both"/>
       </w:pPr>
       <w:r>
         <w:rPr>
           <w:b/>
           <w:color w:val="111827"/>
+          <w:sz w:val="26"/>
         </w:rPr>
-        <w:t xml:space="preserve">Không gian hành động (Action Space): </w:t>
+        <w:t xml:space="preserve">Precision: </w:t>
       </w:r>
       <w:r>
-        <w:t>Tập hợp các toán tử đột biến: Double URL Encode, Inline Comment, Mixed-case, Null-byte, Base64 Wrap, Subshell Expansion.</w:t>
+        <w:rPr>
+          <w:sz w:val="26"/>
+        </w:rPr>
+        <w:t>Độ chuẩn xác của cảnh báo tấn công = TP / (TP + FP).</w:t>
       </w:r>
     </w:p>
     <w:p>
       <w:pPr>
         <w:pStyle w:val="ListBullet"/>
-        <w:spacing w:after="60" w:line="276" w:lineRule="auto"/>
+        <w:spacing w:after="60" w:line="312" w:lineRule="auto"/>
         <w:jc w:val="both"/>
       </w:pPr>
       <w:r>
         <w:rPr>
           <w:b/>
           <w:color w:val="111827"/>
+          <w:sz w:val="26"/>
         </w:rPr>
-        <w:t xml:space="preserve">Hàm phần thưởng (Reward Function): </w:t>
+        <w:t xml:space="preserve">Recall (True Positive Rate - TPR): </w:t>
       </w:r>
       <w:r>
-        <w:t>+100 điểm khi vượt WAF thành công (HTTP 200/500), -50 điểm khi bị chặn (HTTP 403), -10 điểm chi phí độ trễ cho mỗi bước thừa.</w:t>
+        <w:rPr>
+          <w:sz w:val="26"/>
+        </w:rPr>
+        <w:t>Tỷ lệ tóm gọn tấn công = TP / (TP + FN).</w:t>
       </w:r>
-    </w:p>
-    <w:tbl>
-      <w:tblPr>
-        <w:tblW w:type="auto" w:w="0"/>
-        <w:jc w:val="center"/>
-        <w:tblLook w:firstColumn="1" w:firstRow="1" w:lastColumn="0" w:lastRow="0" w:noHBand="0" w:noVBand="1" w:val="04A0"/>
-      </w:tblPr>
-      <w:tblGrid>
-        <w:gridCol w:w="9360"/>
-      </w:tblGrid>
-      <w:tr>
-        <w:tc>
-          <w:tcPr>
-            <w:tcW w:type="dxa" w:w="9360"/>
-            <w:shd w:fill="F3F4F6"/>
-            <w:tcMar>
-              <w:top w:w="140" w:type="dxa"/>
-              <w:bottom w:w="140" w:type="dxa"/>
-              <w:left w:w="200" w:type="dxa"/>
-              <w:right w:w="200" w:type="dxa"/>
-            </w:tcMar>
-          </w:tcPr>
-          <w:p>
-            <w:pPr>
-              <w:jc w:val="center"/>
-            </w:pPr>
-            <w:r>
-              <w:rPr>
-                <w:b/>
-                <w:color w:val="1E293B"/>
-                <w:sz w:val="22"/>
-              </w:rPr>
-              <w:t>Q(s, a) &lt;- Q(s, a) + alpha * [ r + gamma * max_a'( Q(s', a') ) - Q(s, a) ]</w:t>
-            </w:r>
-          </w:p>
-          <w:p>
-            <w:pPr>
-              <w:jc w:val="center"/>
-            </w:pPr>
-            <w:r>
-              <w:rPr>
-                <w:i/>
-                <w:color w:val="64748B"/>
-                <w:sz w:val="19"/>
-              </w:rPr>
-              <w:t>Phương trình cập nhật giá trị Q tối ưu theo thuật toán Q-Learning</w:t>
-            </w:r>
-          </w:p>
-        </w:tc>
-      </w:tr>
-    </w:tbl>
-    <w:p>
-      <w:pPr>
-        <w:spacing w:after="80"/>
-      </w:pPr>
     </w:p>
     <w:p>
       <w:pPr>
-        <w:keepNext/>
+        <w:pStyle w:val="ListBullet"/>
+        <w:spacing w:after="60" w:line="312" w:lineRule="auto"/>
+        <w:jc w:val="both"/>
+      </w:pPr>
+      <w:r>
+        <w:rPr>
+          <w:b/>
+          <w:color w:val="111827"/>
+          <w:sz w:val="26"/>
+        </w:rPr>
+        <w:t xml:space="preserve">False Positive Rate (FPR): </w:t>
+      </w:r>
+      <w:r>
+        <w:rPr>
+          <w:sz w:val="26"/>
+        </w:rPr>
+        <w:t>Tỷ lệ báo động nhầm người dùng hợp lệ = FP / (FP + TN).</w:t>
+      </w:r>
+    </w:p>
+    <w:p>
+      <w:pPr>
+        <w:pStyle w:val="ListBullet"/>
+        <w:spacing w:after="60" w:line="312" w:lineRule="auto"/>
+        <w:jc w:val="both"/>
+      </w:pPr>
+      <w:r>
+        <w:rPr>
+          <w:b/>
+          <w:color w:val="111827"/>
+          <w:sz w:val="26"/>
+        </w:rPr>
+        <w:t xml:space="preserve">F1-Score: </w:t>
+      </w:r>
+      <w:r>
+        <w:rPr>
+          <w:sz w:val="26"/>
+        </w:rPr>
+        <w:t>Trung bình điều hòa giữa Precision và Recall = 2 * (Precision * Recall) / (Precision + Recall).</w:t>
+      </w:r>
+    </w:p>
+    <w:p>
+      <w:pPr>
+        <w:spacing w:before="200" w:after="80"/>
+      </w:pPr>
+      <w:r>
+        <w:rPr>
+          <w:b/>
+          <w:color w:val="1E40AF"/>
+          <w:sz w:val="27"/>
+        </w:rPr>
+        <w:t>1.5.2. Thước đo Youden's Index (J) theo chuẩn OWASP Benchmark Project</w:t>
+      </w:r>
+    </w:p>
+    <w:p>
+      <w:pPr>
+        <w:spacing w:after="80" w:line="312" w:lineRule="auto"/>
+        <w:jc w:val="both"/>
+      </w:pPr>
+      <w:r>
+        <w:rPr>
+          <w:i w:val="0"/>
+          <w:sz w:val="26"/>
+        </w:rPr>
+        <w:t>Theo tiêu chuẩn đánh giá WAF quốc tế của OWASP Benchmark Project [Ref 08], một hệ thống WAF đạt chuẩn khoa học không thể chỉ dựa vào Accuracy mà phải cân bằng tuyệt đối giữa khả năng chặn mã độc và tỷ lệ không làm gián đoạn người dùng hợp lệ:</w:t>
+      </w:r>
+    </w:p>
+    <w:p>
+      <w:pPr>
+        <w:spacing w:before="160" w:after="40" w:line="276" w:lineRule="auto"/>
+        <w:jc w:val="center"/>
+      </w:pPr>
+      <m:oMathPara>
+        <m:oMath>
+          <m:r>
+            <m:t>J=</m:t>
+          </m:r>
+          <m:r>
+            <m:rPr>
+              <m:nor/>
+            </m:rPr>
+            <m:t>TPR</m:t>
+          </m:r>
+          <m:r>
+            <m:t>−</m:t>
+          </m:r>
+          <m:r>
+            <m:rPr>
+              <m:nor/>
+            </m:rPr>
+            <m:t>FPR</m:t>
+          </m:r>
+          <m:r>
+            <m:t>=</m:t>
+          </m:r>
+          <m:f>
+            <m:fPr>
+              <m:type m:val="bar"/>
+            </m:fPr>
+            <m:num>
+              <m:r>
+                <m:rPr>
+                  <m:nor/>
+                </m:rPr>
+                <m:t>TP</m:t>
+              </m:r>
+            </m:num>
+            <m:den>
+              <m:r>
+                <m:rPr>
+                  <m:nor/>
+                </m:rPr>
+                <m:t>TP</m:t>
+              </m:r>
+              <m:r>
+                <m:t>+</m:t>
+              </m:r>
+              <m:r>
+                <m:rPr>
+                  <m:nor/>
+                </m:rPr>
+                <m:t>FN</m:t>
+              </m:r>
+            </m:den>
+          </m:f>
+          <m:r>
+            <m:t>−</m:t>
+          </m:r>
+          <m:f>
+            <m:fPr>
+              <m:type m:val="bar"/>
+            </m:fPr>
+            <m:num>
+              <m:r>
+                <m:rPr>
+                  <m:nor/>
+                </m:rPr>
+                <m:t>FP</m:t>
+              </m:r>
+            </m:num>
+            <m:den>
+              <m:r>
+                <m:rPr>
+                  <m:nor/>
+                </m:rPr>
+                <m:t>FP</m:t>
+              </m:r>
+              <m:r>
+                <m:t>+</m:t>
+              </m:r>
+              <m:r>
+                <m:rPr>
+                  <m:nor/>
+                </m:rPr>
+                <m:t>TN</m:t>
+              </m:r>
+            </m:den>
+          </m:f>
+        </m:oMath>
+      </m:oMathPara>
+    </w:p>
+    <w:p>
+      <w:pPr>
+        <w:spacing w:before="0" w:after="160"/>
+        <w:jc w:val="center"/>
+      </w:pPr>
+      <w:r>
+        <w:rPr>
+          <w:i/>
+          <w:color w:val="4B5563"/>
+          <w:sz w:val="20"/>
+        </w:rPr>
+        <w:t>Công thức (1.9): Chỉ số Youden's Index J theo chuẩn đánh giá WAF của OWASP Benchmark Project [Ref 08]</w:t>
+      </w:r>
+    </w:p>
+    <w:p>
+      <w:pPr>
+        <w:spacing w:after="80" w:line="312" w:lineRule="auto"/>
+        <w:jc w:val="both"/>
+      </w:pPr>
+      <w:r>
+        <w:rPr>
+          <w:i w:val="0"/>
+          <w:sz w:val="26"/>
+        </w:rPr>
+        <w:t>Thang đo J thuộc [-1.0, 1.0]. Hệ thống lý tưởng đạt J = 1.0 (TPR = 100%, FPR = 0%). Nếu J &lt;= 0, hệ thống phòng thủ hoàn toàn vô dụng hoặc gây hại cho dịch vụ.</w:t>
+      </w:r>
+    </w:p>
+    <w:p>
+      <w:pPr>
+        <w:spacing w:before="200" w:after="80"/>
+      </w:pPr>
+      <w:r>
+        <w:rPr>
+          <w:b/>
+          <w:color w:val="1E40AF"/>
+          <w:sz w:val="27"/>
+        </w:rPr>
+        <w:t>1.5.3. Ngân sách độ trễ xử lý (Latency Overhead Budget)</w:t>
+      </w:r>
+    </w:p>
+    <w:p>
+      <w:pPr>
+        <w:spacing w:after="80" w:line="312" w:lineRule="auto"/>
+        <w:jc w:val="both"/>
+      </w:pPr>
+      <w:r>
+        <w:rPr>
+          <w:i w:val="0"/>
+          <w:sz w:val="26"/>
+        </w:rPr>
+        <w:t>Theo tiêu chuẩn vận hành kiến trúc Reverse Proxy hiệu năng cao trong NGINX Cookbook [Ref 05], thời gian WAF can thiệp phân tích gói tin không được làm suy giảm trải nghiệm người dùng:</w:t>
+      </w:r>
+    </w:p>
+    <w:p>
+      <w:pPr>
+        <w:spacing w:before="160" w:after="40" w:line="276" w:lineRule="auto"/>
+        <w:jc w:val="center"/>
+      </w:pPr>
+      <m:oMathPara>
+        <m:oMath>
+          <m:r>
+            <m:t>Δt=</m:t>
+          </m:r>
+          <m:sSub>
+            <m:e>
+              <m:r>
+                <m:t>t</m:t>
+              </m:r>
+            </m:e>
+            <m:sub>
+              <m:r>
+                <m:rPr>
+                  <m:nor/>
+                </m:rPr>
+                <m:t>with\_WAF</m:t>
+              </m:r>
+            </m:sub>
+          </m:sSub>
+          <m:r>
+            <m:t>−</m:t>
+          </m:r>
+          <m:sSub>
+            <m:e>
+              <m:r>
+                <m:t>t</m:t>
+              </m:r>
+            </m:e>
+            <m:sub>
+              <m:r>
+                <m:rPr>
+                  <m:nor/>
+                </m:rPr>
+                <m:t>direct</m:t>
+              </m:r>
+            </m:sub>
+          </m:sSub>
+          <m:r>
+            <m:t>≤15</m:t>
+          </m:r>
+          <m:r>
+            <m:rPr>
+              <m:nor/>
+            </m:rPr>
+            <m:t> ms</m:t>
+          </m:r>
+        </m:oMath>
+      </m:oMathPara>
+    </w:p>
+    <w:p>
+      <w:pPr>
+        <w:spacing w:before="0" w:after="160"/>
+        <w:jc w:val="center"/>
+      </w:pPr>
+      <w:r>
+        <w:rPr>
+          <w:i/>
+          <w:color w:val="4B5563"/>
+          <w:sz w:val="20"/>
+        </w:rPr>
+        <w:t>Công thức (1.10): Ngân sách độ trễ tối đa cho toàn bộ quy trình kiểm tra WAF Hybrid [Ref 05]</w:t>
+      </w:r>
+    </w:p>
+    <w:p>
+      <w:pPr>
         <w:spacing w:before="280" w:after="120"/>
       </w:pPr>
       <w:r>
         <w:rPr>
           <w:b/>
           <w:color w:val="0F766E"/>
-          <w:sz w:val="28"/>
+          <w:sz w:val="30"/>
         </w:rPr>
-        <w:t>1.5. CÁC THƯỚC ĐO VÀ TIÊU CHUẨN ĐÁNH GIÁ HIỆU NĂNG KHOA HỌC</w:t>
+        <w:t>1.6. TỔNG KẾT CHƯƠNG 1</w:t>
       </w:r>
     </w:p>
     <w:p>
       <w:pPr>
-        <w:keepNext/>
-        <w:spacing w:before="200" w:after="80"/>
-      </w:pPr>
-      <w:r>
-        <w:rPr>
-          <w:b/>
-          <w:color w:val="1E3A8A"/>
-          <w:sz w:val="24"/>
-        </w:rPr>
-        <w:t>1.5.1. Ma trận nhầm lẫn và các chỉ số cốt lõi</w:t>
-      </w:r>
-    </w:p>
-    <w:p>
-      <w:pPr>
-        <w:spacing w:after="80" w:line="288" w:lineRule="auto"/>
+        <w:spacing w:after="80" w:line="312" w:lineRule="auto"/>
         <w:jc w:val="both"/>
       </w:pPr>
       <w:r>
         <w:rPr>
-          <w:b w:val="0"/>
           <w:i w:val="0"/>
+          <w:sz w:val="26"/>
         </w:rPr>
-        <w:t>Hiệu năng của hệ thống được đánh giá định lượng qua Ma trận nhầm lẫn (Confusion Matrix) với các chỉ số thống kê chuẩn mực:</w:t>
+        <w:t>Chương 1 đã hoàn thành việc xây dựng nền tảng cơ sở lý thuyết toàn diện, có tính liên kết chặt chẽ:</w:t>
       </w:r>
     </w:p>
     <w:p>
       <w:pPr>
         <w:pStyle w:val="ListBullet"/>
-        <w:spacing w:after="60" w:line="276" w:lineRule="auto"/>
+        <w:spacing w:after="60" w:line="312" w:lineRule="auto"/>
         <w:jc w:val="both"/>
       </w:pPr>
       <w:r>
         <w:rPr>
           <w:b/>
           <w:color w:val="111827"/>
+          <w:sz w:val="26"/>
         </w:rPr>
-        <w:t xml:space="preserve">Accuracy: </w:t>
+        <w:t xml:space="preserve">1. Giáo trình kinh điển: </w:t>
       </w:r>
       <w:r>
-        <w:t>Tỷ lệ dự đoán đúng tổng thể = (TP + TN) / (TP + TN + FP + FN).</w:t>
+        <w:rPr>
+          <w:sz w:val="26"/>
+        </w:rPr>
+        <w:t>Vận dụng lý thuyết Cổng tầng ứng dụng của William Stallings [Ref 01], lý thuyết thông tin Shannon của Douglas Stinson [Ref 02], và Trò chơi an ninh đối kháng của Katz &amp; Lindell [Ref 03].</w:t>
       </w:r>
     </w:p>
     <w:p>
       <w:pPr>
         <w:pStyle w:val="ListBullet"/>
-        <w:spacing w:after="60" w:line="276" w:lineRule="auto"/>
+        <w:spacing w:after="60" w:line="312" w:lineRule="auto"/>
         <w:jc w:val="both"/>
       </w:pPr>
       <w:r>
         <w:rPr>
           <w:b/>
           <w:color w:val="111827"/>
+          <w:sz w:val="26"/>
         </w:rPr>
-        <w:t xml:space="preserve">Precision: </w:t>
+        <w:t xml:space="preserve">2. Tiêu chuẩn công nghiệp: </w:t>
       </w:r>
       <w:r>
-        <w:t>Độ chuẩn xác của cảnh báo tấn công = TP / (TP + FP).</w:t>
+        <w:rPr>
+          <w:sz w:val="26"/>
+        </w:rPr>
+        <w:t>Bám sát bộ rủi ro OWASP Top 10 API Security Risks (2023) [Ref 06], kiến trúc phân tích tính điểm bất thường ModSecurity CRS v4 [Ref 07], và khung chuẩn đánh giá OWASP Benchmark [Ref 08].</w:t>
       </w:r>
     </w:p>
     <w:p>
       <w:pPr>
         <w:pStyle w:val="ListBullet"/>
-        <w:spacing w:after="60" w:line="276" w:lineRule="auto"/>
+        <w:spacing w:after="60" w:line="312" w:lineRule="auto"/>
         <w:jc w:val="both"/>
       </w:pPr>
       <w:r>
         <w:rPr>
           <w:b/>
           <w:color w:val="111827"/>
-        </w:rPr>
-        <w:t xml:space="preserve">Recall (True Positive Rate - TPR): </w:t>
-      </w:r>
-      <w:r>
-        <w:t>Tỷ lệ tóm gọn tấn công = TP / (TP + FN).</w:t>
-      </w:r>
-    </w:p>
-    <w:p>
-      <w:pPr>
-        <w:pStyle w:val="ListBullet"/>
-        <w:spacing w:after="60" w:line="276" w:lineRule="auto"/>
-        <w:jc w:val="both"/>
-      </w:pPr>
-      <w:r>
-        <w:rPr>
-          <w:b/>
-          <w:color w:val="111827"/>
-        </w:rPr>
-        <w:t xml:space="preserve">False Positive Rate (FPR): </w:t>
-      </w:r>
-      <w:r>
-        <w:t>Tỷ lệ báo động nhầm người dùng hợp lệ = FP / (FP + TN).</w:t>
-      </w:r>
-    </w:p>
-    <w:p>
-      <w:pPr>
-        <w:pStyle w:val="ListBullet"/>
-        <w:spacing w:after="60" w:line="276" w:lineRule="auto"/>
-        <w:jc w:val="both"/>
-      </w:pPr>
-      <w:r>
-        <w:rPr>
-          <w:b/>
-          <w:color w:val="111827"/>
-        </w:rPr>
-        <w:t xml:space="preserve">F1-Score: </w:t>
-      </w:r>
-      <w:r>
-        <w:t>Trung bình điều hòa giữa Precision và Recall = 2 * (Precision * Recall) / (Precision + Recall).</w:t>
-      </w:r>
-    </w:p>
-    <w:p>
-      <w:pPr>
-        <w:keepNext/>
-        <w:spacing w:before="200" w:after="80"/>
-      </w:pPr>
-      <w:r>
-        <w:rPr>
-          <w:b/>
-          <w:color w:val="1E3A8A"/>
-          <w:sz w:val="24"/>
-        </w:rPr>
-        <w:t>1.5.2. Thước đo Youden's Index (J) theo chuẩn OWASP Benchmark Project</w:t>
-      </w:r>
-    </w:p>
-    <w:p>
-      <w:pPr>
-        <w:spacing w:after="80" w:line="288" w:lineRule="auto"/>
-        <w:jc w:val="both"/>
-      </w:pPr>
-      <w:r>
-        <w:rPr>
-          <w:b w:val="0"/>
-          <w:i w:val="0"/>
-        </w:rPr>
-        <w:t>Theo tiêu chuẩn đánh giá WAF quốc tế của OWASP Benchmark Project [Ref 13], một hệ thống WAF đạt chuẩn khoa học bắt buộc phải cân bằng giữa khả năng bắt tấn công và khả năng hạn chế tối đa báo động giả. Chỉ số Youden's Index J được định nghĩa:</w:t>
-      </w:r>
-    </w:p>
-    <w:tbl>
-      <w:tblPr>
-        <w:tblW w:type="auto" w:w="0"/>
-        <w:jc w:val="center"/>
-        <w:tblLook w:firstColumn="1" w:firstRow="1" w:lastColumn="0" w:lastRow="0" w:noHBand="0" w:noVBand="1" w:val="04A0"/>
-      </w:tblPr>
-      <w:tblGrid>
-        <w:gridCol w:w="9360"/>
-      </w:tblGrid>
-      <w:tr>
-        <w:tc>
-          <w:tcPr>
-            <w:tcW w:type="dxa" w:w="9360"/>
-            <w:shd w:fill="F3F4F6"/>
-            <w:tcMar>
-              <w:top w:w="140" w:type="dxa"/>
-              <w:bottom w:w="140" w:type="dxa"/>
-              <w:left w:w="200" w:type="dxa"/>
-              <w:right w:w="200" w:type="dxa"/>
-            </w:tcMar>
-          </w:tcPr>
-          <w:p>
-            <w:pPr>
-              <w:jc w:val="center"/>
-            </w:pPr>
-            <w:r>
-              <w:rPr>
-                <w:b/>
-                <w:color w:val="1E293B"/>
-                <w:sz w:val="22"/>
-              </w:rPr>
-              <w:t>J = TPR - FPR = [ TP / (TP + FN) ] - [ FP / (FP + TN) ]</w:t>
-            </w:r>
-          </w:p>
-          <w:p>
-            <w:pPr>
-              <w:jc w:val="center"/>
-            </w:pPr>
-            <w:r>
-              <w:rPr>
-                <w:i/>
-                <w:color w:val="64748B"/>
-                <w:sz w:val="19"/>
-              </w:rPr>
-              <w:t>Chỉ số Youden's Index J theo chuẩn đánh giá WAF của OWASP Benchmark</w:t>
-            </w:r>
-          </w:p>
-        </w:tc>
-      </w:tr>
-    </w:tbl>
-    <w:p>
-      <w:pPr>
-        <w:spacing w:after="80"/>
-      </w:pPr>
-    </w:p>
-    <w:p>
-      <w:pPr>
-        <w:spacing w:after="80" w:line="288" w:lineRule="auto"/>
-        <w:jc w:val="both"/>
-      </w:pPr>
-      <w:r>
-        <w:rPr>
-          <w:b w:val="0"/>
-          <w:i w:val="0"/>
-        </w:rPr>
-        <w:t>Thang đo J thuộc [-1.0, 1.0]. Hệ thống lý tưởng đạt J = 1.0 (TPR = 100%, FPR = 0%). Nếu J &lt;= 0, hệ thống không có giá trị thực tiễn. Mục tiêu của đồ án PBL6 là đạt J &gt;= 0.90 trên tập dữ liệu kiểm nghiệm thực tế.</w:t>
-      </w:r>
-    </w:p>
-    <w:p>
-      <w:pPr>
-        <w:keepNext/>
-        <w:spacing w:before="200" w:after="80"/>
-      </w:pPr>
-      <w:r>
-        <w:rPr>
-          <w:b/>
-          <w:color w:val="1E3A8A"/>
-          <w:sz w:val="24"/>
-        </w:rPr>
-        <w:t>1.5.3. Ngân sách độ trễ xử lý (Latency Overhead Budget)</w:t>
-      </w:r>
-    </w:p>
-    <w:p>
-      <w:pPr>
-        <w:spacing w:after="80" w:line="288" w:lineRule="auto"/>
-        <w:jc w:val="both"/>
-      </w:pPr>
-      <w:r>
-        <w:rPr>
-          <w:b w:val="0"/>
-          <w:i w:val="0"/>
-        </w:rPr>
-        <w:t>Theo tiêu chuẩn vận hành kiến trúc Reverse Proxy hiệu năng cao trong NGINX Cookbook [Ref 05], hệ thống WAF bảo vệ Web API bắt buộc phải tuân thủ nghiêm ngặt ngân sách độ trễ:</w:t>
-      </w:r>
-    </w:p>
-    <w:tbl>
-      <w:tblPr>
-        <w:tblW w:type="auto" w:w="0"/>
-        <w:jc w:val="center"/>
-        <w:tblLook w:firstColumn="1" w:firstRow="1" w:lastColumn="0" w:lastRow="0" w:noHBand="0" w:noVBand="1" w:val="04A0"/>
-      </w:tblPr>
-      <w:tblGrid>
-        <w:gridCol w:w="9360"/>
-      </w:tblGrid>
-      <w:tr>
-        <w:tc>
-          <w:tcPr>
-            <w:tcW w:type="dxa" w:w="9360"/>
-            <w:shd w:fill="F3F4F6"/>
-            <w:tcMar>
-              <w:top w:w="140" w:type="dxa"/>
-              <w:bottom w:w="140" w:type="dxa"/>
-              <w:left w:w="200" w:type="dxa"/>
-              <w:right w:w="200" w:type="dxa"/>
-            </w:tcMar>
-          </w:tcPr>
-          <w:p>
-            <w:pPr>
-              <w:jc w:val="center"/>
-            </w:pPr>
-            <w:r>
-              <w:rPr>
-                <w:b/>
-                <w:color w:val="1E293B"/>
-                <w:sz w:val="22"/>
-              </w:rPr>
-              <w:t>Delta t = t_with_WAF - t_direct &lt;= 15 ms</w:t>
-            </w:r>
-          </w:p>
-          <w:p>
-            <w:pPr>
-              <w:jc w:val="center"/>
-            </w:pPr>
-            <w:r>
-              <w:rPr>
-                <w:i/>
-                <w:color w:val="64748B"/>
-                <w:sz w:val="19"/>
-              </w:rPr>
-              <w:t>Ngân sách độ trễ tối đa cho toàn bộ quy trình kiểm tra WAF Hybrid</w:t>
-            </w:r>
-          </w:p>
-        </w:tc>
-      </w:tr>
-    </w:tbl>
-    <w:p>
-      <w:pPr>
-        <w:spacing w:after="80"/>
-      </w:pPr>
-    </w:p>
-    <w:p>
-      <w:pPr>
-        <w:keepNext/>
-        <w:spacing w:before="280" w:after="120"/>
-      </w:pPr>
-      <w:r>
-        <w:rPr>
-          <w:b/>
-          <w:color w:val="0F766E"/>
-          <w:sz w:val="28"/>
-        </w:rPr>
-        <w:t>1.6. TỔNG KẾT CHƯƠNG 1</w:t>
-      </w:r>
-    </w:p>
-    <w:p>
-      <w:pPr>
-        <w:spacing w:after="80" w:line="288" w:lineRule="auto"/>
-        <w:jc w:val="both"/>
-      </w:pPr>
-      <w:r>
-        <w:rPr>
-          <w:b w:val="0"/>
-          <w:i w:val="0"/>
-        </w:rPr>
-        <w:t>Chương 1 đã hoàn thành việc xây dựng nền tảng cơ sở lý thuyết toàn diện, có tính liên kết chặt chẽ và hàm lượng khoa học cao cho toàn bộ đồ án PBL6 dựa trên mô hình Kiềng ba chân học thuật:</w:t>
-      </w:r>
-    </w:p>
-    <w:p>
-      <w:pPr>
-        <w:pStyle w:val="ListBullet"/>
-        <w:spacing w:after="60" w:line="276" w:lineRule="auto"/>
-        <w:jc w:val="both"/>
-      </w:pPr>
-      <w:r>
-        <w:rPr>
-          <w:b/>
-          <w:color w:val="111827"/>
-        </w:rPr>
-        <w:t xml:space="preserve">1. Giáo trình kinh điển: </w:t>
-      </w:r>
-      <w:r>
-        <w:t>Vận dụng lý thuyết Cổng tầng ứng dụng của William Stallings [Ref 01], cơ sở toán học về Shannon Entropy của Douglas Stinson [Ref 02], mô hình Trò chơi an ninh đối kháng của Jonathan Katz &amp; Yehuda Lindell [Ref 03], phương pháp luận kiểm thử của CompTIA PenTest+ [Ref 04], và kiến trúc Reverse Proxy từ NGINX Cookbook [Ref 05].</w:t>
-      </w:r>
-    </w:p>
-    <w:p>
-      <w:pPr>
-        <w:pStyle w:val="ListBullet"/>
-        <w:spacing w:after="60" w:line="276" w:lineRule="auto"/>
-        <w:jc w:val="both"/>
-      </w:pPr>
-      <w:r>
-        <w:rPr>
-          <w:b/>
-          <w:color w:val="111827"/>
-        </w:rPr>
-        <w:t xml:space="preserve">2. Tiêu chuẩn công nghiệp: </w:t>
-      </w:r>
-      <w:r>
-        <w:t>Bám sát bộ rủi ro OWASP Top 10 API Security Risks (2023) [Ref 06], kiến trúc Anomaly Scoring của OWASP ModSecurity CRS v4.0 [Ref 07], quy trình đánh giá NIST SP 800-115 [Ref 15], và ma trận kỹ thuật MITRE ATT&amp;CK [Ref 16].</w:t>
-      </w:r>
-    </w:p>
-    <w:p>
-      <w:pPr>
-        <w:pStyle w:val="ListBullet"/>
-        <w:spacing w:after="60" w:line="276" w:lineRule="auto"/>
-        <w:jc w:val="both"/>
-      </w:pPr>
-      <w:r>
-        <w:rPr>
-          <w:b/>
-          <w:color w:val="111827"/>
+          <w:sz w:val="26"/>
         </w:rPr>
         <w:t xml:space="preserve">3. Công trình khoa học thực nghiệm: </w:t>
       </w:r>
       <w:r>
-        <w:t>Triển khai không gian 17 đặc trưng hình thái chuẩn Torrano-Gimenez (Wiley 2015) [Ref 08], bộ dữ liệu chuẩn quốc tế CSIC 2010 [Ref 09], khảo sát SQLi của IEEE Access (2023) [Ref 10], kiến trúc Hybrid WAF của MDPI Electronics (2025) [Ref 11], và mô hình Thao trường mạng chuẩn Elsevier (2020) [Ref 14].</w:t>
+        <w:rPr>
+          <w:sz w:val="26"/>
+        </w:rPr>
+        <w:t>Triển khai không gian 17 đặc trưng hình thái chuỗi payload [Ref 15], kết hợp mô hình học máy phân lớp Random Forest [Ref 12], phát hiện dị biệt Isolation Forest [Ref 11], kiến trúc dung hợp đa tầng [Ref 13], và mô hình Thao trường An ninh Đối kháng phân tán [Ref 16].</w:t>
       </w:r>
     </w:p>
     <w:sectPr>
       <w:pgSz w:w="12240" w:h="15840"/>
-      <w:pgMar w:top="1440" w:right="1440" w:bottom="1440" w:left="1440" w:header="720" w:footer="720" w:gutter="0"/>
+      <w:pgMar w:top="1417" w:right="1133" w:bottom="1417" w:left="1984" w:header="720" w:footer="720" w:gutter="0"/>
       <w:cols w:space="720"/>
       <w:docGrid w:linePitch="360"/>
     </w:sectPr>
@@ -2975,12 +2790,12 @@
     <w:qFormat/>
     <w:rsid w:val="00FC693F"/>
     <w:pPr>
-      <w:spacing w:line="288" w:lineRule="auto" w:after="80"/>
+      <w:spacing w:line="312" w:lineRule="auto" w:after="80"/>
     </w:pPr>
     <w:rPr>
       <w:rFonts w:ascii="Times New Roman" w:hAnsi="Times New Roman"/>
       <w:color w:val="1F2937"/>
-      <w:sz w:val="22"/>
+      <w:sz w:val="26"/>
     </w:rPr>
   </w:style>
   <w:style w:type="paragraph" w:styleId="Header">

</xml_diff>